<commit_message>
T25 tank counter card (alert at limit, owner reset) and T26 Inventory: stock overview, add stock, damaged or lost, entries, movement history with filter
Co-Authored-By: Claude Opus 5.5 <noreply@anthropic.com>
Claude-Session: https://claude.ai/code/session_01DasQCNUJBbLyCWkvv4Qmw3
</commit_message>
<xml_diff>
--- a/docs/testing/Mangao-Testing-Checklist.docx
+++ b/docs/testing/Mangao-Testing-Checklist.docx
@@ -30,7 +30,7 @@
           <w:sz w:val="19"/>
           <w:szCs w:val="19"/>
         </w:rPr>
-        <w:t xml:space="preserve">Steps built but not yet checked in Chrome: 15 steps, 118 checks. Updated Oct 14, 2026, 12:59 AM.</w:t>
+        <w:t xml:space="preserve">Steps built but not yet checked in Chrome: 17 steps, 137 checks. Updated Oct 14, 2026, 1:01 AM.</w:t>
       </w:r>
     </w:p>
     <w:p>
@@ -3731,6 +3731,331 @@
           </w:p>
         </w:tc>
       </w:tr>
+      <w:tr>
+        <w:trPr>
+          <w:cantSplit/>
+        </w:trPr>
+        <w:tc>
+          <w:tcPr>
+            <w:tcW w:type="dxa" w:w="900"/>
+            <w:tcBorders>
+              <w:top w:val="single" w:color="B9D7F2" w:sz="4"/>
+              <w:left w:val="single" w:color="B9D7F2" w:sz="4"/>
+              <w:bottom w:val="single" w:color="B9D7F2" w:sz="4"/>
+              <w:right w:val="single" w:color="B9D7F2" w:sz="4"/>
+            </w:tcBorders>
+            <w:shd w:fill="EAF4FD" w:color="auto" w:val="clear"/>
+            <w:tcMar>
+              <w:top w:type="dxa" w:w="60"/>
+              <w:left w:type="dxa" w:w="90"/>
+              <w:bottom w:type="dxa" w:w="60"/>
+              <w:right w:type="dxa" w:w="90"/>
+            </w:tcMar>
+          </w:tcPr>
+          <w:p>
+            <w:pPr>
+              <w:spacing w:after="0" w:before="0"/>
+            </w:pPr>
+            <w:r>
+              <w:rPr>
+                <w:rFonts w:ascii="Arial" w:cs="Arial" w:eastAsia="Arial" w:hAnsi="Arial"/>
+                <w:color w:val="15202B"/>
+                <w:sz w:val="18"/>
+                <w:szCs w:val="18"/>
+              </w:rPr>
+              <w:t xml:space="preserve">25</w:t>
+            </w:r>
+          </w:p>
+        </w:tc>
+        <w:tc>
+          <w:tcPr>
+            <w:tcW w:type="dxa" w:w="4400"/>
+            <w:tcBorders>
+              <w:top w:val="single" w:color="B9D7F2" w:sz="4"/>
+              <w:left w:val="single" w:color="B9D7F2" w:sz="4"/>
+              <w:bottom w:val="single" w:color="B9D7F2" w:sz="4"/>
+              <w:right w:val="single" w:color="B9D7F2" w:sz="4"/>
+            </w:tcBorders>
+            <w:shd w:fill="EAF4FD" w:color="auto" w:val="clear"/>
+            <w:tcMar>
+              <w:top w:type="dxa" w:w="60"/>
+              <w:left w:type="dxa" w:w="90"/>
+              <w:bottom w:type="dxa" w:w="60"/>
+              <w:right w:type="dxa" w:w="90"/>
+            </w:tcMar>
+          </w:tcPr>
+          <w:p>
+            <w:pPr>
+              <w:spacing w:after="0" w:before="0"/>
+            </w:pPr>
+            <w:r>
+              <w:rPr>
+                <w:rFonts w:ascii="Arial" w:cs="Arial" w:eastAsia="Arial" w:hAnsi="Arial"/>
+                <w:color w:val="15202B"/>
+                <w:sz w:val="18"/>
+                <w:szCs w:val="18"/>
+              </w:rPr>
+              <w:t xml:space="preserve">Raw water tank counter and 60-gallon alert</w:t>
+            </w:r>
+          </w:p>
+        </w:tc>
+        <w:tc>
+          <w:tcPr>
+            <w:tcW w:type="dxa" w:w="2600"/>
+            <w:tcBorders>
+              <w:top w:val="single" w:color="B9D7F2" w:sz="4"/>
+              <w:left w:val="single" w:color="B9D7F2" w:sz="4"/>
+              <w:bottom w:val="single" w:color="B9D7F2" w:sz="4"/>
+              <w:right w:val="single" w:color="B9D7F2" w:sz="4"/>
+            </w:tcBorders>
+            <w:shd w:fill="EAF4FD" w:color="auto" w:val="clear"/>
+            <w:tcMar>
+              <w:top w:type="dxa" w:w="60"/>
+              <w:left w:type="dxa" w:w="90"/>
+              <w:bottom w:type="dxa" w:w="60"/>
+              <w:right w:type="dxa" w:w="90"/>
+            </w:tcMar>
+          </w:tcPr>
+          <w:p>
+            <w:pPr>
+              <w:spacing w:after="0" w:before="0"/>
+            </w:pPr>
+            <w:r>
+              <w:rPr>
+                <w:rFonts w:ascii="Arial" w:cs="Arial" w:eastAsia="Arial" w:hAnsi="Arial"/>
+                <w:color w:val="15202B"/>
+                <w:sz w:val="18"/>
+                <w:szCs w:val="18"/>
+              </w:rPr>
+              <w:t xml:space="preserve">Admin Home 6, Staff 1</w:t>
+            </w:r>
+          </w:p>
+        </w:tc>
+        <w:tc>
+          <w:tcPr>
+            <w:tcW w:type="dxa" w:w="1300"/>
+            <w:tcBorders>
+              <w:top w:val="single" w:color="B9D7F2" w:sz="4"/>
+              <w:left w:val="single" w:color="B9D7F2" w:sz="4"/>
+              <w:bottom w:val="single" w:color="B9D7F2" w:sz="4"/>
+              <w:right w:val="single" w:color="B9D7F2" w:sz="4"/>
+            </w:tcBorders>
+            <w:shd w:fill="EAF4FD" w:color="auto" w:val="clear"/>
+            <w:tcMar>
+              <w:top w:type="dxa" w:w="60"/>
+              <w:left w:type="dxa" w:w="90"/>
+              <w:bottom w:type="dxa" w:w="60"/>
+              <w:right w:type="dxa" w:w="90"/>
+            </w:tcMar>
+          </w:tcPr>
+          <w:p>
+            <w:pPr>
+              <w:spacing w:after="0" w:before="0"/>
+            </w:pPr>
+            <w:r>
+              <w:rPr>
+                <w:rFonts w:ascii="Arial" w:cs="Arial" w:eastAsia="Arial" w:hAnsi="Arial"/>
+                <w:color w:val="15202B"/>
+                <w:sz w:val="18"/>
+                <w:szCs w:val="18"/>
+              </w:rPr>
+              <w:t xml:space="preserve">8</w:t>
+            </w:r>
+          </w:p>
+        </w:tc>
+        <w:tc>
+          <w:tcPr>
+            <w:tcW w:type="dxa" w:w="1266"/>
+            <w:tcBorders>
+              <w:top w:val="single" w:color="B9D7F2" w:sz="4"/>
+              <w:left w:val="single" w:color="B9D7F2" w:sz="4"/>
+              <w:bottom w:val="single" w:color="B9D7F2" w:sz="4"/>
+              <w:right w:val="single" w:color="B9D7F2" w:sz="4"/>
+            </w:tcBorders>
+            <w:shd w:fill="EAF4FD" w:color="auto" w:val="clear"/>
+            <w:tcMar>
+              <w:top w:type="dxa" w:w="60"/>
+              <w:left w:type="dxa" w:w="90"/>
+              <w:bottom w:type="dxa" w:w="60"/>
+              <w:right w:type="dxa" w:w="90"/>
+            </w:tcMar>
+          </w:tcPr>
+          <w:p>
+            <w:pPr>
+              <w:spacing w:after="0" w:before="0"/>
+            </w:pPr>
+            <w:r>
+              <w:rPr>
+                <w:rFonts w:ascii="Arial" w:cs="Arial" w:eastAsia="Arial" w:hAnsi="Arial"/>
+                <w:color w:val="15202B"/>
+                <w:sz w:val="18"/>
+                <w:szCs w:val="18"/>
+              </w:rPr>
+              <w:t xml:space="preserve">☐ Yes  ☐ No</w:t>
+            </w:r>
+          </w:p>
+        </w:tc>
+      </w:tr>
+      <w:tr>
+        <w:trPr>
+          <w:cantSplit/>
+        </w:trPr>
+        <w:tc>
+          <w:tcPr>
+            <w:tcW w:type="dxa" w:w="900"/>
+            <w:tcBorders>
+              <w:top w:val="single" w:color="B9D7F2" w:sz="4"/>
+              <w:left w:val="single" w:color="B9D7F2" w:sz="4"/>
+              <w:bottom w:val="single" w:color="B9D7F2" w:sz="4"/>
+              <w:right w:val="single" w:color="B9D7F2" w:sz="4"/>
+            </w:tcBorders>
+            <w:tcMar>
+              <w:top w:type="dxa" w:w="60"/>
+              <w:left w:type="dxa" w:w="90"/>
+              <w:bottom w:type="dxa" w:w="60"/>
+              <w:right w:type="dxa" w:w="90"/>
+            </w:tcMar>
+          </w:tcPr>
+          <w:p>
+            <w:pPr>
+              <w:spacing w:after="0" w:before="0"/>
+            </w:pPr>
+            <w:r>
+              <w:rPr>
+                <w:rFonts w:ascii="Arial" w:cs="Arial" w:eastAsia="Arial" w:hAnsi="Arial"/>
+                <w:color w:val="15202B"/>
+                <w:sz w:val="18"/>
+                <w:szCs w:val="18"/>
+              </w:rPr>
+              <w:t xml:space="preserve">26</w:t>
+            </w:r>
+          </w:p>
+        </w:tc>
+        <w:tc>
+          <w:tcPr>
+            <w:tcW w:type="dxa" w:w="4400"/>
+            <w:tcBorders>
+              <w:top w:val="single" w:color="B9D7F2" w:sz="4"/>
+              <w:left w:val="single" w:color="B9D7F2" w:sz="4"/>
+              <w:bottom w:val="single" w:color="B9D7F2" w:sz="4"/>
+              <w:right w:val="single" w:color="B9D7F2" w:sz="4"/>
+            </w:tcBorders>
+            <w:tcMar>
+              <w:top w:type="dxa" w:w="60"/>
+              <w:left w:type="dxa" w:w="90"/>
+              <w:bottom w:type="dxa" w:w="60"/>
+              <w:right w:type="dxa" w:w="90"/>
+            </w:tcMar>
+          </w:tcPr>
+          <w:p>
+            <w:pPr>
+              <w:spacing w:after="0" w:before="0"/>
+            </w:pPr>
+            <w:r>
+              <w:rPr>
+                <w:rFonts w:ascii="Arial" w:cs="Arial" w:eastAsia="Arial" w:hAnsi="Arial"/>
+                <w:color w:val="15202B"/>
+                <w:sz w:val="18"/>
+                <w:szCs w:val="18"/>
+              </w:rPr>
+              <w:t xml:space="preserve">Gallon and seal stock</w:t>
+            </w:r>
+          </w:p>
+        </w:tc>
+        <w:tc>
+          <w:tcPr>
+            <w:tcW w:type="dxa" w:w="2600"/>
+            <w:tcBorders>
+              <w:top w:val="single" w:color="B9D7F2" w:sz="4"/>
+              <w:left w:val="single" w:color="B9D7F2" w:sz="4"/>
+              <w:bottom w:val="single" w:color="B9D7F2" w:sz="4"/>
+              <w:right w:val="single" w:color="B9D7F2" w:sz="4"/>
+            </w:tcBorders>
+            <w:tcMar>
+              <w:top w:type="dxa" w:w="60"/>
+              <w:left w:type="dxa" w:w="90"/>
+              <w:bottom w:type="dxa" w:w="60"/>
+              <w:right w:type="dxa" w:w="90"/>
+            </w:tcMar>
+          </w:tcPr>
+          <w:p>
+            <w:pPr>
+              <w:spacing w:after="0" w:before="0"/>
+            </w:pPr>
+            <w:r>
+              <w:rPr>
+                <w:rFonts w:ascii="Arial" w:cs="Arial" w:eastAsia="Arial" w:hAnsi="Arial"/>
+                <w:color w:val="15202B"/>
+                <w:sz w:val="18"/>
+                <w:szCs w:val="18"/>
+              </w:rPr>
+              <w:t xml:space="preserve">Admin Inventory 1-4, Admin Home 7</w:t>
+            </w:r>
+          </w:p>
+        </w:tc>
+        <w:tc>
+          <w:tcPr>
+            <w:tcW w:type="dxa" w:w="1300"/>
+            <w:tcBorders>
+              <w:top w:val="single" w:color="B9D7F2" w:sz="4"/>
+              <w:left w:val="single" w:color="B9D7F2" w:sz="4"/>
+              <w:bottom w:val="single" w:color="B9D7F2" w:sz="4"/>
+              <w:right w:val="single" w:color="B9D7F2" w:sz="4"/>
+            </w:tcBorders>
+            <w:tcMar>
+              <w:top w:type="dxa" w:w="60"/>
+              <w:left w:type="dxa" w:w="90"/>
+              <w:bottom w:type="dxa" w:w="60"/>
+              <w:right w:type="dxa" w:w="90"/>
+            </w:tcMar>
+          </w:tcPr>
+          <w:p>
+            <w:pPr>
+              <w:spacing w:after="0" w:before="0"/>
+            </w:pPr>
+            <w:r>
+              <w:rPr>
+                <w:rFonts w:ascii="Arial" w:cs="Arial" w:eastAsia="Arial" w:hAnsi="Arial"/>
+                <w:color w:val="15202B"/>
+                <w:sz w:val="18"/>
+                <w:szCs w:val="18"/>
+              </w:rPr>
+              <w:t xml:space="preserve">11</w:t>
+            </w:r>
+          </w:p>
+        </w:tc>
+        <w:tc>
+          <w:tcPr>
+            <w:tcW w:type="dxa" w:w="1266"/>
+            <w:tcBorders>
+              <w:top w:val="single" w:color="B9D7F2" w:sz="4"/>
+              <w:left w:val="single" w:color="B9D7F2" w:sz="4"/>
+              <w:bottom w:val="single" w:color="B9D7F2" w:sz="4"/>
+              <w:right w:val="single" w:color="B9D7F2" w:sz="4"/>
+            </w:tcBorders>
+            <w:tcMar>
+              <w:top w:type="dxa" w:w="60"/>
+              <w:left w:type="dxa" w:w="90"/>
+              <w:bottom w:type="dxa" w:w="60"/>
+              <w:right w:type="dxa" w:w="90"/>
+            </w:tcMar>
+          </w:tcPr>
+          <w:p>
+            <w:pPr>
+              <w:spacing w:after="0" w:before="0"/>
+            </w:pPr>
+            <w:r>
+              <w:rPr>
+                <w:rFonts w:ascii="Arial" w:cs="Arial" w:eastAsia="Arial" w:hAnsi="Arial"/>
+                <w:color w:val="15202B"/>
+                <w:sz w:val="18"/>
+                <w:szCs w:val="18"/>
+              </w:rPr>
+              <w:t xml:space="preserve">☐ Yes  ☐ No</w:t>
+            </w:r>
+          </w:p>
+        </w:tc>
+      </w:tr>
     </w:tbl>
     <w:p>
       <w:pPr>
@@ -28490,6 +28815,3925 @@
               <w:right w:val="single" w:color="B9D7F2" w:sz="4"/>
             </w:tcBorders>
             <w:shd w:fill="EAF4FD" w:color="auto" w:val="clear"/>
+            <w:tcMar>
+              <w:top w:type="dxa" w:w="60"/>
+              <w:left w:type="dxa" w:w="90"/>
+              <w:bottom w:type="dxa" w:w="60"/>
+              <w:right w:type="dxa" w:w="90"/>
+            </w:tcMar>
+          </w:tcPr>
+          <w:p>
+            <w:pPr>
+              <w:spacing w:after="0" w:before="0"/>
+            </w:pPr>
+            <w:r>
+              <w:rPr>
+                <w:rFonts w:ascii="Arial" w:cs="Arial" w:eastAsia="Arial" w:hAnsi="Arial"/>
+                <w:color w:val="15202B"/>
+                <w:sz w:val="18"/>
+                <w:szCs w:val="18"/>
+              </w:rPr>
+              <w:t xml:space="preserve"/>
+            </w:r>
+          </w:p>
+        </w:tc>
+      </w:tr>
+    </w:tbl>
+    <w:p>
+      <w:pPr>
+        <w:pStyle w:val="Heading1"/>
+        <w:pageBreakBefore/>
+        <w:spacing w:after="60"/>
+      </w:pPr>
+      <w:r>
+        <w:rPr>
+          <w:rFonts w:ascii="Arial" w:cs="Arial" w:eastAsia="Arial" w:hAnsi="Arial"/>
+          <w:b/>
+          <w:bCs/>
+          <w:color w:val="0A84E0"/>
+          <w:sz w:val="28"/>
+          <w:szCs w:val="28"/>
+        </w:rPr>
+        <w:t xml:space="preserve">Step 25 · Raw water tank counter and 60-gallon alert</w:t>
+      </w:r>
+    </w:p>
+    <w:p>
+      <w:pPr>
+        <w:spacing w:after="60" w:before="0"/>
+      </w:pPr>
+      <w:r>
+        <w:rPr>
+          <w:rFonts w:ascii="Arial" w:cs="Arial" w:eastAsia="Arial" w:hAnsi="Arial"/>
+          <w:b/>
+          <w:bCs/>
+          <w:color w:val="15202B"/>
+          <w:sz w:val="19"/>
+          <w:szCs w:val="19"/>
+        </w:rPr>
+        <w:t xml:space="preserve">Screens: </w:t>
+      </w:r>
+      <w:r>
+        <w:rPr>
+          <w:rFonts w:ascii="Arial" w:cs="Arial" w:eastAsia="Arial" w:hAnsi="Arial"/>
+          <w:color w:val="15202B"/>
+          <w:sz w:val="19"/>
+          <w:szCs w:val="19"/>
+        </w:rPr>
+        <w:t xml:space="preserve">Admin Home 6, Staff 1</w:t>
+      </w:r>
+      <w:r>
+        <w:rPr>
+          <w:rFonts w:ascii="Arial" w:cs="Arial" w:eastAsia="Arial" w:hAnsi="Arial"/>
+          <w:b/>
+          <w:bCs/>
+          <w:color w:val="15202B"/>
+          <w:sz w:val="19"/>
+          <w:szCs w:val="19"/>
+        </w:rPr>
+        <w:t xml:space="preserve">    Log in as: </w:t>
+      </w:r>
+      <w:r>
+        <w:rPr>
+          <w:rFonts w:ascii="Arial" w:cs="Arial" w:eastAsia="Arial" w:hAnsi="Arial"/>
+          <w:color w:val="15202B"/>
+          <w:sz w:val="19"/>
+          <w:szCs w:val="19"/>
+        </w:rPr>
+        <w:t xml:space="preserve">Staff and Owner</w:t>
+      </w:r>
+    </w:p>
+    <w:p>
+      <w:pPr>
+        <w:spacing w:after="60" w:before="0"/>
+      </w:pPr>
+      <w:r>
+        <w:rPr>
+          <w:rFonts w:ascii="Arial" w:cs="Arial" w:eastAsia="Arial" w:hAnsi="Arial"/>
+          <w:b/>
+          <w:bCs/>
+          <w:color w:val="0A84E0"/>
+          <w:sz w:val="19"/>
+          <w:szCs w:val="19"/>
+        </w:rPr>
+        <w:t xml:space="preserve">Before: </w:t>
+      </w:r>
+      <w:r>
+        <w:rPr>
+          <w:rFonts w:ascii="Arial" w:cs="Arial" w:eastAsia="Arial" w:hAnsi="Arial"/>
+          <w:color w:val="15202B"/>
+          <w:sz w:val="19"/>
+          <w:szCs w:val="19"/>
+        </w:rPr>
+        <w:t xml:space="preserve">Tip: to reach 60 quickly, log one walk-in of 55 gallons, then send a few orders out.</w:t>
+      </w:r>
+    </w:p>
+    <w:tbl>
+      <w:tblPr>
+        <w:tblW w:type="dxa" w:w="10466"/>
+        <w:tblBorders>
+          <w:top w:val="single" w:color="auto" w:sz="4"/>
+          <w:left w:val="single" w:color="auto" w:sz="4"/>
+          <w:bottom w:val="single" w:color="auto" w:sz="4"/>
+          <w:right w:val="single" w:color="auto" w:sz="4"/>
+          <w:insideH w:val="single" w:color="auto" w:sz="4"/>
+          <w:insideV w:val="single" w:color="auto" w:sz="4"/>
+        </w:tblBorders>
+        <w:tblLayout w:type="fixed"/>
+      </w:tblPr>
+      <w:tblGrid>
+        <w:gridCol w:w="640"/>
+        <w:gridCol w:w="3820"/>
+        <w:gridCol w:w="3900"/>
+        <w:gridCol w:w="900"/>
+        <w:gridCol w:w="1206"/>
+      </w:tblGrid>
+      <w:tr>
+        <w:trPr>
+          <w:tblHeader/>
+        </w:trPr>
+        <w:tc>
+          <w:tcPr>
+            <w:tcW w:type="dxa" w:w="640"/>
+            <w:tcBorders>
+              <w:top w:val="single" w:color="B9D7F2" w:sz="4"/>
+              <w:left w:val="single" w:color="B9D7F2" w:sz="4"/>
+              <w:bottom w:val="single" w:color="B9D7F2" w:sz="4"/>
+              <w:right w:val="single" w:color="B9D7F2" w:sz="4"/>
+            </w:tcBorders>
+            <w:shd w:fill="0A84E0" w:color="auto" w:val="clear"/>
+            <w:tcMar>
+              <w:top w:type="dxa" w:w="60"/>
+              <w:left w:type="dxa" w:w="90"/>
+              <w:bottom w:type="dxa" w:w="60"/>
+              <w:right w:type="dxa" w:w="90"/>
+            </w:tcMar>
+          </w:tcPr>
+          <w:p>
+            <w:pPr>
+              <w:spacing w:after="0" w:before="0"/>
+            </w:pPr>
+            <w:r>
+              <w:rPr>
+                <w:rFonts w:ascii="Arial" w:cs="Arial" w:eastAsia="Arial" w:hAnsi="Arial"/>
+                <w:b/>
+                <w:bCs/>
+                <w:color w:val="FFFFFF"/>
+                <w:sz w:val="18"/>
+                <w:szCs w:val="18"/>
+              </w:rPr>
+              <w:t xml:space="preserve">#</w:t>
+            </w:r>
+          </w:p>
+        </w:tc>
+        <w:tc>
+          <w:tcPr>
+            <w:tcW w:type="dxa" w:w="3820"/>
+            <w:tcBorders>
+              <w:top w:val="single" w:color="B9D7F2" w:sz="4"/>
+              <w:left w:val="single" w:color="B9D7F2" w:sz="4"/>
+              <w:bottom w:val="single" w:color="B9D7F2" w:sz="4"/>
+              <w:right w:val="single" w:color="B9D7F2" w:sz="4"/>
+            </w:tcBorders>
+            <w:shd w:fill="0A84E0" w:color="auto" w:val="clear"/>
+            <w:tcMar>
+              <w:top w:type="dxa" w:w="60"/>
+              <w:left w:type="dxa" w:w="90"/>
+              <w:bottom w:type="dxa" w:w="60"/>
+              <w:right w:type="dxa" w:w="90"/>
+            </w:tcMar>
+          </w:tcPr>
+          <w:p>
+            <w:pPr>
+              <w:spacing w:after="0" w:before="0"/>
+            </w:pPr>
+            <w:r>
+              <w:rPr>
+                <w:rFonts w:ascii="Arial" w:cs="Arial" w:eastAsia="Arial" w:hAnsi="Arial"/>
+                <w:b/>
+                <w:bCs/>
+                <w:color w:val="FFFFFF"/>
+                <w:sz w:val="18"/>
+                <w:szCs w:val="18"/>
+              </w:rPr>
+              <w:t xml:space="preserve">What to do</w:t>
+            </w:r>
+          </w:p>
+        </w:tc>
+        <w:tc>
+          <w:tcPr>
+            <w:tcW w:type="dxa" w:w="3900"/>
+            <w:tcBorders>
+              <w:top w:val="single" w:color="B9D7F2" w:sz="4"/>
+              <w:left w:val="single" w:color="B9D7F2" w:sz="4"/>
+              <w:bottom w:val="single" w:color="B9D7F2" w:sz="4"/>
+              <w:right w:val="single" w:color="B9D7F2" w:sz="4"/>
+            </w:tcBorders>
+            <w:shd w:fill="0A84E0" w:color="auto" w:val="clear"/>
+            <w:tcMar>
+              <w:top w:type="dxa" w:w="60"/>
+              <w:left w:type="dxa" w:w="90"/>
+              <w:bottom w:type="dxa" w:w="60"/>
+              <w:right w:type="dxa" w:w="90"/>
+            </w:tcMar>
+          </w:tcPr>
+          <w:p>
+            <w:pPr>
+              <w:spacing w:after="0" w:before="0"/>
+            </w:pPr>
+            <w:r>
+              <w:rPr>
+                <w:rFonts w:ascii="Arial" w:cs="Arial" w:eastAsia="Arial" w:hAnsi="Arial"/>
+                <w:b/>
+                <w:bCs/>
+                <w:color w:val="FFFFFF"/>
+                <w:sz w:val="18"/>
+                <w:szCs w:val="18"/>
+              </w:rPr>
+              <w:t xml:space="preserve">What you should see</w:t>
+            </w:r>
+          </w:p>
+        </w:tc>
+        <w:tc>
+          <w:tcPr>
+            <w:tcW w:type="dxa" w:w="900"/>
+            <w:tcBorders>
+              <w:top w:val="single" w:color="B9D7F2" w:sz="4"/>
+              <w:left w:val="single" w:color="B9D7F2" w:sz="4"/>
+              <w:bottom w:val="single" w:color="B9D7F2" w:sz="4"/>
+              <w:right w:val="single" w:color="B9D7F2" w:sz="4"/>
+            </w:tcBorders>
+            <w:shd w:fill="0A84E0" w:color="auto" w:val="clear"/>
+            <w:tcMar>
+              <w:top w:type="dxa" w:w="60"/>
+              <w:left w:type="dxa" w:w="90"/>
+              <w:bottom w:type="dxa" w:w="60"/>
+              <w:right w:type="dxa" w:w="90"/>
+            </w:tcMar>
+          </w:tcPr>
+          <w:p>
+            <w:pPr>
+              <w:spacing w:after="0" w:before="0"/>
+            </w:pPr>
+            <w:r>
+              <w:rPr>
+                <w:rFonts w:ascii="Arial" w:cs="Arial" w:eastAsia="Arial" w:hAnsi="Arial"/>
+                <w:b/>
+                <w:bCs/>
+                <w:color w:val="FFFFFF"/>
+                <w:sz w:val="18"/>
+                <w:szCs w:val="18"/>
+              </w:rPr>
+              <w:t xml:space="preserve">Result</w:t>
+            </w:r>
+          </w:p>
+        </w:tc>
+        <w:tc>
+          <w:tcPr>
+            <w:tcW w:type="dxa" w:w="1206"/>
+            <w:tcBorders>
+              <w:top w:val="single" w:color="B9D7F2" w:sz="4"/>
+              <w:left w:val="single" w:color="B9D7F2" w:sz="4"/>
+              <w:bottom w:val="single" w:color="B9D7F2" w:sz="4"/>
+              <w:right w:val="single" w:color="B9D7F2" w:sz="4"/>
+            </w:tcBorders>
+            <w:shd w:fill="0A84E0" w:color="auto" w:val="clear"/>
+            <w:tcMar>
+              <w:top w:type="dxa" w:w="60"/>
+              <w:left w:type="dxa" w:w="90"/>
+              <w:bottom w:type="dxa" w:w="60"/>
+              <w:right w:type="dxa" w:w="90"/>
+            </w:tcMar>
+          </w:tcPr>
+          <w:p>
+            <w:pPr>
+              <w:spacing w:after="0" w:before="0"/>
+            </w:pPr>
+            <w:r>
+              <w:rPr>
+                <w:rFonts w:ascii="Arial" w:cs="Arial" w:eastAsia="Arial" w:hAnsi="Arial"/>
+                <w:b/>
+                <w:bCs/>
+                <w:color w:val="FFFFFF"/>
+                <w:sz w:val="18"/>
+                <w:szCs w:val="18"/>
+              </w:rPr>
+              <w:t xml:space="preserve">Notes</w:t>
+            </w:r>
+          </w:p>
+        </w:tc>
+      </w:tr>
+      <w:tr>
+        <w:trPr>
+          <w:cantSplit/>
+        </w:trPr>
+        <w:tc>
+          <w:tcPr>
+            <w:tcW w:type="dxa" w:w="640"/>
+            <w:tcBorders>
+              <w:top w:val="single" w:color="B9D7F2" w:sz="4"/>
+              <w:left w:val="single" w:color="B9D7F2" w:sz="4"/>
+              <w:bottom w:val="single" w:color="B9D7F2" w:sz="4"/>
+              <w:right w:val="single" w:color="B9D7F2" w:sz="4"/>
+            </w:tcBorders>
+            <w:tcMar>
+              <w:top w:type="dxa" w:w="60"/>
+              <w:left w:type="dxa" w:w="90"/>
+              <w:bottom w:type="dxa" w:w="60"/>
+              <w:right w:type="dxa" w:w="90"/>
+            </w:tcMar>
+          </w:tcPr>
+          <w:p>
+            <w:pPr>
+              <w:spacing w:after="0" w:before="0"/>
+            </w:pPr>
+            <w:r>
+              <w:rPr>
+                <w:rFonts w:ascii="Arial" w:cs="Arial" w:eastAsia="Arial" w:hAnsi="Arial"/>
+                <w:color w:val="15202B"/>
+                <w:sz w:val="18"/>
+                <w:szCs w:val="18"/>
+              </w:rPr>
+              <w:t xml:space="preserve">25.1</w:t>
+            </w:r>
+          </w:p>
+        </w:tc>
+        <w:tc>
+          <w:tcPr>
+            <w:tcW w:type="dxa" w:w="3820"/>
+            <w:tcBorders>
+              <w:top w:val="single" w:color="B9D7F2" w:sz="4"/>
+              <w:left w:val="single" w:color="B9D7F2" w:sz="4"/>
+              <w:bottom w:val="single" w:color="B9D7F2" w:sz="4"/>
+              <w:right w:val="single" w:color="B9D7F2" w:sz="4"/>
+            </w:tcBorders>
+            <w:tcMar>
+              <w:top w:type="dxa" w:w="60"/>
+              <w:left w:type="dxa" w:w="90"/>
+              <w:bottom w:type="dxa" w:w="60"/>
+              <w:right w:type="dxa" w:w="90"/>
+            </w:tcMar>
+          </w:tcPr>
+          <w:p>
+            <w:pPr>
+              <w:spacing w:after="0" w:before="0"/>
+            </w:pPr>
+            <w:r>
+              <w:rPr>
+                <w:rFonts w:ascii="Arial" w:cs="Arial" w:eastAsia="Arial" w:hAnsi="Arial"/>
+                <w:color w:val="15202B"/>
+                <w:sz w:val="18"/>
+                <w:szCs w:val="18"/>
+              </w:rPr>
+              <w:t xml:space="preserve">Staff: To Do. Note the Tank Counter (e.g. 0 / 60).</w:t>
+            </w:r>
+          </w:p>
+        </w:tc>
+        <w:tc>
+          <w:tcPr>
+            <w:tcW w:type="dxa" w:w="3900"/>
+            <w:tcBorders>
+              <w:top w:val="single" w:color="B9D7F2" w:sz="4"/>
+              <w:left w:val="single" w:color="B9D7F2" w:sz="4"/>
+              <w:bottom w:val="single" w:color="B9D7F2" w:sz="4"/>
+              <w:right w:val="single" w:color="B9D7F2" w:sz="4"/>
+            </w:tcBorders>
+            <w:tcMar>
+              <w:top w:type="dxa" w:w="60"/>
+              <w:left w:type="dxa" w:w="90"/>
+              <w:bottom w:type="dxa" w:w="60"/>
+              <w:right w:type="dxa" w:w="90"/>
+            </w:tcMar>
+          </w:tcPr>
+          <w:p>
+            <w:pPr>
+              <w:spacing w:after="0" w:before="0"/>
+            </w:pPr>
+            <w:r>
+              <w:rPr>
+                <w:rFonts w:ascii="Arial" w:cs="Arial" w:eastAsia="Arial" w:hAnsi="Arial"/>
+                <w:color w:val="15202B"/>
+                <w:sz w:val="18"/>
+                <w:szCs w:val="18"/>
+              </w:rPr>
+              <w:t xml:space="preserve">Card "Tank Counter · Gallons counted out of 60" with a bar; no reset button for staff.</w:t>
+            </w:r>
+          </w:p>
+        </w:tc>
+        <w:tc>
+          <w:tcPr>
+            <w:tcW w:type="dxa" w:w="900"/>
+            <w:tcBorders>
+              <w:top w:val="single" w:color="B9D7F2" w:sz="4"/>
+              <w:left w:val="single" w:color="B9D7F2" w:sz="4"/>
+              <w:bottom w:val="single" w:color="B9D7F2" w:sz="4"/>
+              <w:right w:val="single" w:color="B9D7F2" w:sz="4"/>
+            </w:tcBorders>
+            <w:tcMar>
+              <w:top w:type="dxa" w:w="60"/>
+              <w:left w:type="dxa" w:w="90"/>
+              <w:bottom w:type="dxa" w:w="60"/>
+              <w:right w:type="dxa" w:w="90"/>
+            </w:tcMar>
+          </w:tcPr>
+          <w:p>
+            <w:pPr>
+              <w:spacing w:after="0" w:before="0"/>
+            </w:pPr>
+            <w:r>
+              <w:rPr>
+                <w:rFonts w:ascii="Arial" w:cs="Arial" w:eastAsia="Arial" w:hAnsi="Arial"/>
+                <w:color w:val="15202B"/>
+                <w:sz w:val="18"/>
+                <w:szCs w:val="18"/>
+              </w:rPr>
+              <w:t xml:space="preserve">☐ Pass</w:t>
+            </w:r>
+          </w:p>
+          <w:p>
+            <w:pPr>
+              <w:spacing w:after="0" w:before="0"/>
+            </w:pPr>
+            <w:r>
+              <w:rPr>
+                <w:rFonts w:ascii="Arial" w:cs="Arial" w:eastAsia="Arial" w:hAnsi="Arial"/>
+                <w:color w:val="15202B"/>
+                <w:sz w:val="18"/>
+                <w:szCs w:val="18"/>
+              </w:rPr>
+              <w:t xml:space="preserve">☐ Fail</w:t>
+            </w:r>
+          </w:p>
+        </w:tc>
+        <w:tc>
+          <w:tcPr>
+            <w:tcW w:type="dxa" w:w="1206"/>
+            <w:tcBorders>
+              <w:top w:val="single" w:color="B9D7F2" w:sz="4"/>
+              <w:left w:val="single" w:color="B9D7F2" w:sz="4"/>
+              <w:bottom w:val="single" w:color="B9D7F2" w:sz="4"/>
+              <w:right w:val="single" w:color="B9D7F2" w:sz="4"/>
+            </w:tcBorders>
+            <w:tcMar>
+              <w:top w:type="dxa" w:w="60"/>
+              <w:left w:type="dxa" w:w="90"/>
+              <w:bottom w:type="dxa" w:w="60"/>
+              <w:right w:type="dxa" w:w="90"/>
+            </w:tcMar>
+          </w:tcPr>
+          <w:p>
+            <w:pPr>
+              <w:spacing w:after="0" w:before="0"/>
+            </w:pPr>
+            <w:r>
+              <w:rPr>
+                <w:rFonts w:ascii="Arial" w:cs="Arial" w:eastAsia="Arial" w:hAnsi="Arial"/>
+                <w:color w:val="15202B"/>
+                <w:sz w:val="18"/>
+                <w:szCs w:val="18"/>
+              </w:rPr>
+              <w:t xml:space="preserve"/>
+            </w:r>
+          </w:p>
+        </w:tc>
+      </w:tr>
+      <w:tr>
+        <w:trPr>
+          <w:cantSplit/>
+        </w:trPr>
+        <w:tc>
+          <w:tcPr>
+            <w:tcW w:type="dxa" w:w="640"/>
+            <w:tcBorders>
+              <w:top w:val="single" w:color="B9D7F2" w:sz="4"/>
+              <w:left w:val="single" w:color="B9D7F2" w:sz="4"/>
+              <w:bottom w:val="single" w:color="B9D7F2" w:sz="4"/>
+              <w:right w:val="single" w:color="B9D7F2" w:sz="4"/>
+            </w:tcBorders>
+            <w:shd w:fill="EAF4FD" w:color="auto" w:val="clear"/>
+            <w:tcMar>
+              <w:top w:type="dxa" w:w="60"/>
+              <w:left w:type="dxa" w:w="90"/>
+              <w:bottom w:type="dxa" w:w="60"/>
+              <w:right w:type="dxa" w:w="90"/>
+            </w:tcMar>
+          </w:tcPr>
+          <w:p>
+            <w:pPr>
+              <w:spacing w:after="0" w:before="0"/>
+            </w:pPr>
+            <w:r>
+              <w:rPr>
+                <w:rFonts w:ascii="Arial" w:cs="Arial" w:eastAsia="Arial" w:hAnsi="Arial"/>
+                <w:color w:val="15202B"/>
+                <w:sz w:val="18"/>
+                <w:szCs w:val="18"/>
+              </w:rPr>
+              <w:t xml:space="preserve">25.2</w:t>
+            </w:r>
+          </w:p>
+        </w:tc>
+        <w:tc>
+          <w:tcPr>
+            <w:tcW w:type="dxa" w:w="3820"/>
+            <w:tcBorders>
+              <w:top w:val="single" w:color="B9D7F2" w:sz="4"/>
+              <w:left w:val="single" w:color="B9D7F2" w:sz="4"/>
+              <w:bottom w:val="single" w:color="B9D7F2" w:sz="4"/>
+              <w:right w:val="single" w:color="B9D7F2" w:sz="4"/>
+            </w:tcBorders>
+            <w:shd w:fill="EAF4FD" w:color="auto" w:val="clear"/>
+            <w:tcMar>
+              <w:top w:type="dxa" w:w="60"/>
+              <w:left w:type="dxa" w:w="90"/>
+              <w:bottom w:type="dxa" w:w="60"/>
+              <w:right w:type="dxa" w:w="90"/>
+            </w:tcMar>
+          </w:tcPr>
+          <w:p>
+            <w:pPr>
+              <w:spacing w:after="0" w:before="0"/>
+            </w:pPr>
+            <w:r>
+              <w:rPr>
+                <w:rFonts w:ascii="Arial" w:cs="Arial" w:eastAsia="Arial" w:hAnsi="Arial"/>
+                <w:color w:val="15202B"/>
+                <w:sz w:val="18"/>
+                <w:szCs w:val="18"/>
+              </w:rPr>
+              <w:t xml:space="preserve">Log Walk-in of 2 gallons.</w:t>
+            </w:r>
+          </w:p>
+        </w:tc>
+        <w:tc>
+          <w:tcPr>
+            <w:tcW w:type="dxa" w:w="3900"/>
+            <w:tcBorders>
+              <w:top w:val="single" w:color="B9D7F2" w:sz="4"/>
+              <w:left w:val="single" w:color="B9D7F2" w:sz="4"/>
+              <w:bottom w:val="single" w:color="B9D7F2" w:sz="4"/>
+              <w:right w:val="single" w:color="B9D7F2" w:sz="4"/>
+            </w:tcBorders>
+            <w:shd w:fill="EAF4FD" w:color="auto" w:val="clear"/>
+            <w:tcMar>
+              <w:top w:type="dxa" w:w="60"/>
+              <w:left w:type="dxa" w:w="90"/>
+              <w:bottom w:type="dxa" w:w="60"/>
+              <w:right w:type="dxa" w:w="90"/>
+            </w:tcMar>
+          </w:tcPr>
+          <w:p>
+            <w:pPr>
+              <w:spacing w:after="0" w:before="0"/>
+            </w:pPr>
+            <w:r>
+              <w:rPr>
+                <w:rFonts w:ascii="Arial" w:cs="Arial" w:eastAsia="Arial" w:hAnsi="Arial"/>
+                <w:color w:val="15202B"/>
+                <w:sz w:val="18"/>
+                <w:szCs w:val="18"/>
+              </w:rPr>
+              <w:t xml:space="preserve">Counter goes up by 2.</w:t>
+            </w:r>
+          </w:p>
+        </w:tc>
+        <w:tc>
+          <w:tcPr>
+            <w:tcW w:type="dxa" w:w="900"/>
+            <w:tcBorders>
+              <w:top w:val="single" w:color="B9D7F2" w:sz="4"/>
+              <w:left w:val="single" w:color="B9D7F2" w:sz="4"/>
+              <w:bottom w:val="single" w:color="B9D7F2" w:sz="4"/>
+              <w:right w:val="single" w:color="B9D7F2" w:sz="4"/>
+            </w:tcBorders>
+            <w:shd w:fill="EAF4FD" w:color="auto" w:val="clear"/>
+            <w:tcMar>
+              <w:top w:type="dxa" w:w="60"/>
+              <w:left w:type="dxa" w:w="90"/>
+              <w:bottom w:type="dxa" w:w="60"/>
+              <w:right w:type="dxa" w:w="90"/>
+            </w:tcMar>
+          </w:tcPr>
+          <w:p>
+            <w:pPr>
+              <w:spacing w:after="0" w:before="0"/>
+            </w:pPr>
+            <w:r>
+              <w:rPr>
+                <w:rFonts w:ascii="Arial" w:cs="Arial" w:eastAsia="Arial" w:hAnsi="Arial"/>
+                <w:color w:val="15202B"/>
+                <w:sz w:val="18"/>
+                <w:szCs w:val="18"/>
+              </w:rPr>
+              <w:t xml:space="preserve">☐ Pass</w:t>
+            </w:r>
+          </w:p>
+          <w:p>
+            <w:pPr>
+              <w:spacing w:after="0" w:before="0"/>
+            </w:pPr>
+            <w:r>
+              <w:rPr>
+                <w:rFonts w:ascii="Arial" w:cs="Arial" w:eastAsia="Arial" w:hAnsi="Arial"/>
+                <w:color w:val="15202B"/>
+                <w:sz w:val="18"/>
+                <w:szCs w:val="18"/>
+              </w:rPr>
+              <w:t xml:space="preserve">☐ Fail</w:t>
+            </w:r>
+          </w:p>
+        </w:tc>
+        <w:tc>
+          <w:tcPr>
+            <w:tcW w:type="dxa" w:w="1206"/>
+            <w:tcBorders>
+              <w:top w:val="single" w:color="B9D7F2" w:sz="4"/>
+              <w:left w:val="single" w:color="B9D7F2" w:sz="4"/>
+              <w:bottom w:val="single" w:color="B9D7F2" w:sz="4"/>
+              <w:right w:val="single" w:color="B9D7F2" w:sz="4"/>
+            </w:tcBorders>
+            <w:shd w:fill="EAF4FD" w:color="auto" w:val="clear"/>
+            <w:tcMar>
+              <w:top w:type="dxa" w:w="60"/>
+              <w:left w:type="dxa" w:w="90"/>
+              <w:bottom w:type="dxa" w:w="60"/>
+              <w:right w:type="dxa" w:w="90"/>
+            </w:tcMar>
+          </w:tcPr>
+          <w:p>
+            <w:pPr>
+              <w:spacing w:after="0" w:before="0"/>
+            </w:pPr>
+            <w:r>
+              <w:rPr>
+                <w:rFonts w:ascii="Arial" w:cs="Arial" w:eastAsia="Arial" w:hAnsi="Arial"/>
+                <w:color w:val="15202B"/>
+                <w:sz w:val="18"/>
+                <w:szCs w:val="18"/>
+              </w:rPr>
+              <w:t xml:space="preserve"/>
+            </w:r>
+          </w:p>
+        </w:tc>
+      </w:tr>
+      <w:tr>
+        <w:trPr>
+          <w:cantSplit/>
+        </w:trPr>
+        <w:tc>
+          <w:tcPr>
+            <w:tcW w:type="dxa" w:w="640"/>
+            <w:tcBorders>
+              <w:top w:val="single" w:color="B9D7F2" w:sz="4"/>
+              <w:left w:val="single" w:color="B9D7F2" w:sz="4"/>
+              <w:bottom w:val="single" w:color="B9D7F2" w:sz="4"/>
+              <w:right w:val="single" w:color="B9D7F2" w:sz="4"/>
+            </w:tcBorders>
+            <w:tcMar>
+              <w:top w:type="dxa" w:w="60"/>
+              <w:left w:type="dxa" w:w="90"/>
+              <w:bottom w:type="dxa" w:w="60"/>
+              <w:right w:type="dxa" w:w="90"/>
+            </w:tcMar>
+          </w:tcPr>
+          <w:p>
+            <w:pPr>
+              <w:spacing w:after="0" w:before="0"/>
+            </w:pPr>
+            <w:r>
+              <w:rPr>
+                <w:rFonts w:ascii="Arial" w:cs="Arial" w:eastAsia="Arial" w:hAnsi="Arial"/>
+                <w:color w:val="15202B"/>
+                <w:sz w:val="18"/>
+                <w:szCs w:val="18"/>
+              </w:rPr>
+              <w:t xml:space="preserve">25.3</w:t>
+            </w:r>
+          </w:p>
+        </w:tc>
+        <w:tc>
+          <w:tcPr>
+            <w:tcW w:type="dxa" w:w="3820"/>
+            <w:tcBorders>
+              <w:top w:val="single" w:color="B9D7F2" w:sz="4"/>
+              <w:left w:val="single" w:color="B9D7F2" w:sz="4"/>
+              <w:bottom w:val="single" w:color="B9D7F2" w:sz="4"/>
+              <w:right w:val="single" w:color="B9D7F2" w:sz="4"/>
+            </w:tcBorders>
+            <w:tcMar>
+              <w:top w:type="dxa" w:w="60"/>
+              <w:left w:type="dxa" w:w="90"/>
+              <w:bottom w:type="dxa" w:w="60"/>
+              <w:right w:type="dxa" w:w="90"/>
+            </w:tcMar>
+          </w:tcPr>
+          <w:p>
+            <w:pPr>
+              <w:spacing w:after="0" w:before="0"/>
+            </w:pPr>
+            <w:r>
+              <w:rPr>
+                <w:rFonts w:ascii="Arial" w:cs="Arial" w:eastAsia="Arial" w:hAnsi="Arial"/>
+                <w:color w:val="15202B"/>
+                <w:sz w:val="18"/>
+                <w:szCs w:val="18"/>
+              </w:rPr>
+              <w:t xml:space="preserve">Mark a 3-gallon order Out for Delivery.</w:t>
+            </w:r>
+          </w:p>
+        </w:tc>
+        <w:tc>
+          <w:tcPr>
+            <w:tcW w:type="dxa" w:w="3900"/>
+            <w:tcBorders>
+              <w:top w:val="single" w:color="B9D7F2" w:sz="4"/>
+              <w:left w:val="single" w:color="B9D7F2" w:sz="4"/>
+              <w:bottom w:val="single" w:color="B9D7F2" w:sz="4"/>
+              <w:right w:val="single" w:color="B9D7F2" w:sz="4"/>
+            </w:tcBorders>
+            <w:tcMar>
+              <w:top w:type="dxa" w:w="60"/>
+              <w:left w:type="dxa" w:w="90"/>
+              <w:bottom w:type="dxa" w:w="60"/>
+              <w:right w:type="dxa" w:w="90"/>
+            </w:tcMar>
+          </w:tcPr>
+          <w:p>
+            <w:pPr>
+              <w:spacing w:after="0" w:before="0"/>
+            </w:pPr>
+            <w:r>
+              <w:rPr>
+                <w:rFonts w:ascii="Arial" w:cs="Arial" w:eastAsia="Arial" w:hAnsi="Arial"/>
+                <w:color w:val="15202B"/>
+                <w:sz w:val="18"/>
+                <w:szCs w:val="18"/>
+              </w:rPr>
+              <w:t xml:space="preserve">Counter goes up by 3 (only when it goes out, not when it is accepted or logged).</w:t>
+            </w:r>
+          </w:p>
+        </w:tc>
+        <w:tc>
+          <w:tcPr>
+            <w:tcW w:type="dxa" w:w="900"/>
+            <w:tcBorders>
+              <w:top w:val="single" w:color="B9D7F2" w:sz="4"/>
+              <w:left w:val="single" w:color="B9D7F2" w:sz="4"/>
+              <w:bottom w:val="single" w:color="B9D7F2" w:sz="4"/>
+              <w:right w:val="single" w:color="B9D7F2" w:sz="4"/>
+            </w:tcBorders>
+            <w:tcMar>
+              <w:top w:type="dxa" w:w="60"/>
+              <w:left w:type="dxa" w:w="90"/>
+              <w:bottom w:type="dxa" w:w="60"/>
+              <w:right w:type="dxa" w:w="90"/>
+            </w:tcMar>
+          </w:tcPr>
+          <w:p>
+            <w:pPr>
+              <w:spacing w:after="0" w:before="0"/>
+            </w:pPr>
+            <w:r>
+              <w:rPr>
+                <w:rFonts w:ascii="Arial" w:cs="Arial" w:eastAsia="Arial" w:hAnsi="Arial"/>
+                <w:color w:val="15202B"/>
+                <w:sz w:val="18"/>
+                <w:szCs w:val="18"/>
+              </w:rPr>
+              <w:t xml:space="preserve">☐ Pass</w:t>
+            </w:r>
+          </w:p>
+          <w:p>
+            <w:pPr>
+              <w:spacing w:after="0" w:before="0"/>
+            </w:pPr>
+            <w:r>
+              <w:rPr>
+                <w:rFonts w:ascii="Arial" w:cs="Arial" w:eastAsia="Arial" w:hAnsi="Arial"/>
+                <w:color w:val="15202B"/>
+                <w:sz w:val="18"/>
+                <w:szCs w:val="18"/>
+              </w:rPr>
+              <w:t xml:space="preserve">☐ Fail</w:t>
+            </w:r>
+          </w:p>
+        </w:tc>
+        <w:tc>
+          <w:tcPr>
+            <w:tcW w:type="dxa" w:w="1206"/>
+            <w:tcBorders>
+              <w:top w:val="single" w:color="B9D7F2" w:sz="4"/>
+              <w:left w:val="single" w:color="B9D7F2" w:sz="4"/>
+              <w:bottom w:val="single" w:color="B9D7F2" w:sz="4"/>
+              <w:right w:val="single" w:color="B9D7F2" w:sz="4"/>
+            </w:tcBorders>
+            <w:tcMar>
+              <w:top w:type="dxa" w:w="60"/>
+              <w:left w:type="dxa" w:w="90"/>
+              <w:bottom w:type="dxa" w:w="60"/>
+              <w:right w:type="dxa" w:w="90"/>
+            </w:tcMar>
+          </w:tcPr>
+          <w:p>
+            <w:pPr>
+              <w:spacing w:after="0" w:before="0"/>
+            </w:pPr>
+            <w:r>
+              <w:rPr>
+                <w:rFonts w:ascii="Arial" w:cs="Arial" w:eastAsia="Arial" w:hAnsi="Arial"/>
+                <w:color w:val="15202B"/>
+                <w:sz w:val="18"/>
+                <w:szCs w:val="18"/>
+              </w:rPr>
+              <w:t xml:space="preserve"/>
+            </w:r>
+          </w:p>
+        </w:tc>
+      </w:tr>
+      <w:tr>
+        <w:trPr>
+          <w:cantSplit/>
+        </w:trPr>
+        <w:tc>
+          <w:tcPr>
+            <w:tcW w:type="dxa" w:w="640"/>
+            <w:tcBorders>
+              <w:top w:val="single" w:color="B9D7F2" w:sz="4"/>
+              <w:left w:val="single" w:color="B9D7F2" w:sz="4"/>
+              <w:bottom w:val="single" w:color="B9D7F2" w:sz="4"/>
+              <w:right w:val="single" w:color="B9D7F2" w:sz="4"/>
+            </w:tcBorders>
+            <w:shd w:fill="EAF4FD" w:color="auto" w:val="clear"/>
+            <w:tcMar>
+              <w:top w:type="dxa" w:w="60"/>
+              <w:left w:type="dxa" w:w="90"/>
+              <w:bottom w:type="dxa" w:w="60"/>
+              <w:right w:type="dxa" w:w="90"/>
+            </w:tcMar>
+          </w:tcPr>
+          <w:p>
+            <w:pPr>
+              <w:spacing w:after="0" w:before="0"/>
+            </w:pPr>
+            <w:r>
+              <w:rPr>
+                <w:rFonts w:ascii="Arial" w:cs="Arial" w:eastAsia="Arial" w:hAnsi="Arial"/>
+                <w:color w:val="15202B"/>
+                <w:sz w:val="18"/>
+                <w:szCs w:val="18"/>
+              </w:rPr>
+              <w:t xml:space="preserve">25.4</w:t>
+            </w:r>
+          </w:p>
+        </w:tc>
+        <w:tc>
+          <w:tcPr>
+            <w:tcW w:type="dxa" w:w="3820"/>
+            <w:tcBorders>
+              <w:top w:val="single" w:color="B9D7F2" w:sz="4"/>
+              <w:left w:val="single" w:color="B9D7F2" w:sz="4"/>
+              <w:bottom w:val="single" w:color="B9D7F2" w:sz="4"/>
+              <w:right w:val="single" w:color="B9D7F2" w:sz="4"/>
+            </w:tcBorders>
+            <w:shd w:fill="EAF4FD" w:color="auto" w:val="clear"/>
+            <w:tcMar>
+              <w:top w:type="dxa" w:w="60"/>
+              <w:left w:type="dxa" w:w="90"/>
+              <w:bottom w:type="dxa" w:w="60"/>
+              <w:right w:type="dxa" w:w="90"/>
+            </w:tcMar>
+          </w:tcPr>
+          <w:p>
+            <w:pPr>
+              <w:spacing w:after="0" w:before="0"/>
+            </w:pPr>
+            <w:r>
+              <w:rPr>
+                <w:rFonts w:ascii="Arial" w:cs="Arial" w:eastAsia="Arial" w:hAnsi="Arial"/>
+                <w:color w:val="15202B"/>
+                <w:sz w:val="18"/>
+                <w:szCs w:val="18"/>
+              </w:rPr>
+              <w:t xml:space="preserve">Re-deliver a Not delivered order and send it out again.</w:t>
+            </w:r>
+          </w:p>
+        </w:tc>
+        <w:tc>
+          <w:tcPr>
+            <w:tcW w:type="dxa" w:w="3900"/>
+            <w:tcBorders>
+              <w:top w:val="single" w:color="B9D7F2" w:sz="4"/>
+              <w:left w:val="single" w:color="B9D7F2" w:sz="4"/>
+              <w:bottom w:val="single" w:color="B9D7F2" w:sz="4"/>
+              <w:right w:val="single" w:color="B9D7F2" w:sz="4"/>
+            </w:tcBorders>
+            <w:shd w:fill="EAF4FD" w:color="auto" w:val="clear"/>
+            <w:tcMar>
+              <w:top w:type="dxa" w:w="60"/>
+              <w:left w:type="dxa" w:w="90"/>
+              <w:bottom w:type="dxa" w:w="60"/>
+              <w:right w:type="dxa" w:w="90"/>
+            </w:tcMar>
+          </w:tcPr>
+          <w:p>
+            <w:pPr>
+              <w:spacing w:after="0" w:before="0"/>
+            </w:pPr>
+            <w:r>
+              <w:rPr>
+                <w:rFonts w:ascii="Arial" w:cs="Arial" w:eastAsia="Arial" w:hAnsi="Arial"/>
+                <w:color w:val="15202B"/>
+                <w:sz w:val="18"/>
+                <w:szCs w:val="18"/>
+              </w:rPr>
+              <w:t xml:space="preserve">Counter does NOT go up again for that order.</w:t>
+            </w:r>
+          </w:p>
+        </w:tc>
+        <w:tc>
+          <w:tcPr>
+            <w:tcW w:type="dxa" w:w="900"/>
+            <w:tcBorders>
+              <w:top w:val="single" w:color="B9D7F2" w:sz="4"/>
+              <w:left w:val="single" w:color="B9D7F2" w:sz="4"/>
+              <w:bottom w:val="single" w:color="B9D7F2" w:sz="4"/>
+              <w:right w:val="single" w:color="B9D7F2" w:sz="4"/>
+            </w:tcBorders>
+            <w:shd w:fill="EAF4FD" w:color="auto" w:val="clear"/>
+            <w:tcMar>
+              <w:top w:type="dxa" w:w="60"/>
+              <w:left w:type="dxa" w:w="90"/>
+              <w:bottom w:type="dxa" w:w="60"/>
+              <w:right w:type="dxa" w:w="90"/>
+            </w:tcMar>
+          </w:tcPr>
+          <w:p>
+            <w:pPr>
+              <w:spacing w:after="0" w:before="0"/>
+            </w:pPr>
+            <w:r>
+              <w:rPr>
+                <w:rFonts w:ascii="Arial" w:cs="Arial" w:eastAsia="Arial" w:hAnsi="Arial"/>
+                <w:color w:val="15202B"/>
+                <w:sz w:val="18"/>
+                <w:szCs w:val="18"/>
+              </w:rPr>
+              <w:t xml:space="preserve">☐ Pass</w:t>
+            </w:r>
+          </w:p>
+          <w:p>
+            <w:pPr>
+              <w:spacing w:after="0" w:before="0"/>
+            </w:pPr>
+            <w:r>
+              <w:rPr>
+                <w:rFonts w:ascii="Arial" w:cs="Arial" w:eastAsia="Arial" w:hAnsi="Arial"/>
+                <w:color w:val="15202B"/>
+                <w:sz w:val="18"/>
+                <w:szCs w:val="18"/>
+              </w:rPr>
+              <w:t xml:space="preserve">☐ Fail</w:t>
+            </w:r>
+          </w:p>
+        </w:tc>
+        <w:tc>
+          <w:tcPr>
+            <w:tcW w:type="dxa" w:w="1206"/>
+            <w:tcBorders>
+              <w:top w:val="single" w:color="B9D7F2" w:sz="4"/>
+              <w:left w:val="single" w:color="B9D7F2" w:sz="4"/>
+              <w:bottom w:val="single" w:color="B9D7F2" w:sz="4"/>
+              <w:right w:val="single" w:color="B9D7F2" w:sz="4"/>
+            </w:tcBorders>
+            <w:shd w:fill="EAF4FD" w:color="auto" w:val="clear"/>
+            <w:tcMar>
+              <w:top w:type="dxa" w:w="60"/>
+              <w:left w:type="dxa" w:w="90"/>
+              <w:bottom w:type="dxa" w:w="60"/>
+              <w:right w:type="dxa" w:w="90"/>
+            </w:tcMar>
+          </w:tcPr>
+          <w:p>
+            <w:pPr>
+              <w:spacing w:after="0" w:before="0"/>
+            </w:pPr>
+            <w:r>
+              <w:rPr>
+                <w:rFonts w:ascii="Arial" w:cs="Arial" w:eastAsia="Arial" w:hAnsi="Arial"/>
+                <w:color w:val="15202B"/>
+                <w:sz w:val="18"/>
+                <w:szCs w:val="18"/>
+              </w:rPr>
+              <w:t xml:space="preserve"/>
+            </w:r>
+          </w:p>
+        </w:tc>
+      </w:tr>
+      <w:tr>
+        <w:trPr>
+          <w:cantSplit/>
+        </w:trPr>
+        <w:tc>
+          <w:tcPr>
+            <w:tcW w:type="dxa" w:w="640"/>
+            <w:tcBorders>
+              <w:top w:val="single" w:color="B9D7F2" w:sz="4"/>
+              <w:left w:val="single" w:color="B9D7F2" w:sz="4"/>
+              <w:bottom w:val="single" w:color="B9D7F2" w:sz="4"/>
+              <w:right w:val="single" w:color="B9D7F2" w:sz="4"/>
+            </w:tcBorders>
+            <w:tcMar>
+              <w:top w:type="dxa" w:w="60"/>
+              <w:left w:type="dxa" w:w="90"/>
+              <w:bottom w:type="dxa" w:w="60"/>
+              <w:right w:type="dxa" w:w="90"/>
+            </w:tcMar>
+          </w:tcPr>
+          <w:p>
+            <w:pPr>
+              <w:spacing w:after="0" w:before="0"/>
+            </w:pPr>
+            <w:r>
+              <w:rPr>
+                <w:rFonts w:ascii="Arial" w:cs="Arial" w:eastAsia="Arial" w:hAnsi="Arial"/>
+                <w:color w:val="15202B"/>
+                <w:sz w:val="18"/>
+                <w:szCs w:val="18"/>
+              </w:rPr>
+              <w:t xml:space="preserve">25.5</w:t>
+            </w:r>
+          </w:p>
+        </w:tc>
+        <w:tc>
+          <w:tcPr>
+            <w:tcW w:type="dxa" w:w="3820"/>
+            <w:tcBorders>
+              <w:top w:val="single" w:color="B9D7F2" w:sz="4"/>
+              <w:left w:val="single" w:color="B9D7F2" w:sz="4"/>
+              <w:bottom w:val="single" w:color="B9D7F2" w:sz="4"/>
+              <w:right w:val="single" w:color="B9D7F2" w:sz="4"/>
+            </w:tcBorders>
+            <w:tcMar>
+              <w:top w:type="dxa" w:w="60"/>
+              <w:left w:type="dxa" w:w="90"/>
+              <w:bottom w:type="dxa" w:w="60"/>
+              <w:right w:type="dxa" w:w="90"/>
+            </w:tcMar>
+          </w:tcPr>
+          <w:p>
+            <w:pPr>
+              <w:spacing w:after="0" w:before="0"/>
+            </w:pPr>
+            <w:r>
+              <w:rPr>
+                <w:rFonts w:ascii="Arial" w:cs="Arial" w:eastAsia="Arial" w:hAnsi="Arial"/>
+                <w:color w:val="15202B"/>
+                <w:sz w:val="18"/>
+                <w:szCs w:val="18"/>
+              </w:rPr>
+              <w:t xml:space="preserve">Bring the counter to 60 or more.</w:t>
+            </w:r>
+          </w:p>
+        </w:tc>
+        <w:tc>
+          <w:tcPr>
+            <w:tcW w:type="dxa" w:w="3900"/>
+            <w:tcBorders>
+              <w:top w:val="single" w:color="B9D7F2" w:sz="4"/>
+              <w:left w:val="single" w:color="B9D7F2" w:sz="4"/>
+              <w:bottom w:val="single" w:color="B9D7F2" w:sz="4"/>
+              <w:right w:val="single" w:color="B9D7F2" w:sz="4"/>
+            </w:tcBorders>
+            <w:tcMar>
+              <w:top w:type="dxa" w:w="60"/>
+              <w:left w:type="dxa" w:w="90"/>
+              <w:bottom w:type="dxa" w:w="60"/>
+              <w:right w:type="dxa" w:w="90"/>
+            </w:tcMar>
+          </w:tcPr>
+          <w:p>
+            <w:pPr>
+              <w:spacing w:after="0" w:before="0"/>
+            </w:pPr>
+            <w:r>
+              <w:rPr>
+                <w:rFonts w:ascii="Arial" w:cs="Arial" w:eastAsia="Arial" w:hAnsi="Arial"/>
+                <w:color w:val="15202B"/>
+                <w:sz w:val="18"/>
+                <w:szCs w:val="18"/>
+              </w:rPr>
+              <w:t xml:space="preserve">Staff: blue box "Tell the owner: water tank needs refilling". Owner: Home tank card turns blue with "Refill the water tank" and a bell alert "Tank at 60".</w:t>
+            </w:r>
+          </w:p>
+        </w:tc>
+        <w:tc>
+          <w:tcPr>
+            <w:tcW w:type="dxa" w:w="900"/>
+            <w:tcBorders>
+              <w:top w:val="single" w:color="B9D7F2" w:sz="4"/>
+              <w:left w:val="single" w:color="B9D7F2" w:sz="4"/>
+              <w:bottom w:val="single" w:color="B9D7F2" w:sz="4"/>
+              <w:right w:val="single" w:color="B9D7F2" w:sz="4"/>
+            </w:tcBorders>
+            <w:tcMar>
+              <w:top w:type="dxa" w:w="60"/>
+              <w:left w:type="dxa" w:w="90"/>
+              <w:bottom w:type="dxa" w:w="60"/>
+              <w:right w:type="dxa" w:w="90"/>
+            </w:tcMar>
+          </w:tcPr>
+          <w:p>
+            <w:pPr>
+              <w:spacing w:after="0" w:before="0"/>
+            </w:pPr>
+            <w:r>
+              <w:rPr>
+                <w:rFonts w:ascii="Arial" w:cs="Arial" w:eastAsia="Arial" w:hAnsi="Arial"/>
+                <w:color w:val="15202B"/>
+                <w:sz w:val="18"/>
+                <w:szCs w:val="18"/>
+              </w:rPr>
+              <w:t xml:space="preserve">☐ Pass</w:t>
+            </w:r>
+          </w:p>
+          <w:p>
+            <w:pPr>
+              <w:spacing w:after="0" w:before="0"/>
+            </w:pPr>
+            <w:r>
+              <w:rPr>
+                <w:rFonts w:ascii="Arial" w:cs="Arial" w:eastAsia="Arial" w:hAnsi="Arial"/>
+                <w:color w:val="15202B"/>
+                <w:sz w:val="18"/>
+                <w:szCs w:val="18"/>
+              </w:rPr>
+              <w:t xml:space="preserve">☐ Fail</w:t>
+            </w:r>
+          </w:p>
+        </w:tc>
+        <w:tc>
+          <w:tcPr>
+            <w:tcW w:type="dxa" w:w="1206"/>
+            <w:tcBorders>
+              <w:top w:val="single" w:color="B9D7F2" w:sz="4"/>
+              <w:left w:val="single" w:color="B9D7F2" w:sz="4"/>
+              <w:bottom w:val="single" w:color="B9D7F2" w:sz="4"/>
+              <w:right w:val="single" w:color="B9D7F2" w:sz="4"/>
+            </w:tcBorders>
+            <w:tcMar>
+              <w:top w:type="dxa" w:w="60"/>
+              <w:left w:type="dxa" w:w="90"/>
+              <w:bottom w:type="dxa" w:w="60"/>
+              <w:right w:type="dxa" w:w="90"/>
+            </w:tcMar>
+          </w:tcPr>
+          <w:p>
+            <w:pPr>
+              <w:spacing w:after="0" w:before="0"/>
+            </w:pPr>
+            <w:r>
+              <w:rPr>
+                <w:rFonts w:ascii="Arial" w:cs="Arial" w:eastAsia="Arial" w:hAnsi="Arial"/>
+                <w:color w:val="15202B"/>
+                <w:sz w:val="18"/>
+                <w:szCs w:val="18"/>
+              </w:rPr>
+              <w:t xml:space="preserve"/>
+            </w:r>
+          </w:p>
+        </w:tc>
+      </w:tr>
+      <w:tr>
+        <w:trPr>
+          <w:cantSplit/>
+        </w:trPr>
+        <w:tc>
+          <w:tcPr>
+            <w:tcW w:type="dxa" w:w="640"/>
+            <w:tcBorders>
+              <w:top w:val="single" w:color="B9D7F2" w:sz="4"/>
+              <w:left w:val="single" w:color="B9D7F2" w:sz="4"/>
+              <w:bottom w:val="single" w:color="B9D7F2" w:sz="4"/>
+              <w:right w:val="single" w:color="B9D7F2" w:sz="4"/>
+            </w:tcBorders>
+            <w:shd w:fill="EAF4FD" w:color="auto" w:val="clear"/>
+            <w:tcMar>
+              <w:top w:type="dxa" w:w="60"/>
+              <w:left w:type="dxa" w:w="90"/>
+              <w:bottom w:type="dxa" w:w="60"/>
+              <w:right w:type="dxa" w:w="90"/>
+            </w:tcMar>
+          </w:tcPr>
+          <w:p>
+            <w:pPr>
+              <w:spacing w:after="0" w:before="0"/>
+            </w:pPr>
+            <w:r>
+              <w:rPr>
+                <w:rFonts w:ascii="Arial" w:cs="Arial" w:eastAsia="Arial" w:hAnsi="Arial"/>
+                <w:color w:val="15202B"/>
+                <w:sz w:val="18"/>
+                <w:szCs w:val="18"/>
+              </w:rPr>
+              <w:t xml:space="preserve">25.6</w:t>
+            </w:r>
+          </w:p>
+        </w:tc>
+        <w:tc>
+          <w:tcPr>
+            <w:tcW w:type="dxa" w:w="3820"/>
+            <w:tcBorders>
+              <w:top w:val="single" w:color="B9D7F2" w:sz="4"/>
+              <w:left w:val="single" w:color="B9D7F2" w:sz="4"/>
+              <w:bottom w:val="single" w:color="B9D7F2" w:sz="4"/>
+              <w:right w:val="single" w:color="B9D7F2" w:sz="4"/>
+            </w:tcBorders>
+            <w:shd w:fill="EAF4FD" w:color="auto" w:val="clear"/>
+            <w:tcMar>
+              <w:top w:type="dxa" w:w="60"/>
+              <w:left w:type="dxa" w:w="90"/>
+              <w:bottom w:type="dxa" w:w="60"/>
+              <w:right w:type="dxa" w:w="90"/>
+            </w:tcMar>
+          </w:tcPr>
+          <w:p>
+            <w:pPr>
+              <w:spacing w:after="0" w:before="0"/>
+            </w:pPr>
+            <w:r>
+              <w:rPr>
+                <w:rFonts w:ascii="Arial" w:cs="Arial" w:eastAsia="Arial" w:hAnsi="Arial"/>
+                <w:color w:val="15202B"/>
+                <w:sz w:val="18"/>
+                <w:szCs w:val="18"/>
+              </w:rPr>
+              <w:t xml:space="preserve">Owner: Home &gt; Water tank refilled &gt; Cancel.</w:t>
+            </w:r>
+          </w:p>
+        </w:tc>
+        <w:tc>
+          <w:tcPr>
+            <w:tcW w:type="dxa" w:w="3900"/>
+            <w:tcBorders>
+              <w:top w:val="single" w:color="B9D7F2" w:sz="4"/>
+              <w:left w:val="single" w:color="B9D7F2" w:sz="4"/>
+              <w:bottom w:val="single" w:color="B9D7F2" w:sz="4"/>
+              <w:right w:val="single" w:color="B9D7F2" w:sz="4"/>
+            </w:tcBorders>
+            <w:shd w:fill="EAF4FD" w:color="auto" w:val="clear"/>
+            <w:tcMar>
+              <w:top w:type="dxa" w:w="60"/>
+              <w:left w:type="dxa" w:w="90"/>
+              <w:bottom w:type="dxa" w:w="60"/>
+              <w:right w:type="dxa" w:w="90"/>
+            </w:tcMar>
+          </w:tcPr>
+          <w:p>
+            <w:pPr>
+              <w:spacing w:after="0" w:before="0"/>
+            </w:pPr>
+            <w:r>
+              <w:rPr>
+                <w:rFonts w:ascii="Arial" w:cs="Arial" w:eastAsia="Arial" w:hAnsi="Arial"/>
+                <w:color w:val="15202B"/>
+                <w:sz w:val="18"/>
+                <w:szCs w:val="18"/>
+              </w:rPr>
+              <w:t xml:space="preserve">Nothing changes.</w:t>
+            </w:r>
+          </w:p>
+        </w:tc>
+        <w:tc>
+          <w:tcPr>
+            <w:tcW w:type="dxa" w:w="900"/>
+            <w:tcBorders>
+              <w:top w:val="single" w:color="B9D7F2" w:sz="4"/>
+              <w:left w:val="single" w:color="B9D7F2" w:sz="4"/>
+              <w:bottom w:val="single" w:color="B9D7F2" w:sz="4"/>
+              <w:right w:val="single" w:color="B9D7F2" w:sz="4"/>
+            </w:tcBorders>
+            <w:shd w:fill="EAF4FD" w:color="auto" w:val="clear"/>
+            <w:tcMar>
+              <w:top w:type="dxa" w:w="60"/>
+              <w:left w:type="dxa" w:w="90"/>
+              <w:bottom w:type="dxa" w:w="60"/>
+              <w:right w:type="dxa" w:w="90"/>
+            </w:tcMar>
+          </w:tcPr>
+          <w:p>
+            <w:pPr>
+              <w:spacing w:after="0" w:before="0"/>
+            </w:pPr>
+            <w:r>
+              <w:rPr>
+                <w:rFonts w:ascii="Arial" w:cs="Arial" w:eastAsia="Arial" w:hAnsi="Arial"/>
+                <w:color w:val="15202B"/>
+                <w:sz w:val="18"/>
+                <w:szCs w:val="18"/>
+              </w:rPr>
+              <w:t xml:space="preserve">☐ Pass</w:t>
+            </w:r>
+          </w:p>
+          <w:p>
+            <w:pPr>
+              <w:spacing w:after="0" w:before="0"/>
+            </w:pPr>
+            <w:r>
+              <w:rPr>
+                <w:rFonts w:ascii="Arial" w:cs="Arial" w:eastAsia="Arial" w:hAnsi="Arial"/>
+                <w:color w:val="15202B"/>
+                <w:sz w:val="18"/>
+                <w:szCs w:val="18"/>
+              </w:rPr>
+              <w:t xml:space="preserve">☐ Fail</w:t>
+            </w:r>
+          </w:p>
+        </w:tc>
+        <w:tc>
+          <w:tcPr>
+            <w:tcW w:type="dxa" w:w="1206"/>
+            <w:tcBorders>
+              <w:top w:val="single" w:color="B9D7F2" w:sz="4"/>
+              <w:left w:val="single" w:color="B9D7F2" w:sz="4"/>
+              <w:bottom w:val="single" w:color="B9D7F2" w:sz="4"/>
+              <w:right w:val="single" w:color="B9D7F2" w:sz="4"/>
+            </w:tcBorders>
+            <w:shd w:fill="EAF4FD" w:color="auto" w:val="clear"/>
+            <w:tcMar>
+              <w:top w:type="dxa" w:w="60"/>
+              <w:left w:type="dxa" w:w="90"/>
+              <w:bottom w:type="dxa" w:w="60"/>
+              <w:right w:type="dxa" w:w="90"/>
+            </w:tcMar>
+          </w:tcPr>
+          <w:p>
+            <w:pPr>
+              <w:spacing w:after="0" w:before="0"/>
+            </w:pPr>
+            <w:r>
+              <w:rPr>
+                <w:rFonts w:ascii="Arial" w:cs="Arial" w:eastAsia="Arial" w:hAnsi="Arial"/>
+                <w:color w:val="15202B"/>
+                <w:sz w:val="18"/>
+                <w:szCs w:val="18"/>
+              </w:rPr>
+              <w:t xml:space="preserve"/>
+            </w:r>
+          </w:p>
+        </w:tc>
+      </w:tr>
+      <w:tr>
+        <w:trPr>
+          <w:cantSplit/>
+        </w:trPr>
+        <w:tc>
+          <w:tcPr>
+            <w:tcW w:type="dxa" w:w="640"/>
+            <w:tcBorders>
+              <w:top w:val="single" w:color="B9D7F2" w:sz="4"/>
+              <w:left w:val="single" w:color="B9D7F2" w:sz="4"/>
+              <w:bottom w:val="single" w:color="B9D7F2" w:sz="4"/>
+              <w:right w:val="single" w:color="B9D7F2" w:sz="4"/>
+            </w:tcBorders>
+            <w:tcMar>
+              <w:top w:type="dxa" w:w="60"/>
+              <w:left w:type="dxa" w:w="90"/>
+              <w:bottom w:type="dxa" w:w="60"/>
+              <w:right w:type="dxa" w:w="90"/>
+            </w:tcMar>
+          </w:tcPr>
+          <w:p>
+            <w:pPr>
+              <w:spacing w:after="0" w:before="0"/>
+            </w:pPr>
+            <w:r>
+              <w:rPr>
+                <w:rFonts w:ascii="Arial" w:cs="Arial" w:eastAsia="Arial" w:hAnsi="Arial"/>
+                <w:color w:val="15202B"/>
+                <w:sz w:val="18"/>
+                <w:szCs w:val="18"/>
+              </w:rPr>
+              <w:t xml:space="preserve">25.7</w:t>
+            </w:r>
+          </w:p>
+        </w:tc>
+        <w:tc>
+          <w:tcPr>
+            <w:tcW w:type="dxa" w:w="3820"/>
+            <w:tcBorders>
+              <w:top w:val="single" w:color="B9D7F2" w:sz="4"/>
+              <w:left w:val="single" w:color="B9D7F2" w:sz="4"/>
+              <w:bottom w:val="single" w:color="B9D7F2" w:sz="4"/>
+              <w:right w:val="single" w:color="B9D7F2" w:sz="4"/>
+            </w:tcBorders>
+            <w:tcMar>
+              <w:top w:type="dxa" w:w="60"/>
+              <w:left w:type="dxa" w:w="90"/>
+              <w:bottom w:type="dxa" w:w="60"/>
+              <w:right w:type="dxa" w:w="90"/>
+            </w:tcMar>
+          </w:tcPr>
+          <w:p>
+            <w:pPr>
+              <w:spacing w:after="0" w:before="0"/>
+            </w:pPr>
+            <w:r>
+              <w:rPr>
+                <w:rFonts w:ascii="Arial" w:cs="Arial" w:eastAsia="Arial" w:hAnsi="Arial"/>
+                <w:color w:val="15202B"/>
+                <w:sz w:val="18"/>
+                <w:szCs w:val="18"/>
+              </w:rPr>
+              <w:t xml:space="preserve">Owner: Water tank refilled &gt; Confirm.</w:t>
+            </w:r>
+          </w:p>
+        </w:tc>
+        <w:tc>
+          <w:tcPr>
+            <w:tcW w:type="dxa" w:w="3900"/>
+            <w:tcBorders>
+              <w:top w:val="single" w:color="B9D7F2" w:sz="4"/>
+              <w:left w:val="single" w:color="B9D7F2" w:sz="4"/>
+              <w:bottom w:val="single" w:color="B9D7F2" w:sz="4"/>
+              <w:right w:val="single" w:color="B9D7F2" w:sz="4"/>
+            </w:tcBorders>
+            <w:tcMar>
+              <w:top w:type="dxa" w:w="60"/>
+              <w:left w:type="dxa" w:w="90"/>
+              <w:bottom w:type="dxa" w:w="60"/>
+              <w:right w:type="dxa" w:w="90"/>
+            </w:tcMar>
+          </w:tcPr>
+          <w:p>
+            <w:pPr>
+              <w:spacing w:after="0" w:before="0"/>
+            </w:pPr>
+            <w:r>
+              <w:rPr>
+                <w:rFonts w:ascii="Arial" w:cs="Arial" w:eastAsia="Arial" w:hAnsi="Arial"/>
+                <w:color w:val="15202B"/>
+                <w:sz w:val="18"/>
+                <w:szCs w:val="18"/>
+              </w:rPr>
+              <w:t xml:space="preserve">"Counter = 0; alert cleared"; card shows 0 / 60. Staff To Do also shows 0 / 60.</w:t>
+            </w:r>
+          </w:p>
+        </w:tc>
+        <w:tc>
+          <w:tcPr>
+            <w:tcW w:type="dxa" w:w="900"/>
+            <w:tcBorders>
+              <w:top w:val="single" w:color="B9D7F2" w:sz="4"/>
+              <w:left w:val="single" w:color="B9D7F2" w:sz="4"/>
+              <w:bottom w:val="single" w:color="B9D7F2" w:sz="4"/>
+              <w:right w:val="single" w:color="B9D7F2" w:sz="4"/>
+            </w:tcBorders>
+            <w:tcMar>
+              <w:top w:type="dxa" w:w="60"/>
+              <w:left w:type="dxa" w:w="90"/>
+              <w:bottom w:type="dxa" w:w="60"/>
+              <w:right w:type="dxa" w:w="90"/>
+            </w:tcMar>
+          </w:tcPr>
+          <w:p>
+            <w:pPr>
+              <w:spacing w:after="0" w:before="0"/>
+            </w:pPr>
+            <w:r>
+              <w:rPr>
+                <w:rFonts w:ascii="Arial" w:cs="Arial" w:eastAsia="Arial" w:hAnsi="Arial"/>
+                <w:color w:val="15202B"/>
+                <w:sz w:val="18"/>
+                <w:szCs w:val="18"/>
+              </w:rPr>
+              <w:t xml:space="preserve">☐ Pass</w:t>
+            </w:r>
+          </w:p>
+          <w:p>
+            <w:pPr>
+              <w:spacing w:after="0" w:before="0"/>
+            </w:pPr>
+            <w:r>
+              <w:rPr>
+                <w:rFonts w:ascii="Arial" w:cs="Arial" w:eastAsia="Arial" w:hAnsi="Arial"/>
+                <w:color w:val="15202B"/>
+                <w:sz w:val="18"/>
+                <w:szCs w:val="18"/>
+              </w:rPr>
+              <w:t xml:space="preserve">☐ Fail</w:t>
+            </w:r>
+          </w:p>
+        </w:tc>
+        <w:tc>
+          <w:tcPr>
+            <w:tcW w:type="dxa" w:w="1206"/>
+            <w:tcBorders>
+              <w:top w:val="single" w:color="B9D7F2" w:sz="4"/>
+              <w:left w:val="single" w:color="B9D7F2" w:sz="4"/>
+              <w:bottom w:val="single" w:color="B9D7F2" w:sz="4"/>
+              <w:right w:val="single" w:color="B9D7F2" w:sz="4"/>
+            </w:tcBorders>
+            <w:tcMar>
+              <w:top w:type="dxa" w:w="60"/>
+              <w:left w:type="dxa" w:w="90"/>
+              <w:bottom w:type="dxa" w:w="60"/>
+              <w:right w:type="dxa" w:w="90"/>
+            </w:tcMar>
+          </w:tcPr>
+          <w:p>
+            <w:pPr>
+              <w:spacing w:after="0" w:before="0"/>
+            </w:pPr>
+            <w:r>
+              <w:rPr>
+                <w:rFonts w:ascii="Arial" w:cs="Arial" w:eastAsia="Arial" w:hAnsi="Arial"/>
+                <w:color w:val="15202B"/>
+                <w:sz w:val="18"/>
+                <w:szCs w:val="18"/>
+              </w:rPr>
+              <w:t xml:space="preserve"/>
+            </w:r>
+          </w:p>
+        </w:tc>
+      </w:tr>
+      <w:tr>
+        <w:trPr>
+          <w:cantSplit/>
+        </w:trPr>
+        <w:tc>
+          <w:tcPr>
+            <w:tcW w:type="dxa" w:w="640"/>
+            <w:tcBorders>
+              <w:top w:val="single" w:color="B9D7F2" w:sz="4"/>
+              <w:left w:val="single" w:color="B9D7F2" w:sz="4"/>
+              <w:bottom w:val="single" w:color="B9D7F2" w:sz="4"/>
+              <w:right w:val="single" w:color="B9D7F2" w:sz="4"/>
+            </w:tcBorders>
+            <w:shd w:fill="EAF4FD" w:color="auto" w:val="clear"/>
+            <w:tcMar>
+              <w:top w:type="dxa" w:w="60"/>
+              <w:left w:type="dxa" w:w="90"/>
+              <w:bottom w:type="dxa" w:w="60"/>
+              <w:right w:type="dxa" w:w="90"/>
+            </w:tcMar>
+          </w:tcPr>
+          <w:p>
+            <w:pPr>
+              <w:spacing w:after="0" w:before="0"/>
+            </w:pPr>
+            <w:r>
+              <w:rPr>
+                <w:rFonts w:ascii="Arial" w:cs="Arial" w:eastAsia="Arial" w:hAnsi="Arial"/>
+                <w:color w:val="15202B"/>
+                <w:sz w:val="18"/>
+                <w:szCs w:val="18"/>
+              </w:rPr>
+              <w:t xml:space="preserve">25.8</w:t>
+            </w:r>
+          </w:p>
+        </w:tc>
+        <w:tc>
+          <w:tcPr>
+            <w:tcW w:type="dxa" w:w="3820"/>
+            <w:tcBorders>
+              <w:top w:val="single" w:color="B9D7F2" w:sz="4"/>
+              <w:left w:val="single" w:color="B9D7F2" w:sz="4"/>
+              <w:bottom w:val="single" w:color="B9D7F2" w:sz="4"/>
+              <w:right w:val="single" w:color="B9D7F2" w:sz="4"/>
+            </w:tcBorders>
+            <w:shd w:fill="EAF4FD" w:color="auto" w:val="clear"/>
+            <w:tcMar>
+              <w:top w:type="dxa" w:w="60"/>
+              <w:left w:type="dxa" w:w="90"/>
+              <w:bottom w:type="dxa" w:w="60"/>
+              <w:right w:type="dxa" w:w="90"/>
+            </w:tcMar>
+          </w:tcPr>
+          <w:p>
+            <w:pPr>
+              <w:spacing w:after="0" w:before="0"/>
+            </w:pPr>
+            <w:r>
+              <w:rPr>
+                <w:rFonts w:ascii="Arial" w:cs="Arial" w:eastAsia="Arial" w:hAnsi="Arial"/>
+                <w:color w:val="15202B"/>
+                <w:sz w:val="18"/>
+                <w:szCs w:val="18"/>
+              </w:rPr>
+              <w:t xml:space="preserve">Owner: More &gt; Prices &amp; Settings &gt; Tank limit 70.</w:t>
+            </w:r>
+          </w:p>
+        </w:tc>
+        <w:tc>
+          <w:tcPr>
+            <w:tcW w:type="dxa" w:w="3900"/>
+            <w:tcBorders>
+              <w:top w:val="single" w:color="B9D7F2" w:sz="4"/>
+              <w:left w:val="single" w:color="B9D7F2" w:sz="4"/>
+              <w:bottom w:val="single" w:color="B9D7F2" w:sz="4"/>
+              <w:right w:val="single" w:color="B9D7F2" w:sz="4"/>
+            </w:tcBorders>
+            <w:shd w:fill="EAF4FD" w:color="auto" w:val="clear"/>
+            <w:tcMar>
+              <w:top w:type="dxa" w:w="60"/>
+              <w:left w:type="dxa" w:w="90"/>
+              <w:bottom w:type="dxa" w:w="60"/>
+              <w:right w:type="dxa" w:w="90"/>
+            </w:tcMar>
+          </w:tcPr>
+          <w:p>
+            <w:pPr>
+              <w:spacing w:after="0" w:before="0"/>
+            </w:pPr>
+            <w:r>
+              <w:rPr>
+                <w:rFonts w:ascii="Arial" w:cs="Arial" w:eastAsia="Arial" w:hAnsi="Arial"/>
+                <w:color w:val="15202B"/>
+                <w:sz w:val="18"/>
+                <w:szCs w:val="18"/>
+              </w:rPr>
+              <w:t xml:space="preserve">Home and To Do show "/ 70".</w:t>
+            </w:r>
+          </w:p>
+        </w:tc>
+        <w:tc>
+          <w:tcPr>
+            <w:tcW w:type="dxa" w:w="900"/>
+            <w:tcBorders>
+              <w:top w:val="single" w:color="B9D7F2" w:sz="4"/>
+              <w:left w:val="single" w:color="B9D7F2" w:sz="4"/>
+              <w:bottom w:val="single" w:color="B9D7F2" w:sz="4"/>
+              <w:right w:val="single" w:color="B9D7F2" w:sz="4"/>
+            </w:tcBorders>
+            <w:shd w:fill="EAF4FD" w:color="auto" w:val="clear"/>
+            <w:tcMar>
+              <w:top w:type="dxa" w:w="60"/>
+              <w:left w:type="dxa" w:w="90"/>
+              <w:bottom w:type="dxa" w:w="60"/>
+              <w:right w:type="dxa" w:w="90"/>
+            </w:tcMar>
+          </w:tcPr>
+          <w:p>
+            <w:pPr>
+              <w:spacing w:after="0" w:before="0"/>
+            </w:pPr>
+            <w:r>
+              <w:rPr>
+                <w:rFonts w:ascii="Arial" w:cs="Arial" w:eastAsia="Arial" w:hAnsi="Arial"/>
+                <w:color w:val="15202B"/>
+                <w:sz w:val="18"/>
+                <w:szCs w:val="18"/>
+              </w:rPr>
+              <w:t xml:space="preserve">☐ Pass</w:t>
+            </w:r>
+          </w:p>
+          <w:p>
+            <w:pPr>
+              <w:spacing w:after="0" w:before="0"/>
+            </w:pPr>
+            <w:r>
+              <w:rPr>
+                <w:rFonts w:ascii="Arial" w:cs="Arial" w:eastAsia="Arial" w:hAnsi="Arial"/>
+                <w:color w:val="15202B"/>
+                <w:sz w:val="18"/>
+                <w:szCs w:val="18"/>
+              </w:rPr>
+              <w:t xml:space="preserve">☐ Fail</w:t>
+            </w:r>
+          </w:p>
+        </w:tc>
+        <w:tc>
+          <w:tcPr>
+            <w:tcW w:type="dxa" w:w="1206"/>
+            <w:tcBorders>
+              <w:top w:val="single" w:color="B9D7F2" w:sz="4"/>
+              <w:left w:val="single" w:color="B9D7F2" w:sz="4"/>
+              <w:bottom w:val="single" w:color="B9D7F2" w:sz="4"/>
+              <w:right w:val="single" w:color="B9D7F2" w:sz="4"/>
+            </w:tcBorders>
+            <w:shd w:fill="EAF4FD" w:color="auto" w:val="clear"/>
+            <w:tcMar>
+              <w:top w:type="dxa" w:w="60"/>
+              <w:left w:type="dxa" w:w="90"/>
+              <w:bottom w:type="dxa" w:w="60"/>
+              <w:right w:type="dxa" w:w="90"/>
+            </w:tcMar>
+          </w:tcPr>
+          <w:p>
+            <w:pPr>
+              <w:spacing w:after="0" w:before="0"/>
+            </w:pPr>
+            <w:r>
+              <w:rPr>
+                <w:rFonts w:ascii="Arial" w:cs="Arial" w:eastAsia="Arial" w:hAnsi="Arial"/>
+                <w:color w:val="15202B"/>
+                <w:sz w:val="18"/>
+                <w:szCs w:val="18"/>
+              </w:rPr>
+              <w:t xml:space="preserve"/>
+            </w:r>
+          </w:p>
+        </w:tc>
+      </w:tr>
+    </w:tbl>
+    <w:p>
+      <w:pPr>
+        <w:pStyle w:val="Heading1"/>
+        <w:pageBreakBefore/>
+        <w:spacing w:after="60"/>
+      </w:pPr>
+      <w:r>
+        <w:rPr>
+          <w:rFonts w:ascii="Arial" w:cs="Arial" w:eastAsia="Arial" w:hAnsi="Arial"/>
+          <w:b/>
+          <w:bCs/>
+          <w:color w:val="0A84E0"/>
+          <w:sz w:val="28"/>
+          <w:szCs w:val="28"/>
+        </w:rPr>
+        <w:t xml:space="preserve">Step 26 · Gallon and seal stock</w:t>
+      </w:r>
+    </w:p>
+    <w:p>
+      <w:pPr>
+        <w:spacing w:after="60" w:before="0"/>
+      </w:pPr>
+      <w:r>
+        <w:rPr>
+          <w:rFonts w:ascii="Arial" w:cs="Arial" w:eastAsia="Arial" w:hAnsi="Arial"/>
+          <w:b/>
+          <w:bCs/>
+          <w:color w:val="15202B"/>
+          <w:sz w:val="19"/>
+          <w:szCs w:val="19"/>
+        </w:rPr>
+        <w:t xml:space="preserve">Screens: </w:t>
+      </w:r>
+      <w:r>
+        <w:rPr>
+          <w:rFonts w:ascii="Arial" w:cs="Arial" w:eastAsia="Arial" w:hAnsi="Arial"/>
+          <w:color w:val="15202B"/>
+          <w:sz w:val="19"/>
+          <w:szCs w:val="19"/>
+        </w:rPr>
+        <w:t xml:space="preserve">Admin Inventory 1-4, Admin Home 7</w:t>
+      </w:r>
+      <w:r>
+        <w:rPr>
+          <w:rFonts w:ascii="Arial" w:cs="Arial" w:eastAsia="Arial" w:hAnsi="Arial"/>
+          <w:b/>
+          <w:bCs/>
+          <w:color w:val="15202B"/>
+          <w:sz w:val="19"/>
+          <w:szCs w:val="19"/>
+        </w:rPr>
+        <w:t xml:space="preserve">    Log in as: </w:t>
+      </w:r>
+      <w:r>
+        <w:rPr>
+          <w:rFonts w:ascii="Arial" w:cs="Arial" w:eastAsia="Arial" w:hAnsi="Arial"/>
+          <w:color w:val="15202B"/>
+          <w:sz w:val="19"/>
+          <w:szCs w:val="19"/>
+        </w:rPr>
+        <w:t xml:space="preserve">Owner</w:t>
+      </w:r>
+    </w:p>
+    <w:p>
+      <w:pPr>
+        <w:spacing w:after="60" w:before="0"/>
+      </w:pPr>
+      <w:r>
+        <w:rPr>
+          <w:rFonts w:ascii="Arial" w:cs="Arial" w:eastAsia="Arial" w:hAnsi="Arial"/>
+          <w:b/>
+          <w:bCs/>
+          <w:color w:val="0A84E0"/>
+          <w:sz w:val="19"/>
+          <w:szCs w:val="19"/>
+        </w:rPr>
+        <w:t xml:space="preserve">Before: </w:t>
+      </w:r>
+      <w:r>
+        <w:rPr>
+          <w:rFonts w:ascii="Arial" w:cs="Arial" w:eastAsia="Arial" w:hAnsi="Arial"/>
+          <w:color w:val="15202B"/>
+          <w:sz w:val="19"/>
+          <w:szCs w:val="19"/>
+        </w:rPr>
+        <w:t xml:space="preserve">After RESET-DEMO-DATA the stock is 24 new gallons (below the level 30) and 420 seals.</w:t>
+      </w:r>
+    </w:p>
+    <w:tbl>
+      <w:tblPr>
+        <w:tblW w:type="dxa" w:w="10466"/>
+        <w:tblBorders>
+          <w:top w:val="single" w:color="auto" w:sz="4"/>
+          <w:left w:val="single" w:color="auto" w:sz="4"/>
+          <w:bottom w:val="single" w:color="auto" w:sz="4"/>
+          <w:right w:val="single" w:color="auto" w:sz="4"/>
+          <w:insideH w:val="single" w:color="auto" w:sz="4"/>
+          <w:insideV w:val="single" w:color="auto" w:sz="4"/>
+        </w:tblBorders>
+        <w:tblLayout w:type="fixed"/>
+      </w:tblPr>
+      <w:tblGrid>
+        <w:gridCol w:w="640"/>
+        <w:gridCol w:w="3820"/>
+        <w:gridCol w:w="3900"/>
+        <w:gridCol w:w="900"/>
+        <w:gridCol w:w="1206"/>
+      </w:tblGrid>
+      <w:tr>
+        <w:trPr>
+          <w:tblHeader/>
+        </w:trPr>
+        <w:tc>
+          <w:tcPr>
+            <w:tcW w:type="dxa" w:w="640"/>
+            <w:tcBorders>
+              <w:top w:val="single" w:color="B9D7F2" w:sz="4"/>
+              <w:left w:val="single" w:color="B9D7F2" w:sz="4"/>
+              <w:bottom w:val="single" w:color="B9D7F2" w:sz="4"/>
+              <w:right w:val="single" w:color="B9D7F2" w:sz="4"/>
+            </w:tcBorders>
+            <w:shd w:fill="0A84E0" w:color="auto" w:val="clear"/>
+            <w:tcMar>
+              <w:top w:type="dxa" w:w="60"/>
+              <w:left w:type="dxa" w:w="90"/>
+              <w:bottom w:type="dxa" w:w="60"/>
+              <w:right w:type="dxa" w:w="90"/>
+            </w:tcMar>
+          </w:tcPr>
+          <w:p>
+            <w:pPr>
+              <w:spacing w:after="0" w:before="0"/>
+            </w:pPr>
+            <w:r>
+              <w:rPr>
+                <w:rFonts w:ascii="Arial" w:cs="Arial" w:eastAsia="Arial" w:hAnsi="Arial"/>
+                <w:b/>
+                <w:bCs/>
+                <w:color w:val="FFFFFF"/>
+                <w:sz w:val="18"/>
+                <w:szCs w:val="18"/>
+              </w:rPr>
+              <w:t xml:space="preserve">#</w:t>
+            </w:r>
+          </w:p>
+        </w:tc>
+        <w:tc>
+          <w:tcPr>
+            <w:tcW w:type="dxa" w:w="3820"/>
+            <w:tcBorders>
+              <w:top w:val="single" w:color="B9D7F2" w:sz="4"/>
+              <w:left w:val="single" w:color="B9D7F2" w:sz="4"/>
+              <w:bottom w:val="single" w:color="B9D7F2" w:sz="4"/>
+              <w:right w:val="single" w:color="B9D7F2" w:sz="4"/>
+            </w:tcBorders>
+            <w:shd w:fill="0A84E0" w:color="auto" w:val="clear"/>
+            <w:tcMar>
+              <w:top w:type="dxa" w:w="60"/>
+              <w:left w:type="dxa" w:w="90"/>
+              <w:bottom w:type="dxa" w:w="60"/>
+              <w:right w:type="dxa" w:w="90"/>
+            </w:tcMar>
+          </w:tcPr>
+          <w:p>
+            <w:pPr>
+              <w:spacing w:after="0" w:before="0"/>
+            </w:pPr>
+            <w:r>
+              <w:rPr>
+                <w:rFonts w:ascii="Arial" w:cs="Arial" w:eastAsia="Arial" w:hAnsi="Arial"/>
+                <w:b/>
+                <w:bCs/>
+                <w:color w:val="FFFFFF"/>
+                <w:sz w:val="18"/>
+                <w:szCs w:val="18"/>
+              </w:rPr>
+              <w:t xml:space="preserve">What to do</w:t>
+            </w:r>
+          </w:p>
+        </w:tc>
+        <w:tc>
+          <w:tcPr>
+            <w:tcW w:type="dxa" w:w="3900"/>
+            <w:tcBorders>
+              <w:top w:val="single" w:color="B9D7F2" w:sz="4"/>
+              <w:left w:val="single" w:color="B9D7F2" w:sz="4"/>
+              <w:bottom w:val="single" w:color="B9D7F2" w:sz="4"/>
+              <w:right w:val="single" w:color="B9D7F2" w:sz="4"/>
+            </w:tcBorders>
+            <w:shd w:fill="0A84E0" w:color="auto" w:val="clear"/>
+            <w:tcMar>
+              <w:top w:type="dxa" w:w="60"/>
+              <w:left w:type="dxa" w:w="90"/>
+              <w:bottom w:type="dxa" w:w="60"/>
+              <w:right w:type="dxa" w:w="90"/>
+            </w:tcMar>
+          </w:tcPr>
+          <w:p>
+            <w:pPr>
+              <w:spacing w:after="0" w:before="0"/>
+            </w:pPr>
+            <w:r>
+              <w:rPr>
+                <w:rFonts w:ascii="Arial" w:cs="Arial" w:eastAsia="Arial" w:hAnsi="Arial"/>
+                <w:b/>
+                <w:bCs/>
+                <w:color w:val="FFFFFF"/>
+                <w:sz w:val="18"/>
+                <w:szCs w:val="18"/>
+              </w:rPr>
+              <w:t xml:space="preserve">What you should see</w:t>
+            </w:r>
+          </w:p>
+        </w:tc>
+        <w:tc>
+          <w:tcPr>
+            <w:tcW w:type="dxa" w:w="900"/>
+            <w:tcBorders>
+              <w:top w:val="single" w:color="B9D7F2" w:sz="4"/>
+              <w:left w:val="single" w:color="B9D7F2" w:sz="4"/>
+              <w:bottom w:val="single" w:color="B9D7F2" w:sz="4"/>
+              <w:right w:val="single" w:color="B9D7F2" w:sz="4"/>
+            </w:tcBorders>
+            <w:shd w:fill="0A84E0" w:color="auto" w:val="clear"/>
+            <w:tcMar>
+              <w:top w:type="dxa" w:w="60"/>
+              <w:left w:type="dxa" w:w="90"/>
+              <w:bottom w:type="dxa" w:w="60"/>
+              <w:right w:type="dxa" w:w="90"/>
+            </w:tcMar>
+          </w:tcPr>
+          <w:p>
+            <w:pPr>
+              <w:spacing w:after="0" w:before="0"/>
+            </w:pPr>
+            <w:r>
+              <w:rPr>
+                <w:rFonts w:ascii="Arial" w:cs="Arial" w:eastAsia="Arial" w:hAnsi="Arial"/>
+                <w:b/>
+                <w:bCs/>
+                <w:color w:val="FFFFFF"/>
+                <w:sz w:val="18"/>
+                <w:szCs w:val="18"/>
+              </w:rPr>
+              <w:t xml:space="preserve">Result</w:t>
+            </w:r>
+          </w:p>
+        </w:tc>
+        <w:tc>
+          <w:tcPr>
+            <w:tcW w:type="dxa" w:w="1206"/>
+            <w:tcBorders>
+              <w:top w:val="single" w:color="B9D7F2" w:sz="4"/>
+              <w:left w:val="single" w:color="B9D7F2" w:sz="4"/>
+              <w:bottom w:val="single" w:color="B9D7F2" w:sz="4"/>
+              <w:right w:val="single" w:color="B9D7F2" w:sz="4"/>
+            </w:tcBorders>
+            <w:shd w:fill="0A84E0" w:color="auto" w:val="clear"/>
+            <w:tcMar>
+              <w:top w:type="dxa" w:w="60"/>
+              <w:left w:type="dxa" w:w="90"/>
+              <w:bottom w:type="dxa" w:w="60"/>
+              <w:right w:type="dxa" w:w="90"/>
+            </w:tcMar>
+          </w:tcPr>
+          <w:p>
+            <w:pPr>
+              <w:spacing w:after="0" w:before="0"/>
+            </w:pPr>
+            <w:r>
+              <w:rPr>
+                <w:rFonts w:ascii="Arial" w:cs="Arial" w:eastAsia="Arial" w:hAnsi="Arial"/>
+                <w:b/>
+                <w:bCs/>
+                <w:color w:val="FFFFFF"/>
+                <w:sz w:val="18"/>
+                <w:szCs w:val="18"/>
+              </w:rPr>
+              <w:t xml:space="preserve">Notes</w:t>
+            </w:r>
+          </w:p>
+        </w:tc>
+      </w:tr>
+      <w:tr>
+        <w:trPr>
+          <w:cantSplit/>
+        </w:trPr>
+        <w:tc>
+          <w:tcPr>
+            <w:tcW w:type="dxa" w:w="640"/>
+            <w:tcBorders>
+              <w:top w:val="single" w:color="B9D7F2" w:sz="4"/>
+              <w:left w:val="single" w:color="B9D7F2" w:sz="4"/>
+              <w:bottom w:val="single" w:color="B9D7F2" w:sz="4"/>
+              <w:right w:val="single" w:color="B9D7F2" w:sz="4"/>
+            </w:tcBorders>
+            <w:tcMar>
+              <w:top w:type="dxa" w:w="60"/>
+              <w:left w:type="dxa" w:w="90"/>
+              <w:bottom w:type="dxa" w:w="60"/>
+              <w:right w:type="dxa" w:w="90"/>
+            </w:tcMar>
+          </w:tcPr>
+          <w:p>
+            <w:pPr>
+              <w:spacing w:after="0" w:before="0"/>
+            </w:pPr>
+            <w:r>
+              <w:rPr>
+                <w:rFonts w:ascii="Arial" w:cs="Arial" w:eastAsia="Arial" w:hAnsi="Arial"/>
+                <w:color w:val="15202B"/>
+                <w:sz w:val="18"/>
+                <w:szCs w:val="18"/>
+              </w:rPr>
+              <w:t xml:space="preserve">26.1</w:t>
+            </w:r>
+          </w:p>
+        </w:tc>
+        <w:tc>
+          <w:tcPr>
+            <w:tcW w:type="dxa" w:w="3820"/>
+            <w:tcBorders>
+              <w:top w:val="single" w:color="B9D7F2" w:sz="4"/>
+              <w:left w:val="single" w:color="B9D7F2" w:sz="4"/>
+              <w:bottom w:val="single" w:color="B9D7F2" w:sz="4"/>
+              <w:right w:val="single" w:color="B9D7F2" w:sz="4"/>
+            </w:tcBorders>
+            <w:tcMar>
+              <w:top w:type="dxa" w:w="60"/>
+              <w:left w:type="dxa" w:w="90"/>
+              <w:bottom w:type="dxa" w:w="60"/>
+              <w:right w:type="dxa" w:w="90"/>
+            </w:tcMar>
+          </w:tcPr>
+          <w:p>
+            <w:pPr>
+              <w:spacing w:after="0" w:before="0"/>
+            </w:pPr>
+            <w:r>
+              <w:rPr>
+                <w:rFonts w:ascii="Arial" w:cs="Arial" w:eastAsia="Arial" w:hAnsi="Arial"/>
+                <w:color w:val="15202B"/>
+                <w:sz w:val="18"/>
+                <w:szCs w:val="18"/>
+              </w:rPr>
+              <w:t xml:space="preserve">Inventory tab.</w:t>
+            </w:r>
+          </w:p>
+        </w:tc>
+        <w:tc>
+          <w:tcPr>
+            <w:tcW w:type="dxa" w:w="3900"/>
+            <w:tcBorders>
+              <w:top w:val="single" w:color="B9D7F2" w:sz="4"/>
+              <w:left w:val="single" w:color="B9D7F2" w:sz="4"/>
+              <w:bottom w:val="single" w:color="B9D7F2" w:sz="4"/>
+              <w:right w:val="single" w:color="B9D7F2" w:sz="4"/>
+            </w:tcBorders>
+            <w:tcMar>
+              <w:top w:type="dxa" w:w="60"/>
+              <w:left w:type="dxa" w:w="90"/>
+              <w:bottom w:type="dxa" w:w="60"/>
+              <w:right w:type="dxa" w:w="90"/>
+            </w:tcMar>
+          </w:tcPr>
+          <w:p>
+            <w:pPr>
+              <w:spacing w:after="0" w:before="0"/>
+            </w:pPr>
+            <w:r>
+              <w:rPr>
+                <w:rFonts w:ascii="Arial" w:cs="Arial" w:eastAsia="Arial" w:hAnsi="Arial"/>
+                <w:color w:val="15202B"/>
+                <w:sz w:val="18"/>
+                <w:szCs w:val="18"/>
+              </w:rPr>
+              <w:t xml:space="preserve">Stock Overview: "Low-stock warning · New Gallons: 24 left", New Gallons 24, Seals 420, Movement History and Borrowed Gallons buttons.</w:t>
+            </w:r>
+          </w:p>
+        </w:tc>
+        <w:tc>
+          <w:tcPr>
+            <w:tcW w:type="dxa" w:w="900"/>
+            <w:tcBorders>
+              <w:top w:val="single" w:color="B9D7F2" w:sz="4"/>
+              <w:left w:val="single" w:color="B9D7F2" w:sz="4"/>
+              <w:bottom w:val="single" w:color="B9D7F2" w:sz="4"/>
+              <w:right w:val="single" w:color="B9D7F2" w:sz="4"/>
+            </w:tcBorders>
+            <w:tcMar>
+              <w:top w:type="dxa" w:w="60"/>
+              <w:left w:type="dxa" w:w="90"/>
+              <w:bottom w:type="dxa" w:w="60"/>
+              <w:right w:type="dxa" w:w="90"/>
+            </w:tcMar>
+          </w:tcPr>
+          <w:p>
+            <w:pPr>
+              <w:spacing w:after="0" w:before="0"/>
+            </w:pPr>
+            <w:r>
+              <w:rPr>
+                <w:rFonts w:ascii="Arial" w:cs="Arial" w:eastAsia="Arial" w:hAnsi="Arial"/>
+                <w:color w:val="15202B"/>
+                <w:sz w:val="18"/>
+                <w:szCs w:val="18"/>
+              </w:rPr>
+              <w:t xml:space="preserve">☐ Pass</w:t>
+            </w:r>
+          </w:p>
+          <w:p>
+            <w:pPr>
+              <w:spacing w:after="0" w:before="0"/>
+            </w:pPr>
+            <w:r>
+              <w:rPr>
+                <w:rFonts w:ascii="Arial" w:cs="Arial" w:eastAsia="Arial" w:hAnsi="Arial"/>
+                <w:color w:val="15202B"/>
+                <w:sz w:val="18"/>
+                <w:szCs w:val="18"/>
+              </w:rPr>
+              <w:t xml:space="preserve">☐ Fail</w:t>
+            </w:r>
+          </w:p>
+        </w:tc>
+        <w:tc>
+          <w:tcPr>
+            <w:tcW w:type="dxa" w:w="1206"/>
+            <w:tcBorders>
+              <w:top w:val="single" w:color="B9D7F2" w:sz="4"/>
+              <w:left w:val="single" w:color="B9D7F2" w:sz="4"/>
+              <w:bottom w:val="single" w:color="B9D7F2" w:sz="4"/>
+              <w:right w:val="single" w:color="B9D7F2" w:sz="4"/>
+            </w:tcBorders>
+            <w:tcMar>
+              <w:top w:type="dxa" w:w="60"/>
+              <w:left w:type="dxa" w:w="90"/>
+              <w:bottom w:type="dxa" w:w="60"/>
+              <w:right w:type="dxa" w:w="90"/>
+            </w:tcMar>
+          </w:tcPr>
+          <w:p>
+            <w:pPr>
+              <w:spacing w:after="0" w:before="0"/>
+            </w:pPr>
+            <w:r>
+              <w:rPr>
+                <w:rFonts w:ascii="Arial" w:cs="Arial" w:eastAsia="Arial" w:hAnsi="Arial"/>
+                <w:color w:val="15202B"/>
+                <w:sz w:val="18"/>
+                <w:szCs w:val="18"/>
+              </w:rPr>
+              <w:t xml:space="preserve"/>
+            </w:r>
+          </w:p>
+        </w:tc>
+      </w:tr>
+      <w:tr>
+        <w:trPr>
+          <w:cantSplit/>
+        </w:trPr>
+        <w:tc>
+          <w:tcPr>
+            <w:tcW w:type="dxa" w:w="640"/>
+            <w:tcBorders>
+              <w:top w:val="single" w:color="B9D7F2" w:sz="4"/>
+              <w:left w:val="single" w:color="B9D7F2" w:sz="4"/>
+              <w:bottom w:val="single" w:color="B9D7F2" w:sz="4"/>
+              <w:right w:val="single" w:color="B9D7F2" w:sz="4"/>
+            </w:tcBorders>
+            <w:shd w:fill="EAF4FD" w:color="auto" w:val="clear"/>
+            <w:tcMar>
+              <w:top w:type="dxa" w:w="60"/>
+              <w:left w:type="dxa" w:w="90"/>
+              <w:bottom w:type="dxa" w:w="60"/>
+              <w:right w:type="dxa" w:w="90"/>
+            </w:tcMar>
+          </w:tcPr>
+          <w:p>
+            <w:pPr>
+              <w:spacing w:after="0" w:before="0"/>
+            </w:pPr>
+            <w:r>
+              <w:rPr>
+                <w:rFonts w:ascii="Arial" w:cs="Arial" w:eastAsia="Arial" w:hAnsi="Arial"/>
+                <w:color w:val="15202B"/>
+                <w:sz w:val="18"/>
+                <w:szCs w:val="18"/>
+              </w:rPr>
+              <w:t xml:space="preserve">26.2</w:t>
+            </w:r>
+          </w:p>
+        </w:tc>
+        <w:tc>
+          <w:tcPr>
+            <w:tcW w:type="dxa" w:w="3820"/>
+            <w:tcBorders>
+              <w:top w:val="single" w:color="B9D7F2" w:sz="4"/>
+              <w:left w:val="single" w:color="B9D7F2" w:sz="4"/>
+              <w:bottom w:val="single" w:color="B9D7F2" w:sz="4"/>
+              <w:right w:val="single" w:color="B9D7F2" w:sz="4"/>
+            </w:tcBorders>
+            <w:shd w:fill="EAF4FD" w:color="auto" w:val="clear"/>
+            <w:tcMar>
+              <w:top w:type="dxa" w:w="60"/>
+              <w:left w:type="dxa" w:w="90"/>
+              <w:bottom w:type="dxa" w:w="60"/>
+              <w:right w:type="dxa" w:w="90"/>
+            </w:tcMar>
+          </w:tcPr>
+          <w:p>
+            <w:pPr>
+              <w:spacing w:after="0" w:before="0"/>
+            </w:pPr>
+            <w:r>
+              <w:rPr>
+                <w:rFonts w:ascii="Arial" w:cs="Arial" w:eastAsia="Arial" w:hAnsi="Arial"/>
+                <w:color w:val="15202B"/>
+                <w:sz w:val="18"/>
+                <w:szCs w:val="18"/>
+              </w:rPr>
+              <w:t xml:space="preserve">Tap New Gallons.</w:t>
+            </w:r>
+          </w:p>
+        </w:tc>
+        <w:tc>
+          <w:tcPr>
+            <w:tcW w:type="dxa" w:w="3900"/>
+            <w:tcBorders>
+              <w:top w:val="single" w:color="B9D7F2" w:sz="4"/>
+              <w:left w:val="single" w:color="B9D7F2" w:sz="4"/>
+              <w:bottom w:val="single" w:color="B9D7F2" w:sz="4"/>
+              <w:right w:val="single" w:color="B9D7F2" w:sz="4"/>
+            </w:tcBorders>
+            <w:shd w:fill="EAF4FD" w:color="auto" w:val="clear"/>
+            <w:tcMar>
+              <w:top w:type="dxa" w:w="60"/>
+              <w:left w:type="dxa" w:w="90"/>
+              <w:bottom w:type="dxa" w:w="60"/>
+              <w:right w:type="dxa" w:w="90"/>
+            </w:tcMar>
+          </w:tcPr>
+          <w:p>
+            <w:pPr>
+              <w:spacing w:after="0" w:before="0"/>
+            </w:pPr>
+            <w:r>
+              <w:rPr>
+                <w:rFonts w:ascii="Arial" w:cs="Arial" w:eastAsia="Arial" w:hAnsi="Arial"/>
+                <w:color w:val="15202B"/>
+                <w:sz w:val="18"/>
+                <w:szCs w:val="18"/>
+              </w:rPr>
+              <w:t xml:space="preserve">Current stock 24, Add stock and Damaged or Lost buttons, Entries list with "+24 Starting stock".</w:t>
+            </w:r>
+          </w:p>
+        </w:tc>
+        <w:tc>
+          <w:tcPr>
+            <w:tcW w:type="dxa" w:w="900"/>
+            <w:tcBorders>
+              <w:top w:val="single" w:color="B9D7F2" w:sz="4"/>
+              <w:left w:val="single" w:color="B9D7F2" w:sz="4"/>
+              <w:bottom w:val="single" w:color="B9D7F2" w:sz="4"/>
+              <w:right w:val="single" w:color="B9D7F2" w:sz="4"/>
+            </w:tcBorders>
+            <w:shd w:fill="EAF4FD" w:color="auto" w:val="clear"/>
+            <w:tcMar>
+              <w:top w:type="dxa" w:w="60"/>
+              <w:left w:type="dxa" w:w="90"/>
+              <w:bottom w:type="dxa" w:w="60"/>
+              <w:right w:type="dxa" w:w="90"/>
+            </w:tcMar>
+          </w:tcPr>
+          <w:p>
+            <w:pPr>
+              <w:spacing w:after="0" w:before="0"/>
+            </w:pPr>
+            <w:r>
+              <w:rPr>
+                <w:rFonts w:ascii="Arial" w:cs="Arial" w:eastAsia="Arial" w:hAnsi="Arial"/>
+                <w:color w:val="15202B"/>
+                <w:sz w:val="18"/>
+                <w:szCs w:val="18"/>
+              </w:rPr>
+              <w:t xml:space="preserve">☐ Pass</w:t>
+            </w:r>
+          </w:p>
+          <w:p>
+            <w:pPr>
+              <w:spacing w:after="0" w:before="0"/>
+            </w:pPr>
+            <w:r>
+              <w:rPr>
+                <w:rFonts w:ascii="Arial" w:cs="Arial" w:eastAsia="Arial" w:hAnsi="Arial"/>
+                <w:color w:val="15202B"/>
+                <w:sz w:val="18"/>
+                <w:szCs w:val="18"/>
+              </w:rPr>
+              <w:t xml:space="preserve">☐ Fail</w:t>
+            </w:r>
+          </w:p>
+        </w:tc>
+        <w:tc>
+          <w:tcPr>
+            <w:tcW w:type="dxa" w:w="1206"/>
+            <w:tcBorders>
+              <w:top w:val="single" w:color="B9D7F2" w:sz="4"/>
+              <w:left w:val="single" w:color="B9D7F2" w:sz="4"/>
+              <w:bottom w:val="single" w:color="B9D7F2" w:sz="4"/>
+              <w:right w:val="single" w:color="B9D7F2" w:sz="4"/>
+            </w:tcBorders>
+            <w:shd w:fill="EAF4FD" w:color="auto" w:val="clear"/>
+            <w:tcMar>
+              <w:top w:type="dxa" w:w="60"/>
+              <w:left w:type="dxa" w:w="90"/>
+              <w:bottom w:type="dxa" w:w="60"/>
+              <w:right w:type="dxa" w:w="90"/>
+            </w:tcMar>
+          </w:tcPr>
+          <w:p>
+            <w:pPr>
+              <w:spacing w:after="0" w:before="0"/>
+            </w:pPr>
+            <w:r>
+              <w:rPr>
+                <w:rFonts w:ascii="Arial" w:cs="Arial" w:eastAsia="Arial" w:hAnsi="Arial"/>
+                <w:color w:val="15202B"/>
+                <w:sz w:val="18"/>
+                <w:szCs w:val="18"/>
+              </w:rPr>
+              <w:t xml:space="preserve"/>
+            </w:r>
+          </w:p>
+        </w:tc>
+      </w:tr>
+      <w:tr>
+        <w:trPr>
+          <w:cantSplit/>
+        </w:trPr>
+        <w:tc>
+          <w:tcPr>
+            <w:tcW w:type="dxa" w:w="640"/>
+            <w:tcBorders>
+              <w:top w:val="single" w:color="B9D7F2" w:sz="4"/>
+              <w:left w:val="single" w:color="B9D7F2" w:sz="4"/>
+              <w:bottom w:val="single" w:color="B9D7F2" w:sz="4"/>
+              <w:right w:val="single" w:color="B9D7F2" w:sz="4"/>
+            </w:tcBorders>
+            <w:tcMar>
+              <w:top w:type="dxa" w:w="60"/>
+              <w:left w:type="dxa" w:w="90"/>
+              <w:bottom w:type="dxa" w:w="60"/>
+              <w:right w:type="dxa" w:w="90"/>
+            </w:tcMar>
+          </w:tcPr>
+          <w:p>
+            <w:pPr>
+              <w:spacing w:after="0" w:before="0"/>
+            </w:pPr>
+            <w:r>
+              <w:rPr>
+                <w:rFonts w:ascii="Arial" w:cs="Arial" w:eastAsia="Arial" w:hAnsi="Arial"/>
+                <w:color w:val="15202B"/>
+                <w:sz w:val="18"/>
+                <w:szCs w:val="18"/>
+              </w:rPr>
+              <w:t xml:space="preserve">26.3</w:t>
+            </w:r>
+          </w:p>
+        </w:tc>
+        <w:tc>
+          <w:tcPr>
+            <w:tcW w:type="dxa" w:w="3820"/>
+            <w:tcBorders>
+              <w:top w:val="single" w:color="B9D7F2" w:sz="4"/>
+              <w:left w:val="single" w:color="B9D7F2" w:sz="4"/>
+              <w:bottom w:val="single" w:color="B9D7F2" w:sz="4"/>
+              <w:right w:val="single" w:color="B9D7F2" w:sz="4"/>
+            </w:tcBorders>
+            <w:tcMar>
+              <w:top w:type="dxa" w:w="60"/>
+              <w:left w:type="dxa" w:w="90"/>
+              <w:bottom w:type="dxa" w:w="60"/>
+              <w:right w:type="dxa" w:w="90"/>
+            </w:tcMar>
+          </w:tcPr>
+          <w:p>
+            <w:pPr>
+              <w:spacing w:after="0" w:before="0"/>
+            </w:pPr>
+            <w:r>
+              <w:rPr>
+                <w:rFonts w:ascii="Arial" w:cs="Arial" w:eastAsia="Arial" w:hAnsi="Arial"/>
+                <w:color w:val="15202B"/>
+                <w:sz w:val="18"/>
+                <w:szCs w:val="18"/>
+              </w:rPr>
+              <w:t xml:space="preserve">Add stock &gt; + to 10 &gt; today &gt; note "Supplier" &gt; Save.</w:t>
+            </w:r>
+          </w:p>
+        </w:tc>
+        <w:tc>
+          <w:tcPr>
+            <w:tcW w:type="dxa" w:w="3900"/>
+            <w:tcBorders>
+              <w:top w:val="single" w:color="B9D7F2" w:sz="4"/>
+              <w:left w:val="single" w:color="B9D7F2" w:sz="4"/>
+              <w:bottom w:val="single" w:color="B9D7F2" w:sz="4"/>
+              <w:right w:val="single" w:color="B9D7F2" w:sz="4"/>
+            </w:tcBorders>
+            <w:tcMar>
+              <w:top w:type="dxa" w:w="60"/>
+              <w:left w:type="dxa" w:w="90"/>
+              <w:bottom w:type="dxa" w:w="60"/>
+              <w:right w:type="dxa" w:w="90"/>
+            </w:tcMar>
+          </w:tcPr>
+          <w:p>
+            <w:pPr>
+              <w:spacing w:after="0" w:before="0"/>
+            </w:pPr>
+            <w:r>
+              <w:rPr>
+                <w:rFonts w:ascii="Arial" w:cs="Arial" w:eastAsia="Arial" w:hAnsi="Arial"/>
+                <w:color w:val="15202B"/>
+                <w:sz w:val="18"/>
+                <w:szCs w:val="18"/>
+              </w:rPr>
+              <w:t xml:space="preserve">"Stock goes up. Entry saved."; current stock 34; "+10 Stock added · &lt;date&gt; · Owner" at the top.</w:t>
+            </w:r>
+          </w:p>
+        </w:tc>
+        <w:tc>
+          <w:tcPr>
+            <w:tcW w:type="dxa" w:w="900"/>
+            <w:tcBorders>
+              <w:top w:val="single" w:color="B9D7F2" w:sz="4"/>
+              <w:left w:val="single" w:color="B9D7F2" w:sz="4"/>
+              <w:bottom w:val="single" w:color="B9D7F2" w:sz="4"/>
+              <w:right w:val="single" w:color="B9D7F2" w:sz="4"/>
+            </w:tcBorders>
+            <w:tcMar>
+              <w:top w:type="dxa" w:w="60"/>
+              <w:left w:type="dxa" w:w="90"/>
+              <w:bottom w:type="dxa" w:w="60"/>
+              <w:right w:type="dxa" w:w="90"/>
+            </w:tcMar>
+          </w:tcPr>
+          <w:p>
+            <w:pPr>
+              <w:spacing w:after="0" w:before="0"/>
+            </w:pPr>
+            <w:r>
+              <w:rPr>
+                <w:rFonts w:ascii="Arial" w:cs="Arial" w:eastAsia="Arial" w:hAnsi="Arial"/>
+                <w:color w:val="15202B"/>
+                <w:sz w:val="18"/>
+                <w:szCs w:val="18"/>
+              </w:rPr>
+              <w:t xml:space="preserve">☐ Pass</w:t>
+            </w:r>
+          </w:p>
+          <w:p>
+            <w:pPr>
+              <w:spacing w:after="0" w:before="0"/>
+            </w:pPr>
+            <w:r>
+              <w:rPr>
+                <w:rFonts w:ascii="Arial" w:cs="Arial" w:eastAsia="Arial" w:hAnsi="Arial"/>
+                <w:color w:val="15202B"/>
+                <w:sz w:val="18"/>
+                <w:szCs w:val="18"/>
+              </w:rPr>
+              <w:t xml:space="preserve">☐ Fail</w:t>
+            </w:r>
+          </w:p>
+        </w:tc>
+        <w:tc>
+          <w:tcPr>
+            <w:tcW w:type="dxa" w:w="1206"/>
+            <w:tcBorders>
+              <w:top w:val="single" w:color="B9D7F2" w:sz="4"/>
+              <w:left w:val="single" w:color="B9D7F2" w:sz="4"/>
+              <w:bottom w:val="single" w:color="B9D7F2" w:sz="4"/>
+              <w:right w:val="single" w:color="B9D7F2" w:sz="4"/>
+            </w:tcBorders>
+            <w:tcMar>
+              <w:top w:type="dxa" w:w="60"/>
+              <w:left w:type="dxa" w:w="90"/>
+              <w:bottom w:type="dxa" w:w="60"/>
+              <w:right w:type="dxa" w:w="90"/>
+            </w:tcMar>
+          </w:tcPr>
+          <w:p>
+            <w:pPr>
+              <w:spacing w:after="0" w:before="0"/>
+            </w:pPr>
+            <w:r>
+              <w:rPr>
+                <w:rFonts w:ascii="Arial" w:cs="Arial" w:eastAsia="Arial" w:hAnsi="Arial"/>
+                <w:color w:val="15202B"/>
+                <w:sz w:val="18"/>
+                <w:szCs w:val="18"/>
+              </w:rPr>
+              <w:t xml:space="preserve"/>
+            </w:r>
+          </w:p>
+        </w:tc>
+      </w:tr>
+      <w:tr>
+        <w:trPr>
+          <w:cantSplit/>
+        </w:trPr>
+        <w:tc>
+          <w:tcPr>
+            <w:tcW w:type="dxa" w:w="640"/>
+            <w:tcBorders>
+              <w:top w:val="single" w:color="B9D7F2" w:sz="4"/>
+              <w:left w:val="single" w:color="B9D7F2" w:sz="4"/>
+              <w:bottom w:val="single" w:color="B9D7F2" w:sz="4"/>
+              <w:right w:val="single" w:color="B9D7F2" w:sz="4"/>
+            </w:tcBorders>
+            <w:shd w:fill="EAF4FD" w:color="auto" w:val="clear"/>
+            <w:tcMar>
+              <w:top w:type="dxa" w:w="60"/>
+              <w:left w:type="dxa" w:w="90"/>
+              <w:bottom w:type="dxa" w:w="60"/>
+              <w:right w:type="dxa" w:w="90"/>
+            </w:tcMar>
+          </w:tcPr>
+          <w:p>
+            <w:pPr>
+              <w:spacing w:after="0" w:before="0"/>
+            </w:pPr>
+            <w:r>
+              <w:rPr>
+                <w:rFonts w:ascii="Arial" w:cs="Arial" w:eastAsia="Arial" w:hAnsi="Arial"/>
+                <w:color w:val="15202B"/>
+                <w:sz w:val="18"/>
+                <w:szCs w:val="18"/>
+              </w:rPr>
+              <w:t xml:space="preserve">26.4</w:t>
+            </w:r>
+          </w:p>
+        </w:tc>
+        <w:tc>
+          <w:tcPr>
+            <w:tcW w:type="dxa" w:w="3820"/>
+            <w:tcBorders>
+              <w:top w:val="single" w:color="B9D7F2" w:sz="4"/>
+              <w:left w:val="single" w:color="B9D7F2" w:sz="4"/>
+              <w:bottom w:val="single" w:color="B9D7F2" w:sz="4"/>
+              <w:right w:val="single" w:color="B9D7F2" w:sz="4"/>
+            </w:tcBorders>
+            <w:shd w:fill="EAF4FD" w:color="auto" w:val="clear"/>
+            <w:tcMar>
+              <w:top w:type="dxa" w:w="60"/>
+              <w:left w:type="dxa" w:w="90"/>
+              <w:bottom w:type="dxa" w:w="60"/>
+              <w:right w:type="dxa" w:w="90"/>
+            </w:tcMar>
+          </w:tcPr>
+          <w:p>
+            <w:pPr>
+              <w:spacing w:after="0" w:before="0"/>
+            </w:pPr>
+            <w:r>
+              <w:rPr>
+                <w:rFonts w:ascii="Arial" w:cs="Arial" w:eastAsia="Arial" w:hAnsi="Arial"/>
+                <w:color w:val="15202B"/>
+                <w:sz w:val="18"/>
+                <w:szCs w:val="18"/>
+              </w:rPr>
+              <w:t xml:space="preserve">Damaged or Lost &gt; 1 &gt; Damaged &gt; note "Cracked" &gt; Save.</w:t>
+            </w:r>
+          </w:p>
+        </w:tc>
+        <w:tc>
+          <w:tcPr>
+            <w:tcW w:type="dxa" w:w="3900"/>
+            <w:tcBorders>
+              <w:top w:val="single" w:color="B9D7F2" w:sz="4"/>
+              <w:left w:val="single" w:color="B9D7F2" w:sz="4"/>
+              <w:bottom w:val="single" w:color="B9D7F2" w:sz="4"/>
+              <w:right w:val="single" w:color="B9D7F2" w:sz="4"/>
+            </w:tcBorders>
+            <w:shd w:fill="EAF4FD" w:color="auto" w:val="clear"/>
+            <w:tcMar>
+              <w:top w:type="dxa" w:w="60"/>
+              <w:left w:type="dxa" w:w="90"/>
+              <w:bottom w:type="dxa" w:w="60"/>
+              <w:right w:type="dxa" w:w="90"/>
+            </w:tcMar>
+          </w:tcPr>
+          <w:p>
+            <w:pPr>
+              <w:spacing w:after="0" w:before="0"/>
+            </w:pPr>
+            <w:r>
+              <w:rPr>
+                <w:rFonts w:ascii="Arial" w:cs="Arial" w:eastAsia="Arial" w:hAnsi="Arial"/>
+                <w:color w:val="15202B"/>
+                <w:sz w:val="18"/>
+                <w:szCs w:val="18"/>
+              </w:rPr>
+              <w:t xml:space="preserve">"Stock goes down. Entry saved."; 33; "-1 Damaged".</w:t>
+            </w:r>
+          </w:p>
+        </w:tc>
+        <w:tc>
+          <w:tcPr>
+            <w:tcW w:type="dxa" w:w="900"/>
+            <w:tcBorders>
+              <w:top w:val="single" w:color="B9D7F2" w:sz="4"/>
+              <w:left w:val="single" w:color="B9D7F2" w:sz="4"/>
+              <w:bottom w:val="single" w:color="B9D7F2" w:sz="4"/>
+              <w:right w:val="single" w:color="B9D7F2" w:sz="4"/>
+            </w:tcBorders>
+            <w:shd w:fill="EAF4FD" w:color="auto" w:val="clear"/>
+            <w:tcMar>
+              <w:top w:type="dxa" w:w="60"/>
+              <w:left w:type="dxa" w:w="90"/>
+              <w:bottom w:type="dxa" w:w="60"/>
+              <w:right w:type="dxa" w:w="90"/>
+            </w:tcMar>
+          </w:tcPr>
+          <w:p>
+            <w:pPr>
+              <w:spacing w:after="0" w:before="0"/>
+            </w:pPr>
+            <w:r>
+              <w:rPr>
+                <w:rFonts w:ascii="Arial" w:cs="Arial" w:eastAsia="Arial" w:hAnsi="Arial"/>
+                <w:color w:val="15202B"/>
+                <w:sz w:val="18"/>
+                <w:szCs w:val="18"/>
+              </w:rPr>
+              <w:t xml:space="preserve">☐ Pass</w:t>
+            </w:r>
+          </w:p>
+          <w:p>
+            <w:pPr>
+              <w:spacing w:after="0" w:before="0"/>
+            </w:pPr>
+            <w:r>
+              <w:rPr>
+                <w:rFonts w:ascii="Arial" w:cs="Arial" w:eastAsia="Arial" w:hAnsi="Arial"/>
+                <w:color w:val="15202B"/>
+                <w:sz w:val="18"/>
+                <w:szCs w:val="18"/>
+              </w:rPr>
+              <w:t xml:space="preserve">☐ Fail</w:t>
+            </w:r>
+          </w:p>
+        </w:tc>
+        <w:tc>
+          <w:tcPr>
+            <w:tcW w:type="dxa" w:w="1206"/>
+            <w:tcBorders>
+              <w:top w:val="single" w:color="B9D7F2" w:sz="4"/>
+              <w:left w:val="single" w:color="B9D7F2" w:sz="4"/>
+              <w:bottom w:val="single" w:color="B9D7F2" w:sz="4"/>
+              <w:right w:val="single" w:color="B9D7F2" w:sz="4"/>
+            </w:tcBorders>
+            <w:shd w:fill="EAF4FD" w:color="auto" w:val="clear"/>
+            <w:tcMar>
+              <w:top w:type="dxa" w:w="60"/>
+              <w:left w:type="dxa" w:w="90"/>
+              <w:bottom w:type="dxa" w:w="60"/>
+              <w:right w:type="dxa" w:w="90"/>
+            </w:tcMar>
+          </w:tcPr>
+          <w:p>
+            <w:pPr>
+              <w:spacing w:after="0" w:before="0"/>
+            </w:pPr>
+            <w:r>
+              <w:rPr>
+                <w:rFonts w:ascii="Arial" w:cs="Arial" w:eastAsia="Arial" w:hAnsi="Arial"/>
+                <w:color w:val="15202B"/>
+                <w:sz w:val="18"/>
+                <w:szCs w:val="18"/>
+              </w:rPr>
+              <w:t xml:space="preserve"/>
+            </w:r>
+          </w:p>
+        </w:tc>
+      </w:tr>
+      <w:tr>
+        <w:trPr>
+          <w:cantSplit/>
+        </w:trPr>
+        <w:tc>
+          <w:tcPr>
+            <w:tcW w:type="dxa" w:w="640"/>
+            <w:tcBorders>
+              <w:top w:val="single" w:color="B9D7F2" w:sz="4"/>
+              <w:left w:val="single" w:color="B9D7F2" w:sz="4"/>
+              <w:bottom w:val="single" w:color="B9D7F2" w:sz="4"/>
+              <w:right w:val="single" w:color="B9D7F2" w:sz="4"/>
+            </w:tcBorders>
+            <w:tcMar>
+              <w:top w:type="dxa" w:w="60"/>
+              <w:left w:type="dxa" w:w="90"/>
+              <w:bottom w:type="dxa" w:w="60"/>
+              <w:right w:type="dxa" w:w="90"/>
+            </w:tcMar>
+          </w:tcPr>
+          <w:p>
+            <w:pPr>
+              <w:spacing w:after="0" w:before="0"/>
+            </w:pPr>
+            <w:r>
+              <w:rPr>
+                <w:rFonts w:ascii="Arial" w:cs="Arial" w:eastAsia="Arial" w:hAnsi="Arial"/>
+                <w:color w:val="15202B"/>
+                <w:sz w:val="18"/>
+                <w:szCs w:val="18"/>
+              </w:rPr>
+              <w:t xml:space="preserve">26.5</w:t>
+            </w:r>
+          </w:p>
+        </w:tc>
+        <w:tc>
+          <w:tcPr>
+            <w:tcW w:type="dxa" w:w="3820"/>
+            <w:tcBorders>
+              <w:top w:val="single" w:color="B9D7F2" w:sz="4"/>
+              <w:left w:val="single" w:color="B9D7F2" w:sz="4"/>
+              <w:bottom w:val="single" w:color="B9D7F2" w:sz="4"/>
+              <w:right w:val="single" w:color="B9D7F2" w:sz="4"/>
+            </w:tcBorders>
+            <w:tcMar>
+              <w:top w:type="dxa" w:w="60"/>
+              <w:left w:type="dxa" w:w="90"/>
+              <w:bottom w:type="dxa" w:w="60"/>
+              <w:right w:type="dxa" w:w="90"/>
+            </w:tcMar>
+          </w:tcPr>
+          <w:p>
+            <w:pPr>
+              <w:spacing w:after="0" w:before="0"/>
+            </w:pPr>
+            <w:r>
+              <w:rPr>
+                <w:rFonts w:ascii="Arial" w:cs="Arial" w:eastAsia="Arial" w:hAnsi="Arial"/>
+                <w:color w:val="15202B"/>
+                <w:sz w:val="18"/>
+                <w:szCs w:val="18"/>
+              </w:rPr>
+              <w:t xml:space="preserve">Sell a package (walk-in Package 1).</w:t>
+            </w:r>
+          </w:p>
+        </w:tc>
+        <w:tc>
+          <w:tcPr>
+            <w:tcW w:type="dxa" w:w="3900"/>
+            <w:tcBorders>
+              <w:top w:val="single" w:color="B9D7F2" w:sz="4"/>
+              <w:left w:val="single" w:color="B9D7F2" w:sz="4"/>
+              <w:bottom w:val="single" w:color="B9D7F2" w:sz="4"/>
+              <w:right w:val="single" w:color="B9D7F2" w:sz="4"/>
+            </w:tcBorders>
+            <w:tcMar>
+              <w:top w:type="dxa" w:w="60"/>
+              <w:left w:type="dxa" w:w="90"/>
+              <w:bottom w:type="dxa" w:w="60"/>
+              <w:right w:type="dxa" w:w="90"/>
+            </w:tcMar>
+          </w:tcPr>
+          <w:p>
+            <w:pPr>
+              <w:spacing w:after="0" w:before="0"/>
+            </w:pPr>
+            <w:r>
+              <w:rPr>
+                <w:rFonts w:ascii="Arial" w:cs="Arial" w:eastAsia="Arial" w:hAnsi="Arial"/>
+                <w:color w:val="15202B"/>
+                <w:sz w:val="18"/>
+                <w:szCs w:val="18"/>
+              </w:rPr>
+              <w:t xml:space="preserve">New Gallons "-1 Package sold · Order #.. · Automatic"; Seals "-3 ... · Automatic".</w:t>
+            </w:r>
+          </w:p>
+        </w:tc>
+        <w:tc>
+          <w:tcPr>
+            <w:tcW w:type="dxa" w:w="900"/>
+            <w:tcBorders>
+              <w:top w:val="single" w:color="B9D7F2" w:sz="4"/>
+              <w:left w:val="single" w:color="B9D7F2" w:sz="4"/>
+              <w:bottom w:val="single" w:color="B9D7F2" w:sz="4"/>
+              <w:right w:val="single" w:color="B9D7F2" w:sz="4"/>
+            </w:tcBorders>
+            <w:tcMar>
+              <w:top w:type="dxa" w:w="60"/>
+              <w:left w:type="dxa" w:w="90"/>
+              <w:bottom w:type="dxa" w:w="60"/>
+              <w:right w:type="dxa" w:w="90"/>
+            </w:tcMar>
+          </w:tcPr>
+          <w:p>
+            <w:pPr>
+              <w:spacing w:after="0" w:before="0"/>
+            </w:pPr>
+            <w:r>
+              <w:rPr>
+                <w:rFonts w:ascii="Arial" w:cs="Arial" w:eastAsia="Arial" w:hAnsi="Arial"/>
+                <w:color w:val="15202B"/>
+                <w:sz w:val="18"/>
+                <w:szCs w:val="18"/>
+              </w:rPr>
+              <w:t xml:space="preserve">☐ Pass</w:t>
+            </w:r>
+          </w:p>
+          <w:p>
+            <w:pPr>
+              <w:spacing w:after="0" w:before="0"/>
+            </w:pPr>
+            <w:r>
+              <w:rPr>
+                <w:rFonts w:ascii="Arial" w:cs="Arial" w:eastAsia="Arial" w:hAnsi="Arial"/>
+                <w:color w:val="15202B"/>
+                <w:sz w:val="18"/>
+                <w:szCs w:val="18"/>
+              </w:rPr>
+              <w:t xml:space="preserve">☐ Fail</w:t>
+            </w:r>
+          </w:p>
+        </w:tc>
+        <w:tc>
+          <w:tcPr>
+            <w:tcW w:type="dxa" w:w="1206"/>
+            <w:tcBorders>
+              <w:top w:val="single" w:color="B9D7F2" w:sz="4"/>
+              <w:left w:val="single" w:color="B9D7F2" w:sz="4"/>
+              <w:bottom w:val="single" w:color="B9D7F2" w:sz="4"/>
+              <w:right w:val="single" w:color="B9D7F2" w:sz="4"/>
+            </w:tcBorders>
+            <w:tcMar>
+              <w:top w:type="dxa" w:w="60"/>
+              <w:left w:type="dxa" w:w="90"/>
+              <w:bottom w:type="dxa" w:w="60"/>
+              <w:right w:type="dxa" w:w="90"/>
+            </w:tcMar>
+          </w:tcPr>
+          <w:p>
+            <w:pPr>
+              <w:spacing w:after="0" w:before="0"/>
+            </w:pPr>
+            <w:r>
+              <w:rPr>
+                <w:rFonts w:ascii="Arial" w:cs="Arial" w:eastAsia="Arial" w:hAnsi="Arial"/>
+                <w:color w:val="15202B"/>
+                <w:sz w:val="18"/>
+                <w:szCs w:val="18"/>
+              </w:rPr>
+              <w:t xml:space="preserve"/>
+            </w:r>
+          </w:p>
+        </w:tc>
+      </w:tr>
+      <w:tr>
+        <w:trPr>
+          <w:cantSplit/>
+        </w:trPr>
+        <w:tc>
+          <w:tcPr>
+            <w:tcW w:type="dxa" w:w="640"/>
+            <w:tcBorders>
+              <w:top w:val="single" w:color="B9D7F2" w:sz="4"/>
+              <w:left w:val="single" w:color="B9D7F2" w:sz="4"/>
+              <w:bottom w:val="single" w:color="B9D7F2" w:sz="4"/>
+              <w:right w:val="single" w:color="B9D7F2" w:sz="4"/>
+            </w:tcBorders>
+            <w:shd w:fill="EAF4FD" w:color="auto" w:val="clear"/>
+            <w:tcMar>
+              <w:top w:type="dxa" w:w="60"/>
+              <w:left w:type="dxa" w:w="90"/>
+              <w:bottom w:type="dxa" w:w="60"/>
+              <w:right w:type="dxa" w:w="90"/>
+            </w:tcMar>
+          </w:tcPr>
+          <w:p>
+            <w:pPr>
+              <w:spacing w:after="0" w:before="0"/>
+            </w:pPr>
+            <w:r>
+              <w:rPr>
+                <w:rFonts w:ascii="Arial" w:cs="Arial" w:eastAsia="Arial" w:hAnsi="Arial"/>
+                <w:color w:val="15202B"/>
+                <w:sz w:val="18"/>
+                <w:szCs w:val="18"/>
+              </w:rPr>
+              <w:t xml:space="preserve">26.6</w:t>
+            </w:r>
+          </w:p>
+        </w:tc>
+        <w:tc>
+          <w:tcPr>
+            <w:tcW w:type="dxa" w:w="3820"/>
+            <w:tcBorders>
+              <w:top w:val="single" w:color="B9D7F2" w:sz="4"/>
+              <w:left w:val="single" w:color="B9D7F2" w:sz="4"/>
+              <w:bottom w:val="single" w:color="B9D7F2" w:sz="4"/>
+              <w:right w:val="single" w:color="B9D7F2" w:sz="4"/>
+            </w:tcBorders>
+            <w:shd w:fill="EAF4FD" w:color="auto" w:val="clear"/>
+            <w:tcMar>
+              <w:top w:type="dxa" w:w="60"/>
+              <w:left w:type="dxa" w:w="90"/>
+              <w:bottom w:type="dxa" w:w="60"/>
+              <w:right w:type="dxa" w:w="90"/>
+            </w:tcMar>
+          </w:tcPr>
+          <w:p>
+            <w:pPr>
+              <w:spacing w:after="0" w:before="0"/>
+            </w:pPr>
+            <w:r>
+              <w:rPr>
+                <w:rFonts w:ascii="Arial" w:cs="Arial" w:eastAsia="Arial" w:hAnsi="Arial"/>
+                <w:color w:val="15202B"/>
+                <w:sz w:val="18"/>
+                <w:szCs w:val="18"/>
+              </w:rPr>
+              <w:t xml:space="preserve">Seals: open it.</w:t>
+            </w:r>
+          </w:p>
+        </w:tc>
+        <w:tc>
+          <w:tcPr>
+            <w:tcW w:type="dxa" w:w="3900"/>
+            <w:tcBorders>
+              <w:top w:val="single" w:color="B9D7F2" w:sz="4"/>
+              <w:left w:val="single" w:color="B9D7F2" w:sz="4"/>
+              <w:bottom w:val="single" w:color="B9D7F2" w:sz="4"/>
+              <w:right w:val="single" w:color="B9D7F2" w:sz="4"/>
+            </w:tcBorders>
+            <w:shd w:fill="EAF4FD" w:color="auto" w:val="clear"/>
+            <w:tcMar>
+              <w:top w:type="dxa" w:w="60"/>
+              <w:left w:type="dxa" w:w="90"/>
+              <w:bottom w:type="dxa" w:w="60"/>
+              <w:right w:type="dxa" w:w="90"/>
+            </w:tcMar>
+          </w:tcPr>
+          <w:p>
+            <w:pPr>
+              <w:spacing w:after="0" w:before="0"/>
+            </w:pPr>
+            <w:r>
+              <w:rPr>
+                <w:rFonts w:ascii="Arial" w:cs="Arial" w:eastAsia="Arial" w:hAnsi="Arial"/>
+                <w:color w:val="15202B"/>
+                <w:sz w:val="18"/>
+                <w:szCs w:val="18"/>
+              </w:rPr>
+              <w:t xml:space="preserve">"3 seals used per gallon processed"; entries from walk-ins and orders sent out are Automatic.</w:t>
+            </w:r>
+          </w:p>
+        </w:tc>
+        <w:tc>
+          <w:tcPr>
+            <w:tcW w:type="dxa" w:w="900"/>
+            <w:tcBorders>
+              <w:top w:val="single" w:color="B9D7F2" w:sz="4"/>
+              <w:left w:val="single" w:color="B9D7F2" w:sz="4"/>
+              <w:bottom w:val="single" w:color="B9D7F2" w:sz="4"/>
+              <w:right w:val="single" w:color="B9D7F2" w:sz="4"/>
+            </w:tcBorders>
+            <w:shd w:fill="EAF4FD" w:color="auto" w:val="clear"/>
+            <w:tcMar>
+              <w:top w:type="dxa" w:w="60"/>
+              <w:left w:type="dxa" w:w="90"/>
+              <w:bottom w:type="dxa" w:w="60"/>
+              <w:right w:type="dxa" w:w="90"/>
+            </w:tcMar>
+          </w:tcPr>
+          <w:p>
+            <w:pPr>
+              <w:spacing w:after="0" w:before="0"/>
+            </w:pPr>
+            <w:r>
+              <w:rPr>
+                <w:rFonts w:ascii="Arial" w:cs="Arial" w:eastAsia="Arial" w:hAnsi="Arial"/>
+                <w:color w:val="15202B"/>
+                <w:sz w:val="18"/>
+                <w:szCs w:val="18"/>
+              </w:rPr>
+              <w:t xml:space="preserve">☐ Pass</w:t>
+            </w:r>
+          </w:p>
+          <w:p>
+            <w:pPr>
+              <w:spacing w:after="0" w:before="0"/>
+            </w:pPr>
+            <w:r>
+              <w:rPr>
+                <w:rFonts w:ascii="Arial" w:cs="Arial" w:eastAsia="Arial" w:hAnsi="Arial"/>
+                <w:color w:val="15202B"/>
+                <w:sz w:val="18"/>
+                <w:szCs w:val="18"/>
+              </w:rPr>
+              <w:t xml:space="preserve">☐ Fail</w:t>
+            </w:r>
+          </w:p>
+        </w:tc>
+        <w:tc>
+          <w:tcPr>
+            <w:tcW w:type="dxa" w:w="1206"/>
+            <w:tcBorders>
+              <w:top w:val="single" w:color="B9D7F2" w:sz="4"/>
+              <w:left w:val="single" w:color="B9D7F2" w:sz="4"/>
+              <w:bottom w:val="single" w:color="B9D7F2" w:sz="4"/>
+              <w:right w:val="single" w:color="B9D7F2" w:sz="4"/>
+            </w:tcBorders>
+            <w:shd w:fill="EAF4FD" w:color="auto" w:val="clear"/>
+            <w:tcMar>
+              <w:top w:type="dxa" w:w="60"/>
+              <w:left w:type="dxa" w:w="90"/>
+              <w:bottom w:type="dxa" w:w="60"/>
+              <w:right w:type="dxa" w:w="90"/>
+            </w:tcMar>
+          </w:tcPr>
+          <w:p>
+            <w:pPr>
+              <w:spacing w:after="0" w:before="0"/>
+            </w:pPr>
+            <w:r>
+              <w:rPr>
+                <w:rFonts w:ascii="Arial" w:cs="Arial" w:eastAsia="Arial" w:hAnsi="Arial"/>
+                <w:color w:val="15202B"/>
+                <w:sz w:val="18"/>
+                <w:szCs w:val="18"/>
+              </w:rPr>
+              <w:t xml:space="preserve"/>
+            </w:r>
+          </w:p>
+        </w:tc>
+      </w:tr>
+      <w:tr>
+        <w:trPr>
+          <w:cantSplit/>
+        </w:trPr>
+        <w:tc>
+          <w:tcPr>
+            <w:tcW w:type="dxa" w:w="640"/>
+            <w:tcBorders>
+              <w:top w:val="single" w:color="B9D7F2" w:sz="4"/>
+              <w:left w:val="single" w:color="B9D7F2" w:sz="4"/>
+              <w:bottom w:val="single" w:color="B9D7F2" w:sz="4"/>
+              <w:right w:val="single" w:color="B9D7F2" w:sz="4"/>
+            </w:tcBorders>
+            <w:tcMar>
+              <w:top w:type="dxa" w:w="60"/>
+              <w:left w:type="dxa" w:w="90"/>
+              <w:bottom w:type="dxa" w:w="60"/>
+              <w:right w:type="dxa" w:w="90"/>
+            </w:tcMar>
+          </w:tcPr>
+          <w:p>
+            <w:pPr>
+              <w:spacing w:after="0" w:before="0"/>
+            </w:pPr>
+            <w:r>
+              <w:rPr>
+                <w:rFonts w:ascii="Arial" w:cs="Arial" w:eastAsia="Arial" w:hAnsi="Arial"/>
+                <w:color w:val="15202B"/>
+                <w:sz w:val="18"/>
+                <w:szCs w:val="18"/>
+              </w:rPr>
+              <w:t xml:space="preserve">26.7</w:t>
+            </w:r>
+          </w:p>
+        </w:tc>
+        <w:tc>
+          <w:tcPr>
+            <w:tcW w:type="dxa" w:w="3820"/>
+            <w:tcBorders>
+              <w:top w:val="single" w:color="B9D7F2" w:sz="4"/>
+              <w:left w:val="single" w:color="B9D7F2" w:sz="4"/>
+              <w:bottom w:val="single" w:color="B9D7F2" w:sz="4"/>
+              <w:right w:val="single" w:color="B9D7F2" w:sz="4"/>
+            </w:tcBorders>
+            <w:tcMar>
+              <w:top w:type="dxa" w:w="60"/>
+              <w:left w:type="dxa" w:w="90"/>
+              <w:bottom w:type="dxa" w:w="60"/>
+              <w:right w:type="dxa" w:w="90"/>
+            </w:tcMar>
+          </w:tcPr>
+          <w:p>
+            <w:pPr>
+              <w:spacing w:after="0" w:before="0"/>
+            </w:pPr>
+            <w:r>
+              <w:rPr>
+                <w:rFonts w:ascii="Arial" w:cs="Arial" w:eastAsia="Arial" w:hAnsi="Arial"/>
+                <w:color w:val="15202B"/>
+                <w:sz w:val="18"/>
+                <w:szCs w:val="18"/>
+              </w:rPr>
+              <w:t xml:space="preserve">Seals &gt; Lost &gt; 5 &gt; Save.</w:t>
+            </w:r>
+          </w:p>
+        </w:tc>
+        <w:tc>
+          <w:tcPr>
+            <w:tcW w:type="dxa" w:w="3900"/>
+            <w:tcBorders>
+              <w:top w:val="single" w:color="B9D7F2" w:sz="4"/>
+              <w:left w:val="single" w:color="B9D7F2" w:sz="4"/>
+              <w:bottom w:val="single" w:color="B9D7F2" w:sz="4"/>
+              <w:right w:val="single" w:color="B9D7F2" w:sz="4"/>
+            </w:tcBorders>
+            <w:tcMar>
+              <w:top w:type="dxa" w:w="60"/>
+              <w:left w:type="dxa" w:w="90"/>
+              <w:bottom w:type="dxa" w:w="60"/>
+              <w:right w:type="dxa" w:w="90"/>
+            </w:tcMar>
+          </w:tcPr>
+          <w:p>
+            <w:pPr>
+              <w:spacing w:after="0" w:before="0"/>
+            </w:pPr>
+            <w:r>
+              <w:rPr>
+                <w:rFonts w:ascii="Arial" w:cs="Arial" w:eastAsia="Arial" w:hAnsi="Arial"/>
+                <w:color w:val="15202B"/>
+                <w:sz w:val="18"/>
+                <w:szCs w:val="18"/>
+              </w:rPr>
+              <w:t xml:space="preserve">Seals go down by 5.</w:t>
+            </w:r>
+          </w:p>
+        </w:tc>
+        <w:tc>
+          <w:tcPr>
+            <w:tcW w:type="dxa" w:w="900"/>
+            <w:tcBorders>
+              <w:top w:val="single" w:color="B9D7F2" w:sz="4"/>
+              <w:left w:val="single" w:color="B9D7F2" w:sz="4"/>
+              <w:bottom w:val="single" w:color="B9D7F2" w:sz="4"/>
+              <w:right w:val="single" w:color="B9D7F2" w:sz="4"/>
+            </w:tcBorders>
+            <w:tcMar>
+              <w:top w:type="dxa" w:w="60"/>
+              <w:left w:type="dxa" w:w="90"/>
+              <w:bottom w:type="dxa" w:w="60"/>
+              <w:right w:type="dxa" w:w="90"/>
+            </w:tcMar>
+          </w:tcPr>
+          <w:p>
+            <w:pPr>
+              <w:spacing w:after="0" w:before="0"/>
+            </w:pPr>
+            <w:r>
+              <w:rPr>
+                <w:rFonts w:ascii="Arial" w:cs="Arial" w:eastAsia="Arial" w:hAnsi="Arial"/>
+                <w:color w:val="15202B"/>
+                <w:sz w:val="18"/>
+                <w:szCs w:val="18"/>
+              </w:rPr>
+              <w:t xml:space="preserve">☐ Pass</w:t>
+            </w:r>
+          </w:p>
+          <w:p>
+            <w:pPr>
+              <w:spacing w:after="0" w:before="0"/>
+            </w:pPr>
+            <w:r>
+              <w:rPr>
+                <w:rFonts w:ascii="Arial" w:cs="Arial" w:eastAsia="Arial" w:hAnsi="Arial"/>
+                <w:color w:val="15202B"/>
+                <w:sz w:val="18"/>
+                <w:szCs w:val="18"/>
+              </w:rPr>
+              <w:t xml:space="preserve">☐ Fail</w:t>
+            </w:r>
+          </w:p>
+        </w:tc>
+        <w:tc>
+          <w:tcPr>
+            <w:tcW w:type="dxa" w:w="1206"/>
+            <w:tcBorders>
+              <w:top w:val="single" w:color="B9D7F2" w:sz="4"/>
+              <w:left w:val="single" w:color="B9D7F2" w:sz="4"/>
+              <w:bottom w:val="single" w:color="B9D7F2" w:sz="4"/>
+              <w:right w:val="single" w:color="B9D7F2" w:sz="4"/>
+            </w:tcBorders>
+            <w:tcMar>
+              <w:top w:type="dxa" w:w="60"/>
+              <w:left w:type="dxa" w:w="90"/>
+              <w:bottom w:type="dxa" w:w="60"/>
+              <w:right w:type="dxa" w:w="90"/>
+            </w:tcMar>
+          </w:tcPr>
+          <w:p>
+            <w:pPr>
+              <w:spacing w:after="0" w:before="0"/>
+            </w:pPr>
+            <w:r>
+              <w:rPr>
+                <w:rFonts w:ascii="Arial" w:cs="Arial" w:eastAsia="Arial" w:hAnsi="Arial"/>
+                <w:color w:val="15202B"/>
+                <w:sz w:val="18"/>
+                <w:szCs w:val="18"/>
+              </w:rPr>
+              <w:t xml:space="preserve"/>
+            </w:r>
+          </w:p>
+        </w:tc>
+      </w:tr>
+      <w:tr>
+        <w:trPr>
+          <w:cantSplit/>
+        </w:trPr>
+        <w:tc>
+          <w:tcPr>
+            <w:tcW w:type="dxa" w:w="640"/>
+            <w:tcBorders>
+              <w:top w:val="single" w:color="B9D7F2" w:sz="4"/>
+              <w:left w:val="single" w:color="B9D7F2" w:sz="4"/>
+              <w:bottom w:val="single" w:color="B9D7F2" w:sz="4"/>
+              <w:right w:val="single" w:color="B9D7F2" w:sz="4"/>
+            </w:tcBorders>
+            <w:shd w:fill="EAF4FD" w:color="auto" w:val="clear"/>
+            <w:tcMar>
+              <w:top w:type="dxa" w:w="60"/>
+              <w:left w:type="dxa" w:w="90"/>
+              <w:bottom w:type="dxa" w:w="60"/>
+              <w:right w:type="dxa" w:w="90"/>
+            </w:tcMar>
+          </w:tcPr>
+          <w:p>
+            <w:pPr>
+              <w:spacing w:after="0" w:before="0"/>
+            </w:pPr>
+            <w:r>
+              <w:rPr>
+                <w:rFonts w:ascii="Arial" w:cs="Arial" w:eastAsia="Arial" w:hAnsi="Arial"/>
+                <w:color w:val="15202B"/>
+                <w:sz w:val="18"/>
+                <w:szCs w:val="18"/>
+              </w:rPr>
+              <w:t xml:space="preserve">26.8</w:t>
+            </w:r>
+          </w:p>
+        </w:tc>
+        <w:tc>
+          <w:tcPr>
+            <w:tcW w:type="dxa" w:w="3820"/>
+            <w:tcBorders>
+              <w:top w:val="single" w:color="B9D7F2" w:sz="4"/>
+              <w:left w:val="single" w:color="B9D7F2" w:sz="4"/>
+              <w:bottom w:val="single" w:color="B9D7F2" w:sz="4"/>
+              <w:right w:val="single" w:color="B9D7F2" w:sz="4"/>
+            </w:tcBorders>
+            <w:shd w:fill="EAF4FD" w:color="auto" w:val="clear"/>
+            <w:tcMar>
+              <w:top w:type="dxa" w:w="60"/>
+              <w:left w:type="dxa" w:w="90"/>
+              <w:bottom w:type="dxa" w:w="60"/>
+              <w:right w:type="dxa" w:w="90"/>
+            </w:tcMar>
+          </w:tcPr>
+          <w:p>
+            <w:pPr>
+              <w:spacing w:after="0" w:before="0"/>
+            </w:pPr>
+            <w:r>
+              <w:rPr>
+                <w:rFonts w:ascii="Arial" w:cs="Arial" w:eastAsia="Arial" w:hAnsi="Arial"/>
+                <w:color w:val="15202B"/>
+                <w:sz w:val="18"/>
+                <w:szCs w:val="18"/>
+              </w:rPr>
+              <w:t xml:space="preserve">Movement History.</w:t>
+            </w:r>
+          </w:p>
+        </w:tc>
+        <w:tc>
+          <w:tcPr>
+            <w:tcW w:type="dxa" w:w="3900"/>
+            <w:tcBorders>
+              <w:top w:val="single" w:color="B9D7F2" w:sz="4"/>
+              <w:left w:val="single" w:color="B9D7F2" w:sz="4"/>
+              <w:bottom w:val="single" w:color="B9D7F2" w:sz="4"/>
+              <w:right w:val="single" w:color="B9D7F2" w:sz="4"/>
+            </w:tcBorders>
+            <w:shd w:fill="EAF4FD" w:color="auto" w:val="clear"/>
+            <w:tcMar>
+              <w:top w:type="dxa" w:w="60"/>
+              <w:left w:type="dxa" w:w="90"/>
+              <w:bottom w:type="dxa" w:w="60"/>
+              <w:right w:type="dxa" w:w="90"/>
+            </w:tcMar>
+          </w:tcPr>
+          <w:p>
+            <w:pPr>
+              <w:spacing w:after="0" w:before="0"/>
+            </w:pPr>
+            <w:r>
+              <w:rPr>
+                <w:rFonts w:ascii="Arial" w:cs="Arial" w:eastAsia="Arial" w:hAnsi="Arial"/>
+                <w:color w:val="15202B"/>
+                <w:sz w:val="18"/>
+                <w:szCs w:val="18"/>
+              </w:rPr>
+              <w:t xml:space="preserve">Gallons and seals together, newest first.</w:t>
+            </w:r>
+          </w:p>
+        </w:tc>
+        <w:tc>
+          <w:tcPr>
+            <w:tcW w:type="dxa" w:w="900"/>
+            <w:tcBorders>
+              <w:top w:val="single" w:color="B9D7F2" w:sz="4"/>
+              <w:left w:val="single" w:color="B9D7F2" w:sz="4"/>
+              <w:bottom w:val="single" w:color="B9D7F2" w:sz="4"/>
+              <w:right w:val="single" w:color="B9D7F2" w:sz="4"/>
+            </w:tcBorders>
+            <w:shd w:fill="EAF4FD" w:color="auto" w:val="clear"/>
+            <w:tcMar>
+              <w:top w:type="dxa" w:w="60"/>
+              <w:left w:type="dxa" w:w="90"/>
+              <w:bottom w:type="dxa" w:w="60"/>
+              <w:right w:type="dxa" w:w="90"/>
+            </w:tcMar>
+          </w:tcPr>
+          <w:p>
+            <w:pPr>
+              <w:spacing w:after="0" w:before="0"/>
+            </w:pPr>
+            <w:r>
+              <w:rPr>
+                <w:rFonts w:ascii="Arial" w:cs="Arial" w:eastAsia="Arial" w:hAnsi="Arial"/>
+                <w:color w:val="15202B"/>
+                <w:sz w:val="18"/>
+                <w:szCs w:val="18"/>
+              </w:rPr>
+              <w:t xml:space="preserve">☐ Pass</w:t>
+            </w:r>
+          </w:p>
+          <w:p>
+            <w:pPr>
+              <w:spacing w:after="0" w:before="0"/>
+            </w:pPr>
+            <w:r>
+              <w:rPr>
+                <w:rFonts w:ascii="Arial" w:cs="Arial" w:eastAsia="Arial" w:hAnsi="Arial"/>
+                <w:color w:val="15202B"/>
+                <w:sz w:val="18"/>
+                <w:szCs w:val="18"/>
+              </w:rPr>
+              <w:t xml:space="preserve">☐ Fail</w:t>
+            </w:r>
+          </w:p>
+        </w:tc>
+        <w:tc>
+          <w:tcPr>
+            <w:tcW w:type="dxa" w:w="1206"/>
+            <w:tcBorders>
+              <w:top w:val="single" w:color="B9D7F2" w:sz="4"/>
+              <w:left w:val="single" w:color="B9D7F2" w:sz="4"/>
+              <w:bottom w:val="single" w:color="B9D7F2" w:sz="4"/>
+              <w:right w:val="single" w:color="B9D7F2" w:sz="4"/>
+            </w:tcBorders>
+            <w:shd w:fill="EAF4FD" w:color="auto" w:val="clear"/>
+            <w:tcMar>
+              <w:top w:type="dxa" w:w="60"/>
+              <w:left w:type="dxa" w:w="90"/>
+              <w:bottom w:type="dxa" w:w="60"/>
+              <w:right w:type="dxa" w:w="90"/>
+            </w:tcMar>
+          </w:tcPr>
+          <w:p>
+            <w:pPr>
+              <w:spacing w:after="0" w:before="0"/>
+            </w:pPr>
+            <w:r>
+              <w:rPr>
+                <w:rFonts w:ascii="Arial" w:cs="Arial" w:eastAsia="Arial" w:hAnsi="Arial"/>
+                <w:color w:val="15202B"/>
+                <w:sz w:val="18"/>
+                <w:szCs w:val="18"/>
+              </w:rPr>
+              <w:t xml:space="preserve"/>
+            </w:r>
+          </w:p>
+        </w:tc>
+      </w:tr>
+      <w:tr>
+        <w:trPr>
+          <w:cantSplit/>
+        </w:trPr>
+        <w:tc>
+          <w:tcPr>
+            <w:tcW w:type="dxa" w:w="640"/>
+            <w:tcBorders>
+              <w:top w:val="single" w:color="B9D7F2" w:sz="4"/>
+              <w:left w:val="single" w:color="B9D7F2" w:sz="4"/>
+              <w:bottom w:val="single" w:color="B9D7F2" w:sz="4"/>
+              <w:right w:val="single" w:color="B9D7F2" w:sz="4"/>
+            </w:tcBorders>
+            <w:tcMar>
+              <w:top w:type="dxa" w:w="60"/>
+              <w:left w:type="dxa" w:w="90"/>
+              <w:bottom w:type="dxa" w:w="60"/>
+              <w:right w:type="dxa" w:w="90"/>
+            </w:tcMar>
+          </w:tcPr>
+          <w:p>
+            <w:pPr>
+              <w:spacing w:after="0" w:before="0"/>
+            </w:pPr>
+            <w:r>
+              <w:rPr>
+                <w:rFonts w:ascii="Arial" w:cs="Arial" w:eastAsia="Arial" w:hAnsi="Arial"/>
+                <w:color w:val="15202B"/>
+                <w:sz w:val="18"/>
+                <w:szCs w:val="18"/>
+              </w:rPr>
+              <w:t xml:space="preserve">26.9</w:t>
+            </w:r>
+          </w:p>
+        </w:tc>
+        <w:tc>
+          <w:tcPr>
+            <w:tcW w:type="dxa" w:w="3820"/>
+            <w:tcBorders>
+              <w:top w:val="single" w:color="B9D7F2" w:sz="4"/>
+              <w:left w:val="single" w:color="B9D7F2" w:sz="4"/>
+              <w:bottom w:val="single" w:color="B9D7F2" w:sz="4"/>
+              <w:right w:val="single" w:color="B9D7F2" w:sz="4"/>
+            </w:tcBorders>
+            <w:tcMar>
+              <w:top w:type="dxa" w:w="60"/>
+              <w:left w:type="dxa" w:w="90"/>
+              <w:bottom w:type="dxa" w:w="60"/>
+              <w:right w:type="dxa" w:w="90"/>
+            </w:tcMar>
+          </w:tcPr>
+          <w:p>
+            <w:pPr>
+              <w:spacing w:after="0" w:before="0"/>
+            </w:pPr>
+            <w:r>
+              <w:rPr>
+                <w:rFonts w:ascii="Arial" w:cs="Arial" w:eastAsia="Arial" w:hAnsi="Arial"/>
+                <w:color w:val="15202B"/>
+                <w:sz w:val="18"/>
+                <w:szCs w:val="18"/>
+              </w:rPr>
+              <w:t xml:space="preserve">Filter &gt; Seals &gt; Lost &gt; Show.</w:t>
+            </w:r>
+          </w:p>
+        </w:tc>
+        <w:tc>
+          <w:tcPr>
+            <w:tcW w:type="dxa" w:w="3900"/>
+            <w:tcBorders>
+              <w:top w:val="single" w:color="B9D7F2" w:sz="4"/>
+              <w:left w:val="single" w:color="B9D7F2" w:sz="4"/>
+              <w:bottom w:val="single" w:color="B9D7F2" w:sz="4"/>
+              <w:right w:val="single" w:color="B9D7F2" w:sz="4"/>
+            </w:tcBorders>
+            <w:tcMar>
+              <w:top w:type="dxa" w:w="60"/>
+              <w:left w:type="dxa" w:w="90"/>
+              <w:bottom w:type="dxa" w:w="60"/>
+              <w:right w:type="dxa" w:w="90"/>
+            </w:tcMar>
+          </w:tcPr>
+          <w:p>
+            <w:pPr>
+              <w:spacing w:after="0" w:before="0"/>
+            </w:pPr>
+            <w:r>
+              <w:rPr>
+                <w:rFonts w:ascii="Arial" w:cs="Arial" w:eastAsia="Arial" w:hAnsi="Arial"/>
+                <w:color w:val="15202B"/>
+                <w:sz w:val="18"/>
+                <w:szCs w:val="18"/>
+              </w:rPr>
+              <w:t xml:space="preserve">"Filter: Seals · Lost"; only lost seals entries.</w:t>
+            </w:r>
+          </w:p>
+        </w:tc>
+        <w:tc>
+          <w:tcPr>
+            <w:tcW w:type="dxa" w:w="900"/>
+            <w:tcBorders>
+              <w:top w:val="single" w:color="B9D7F2" w:sz="4"/>
+              <w:left w:val="single" w:color="B9D7F2" w:sz="4"/>
+              <w:bottom w:val="single" w:color="B9D7F2" w:sz="4"/>
+              <w:right w:val="single" w:color="B9D7F2" w:sz="4"/>
+            </w:tcBorders>
+            <w:tcMar>
+              <w:top w:type="dxa" w:w="60"/>
+              <w:left w:type="dxa" w:w="90"/>
+              <w:bottom w:type="dxa" w:w="60"/>
+              <w:right w:type="dxa" w:w="90"/>
+            </w:tcMar>
+          </w:tcPr>
+          <w:p>
+            <w:pPr>
+              <w:spacing w:after="0" w:before="0"/>
+            </w:pPr>
+            <w:r>
+              <w:rPr>
+                <w:rFonts w:ascii="Arial" w:cs="Arial" w:eastAsia="Arial" w:hAnsi="Arial"/>
+                <w:color w:val="15202B"/>
+                <w:sz w:val="18"/>
+                <w:szCs w:val="18"/>
+              </w:rPr>
+              <w:t xml:space="preserve">☐ Pass</w:t>
+            </w:r>
+          </w:p>
+          <w:p>
+            <w:pPr>
+              <w:spacing w:after="0" w:before="0"/>
+            </w:pPr>
+            <w:r>
+              <w:rPr>
+                <w:rFonts w:ascii="Arial" w:cs="Arial" w:eastAsia="Arial" w:hAnsi="Arial"/>
+                <w:color w:val="15202B"/>
+                <w:sz w:val="18"/>
+                <w:szCs w:val="18"/>
+              </w:rPr>
+              <w:t xml:space="preserve">☐ Fail</w:t>
+            </w:r>
+          </w:p>
+        </w:tc>
+        <w:tc>
+          <w:tcPr>
+            <w:tcW w:type="dxa" w:w="1206"/>
+            <w:tcBorders>
+              <w:top w:val="single" w:color="B9D7F2" w:sz="4"/>
+              <w:left w:val="single" w:color="B9D7F2" w:sz="4"/>
+              <w:bottom w:val="single" w:color="B9D7F2" w:sz="4"/>
+              <w:right w:val="single" w:color="B9D7F2" w:sz="4"/>
+            </w:tcBorders>
+            <w:tcMar>
+              <w:top w:type="dxa" w:w="60"/>
+              <w:left w:type="dxa" w:w="90"/>
+              <w:bottom w:type="dxa" w:w="60"/>
+              <w:right w:type="dxa" w:w="90"/>
+            </w:tcMar>
+          </w:tcPr>
+          <w:p>
+            <w:pPr>
+              <w:spacing w:after="0" w:before="0"/>
+            </w:pPr>
+            <w:r>
+              <w:rPr>
+                <w:rFonts w:ascii="Arial" w:cs="Arial" w:eastAsia="Arial" w:hAnsi="Arial"/>
+                <w:color w:val="15202B"/>
+                <w:sz w:val="18"/>
+                <w:szCs w:val="18"/>
+              </w:rPr>
+              <w:t xml:space="preserve"/>
+            </w:r>
+          </w:p>
+        </w:tc>
+      </w:tr>
+      <w:tr>
+        <w:trPr>
+          <w:cantSplit/>
+        </w:trPr>
+        <w:tc>
+          <w:tcPr>
+            <w:tcW w:type="dxa" w:w="640"/>
+            <w:tcBorders>
+              <w:top w:val="single" w:color="B9D7F2" w:sz="4"/>
+              <w:left w:val="single" w:color="B9D7F2" w:sz="4"/>
+              <w:bottom w:val="single" w:color="B9D7F2" w:sz="4"/>
+              <w:right w:val="single" w:color="B9D7F2" w:sz="4"/>
+            </w:tcBorders>
+            <w:shd w:fill="EAF4FD" w:color="auto" w:val="clear"/>
+            <w:tcMar>
+              <w:top w:type="dxa" w:w="60"/>
+              <w:left w:type="dxa" w:w="90"/>
+              <w:bottom w:type="dxa" w:w="60"/>
+              <w:right w:type="dxa" w:w="90"/>
+            </w:tcMar>
+          </w:tcPr>
+          <w:p>
+            <w:pPr>
+              <w:spacing w:after="0" w:before="0"/>
+            </w:pPr>
+            <w:r>
+              <w:rPr>
+                <w:rFonts w:ascii="Arial" w:cs="Arial" w:eastAsia="Arial" w:hAnsi="Arial"/>
+                <w:color w:val="15202B"/>
+                <w:sz w:val="18"/>
+                <w:szCs w:val="18"/>
+              </w:rPr>
+              <w:t xml:space="preserve">26.10</w:t>
+            </w:r>
+          </w:p>
+        </w:tc>
+        <w:tc>
+          <w:tcPr>
+            <w:tcW w:type="dxa" w:w="3820"/>
+            <w:tcBorders>
+              <w:top w:val="single" w:color="B9D7F2" w:sz="4"/>
+              <w:left w:val="single" w:color="B9D7F2" w:sz="4"/>
+              <w:bottom w:val="single" w:color="B9D7F2" w:sz="4"/>
+              <w:right w:val="single" w:color="B9D7F2" w:sz="4"/>
+            </w:tcBorders>
+            <w:shd w:fill="EAF4FD" w:color="auto" w:val="clear"/>
+            <w:tcMar>
+              <w:top w:type="dxa" w:w="60"/>
+              <w:left w:type="dxa" w:w="90"/>
+              <w:bottom w:type="dxa" w:w="60"/>
+              <w:right w:type="dxa" w:w="90"/>
+            </w:tcMar>
+          </w:tcPr>
+          <w:p>
+            <w:pPr>
+              <w:spacing w:after="0" w:before="0"/>
+            </w:pPr>
+            <w:r>
+              <w:rPr>
+                <w:rFonts w:ascii="Arial" w:cs="Arial" w:eastAsia="Arial" w:hAnsi="Arial"/>
+                <w:color w:val="15202B"/>
+                <w:sz w:val="18"/>
+                <w:szCs w:val="18"/>
+              </w:rPr>
+              <w:t xml:space="preserve">Filter &gt; pick today's date &gt; Show; then Clear filter &gt; Show.</w:t>
+            </w:r>
+          </w:p>
+        </w:tc>
+        <w:tc>
+          <w:tcPr>
+            <w:tcW w:type="dxa" w:w="3900"/>
+            <w:tcBorders>
+              <w:top w:val="single" w:color="B9D7F2" w:sz="4"/>
+              <w:left w:val="single" w:color="B9D7F2" w:sz="4"/>
+              <w:bottom w:val="single" w:color="B9D7F2" w:sz="4"/>
+              <w:right w:val="single" w:color="B9D7F2" w:sz="4"/>
+            </w:tcBorders>
+            <w:shd w:fill="EAF4FD" w:color="auto" w:val="clear"/>
+            <w:tcMar>
+              <w:top w:type="dxa" w:w="60"/>
+              <w:left w:type="dxa" w:w="90"/>
+              <w:bottom w:type="dxa" w:w="60"/>
+              <w:right w:type="dxa" w:w="90"/>
+            </w:tcMar>
+          </w:tcPr>
+          <w:p>
+            <w:pPr>
+              <w:spacing w:after="0" w:before="0"/>
+            </w:pPr>
+            <w:r>
+              <w:rPr>
+                <w:rFonts w:ascii="Arial" w:cs="Arial" w:eastAsia="Arial" w:hAnsi="Arial"/>
+                <w:color w:val="15202B"/>
+                <w:sz w:val="18"/>
+                <w:szCs w:val="18"/>
+              </w:rPr>
+              <w:t xml:space="preserve">Only today's entries; then all entries again.</w:t>
+            </w:r>
+          </w:p>
+        </w:tc>
+        <w:tc>
+          <w:tcPr>
+            <w:tcW w:type="dxa" w:w="900"/>
+            <w:tcBorders>
+              <w:top w:val="single" w:color="B9D7F2" w:sz="4"/>
+              <w:left w:val="single" w:color="B9D7F2" w:sz="4"/>
+              <w:bottom w:val="single" w:color="B9D7F2" w:sz="4"/>
+              <w:right w:val="single" w:color="B9D7F2" w:sz="4"/>
+            </w:tcBorders>
+            <w:shd w:fill="EAF4FD" w:color="auto" w:val="clear"/>
+            <w:tcMar>
+              <w:top w:type="dxa" w:w="60"/>
+              <w:left w:type="dxa" w:w="90"/>
+              <w:bottom w:type="dxa" w:w="60"/>
+              <w:right w:type="dxa" w:w="90"/>
+            </w:tcMar>
+          </w:tcPr>
+          <w:p>
+            <w:pPr>
+              <w:spacing w:after="0" w:before="0"/>
+            </w:pPr>
+            <w:r>
+              <w:rPr>
+                <w:rFonts w:ascii="Arial" w:cs="Arial" w:eastAsia="Arial" w:hAnsi="Arial"/>
+                <w:color w:val="15202B"/>
+                <w:sz w:val="18"/>
+                <w:szCs w:val="18"/>
+              </w:rPr>
+              <w:t xml:space="preserve">☐ Pass</w:t>
+            </w:r>
+          </w:p>
+          <w:p>
+            <w:pPr>
+              <w:spacing w:after="0" w:before="0"/>
+            </w:pPr>
+            <w:r>
+              <w:rPr>
+                <w:rFonts w:ascii="Arial" w:cs="Arial" w:eastAsia="Arial" w:hAnsi="Arial"/>
+                <w:color w:val="15202B"/>
+                <w:sz w:val="18"/>
+                <w:szCs w:val="18"/>
+              </w:rPr>
+              <w:t xml:space="preserve">☐ Fail</w:t>
+            </w:r>
+          </w:p>
+        </w:tc>
+        <w:tc>
+          <w:tcPr>
+            <w:tcW w:type="dxa" w:w="1206"/>
+            <w:tcBorders>
+              <w:top w:val="single" w:color="B9D7F2" w:sz="4"/>
+              <w:left w:val="single" w:color="B9D7F2" w:sz="4"/>
+              <w:bottom w:val="single" w:color="B9D7F2" w:sz="4"/>
+              <w:right w:val="single" w:color="B9D7F2" w:sz="4"/>
+            </w:tcBorders>
+            <w:shd w:fill="EAF4FD" w:color="auto" w:val="clear"/>
+            <w:tcMar>
+              <w:top w:type="dxa" w:w="60"/>
+              <w:left w:type="dxa" w:w="90"/>
+              <w:bottom w:type="dxa" w:w="60"/>
+              <w:right w:type="dxa" w:w="90"/>
+            </w:tcMar>
+          </w:tcPr>
+          <w:p>
+            <w:pPr>
+              <w:spacing w:after="0" w:before="0"/>
+            </w:pPr>
+            <w:r>
+              <w:rPr>
+                <w:rFonts w:ascii="Arial" w:cs="Arial" w:eastAsia="Arial" w:hAnsi="Arial"/>
+                <w:color w:val="15202B"/>
+                <w:sz w:val="18"/>
+                <w:szCs w:val="18"/>
+              </w:rPr>
+              <w:t xml:space="preserve"/>
+            </w:r>
+          </w:p>
+        </w:tc>
+      </w:tr>
+      <w:tr>
+        <w:trPr>
+          <w:cantSplit/>
+        </w:trPr>
+        <w:tc>
+          <w:tcPr>
+            <w:tcW w:type="dxa" w:w="640"/>
+            <w:tcBorders>
+              <w:top w:val="single" w:color="B9D7F2" w:sz="4"/>
+              <w:left w:val="single" w:color="B9D7F2" w:sz="4"/>
+              <w:bottom w:val="single" w:color="B9D7F2" w:sz="4"/>
+              <w:right w:val="single" w:color="B9D7F2" w:sz="4"/>
+            </w:tcBorders>
+            <w:tcMar>
+              <w:top w:type="dxa" w:w="60"/>
+              <w:left w:type="dxa" w:w="90"/>
+              <w:bottom w:type="dxa" w:w="60"/>
+              <w:right w:type="dxa" w:w="90"/>
+            </w:tcMar>
+          </w:tcPr>
+          <w:p>
+            <w:pPr>
+              <w:spacing w:after="0" w:before="0"/>
+            </w:pPr>
+            <w:r>
+              <w:rPr>
+                <w:rFonts w:ascii="Arial" w:cs="Arial" w:eastAsia="Arial" w:hAnsi="Arial"/>
+                <w:color w:val="15202B"/>
+                <w:sz w:val="18"/>
+                <w:szCs w:val="18"/>
+              </w:rPr>
+              <w:t xml:space="preserve">26.11</w:t>
+            </w:r>
+          </w:p>
+        </w:tc>
+        <w:tc>
+          <w:tcPr>
+            <w:tcW w:type="dxa" w:w="3820"/>
+            <w:tcBorders>
+              <w:top w:val="single" w:color="B9D7F2" w:sz="4"/>
+              <w:left w:val="single" w:color="B9D7F2" w:sz="4"/>
+              <w:bottom w:val="single" w:color="B9D7F2" w:sz="4"/>
+              <w:right w:val="single" w:color="B9D7F2" w:sz="4"/>
+            </w:tcBorders>
+            <w:tcMar>
+              <w:top w:type="dxa" w:w="60"/>
+              <w:left w:type="dxa" w:w="90"/>
+              <w:bottom w:type="dxa" w:w="60"/>
+              <w:right w:type="dxa" w:w="90"/>
+            </w:tcMar>
+          </w:tcPr>
+          <w:p>
+            <w:pPr>
+              <w:spacing w:after="0" w:before="0"/>
+            </w:pPr>
+            <w:r>
+              <w:rPr>
+                <w:rFonts w:ascii="Arial" w:cs="Arial" w:eastAsia="Arial" w:hAnsi="Arial"/>
+                <w:color w:val="15202B"/>
+                <w:sz w:val="18"/>
+                <w:szCs w:val="18"/>
+              </w:rPr>
+              <w:t xml:space="preserve">Bring new gallons below 30 (or seals below 60).</w:t>
+            </w:r>
+          </w:p>
+        </w:tc>
+        <w:tc>
+          <w:tcPr>
+            <w:tcW w:type="dxa" w:w="3900"/>
+            <w:tcBorders>
+              <w:top w:val="single" w:color="B9D7F2" w:sz="4"/>
+              <w:left w:val="single" w:color="B9D7F2" w:sz="4"/>
+              <w:bottom w:val="single" w:color="B9D7F2" w:sz="4"/>
+              <w:right w:val="single" w:color="B9D7F2" w:sz="4"/>
+            </w:tcBorders>
+            <w:tcMar>
+              <w:top w:type="dxa" w:w="60"/>
+              <w:left w:type="dxa" w:w="90"/>
+              <w:bottom w:type="dxa" w:w="60"/>
+              <w:right w:type="dxa" w:w="90"/>
+            </w:tcMar>
+          </w:tcPr>
+          <w:p>
+            <w:pPr>
+              <w:spacing w:after="0" w:before="0"/>
+            </w:pPr>
+            <w:r>
+              <w:rPr>
+                <w:rFonts w:ascii="Arial" w:cs="Arial" w:eastAsia="Arial" w:hAnsi="Arial"/>
+                <w:color w:val="15202B"/>
+                <w:sz w:val="18"/>
+                <w:szCs w:val="18"/>
+              </w:rPr>
+              <w:t xml:space="preserve">Low-stock warning on Stock Overview and Home; bell alert "Low stock".</w:t>
+            </w:r>
+          </w:p>
+        </w:tc>
+        <w:tc>
+          <w:tcPr>
+            <w:tcW w:type="dxa" w:w="900"/>
+            <w:tcBorders>
+              <w:top w:val="single" w:color="B9D7F2" w:sz="4"/>
+              <w:left w:val="single" w:color="B9D7F2" w:sz="4"/>
+              <w:bottom w:val="single" w:color="B9D7F2" w:sz="4"/>
+              <w:right w:val="single" w:color="B9D7F2" w:sz="4"/>
+            </w:tcBorders>
+            <w:tcMar>
+              <w:top w:type="dxa" w:w="60"/>
+              <w:left w:type="dxa" w:w="90"/>
+              <w:bottom w:type="dxa" w:w="60"/>
+              <w:right w:type="dxa" w:w="90"/>
+            </w:tcMar>
+          </w:tcPr>
+          <w:p>
+            <w:pPr>
+              <w:spacing w:after="0" w:before="0"/>
+            </w:pPr>
+            <w:r>
+              <w:rPr>
+                <w:rFonts w:ascii="Arial" w:cs="Arial" w:eastAsia="Arial" w:hAnsi="Arial"/>
+                <w:color w:val="15202B"/>
+                <w:sz w:val="18"/>
+                <w:szCs w:val="18"/>
+              </w:rPr>
+              <w:t xml:space="preserve">☐ Pass</w:t>
+            </w:r>
+          </w:p>
+          <w:p>
+            <w:pPr>
+              <w:spacing w:after="0" w:before="0"/>
+            </w:pPr>
+            <w:r>
+              <w:rPr>
+                <w:rFonts w:ascii="Arial" w:cs="Arial" w:eastAsia="Arial" w:hAnsi="Arial"/>
+                <w:color w:val="15202B"/>
+                <w:sz w:val="18"/>
+                <w:szCs w:val="18"/>
+              </w:rPr>
+              <w:t xml:space="preserve">☐ Fail</w:t>
+            </w:r>
+          </w:p>
+        </w:tc>
+        <w:tc>
+          <w:tcPr>
+            <w:tcW w:type="dxa" w:w="1206"/>
+            <w:tcBorders>
+              <w:top w:val="single" w:color="B9D7F2" w:sz="4"/>
+              <w:left w:val="single" w:color="B9D7F2" w:sz="4"/>
+              <w:bottom w:val="single" w:color="B9D7F2" w:sz="4"/>
+              <w:right w:val="single" w:color="B9D7F2" w:sz="4"/>
+            </w:tcBorders>
             <w:tcMar>
               <w:top w:type="dxa" w:w="60"/>
               <w:left w:type="dxa" w:w="90"/>

</xml_diff>

<commit_message>
T27 owner Home (switch view, tank, needs your action, today's summary, stock alerts), T28 mark paid, T29 Daily Sales Report
Co-Authored-By: Claude Opus 5.5 <noreply@anthropic.com>
Claude-Session: https://claude.ai/code/session_01DasQCNUJBbLyCWkvv4Qmw3
</commit_message>
<xml_diff>
--- a/docs/testing/Mangao-Testing-Checklist.docx
+++ b/docs/testing/Mangao-Testing-Checklist.docx
@@ -30,7 +30,7 @@
           <w:sz w:val="19"/>
           <w:szCs w:val="19"/>
         </w:rPr>
-        <w:t xml:space="preserve">Steps built but not yet checked in Chrome: 17 steps, 137 checks. Updated Oct 14, 2026, 1:01 AM.</w:t>
+        <w:t xml:space="preserve">Steps built but not yet checked in Chrome: 20 steps, 158 checks. Updated Oct 14, 2026, 1:03 AM.</w:t>
       </w:r>
     </w:p>
     <w:p>
@@ -4056,6 +4056,496 @@
           </w:p>
         </w:tc>
       </w:tr>
+      <w:tr>
+        <w:trPr>
+          <w:cantSplit/>
+        </w:trPr>
+        <w:tc>
+          <w:tcPr>
+            <w:tcW w:type="dxa" w:w="900"/>
+            <w:tcBorders>
+              <w:top w:val="single" w:color="B9D7F2" w:sz="4"/>
+              <w:left w:val="single" w:color="B9D7F2" w:sz="4"/>
+              <w:bottom w:val="single" w:color="B9D7F2" w:sz="4"/>
+              <w:right w:val="single" w:color="B9D7F2" w:sz="4"/>
+            </w:tcBorders>
+            <w:shd w:fill="EAF4FD" w:color="auto" w:val="clear"/>
+            <w:tcMar>
+              <w:top w:type="dxa" w:w="60"/>
+              <w:left w:type="dxa" w:w="90"/>
+              <w:bottom w:type="dxa" w:w="60"/>
+              <w:right w:type="dxa" w:w="90"/>
+            </w:tcMar>
+          </w:tcPr>
+          <w:p>
+            <w:pPr>
+              <w:spacing w:after="0" w:before="0"/>
+            </w:pPr>
+            <w:r>
+              <w:rPr>
+                <w:rFonts w:ascii="Arial" w:cs="Arial" w:eastAsia="Arial" w:hAnsi="Arial"/>
+                <w:color w:val="15202B"/>
+                <w:sz w:val="18"/>
+                <w:szCs w:val="18"/>
+              </w:rPr>
+              <w:t xml:space="preserve">27</w:t>
+            </w:r>
+          </w:p>
+        </w:tc>
+        <w:tc>
+          <w:tcPr>
+            <w:tcW w:type="dxa" w:w="4400"/>
+            <w:tcBorders>
+              <w:top w:val="single" w:color="B9D7F2" w:sz="4"/>
+              <w:left w:val="single" w:color="B9D7F2" w:sz="4"/>
+              <w:bottom w:val="single" w:color="B9D7F2" w:sz="4"/>
+              <w:right w:val="single" w:color="B9D7F2" w:sz="4"/>
+            </w:tcBorders>
+            <w:shd w:fill="EAF4FD" w:color="auto" w:val="clear"/>
+            <w:tcMar>
+              <w:top w:type="dxa" w:w="60"/>
+              <w:left w:type="dxa" w:w="90"/>
+              <w:bottom w:type="dxa" w:w="60"/>
+              <w:right w:type="dxa" w:w="90"/>
+            </w:tcMar>
+          </w:tcPr>
+          <w:p>
+            <w:pPr>
+              <w:spacing w:after="0" w:before="0"/>
+            </w:pPr>
+            <w:r>
+              <w:rPr>
+                <w:rFonts w:ascii="Arial" w:cs="Arial" w:eastAsia="Arial" w:hAnsi="Arial"/>
+                <w:color w:val="15202B"/>
+                <w:sz w:val="18"/>
+                <w:szCs w:val="18"/>
+              </w:rPr>
+              <w:t xml:space="preserve">Owner Home: Today's Summary and Needs Your Action</w:t>
+            </w:r>
+          </w:p>
+        </w:tc>
+        <w:tc>
+          <w:tcPr>
+            <w:tcW w:type="dxa" w:w="2600"/>
+            <w:tcBorders>
+              <w:top w:val="single" w:color="B9D7F2" w:sz="4"/>
+              <w:left w:val="single" w:color="B9D7F2" w:sz="4"/>
+              <w:bottom w:val="single" w:color="B9D7F2" w:sz="4"/>
+              <w:right w:val="single" w:color="B9D7F2" w:sz="4"/>
+            </w:tcBorders>
+            <w:shd w:fill="EAF4FD" w:color="auto" w:val="clear"/>
+            <w:tcMar>
+              <w:top w:type="dxa" w:w="60"/>
+              <w:left w:type="dxa" w:w="90"/>
+              <w:bottom w:type="dxa" w:w="60"/>
+              <w:right w:type="dxa" w:w="90"/>
+            </w:tcMar>
+          </w:tcPr>
+          <w:p>
+            <w:pPr>
+              <w:spacing w:after="0" w:before="0"/>
+            </w:pPr>
+            <w:r>
+              <w:rPr>
+                <w:rFonts w:ascii="Arial" w:cs="Arial" w:eastAsia="Arial" w:hAnsi="Arial"/>
+                <w:color w:val="15202B"/>
+                <w:sz w:val="18"/>
+                <w:szCs w:val="18"/>
+              </w:rPr>
+              <w:t xml:space="preserve">Admin Home 1, 2, 3, 4, 7</w:t>
+            </w:r>
+          </w:p>
+        </w:tc>
+        <w:tc>
+          <w:tcPr>
+            <w:tcW w:type="dxa" w:w="1300"/>
+            <w:tcBorders>
+              <w:top w:val="single" w:color="B9D7F2" w:sz="4"/>
+              <w:left w:val="single" w:color="B9D7F2" w:sz="4"/>
+              <w:bottom w:val="single" w:color="B9D7F2" w:sz="4"/>
+              <w:right w:val="single" w:color="B9D7F2" w:sz="4"/>
+            </w:tcBorders>
+            <w:shd w:fill="EAF4FD" w:color="auto" w:val="clear"/>
+            <w:tcMar>
+              <w:top w:type="dxa" w:w="60"/>
+              <w:left w:type="dxa" w:w="90"/>
+              <w:bottom w:type="dxa" w:w="60"/>
+              <w:right w:type="dxa" w:w="90"/>
+            </w:tcMar>
+          </w:tcPr>
+          <w:p>
+            <w:pPr>
+              <w:spacing w:after="0" w:before="0"/>
+            </w:pPr>
+            <w:r>
+              <w:rPr>
+                <w:rFonts w:ascii="Arial" w:cs="Arial" w:eastAsia="Arial" w:hAnsi="Arial"/>
+                <w:color w:val="15202B"/>
+                <w:sz w:val="18"/>
+                <w:szCs w:val="18"/>
+              </w:rPr>
+              <w:t xml:space="preserve">9</w:t>
+            </w:r>
+          </w:p>
+        </w:tc>
+        <w:tc>
+          <w:tcPr>
+            <w:tcW w:type="dxa" w:w="1266"/>
+            <w:tcBorders>
+              <w:top w:val="single" w:color="B9D7F2" w:sz="4"/>
+              <w:left w:val="single" w:color="B9D7F2" w:sz="4"/>
+              <w:bottom w:val="single" w:color="B9D7F2" w:sz="4"/>
+              <w:right w:val="single" w:color="B9D7F2" w:sz="4"/>
+            </w:tcBorders>
+            <w:shd w:fill="EAF4FD" w:color="auto" w:val="clear"/>
+            <w:tcMar>
+              <w:top w:type="dxa" w:w="60"/>
+              <w:left w:type="dxa" w:w="90"/>
+              <w:bottom w:type="dxa" w:w="60"/>
+              <w:right w:type="dxa" w:w="90"/>
+            </w:tcMar>
+          </w:tcPr>
+          <w:p>
+            <w:pPr>
+              <w:spacing w:after="0" w:before="0"/>
+            </w:pPr>
+            <w:r>
+              <w:rPr>
+                <w:rFonts w:ascii="Arial" w:cs="Arial" w:eastAsia="Arial" w:hAnsi="Arial"/>
+                <w:color w:val="15202B"/>
+                <w:sz w:val="18"/>
+                <w:szCs w:val="18"/>
+              </w:rPr>
+              <w:t xml:space="preserve">☐ Yes  ☐ No</w:t>
+            </w:r>
+          </w:p>
+        </w:tc>
+      </w:tr>
+      <w:tr>
+        <w:trPr>
+          <w:cantSplit/>
+        </w:trPr>
+        <w:tc>
+          <w:tcPr>
+            <w:tcW w:type="dxa" w:w="900"/>
+            <w:tcBorders>
+              <w:top w:val="single" w:color="B9D7F2" w:sz="4"/>
+              <w:left w:val="single" w:color="B9D7F2" w:sz="4"/>
+              <w:bottom w:val="single" w:color="B9D7F2" w:sz="4"/>
+              <w:right w:val="single" w:color="B9D7F2" w:sz="4"/>
+            </w:tcBorders>
+            <w:tcMar>
+              <w:top w:type="dxa" w:w="60"/>
+              <w:left w:type="dxa" w:w="90"/>
+              <w:bottom w:type="dxa" w:w="60"/>
+              <w:right w:type="dxa" w:w="90"/>
+            </w:tcMar>
+          </w:tcPr>
+          <w:p>
+            <w:pPr>
+              <w:spacing w:after="0" w:before="0"/>
+            </w:pPr>
+            <w:r>
+              <w:rPr>
+                <w:rFonts w:ascii="Arial" w:cs="Arial" w:eastAsia="Arial" w:hAnsi="Arial"/>
+                <w:color w:val="15202B"/>
+                <w:sz w:val="18"/>
+                <w:szCs w:val="18"/>
+              </w:rPr>
+              <w:t xml:space="preserve">28</w:t>
+            </w:r>
+          </w:p>
+        </w:tc>
+        <w:tc>
+          <w:tcPr>
+            <w:tcW w:type="dxa" w:w="4400"/>
+            <w:tcBorders>
+              <w:top w:val="single" w:color="B9D7F2" w:sz="4"/>
+              <w:left w:val="single" w:color="B9D7F2" w:sz="4"/>
+              <w:bottom w:val="single" w:color="B9D7F2" w:sz="4"/>
+              <w:right w:val="single" w:color="B9D7F2" w:sz="4"/>
+            </w:tcBorders>
+            <w:tcMar>
+              <w:top w:type="dxa" w:w="60"/>
+              <w:left w:type="dxa" w:w="90"/>
+              <w:bottom w:type="dxa" w:w="60"/>
+              <w:right w:type="dxa" w:w="90"/>
+            </w:tcMar>
+          </w:tcPr>
+          <w:p>
+            <w:pPr>
+              <w:spacing w:after="0" w:before="0"/>
+            </w:pPr>
+            <w:r>
+              <w:rPr>
+                <w:rFonts w:ascii="Arial" w:cs="Arial" w:eastAsia="Arial" w:hAnsi="Arial"/>
+                <w:color w:val="15202B"/>
+                <w:sz w:val="18"/>
+                <w:szCs w:val="18"/>
+              </w:rPr>
+              <w:t xml:space="preserve">Payments and unpaid balance</w:t>
+            </w:r>
+          </w:p>
+        </w:tc>
+        <w:tc>
+          <w:tcPr>
+            <w:tcW w:type="dxa" w:w="2600"/>
+            <w:tcBorders>
+              <w:top w:val="single" w:color="B9D7F2" w:sz="4"/>
+              <w:left w:val="single" w:color="B9D7F2" w:sz="4"/>
+              <w:bottom w:val="single" w:color="B9D7F2" w:sz="4"/>
+              <w:right w:val="single" w:color="B9D7F2" w:sz="4"/>
+            </w:tcBorders>
+            <w:tcMar>
+              <w:top w:type="dxa" w:w="60"/>
+              <w:left w:type="dxa" w:w="90"/>
+              <w:bottom w:type="dxa" w:w="60"/>
+              <w:right w:type="dxa" w:w="90"/>
+            </w:tcMar>
+          </w:tcPr>
+          <w:p>
+            <w:pPr>
+              <w:spacing w:after="0" w:before="0"/>
+            </w:pPr>
+            <w:r>
+              <w:rPr>
+                <w:rFonts w:ascii="Arial" w:cs="Arial" w:eastAsia="Arial" w:hAnsi="Arial"/>
+                <w:color w:val="15202B"/>
+                <w:sz w:val="18"/>
+                <w:szCs w:val="18"/>
+              </w:rPr>
+              <w:t xml:space="preserve">Admin Orders 6, Customer 3</w:t>
+            </w:r>
+          </w:p>
+        </w:tc>
+        <w:tc>
+          <w:tcPr>
+            <w:tcW w:type="dxa" w:w="1300"/>
+            <w:tcBorders>
+              <w:top w:val="single" w:color="B9D7F2" w:sz="4"/>
+              <w:left w:val="single" w:color="B9D7F2" w:sz="4"/>
+              <w:bottom w:val="single" w:color="B9D7F2" w:sz="4"/>
+              <w:right w:val="single" w:color="B9D7F2" w:sz="4"/>
+            </w:tcBorders>
+            <w:tcMar>
+              <w:top w:type="dxa" w:w="60"/>
+              <w:left w:type="dxa" w:w="90"/>
+              <w:bottom w:type="dxa" w:w="60"/>
+              <w:right w:type="dxa" w:w="90"/>
+            </w:tcMar>
+          </w:tcPr>
+          <w:p>
+            <w:pPr>
+              <w:spacing w:after="0" w:before="0"/>
+            </w:pPr>
+            <w:r>
+              <w:rPr>
+                <w:rFonts w:ascii="Arial" w:cs="Arial" w:eastAsia="Arial" w:hAnsi="Arial"/>
+                <w:color w:val="15202B"/>
+                <w:sz w:val="18"/>
+                <w:szCs w:val="18"/>
+              </w:rPr>
+              <w:t xml:space="preserve">6</w:t>
+            </w:r>
+          </w:p>
+        </w:tc>
+        <w:tc>
+          <w:tcPr>
+            <w:tcW w:type="dxa" w:w="1266"/>
+            <w:tcBorders>
+              <w:top w:val="single" w:color="B9D7F2" w:sz="4"/>
+              <w:left w:val="single" w:color="B9D7F2" w:sz="4"/>
+              <w:bottom w:val="single" w:color="B9D7F2" w:sz="4"/>
+              <w:right w:val="single" w:color="B9D7F2" w:sz="4"/>
+            </w:tcBorders>
+            <w:tcMar>
+              <w:top w:type="dxa" w:w="60"/>
+              <w:left w:type="dxa" w:w="90"/>
+              <w:bottom w:type="dxa" w:w="60"/>
+              <w:right w:type="dxa" w:w="90"/>
+            </w:tcMar>
+          </w:tcPr>
+          <w:p>
+            <w:pPr>
+              <w:spacing w:after="0" w:before="0"/>
+            </w:pPr>
+            <w:r>
+              <w:rPr>
+                <w:rFonts w:ascii="Arial" w:cs="Arial" w:eastAsia="Arial" w:hAnsi="Arial"/>
+                <w:color w:val="15202B"/>
+                <w:sz w:val="18"/>
+                <w:szCs w:val="18"/>
+              </w:rPr>
+              <w:t xml:space="preserve">☐ Yes  ☐ No</w:t>
+            </w:r>
+          </w:p>
+        </w:tc>
+      </w:tr>
+      <w:tr>
+        <w:trPr>
+          <w:cantSplit/>
+        </w:trPr>
+        <w:tc>
+          <w:tcPr>
+            <w:tcW w:type="dxa" w:w="900"/>
+            <w:tcBorders>
+              <w:top w:val="single" w:color="B9D7F2" w:sz="4"/>
+              <w:left w:val="single" w:color="B9D7F2" w:sz="4"/>
+              <w:bottom w:val="single" w:color="B9D7F2" w:sz="4"/>
+              <w:right w:val="single" w:color="B9D7F2" w:sz="4"/>
+            </w:tcBorders>
+            <w:shd w:fill="EAF4FD" w:color="auto" w:val="clear"/>
+            <w:tcMar>
+              <w:top w:type="dxa" w:w="60"/>
+              <w:left w:type="dxa" w:w="90"/>
+              <w:bottom w:type="dxa" w:w="60"/>
+              <w:right w:type="dxa" w:w="90"/>
+            </w:tcMar>
+          </w:tcPr>
+          <w:p>
+            <w:pPr>
+              <w:spacing w:after="0" w:before="0"/>
+            </w:pPr>
+            <w:r>
+              <w:rPr>
+                <w:rFonts w:ascii="Arial" w:cs="Arial" w:eastAsia="Arial" w:hAnsi="Arial"/>
+                <w:color w:val="15202B"/>
+                <w:sz w:val="18"/>
+                <w:szCs w:val="18"/>
+              </w:rPr>
+              <w:t xml:space="preserve">29</w:t>
+            </w:r>
+          </w:p>
+        </w:tc>
+        <w:tc>
+          <w:tcPr>
+            <w:tcW w:type="dxa" w:w="4400"/>
+            <w:tcBorders>
+              <w:top w:val="single" w:color="B9D7F2" w:sz="4"/>
+              <w:left w:val="single" w:color="B9D7F2" w:sz="4"/>
+              <w:bottom w:val="single" w:color="B9D7F2" w:sz="4"/>
+              <w:right w:val="single" w:color="B9D7F2" w:sz="4"/>
+            </w:tcBorders>
+            <w:shd w:fill="EAF4FD" w:color="auto" w:val="clear"/>
+            <w:tcMar>
+              <w:top w:type="dxa" w:w="60"/>
+              <w:left w:type="dxa" w:w="90"/>
+              <w:bottom w:type="dxa" w:w="60"/>
+              <w:right w:type="dxa" w:w="90"/>
+            </w:tcMar>
+          </w:tcPr>
+          <w:p>
+            <w:pPr>
+              <w:spacing w:after="0" w:before="0"/>
+            </w:pPr>
+            <w:r>
+              <w:rPr>
+                <w:rFonts w:ascii="Arial" w:cs="Arial" w:eastAsia="Arial" w:hAnsi="Arial"/>
+                <w:color w:val="15202B"/>
+                <w:sz w:val="18"/>
+                <w:szCs w:val="18"/>
+              </w:rPr>
+              <w:t xml:space="preserve">Daily sales report</w:t>
+            </w:r>
+          </w:p>
+        </w:tc>
+        <w:tc>
+          <w:tcPr>
+            <w:tcW w:type="dxa" w:w="2600"/>
+            <w:tcBorders>
+              <w:top w:val="single" w:color="B9D7F2" w:sz="4"/>
+              <w:left w:val="single" w:color="B9D7F2" w:sz="4"/>
+              <w:bottom w:val="single" w:color="B9D7F2" w:sz="4"/>
+              <w:right w:val="single" w:color="B9D7F2" w:sz="4"/>
+            </w:tcBorders>
+            <w:shd w:fill="EAF4FD" w:color="auto" w:val="clear"/>
+            <w:tcMar>
+              <w:top w:type="dxa" w:w="60"/>
+              <w:left w:type="dxa" w:w="90"/>
+              <w:bottom w:type="dxa" w:w="60"/>
+              <w:right w:type="dxa" w:w="90"/>
+            </w:tcMar>
+          </w:tcPr>
+          <w:p>
+            <w:pPr>
+              <w:spacing w:after="0" w:before="0"/>
+            </w:pPr>
+            <w:r>
+              <w:rPr>
+                <w:rFonts w:ascii="Arial" w:cs="Arial" w:eastAsia="Arial" w:hAnsi="Arial"/>
+                <w:color w:val="15202B"/>
+                <w:sz w:val="18"/>
+                <w:szCs w:val="18"/>
+              </w:rPr>
+              <w:t xml:space="preserve">Admin Sales 1</w:t>
+            </w:r>
+          </w:p>
+        </w:tc>
+        <w:tc>
+          <w:tcPr>
+            <w:tcW w:type="dxa" w:w="1300"/>
+            <w:tcBorders>
+              <w:top w:val="single" w:color="B9D7F2" w:sz="4"/>
+              <w:left w:val="single" w:color="B9D7F2" w:sz="4"/>
+              <w:bottom w:val="single" w:color="B9D7F2" w:sz="4"/>
+              <w:right w:val="single" w:color="B9D7F2" w:sz="4"/>
+            </w:tcBorders>
+            <w:shd w:fill="EAF4FD" w:color="auto" w:val="clear"/>
+            <w:tcMar>
+              <w:top w:type="dxa" w:w="60"/>
+              <w:left w:type="dxa" w:w="90"/>
+              <w:bottom w:type="dxa" w:w="60"/>
+              <w:right w:type="dxa" w:w="90"/>
+            </w:tcMar>
+          </w:tcPr>
+          <w:p>
+            <w:pPr>
+              <w:spacing w:after="0" w:before="0"/>
+            </w:pPr>
+            <w:r>
+              <w:rPr>
+                <w:rFonts w:ascii="Arial" w:cs="Arial" w:eastAsia="Arial" w:hAnsi="Arial"/>
+                <w:color w:val="15202B"/>
+                <w:sz w:val="18"/>
+                <w:szCs w:val="18"/>
+              </w:rPr>
+              <w:t xml:space="preserve">6</w:t>
+            </w:r>
+          </w:p>
+        </w:tc>
+        <w:tc>
+          <w:tcPr>
+            <w:tcW w:type="dxa" w:w="1266"/>
+            <w:tcBorders>
+              <w:top w:val="single" w:color="B9D7F2" w:sz="4"/>
+              <w:left w:val="single" w:color="B9D7F2" w:sz="4"/>
+              <w:bottom w:val="single" w:color="B9D7F2" w:sz="4"/>
+              <w:right w:val="single" w:color="B9D7F2" w:sz="4"/>
+            </w:tcBorders>
+            <w:shd w:fill="EAF4FD" w:color="auto" w:val="clear"/>
+            <w:tcMar>
+              <w:top w:type="dxa" w:w="60"/>
+              <w:left w:type="dxa" w:w="90"/>
+              <w:bottom w:type="dxa" w:w="60"/>
+              <w:right w:type="dxa" w:w="90"/>
+            </w:tcMar>
+          </w:tcPr>
+          <w:p>
+            <w:pPr>
+              <w:spacing w:after="0" w:before="0"/>
+            </w:pPr>
+            <w:r>
+              <w:rPr>
+                <w:rFonts w:ascii="Arial" w:cs="Arial" w:eastAsia="Arial" w:hAnsi="Arial"/>
+                <w:color w:val="15202B"/>
+                <w:sz w:val="18"/>
+                <w:szCs w:val="18"/>
+              </w:rPr>
+              <w:t xml:space="preserve">☐ Yes  ☐ No</w:t>
+            </w:r>
+          </w:p>
+        </w:tc>
+      </w:tr>
     </w:tbl>
     <w:p>
       <w:pPr>
@@ -32734,6 +33224,4487 @@
               <w:bottom w:val="single" w:color="B9D7F2" w:sz="4"/>
               <w:right w:val="single" w:color="B9D7F2" w:sz="4"/>
             </w:tcBorders>
+            <w:tcMar>
+              <w:top w:type="dxa" w:w="60"/>
+              <w:left w:type="dxa" w:w="90"/>
+              <w:bottom w:type="dxa" w:w="60"/>
+              <w:right w:type="dxa" w:w="90"/>
+            </w:tcMar>
+          </w:tcPr>
+          <w:p>
+            <w:pPr>
+              <w:spacing w:after="0" w:before="0"/>
+            </w:pPr>
+            <w:r>
+              <w:rPr>
+                <w:rFonts w:ascii="Arial" w:cs="Arial" w:eastAsia="Arial" w:hAnsi="Arial"/>
+                <w:color w:val="15202B"/>
+                <w:sz w:val="18"/>
+                <w:szCs w:val="18"/>
+              </w:rPr>
+              <w:t xml:space="preserve"/>
+            </w:r>
+          </w:p>
+        </w:tc>
+      </w:tr>
+    </w:tbl>
+    <w:p>
+      <w:pPr>
+        <w:pStyle w:val="Heading1"/>
+        <w:pageBreakBefore/>
+        <w:spacing w:after="60"/>
+      </w:pPr>
+      <w:r>
+        <w:rPr>
+          <w:rFonts w:ascii="Arial" w:cs="Arial" w:eastAsia="Arial" w:hAnsi="Arial"/>
+          <w:b/>
+          <w:bCs/>
+          <w:color w:val="0A84E0"/>
+          <w:sz w:val="28"/>
+          <w:szCs w:val="28"/>
+        </w:rPr>
+        <w:t xml:space="preserve">Step 27 · Owner Home: Today's Summary and Needs Your Action</w:t>
+      </w:r>
+    </w:p>
+    <w:p>
+      <w:pPr>
+        <w:spacing w:after="60" w:before="0"/>
+      </w:pPr>
+      <w:r>
+        <w:rPr>
+          <w:rFonts w:ascii="Arial" w:cs="Arial" w:eastAsia="Arial" w:hAnsi="Arial"/>
+          <w:b/>
+          <w:bCs/>
+          <w:color w:val="15202B"/>
+          <w:sz w:val="19"/>
+          <w:szCs w:val="19"/>
+        </w:rPr>
+        <w:t xml:space="preserve">Screens: </w:t>
+      </w:r>
+      <w:r>
+        <w:rPr>
+          <w:rFonts w:ascii="Arial" w:cs="Arial" w:eastAsia="Arial" w:hAnsi="Arial"/>
+          <w:color w:val="15202B"/>
+          <w:sz w:val="19"/>
+          <w:szCs w:val="19"/>
+        </w:rPr>
+        <w:t xml:space="preserve">Admin Home 1, 2, 3, 4, 7</w:t>
+      </w:r>
+      <w:r>
+        <w:rPr>
+          <w:rFonts w:ascii="Arial" w:cs="Arial" w:eastAsia="Arial" w:hAnsi="Arial"/>
+          <w:b/>
+          <w:bCs/>
+          <w:color w:val="15202B"/>
+          <w:sz w:val="19"/>
+          <w:szCs w:val="19"/>
+        </w:rPr>
+        <w:t xml:space="preserve">    Log in as: </w:t>
+      </w:r>
+      <w:r>
+        <w:rPr>
+          <w:rFonts w:ascii="Arial" w:cs="Arial" w:eastAsia="Arial" w:hAnsi="Arial"/>
+          <w:color w:val="15202B"/>
+          <w:sz w:val="19"/>
+          <w:szCs w:val="19"/>
+        </w:rPr>
+        <w:t xml:space="preserve">Owner</w:t>
+      </w:r>
+    </w:p>
+    <w:tbl>
+      <w:tblPr>
+        <w:tblW w:type="dxa" w:w="10466"/>
+        <w:tblBorders>
+          <w:top w:val="single" w:color="auto" w:sz="4"/>
+          <w:left w:val="single" w:color="auto" w:sz="4"/>
+          <w:bottom w:val="single" w:color="auto" w:sz="4"/>
+          <w:right w:val="single" w:color="auto" w:sz="4"/>
+          <w:insideH w:val="single" w:color="auto" w:sz="4"/>
+          <w:insideV w:val="single" w:color="auto" w:sz="4"/>
+        </w:tblBorders>
+        <w:tblLayout w:type="fixed"/>
+      </w:tblPr>
+      <w:tblGrid>
+        <w:gridCol w:w="640"/>
+        <w:gridCol w:w="3820"/>
+        <w:gridCol w:w="3900"/>
+        <w:gridCol w:w="900"/>
+        <w:gridCol w:w="1206"/>
+      </w:tblGrid>
+      <w:tr>
+        <w:trPr>
+          <w:tblHeader/>
+        </w:trPr>
+        <w:tc>
+          <w:tcPr>
+            <w:tcW w:type="dxa" w:w="640"/>
+            <w:tcBorders>
+              <w:top w:val="single" w:color="B9D7F2" w:sz="4"/>
+              <w:left w:val="single" w:color="B9D7F2" w:sz="4"/>
+              <w:bottom w:val="single" w:color="B9D7F2" w:sz="4"/>
+              <w:right w:val="single" w:color="B9D7F2" w:sz="4"/>
+            </w:tcBorders>
+            <w:shd w:fill="0A84E0" w:color="auto" w:val="clear"/>
+            <w:tcMar>
+              <w:top w:type="dxa" w:w="60"/>
+              <w:left w:type="dxa" w:w="90"/>
+              <w:bottom w:type="dxa" w:w="60"/>
+              <w:right w:type="dxa" w:w="90"/>
+            </w:tcMar>
+          </w:tcPr>
+          <w:p>
+            <w:pPr>
+              <w:spacing w:after="0" w:before="0"/>
+            </w:pPr>
+            <w:r>
+              <w:rPr>
+                <w:rFonts w:ascii="Arial" w:cs="Arial" w:eastAsia="Arial" w:hAnsi="Arial"/>
+                <w:b/>
+                <w:bCs/>
+                <w:color w:val="FFFFFF"/>
+                <w:sz w:val="18"/>
+                <w:szCs w:val="18"/>
+              </w:rPr>
+              <w:t xml:space="preserve">#</w:t>
+            </w:r>
+          </w:p>
+        </w:tc>
+        <w:tc>
+          <w:tcPr>
+            <w:tcW w:type="dxa" w:w="3820"/>
+            <w:tcBorders>
+              <w:top w:val="single" w:color="B9D7F2" w:sz="4"/>
+              <w:left w:val="single" w:color="B9D7F2" w:sz="4"/>
+              <w:bottom w:val="single" w:color="B9D7F2" w:sz="4"/>
+              <w:right w:val="single" w:color="B9D7F2" w:sz="4"/>
+            </w:tcBorders>
+            <w:shd w:fill="0A84E0" w:color="auto" w:val="clear"/>
+            <w:tcMar>
+              <w:top w:type="dxa" w:w="60"/>
+              <w:left w:type="dxa" w:w="90"/>
+              <w:bottom w:type="dxa" w:w="60"/>
+              <w:right w:type="dxa" w:w="90"/>
+            </w:tcMar>
+          </w:tcPr>
+          <w:p>
+            <w:pPr>
+              <w:spacing w:after="0" w:before="0"/>
+            </w:pPr>
+            <w:r>
+              <w:rPr>
+                <w:rFonts w:ascii="Arial" w:cs="Arial" w:eastAsia="Arial" w:hAnsi="Arial"/>
+                <w:b/>
+                <w:bCs/>
+                <w:color w:val="FFFFFF"/>
+                <w:sz w:val="18"/>
+                <w:szCs w:val="18"/>
+              </w:rPr>
+              <w:t xml:space="preserve">What to do</w:t>
+            </w:r>
+          </w:p>
+        </w:tc>
+        <w:tc>
+          <w:tcPr>
+            <w:tcW w:type="dxa" w:w="3900"/>
+            <w:tcBorders>
+              <w:top w:val="single" w:color="B9D7F2" w:sz="4"/>
+              <w:left w:val="single" w:color="B9D7F2" w:sz="4"/>
+              <w:bottom w:val="single" w:color="B9D7F2" w:sz="4"/>
+              <w:right w:val="single" w:color="B9D7F2" w:sz="4"/>
+            </w:tcBorders>
+            <w:shd w:fill="0A84E0" w:color="auto" w:val="clear"/>
+            <w:tcMar>
+              <w:top w:type="dxa" w:w="60"/>
+              <w:left w:type="dxa" w:w="90"/>
+              <w:bottom w:type="dxa" w:w="60"/>
+              <w:right w:type="dxa" w:w="90"/>
+            </w:tcMar>
+          </w:tcPr>
+          <w:p>
+            <w:pPr>
+              <w:spacing w:after="0" w:before="0"/>
+            </w:pPr>
+            <w:r>
+              <w:rPr>
+                <w:rFonts w:ascii="Arial" w:cs="Arial" w:eastAsia="Arial" w:hAnsi="Arial"/>
+                <w:b/>
+                <w:bCs/>
+                <w:color w:val="FFFFFF"/>
+                <w:sz w:val="18"/>
+                <w:szCs w:val="18"/>
+              </w:rPr>
+              <w:t xml:space="preserve">What you should see</w:t>
+            </w:r>
+          </w:p>
+        </w:tc>
+        <w:tc>
+          <w:tcPr>
+            <w:tcW w:type="dxa" w:w="900"/>
+            <w:tcBorders>
+              <w:top w:val="single" w:color="B9D7F2" w:sz="4"/>
+              <w:left w:val="single" w:color="B9D7F2" w:sz="4"/>
+              <w:bottom w:val="single" w:color="B9D7F2" w:sz="4"/>
+              <w:right w:val="single" w:color="B9D7F2" w:sz="4"/>
+            </w:tcBorders>
+            <w:shd w:fill="0A84E0" w:color="auto" w:val="clear"/>
+            <w:tcMar>
+              <w:top w:type="dxa" w:w="60"/>
+              <w:left w:type="dxa" w:w="90"/>
+              <w:bottom w:type="dxa" w:w="60"/>
+              <w:right w:type="dxa" w:w="90"/>
+            </w:tcMar>
+          </w:tcPr>
+          <w:p>
+            <w:pPr>
+              <w:spacing w:after="0" w:before="0"/>
+            </w:pPr>
+            <w:r>
+              <w:rPr>
+                <w:rFonts w:ascii="Arial" w:cs="Arial" w:eastAsia="Arial" w:hAnsi="Arial"/>
+                <w:b/>
+                <w:bCs/>
+                <w:color w:val="FFFFFF"/>
+                <w:sz w:val="18"/>
+                <w:szCs w:val="18"/>
+              </w:rPr>
+              <w:t xml:space="preserve">Result</w:t>
+            </w:r>
+          </w:p>
+        </w:tc>
+        <w:tc>
+          <w:tcPr>
+            <w:tcW w:type="dxa" w:w="1206"/>
+            <w:tcBorders>
+              <w:top w:val="single" w:color="B9D7F2" w:sz="4"/>
+              <w:left w:val="single" w:color="B9D7F2" w:sz="4"/>
+              <w:bottom w:val="single" w:color="B9D7F2" w:sz="4"/>
+              <w:right w:val="single" w:color="B9D7F2" w:sz="4"/>
+            </w:tcBorders>
+            <w:shd w:fill="0A84E0" w:color="auto" w:val="clear"/>
+            <w:tcMar>
+              <w:top w:type="dxa" w:w="60"/>
+              <w:left w:type="dxa" w:w="90"/>
+              <w:bottom w:type="dxa" w:w="60"/>
+              <w:right w:type="dxa" w:w="90"/>
+            </w:tcMar>
+          </w:tcPr>
+          <w:p>
+            <w:pPr>
+              <w:spacing w:after="0" w:before="0"/>
+            </w:pPr>
+            <w:r>
+              <w:rPr>
+                <w:rFonts w:ascii="Arial" w:cs="Arial" w:eastAsia="Arial" w:hAnsi="Arial"/>
+                <w:b/>
+                <w:bCs/>
+                <w:color w:val="FFFFFF"/>
+                <w:sz w:val="18"/>
+                <w:szCs w:val="18"/>
+              </w:rPr>
+              <w:t xml:space="preserve">Notes</w:t>
+            </w:r>
+          </w:p>
+        </w:tc>
+      </w:tr>
+      <w:tr>
+        <w:trPr>
+          <w:cantSplit/>
+        </w:trPr>
+        <w:tc>
+          <w:tcPr>
+            <w:tcW w:type="dxa" w:w="640"/>
+            <w:tcBorders>
+              <w:top w:val="single" w:color="B9D7F2" w:sz="4"/>
+              <w:left w:val="single" w:color="B9D7F2" w:sz="4"/>
+              <w:bottom w:val="single" w:color="B9D7F2" w:sz="4"/>
+              <w:right w:val="single" w:color="B9D7F2" w:sz="4"/>
+            </w:tcBorders>
+            <w:tcMar>
+              <w:top w:type="dxa" w:w="60"/>
+              <w:left w:type="dxa" w:w="90"/>
+              <w:bottom w:type="dxa" w:w="60"/>
+              <w:right w:type="dxa" w:w="90"/>
+            </w:tcMar>
+          </w:tcPr>
+          <w:p>
+            <w:pPr>
+              <w:spacing w:after="0" w:before="0"/>
+            </w:pPr>
+            <w:r>
+              <w:rPr>
+                <w:rFonts w:ascii="Arial" w:cs="Arial" w:eastAsia="Arial" w:hAnsi="Arial"/>
+                <w:color w:val="15202B"/>
+                <w:sz w:val="18"/>
+                <w:szCs w:val="18"/>
+              </w:rPr>
+              <w:t xml:space="preserve">27.1</w:t>
+            </w:r>
+          </w:p>
+        </w:tc>
+        <w:tc>
+          <w:tcPr>
+            <w:tcW w:type="dxa" w:w="3820"/>
+            <w:tcBorders>
+              <w:top w:val="single" w:color="B9D7F2" w:sz="4"/>
+              <w:left w:val="single" w:color="B9D7F2" w:sz="4"/>
+              <w:bottom w:val="single" w:color="B9D7F2" w:sz="4"/>
+              <w:right w:val="single" w:color="B9D7F2" w:sz="4"/>
+            </w:tcBorders>
+            <w:tcMar>
+              <w:top w:type="dxa" w:w="60"/>
+              <w:left w:type="dxa" w:w="90"/>
+              <w:bottom w:type="dxa" w:w="60"/>
+              <w:right w:type="dxa" w:w="90"/>
+            </w:tcMar>
+          </w:tcPr>
+          <w:p>
+            <w:pPr>
+              <w:spacing w:after="0" w:before="0"/>
+            </w:pPr>
+            <w:r>
+              <w:rPr>
+                <w:rFonts w:ascii="Arial" w:cs="Arial" w:eastAsia="Arial" w:hAnsi="Arial"/>
+                <w:color w:val="15202B"/>
+                <w:sz w:val="18"/>
+                <w:szCs w:val="18"/>
+              </w:rPr>
+              <w:t xml:space="preserve">Home tab.</w:t>
+            </w:r>
+          </w:p>
+        </w:tc>
+        <w:tc>
+          <w:tcPr>
+            <w:tcW w:type="dxa" w:w="3900"/>
+            <w:tcBorders>
+              <w:top w:val="single" w:color="B9D7F2" w:sz="4"/>
+              <w:left w:val="single" w:color="B9D7F2" w:sz="4"/>
+              <w:bottom w:val="single" w:color="B9D7F2" w:sz="4"/>
+              <w:right w:val="single" w:color="B9D7F2" w:sz="4"/>
+            </w:tcBorders>
+            <w:tcMar>
+              <w:top w:type="dxa" w:w="60"/>
+              <w:left w:type="dxa" w:w="90"/>
+              <w:bottom w:type="dxa" w:w="60"/>
+              <w:right w:type="dxa" w:w="90"/>
+            </w:tcMar>
+          </w:tcPr>
+          <w:p>
+            <w:pPr>
+              <w:spacing w:after="0" w:before="0"/>
+            </w:pPr>
+            <w:r>
+              <w:rPr>
+                <w:rFonts w:ascii="Arial" w:cs="Arial" w:eastAsia="Arial" w:hAnsi="Arial"/>
+                <w:color w:val="15202B"/>
+                <w:sz w:val="18"/>
+                <w:szCs w:val="18"/>
+              </w:rPr>
+              <w:t xml:space="preserve">Log Walk-in / Log Delivery, Switch View (Staff view "n orders processing", Delivery view "n orders out"), Tank Alert &amp; Counter, Needs Your Action, Today's Summary (9 tiles), Stock Alerts.</w:t>
+            </w:r>
+          </w:p>
+        </w:tc>
+        <w:tc>
+          <w:tcPr>
+            <w:tcW w:type="dxa" w:w="900"/>
+            <w:tcBorders>
+              <w:top w:val="single" w:color="B9D7F2" w:sz="4"/>
+              <w:left w:val="single" w:color="B9D7F2" w:sz="4"/>
+              <w:bottom w:val="single" w:color="B9D7F2" w:sz="4"/>
+              <w:right w:val="single" w:color="B9D7F2" w:sz="4"/>
+            </w:tcBorders>
+            <w:tcMar>
+              <w:top w:type="dxa" w:w="60"/>
+              <w:left w:type="dxa" w:w="90"/>
+              <w:bottom w:type="dxa" w:w="60"/>
+              <w:right w:type="dxa" w:w="90"/>
+            </w:tcMar>
+          </w:tcPr>
+          <w:p>
+            <w:pPr>
+              <w:spacing w:after="0" w:before="0"/>
+            </w:pPr>
+            <w:r>
+              <w:rPr>
+                <w:rFonts w:ascii="Arial" w:cs="Arial" w:eastAsia="Arial" w:hAnsi="Arial"/>
+                <w:color w:val="15202B"/>
+                <w:sz w:val="18"/>
+                <w:szCs w:val="18"/>
+              </w:rPr>
+              <w:t xml:space="preserve">☐ Pass</w:t>
+            </w:r>
+          </w:p>
+          <w:p>
+            <w:pPr>
+              <w:spacing w:after="0" w:before="0"/>
+            </w:pPr>
+            <w:r>
+              <w:rPr>
+                <w:rFonts w:ascii="Arial" w:cs="Arial" w:eastAsia="Arial" w:hAnsi="Arial"/>
+                <w:color w:val="15202B"/>
+                <w:sz w:val="18"/>
+                <w:szCs w:val="18"/>
+              </w:rPr>
+              <w:t xml:space="preserve">☐ Fail</w:t>
+            </w:r>
+          </w:p>
+        </w:tc>
+        <w:tc>
+          <w:tcPr>
+            <w:tcW w:type="dxa" w:w="1206"/>
+            <w:tcBorders>
+              <w:top w:val="single" w:color="B9D7F2" w:sz="4"/>
+              <w:left w:val="single" w:color="B9D7F2" w:sz="4"/>
+              <w:bottom w:val="single" w:color="B9D7F2" w:sz="4"/>
+              <w:right w:val="single" w:color="B9D7F2" w:sz="4"/>
+            </w:tcBorders>
+            <w:tcMar>
+              <w:top w:type="dxa" w:w="60"/>
+              <w:left w:type="dxa" w:w="90"/>
+              <w:bottom w:type="dxa" w:w="60"/>
+              <w:right w:type="dxa" w:w="90"/>
+            </w:tcMar>
+          </w:tcPr>
+          <w:p>
+            <w:pPr>
+              <w:spacing w:after="0" w:before="0"/>
+            </w:pPr>
+            <w:r>
+              <w:rPr>
+                <w:rFonts w:ascii="Arial" w:cs="Arial" w:eastAsia="Arial" w:hAnsi="Arial"/>
+                <w:color w:val="15202B"/>
+                <w:sz w:val="18"/>
+                <w:szCs w:val="18"/>
+              </w:rPr>
+              <w:t xml:space="preserve"/>
+            </w:r>
+          </w:p>
+        </w:tc>
+      </w:tr>
+      <w:tr>
+        <w:trPr>
+          <w:cantSplit/>
+        </w:trPr>
+        <w:tc>
+          <w:tcPr>
+            <w:tcW w:type="dxa" w:w="640"/>
+            <w:tcBorders>
+              <w:top w:val="single" w:color="B9D7F2" w:sz="4"/>
+              <w:left w:val="single" w:color="B9D7F2" w:sz="4"/>
+              <w:bottom w:val="single" w:color="B9D7F2" w:sz="4"/>
+              <w:right w:val="single" w:color="B9D7F2" w:sz="4"/>
+            </w:tcBorders>
+            <w:shd w:fill="EAF4FD" w:color="auto" w:val="clear"/>
+            <w:tcMar>
+              <w:top w:type="dxa" w:w="60"/>
+              <w:left w:type="dxa" w:w="90"/>
+              <w:bottom w:type="dxa" w:w="60"/>
+              <w:right w:type="dxa" w:w="90"/>
+            </w:tcMar>
+          </w:tcPr>
+          <w:p>
+            <w:pPr>
+              <w:spacing w:after="0" w:before="0"/>
+            </w:pPr>
+            <w:r>
+              <w:rPr>
+                <w:rFonts w:ascii="Arial" w:cs="Arial" w:eastAsia="Arial" w:hAnsi="Arial"/>
+                <w:color w:val="15202B"/>
+                <w:sz w:val="18"/>
+                <w:szCs w:val="18"/>
+              </w:rPr>
+              <w:t xml:space="preserve">27.2</w:t>
+            </w:r>
+          </w:p>
+        </w:tc>
+        <w:tc>
+          <w:tcPr>
+            <w:tcW w:type="dxa" w:w="3820"/>
+            <w:tcBorders>
+              <w:top w:val="single" w:color="B9D7F2" w:sz="4"/>
+              <w:left w:val="single" w:color="B9D7F2" w:sz="4"/>
+              <w:bottom w:val="single" w:color="B9D7F2" w:sz="4"/>
+              <w:right w:val="single" w:color="B9D7F2" w:sz="4"/>
+            </w:tcBorders>
+            <w:shd w:fill="EAF4FD" w:color="auto" w:val="clear"/>
+            <w:tcMar>
+              <w:top w:type="dxa" w:w="60"/>
+              <w:left w:type="dxa" w:w="90"/>
+              <w:bottom w:type="dxa" w:w="60"/>
+              <w:right w:type="dxa" w:w="90"/>
+            </w:tcMar>
+          </w:tcPr>
+          <w:p>
+            <w:pPr>
+              <w:spacing w:after="0" w:before="0"/>
+            </w:pPr>
+            <w:r>
+              <w:rPr>
+                <w:rFonts w:ascii="Arial" w:cs="Arial" w:eastAsia="Arial" w:hAnsi="Arial"/>
+                <w:color w:val="15202B"/>
+                <w:sz w:val="18"/>
+                <w:szCs w:val="18"/>
+              </w:rPr>
+              <w:t xml:space="preserve">Tap Staff view.</w:t>
+            </w:r>
+          </w:p>
+        </w:tc>
+        <w:tc>
+          <w:tcPr>
+            <w:tcW w:type="dxa" w:w="3900"/>
+            <w:tcBorders>
+              <w:top w:val="single" w:color="B9D7F2" w:sz="4"/>
+              <w:left w:val="single" w:color="B9D7F2" w:sz="4"/>
+              <w:bottom w:val="single" w:color="B9D7F2" w:sz="4"/>
+              <w:right w:val="single" w:color="B9D7F2" w:sz="4"/>
+            </w:tcBorders>
+            <w:shd w:fill="EAF4FD" w:color="auto" w:val="clear"/>
+            <w:tcMar>
+              <w:top w:type="dxa" w:w="60"/>
+              <w:left w:type="dxa" w:w="90"/>
+              <w:bottom w:type="dxa" w:w="60"/>
+              <w:right w:type="dxa" w:w="90"/>
+            </w:tcMar>
+          </w:tcPr>
+          <w:p>
+            <w:pPr>
+              <w:spacing w:after="0" w:before="0"/>
+            </w:pPr>
+            <w:r>
+              <w:rPr>
+                <w:rFonts w:ascii="Arial" w:cs="Arial" w:eastAsia="Arial" w:hAnsi="Arial"/>
+                <w:color w:val="15202B"/>
+                <w:sz w:val="18"/>
+                <w:szCs w:val="18"/>
+              </w:rPr>
+              <w:t xml:space="preserve">Opens the staff screens (To Do ...); the top button says Staff. Switch back to Admin from the top bar.</w:t>
+            </w:r>
+          </w:p>
+        </w:tc>
+        <w:tc>
+          <w:tcPr>
+            <w:tcW w:type="dxa" w:w="900"/>
+            <w:tcBorders>
+              <w:top w:val="single" w:color="B9D7F2" w:sz="4"/>
+              <w:left w:val="single" w:color="B9D7F2" w:sz="4"/>
+              <w:bottom w:val="single" w:color="B9D7F2" w:sz="4"/>
+              <w:right w:val="single" w:color="B9D7F2" w:sz="4"/>
+            </w:tcBorders>
+            <w:shd w:fill="EAF4FD" w:color="auto" w:val="clear"/>
+            <w:tcMar>
+              <w:top w:type="dxa" w:w="60"/>
+              <w:left w:type="dxa" w:w="90"/>
+              <w:bottom w:type="dxa" w:w="60"/>
+              <w:right w:type="dxa" w:w="90"/>
+            </w:tcMar>
+          </w:tcPr>
+          <w:p>
+            <w:pPr>
+              <w:spacing w:after="0" w:before="0"/>
+            </w:pPr>
+            <w:r>
+              <w:rPr>
+                <w:rFonts w:ascii="Arial" w:cs="Arial" w:eastAsia="Arial" w:hAnsi="Arial"/>
+                <w:color w:val="15202B"/>
+                <w:sz w:val="18"/>
+                <w:szCs w:val="18"/>
+              </w:rPr>
+              <w:t xml:space="preserve">☐ Pass</w:t>
+            </w:r>
+          </w:p>
+          <w:p>
+            <w:pPr>
+              <w:spacing w:after="0" w:before="0"/>
+            </w:pPr>
+            <w:r>
+              <w:rPr>
+                <w:rFonts w:ascii="Arial" w:cs="Arial" w:eastAsia="Arial" w:hAnsi="Arial"/>
+                <w:color w:val="15202B"/>
+                <w:sz w:val="18"/>
+                <w:szCs w:val="18"/>
+              </w:rPr>
+              <w:t xml:space="preserve">☐ Fail</w:t>
+            </w:r>
+          </w:p>
+        </w:tc>
+        <w:tc>
+          <w:tcPr>
+            <w:tcW w:type="dxa" w:w="1206"/>
+            <w:tcBorders>
+              <w:top w:val="single" w:color="B9D7F2" w:sz="4"/>
+              <w:left w:val="single" w:color="B9D7F2" w:sz="4"/>
+              <w:bottom w:val="single" w:color="B9D7F2" w:sz="4"/>
+              <w:right w:val="single" w:color="B9D7F2" w:sz="4"/>
+            </w:tcBorders>
+            <w:shd w:fill="EAF4FD" w:color="auto" w:val="clear"/>
+            <w:tcMar>
+              <w:top w:type="dxa" w:w="60"/>
+              <w:left w:type="dxa" w:w="90"/>
+              <w:bottom w:type="dxa" w:w="60"/>
+              <w:right w:type="dxa" w:w="90"/>
+            </w:tcMar>
+          </w:tcPr>
+          <w:p>
+            <w:pPr>
+              <w:spacing w:after="0" w:before="0"/>
+            </w:pPr>
+            <w:r>
+              <w:rPr>
+                <w:rFonts w:ascii="Arial" w:cs="Arial" w:eastAsia="Arial" w:hAnsi="Arial"/>
+                <w:color w:val="15202B"/>
+                <w:sz w:val="18"/>
+                <w:szCs w:val="18"/>
+              </w:rPr>
+              <w:t xml:space="preserve"/>
+            </w:r>
+          </w:p>
+        </w:tc>
+      </w:tr>
+      <w:tr>
+        <w:trPr>
+          <w:cantSplit/>
+        </w:trPr>
+        <w:tc>
+          <w:tcPr>
+            <w:tcW w:type="dxa" w:w="640"/>
+            <w:tcBorders>
+              <w:top w:val="single" w:color="B9D7F2" w:sz="4"/>
+              <w:left w:val="single" w:color="B9D7F2" w:sz="4"/>
+              <w:bottom w:val="single" w:color="B9D7F2" w:sz="4"/>
+              <w:right w:val="single" w:color="B9D7F2" w:sz="4"/>
+            </w:tcBorders>
+            <w:tcMar>
+              <w:top w:type="dxa" w:w="60"/>
+              <w:left w:type="dxa" w:w="90"/>
+              <w:bottom w:type="dxa" w:w="60"/>
+              <w:right w:type="dxa" w:w="90"/>
+            </w:tcMar>
+          </w:tcPr>
+          <w:p>
+            <w:pPr>
+              <w:spacing w:after="0" w:before="0"/>
+            </w:pPr>
+            <w:r>
+              <w:rPr>
+                <w:rFonts w:ascii="Arial" w:cs="Arial" w:eastAsia="Arial" w:hAnsi="Arial"/>
+                <w:color w:val="15202B"/>
+                <w:sz w:val="18"/>
+                <w:szCs w:val="18"/>
+              </w:rPr>
+              <w:t xml:space="preserve">27.3</w:t>
+            </w:r>
+          </w:p>
+        </w:tc>
+        <w:tc>
+          <w:tcPr>
+            <w:tcW w:type="dxa" w:w="3820"/>
+            <w:tcBorders>
+              <w:top w:val="single" w:color="B9D7F2" w:sz="4"/>
+              <w:left w:val="single" w:color="B9D7F2" w:sz="4"/>
+              <w:bottom w:val="single" w:color="B9D7F2" w:sz="4"/>
+              <w:right w:val="single" w:color="B9D7F2" w:sz="4"/>
+            </w:tcBorders>
+            <w:tcMar>
+              <w:top w:type="dxa" w:w="60"/>
+              <w:left w:type="dxa" w:w="90"/>
+              <w:bottom w:type="dxa" w:w="60"/>
+              <w:right w:type="dxa" w:w="90"/>
+            </w:tcMar>
+          </w:tcPr>
+          <w:p>
+            <w:pPr>
+              <w:spacing w:after="0" w:before="0"/>
+            </w:pPr>
+            <w:r>
+              <w:rPr>
+                <w:rFonts w:ascii="Arial" w:cs="Arial" w:eastAsia="Arial" w:hAnsi="Arial"/>
+                <w:color w:val="15202B"/>
+                <w:sz w:val="18"/>
+                <w:szCs w:val="18"/>
+              </w:rPr>
+              <w:t xml:space="preserve">Tap Delivery view.</w:t>
+            </w:r>
+          </w:p>
+        </w:tc>
+        <w:tc>
+          <w:tcPr>
+            <w:tcW w:type="dxa" w:w="3900"/>
+            <w:tcBorders>
+              <w:top w:val="single" w:color="B9D7F2" w:sz="4"/>
+              <w:left w:val="single" w:color="B9D7F2" w:sz="4"/>
+              <w:bottom w:val="single" w:color="B9D7F2" w:sz="4"/>
+              <w:right w:val="single" w:color="B9D7F2" w:sz="4"/>
+            </w:tcBorders>
+            <w:tcMar>
+              <w:top w:type="dxa" w:w="60"/>
+              <w:left w:type="dxa" w:w="90"/>
+              <w:bottom w:type="dxa" w:w="60"/>
+              <w:right w:type="dxa" w:w="90"/>
+            </w:tcMar>
+          </w:tcPr>
+          <w:p>
+            <w:pPr>
+              <w:spacing w:after="0" w:before="0"/>
+            </w:pPr>
+            <w:r>
+              <w:rPr>
+                <w:rFonts w:ascii="Arial" w:cs="Arial" w:eastAsia="Arial" w:hAnsi="Arial"/>
+                <w:color w:val="15202B"/>
+                <w:sz w:val="18"/>
+                <w:szCs w:val="18"/>
+              </w:rPr>
+              <w:t xml:space="preserve">Opens the rider screens (Deliveries ...). Switch back to Admin.</w:t>
+            </w:r>
+          </w:p>
+        </w:tc>
+        <w:tc>
+          <w:tcPr>
+            <w:tcW w:type="dxa" w:w="900"/>
+            <w:tcBorders>
+              <w:top w:val="single" w:color="B9D7F2" w:sz="4"/>
+              <w:left w:val="single" w:color="B9D7F2" w:sz="4"/>
+              <w:bottom w:val="single" w:color="B9D7F2" w:sz="4"/>
+              <w:right w:val="single" w:color="B9D7F2" w:sz="4"/>
+            </w:tcBorders>
+            <w:tcMar>
+              <w:top w:type="dxa" w:w="60"/>
+              <w:left w:type="dxa" w:w="90"/>
+              <w:bottom w:type="dxa" w:w="60"/>
+              <w:right w:type="dxa" w:w="90"/>
+            </w:tcMar>
+          </w:tcPr>
+          <w:p>
+            <w:pPr>
+              <w:spacing w:after="0" w:before="0"/>
+            </w:pPr>
+            <w:r>
+              <w:rPr>
+                <w:rFonts w:ascii="Arial" w:cs="Arial" w:eastAsia="Arial" w:hAnsi="Arial"/>
+                <w:color w:val="15202B"/>
+                <w:sz w:val="18"/>
+                <w:szCs w:val="18"/>
+              </w:rPr>
+              <w:t xml:space="preserve">☐ Pass</w:t>
+            </w:r>
+          </w:p>
+          <w:p>
+            <w:pPr>
+              <w:spacing w:after="0" w:before="0"/>
+            </w:pPr>
+            <w:r>
+              <w:rPr>
+                <w:rFonts w:ascii="Arial" w:cs="Arial" w:eastAsia="Arial" w:hAnsi="Arial"/>
+                <w:color w:val="15202B"/>
+                <w:sz w:val="18"/>
+                <w:szCs w:val="18"/>
+              </w:rPr>
+              <w:t xml:space="preserve">☐ Fail</w:t>
+            </w:r>
+          </w:p>
+        </w:tc>
+        <w:tc>
+          <w:tcPr>
+            <w:tcW w:type="dxa" w:w="1206"/>
+            <w:tcBorders>
+              <w:top w:val="single" w:color="B9D7F2" w:sz="4"/>
+              <w:left w:val="single" w:color="B9D7F2" w:sz="4"/>
+              <w:bottom w:val="single" w:color="B9D7F2" w:sz="4"/>
+              <w:right w:val="single" w:color="B9D7F2" w:sz="4"/>
+            </w:tcBorders>
+            <w:tcMar>
+              <w:top w:type="dxa" w:w="60"/>
+              <w:left w:type="dxa" w:w="90"/>
+              <w:bottom w:type="dxa" w:w="60"/>
+              <w:right w:type="dxa" w:w="90"/>
+            </w:tcMar>
+          </w:tcPr>
+          <w:p>
+            <w:pPr>
+              <w:spacing w:after="0" w:before="0"/>
+            </w:pPr>
+            <w:r>
+              <w:rPr>
+                <w:rFonts w:ascii="Arial" w:cs="Arial" w:eastAsia="Arial" w:hAnsi="Arial"/>
+                <w:color w:val="15202B"/>
+                <w:sz w:val="18"/>
+                <w:szCs w:val="18"/>
+              </w:rPr>
+              <w:t xml:space="preserve"/>
+            </w:r>
+          </w:p>
+        </w:tc>
+      </w:tr>
+      <w:tr>
+        <w:trPr>
+          <w:cantSplit/>
+        </w:trPr>
+        <w:tc>
+          <w:tcPr>
+            <w:tcW w:type="dxa" w:w="640"/>
+            <w:tcBorders>
+              <w:top w:val="single" w:color="B9D7F2" w:sz="4"/>
+              <w:left w:val="single" w:color="B9D7F2" w:sz="4"/>
+              <w:bottom w:val="single" w:color="B9D7F2" w:sz="4"/>
+              <w:right w:val="single" w:color="B9D7F2" w:sz="4"/>
+            </w:tcBorders>
+            <w:shd w:fill="EAF4FD" w:color="auto" w:val="clear"/>
+            <w:tcMar>
+              <w:top w:type="dxa" w:w="60"/>
+              <w:left w:type="dxa" w:w="90"/>
+              <w:bottom w:type="dxa" w:w="60"/>
+              <w:right w:type="dxa" w:w="90"/>
+            </w:tcMar>
+          </w:tcPr>
+          <w:p>
+            <w:pPr>
+              <w:spacing w:after="0" w:before="0"/>
+            </w:pPr>
+            <w:r>
+              <w:rPr>
+                <w:rFonts w:ascii="Arial" w:cs="Arial" w:eastAsia="Arial" w:hAnsi="Arial"/>
+                <w:color w:val="15202B"/>
+                <w:sz w:val="18"/>
+                <w:szCs w:val="18"/>
+              </w:rPr>
+              <w:t xml:space="preserve">27.4</w:t>
+            </w:r>
+          </w:p>
+        </w:tc>
+        <w:tc>
+          <w:tcPr>
+            <w:tcW w:type="dxa" w:w="3820"/>
+            <w:tcBorders>
+              <w:top w:val="single" w:color="B9D7F2" w:sz="4"/>
+              <w:left w:val="single" w:color="B9D7F2" w:sz="4"/>
+              <w:bottom w:val="single" w:color="B9D7F2" w:sz="4"/>
+              <w:right w:val="single" w:color="B9D7F2" w:sz="4"/>
+            </w:tcBorders>
+            <w:shd w:fill="EAF4FD" w:color="auto" w:val="clear"/>
+            <w:tcMar>
+              <w:top w:type="dxa" w:w="60"/>
+              <w:left w:type="dxa" w:w="90"/>
+              <w:bottom w:type="dxa" w:w="60"/>
+              <w:right w:type="dxa" w:w="90"/>
+            </w:tcMar>
+          </w:tcPr>
+          <w:p>
+            <w:pPr>
+              <w:spacing w:after="0" w:before="0"/>
+            </w:pPr>
+            <w:r>
+              <w:rPr>
+                <w:rFonts w:ascii="Arial" w:cs="Arial" w:eastAsia="Arial" w:hAnsi="Arial"/>
+                <w:color w:val="15202B"/>
+                <w:sz w:val="18"/>
+                <w:szCs w:val="18"/>
+              </w:rPr>
+              <w:t xml:space="preserve">Needs Your Action &gt; New orders (badge = number of new orders).</w:t>
+            </w:r>
+          </w:p>
+        </w:tc>
+        <w:tc>
+          <w:tcPr>
+            <w:tcW w:type="dxa" w:w="3900"/>
+            <w:tcBorders>
+              <w:top w:val="single" w:color="B9D7F2" w:sz="4"/>
+              <w:left w:val="single" w:color="B9D7F2" w:sz="4"/>
+              <w:bottom w:val="single" w:color="B9D7F2" w:sz="4"/>
+              <w:right w:val="single" w:color="B9D7F2" w:sz="4"/>
+            </w:tcBorders>
+            <w:shd w:fill="EAF4FD" w:color="auto" w:val="clear"/>
+            <w:tcMar>
+              <w:top w:type="dxa" w:w="60"/>
+              <w:left w:type="dxa" w:w="90"/>
+              <w:bottom w:type="dxa" w:w="60"/>
+              <w:right w:type="dxa" w:w="90"/>
+            </w:tcMar>
+          </w:tcPr>
+          <w:p>
+            <w:pPr>
+              <w:spacing w:after="0" w:before="0"/>
+            </w:pPr>
+            <w:r>
+              <w:rPr>
+                <w:rFonts w:ascii="Arial" w:cs="Arial" w:eastAsia="Arial" w:hAnsi="Arial"/>
+                <w:color w:val="15202B"/>
+                <w:sz w:val="18"/>
+                <w:szCs w:val="18"/>
+              </w:rPr>
+              <w:t xml:space="preserve">Orders tab opens on the New tab.</w:t>
+            </w:r>
+          </w:p>
+        </w:tc>
+        <w:tc>
+          <w:tcPr>
+            <w:tcW w:type="dxa" w:w="900"/>
+            <w:tcBorders>
+              <w:top w:val="single" w:color="B9D7F2" w:sz="4"/>
+              <w:left w:val="single" w:color="B9D7F2" w:sz="4"/>
+              <w:bottom w:val="single" w:color="B9D7F2" w:sz="4"/>
+              <w:right w:val="single" w:color="B9D7F2" w:sz="4"/>
+            </w:tcBorders>
+            <w:shd w:fill="EAF4FD" w:color="auto" w:val="clear"/>
+            <w:tcMar>
+              <w:top w:type="dxa" w:w="60"/>
+              <w:left w:type="dxa" w:w="90"/>
+              <w:bottom w:type="dxa" w:w="60"/>
+              <w:right w:type="dxa" w:w="90"/>
+            </w:tcMar>
+          </w:tcPr>
+          <w:p>
+            <w:pPr>
+              <w:spacing w:after="0" w:before="0"/>
+            </w:pPr>
+            <w:r>
+              <w:rPr>
+                <w:rFonts w:ascii="Arial" w:cs="Arial" w:eastAsia="Arial" w:hAnsi="Arial"/>
+                <w:color w:val="15202B"/>
+                <w:sz w:val="18"/>
+                <w:szCs w:val="18"/>
+              </w:rPr>
+              <w:t xml:space="preserve">☐ Pass</w:t>
+            </w:r>
+          </w:p>
+          <w:p>
+            <w:pPr>
+              <w:spacing w:after="0" w:before="0"/>
+            </w:pPr>
+            <w:r>
+              <w:rPr>
+                <w:rFonts w:ascii="Arial" w:cs="Arial" w:eastAsia="Arial" w:hAnsi="Arial"/>
+                <w:color w:val="15202B"/>
+                <w:sz w:val="18"/>
+                <w:szCs w:val="18"/>
+              </w:rPr>
+              <w:t xml:space="preserve">☐ Fail</w:t>
+            </w:r>
+          </w:p>
+        </w:tc>
+        <w:tc>
+          <w:tcPr>
+            <w:tcW w:type="dxa" w:w="1206"/>
+            <w:tcBorders>
+              <w:top w:val="single" w:color="B9D7F2" w:sz="4"/>
+              <w:left w:val="single" w:color="B9D7F2" w:sz="4"/>
+              <w:bottom w:val="single" w:color="B9D7F2" w:sz="4"/>
+              <w:right w:val="single" w:color="B9D7F2" w:sz="4"/>
+            </w:tcBorders>
+            <w:shd w:fill="EAF4FD" w:color="auto" w:val="clear"/>
+            <w:tcMar>
+              <w:top w:type="dxa" w:w="60"/>
+              <w:left w:type="dxa" w:w="90"/>
+              <w:bottom w:type="dxa" w:w="60"/>
+              <w:right w:type="dxa" w:w="90"/>
+            </w:tcMar>
+          </w:tcPr>
+          <w:p>
+            <w:pPr>
+              <w:spacing w:after="0" w:before="0"/>
+            </w:pPr>
+            <w:r>
+              <w:rPr>
+                <w:rFonts w:ascii="Arial" w:cs="Arial" w:eastAsia="Arial" w:hAnsi="Arial"/>
+                <w:color w:val="15202B"/>
+                <w:sz w:val="18"/>
+                <w:szCs w:val="18"/>
+              </w:rPr>
+              <w:t xml:space="preserve"/>
+            </w:r>
+          </w:p>
+        </w:tc>
+      </w:tr>
+      <w:tr>
+        <w:trPr>
+          <w:cantSplit/>
+        </w:trPr>
+        <w:tc>
+          <w:tcPr>
+            <w:tcW w:type="dxa" w:w="640"/>
+            <w:tcBorders>
+              <w:top w:val="single" w:color="B9D7F2" w:sz="4"/>
+              <w:left w:val="single" w:color="B9D7F2" w:sz="4"/>
+              <w:bottom w:val="single" w:color="B9D7F2" w:sz="4"/>
+              <w:right w:val="single" w:color="B9D7F2" w:sz="4"/>
+            </w:tcBorders>
+            <w:tcMar>
+              <w:top w:type="dxa" w:w="60"/>
+              <w:left w:type="dxa" w:w="90"/>
+              <w:bottom w:type="dxa" w:w="60"/>
+              <w:right w:type="dxa" w:w="90"/>
+            </w:tcMar>
+          </w:tcPr>
+          <w:p>
+            <w:pPr>
+              <w:spacing w:after="0" w:before="0"/>
+            </w:pPr>
+            <w:r>
+              <w:rPr>
+                <w:rFonts w:ascii="Arial" w:cs="Arial" w:eastAsia="Arial" w:hAnsi="Arial"/>
+                <w:color w:val="15202B"/>
+                <w:sz w:val="18"/>
+                <w:szCs w:val="18"/>
+              </w:rPr>
+              <w:t xml:space="preserve">27.5</w:t>
+            </w:r>
+          </w:p>
+        </w:tc>
+        <w:tc>
+          <w:tcPr>
+            <w:tcW w:type="dxa" w:w="3820"/>
+            <w:tcBorders>
+              <w:top w:val="single" w:color="B9D7F2" w:sz="4"/>
+              <w:left w:val="single" w:color="B9D7F2" w:sz="4"/>
+              <w:bottom w:val="single" w:color="B9D7F2" w:sz="4"/>
+              <w:right w:val="single" w:color="B9D7F2" w:sz="4"/>
+            </w:tcBorders>
+            <w:tcMar>
+              <w:top w:type="dxa" w:w="60"/>
+              <w:left w:type="dxa" w:w="90"/>
+              <w:bottom w:type="dxa" w:w="60"/>
+              <w:right w:type="dxa" w:w="90"/>
+            </w:tcMar>
+          </w:tcPr>
+          <w:p>
+            <w:pPr>
+              <w:spacing w:after="0" w:before="0"/>
+            </w:pPr>
+            <w:r>
+              <w:rPr>
+                <w:rFonts w:ascii="Arial" w:cs="Arial" w:eastAsia="Arial" w:hAnsi="Arial"/>
+                <w:color w:val="15202B"/>
+                <w:sz w:val="18"/>
+                <w:szCs w:val="18"/>
+              </w:rPr>
+              <w:t xml:space="preserve">Needs Your Action &gt; Ready to send out.</w:t>
+            </w:r>
+          </w:p>
+        </w:tc>
+        <w:tc>
+          <w:tcPr>
+            <w:tcW w:type="dxa" w:w="3900"/>
+            <w:tcBorders>
+              <w:top w:val="single" w:color="B9D7F2" w:sz="4"/>
+              <w:left w:val="single" w:color="B9D7F2" w:sz="4"/>
+              <w:bottom w:val="single" w:color="B9D7F2" w:sz="4"/>
+              <w:right w:val="single" w:color="B9D7F2" w:sz="4"/>
+            </w:tcBorders>
+            <w:tcMar>
+              <w:top w:type="dxa" w:w="60"/>
+              <w:left w:type="dxa" w:w="90"/>
+              <w:bottom w:type="dxa" w:w="60"/>
+              <w:right w:type="dxa" w:w="90"/>
+            </w:tcMar>
+          </w:tcPr>
+          <w:p>
+            <w:pPr>
+              <w:spacing w:after="0" w:before="0"/>
+            </w:pPr>
+            <w:r>
+              <w:rPr>
+                <w:rFonts w:ascii="Arial" w:cs="Arial" w:eastAsia="Arial" w:hAnsi="Arial"/>
+                <w:color w:val="15202B"/>
+                <w:sz w:val="18"/>
+                <w:szCs w:val="18"/>
+              </w:rPr>
+              <w:t xml:space="preserve">Orders tab opens on the Processing tab.</w:t>
+            </w:r>
+          </w:p>
+        </w:tc>
+        <w:tc>
+          <w:tcPr>
+            <w:tcW w:type="dxa" w:w="900"/>
+            <w:tcBorders>
+              <w:top w:val="single" w:color="B9D7F2" w:sz="4"/>
+              <w:left w:val="single" w:color="B9D7F2" w:sz="4"/>
+              <w:bottom w:val="single" w:color="B9D7F2" w:sz="4"/>
+              <w:right w:val="single" w:color="B9D7F2" w:sz="4"/>
+            </w:tcBorders>
+            <w:tcMar>
+              <w:top w:type="dxa" w:w="60"/>
+              <w:left w:type="dxa" w:w="90"/>
+              <w:bottom w:type="dxa" w:w="60"/>
+              <w:right w:type="dxa" w:w="90"/>
+            </w:tcMar>
+          </w:tcPr>
+          <w:p>
+            <w:pPr>
+              <w:spacing w:after="0" w:before="0"/>
+            </w:pPr>
+            <w:r>
+              <w:rPr>
+                <w:rFonts w:ascii="Arial" w:cs="Arial" w:eastAsia="Arial" w:hAnsi="Arial"/>
+                <w:color w:val="15202B"/>
+                <w:sz w:val="18"/>
+                <w:szCs w:val="18"/>
+              </w:rPr>
+              <w:t xml:space="preserve">☐ Pass</w:t>
+            </w:r>
+          </w:p>
+          <w:p>
+            <w:pPr>
+              <w:spacing w:after="0" w:before="0"/>
+            </w:pPr>
+            <w:r>
+              <w:rPr>
+                <w:rFonts w:ascii="Arial" w:cs="Arial" w:eastAsia="Arial" w:hAnsi="Arial"/>
+                <w:color w:val="15202B"/>
+                <w:sz w:val="18"/>
+                <w:szCs w:val="18"/>
+              </w:rPr>
+              <w:t xml:space="preserve">☐ Fail</w:t>
+            </w:r>
+          </w:p>
+        </w:tc>
+        <w:tc>
+          <w:tcPr>
+            <w:tcW w:type="dxa" w:w="1206"/>
+            <w:tcBorders>
+              <w:top w:val="single" w:color="B9D7F2" w:sz="4"/>
+              <w:left w:val="single" w:color="B9D7F2" w:sz="4"/>
+              <w:bottom w:val="single" w:color="B9D7F2" w:sz="4"/>
+              <w:right w:val="single" w:color="B9D7F2" w:sz="4"/>
+            </w:tcBorders>
+            <w:tcMar>
+              <w:top w:type="dxa" w:w="60"/>
+              <w:left w:type="dxa" w:w="90"/>
+              <w:bottom w:type="dxa" w:w="60"/>
+              <w:right w:type="dxa" w:w="90"/>
+            </w:tcMar>
+          </w:tcPr>
+          <w:p>
+            <w:pPr>
+              <w:spacing w:after="0" w:before="0"/>
+            </w:pPr>
+            <w:r>
+              <w:rPr>
+                <w:rFonts w:ascii="Arial" w:cs="Arial" w:eastAsia="Arial" w:hAnsi="Arial"/>
+                <w:color w:val="15202B"/>
+                <w:sz w:val="18"/>
+                <w:szCs w:val="18"/>
+              </w:rPr>
+              <w:t xml:space="preserve"/>
+            </w:r>
+          </w:p>
+        </w:tc>
+      </w:tr>
+      <w:tr>
+        <w:trPr>
+          <w:cantSplit/>
+        </w:trPr>
+        <w:tc>
+          <w:tcPr>
+            <w:tcW w:type="dxa" w:w="640"/>
+            <w:tcBorders>
+              <w:top w:val="single" w:color="B9D7F2" w:sz="4"/>
+              <w:left w:val="single" w:color="B9D7F2" w:sz="4"/>
+              <w:bottom w:val="single" w:color="B9D7F2" w:sz="4"/>
+              <w:right w:val="single" w:color="B9D7F2" w:sz="4"/>
+            </w:tcBorders>
+            <w:shd w:fill="EAF4FD" w:color="auto" w:val="clear"/>
+            <w:tcMar>
+              <w:top w:type="dxa" w:w="60"/>
+              <w:left w:type="dxa" w:w="90"/>
+              <w:bottom w:type="dxa" w:w="60"/>
+              <w:right w:type="dxa" w:w="90"/>
+            </w:tcMar>
+          </w:tcPr>
+          <w:p>
+            <w:pPr>
+              <w:spacing w:after="0" w:before="0"/>
+            </w:pPr>
+            <w:r>
+              <w:rPr>
+                <w:rFonts w:ascii="Arial" w:cs="Arial" w:eastAsia="Arial" w:hAnsi="Arial"/>
+                <w:color w:val="15202B"/>
+                <w:sz w:val="18"/>
+                <w:szCs w:val="18"/>
+              </w:rPr>
+              <w:t xml:space="preserve">27.6</w:t>
+            </w:r>
+          </w:p>
+        </w:tc>
+        <w:tc>
+          <w:tcPr>
+            <w:tcW w:type="dxa" w:w="3820"/>
+            <w:tcBorders>
+              <w:top w:val="single" w:color="B9D7F2" w:sz="4"/>
+              <w:left w:val="single" w:color="B9D7F2" w:sz="4"/>
+              <w:bottom w:val="single" w:color="B9D7F2" w:sz="4"/>
+              <w:right w:val="single" w:color="B9D7F2" w:sz="4"/>
+            </w:tcBorders>
+            <w:shd w:fill="EAF4FD" w:color="auto" w:val="clear"/>
+            <w:tcMar>
+              <w:top w:type="dxa" w:w="60"/>
+              <w:left w:type="dxa" w:w="90"/>
+              <w:bottom w:type="dxa" w:w="60"/>
+              <w:right w:type="dxa" w:w="90"/>
+            </w:tcMar>
+          </w:tcPr>
+          <w:p>
+            <w:pPr>
+              <w:spacing w:after="0" w:before="0"/>
+            </w:pPr>
+            <w:r>
+              <w:rPr>
+                <w:rFonts w:ascii="Arial" w:cs="Arial" w:eastAsia="Arial" w:hAnsi="Arial"/>
+                <w:color w:val="15202B"/>
+                <w:sz w:val="18"/>
+                <w:szCs w:val="18"/>
+              </w:rPr>
+              <w:t xml:space="preserve">Today's Summary: tap New, Processing, Out for Delivery, Delivered, Not delivered.</w:t>
+            </w:r>
+          </w:p>
+        </w:tc>
+        <w:tc>
+          <w:tcPr>
+            <w:tcW w:type="dxa" w:w="3900"/>
+            <w:tcBorders>
+              <w:top w:val="single" w:color="B9D7F2" w:sz="4"/>
+              <w:left w:val="single" w:color="B9D7F2" w:sz="4"/>
+              <w:bottom w:val="single" w:color="B9D7F2" w:sz="4"/>
+              <w:right w:val="single" w:color="B9D7F2" w:sz="4"/>
+            </w:tcBorders>
+            <w:shd w:fill="EAF4FD" w:color="auto" w:val="clear"/>
+            <w:tcMar>
+              <w:top w:type="dxa" w:w="60"/>
+              <w:left w:type="dxa" w:w="90"/>
+              <w:bottom w:type="dxa" w:w="60"/>
+              <w:right w:type="dxa" w:w="90"/>
+            </w:tcMar>
+          </w:tcPr>
+          <w:p>
+            <w:pPr>
+              <w:spacing w:after="0" w:before="0"/>
+            </w:pPr>
+            <w:r>
+              <w:rPr>
+                <w:rFonts w:ascii="Arial" w:cs="Arial" w:eastAsia="Arial" w:hAnsi="Arial"/>
+                <w:color w:val="15202B"/>
+                <w:sz w:val="18"/>
+                <w:szCs w:val="18"/>
+              </w:rPr>
+              <w:t xml:space="preserve">Each opens the Order Board on that tab or filter.</w:t>
+            </w:r>
+          </w:p>
+        </w:tc>
+        <w:tc>
+          <w:tcPr>
+            <w:tcW w:type="dxa" w:w="900"/>
+            <w:tcBorders>
+              <w:top w:val="single" w:color="B9D7F2" w:sz="4"/>
+              <w:left w:val="single" w:color="B9D7F2" w:sz="4"/>
+              <w:bottom w:val="single" w:color="B9D7F2" w:sz="4"/>
+              <w:right w:val="single" w:color="B9D7F2" w:sz="4"/>
+            </w:tcBorders>
+            <w:shd w:fill="EAF4FD" w:color="auto" w:val="clear"/>
+            <w:tcMar>
+              <w:top w:type="dxa" w:w="60"/>
+              <w:left w:type="dxa" w:w="90"/>
+              <w:bottom w:type="dxa" w:w="60"/>
+              <w:right w:type="dxa" w:w="90"/>
+            </w:tcMar>
+          </w:tcPr>
+          <w:p>
+            <w:pPr>
+              <w:spacing w:after="0" w:before="0"/>
+            </w:pPr>
+            <w:r>
+              <w:rPr>
+                <w:rFonts w:ascii="Arial" w:cs="Arial" w:eastAsia="Arial" w:hAnsi="Arial"/>
+                <w:color w:val="15202B"/>
+                <w:sz w:val="18"/>
+                <w:szCs w:val="18"/>
+              </w:rPr>
+              <w:t xml:space="preserve">☐ Pass</w:t>
+            </w:r>
+          </w:p>
+          <w:p>
+            <w:pPr>
+              <w:spacing w:after="0" w:before="0"/>
+            </w:pPr>
+            <w:r>
+              <w:rPr>
+                <w:rFonts w:ascii="Arial" w:cs="Arial" w:eastAsia="Arial" w:hAnsi="Arial"/>
+                <w:color w:val="15202B"/>
+                <w:sz w:val="18"/>
+                <w:szCs w:val="18"/>
+              </w:rPr>
+              <w:t xml:space="preserve">☐ Fail</w:t>
+            </w:r>
+          </w:p>
+        </w:tc>
+        <w:tc>
+          <w:tcPr>
+            <w:tcW w:type="dxa" w:w="1206"/>
+            <w:tcBorders>
+              <w:top w:val="single" w:color="B9D7F2" w:sz="4"/>
+              <w:left w:val="single" w:color="B9D7F2" w:sz="4"/>
+              <w:bottom w:val="single" w:color="B9D7F2" w:sz="4"/>
+              <w:right w:val="single" w:color="B9D7F2" w:sz="4"/>
+            </w:tcBorders>
+            <w:shd w:fill="EAF4FD" w:color="auto" w:val="clear"/>
+            <w:tcMar>
+              <w:top w:type="dxa" w:w="60"/>
+              <w:left w:type="dxa" w:w="90"/>
+              <w:bottom w:type="dxa" w:w="60"/>
+              <w:right w:type="dxa" w:w="90"/>
+            </w:tcMar>
+          </w:tcPr>
+          <w:p>
+            <w:pPr>
+              <w:spacing w:after="0" w:before="0"/>
+            </w:pPr>
+            <w:r>
+              <w:rPr>
+                <w:rFonts w:ascii="Arial" w:cs="Arial" w:eastAsia="Arial" w:hAnsi="Arial"/>
+                <w:color w:val="15202B"/>
+                <w:sz w:val="18"/>
+                <w:szCs w:val="18"/>
+              </w:rPr>
+              <w:t xml:space="preserve"/>
+            </w:r>
+          </w:p>
+        </w:tc>
+      </w:tr>
+      <w:tr>
+        <w:trPr>
+          <w:cantSplit/>
+        </w:trPr>
+        <w:tc>
+          <w:tcPr>
+            <w:tcW w:type="dxa" w:w="640"/>
+            <w:tcBorders>
+              <w:top w:val="single" w:color="B9D7F2" w:sz="4"/>
+              <w:left w:val="single" w:color="B9D7F2" w:sz="4"/>
+              <w:bottom w:val="single" w:color="B9D7F2" w:sz="4"/>
+              <w:right w:val="single" w:color="B9D7F2" w:sz="4"/>
+            </w:tcBorders>
+            <w:tcMar>
+              <w:top w:type="dxa" w:w="60"/>
+              <w:left w:type="dxa" w:w="90"/>
+              <w:bottom w:type="dxa" w:w="60"/>
+              <w:right w:type="dxa" w:w="90"/>
+            </w:tcMar>
+          </w:tcPr>
+          <w:p>
+            <w:pPr>
+              <w:spacing w:after="0" w:before="0"/>
+            </w:pPr>
+            <w:r>
+              <w:rPr>
+                <w:rFonts w:ascii="Arial" w:cs="Arial" w:eastAsia="Arial" w:hAnsi="Arial"/>
+                <w:color w:val="15202B"/>
+                <w:sz w:val="18"/>
+                <w:szCs w:val="18"/>
+              </w:rPr>
+              <w:t xml:space="preserve">27.7</w:t>
+            </w:r>
+          </w:p>
+        </w:tc>
+        <w:tc>
+          <w:tcPr>
+            <w:tcW w:type="dxa" w:w="3820"/>
+            <w:tcBorders>
+              <w:top w:val="single" w:color="B9D7F2" w:sz="4"/>
+              <w:left w:val="single" w:color="B9D7F2" w:sz="4"/>
+              <w:bottom w:val="single" w:color="B9D7F2" w:sz="4"/>
+              <w:right w:val="single" w:color="B9D7F2" w:sz="4"/>
+            </w:tcBorders>
+            <w:tcMar>
+              <w:top w:type="dxa" w:w="60"/>
+              <w:left w:type="dxa" w:w="90"/>
+              <w:bottom w:type="dxa" w:w="60"/>
+              <w:right w:type="dxa" w:w="90"/>
+            </w:tcMar>
+          </w:tcPr>
+          <w:p>
+            <w:pPr>
+              <w:spacing w:after="0" w:before="0"/>
+            </w:pPr>
+            <w:r>
+              <w:rPr>
+                <w:rFonts w:ascii="Arial" w:cs="Arial" w:eastAsia="Arial" w:hAnsi="Arial"/>
+                <w:color w:val="15202B"/>
+                <w:sz w:val="18"/>
+                <w:szCs w:val="18"/>
+              </w:rPr>
+              <w:t xml:space="preserve">Tap Walk-in, Gallons processed, Sales or Unpaid.</w:t>
+            </w:r>
+          </w:p>
+        </w:tc>
+        <w:tc>
+          <w:tcPr>
+            <w:tcW w:type="dxa" w:w="3900"/>
+            <w:tcBorders>
+              <w:top w:val="single" w:color="B9D7F2" w:sz="4"/>
+              <w:left w:val="single" w:color="B9D7F2" w:sz="4"/>
+              <w:bottom w:val="single" w:color="B9D7F2" w:sz="4"/>
+              <w:right w:val="single" w:color="B9D7F2" w:sz="4"/>
+            </w:tcBorders>
+            <w:tcMar>
+              <w:top w:type="dxa" w:w="60"/>
+              <w:left w:type="dxa" w:w="90"/>
+              <w:bottom w:type="dxa" w:w="60"/>
+              <w:right w:type="dxa" w:w="90"/>
+            </w:tcMar>
+          </w:tcPr>
+          <w:p>
+            <w:pPr>
+              <w:spacing w:after="0" w:before="0"/>
+            </w:pPr>
+            <w:r>
+              <w:rPr>
+                <w:rFonts w:ascii="Arial" w:cs="Arial" w:eastAsia="Arial" w:hAnsi="Arial"/>
+                <w:color w:val="15202B"/>
+                <w:sz w:val="18"/>
+                <w:szCs w:val="18"/>
+              </w:rPr>
+              <w:t xml:space="preserve">Opens the Sales tab (Daily Sales Report).</w:t>
+            </w:r>
+          </w:p>
+        </w:tc>
+        <w:tc>
+          <w:tcPr>
+            <w:tcW w:type="dxa" w:w="900"/>
+            <w:tcBorders>
+              <w:top w:val="single" w:color="B9D7F2" w:sz="4"/>
+              <w:left w:val="single" w:color="B9D7F2" w:sz="4"/>
+              <w:bottom w:val="single" w:color="B9D7F2" w:sz="4"/>
+              <w:right w:val="single" w:color="B9D7F2" w:sz="4"/>
+            </w:tcBorders>
+            <w:tcMar>
+              <w:top w:type="dxa" w:w="60"/>
+              <w:left w:type="dxa" w:w="90"/>
+              <w:bottom w:type="dxa" w:w="60"/>
+              <w:right w:type="dxa" w:w="90"/>
+            </w:tcMar>
+          </w:tcPr>
+          <w:p>
+            <w:pPr>
+              <w:spacing w:after="0" w:before="0"/>
+            </w:pPr>
+            <w:r>
+              <w:rPr>
+                <w:rFonts w:ascii="Arial" w:cs="Arial" w:eastAsia="Arial" w:hAnsi="Arial"/>
+                <w:color w:val="15202B"/>
+                <w:sz w:val="18"/>
+                <w:szCs w:val="18"/>
+              </w:rPr>
+              <w:t xml:space="preserve">☐ Pass</w:t>
+            </w:r>
+          </w:p>
+          <w:p>
+            <w:pPr>
+              <w:spacing w:after="0" w:before="0"/>
+            </w:pPr>
+            <w:r>
+              <w:rPr>
+                <w:rFonts w:ascii="Arial" w:cs="Arial" w:eastAsia="Arial" w:hAnsi="Arial"/>
+                <w:color w:val="15202B"/>
+                <w:sz w:val="18"/>
+                <w:szCs w:val="18"/>
+              </w:rPr>
+              <w:t xml:space="preserve">☐ Fail</w:t>
+            </w:r>
+          </w:p>
+        </w:tc>
+        <w:tc>
+          <w:tcPr>
+            <w:tcW w:type="dxa" w:w="1206"/>
+            <w:tcBorders>
+              <w:top w:val="single" w:color="B9D7F2" w:sz="4"/>
+              <w:left w:val="single" w:color="B9D7F2" w:sz="4"/>
+              <w:bottom w:val="single" w:color="B9D7F2" w:sz="4"/>
+              <w:right w:val="single" w:color="B9D7F2" w:sz="4"/>
+            </w:tcBorders>
+            <w:tcMar>
+              <w:top w:type="dxa" w:w="60"/>
+              <w:left w:type="dxa" w:w="90"/>
+              <w:bottom w:type="dxa" w:w="60"/>
+              <w:right w:type="dxa" w:w="90"/>
+            </w:tcMar>
+          </w:tcPr>
+          <w:p>
+            <w:pPr>
+              <w:spacing w:after="0" w:before="0"/>
+            </w:pPr>
+            <w:r>
+              <w:rPr>
+                <w:rFonts w:ascii="Arial" w:cs="Arial" w:eastAsia="Arial" w:hAnsi="Arial"/>
+                <w:color w:val="15202B"/>
+                <w:sz w:val="18"/>
+                <w:szCs w:val="18"/>
+              </w:rPr>
+              <w:t xml:space="preserve"/>
+            </w:r>
+          </w:p>
+        </w:tc>
+      </w:tr>
+      <w:tr>
+        <w:trPr>
+          <w:cantSplit/>
+        </w:trPr>
+        <w:tc>
+          <w:tcPr>
+            <w:tcW w:type="dxa" w:w="640"/>
+            <w:tcBorders>
+              <w:top w:val="single" w:color="B9D7F2" w:sz="4"/>
+              <w:left w:val="single" w:color="B9D7F2" w:sz="4"/>
+              <w:bottom w:val="single" w:color="B9D7F2" w:sz="4"/>
+              <w:right w:val="single" w:color="B9D7F2" w:sz="4"/>
+            </w:tcBorders>
+            <w:shd w:fill="EAF4FD" w:color="auto" w:val="clear"/>
+            <w:tcMar>
+              <w:top w:type="dxa" w:w="60"/>
+              <w:left w:type="dxa" w:w="90"/>
+              <w:bottom w:type="dxa" w:w="60"/>
+              <w:right w:type="dxa" w:w="90"/>
+            </w:tcMar>
+          </w:tcPr>
+          <w:p>
+            <w:pPr>
+              <w:spacing w:after="0" w:before="0"/>
+            </w:pPr>
+            <w:r>
+              <w:rPr>
+                <w:rFonts w:ascii="Arial" w:cs="Arial" w:eastAsia="Arial" w:hAnsi="Arial"/>
+                <w:color w:val="15202B"/>
+                <w:sz w:val="18"/>
+                <w:szCs w:val="18"/>
+              </w:rPr>
+              <w:t xml:space="preserve">27.8</w:t>
+            </w:r>
+          </w:p>
+        </w:tc>
+        <w:tc>
+          <w:tcPr>
+            <w:tcW w:type="dxa" w:w="3820"/>
+            <w:tcBorders>
+              <w:top w:val="single" w:color="B9D7F2" w:sz="4"/>
+              <w:left w:val="single" w:color="B9D7F2" w:sz="4"/>
+              <w:bottom w:val="single" w:color="B9D7F2" w:sz="4"/>
+              <w:right w:val="single" w:color="B9D7F2" w:sz="4"/>
+            </w:tcBorders>
+            <w:shd w:fill="EAF4FD" w:color="auto" w:val="clear"/>
+            <w:tcMar>
+              <w:top w:type="dxa" w:w="60"/>
+              <w:left w:type="dxa" w:w="90"/>
+              <w:bottom w:type="dxa" w:w="60"/>
+              <w:right w:type="dxa" w:w="90"/>
+            </w:tcMar>
+          </w:tcPr>
+          <w:p>
+            <w:pPr>
+              <w:spacing w:after="0" w:before="0"/>
+            </w:pPr>
+            <w:r>
+              <w:rPr>
+                <w:rFonts w:ascii="Arial" w:cs="Arial" w:eastAsia="Arial" w:hAnsi="Arial"/>
+                <w:color w:val="15202B"/>
+                <w:sz w:val="18"/>
+                <w:szCs w:val="18"/>
+              </w:rPr>
+              <w:t xml:space="preserve">Log a walk-in of 2 gallons Paid from Home.</w:t>
+            </w:r>
+          </w:p>
+        </w:tc>
+        <w:tc>
+          <w:tcPr>
+            <w:tcW w:type="dxa" w:w="3900"/>
+            <w:tcBorders>
+              <w:top w:val="single" w:color="B9D7F2" w:sz="4"/>
+              <w:left w:val="single" w:color="B9D7F2" w:sz="4"/>
+              <w:bottom w:val="single" w:color="B9D7F2" w:sz="4"/>
+              <w:right w:val="single" w:color="B9D7F2" w:sz="4"/>
+            </w:tcBorders>
+            <w:shd w:fill="EAF4FD" w:color="auto" w:val="clear"/>
+            <w:tcMar>
+              <w:top w:type="dxa" w:w="60"/>
+              <w:left w:type="dxa" w:w="90"/>
+              <w:bottom w:type="dxa" w:w="60"/>
+              <w:right w:type="dxa" w:w="90"/>
+            </w:tcMar>
+          </w:tcPr>
+          <w:p>
+            <w:pPr>
+              <w:spacing w:after="0" w:before="0"/>
+            </w:pPr>
+            <w:r>
+              <w:rPr>
+                <w:rFonts w:ascii="Arial" w:cs="Arial" w:eastAsia="Arial" w:hAnsi="Arial"/>
+                <w:color w:val="15202B"/>
+                <w:sz w:val="18"/>
+                <w:szCs w:val="18"/>
+              </w:rPr>
+              <w:t xml:space="preserve">Walk-in tile +1, Gallons processed +2, Sales +₱60 right after saving.</w:t>
+            </w:r>
+          </w:p>
+        </w:tc>
+        <w:tc>
+          <w:tcPr>
+            <w:tcW w:type="dxa" w:w="900"/>
+            <w:tcBorders>
+              <w:top w:val="single" w:color="B9D7F2" w:sz="4"/>
+              <w:left w:val="single" w:color="B9D7F2" w:sz="4"/>
+              <w:bottom w:val="single" w:color="B9D7F2" w:sz="4"/>
+              <w:right w:val="single" w:color="B9D7F2" w:sz="4"/>
+            </w:tcBorders>
+            <w:shd w:fill="EAF4FD" w:color="auto" w:val="clear"/>
+            <w:tcMar>
+              <w:top w:type="dxa" w:w="60"/>
+              <w:left w:type="dxa" w:w="90"/>
+              <w:bottom w:type="dxa" w:w="60"/>
+              <w:right w:type="dxa" w:w="90"/>
+            </w:tcMar>
+          </w:tcPr>
+          <w:p>
+            <w:pPr>
+              <w:spacing w:after="0" w:before="0"/>
+            </w:pPr>
+            <w:r>
+              <w:rPr>
+                <w:rFonts w:ascii="Arial" w:cs="Arial" w:eastAsia="Arial" w:hAnsi="Arial"/>
+                <w:color w:val="15202B"/>
+                <w:sz w:val="18"/>
+                <w:szCs w:val="18"/>
+              </w:rPr>
+              <w:t xml:space="preserve">☐ Pass</w:t>
+            </w:r>
+          </w:p>
+          <w:p>
+            <w:pPr>
+              <w:spacing w:after="0" w:before="0"/>
+            </w:pPr>
+            <w:r>
+              <w:rPr>
+                <w:rFonts w:ascii="Arial" w:cs="Arial" w:eastAsia="Arial" w:hAnsi="Arial"/>
+                <w:color w:val="15202B"/>
+                <w:sz w:val="18"/>
+                <w:szCs w:val="18"/>
+              </w:rPr>
+              <w:t xml:space="preserve">☐ Fail</w:t>
+            </w:r>
+          </w:p>
+        </w:tc>
+        <w:tc>
+          <w:tcPr>
+            <w:tcW w:type="dxa" w:w="1206"/>
+            <w:tcBorders>
+              <w:top w:val="single" w:color="B9D7F2" w:sz="4"/>
+              <w:left w:val="single" w:color="B9D7F2" w:sz="4"/>
+              <w:bottom w:val="single" w:color="B9D7F2" w:sz="4"/>
+              <w:right w:val="single" w:color="B9D7F2" w:sz="4"/>
+            </w:tcBorders>
+            <w:shd w:fill="EAF4FD" w:color="auto" w:val="clear"/>
+            <w:tcMar>
+              <w:top w:type="dxa" w:w="60"/>
+              <w:left w:type="dxa" w:w="90"/>
+              <w:bottom w:type="dxa" w:w="60"/>
+              <w:right w:type="dxa" w:w="90"/>
+            </w:tcMar>
+          </w:tcPr>
+          <w:p>
+            <w:pPr>
+              <w:spacing w:after="0" w:before="0"/>
+            </w:pPr>
+            <w:r>
+              <w:rPr>
+                <w:rFonts w:ascii="Arial" w:cs="Arial" w:eastAsia="Arial" w:hAnsi="Arial"/>
+                <w:color w:val="15202B"/>
+                <w:sz w:val="18"/>
+                <w:szCs w:val="18"/>
+              </w:rPr>
+              <w:t xml:space="preserve"/>
+            </w:r>
+          </w:p>
+        </w:tc>
+      </w:tr>
+      <w:tr>
+        <w:trPr>
+          <w:cantSplit/>
+        </w:trPr>
+        <w:tc>
+          <w:tcPr>
+            <w:tcW w:type="dxa" w:w="640"/>
+            <w:tcBorders>
+              <w:top w:val="single" w:color="B9D7F2" w:sz="4"/>
+              <w:left w:val="single" w:color="B9D7F2" w:sz="4"/>
+              <w:bottom w:val="single" w:color="B9D7F2" w:sz="4"/>
+              <w:right w:val="single" w:color="B9D7F2" w:sz="4"/>
+            </w:tcBorders>
+            <w:tcMar>
+              <w:top w:type="dxa" w:w="60"/>
+              <w:left w:type="dxa" w:w="90"/>
+              <w:bottom w:type="dxa" w:w="60"/>
+              <w:right w:type="dxa" w:w="90"/>
+            </w:tcMar>
+          </w:tcPr>
+          <w:p>
+            <w:pPr>
+              <w:spacing w:after="0" w:before="0"/>
+            </w:pPr>
+            <w:r>
+              <w:rPr>
+                <w:rFonts w:ascii="Arial" w:cs="Arial" w:eastAsia="Arial" w:hAnsi="Arial"/>
+                <w:color w:val="15202B"/>
+                <w:sz w:val="18"/>
+                <w:szCs w:val="18"/>
+              </w:rPr>
+              <w:t xml:space="preserve">27.9</w:t>
+            </w:r>
+          </w:p>
+        </w:tc>
+        <w:tc>
+          <w:tcPr>
+            <w:tcW w:type="dxa" w:w="3820"/>
+            <w:tcBorders>
+              <w:top w:val="single" w:color="B9D7F2" w:sz="4"/>
+              <w:left w:val="single" w:color="B9D7F2" w:sz="4"/>
+              <w:bottom w:val="single" w:color="B9D7F2" w:sz="4"/>
+              <w:right w:val="single" w:color="B9D7F2" w:sz="4"/>
+            </w:tcBorders>
+            <w:tcMar>
+              <w:top w:type="dxa" w:w="60"/>
+              <w:left w:type="dxa" w:w="90"/>
+              <w:bottom w:type="dxa" w:w="60"/>
+              <w:right w:type="dxa" w:w="90"/>
+            </w:tcMar>
+          </w:tcPr>
+          <w:p>
+            <w:pPr>
+              <w:spacing w:after="0" w:before="0"/>
+            </w:pPr>
+            <w:r>
+              <w:rPr>
+                <w:rFonts w:ascii="Arial" w:cs="Arial" w:eastAsia="Arial" w:hAnsi="Arial"/>
+                <w:color w:val="15202B"/>
+                <w:sz w:val="18"/>
+                <w:szCs w:val="18"/>
+              </w:rPr>
+              <w:t xml:space="preserve">Stock Alerts with new gallons below 30.</w:t>
+            </w:r>
+          </w:p>
+        </w:tc>
+        <w:tc>
+          <w:tcPr>
+            <w:tcW w:type="dxa" w:w="3900"/>
+            <w:tcBorders>
+              <w:top w:val="single" w:color="B9D7F2" w:sz="4"/>
+              <w:left w:val="single" w:color="B9D7F2" w:sz="4"/>
+              <w:bottom w:val="single" w:color="B9D7F2" w:sz="4"/>
+              <w:right w:val="single" w:color="B9D7F2" w:sz="4"/>
+            </w:tcBorders>
+            <w:tcMar>
+              <w:top w:type="dxa" w:w="60"/>
+              <w:left w:type="dxa" w:w="90"/>
+              <w:bottom w:type="dxa" w:w="60"/>
+              <w:right w:type="dxa" w:w="90"/>
+            </w:tcMar>
+          </w:tcPr>
+          <w:p>
+            <w:pPr>
+              <w:spacing w:after="0" w:before="0"/>
+            </w:pPr>
+            <w:r>
+              <w:rPr>
+                <w:rFonts w:ascii="Arial" w:cs="Arial" w:eastAsia="Arial" w:hAnsi="Arial"/>
+                <w:color w:val="15202B"/>
+                <w:sz w:val="18"/>
+                <w:szCs w:val="18"/>
+              </w:rPr>
+              <w:t xml:space="preserve">Box "Low new gallons: 24 left" (with "Seals OK"); tapping it opens the Inventory tab.</w:t>
+            </w:r>
+          </w:p>
+        </w:tc>
+        <w:tc>
+          <w:tcPr>
+            <w:tcW w:type="dxa" w:w="900"/>
+            <w:tcBorders>
+              <w:top w:val="single" w:color="B9D7F2" w:sz="4"/>
+              <w:left w:val="single" w:color="B9D7F2" w:sz="4"/>
+              <w:bottom w:val="single" w:color="B9D7F2" w:sz="4"/>
+              <w:right w:val="single" w:color="B9D7F2" w:sz="4"/>
+            </w:tcBorders>
+            <w:tcMar>
+              <w:top w:type="dxa" w:w="60"/>
+              <w:left w:type="dxa" w:w="90"/>
+              <w:bottom w:type="dxa" w:w="60"/>
+              <w:right w:type="dxa" w:w="90"/>
+            </w:tcMar>
+          </w:tcPr>
+          <w:p>
+            <w:pPr>
+              <w:spacing w:after="0" w:before="0"/>
+            </w:pPr>
+            <w:r>
+              <w:rPr>
+                <w:rFonts w:ascii="Arial" w:cs="Arial" w:eastAsia="Arial" w:hAnsi="Arial"/>
+                <w:color w:val="15202B"/>
+                <w:sz w:val="18"/>
+                <w:szCs w:val="18"/>
+              </w:rPr>
+              <w:t xml:space="preserve">☐ Pass</w:t>
+            </w:r>
+          </w:p>
+          <w:p>
+            <w:pPr>
+              <w:spacing w:after="0" w:before="0"/>
+            </w:pPr>
+            <w:r>
+              <w:rPr>
+                <w:rFonts w:ascii="Arial" w:cs="Arial" w:eastAsia="Arial" w:hAnsi="Arial"/>
+                <w:color w:val="15202B"/>
+                <w:sz w:val="18"/>
+                <w:szCs w:val="18"/>
+              </w:rPr>
+              <w:t xml:space="preserve">☐ Fail</w:t>
+            </w:r>
+          </w:p>
+        </w:tc>
+        <w:tc>
+          <w:tcPr>
+            <w:tcW w:type="dxa" w:w="1206"/>
+            <w:tcBorders>
+              <w:top w:val="single" w:color="B9D7F2" w:sz="4"/>
+              <w:left w:val="single" w:color="B9D7F2" w:sz="4"/>
+              <w:bottom w:val="single" w:color="B9D7F2" w:sz="4"/>
+              <w:right w:val="single" w:color="B9D7F2" w:sz="4"/>
+            </w:tcBorders>
+            <w:tcMar>
+              <w:top w:type="dxa" w:w="60"/>
+              <w:left w:type="dxa" w:w="90"/>
+              <w:bottom w:type="dxa" w:w="60"/>
+              <w:right w:type="dxa" w:w="90"/>
+            </w:tcMar>
+          </w:tcPr>
+          <w:p>
+            <w:pPr>
+              <w:spacing w:after="0" w:before="0"/>
+            </w:pPr>
+            <w:r>
+              <w:rPr>
+                <w:rFonts w:ascii="Arial" w:cs="Arial" w:eastAsia="Arial" w:hAnsi="Arial"/>
+                <w:color w:val="15202B"/>
+                <w:sz w:val="18"/>
+                <w:szCs w:val="18"/>
+              </w:rPr>
+              <w:t xml:space="preserve"/>
+            </w:r>
+          </w:p>
+        </w:tc>
+      </w:tr>
+    </w:tbl>
+    <w:p>
+      <w:pPr>
+        <w:pStyle w:val="Heading1"/>
+        <w:pageBreakBefore/>
+        <w:spacing w:after="60"/>
+      </w:pPr>
+      <w:r>
+        <w:rPr>
+          <w:rFonts w:ascii="Arial" w:cs="Arial" w:eastAsia="Arial" w:hAnsi="Arial"/>
+          <w:b/>
+          <w:bCs/>
+          <w:color w:val="0A84E0"/>
+          <w:sz w:val="28"/>
+          <w:szCs w:val="28"/>
+        </w:rPr>
+        <w:t xml:space="preserve">Step 28 · Payments and unpaid balance</w:t>
+      </w:r>
+    </w:p>
+    <w:p>
+      <w:pPr>
+        <w:spacing w:after="60" w:before="0"/>
+      </w:pPr>
+      <w:r>
+        <w:rPr>
+          <w:rFonts w:ascii="Arial" w:cs="Arial" w:eastAsia="Arial" w:hAnsi="Arial"/>
+          <w:b/>
+          <w:bCs/>
+          <w:color w:val="15202B"/>
+          <w:sz w:val="19"/>
+          <w:szCs w:val="19"/>
+        </w:rPr>
+        <w:t xml:space="preserve">Screens: </w:t>
+      </w:r>
+      <w:r>
+        <w:rPr>
+          <w:rFonts w:ascii="Arial" w:cs="Arial" w:eastAsia="Arial" w:hAnsi="Arial"/>
+          <w:color w:val="15202B"/>
+          <w:sz w:val="19"/>
+          <w:szCs w:val="19"/>
+        </w:rPr>
+        <w:t xml:space="preserve">Admin Orders 6, Customer 3</w:t>
+      </w:r>
+      <w:r>
+        <w:rPr>
+          <w:rFonts w:ascii="Arial" w:cs="Arial" w:eastAsia="Arial" w:hAnsi="Arial"/>
+          <w:b/>
+          <w:bCs/>
+          <w:color w:val="15202B"/>
+          <w:sz w:val="19"/>
+          <w:szCs w:val="19"/>
+        </w:rPr>
+        <w:t xml:space="preserve">    Log in as: </w:t>
+      </w:r>
+      <w:r>
+        <w:rPr>
+          <w:rFonts w:ascii="Arial" w:cs="Arial" w:eastAsia="Arial" w:hAnsi="Arial"/>
+          <w:color w:val="15202B"/>
+          <w:sz w:val="19"/>
+          <w:szCs w:val="19"/>
+        </w:rPr>
+        <w:t xml:space="preserve">Owner and Customer</w:t>
+      </w:r>
+    </w:p>
+    <w:tbl>
+      <w:tblPr>
+        <w:tblW w:type="dxa" w:w="10466"/>
+        <w:tblBorders>
+          <w:top w:val="single" w:color="auto" w:sz="4"/>
+          <w:left w:val="single" w:color="auto" w:sz="4"/>
+          <w:bottom w:val="single" w:color="auto" w:sz="4"/>
+          <w:right w:val="single" w:color="auto" w:sz="4"/>
+          <w:insideH w:val="single" w:color="auto" w:sz="4"/>
+          <w:insideV w:val="single" w:color="auto" w:sz="4"/>
+        </w:tblBorders>
+        <w:tblLayout w:type="fixed"/>
+      </w:tblPr>
+      <w:tblGrid>
+        <w:gridCol w:w="640"/>
+        <w:gridCol w:w="3820"/>
+        <w:gridCol w:w="3900"/>
+        <w:gridCol w:w="900"/>
+        <w:gridCol w:w="1206"/>
+      </w:tblGrid>
+      <w:tr>
+        <w:trPr>
+          <w:tblHeader/>
+        </w:trPr>
+        <w:tc>
+          <w:tcPr>
+            <w:tcW w:type="dxa" w:w="640"/>
+            <w:tcBorders>
+              <w:top w:val="single" w:color="B9D7F2" w:sz="4"/>
+              <w:left w:val="single" w:color="B9D7F2" w:sz="4"/>
+              <w:bottom w:val="single" w:color="B9D7F2" w:sz="4"/>
+              <w:right w:val="single" w:color="B9D7F2" w:sz="4"/>
+            </w:tcBorders>
+            <w:shd w:fill="0A84E0" w:color="auto" w:val="clear"/>
+            <w:tcMar>
+              <w:top w:type="dxa" w:w="60"/>
+              <w:left w:type="dxa" w:w="90"/>
+              <w:bottom w:type="dxa" w:w="60"/>
+              <w:right w:type="dxa" w:w="90"/>
+            </w:tcMar>
+          </w:tcPr>
+          <w:p>
+            <w:pPr>
+              <w:spacing w:after="0" w:before="0"/>
+            </w:pPr>
+            <w:r>
+              <w:rPr>
+                <w:rFonts w:ascii="Arial" w:cs="Arial" w:eastAsia="Arial" w:hAnsi="Arial"/>
+                <w:b/>
+                <w:bCs/>
+                <w:color w:val="FFFFFF"/>
+                <w:sz w:val="18"/>
+                <w:szCs w:val="18"/>
+              </w:rPr>
+              <w:t xml:space="preserve">#</w:t>
+            </w:r>
+          </w:p>
+        </w:tc>
+        <w:tc>
+          <w:tcPr>
+            <w:tcW w:type="dxa" w:w="3820"/>
+            <w:tcBorders>
+              <w:top w:val="single" w:color="B9D7F2" w:sz="4"/>
+              <w:left w:val="single" w:color="B9D7F2" w:sz="4"/>
+              <w:bottom w:val="single" w:color="B9D7F2" w:sz="4"/>
+              <w:right w:val="single" w:color="B9D7F2" w:sz="4"/>
+            </w:tcBorders>
+            <w:shd w:fill="0A84E0" w:color="auto" w:val="clear"/>
+            <w:tcMar>
+              <w:top w:type="dxa" w:w="60"/>
+              <w:left w:type="dxa" w:w="90"/>
+              <w:bottom w:type="dxa" w:w="60"/>
+              <w:right w:type="dxa" w:w="90"/>
+            </w:tcMar>
+          </w:tcPr>
+          <w:p>
+            <w:pPr>
+              <w:spacing w:after="0" w:before="0"/>
+            </w:pPr>
+            <w:r>
+              <w:rPr>
+                <w:rFonts w:ascii="Arial" w:cs="Arial" w:eastAsia="Arial" w:hAnsi="Arial"/>
+                <w:b/>
+                <w:bCs/>
+                <w:color w:val="FFFFFF"/>
+                <w:sz w:val="18"/>
+                <w:szCs w:val="18"/>
+              </w:rPr>
+              <w:t xml:space="preserve">What to do</w:t>
+            </w:r>
+          </w:p>
+        </w:tc>
+        <w:tc>
+          <w:tcPr>
+            <w:tcW w:type="dxa" w:w="3900"/>
+            <w:tcBorders>
+              <w:top w:val="single" w:color="B9D7F2" w:sz="4"/>
+              <w:left w:val="single" w:color="B9D7F2" w:sz="4"/>
+              <w:bottom w:val="single" w:color="B9D7F2" w:sz="4"/>
+              <w:right w:val="single" w:color="B9D7F2" w:sz="4"/>
+            </w:tcBorders>
+            <w:shd w:fill="0A84E0" w:color="auto" w:val="clear"/>
+            <w:tcMar>
+              <w:top w:type="dxa" w:w="60"/>
+              <w:left w:type="dxa" w:w="90"/>
+              <w:bottom w:type="dxa" w:w="60"/>
+              <w:right w:type="dxa" w:w="90"/>
+            </w:tcMar>
+          </w:tcPr>
+          <w:p>
+            <w:pPr>
+              <w:spacing w:after="0" w:before="0"/>
+            </w:pPr>
+            <w:r>
+              <w:rPr>
+                <w:rFonts w:ascii="Arial" w:cs="Arial" w:eastAsia="Arial" w:hAnsi="Arial"/>
+                <w:b/>
+                <w:bCs/>
+                <w:color w:val="FFFFFF"/>
+                <w:sz w:val="18"/>
+                <w:szCs w:val="18"/>
+              </w:rPr>
+              <w:t xml:space="preserve">What you should see</w:t>
+            </w:r>
+          </w:p>
+        </w:tc>
+        <w:tc>
+          <w:tcPr>
+            <w:tcW w:type="dxa" w:w="900"/>
+            <w:tcBorders>
+              <w:top w:val="single" w:color="B9D7F2" w:sz="4"/>
+              <w:left w:val="single" w:color="B9D7F2" w:sz="4"/>
+              <w:bottom w:val="single" w:color="B9D7F2" w:sz="4"/>
+              <w:right w:val="single" w:color="B9D7F2" w:sz="4"/>
+            </w:tcBorders>
+            <w:shd w:fill="0A84E0" w:color="auto" w:val="clear"/>
+            <w:tcMar>
+              <w:top w:type="dxa" w:w="60"/>
+              <w:left w:type="dxa" w:w="90"/>
+              <w:bottom w:type="dxa" w:w="60"/>
+              <w:right w:type="dxa" w:w="90"/>
+            </w:tcMar>
+          </w:tcPr>
+          <w:p>
+            <w:pPr>
+              <w:spacing w:after="0" w:before="0"/>
+            </w:pPr>
+            <w:r>
+              <w:rPr>
+                <w:rFonts w:ascii="Arial" w:cs="Arial" w:eastAsia="Arial" w:hAnsi="Arial"/>
+                <w:b/>
+                <w:bCs/>
+                <w:color w:val="FFFFFF"/>
+                <w:sz w:val="18"/>
+                <w:szCs w:val="18"/>
+              </w:rPr>
+              <w:t xml:space="preserve">Result</w:t>
+            </w:r>
+          </w:p>
+        </w:tc>
+        <w:tc>
+          <w:tcPr>
+            <w:tcW w:type="dxa" w:w="1206"/>
+            <w:tcBorders>
+              <w:top w:val="single" w:color="B9D7F2" w:sz="4"/>
+              <w:left w:val="single" w:color="B9D7F2" w:sz="4"/>
+              <w:bottom w:val="single" w:color="B9D7F2" w:sz="4"/>
+              <w:right w:val="single" w:color="B9D7F2" w:sz="4"/>
+            </w:tcBorders>
+            <w:shd w:fill="0A84E0" w:color="auto" w:val="clear"/>
+            <w:tcMar>
+              <w:top w:type="dxa" w:w="60"/>
+              <w:left w:type="dxa" w:w="90"/>
+              <w:bottom w:type="dxa" w:w="60"/>
+              <w:right w:type="dxa" w:w="90"/>
+            </w:tcMar>
+          </w:tcPr>
+          <w:p>
+            <w:pPr>
+              <w:spacing w:after="0" w:before="0"/>
+            </w:pPr>
+            <w:r>
+              <w:rPr>
+                <w:rFonts w:ascii="Arial" w:cs="Arial" w:eastAsia="Arial" w:hAnsi="Arial"/>
+                <w:b/>
+                <w:bCs/>
+                <w:color w:val="FFFFFF"/>
+                <w:sz w:val="18"/>
+                <w:szCs w:val="18"/>
+              </w:rPr>
+              <w:t xml:space="preserve">Notes</w:t>
+            </w:r>
+          </w:p>
+        </w:tc>
+      </w:tr>
+      <w:tr>
+        <w:trPr>
+          <w:cantSplit/>
+        </w:trPr>
+        <w:tc>
+          <w:tcPr>
+            <w:tcW w:type="dxa" w:w="640"/>
+            <w:tcBorders>
+              <w:top w:val="single" w:color="B9D7F2" w:sz="4"/>
+              <w:left w:val="single" w:color="B9D7F2" w:sz="4"/>
+              <w:bottom w:val="single" w:color="B9D7F2" w:sz="4"/>
+              <w:right w:val="single" w:color="B9D7F2" w:sz="4"/>
+            </w:tcBorders>
+            <w:tcMar>
+              <w:top w:type="dxa" w:w="60"/>
+              <w:left w:type="dxa" w:w="90"/>
+              <w:bottom w:type="dxa" w:w="60"/>
+              <w:right w:type="dxa" w:w="90"/>
+            </w:tcMar>
+          </w:tcPr>
+          <w:p>
+            <w:pPr>
+              <w:spacing w:after="0" w:before="0"/>
+            </w:pPr>
+            <w:r>
+              <w:rPr>
+                <w:rFonts w:ascii="Arial" w:cs="Arial" w:eastAsia="Arial" w:hAnsi="Arial"/>
+                <w:color w:val="15202B"/>
+                <w:sz w:val="18"/>
+                <w:szCs w:val="18"/>
+              </w:rPr>
+              <w:t xml:space="preserve">28.1</w:t>
+            </w:r>
+          </w:p>
+        </w:tc>
+        <w:tc>
+          <w:tcPr>
+            <w:tcW w:type="dxa" w:w="3820"/>
+            <w:tcBorders>
+              <w:top w:val="single" w:color="B9D7F2" w:sz="4"/>
+              <w:left w:val="single" w:color="B9D7F2" w:sz="4"/>
+              <w:bottom w:val="single" w:color="B9D7F2" w:sz="4"/>
+              <w:right w:val="single" w:color="B9D7F2" w:sz="4"/>
+            </w:tcBorders>
+            <w:tcMar>
+              <w:top w:type="dxa" w:w="60"/>
+              <w:left w:type="dxa" w:w="90"/>
+              <w:bottom w:type="dxa" w:w="60"/>
+              <w:right w:type="dxa" w:w="90"/>
+            </w:tcMar>
+          </w:tcPr>
+          <w:p>
+            <w:pPr>
+              <w:spacing w:after="0" w:before="0"/>
+            </w:pPr>
+            <w:r>
+              <w:rPr>
+                <w:rFonts w:ascii="Arial" w:cs="Arial" w:eastAsia="Arial" w:hAnsi="Arial"/>
+                <w:color w:val="15202B"/>
+                <w:sz w:val="18"/>
+                <w:szCs w:val="18"/>
+              </w:rPr>
+              <w:t xml:space="preserve">Rider records an order Delivered &gt; Unpaid (step 23). Owner opens it.</w:t>
+            </w:r>
+          </w:p>
+        </w:tc>
+        <w:tc>
+          <w:tcPr>
+            <w:tcW w:type="dxa" w:w="3900"/>
+            <w:tcBorders>
+              <w:top w:val="single" w:color="B9D7F2" w:sz="4"/>
+              <w:left w:val="single" w:color="B9D7F2" w:sz="4"/>
+              <w:bottom w:val="single" w:color="B9D7F2" w:sz="4"/>
+              <w:right w:val="single" w:color="B9D7F2" w:sz="4"/>
+            </w:tcBorders>
+            <w:tcMar>
+              <w:top w:type="dxa" w:w="60"/>
+              <w:left w:type="dxa" w:w="90"/>
+              <w:bottom w:type="dxa" w:w="60"/>
+              <w:right w:type="dxa" w:w="90"/>
+            </w:tcMar>
+          </w:tcPr>
+          <w:p>
+            <w:pPr>
+              <w:spacing w:after="0" w:before="0"/>
+            </w:pPr>
+            <w:r>
+              <w:rPr>
+                <w:rFonts w:ascii="Arial" w:cs="Arial" w:eastAsia="Arial" w:hAnsi="Arial"/>
+                <w:color w:val="15202B"/>
+                <w:sz w:val="18"/>
+                <w:szCs w:val="18"/>
+              </w:rPr>
+              <w:t xml:space="preserve">Tag "Delivered (Unpaid)"; Payment box "Unpaid: owes P..." with a Mark paid button.</w:t>
+            </w:r>
+          </w:p>
+        </w:tc>
+        <w:tc>
+          <w:tcPr>
+            <w:tcW w:type="dxa" w:w="900"/>
+            <w:tcBorders>
+              <w:top w:val="single" w:color="B9D7F2" w:sz="4"/>
+              <w:left w:val="single" w:color="B9D7F2" w:sz="4"/>
+              <w:bottom w:val="single" w:color="B9D7F2" w:sz="4"/>
+              <w:right w:val="single" w:color="B9D7F2" w:sz="4"/>
+            </w:tcBorders>
+            <w:tcMar>
+              <w:top w:type="dxa" w:w="60"/>
+              <w:left w:type="dxa" w:w="90"/>
+              <w:bottom w:type="dxa" w:w="60"/>
+              <w:right w:type="dxa" w:w="90"/>
+            </w:tcMar>
+          </w:tcPr>
+          <w:p>
+            <w:pPr>
+              <w:spacing w:after="0" w:before="0"/>
+            </w:pPr>
+            <w:r>
+              <w:rPr>
+                <w:rFonts w:ascii="Arial" w:cs="Arial" w:eastAsia="Arial" w:hAnsi="Arial"/>
+                <w:color w:val="15202B"/>
+                <w:sz w:val="18"/>
+                <w:szCs w:val="18"/>
+              </w:rPr>
+              <w:t xml:space="preserve">☐ Pass</w:t>
+            </w:r>
+          </w:p>
+          <w:p>
+            <w:pPr>
+              <w:spacing w:after="0" w:before="0"/>
+            </w:pPr>
+            <w:r>
+              <w:rPr>
+                <w:rFonts w:ascii="Arial" w:cs="Arial" w:eastAsia="Arial" w:hAnsi="Arial"/>
+                <w:color w:val="15202B"/>
+                <w:sz w:val="18"/>
+                <w:szCs w:val="18"/>
+              </w:rPr>
+              <w:t xml:space="preserve">☐ Fail</w:t>
+            </w:r>
+          </w:p>
+        </w:tc>
+        <w:tc>
+          <w:tcPr>
+            <w:tcW w:type="dxa" w:w="1206"/>
+            <w:tcBorders>
+              <w:top w:val="single" w:color="B9D7F2" w:sz="4"/>
+              <w:left w:val="single" w:color="B9D7F2" w:sz="4"/>
+              <w:bottom w:val="single" w:color="B9D7F2" w:sz="4"/>
+              <w:right w:val="single" w:color="B9D7F2" w:sz="4"/>
+            </w:tcBorders>
+            <w:tcMar>
+              <w:top w:type="dxa" w:w="60"/>
+              <w:left w:type="dxa" w:w="90"/>
+              <w:bottom w:type="dxa" w:w="60"/>
+              <w:right w:type="dxa" w:w="90"/>
+            </w:tcMar>
+          </w:tcPr>
+          <w:p>
+            <w:pPr>
+              <w:spacing w:after="0" w:before="0"/>
+            </w:pPr>
+            <w:r>
+              <w:rPr>
+                <w:rFonts w:ascii="Arial" w:cs="Arial" w:eastAsia="Arial" w:hAnsi="Arial"/>
+                <w:color w:val="15202B"/>
+                <w:sz w:val="18"/>
+                <w:szCs w:val="18"/>
+              </w:rPr>
+              <w:t xml:space="preserve"/>
+            </w:r>
+          </w:p>
+        </w:tc>
+      </w:tr>
+      <w:tr>
+        <w:trPr>
+          <w:cantSplit/>
+        </w:trPr>
+        <w:tc>
+          <w:tcPr>
+            <w:tcW w:type="dxa" w:w="640"/>
+            <w:tcBorders>
+              <w:top w:val="single" w:color="B9D7F2" w:sz="4"/>
+              <w:left w:val="single" w:color="B9D7F2" w:sz="4"/>
+              <w:bottom w:val="single" w:color="B9D7F2" w:sz="4"/>
+              <w:right w:val="single" w:color="B9D7F2" w:sz="4"/>
+            </w:tcBorders>
+            <w:shd w:fill="EAF4FD" w:color="auto" w:val="clear"/>
+            <w:tcMar>
+              <w:top w:type="dxa" w:w="60"/>
+              <w:left w:type="dxa" w:w="90"/>
+              <w:bottom w:type="dxa" w:w="60"/>
+              <w:right w:type="dxa" w:w="90"/>
+            </w:tcMar>
+          </w:tcPr>
+          <w:p>
+            <w:pPr>
+              <w:spacing w:after="0" w:before="0"/>
+            </w:pPr>
+            <w:r>
+              <w:rPr>
+                <w:rFonts w:ascii="Arial" w:cs="Arial" w:eastAsia="Arial" w:hAnsi="Arial"/>
+                <w:color w:val="15202B"/>
+                <w:sz w:val="18"/>
+                <w:szCs w:val="18"/>
+              </w:rPr>
+              <w:t xml:space="preserve">28.2</w:t>
+            </w:r>
+          </w:p>
+        </w:tc>
+        <w:tc>
+          <w:tcPr>
+            <w:tcW w:type="dxa" w:w="3820"/>
+            <w:tcBorders>
+              <w:top w:val="single" w:color="B9D7F2" w:sz="4"/>
+              <w:left w:val="single" w:color="B9D7F2" w:sz="4"/>
+              <w:bottom w:val="single" w:color="B9D7F2" w:sz="4"/>
+              <w:right w:val="single" w:color="B9D7F2" w:sz="4"/>
+            </w:tcBorders>
+            <w:shd w:fill="EAF4FD" w:color="auto" w:val="clear"/>
+            <w:tcMar>
+              <w:top w:type="dxa" w:w="60"/>
+              <w:left w:type="dxa" w:w="90"/>
+              <w:bottom w:type="dxa" w:w="60"/>
+              <w:right w:type="dxa" w:w="90"/>
+            </w:tcMar>
+          </w:tcPr>
+          <w:p>
+            <w:pPr>
+              <w:spacing w:after="0" w:before="0"/>
+            </w:pPr>
+            <w:r>
+              <w:rPr>
+                <w:rFonts w:ascii="Arial" w:cs="Arial" w:eastAsia="Arial" w:hAnsi="Arial"/>
+                <w:color w:val="15202B"/>
+                <w:sz w:val="18"/>
+                <w:szCs w:val="18"/>
+              </w:rPr>
+              <w:t xml:space="preserve">Customer (owner of that order) opens Order Now.</w:t>
+            </w:r>
+          </w:p>
+        </w:tc>
+        <w:tc>
+          <w:tcPr>
+            <w:tcW w:type="dxa" w:w="3900"/>
+            <w:tcBorders>
+              <w:top w:val="single" w:color="B9D7F2" w:sz="4"/>
+              <w:left w:val="single" w:color="B9D7F2" w:sz="4"/>
+              <w:bottom w:val="single" w:color="B9D7F2" w:sz="4"/>
+              <w:right w:val="single" w:color="B9D7F2" w:sz="4"/>
+            </w:tcBorders>
+            <w:shd w:fill="EAF4FD" w:color="auto" w:val="clear"/>
+            <w:tcMar>
+              <w:top w:type="dxa" w:w="60"/>
+              <w:left w:type="dxa" w:w="90"/>
+              <w:bottom w:type="dxa" w:w="60"/>
+              <w:right w:type="dxa" w:w="90"/>
+            </w:tcMar>
+          </w:tcPr>
+          <w:p>
+            <w:pPr>
+              <w:spacing w:after="0" w:before="0"/>
+            </w:pPr>
+            <w:r>
+              <w:rPr>
+                <w:rFonts w:ascii="Arial" w:cs="Arial" w:eastAsia="Arial" w:hAnsi="Arial"/>
+                <w:color w:val="15202B"/>
+                <w:sz w:val="18"/>
+                <w:szCs w:val="18"/>
+              </w:rPr>
+              <w:t xml:space="preserve">Note at the top "Unpaid balance: P..." (ordering is not blocked).</w:t>
+            </w:r>
+          </w:p>
+        </w:tc>
+        <w:tc>
+          <w:tcPr>
+            <w:tcW w:type="dxa" w:w="900"/>
+            <w:tcBorders>
+              <w:top w:val="single" w:color="B9D7F2" w:sz="4"/>
+              <w:left w:val="single" w:color="B9D7F2" w:sz="4"/>
+              <w:bottom w:val="single" w:color="B9D7F2" w:sz="4"/>
+              <w:right w:val="single" w:color="B9D7F2" w:sz="4"/>
+            </w:tcBorders>
+            <w:shd w:fill="EAF4FD" w:color="auto" w:val="clear"/>
+            <w:tcMar>
+              <w:top w:type="dxa" w:w="60"/>
+              <w:left w:type="dxa" w:w="90"/>
+              <w:bottom w:type="dxa" w:w="60"/>
+              <w:right w:type="dxa" w:w="90"/>
+            </w:tcMar>
+          </w:tcPr>
+          <w:p>
+            <w:pPr>
+              <w:spacing w:after="0" w:before="0"/>
+            </w:pPr>
+            <w:r>
+              <w:rPr>
+                <w:rFonts w:ascii="Arial" w:cs="Arial" w:eastAsia="Arial" w:hAnsi="Arial"/>
+                <w:color w:val="15202B"/>
+                <w:sz w:val="18"/>
+                <w:szCs w:val="18"/>
+              </w:rPr>
+              <w:t xml:space="preserve">☐ Pass</w:t>
+            </w:r>
+          </w:p>
+          <w:p>
+            <w:pPr>
+              <w:spacing w:after="0" w:before="0"/>
+            </w:pPr>
+            <w:r>
+              <w:rPr>
+                <w:rFonts w:ascii="Arial" w:cs="Arial" w:eastAsia="Arial" w:hAnsi="Arial"/>
+                <w:color w:val="15202B"/>
+                <w:sz w:val="18"/>
+                <w:szCs w:val="18"/>
+              </w:rPr>
+              <w:t xml:space="preserve">☐ Fail</w:t>
+            </w:r>
+          </w:p>
+        </w:tc>
+        <w:tc>
+          <w:tcPr>
+            <w:tcW w:type="dxa" w:w="1206"/>
+            <w:tcBorders>
+              <w:top w:val="single" w:color="B9D7F2" w:sz="4"/>
+              <w:left w:val="single" w:color="B9D7F2" w:sz="4"/>
+              <w:bottom w:val="single" w:color="B9D7F2" w:sz="4"/>
+              <w:right w:val="single" w:color="B9D7F2" w:sz="4"/>
+            </w:tcBorders>
+            <w:shd w:fill="EAF4FD" w:color="auto" w:val="clear"/>
+            <w:tcMar>
+              <w:top w:type="dxa" w:w="60"/>
+              <w:left w:type="dxa" w:w="90"/>
+              <w:bottom w:type="dxa" w:w="60"/>
+              <w:right w:type="dxa" w:w="90"/>
+            </w:tcMar>
+          </w:tcPr>
+          <w:p>
+            <w:pPr>
+              <w:spacing w:after="0" w:before="0"/>
+            </w:pPr>
+            <w:r>
+              <w:rPr>
+                <w:rFonts w:ascii="Arial" w:cs="Arial" w:eastAsia="Arial" w:hAnsi="Arial"/>
+                <w:color w:val="15202B"/>
+                <w:sz w:val="18"/>
+                <w:szCs w:val="18"/>
+              </w:rPr>
+              <w:t xml:space="preserve"/>
+            </w:r>
+          </w:p>
+        </w:tc>
+      </w:tr>
+      <w:tr>
+        <w:trPr>
+          <w:cantSplit/>
+        </w:trPr>
+        <w:tc>
+          <w:tcPr>
+            <w:tcW w:type="dxa" w:w="640"/>
+            <w:tcBorders>
+              <w:top w:val="single" w:color="B9D7F2" w:sz="4"/>
+              <w:left w:val="single" w:color="B9D7F2" w:sz="4"/>
+              <w:bottom w:val="single" w:color="B9D7F2" w:sz="4"/>
+              <w:right w:val="single" w:color="B9D7F2" w:sz="4"/>
+            </w:tcBorders>
+            <w:tcMar>
+              <w:top w:type="dxa" w:w="60"/>
+              <w:left w:type="dxa" w:w="90"/>
+              <w:bottom w:type="dxa" w:w="60"/>
+              <w:right w:type="dxa" w:w="90"/>
+            </w:tcMar>
+          </w:tcPr>
+          <w:p>
+            <w:pPr>
+              <w:spacing w:after="0" w:before="0"/>
+            </w:pPr>
+            <w:r>
+              <w:rPr>
+                <w:rFonts w:ascii="Arial" w:cs="Arial" w:eastAsia="Arial" w:hAnsi="Arial"/>
+                <w:color w:val="15202B"/>
+                <w:sz w:val="18"/>
+                <w:szCs w:val="18"/>
+              </w:rPr>
+              <w:t xml:space="preserve">28.3</w:t>
+            </w:r>
+          </w:p>
+        </w:tc>
+        <w:tc>
+          <w:tcPr>
+            <w:tcW w:type="dxa" w:w="3820"/>
+            <w:tcBorders>
+              <w:top w:val="single" w:color="B9D7F2" w:sz="4"/>
+              <w:left w:val="single" w:color="B9D7F2" w:sz="4"/>
+              <w:bottom w:val="single" w:color="B9D7F2" w:sz="4"/>
+              <w:right w:val="single" w:color="B9D7F2" w:sz="4"/>
+            </w:tcBorders>
+            <w:tcMar>
+              <w:top w:type="dxa" w:w="60"/>
+              <w:left w:type="dxa" w:w="90"/>
+              <w:bottom w:type="dxa" w:w="60"/>
+              <w:right w:type="dxa" w:w="90"/>
+            </w:tcMar>
+          </w:tcPr>
+          <w:p>
+            <w:pPr>
+              <w:spacing w:after="0" w:before="0"/>
+            </w:pPr>
+            <w:r>
+              <w:rPr>
+                <w:rFonts w:ascii="Arial" w:cs="Arial" w:eastAsia="Arial" w:hAnsi="Arial"/>
+                <w:color w:val="15202B"/>
+                <w:sz w:val="18"/>
+                <w:szCs w:val="18"/>
+              </w:rPr>
+              <w:t xml:space="preserve">Owner: Mark paid &gt; Confirm.</w:t>
+            </w:r>
+          </w:p>
+        </w:tc>
+        <w:tc>
+          <w:tcPr>
+            <w:tcW w:type="dxa" w:w="3900"/>
+            <w:tcBorders>
+              <w:top w:val="single" w:color="B9D7F2" w:sz="4"/>
+              <w:left w:val="single" w:color="B9D7F2" w:sz="4"/>
+              <w:bottom w:val="single" w:color="B9D7F2" w:sz="4"/>
+              <w:right w:val="single" w:color="B9D7F2" w:sz="4"/>
+            </w:tcBorders>
+            <w:tcMar>
+              <w:top w:type="dxa" w:w="60"/>
+              <w:left w:type="dxa" w:w="90"/>
+              <w:bottom w:type="dxa" w:w="60"/>
+              <w:right w:type="dxa" w:w="90"/>
+            </w:tcMar>
+          </w:tcPr>
+          <w:p>
+            <w:pPr>
+              <w:spacing w:after="0" w:before="0"/>
+            </w:pPr>
+            <w:r>
+              <w:rPr>
+                <w:rFonts w:ascii="Arial" w:cs="Arial" w:eastAsia="Arial" w:hAnsi="Arial"/>
+                <w:color w:val="15202B"/>
+                <w:sz w:val="18"/>
+                <w:szCs w:val="18"/>
+              </w:rPr>
+              <w:t xml:space="preserve">"Marked paid."; Payment shows Paid; timeline "Marked paid · P... received".</w:t>
+            </w:r>
+          </w:p>
+        </w:tc>
+        <w:tc>
+          <w:tcPr>
+            <w:tcW w:type="dxa" w:w="900"/>
+            <w:tcBorders>
+              <w:top w:val="single" w:color="B9D7F2" w:sz="4"/>
+              <w:left w:val="single" w:color="B9D7F2" w:sz="4"/>
+              <w:bottom w:val="single" w:color="B9D7F2" w:sz="4"/>
+              <w:right w:val="single" w:color="B9D7F2" w:sz="4"/>
+            </w:tcBorders>
+            <w:tcMar>
+              <w:top w:type="dxa" w:w="60"/>
+              <w:left w:type="dxa" w:w="90"/>
+              <w:bottom w:type="dxa" w:w="60"/>
+              <w:right w:type="dxa" w:w="90"/>
+            </w:tcMar>
+          </w:tcPr>
+          <w:p>
+            <w:pPr>
+              <w:spacing w:after="0" w:before="0"/>
+            </w:pPr>
+            <w:r>
+              <w:rPr>
+                <w:rFonts w:ascii="Arial" w:cs="Arial" w:eastAsia="Arial" w:hAnsi="Arial"/>
+                <w:color w:val="15202B"/>
+                <w:sz w:val="18"/>
+                <w:szCs w:val="18"/>
+              </w:rPr>
+              <w:t xml:space="preserve">☐ Pass</w:t>
+            </w:r>
+          </w:p>
+          <w:p>
+            <w:pPr>
+              <w:spacing w:after="0" w:before="0"/>
+            </w:pPr>
+            <w:r>
+              <w:rPr>
+                <w:rFonts w:ascii="Arial" w:cs="Arial" w:eastAsia="Arial" w:hAnsi="Arial"/>
+                <w:color w:val="15202B"/>
+                <w:sz w:val="18"/>
+                <w:szCs w:val="18"/>
+              </w:rPr>
+              <w:t xml:space="preserve">☐ Fail</w:t>
+            </w:r>
+          </w:p>
+        </w:tc>
+        <w:tc>
+          <w:tcPr>
+            <w:tcW w:type="dxa" w:w="1206"/>
+            <w:tcBorders>
+              <w:top w:val="single" w:color="B9D7F2" w:sz="4"/>
+              <w:left w:val="single" w:color="B9D7F2" w:sz="4"/>
+              <w:bottom w:val="single" w:color="B9D7F2" w:sz="4"/>
+              <w:right w:val="single" w:color="B9D7F2" w:sz="4"/>
+            </w:tcBorders>
+            <w:tcMar>
+              <w:top w:type="dxa" w:w="60"/>
+              <w:left w:type="dxa" w:w="90"/>
+              <w:bottom w:type="dxa" w:w="60"/>
+              <w:right w:type="dxa" w:w="90"/>
+            </w:tcMar>
+          </w:tcPr>
+          <w:p>
+            <w:pPr>
+              <w:spacing w:after="0" w:before="0"/>
+            </w:pPr>
+            <w:r>
+              <w:rPr>
+                <w:rFonts w:ascii="Arial" w:cs="Arial" w:eastAsia="Arial" w:hAnsi="Arial"/>
+                <w:color w:val="15202B"/>
+                <w:sz w:val="18"/>
+                <w:szCs w:val="18"/>
+              </w:rPr>
+              <w:t xml:space="preserve"/>
+            </w:r>
+          </w:p>
+        </w:tc>
+      </w:tr>
+      <w:tr>
+        <w:trPr>
+          <w:cantSplit/>
+        </w:trPr>
+        <w:tc>
+          <w:tcPr>
+            <w:tcW w:type="dxa" w:w="640"/>
+            <w:tcBorders>
+              <w:top w:val="single" w:color="B9D7F2" w:sz="4"/>
+              <w:left w:val="single" w:color="B9D7F2" w:sz="4"/>
+              <w:bottom w:val="single" w:color="B9D7F2" w:sz="4"/>
+              <w:right w:val="single" w:color="B9D7F2" w:sz="4"/>
+            </w:tcBorders>
+            <w:shd w:fill="EAF4FD" w:color="auto" w:val="clear"/>
+            <w:tcMar>
+              <w:top w:type="dxa" w:w="60"/>
+              <w:left w:type="dxa" w:w="90"/>
+              <w:bottom w:type="dxa" w:w="60"/>
+              <w:right w:type="dxa" w:w="90"/>
+            </w:tcMar>
+          </w:tcPr>
+          <w:p>
+            <w:pPr>
+              <w:spacing w:after="0" w:before="0"/>
+            </w:pPr>
+            <w:r>
+              <w:rPr>
+                <w:rFonts w:ascii="Arial" w:cs="Arial" w:eastAsia="Arial" w:hAnsi="Arial"/>
+                <w:color w:val="15202B"/>
+                <w:sz w:val="18"/>
+                <w:szCs w:val="18"/>
+              </w:rPr>
+              <w:t xml:space="preserve">28.4</w:t>
+            </w:r>
+          </w:p>
+        </w:tc>
+        <w:tc>
+          <w:tcPr>
+            <w:tcW w:type="dxa" w:w="3820"/>
+            <w:tcBorders>
+              <w:top w:val="single" w:color="B9D7F2" w:sz="4"/>
+              <w:left w:val="single" w:color="B9D7F2" w:sz="4"/>
+              <w:bottom w:val="single" w:color="B9D7F2" w:sz="4"/>
+              <w:right w:val="single" w:color="B9D7F2" w:sz="4"/>
+            </w:tcBorders>
+            <w:shd w:fill="EAF4FD" w:color="auto" w:val="clear"/>
+            <w:tcMar>
+              <w:top w:type="dxa" w:w="60"/>
+              <w:left w:type="dxa" w:w="90"/>
+              <w:bottom w:type="dxa" w:w="60"/>
+              <w:right w:type="dxa" w:w="90"/>
+            </w:tcMar>
+          </w:tcPr>
+          <w:p>
+            <w:pPr>
+              <w:spacing w:after="0" w:before="0"/>
+            </w:pPr>
+            <w:r>
+              <w:rPr>
+                <w:rFonts w:ascii="Arial" w:cs="Arial" w:eastAsia="Arial" w:hAnsi="Arial"/>
+                <w:color w:val="15202B"/>
+                <w:sz w:val="18"/>
+                <w:szCs w:val="18"/>
+              </w:rPr>
+              <w:t xml:space="preserve">Customer opens Order Now again.</w:t>
+            </w:r>
+          </w:p>
+        </w:tc>
+        <w:tc>
+          <w:tcPr>
+            <w:tcW w:type="dxa" w:w="3900"/>
+            <w:tcBorders>
+              <w:top w:val="single" w:color="B9D7F2" w:sz="4"/>
+              <w:left w:val="single" w:color="B9D7F2" w:sz="4"/>
+              <w:bottom w:val="single" w:color="B9D7F2" w:sz="4"/>
+              <w:right w:val="single" w:color="B9D7F2" w:sz="4"/>
+            </w:tcBorders>
+            <w:shd w:fill="EAF4FD" w:color="auto" w:val="clear"/>
+            <w:tcMar>
+              <w:top w:type="dxa" w:w="60"/>
+              <w:left w:type="dxa" w:w="90"/>
+              <w:bottom w:type="dxa" w:w="60"/>
+              <w:right w:type="dxa" w:w="90"/>
+            </w:tcMar>
+          </w:tcPr>
+          <w:p>
+            <w:pPr>
+              <w:spacing w:after="0" w:before="0"/>
+            </w:pPr>
+            <w:r>
+              <w:rPr>
+                <w:rFonts w:ascii="Arial" w:cs="Arial" w:eastAsia="Arial" w:hAnsi="Arial"/>
+                <w:color w:val="15202B"/>
+                <w:sz w:val="18"/>
+                <w:szCs w:val="18"/>
+              </w:rPr>
+              <w:t xml:space="preserve">No unpaid balance note (if nothing else is unpaid).</w:t>
+            </w:r>
+          </w:p>
+        </w:tc>
+        <w:tc>
+          <w:tcPr>
+            <w:tcW w:type="dxa" w:w="900"/>
+            <w:tcBorders>
+              <w:top w:val="single" w:color="B9D7F2" w:sz="4"/>
+              <w:left w:val="single" w:color="B9D7F2" w:sz="4"/>
+              <w:bottom w:val="single" w:color="B9D7F2" w:sz="4"/>
+              <w:right w:val="single" w:color="B9D7F2" w:sz="4"/>
+            </w:tcBorders>
+            <w:shd w:fill="EAF4FD" w:color="auto" w:val="clear"/>
+            <w:tcMar>
+              <w:top w:type="dxa" w:w="60"/>
+              <w:left w:type="dxa" w:w="90"/>
+              <w:bottom w:type="dxa" w:w="60"/>
+              <w:right w:type="dxa" w:w="90"/>
+            </w:tcMar>
+          </w:tcPr>
+          <w:p>
+            <w:pPr>
+              <w:spacing w:after="0" w:before="0"/>
+            </w:pPr>
+            <w:r>
+              <w:rPr>
+                <w:rFonts w:ascii="Arial" w:cs="Arial" w:eastAsia="Arial" w:hAnsi="Arial"/>
+                <w:color w:val="15202B"/>
+                <w:sz w:val="18"/>
+                <w:szCs w:val="18"/>
+              </w:rPr>
+              <w:t xml:space="preserve">☐ Pass</w:t>
+            </w:r>
+          </w:p>
+          <w:p>
+            <w:pPr>
+              <w:spacing w:after="0" w:before="0"/>
+            </w:pPr>
+            <w:r>
+              <w:rPr>
+                <w:rFonts w:ascii="Arial" w:cs="Arial" w:eastAsia="Arial" w:hAnsi="Arial"/>
+                <w:color w:val="15202B"/>
+                <w:sz w:val="18"/>
+                <w:szCs w:val="18"/>
+              </w:rPr>
+              <w:t xml:space="preserve">☐ Fail</w:t>
+            </w:r>
+          </w:p>
+        </w:tc>
+        <w:tc>
+          <w:tcPr>
+            <w:tcW w:type="dxa" w:w="1206"/>
+            <w:tcBorders>
+              <w:top w:val="single" w:color="B9D7F2" w:sz="4"/>
+              <w:left w:val="single" w:color="B9D7F2" w:sz="4"/>
+              <w:bottom w:val="single" w:color="B9D7F2" w:sz="4"/>
+              <w:right w:val="single" w:color="B9D7F2" w:sz="4"/>
+            </w:tcBorders>
+            <w:shd w:fill="EAF4FD" w:color="auto" w:val="clear"/>
+            <w:tcMar>
+              <w:top w:type="dxa" w:w="60"/>
+              <w:left w:type="dxa" w:w="90"/>
+              <w:bottom w:type="dxa" w:w="60"/>
+              <w:right w:type="dxa" w:w="90"/>
+            </w:tcMar>
+          </w:tcPr>
+          <w:p>
+            <w:pPr>
+              <w:spacing w:after="0" w:before="0"/>
+            </w:pPr>
+            <w:r>
+              <w:rPr>
+                <w:rFonts w:ascii="Arial" w:cs="Arial" w:eastAsia="Arial" w:hAnsi="Arial"/>
+                <w:color w:val="15202B"/>
+                <w:sz w:val="18"/>
+                <w:szCs w:val="18"/>
+              </w:rPr>
+              <w:t xml:space="preserve"/>
+            </w:r>
+          </w:p>
+        </w:tc>
+      </w:tr>
+      <w:tr>
+        <w:trPr>
+          <w:cantSplit/>
+        </w:trPr>
+        <w:tc>
+          <w:tcPr>
+            <w:tcW w:type="dxa" w:w="640"/>
+            <w:tcBorders>
+              <w:top w:val="single" w:color="B9D7F2" w:sz="4"/>
+              <w:left w:val="single" w:color="B9D7F2" w:sz="4"/>
+              <w:bottom w:val="single" w:color="B9D7F2" w:sz="4"/>
+              <w:right w:val="single" w:color="B9D7F2" w:sz="4"/>
+            </w:tcBorders>
+            <w:tcMar>
+              <w:top w:type="dxa" w:w="60"/>
+              <w:left w:type="dxa" w:w="90"/>
+              <w:bottom w:type="dxa" w:w="60"/>
+              <w:right w:type="dxa" w:w="90"/>
+            </w:tcMar>
+          </w:tcPr>
+          <w:p>
+            <w:pPr>
+              <w:spacing w:after="0" w:before="0"/>
+            </w:pPr>
+            <w:r>
+              <w:rPr>
+                <w:rFonts w:ascii="Arial" w:cs="Arial" w:eastAsia="Arial" w:hAnsi="Arial"/>
+                <w:color w:val="15202B"/>
+                <w:sz w:val="18"/>
+                <w:szCs w:val="18"/>
+              </w:rPr>
+              <w:t xml:space="preserve">28.5</w:t>
+            </w:r>
+          </w:p>
+        </w:tc>
+        <w:tc>
+          <w:tcPr>
+            <w:tcW w:type="dxa" w:w="3820"/>
+            <w:tcBorders>
+              <w:top w:val="single" w:color="B9D7F2" w:sz="4"/>
+              <w:left w:val="single" w:color="B9D7F2" w:sz="4"/>
+              <w:bottom w:val="single" w:color="B9D7F2" w:sz="4"/>
+              <w:right w:val="single" w:color="B9D7F2" w:sz="4"/>
+            </w:tcBorders>
+            <w:tcMar>
+              <w:top w:type="dxa" w:w="60"/>
+              <w:left w:type="dxa" w:w="90"/>
+              <w:bottom w:type="dxa" w:w="60"/>
+              <w:right w:type="dxa" w:w="90"/>
+            </w:tcMar>
+          </w:tcPr>
+          <w:p>
+            <w:pPr>
+              <w:spacing w:after="0" w:before="0"/>
+            </w:pPr>
+            <w:r>
+              <w:rPr>
+                <w:rFonts w:ascii="Arial" w:cs="Arial" w:eastAsia="Arial" w:hAnsi="Arial"/>
+                <w:color w:val="15202B"/>
+                <w:sz w:val="18"/>
+                <w:szCs w:val="18"/>
+              </w:rPr>
+              <w:t xml:space="preserve">Owner is the rider (Delivery view or Order Details of an Out for Delivery order with rider Me (Owner)): Delivered &gt; Paid.</w:t>
+            </w:r>
+          </w:p>
+        </w:tc>
+        <w:tc>
+          <w:tcPr>
+            <w:tcW w:type="dxa" w:w="3900"/>
+            <w:tcBorders>
+              <w:top w:val="single" w:color="B9D7F2" w:sz="4"/>
+              <w:left w:val="single" w:color="B9D7F2" w:sz="4"/>
+              <w:bottom w:val="single" w:color="B9D7F2" w:sz="4"/>
+              <w:right w:val="single" w:color="B9D7F2" w:sz="4"/>
+            </w:tcBorders>
+            <w:tcMar>
+              <w:top w:type="dxa" w:w="60"/>
+              <w:left w:type="dxa" w:w="90"/>
+              <w:bottom w:type="dxa" w:w="60"/>
+              <w:right w:type="dxa" w:w="90"/>
+            </w:tcMar>
+          </w:tcPr>
+          <w:p>
+            <w:pPr>
+              <w:spacing w:after="0" w:before="0"/>
+            </w:pPr>
+            <w:r>
+              <w:rPr>
+                <w:rFonts w:ascii="Arial" w:cs="Arial" w:eastAsia="Arial" w:hAnsi="Arial"/>
+                <w:color w:val="15202B"/>
+                <w:sz w:val="18"/>
+                <w:szCs w:val="18"/>
+              </w:rPr>
+              <w:t xml:space="preserve">"Delivered. Paid."; tag Delivered (Paid).</w:t>
+            </w:r>
+          </w:p>
+        </w:tc>
+        <w:tc>
+          <w:tcPr>
+            <w:tcW w:type="dxa" w:w="900"/>
+            <w:tcBorders>
+              <w:top w:val="single" w:color="B9D7F2" w:sz="4"/>
+              <w:left w:val="single" w:color="B9D7F2" w:sz="4"/>
+              <w:bottom w:val="single" w:color="B9D7F2" w:sz="4"/>
+              <w:right w:val="single" w:color="B9D7F2" w:sz="4"/>
+            </w:tcBorders>
+            <w:tcMar>
+              <w:top w:type="dxa" w:w="60"/>
+              <w:left w:type="dxa" w:w="90"/>
+              <w:bottom w:type="dxa" w:w="60"/>
+              <w:right w:type="dxa" w:w="90"/>
+            </w:tcMar>
+          </w:tcPr>
+          <w:p>
+            <w:pPr>
+              <w:spacing w:after="0" w:before="0"/>
+            </w:pPr>
+            <w:r>
+              <w:rPr>
+                <w:rFonts w:ascii="Arial" w:cs="Arial" w:eastAsia="Arial" w:hAnsi="Arial"/>
+                <w:color w:val="15202B"/>
+                <w:sz w:val="18"/>
+                <w:szCs w:val="18"/>
+              </w:rPr>
+              <w:t xml:space="preserve">☐ Pass</w:t>
+            </w:r>
+          </w:p>
+          <w:p>
+            <w:pPr>
+              <w:spacing w:after="0" w:before="0"/>
+            </w:pPr>
+            <w:r>
+              <w:rPr>
+                <w:rFonts w:ascii="Arial" w:cs="Arial" w:eastAsia="Arial" w:hAnsi="Arial"/>
+                <w:color w:val="15202B"/>
+                <w:sz w:val="18"/>
+                <w:szCs w:val="18"/>
+              </w:rPr>
+              <w:t xml:space="preserve">☐ Fail</w:t>
+            </w:r>
+          </w:p>
+        </w:tc>
+        <w:tc>
+          <w:tcPr>
+            <w:tcW w:type="dxa" w:w="1206"/>
+            <w:tcBorders>
+              <w:top w:val="single" w:color="B9D7F2" w:sz="4"/>
+              <w:left w:val="single" w:color="B9D7F2" w:sz="4"/>
+              <w:bottom w:val="single" w:color="B9D7F2" w:sz="4"/>
+              <w:right w:val="single" w:color="B9D7F2" w:sz="4"/>
+            </w:tcBorders>
+            <w:tcMar>
+              <w:top w:type="dxa" w:w="60"/>
+              <w:left w:type="dxa" w:w="90"/>
+              <w:bottom w:type="dxa" w:w="60"/>
+              <w:right w:type="dxa" w:w="90"/>
+            </w:tcMar>
+          </w:tcPr>
+          <w:p>
+            <w:pPr>
+              <w:spacing w:after="0" w:before="0"/>
+            </w:pPr>
+            <w:r>
+              <w:rPr>
+                <w:rFonts w:ascii="Arial" w:cs="Arial" w:eastAsia="Arial" w:hAnsi="Arial"/>
+                <w:color w:val="15202B"/>
+                <w:sz w:val="18"/>
+                <w:szCs w:val="18"/>
+              </w:rPr>
+              <w:t xml:space="preserve"/>
+            </w:r>
+          </w:p>
+        </w:tc>
+      </w:tr>
+      <w:tr>
+        <w:trPr>
+          <w:cantSplit/>
+        </w:trPr>
+        <w:tc>
+          <w:tcPr>
+            <w:tcW w:type="dxa" w:w="640"/>
+            <w:tcBorders>
+              <w:top w:val="single" w:color="B9D7F2" w:sz="4"/>
+              <w:left w:val="single" w:color="B9D7F2" w:sz="4"/>
+              <w:bottom w:val="single" w:color="B9D7F2" w:sz="4"/>
+              <w:right w:val="single" w:color="B9D7F2" w:sz="4"/>
+            </w:tcBorders>
+            <w:shd w:fill="EAF4FD" w:color="auto" w:val="clear"/>
+            <w:tcMar>
+              <w:top w:type="dxa" w:w="60"/>
+              <w:left w:type="dxa" w:w="90"/>
+              <w:bottom w:type="dxa" w:w="60"/>
+              <w:right w:type="dxa" w:w="90"/>
+            </w:tcMar>
+          </w:tcPr>
+          <w:p>
+            <w:pPr>
+              <w:spacing w:after="0" w:before="0"/>
+            </w:pPr>
+            <w:r>
+              <w:rPr>
+                <w:rFonts w:ascii="Arial" w:cs="Arial" w:eastAsia="Arial" w:hAnsi="Arial"/>
+                <w:color w:val="15202B"/>
+                <w:sz w:val="18"/>
+                <w:szCs w:val="18"/>
+              </w:rPr>
+              <w:t xml:space="preserve">28.6</w:t>
+            </w:r>
+          </w:p>
+        </w:tc>
+        <w:tc>
+          <w:tcPr>
+            <w:tcW w:type="dxa" w:w="3820"/>
+            <w:tcBorders>
+              <w:top w:val="single" w:color="B9D7F2" w:sz="4"/>
+              <w:left w:val="single" w:color="B9D7F2" w:sz="4"/>
+              <w:bottom w:val="single" w:color="B9D7F2" w:sz="4"/>
+              <w:right w:val="single" w:color="B9D7F2" w:sz="4"/>
+            </w:tcBorders>
+            <w:shd w:fill="EAF4FD" w:color="auto" w:val="clear"/>
+            <w:tcMar>
+              <w:top w:type="dxa" w:w="60"/>
+              <w:left w:type="dxa" w:w="90"/>
+              <w:bottom w:type="dxa" w:w="60"/>
+              <w:right w:type="dxa" w:w="90"/>
+            </w:tcMar>
+          </w:tcPr>
+          <w:p>
+            <w:pPr>
+              <w:spacing w:after="0" w:before="0"/>
+            </w:pPr>
+            <w:r>
+              <w:rPr>
+                <w:rFonts w:ascii="Arial" w:cs="Arial" w:eastAsia="Arial" w:hAnsi="Arial"/>
+                <w:color w:val="15202B"/>
+                <w:sz w:val="18"/>
+                <w:szCs w:val="18"/>
+              </w:rPr>
+              <w:t xml:space="preserve">Staff logs a delivery as Paid at station; it is delivered.</w:t>
+            </w:r>
+          </w:p>
+        </w:tc>
+        <w:tc>
+          <w:tcPr>
+            <w:tcW w:type="dxa" w:w="3900"/>
+            <w:tcBorders>
+              <w:top w:val="single" w:color="B9D7F2" w:sz="4"/>
+              <w:left w:val="single" w:color="B9D7F2" w:sz="4"/>
+              <w:bottom w:val="single" w:color="B9D7F2" w:sz="4"/>
+              <w:right w:val="single" w:color="B9D7F2" w:sz="4"/>
+            </w:tcBorders>
+            <w:shd w:fill="EAF4FD" w:color="auto" w:val="clear"/>
+            <w:tcMar>
+              <w:top w:type="dxa" w:w="60"/>
+              <w:left w:type="dxa" w:w="90"/>
+              <w:bottom w:type="dxa" w:w="60"/>
+              <w:right w:type="dxa" w:w="90"/>
+            </w:tcMar>
+          </w:tcPr>
+          <w:p>
+            <w:pPr>
+              <w:spacing w:after="0" w:before="0"/>
+            </w:pPr>
+            <w:r>
+              <w:rPr>
+                <w:rFonts w:ascii="Arial" w:cs="Arial" w:eastAsia="Arial" w:hAnsi="Arial"/>
+                <w:color w:val="15202B"/>
+                <w:sz w:val="18"/>
+                <w:szCs w:val="18"/>
+              </w:rPr>
+              <w:t xml:space="preserve">Delivered without the Paid/Unpaid question; tag "Delivered (Paid at station)".</w:t>
+            </w:r>
+          </w:p>
+        </w:tc>
+        <w:tc>
+          <w:tcPr>
+            <w:tcW w:type="dxa" w:w="900"/>
+            <w:tcBorders>
+              <w:top w:val="single" w:color="B9D7F2" w:sz="4"/>
+              <w:left w:val="single" w:color="B9D7F2" w:sz="4"/>
+              <w:bottom w:val="single" w:color="B9D7F2" w:sz="4"/>
+              <w:right w:val="single" w:color="B9D7F2" w:sz="4"/>
+            </w:tcBorders>
+            <w:shd w:fill="EAF4FD" w:color="auto" w:val="clear"/>
+            <w:tcMar>
+              <w:top w:type="dxa" w:w="60"/>
+              <w:left w:type="dxa" w:w="90"/>
+              <w:bottom w:type="dxa" w:w="60"/>
+              <w:right w:type="dxa" w:w="90"/>
+            </w:tcMar>
+          </w:tcPr>
+          <w:p>
+            <w:pPr>
+              <w:spacing w:after="0" w:before="0"/>
+            </w:pPr>
+            <w:r>
+              <w:rPr>
+                <w:rFonts w:ascii="Arial" w:cs="Arial" w:eastAsia="Arial" w:hAnsi="Arial"/>
+                <w:color w:val="15202B"/>
+                <w:sz w:val="18"/>
+                <w:szCs w:val="18"/>
+              </w:rPr>
+              <w:t xml:space="preserve">☐ Pass</w:t>
+            </w:r>
+          </w:p>
+          <w:p>
+            <w:pPr>
+              <w:spacing w:after="0" w:before="0"/>
+            </w:pPr>
+            <w:r>
+              <w:rPr>
+                <w:rFonts w:ascii="Arial" w:cs="Arial" w:eastAsia="Arial" w:hAnsi="Arial"/>
+                <w:color w:val="15202B"/>
+                <w:sz w:val="18"/>
+                <w:szCs w:val="18"/>
+              </w:rPr>
+              <w:t xml:space="preserve">☐ Fail</w:t>
+            </w:r>
+          </w:p>
+        </w:tc>
+        <w:tc>
+          <w:tcPr>
+            <w:tcW w:type="dxa" w:w="1206"/>
+            <w:tcBorders>
+              <w:top w:val="single" w:color="B9D7F2" w:sz="4"/>
+              <w:left w:val="single" w:color="B9D7F2" w:sz="4"/>
+              <w:bottom w:val="single" w:color="B9D7F2" w:sz="4"/>
+              <w:right w:val="single" w:color="B9D7F2" w:sz="4"/>
+            </w:tcBorders>
+            <w:shd w:fill="EAF4FD" w:color="auto" w:val="clear"/>
+            <w:tcMar>
+              <w:top w:type="dxa" w:w="60"/>
+              <w:left w:type="dxa" w:w="90"/>
+              <w:bottom w:type="dxa" w:w="60"/>
+              <w:right w:type="dxa" w:w="90"/>
+            </w:tcMar>
+          </w:tcPr>
+          <w:p>
+            <w:pPr>
+              <w:spacing w:after="0" w:before="0"/>
+            </w:pPr>
+            <w:r>
+              <w:rPr>
+                <w:rFonts w:ascii="Arial" w:cs="Arial" w:eastAsia="Arial" w:hAnsi="Arial"/>
+                <w:color w:val="15202B"/>
+                <w:sz w:val="18"/>
+                <w:szCs w:val="18"/>
+              </w:rPr>
+              <w:t xml:space="preserve"/>
+            </w:r>
+          </w:p>
+        </w:tc>
+      </w:tr>
+    </w:tbl>
+    <w:p>
+      <w:pPr>
+        <w:pStyle w:val="Heading1"/>
+        <w:pageBreakBefore/>
+        <w:spacing w:after="60"/>
+      </w:pPr>
+      <w:r>
+        <w:rPr>
+          <w:rFonts w:ascii="Arial" w:cs="Arial" w:eastAsia="Arial" w:hAnsi="Arial"/>
+          <w:b/>
+          <w:bCs/>
+          <w:color w:val="0A84E0"/>
+          <w:sz w:val="28"/>
+          <w:szCs w:val="28"/>
+        </w:rPr>
+        <w:t xml:space="preserve">Step 29 · Daily sales report</w:t>
+      </w:r>
+    </w:p>
+    <w:p>
+      <w:pPr>
+        <w:spacing w:after="60" w:before="0"/>
+      </w:pPr>
+      <w:r>
+        <w:rPr>
+          <w:rFonts w:ascii="Arial" w:cs="Arial" w:eastAsia="Arial" w:hAnsi="Arial"/>
+          <w:b/>
+          <w:bCs/>
+          <w:color w:val="15202B"/>
+          <w:sz w:val="19"/>
+          <w:szCs w:val="19"/>
+        </w:rPr>
+        <w:t xml:space="preserve">Screens: </w:t>
+      </w:r>
+      <w:r>
+        <w:rPr>
+          <w:rFonts w:ascii="Arial" w:cs="Arial" w:eastAsia="Arial" w:hAnsi="Arial"/>
+          <w:color w:val="15202B"/>
+          <w:sz w:val="19"/>
+          <w:szCs w:val="19"/>
+        </w:rPr>
+        <w:t xml:space="preserve">Admin Sales 1</w:t>
+      </w:r>
+      <w:r>
+        <w:rPr>
+          <w:rFonts w:ascii="Arial" w:cs="Arial" w:eastAsia="Arial" w:hAnsi="Arial"/>
+          <w:b/>
+          <w:bCs/>
+          <w:color w:val="15202B"/>
+          <w:sz w:val="19"/>
+          <w:szCs w:val="19"/>
+        </w:rPr>
+        <w:t xml:space="preserve">    Log in as: </w:t>
+      </w:r>
+      <w:r>
+        <w:rPr>
+          <w:rFonts w:ascii="Arial" w:cs="Arial" w:eastAsia="Arial" w:hAnsi="Arial"/>
+          <w:color w:val="15202B"/>
+          <w:sz w:val="19"/>
+          <w:szCs w:val="19"/>
+        </w:rPr>
+        <w:t xml:space="preserve">Owner</w:t>
+      </w:r>
+    </w:p>
+    <w:tbl>
+      <w:tblPr>
+        <w:tblW w:type="dxa" w:w="10466"/>
+        <w:tblBorders>
+          <w:top w:val="single" w:color="auto" w:sz="4"/>
+          <w:left w:val="single" w:color="auto" w:sz="4"/>
+          <w:bottom w:val="single" w:color="auto" w:sz="4"/>
+          <w:right w:val="single" w:color="auto" w:sz="4"/>
+          <w:insideH w:val="single" w:color="auto" w:sz="4"/>
+          <w:insideV w:val="single" w:color="auto" w:sz="4"/>
+        </w:tblBorders>
+        <w:tblLayout w:type="fixed"/>
+      </w:tblPr>
+      <w:tblGrid>
+        <w:gridCol w:w="640"/>
+        <w:gridCol w:w="3820"/>
+        <w:gridCol w:w="3900"/>
+        <w:gridCol w:w="900"/>
+        <w:gridCol w:w="1206"/>
+      </w:tblGrid>
+      <w:tr>
+        <w:trPr>
+          <w:tblHeader/>
+        </w:trPr>
+        <w:tc>
+          <w:tcPr>
+            <w:tcW w:type="dxa" w:w="640"/>
+            <w:tcBorders>
+              <w:top w:val="single" w:color="B9D7F2" w:sz="4"/>
+              <w:left w:val="single" w:color="B9D7F2" w:sz="4"/>
+              <w:bottom w:val="single" w:color="B9D7F2" w:sz="4"/>
+              <w:right w:val="single" w:color="B9D7F2" w:sz="4"/>
+            </w:tcBorders>
+            <w:shd w:fill="0A84E0" w:color="auto" w:val="clear"/>
+            <w:tcMar>
+              <w:top w:type="dxa" w:w="60"/>
+              <w:left w:type="dxa" w:w="90"/>
+              <w:bottom w:type="dxa" w:w="60"/>
+              <w:right w:type="dxa" w:w="90"/>
+            </w:tcMar>
+          </w:tcPr>
+          <w:p>
+            <w:pPr>
+              <w:spacing w:after="0" w:before="0"/>
+            </w:pPr>
+            <w:r>
+              <w:rPr>
+                <w:rFonts w:ascii="Arial" w:cs="Arial" w:eastAsia="Arial" w:hAnsi="Arial"/>
+                <w:b/>
+                <w:bCs/>
+                <w:color w:val="FFFFFF"/>
+                <w:sz w:val="18"/>
+                <w:szCs w:val="18"/>
+              </w:rPr>
+              <w:t xml:space="preserve">#</w:t>
+            </w:r>
+          </w:p>
+        </w:tc>
+        <w:tc>
+          <w:tcPr>
+            <w:tcW w:type="dxa" w:w="3820"/>
+            <w:tcBorders>
+              <w:top w:val="single" w:color="B9D7F2" w:sz="4"/>
+              <w:left w:val="single" w:color="B9D7F2" w:sz="4"/>
+              <w:bottom w:val="single" w:color="B9D7F2" w:sz="4"/>
+              <w:right w:val="single" w:color="B9D7F2" w:sz="4"/>
+            </w:tcBorders>
+            <w:shd w:fill="0A84E0" w:color="auto" w:val="clear"/>
+            <w:tcMar>
+              <w:top w:type="dxa" w:w="60"/>
+              <w:left w:type="dxa" w:w="90"/>
+              <w:bottom w:type="dxa" w:w="60"/>
+              <w:right w:type="dxa" w:w="90"/>
+            </w:tcMar>
+          </w:tcPr>
+          <w:p>
+            <w:pPr>
+              <w:spacing w:after="0" w:before="0"/>
+            </w:pPr>
+            <w:r>
+              <w:rPr>
+                <w:rFonts w:ascii="Arial" w:cs="Arial" w:eastAsia="Arial" w:hAnsi="Arial"/>
+                <w:b/>
+                <w:bCs/>
+                <w:color w:val="FFFFFF"/>
+                <w:sz w:val="18"/>
+                <w:szCs w:val="18"/>
+              </w:rPr>
+              <w:t xml:space="preserve">What to do</w:t>
+            </w:r>
+          </w:p>
+        </w:tc>
+        <w:tc>
+          <w:tcPr>
+            <w:tcW w:type="dxa" w:w="3900"/>
+            <w:tcBorders>
+              <w:top w:val="single" w:color="B9D7F2" w:sz="4"/>
+              <w:left w:val="single" w:color="B9D7F2" w:sz="4"/>
+              <w:bottom w:val="single" w:color="B9D7F2" w:sz="4"/>
+              <w:right w:val="single" w:color="B9D7F2" w:sz="4"/>
+            </w:tcBorders>
+            <w:shd w:fill="0A84E0" w:color="auto" w:val="clear"/>
+            <w:tcMar>
+              <w:top w:type="dxa" w:w="60"/>
+              <w:left w:type="dxa" w:w="90"/>
+              <w:bottom w:type="dxa" w:w="60"/>
+              <w:right w:type="dxa" w:w="90"/>
+            </w:tcMar>
+          </w:tcPr>
+          <w:p>
+            <w:pPr>
+              <w:spacing w:after="0" w:before="0"/>
+            </w:pPr>
+            <w:r>
+              <w:rPr>
+                <w:rFonts w:ascii="Arial" w:cs="Arial" w:eastAsia="Arial" w:hAnsi="Arial"/>
+                <w:b/>
+                <w:bCs/>
+                <w:color w:val="FFFFFF"/>
+                <w:sz w:val="18"/>
+                <w:szCs w:val="18"/>
+              </w:rPr>
+              <w:t xml:space="preserve">What you should see</w:t>
+            </w:r>
+          </w:p>
+        </w:tc>
+        <w:tc>
+          <w:tcPr>
+            <w:tcW w:type="dxa" w:w="900"/>
+            <w:tcBorders>
+              <w:top w:val="single" w:color="B9D7F2" w:sz="4"/>
+              <w:left w:val="single" w:color="B9D7F2" w:sz="4"/>
+              <w:bottom w:val="single" w:color="B9D7F2" w:sz="4"/>
+              <w:right w:val="single" w:color="B9D7F2" w:sz="4"/>
+            </w:tcBorders>
+            <w:shd w:fill="0A84E0" w:color="auto" w:val="clear"/>
+            <w:tcMar>
+              <w:top w:type="dxa" w:w="60"/>
+              <w:left w:type="dxa" w:w="90"/>
+              <w:bottom w:type="dxa" w:w="60"/>
+              <w:right w:type="dxa" w:w="90"/>
+            </w:tcMar>
+          </w:tcPr>
+          <w:p>
+            <w:pPr>
+              <w:spacing w:after="0" w:before="0"/>
+            </w:pPr>
+            <w:r>
+              <w:rPr>
+                <w:rFonts w:ascii="Arial" w:cs="Arial" w:eastAsia="Arial" w:hAnsi="Arial"/>
+                <w:b/>
+                <w:bCs/>
+                <w:color w:val="FFFFFF"/>
+                <w:sz w:val="18"/>
+                <w:szCs w:val="18"/>
+              </w:rPr>
+              <w:t xml:space="preserve">Result</w:t>
+            </w:r>
+          </w:p>
+        </w:tc>
+        <w:tc>
+          <w:tcPr>
+            <w:tcW w:type="dxa" w:w="1206"/>
+            <w:tcBorders>
+              <w:top w:val="single" w:color="B9D7F2" w:sz="4"/>
+              <w:left w:val="single" w:color="B9D7F2" w:sz="4"/>
+              <w:bottom w:val="single" w:color="B9D7F2" w:sz="4"/>
+              <w:right w:val="single" w:color="B9D7F2" w:sz="4"/>
+            </w:tcBorders>
+            <w:shd w:fill="0A84E0" w:color="auto" w:val="clear"/>
+            <w:tcMar>
+              <w:top w:type="dxa" w:w="60"/>
+              <w:left w:type="dxa" w:w="90"/>
+              <w:bottom w:type="dxa" w:w="60"/>
+              <w:right w:type="dxa" w:w="90"/>
+            </w:tcMar>
+          </w:tcPr>
+          <w:p>
+            <w:pPr>
+              <w:spacing w:after="0" w:before="0"/>
+            </w:pPr>
+            <w:r>
+              <w:rPr>
+                <w:rFonts w:ascii="Arial" w:cs="Arial" w:eastAsia="Arial" w:hAnsi="Arial"/>
+                <w:b/>
+                <w:bCs/>
+                <w:color w:val="FFFFFF"/>
+                <w:sz w:val="18"/>
+                <w:szCs w:val="18"/>
+              </w:rPr>
+              <w:t xml:space="preserve">Notes</w:t>
+            </w:r>
+          </w:p>
+        </w:tc>
+      </w:tr>
+      <w:tr>
+        <w:trPr>
+          <w:cantSplit/>
+        </w:trPr>
+        <w:tc>
+          <w:tcPr>
+            <w:tcW w:type="dxa" w:w="640"/>
+            <w:tcBorders>
+              <w:top w:val="single" w:color="B9D7F2" w:sz="4"/>
+              <w:left w:val="single" w:color="B9D7F2" w:sz="4"/>
+              <w:bottom w:val="single" w:color="B9D7F2" w:sz="4"/>
+              <w:right w:val="single" w:color="B9D7F2" w:sz="4"/>
+            </w:tcBorders>
+            <w:tcMar>
+              <w:top w:type="dxa" w:w="60"/>
+              <w:left w:type="dxa" w:w="90"/>
+              <w:bottom w:type="dxa" w:w="60"/>
+              <w:right w:type="dxa" w:w="90"/>
+            </w:tcMar>
+          </w:tcPr>
+          <w:p>
+            <w:pPr>
+              <w:spacing w:after="0" w:before="0"/>
+            </w:pPr>
+            <w:r>
+              <w:rPr>
+                <w:rFonts w:ascii="Arial" w:cs="Arial" w:eastAsia="Arial" w:hAnsi="Arial"/>
+                <w:color w:val="15202B"/>
+                <w:sz w:val="18"/>
+                <w:szCs w:val="18"/>
+              </w:rPr>
+              <w:t xml:space="preserve">29.1</w:t>
+            </w:r>
+          </w:p>
+        </w:tc>
+        <w:tc>
+          <w:tcPr>
+            <w:tcW w:type="dxa" w:w="3820"/>
+            <w:tcBorders>
+              <w:top w:val="single" w:color="B9D7F2" w:sz="4"/>
+              <w:left w:val="single" w:color="B9D7F2" w:sz="4"/>
+              <w:bottom w:val="single" w:color="B9D7F2" w:sz="4"/>
+              <w:right w:val="single" w:color="B9D7F2" w:sz="4"/>
+            </w:tcBorders>
+            <w:tcMar>
+              <w:top w:type="dxa" w:w="60"/>
+              <w:left w:type="dxa" w:w="90"/>
+              <w:bottom w:type="dxa" w:w="60"/>
+              <w:right w:type="dxa" w:w="90"/>
+            </w:tcMar>
+          </w:tcPr>
+          <w:p>
+            <w:pPr>
+              <w:spacing w:after="0" w:before="0"/>
+            </w:pPr>
+            <w:r>
+              <w:rPr>
+                <w:rFonts w:ascii="Arial" w:cs="Arial" w:eastAsia="Arial" w:hAnsi="Arial"/>
+                <w:color w:val="15202B"/>
+                <w:sz w:val="18"/>
+                <w:szCs w:val="18"/>
+              </w:rPr>
+              <w:t xml:space="preserve">Sales tab.</w:t>
+            </w:r>
+          </w:p>
+        </w:tc>
+        <w:tc>
+          <w:tcPr>
+            <w:tcW w:type="dxa" w:w="3900"/>
+            <w:tcBorders>
+              <w:top w:val="single" w:color="B9D7F2" w:sz="4"/>
+              <w:left w:val="single" w:color="B9D7F2" w:sz="4"/>
+              <w:bottom w:val="single" w:color="B9D7F2" w:sz="4"/>
+              <w:right w:val="single" w:color="B9D7F2" w:sz="4"/>
+            </w:tcBorders>
+            <w:tcMar>
+              <w:top w:type="dxa" w:w="60"/>
+              <w:left w:type="dxa" w:w="90"/>
+              <w:bottom w:type="dxa" w:w="60"/>
+              <w:right w:type="dxa" w:w="90"/>
+            </w:tcMar>
+          </w:tcPr>
+          <w:p>
+            <w:pPr>
+              <w:spacing w:after="0" w:before="0"/>
+            </w:pPr>
+            <w:r>
+              <w:rPr>
+                <w:rFonts w:ascii="Arial" w:cs="Arial" w:eastAsia="Arial" w:hAnsi="Arial"/>
+                <w:color w:val="15202B"/>
+                <w:sz w:val="18"/>
+                <w:szCs w:val="18"/>
+              </w:rPr>
+              <w:t xml:space="preserve">Daily selected; today's date; Money earned (blue box); Unpaid, Gallons processed, Packages sold, Delivery vs walk-in, Rider paid, Orders completed; Orders list; Export.</w:t>
+            </w:r>
+          </w:p>
+        </w:tc>
+        <w:tc>
+          <w:tcPr>
+            <w:tcW w:type="dxa" w:w="900"/>
+            <w:tcBorders>
+              <w:top w:val="single" w:color="B9D7F2" w:sz="4"/>
+              <w:left w:val="single" w:color="B9D7F2" w:sz="4"/>
+              <w:bottom w:val="single" w:color="B9D7F2" w:sz="4"/>
+              <w:right w:val="single" w:color="B9D7F2" w:sz="4"/>
+            </w:tcBorders>
+            <w:tcMar>
+              <w:top w:type="dxa" w:w="60"/>
+              <w:left w:type="dxa" w:w="90"/>
+              <w:bottom w:type="dxa" w:w="60"/>
+              <w:right w:type="dxa" w:w="90"/>
+            </w:tcMar>
+          </w:tcPr>
+          <w:p>
+            <w:pPr>
+              <w:spacing w:after="0" w:before="0"/>
+            </w:pPr>
+            <w:r>
+              <w:rPr>
+                <w:rFonts w:ascii="Arial" w:cs="Arial" w:eastAsia="Arial" w:hAnsi="Arial"/>
+                <w:color w:val="15202B"/>
+                <w:sz w:val="18"/>
+                <w:szCs w:val="18"/>
+              </w:rPr>
+              <w:t xml:space="preserve">☐ Pass</w:t>
+            </w:r>
+          </w:p>
+          <w:p>
+            <w:pPr>
+              <w:spacing w:after="0" w:before="0"/>
+            </w:pPr>
+            <w:r>
+              <w:rPr>
+                <w:rFonts w:ascii="Arial" w:cs="Arial" w:eastAsia="Arial" w:hAnsi="Arial"/>
+                <w:color w:val="15202B"/>
+                <w:sz w:val="18"/>
+                <w:szCs w:val="18"/>
+              </w:rPr>
+              <w:t xml:space="preserve">☐ Fail</w:t>
+            </w:r>
+          </w:p>
+        </w:tc>
+        <w:tc>
+          <w:tcPr>
+            <w:tcW w:type="dxa" w:w="1206"/>
+            <w:tcBorders>
+              <w:top w:val="single" w:color="B9D7F2" w:sz="4"/>
+              <w:left w:val="single" w:color="B9D7F2" w:sz="4"/>
+              <w:bottom w:val="single" w:color="B9D7F2" w:sz="4"/>
+              <w:right w:val="single" w:color="B9D7F2" w:sz="4"/>
+            </w:tcBorders>
+            <w:tcMar>
+              <w:top w:type="dxa" w:w="60"/>
+              <w:left w:type="dxa" w:w="90"/>
+              <w:bottom w:type="dxa" w:w="60"/>
+              <w:right w:type="dxa" w:w="90"/>
+            </w:tcMar>
+          </w:tcPr>
+          <w:p>
+            <w:pPr>
+              <w:spacing w:after="0" w:before="0"/>
+            </w:pPr>
+            <w:r>
+              <w:rPr>
+                <w:rFonts w:ascii="Arial" w:cs="Arial" w:eastAsia="Arial" w:hAnsi="Arial"/>
+                <w:color w:val="15202B"/>
+                <w:sz w:val="18"/>
+                <w:szCs w:val="18"/>
+              </w:rPr>
+              <w:t xml:space="preserve"/>
+            </w:r>
+          </w:p>
+        </w:tc>
+      </w:tr>
+      <w:tr>
+        <w:trPr>
+          <w:cantSplit/>
+        </w:trPr>
+        <w:tc>
+          <w:tcPr>
+            <w:tcW w:type="dxa" w:w="640"/>
+            <w:tcBorders>
+              <w:top w:val="single" w:color="B9D7F2" w:sz="4"/>
+              <w:left w:val="single" w:color="B9D7F2" w:sz="4"/>
+              <w:bottom w:val="single" w:color="B9D7F2" w:sz="4"/>
+              <w:right w:val="single" w:color="B9D7F2" w:sz="4"/>
+            </w:tcBorders>
+            <w:shd w:fill="EAF4FD" w:color="auto" w:val="clear"/>
+            <w:tcMar>
+              <w:top w:type="dxa" w:w="60"/>
+              <w:left w:type="dxa" w:w="90"/>
+              <w:bottom w:type="dxa" w:w="60"/>
+              <w:right w:type="dxa" w:w="90"/>
+            </w:tcMar>
+          </w:tcPr>
+          <w:p>
+            <w:pPr>
+              <w:spacing w:after="0" w:before="0"/>
+            </w:pPr>
+            <w:r>
+              <w:rPr>
+                <w:rFonts w:ascii="Arial" w:cs="Arial" w:eastAsia="Arial" w:hAnsi="Arial"/>
+                <w:color w:val="15202B"/>
+                <w:sz w:val="18"/>
+                <w:szCs w:val="18"/>
+              </w:rPr>
+              <w:t xml:space="preserve">29.2</w:t>
+            </w:r>
+          </w:p>
+        </w:tc>
+        <w:tc>
+          <w:tcPr>
+            <w:tcW w:type="dxa" w:w="3820"/>
+            <w:tcBorders>
+              <w:top w:val="single" w:color="B9D7F2" w:sz="4"/>
+              <w:left w:val="single" w:color="B9D7F2" w:sz="4"/>
+              <w:bottom w:val="single" w:color="B9D7F2" w:sz="4"/>
+              <w:right w:val="single" w:color="B9D7F2" w:sz="4"/>
+            </w:tcBorders>
+            <w:shd w:fill="EAF4FD" w:color="auto" w:val="clear"/>
+            <w:tcMar>
+              <w:top w:type="dxa" w:w="60"/>
+              <w:left w:type="dxa" w:w="90"/>
+              <w:bottom w:type="dxa" w:w="60"/>
+              <w:right w:type="dxa" w:w="90"/>
+            </w:tcMar>
+          </w:tcPr>
+          <w:p>
+            <w:pPr>
+              <w:spacing w:after="0" w:before="0"/>
+            </w:pPr>
+            <w:r>
+              <w:rPr>
+                <w:rFonts w:ascii="Arial" w:cs="Arial" w:eastAsia="Arial" w:hAnsi="Arial"/>
+                <w:color w:val="15202B"/>
+                <w:sz w:val="18"/>
+                <w:szCs w:val="18"/>
+              </w:rPr>
+              <w:t xml:space="preserve">Compare with what you did today.</w:t>
+            </w:r>
+          </w:p>
+        </w:tc>
+        <w:tc>
+          <w:tcPr>
+            <w:tcW w:type="dxa" w:w="3900"/>
+            <w:tcBorders>
+              <w:top w:val="single" w:color="B9D7F2" w:sz="4"/>
+              <w:left w:val="single" w:color="B9D7F2" w:sz="4"/>
+              <w:bottom w:val="single" w:color="B9D7F2" w:sz="4"/>
+              <w:right w:val="single" w:color="B9D7F2" w:sz="4"/>
+            </w:tcBorders>
+            <w:shd w:fill="EAF4FD" w:color="auto" w:val="clear"/>
+            <w:tcMar>
+              <w:top w:type="dxa" w:w="60"/>
+              <w:left w:type="dxa" w:w="90"/>
+              <w:bottom w:type="dxa" w:w="60"/>
+              <w:right w:type="dxa" w:w="90"/>
+            </w:tcMar>
+          </w:tcPr>
+          <w:p>
+            <w:pPr>
+              <w:spacing w:after="0" w:before="0"/>
+            </w:pPr>
+            <w:r>
+              <w:rPr>
+                <w:rFonts w:ascii="Arial" w:cs="Arial" w:eastAsia="Arial" w:hAnsi="Arial"/>
+                <w:color w:val="15202B"/>
+                <w:sz w:val="18"/>
+                <w:szCs w:val="18"/>
+              </w:rPr>
+              <w:t xml:space="preserve">Money earned = payments received today; Gallons processed = walk-ins + orders sent out today; Delivery vs walk-in splits the gallons; Rider paid = cash collected on delivery.</w:t>
+            </w:r>
+          </w:p>
+        </w:tc>
+        <w:tc>
+          <w:tcPr>
+            <w:tcW w:type="dxa" w:w="900"/>
+            <w:tcBorders>
+              <w:top w:val="single" w:color="B9D7F2" w:sz="4"/>
+              <w:left w:val="single" w:color="B9D7F2" w:sz="4"/>
+              <w:bottom w:val="single" w:color="B9D7F2" w:sz="4"/>
+              <w:right w:val="single" w:color="B9D7F2" w:sz="4"/>
+            </w:tcBorders>
+            <w:shd w:fill="EAF4FD" w:color="auto" w:val="clear"/>
+            <w:tcMar>
+              <w:top w:type="dxa" w:w="60"/>
+              <w:left w:type="dxa" w:w="90"/>
+              <w:bottom w:type="dxa" w:w="60"/>
+              <w:right w:type="dxa" w:w="90"/>
+            </w:tcMar>
+          </w:tcPr>
+          <w:p>
+            <w:pPr>
+              <w:spacing w:after="0" w:before="0"/>
+            </w:pPr>
+            <w:r>
+              <w:rPr>
+                <w:rFonts w:ascii="Arial" w:cs="Arial" w:eastAsia="Arial" w:hAnsi="Arial"/>
+                <w:color w:val="15202B"/>
+                <w:sz w:val="18"/>
+                <w:szCs w:val="18"/>
+              </w:rPr>
+              <w:t xml:space="preserve">☐ Pass</w:t>
+            </w:r>
+          </w:p>
+          <w:p>
+            <w:pPr>
+              <w:spacing w:after="0" w:before="0"/>
+            </w:pPr>
+            <w:r>
+              <w:rPr>
+                <w:rFonts w:ascii="Arial" w:cs="Arial" w:eastAsia="Arial" w:hAnsi="Arial"/>
+                <w:color w:val="15202B"/>
+                <w:sz w:val="18"/>
+                <w:szCs w:val="18"/>
+              </w:rPr>
+              <w:t xml:space="preserve">☐ Fail</w:t>
+            </w:r>
+          </w:p>
+        </w:tc>
+        <w:tc>
+          <w:tcPr>
+            <w:tcW w:type="dxa" w:w="1206"/>
+            <w:tcBorders>
+              <w:top w:val="single" w:color="B9D7F2" w:sz="4"/>
+              <w:left w:val="single" w:color="B9D7F2" w:sz="4"/>
+              <w:bottom w:val="single" w:color="B9D7F2" w:sz="4"/>
+              <w:right w:val="single" w:color="B9D7F2" w:sz="4"/>
+            </w:tcBorders>
+            <w:shd w:fill="EAF4FD" w:color="auto" w:val="clear"/>
+            <w:tcMar>
+              <w:top w:type="dxa" w:w="60"/>
+              <w:left w:type="dxa" w:w="90"/>
+              <w:bottom w:type="dxa" w:w="60"/>
+              <w:right w:type="dxa" w:w="90"/>
+            </w:tcMar>
+          </w:tcPr>
+          <w:p>
+            <w:pPr>
+              <w:spacing w:after="0" w:before="0"/>
+            </w:pPr>
+            <w:r>
+              <w:rPr>
+                <w:rFonts w:ascii="Arial" w:cs="Arial" w:eastAsia="Arial" w:hAnsi="Arial"/>
+                <w:color w:val="15202B"/>
+                <w:sz w:val="18"/>
+                <w:szCs w:val="18"/>
+              </w:rPr>
+              <w:t xml:space="preserve"/>
+            </w:r>
+          </w:p>
+        </w:tc>
+      </w:tr>
+      <w:tr>
+        <w:trPr>
+          <w:cantSplit/>
+        </w:trPr>
+        <w:tc>
+          <w:tcPr>
+            <w:tcW w:type="dxa" w:w="640"/>
+            <w:tcBorders>
+              <w:top w:val="single" w:color="B9D7F2" w:sz="4"/>
+              <w:left w:val="single" w:color="B9D7F2" w:sz="4"/>
+              <w:bottom w:val="single" w:color="B9D7F2" w:sz="4"/>
+              <w:right w:val="single" w:color="B9D7F2" w:sz="4"/>
+            </w:tcBorders>
+            <w:tcMar>
+              <w:top w:type="dxa" w:w="60"/>
+              <w:left w:type="dxa" w:w="90"/>
+              <w:bottom w:type="dxa" w:w="60"/>
+              <w:right w:type="dxa" w:w="90"/>
+            </w:tcMar>
+          </w:tcPr>
+          <w:p>
+            <w:pPr>
+              <w:spacing w:after="0" w:before="0"/>
+            </w:pPr>
+            <w:r>
+              <w:rPr>
+                <w:rFonts w:ascii="Arial" w:cs="Arial" w:eastAsia="Arial" w:hAnsi="Arial"/>
+                <w:color w:val="15202B"/>
+                <w:sz w:val="18"/>
+                <w:szCs w:val="18"/>
+              </w:rPr>
+              <w:t xml:space="preserve">29.3</w:t>
+            </w:r>
+          </w:p>
+        </w:tc>
+        <w:tc>
+          <w:tcPr>
+            <w:tcW w:type="dxa" w:w="3820"/>
+            <w:tcBorders>
+              <w:top w:val="single" w:color="B9D7F2" w:sz="4"/>
+              <w:left w:val="single" w:color="B9D7F2" w:sz="4"/>
+              <w:bottom w:val="single" w:color="B9D7F2" w:sz="4"/>
+              <w:right w:val="single" w:color="B9D7F2" w:sz="4"/>
+            </w:tcBorders>
+            <w:tcMar>
+              <w:top w:type="dxa" w:w="60"/>
+              <w:left w:type="dxa" w:w="90"/>
+              <w:bottom w:type="dxa" w:w="60"/>
+              <w:right w:type="dxa" w:w="90"/>
+            </w:tcMar>
+          </w:tcPr>
+          <w:p>
+            <w:pPr>
+              <w:spacing w:after="0" w:before="0"/>
+            </w:pPr>
+            <w:r>
+              <w:rPr>
+                <w:rFonts w:ascii="Arial" w:cs="Arial" w:eastAsia="Arial" w:hAnsi="Arial"/>
+                <w:color w:val="15202B"/>
+                <w:sz w:val="18"/>
+                <w:szCs w:val="18"/>
+              </w:rPr>
+              <w:t xml:space="preserve">Tap the left arrow.</w:t>
+            </w:r>
+          </w:p>
+        </w:tc>
+        <w:tc>
+          <w:tcPr>
+            <w:tcW w:type="dxa" w:w="3900"/>
+            <w:tcBorders>
+              <w:top w:val="single" w:color="B9D7F2" w:sz="4"/>
+              <w:left w:val="single" w:color="B9D7F2" w:sz="4"/>
+              <w:bottom w:val="single" w:color="B9D7F2" w:sz="4"/>
+              <w:right w:val="single" w:color="B9D7F2" w:sz="4"/>
+            </w:tcBorders>
+            <w:tcMar>
+              <w:top w:type="dxa" w:w="60"/>
+              <w:left w:type="dxa" w:w="90"/>
+              <w:bottom w:type="dxa" w:w="60"/>
+              <w:right w:type="dxa" w:w="90"/>
+            </w:tcMar>
+          </w:tcPr>
+          <w:p>
+            <w:pPr>
+              <w:spacing w:after="0" w:before="0"/>
+            </w:pPr>
+            <w:r>
+              <w:rPr>
+                <w:rFonts w:ascii="Arial" w:cs="Arial" w:eastAsia="Arial" w:hAnsi="Arial"/>
+                <w:color w:val="15202B"/>
+                <w:sz w:val="18"/>
+                <w:szCs w:val="18"/>
+              </w:rPr>
+              <w:t xml:space="preserve">Report for the day before (empty after a reset: ₱0 and "No completed orders on this day").</w:t>
+            </w:r>
+          </w:p>
+        </w:tc>
+        <w:tc>
+          <w:tcPr>
+            <w:tcW w:type="dxa" w:w="900"/>
+            <w:tcBorders>
+              <w:top w:val="single" w:color="B9D7F2" w:sz="4"/>
+              <w:left w:val="single" w:color="B9D7F2" w:sz="4"/>
+              <w:bottom w:val="single" w:color="B9D7F2" w:sz="4"/>
+              <w:right w:val="single" w:color="B9D7F2" w:sz="4"/>
+            </w:tcBorders>
+            <w:tcMar>
+              <w:top w:type="dxa" w:w="60"/>
+              <w:left w:type="dxa" w:w="90"/>
+              <w:bottom w:type="dxa" w:w="60"/>
+              <w:right w:type="dxa" w:w="90"/>
+            </w:tcMar>
+          </w:tcPr>
+          <w:p>
+            <w:pPr>
+              <w:spacing w:after="0" w:before="0"/>
+            </w:pPr>
+            <w:r>
+              <w:rPr>
+                <w:rFonts w:ascii="Arial" w:cs="Arial" w:eastAsia="Arial" w:hAnsi="Arial"/>
+                <w:color w:val="15202B"/>
+                <w:sz w:val="18"/>
+                <w:szCs w:val="18"/>
+              </w:rPr>
+              <w:t xml:space="preserve">☐ Pass</w:t>
+            </w:r>
+          </w:p>
+          <w:p>
+            <w:pPr>
+              <w:spacing w:after="0" w:before="0"/>
+            </w:pPr>
+            <w:r>
+              <w:rPr>
+                <w:rFonts w:ascii="Arial" w:cs="Arial" w:eastAsia="Arial" w:hAnsi="Arial"/>
+                <w:color w:val="15202B"/>
+                <w:sz w:val="18"/>
+                <w:szCs w:val="18"/>
+              </w:rPr>
+              <w:t xml:space="preserve">☐ Fail</w:t>
+            </w:r>
+          </w:p>
+        </w:tc>
+        <w:tc>
+          <w:tcPr>
+            <w:tcW w:type="dxa" w:w="1206"/>
+            <w:tcBorders>
+              <w:top w:val="single" w:color="B9D7F2" w:sz="4"/>
+              <w:left w:val="single" w:color="B9D7F2" w:sz="4"/>
+              <w:bottom w:val="single" w:color="B9D7F2" w:sz="4"/>
+              <w:right w:val="single" w:color="B9D7F2" w:sz="4"/>
+            </w:tcBorders>
+            <w:tcMar>
+              <w:top w:type="dxa" w:w="60"/>
+              <w:left w:type="dxa" w:w="90"/>
+              <w:bottom w:type="dxa" w:w="60"/>
+              <w:right w:type="dxa" w:w="90"/>
+            </w:tcMar>
+          </w:tcPr>
+          <w:p>
+            <w:pPr>
+              <w:spacing w:after="0" w:before="0"/>
+            </w:pPr>
+            <w:r>
+              <w:rPr>
+                <w:rFonts w:ascii="Arial" w:cs="Arial" w:eastAsia="Arial" w:hAnsi="Arial"/>
+                <w:color w:val="15202B"/>
+                <w:sz w:val="18"/>
+                <w:szCs w:val="18"/>
+              </w:rPr>
+              <w:t xml:space="preserve"/>
+            </w:r>
+          </w:p>
+        </w:tc>
+      </w:tr>
+      <w:tr>
+        <w:trPr>
+          <w:cantSplit/>
+        </w:trPr>
+        <w:tc>
+          <w:tcPr>
+            <w:tcW w:type="dxa" w:w="640"/>
+            <w:tcBorders>
+              <w:top w:val="single" w:color="B9D7F2" w:sz="4"/>
+              <w:left w:val="single" w:color="B9D7F2" w:sz="4"/>
+              <w:bottom w:val="single" w:color="B9D7F2" w:sz="4"/>
+              <w:right w:val="single" w:color="B9D7F2" w:sz="4"/>
+            </w:tcBorders>
+            <w:shd w:fill="EAF4FD" w:color="auto" w:val="clear"/>
+            <w:tcMar>
+              <w:top w:type="dxa" w:w="60"/>
+              <w:left w:type="dxa" w:w="90"/>
+              <w:bottom w:type="dxa" w:w="60"/>
+              <w:right w:type="dxa" w:w="90"/>
+            </w:tcMar>
+          </w:tcPr>
+          <w:p>
+            <w:pPr>
+              <w:spacing w:after="0" w:before="0"/>
+            </w:pPr>
+            <w:r>
+              <w:rPr>
+                <w:rFonts w:ascii="Arial" w:cs="Arial" w:eastAsia="Arial" w:hAnsi="Arial"/>
+                <w:color w:val="15202B"/>
+                <w:sz w:val="18"/>
+                <w:szCs w:val="18"/>
+              </w:rPr>
+              <w:t xml:space="preserve">29.4</w:t>
+            </w:r>
+          </w:p>
+        </w:tc>
+        <w:tc>
+          <w:tcPr>
+            <w:tcW w:type="dxa" w:w="3820"/>
+            <w:tcBorders>
+              <w:top w:val="single" w:color="B9D7F2" w:sz="4"/>
+              <w:left w:val="single" w:color="B9D7F2" w:sz="4"/>
+              <w:bottom w:val="single" w:color="B9D7F2" w:sz="4"/>
+              <w:right w:val="single" w:color="B9D7F2" w:sz="4"/>
+            </w:tcBorders>
+            <w:shd w:fill="EAF4FD" w:color="auto" w:val="clear"/>
+            <w:tcMar>
+              <w:top w:type="dxa" w:w="60"/>
+              <w:left w:type="dxa" w:w="90"/>
+              <w:bottom w:type="dxa" w:w="60"/>
+              <w:right w:type="dxa" w:w="90"/>
+            </w:tcMar>
+          </w:tcPr>
+          <w:p>
+            <w:pPr>
+              <w:spacing w:after="0" w:before="0"/>
+            </w:pPr>
+            <w:r>
+              <w:rPr>
+                <w:rFonts w:ascii="Arial" w:cs="Arial" w:eastAsia="Arial" w:hAnsi="Arial"/>
+                <w:color w:val="15202B"/>
+                <w:sz w:val="18"/>
+                <w:szCs w:val="18"/>
+              </w:rPr>
+              <w:t xml:space="preserve">Tap the date and pick a day; the right arrow is off on today.</w:t>
+            </w:r>
+          </w:p>
+        </w:tc>
+        <w:tc>
+          <w:tcPr>
+            <w:tcW w:type="dxa" w:w="3900"/>
+            <w:tcBorders>
+              <w:top w:val="single" w:color="B9D7F2" w:sz="4"/>
+              <w:left w:val="single" w:color="B9D7F2" w:sz="4"/>
+              <w:bottom w:val="single" w:color="B9D7F2" w:sz="4"/>
+              <w:right w:val="single" w:color="B9D7F2" w:sz="4"/>
+            </w:tcBorders>
+            <w:shd w:fill="EAF4FD" w:color="auto" w:val="clear"/>
+            <w:tcMar>
+              <w:top w:type="dxa" w:w="60"/>
+              <w:left w:type="dxa" w:w="90"/>
+              <w:bottom w:type="dxa" w:w="60"/>
+              <w:right w:type="dxa" w:w="90"/>
+            </w:tcMar>
+          </w:tcPr>
+          <w:p>
+            <w:pPr>
+              <w:spacing w:after="0" w:before="0"/>
+            </w:pPr>
+            <w:r>
+              <w:rPr>
+                <w:rFonts w:ascii="Arial" w:cs="Arial" w:eastAsia="Arial" w:hAnsi="Arial"/>
+                <w:color w:val="15202B"/>
+                <w:sz w:val="18"/>
+                <w:szCs w:val="18"/>
+              </w:rPr>
+              <w:t xml:space="preserve">Report for that day; you cannot go past today.</w:t>
+            </w:r>
+          </w:p>
+        </w:tc>
+        <w:tc>
+          <w:tcPr>
+            <w:tcW w:type="dxa" w:w="900"/>
+            <w:tcBorders>
+              <w:top w:val="single" w:color="B9D7F2" w:sz="4"/>
+              <w:left w:val="single" w:color="B9D7F2" w:sz="4"/>
+              <w:bottom w:val="single" w:color="B9D7F2" w:sz="4"/>
+              <w:right w:val="single" w:color="B9D7F2" w:sz="4"/>
+            </w:tcBorders>
+            <w:shd w:fill="EAF4FD" w:color="auto" w:val="clear"/>
+            <w:tcMar>
+              <w:top w:type="dxa" w:w="60"/>
+              <w:left w:type="dxa" w:w="90"/>
+              <w:bottom w:type="dxa" w:w="60"/>
+              <w:right w:type="dxa" w:w="90"/>
+            </w:tcMar>
+          </w:tcPr>
+          <w:p>
+            <w:pPr>
+              <w:spacing w:after="0" w:before="0"/>
+            </w:pPr>
+            <w:r>
+              <w:rPr>
+                <w:rFonts w:ascii="Arial" w:cs="Arial" w:eastAsia="Arial" w:hAnsi="Arial"/>
+                <w:color w:val="15202B"/>
+                <w:sz w:val="18"/>
+                <w:szCs w:val="18"/>
+              </w:rPr>
+              <w:t xml:space="preserve">☐ Pass</w:t>
+            </w:r>
+          </w:p>
+          <w:p>
+            <w:pPr>
+              <w:spacing w:after="0" w:before="0"/>
+            </w:pPr>
+            <w:r>
+              <w:rPr>
+                <w:rFonts w:ascii="Arial" w:cs="Arial" w:eastAsia="Arial" w:hAnsi="Arial"/>
+                <w:color w:val="15202B"/>
+                <w:sz w:val="18"/>
+                <w:szCs w:val="18"/>
+              </w:rPr>
+              <w:t xml:space="preserve">☐ Fail</w:t>
+            </w:r>
+          </w:p>
+        </w:tc>
+        <w:tc>
+          <w:tcPr>
+            <w:tcW w:type="dxa" w:w="1206"/>
+            <w:tcBorders>
+              <w:top w:val="single" w:color="B9D7F2" w:sz="4"/>
+              <w:left w:val="single" w:color="B9D7F2" w:sz="4"/>
+              <w:bottom w:val="single" w:color="B9D7F2" w:sz="4"/>
+              <w:right w:val="single" w:color="B9D7F2" w:sz="4"/>
+            </w:tcBorders>
+            <w:shd w:fill="EAF4FD" w:color="auto" w:val="clear"/>
+            <w:tcMar>
+              <w:top w:type="dxa" w:w="60"/>
+              <w:left w:type="dxa" w:w="90"/>
+              <w:bottom w:type="dxa" w:w="60"/>
+              <w:right w:type="dxa" w:w="90"/>
+            </w:tcMar>
+          </w:tcPr>
+          <w:p>
+            <w:pPr>
+              <w:spacing w:after="0" w:before="0"/>
+            </w:pPr>
+            <w:r>
+              <w:rPr>
+                <w:rFonts w:ascii="Arial" w:cs="Arial" w:eastAsia="Arial" w:hAnsi="Arial"/>
+                <w:color w:val="15202B"/>
+                <w:sz w:val="18"/>
+                <w:szCs w:val="18"/>
+              </w:rPr>
+              <w:t xml:space="preserve"/>
+            </w:r>
+          </w:p>
+        </w:tc>
+      </w:tr>
+      <w:tr>
+        <w:trPr>
+          <w:cantSplit/>
+        </w:trPr>
+        <w:tc>
+          <w:tcPr>
+            <w:tcW w:type="dxa" w:w="640"/>
+            <w:tcBorders>
+              <w:top w:val="single" w:color="B9D7F2" w:sz="4"/>
+              <w:left w:val="single" w:color="B9D7F2" w:sz="4"/>
+              <w:bottom w:val="single" w:color="B9D7F2" w:sz="4"/>
+              <w:right w:val="single" w:color="B9D7F2" w:sz="4"/>
+            </w:tcBorders>
+            <w:tcMar>
+              <w:top w:type="dxa" w:w="60"/>
+              <w:left w:type="dxa" w:w="90"/>
+              <w:bottom w:type="dxa" w:w="60"/>
+              <w:right w:type="dxa" w:w="90"/>
+            </w:tcMar>
+          </w:tcPr>
+          <w:p>
+            <w:pPr>
+              <w:spacing w:after="0" w:before="0"/>
+            </w:pPr>
+            <w:r>
+              <w:rPr>
+                <w:rFonts w:ascii="Arial" w:cs="Arial" w:eastAsia="Arial" w:hAnsi="Arial"/>
+                <w:color w:val="15202B"/>
+                <w:sz w:val="18"/>
+                <w:szCs w:val="18"/>
+              </w:rPr>
+              <w:t xml:space="preserve">29.5</w:t>
+            </w:r>
+          </w:p>
+        </w:tc>
+        <w:tc>
+          <w:tcPr>
+            <w:tcW w:type="dxa" w:w="3820"/>
+            <w:tcBorders>
+              <w:top w:val="single" w:color="B9D7F2" w:sz="4"/>
+              <w:left w:val="single" w:color="B9D7F2" w:sz="4"/>
+              <w:bottom w:val="single" w:color="B9D7F2" w:sz="4"/>
+              <w:right w:val="single" w:color="B9D7F2" w:sz="4"/>
+            </w:tcBorders>
+            <w:tcMar>
+              <w:top w:type="dxa" w:w="60"/>
+              <w:left w:type="dxa" w:w="90"/>
+              <w:bottom w:type="dxa" w:w="60"/>
+              <w:right w:type="dxa" w:w="90"/>
+            </w:tcMar>
+          </w:tcPr>
+          <w:p>
+            <w:pPr>
+              <w:spacing w:after="0" w:before="0"/>
+            </w:pPr>
+            <w:r>
+              <w:rPr>
+                <w:rFonts w:ascii="Arial" w:cs="Arial" w:eastAsia="Arial" w:hAnsi="Arial"/>
+                <w:color w:val="15202B"/>
+                <w:sz w:val="18"/>
+                <w:szCs w:val="18"/>
+              </w:rPr>
+              <w:t xml:space="preserve">Tap an order in the list.</w:t>
+            </w:r>
+          </w:p>
+        </w:tc>
+        <w:tc>
+          <w:tcPr>
+            <w:tcW w:type="dxa" w:w="3900"/>
+            <w:tcBorders>
+              <w:top w:val="single" w:color="B9D7F2" w:sz="4"/>
+              <w:left w:val="single" w:color="B9D7F2" w:sz="4"/>
+              <w:bottom w:val="single" w:color="B9D7F2" w:sz="4"/>
+              <w:right w:val="single" w:color="B9D7F2" w:sz="4"/>
+            </w:tcBorders>
+            <w:tcMar>
+              <w:top w:type="dxa" w:w="60"/>
+              <w:left w:type="dxa" w:w="90"/>
+              <w:bottom w:type="dxa" w:w="60"/>
+              <w:right w:type="dxa" w:w="90"/>
+            </w:tcMar>
+          </w:tcPr>
+          <w:p>
+            <w:pPr>
+              <w:spacing w:after="0" w:before="0"/>
+            </w:pPr>
+            <w:r>
+              <w:rPr>
+                <w:rFonts w:ascii="Arial" w:cs="Arial" w:eastAsia="Arial" w:hAnsi="Arial"/>
+                <w:color w:val="15202B"/>
+                <w:sz w:val="18"/>
+                <w:szCs w:val="18"/>
+              </w:rPr>
+              <w:t xml:space="preserve">Its Order Details opens.</w:t>
+            </w:r>
+          </w:p>
+        </w:tc>
+        <w:tc>
+          <w:tcPr>
+            <w:tcW w:type="dxa" w:w="900"/>
+            <w:tcBorders>
+              <w:top w:val="single" w:color="B9D7F2" w:sz="4"/>
+              <w:left w:val="single" w:color="B9D7F2" w:sz="4"/>
+              <w:bottom w:val="single" w:color="B9D7F2" w:sz="4"/>
+              <w:right w:val="single" w:color="B9D7F2" w:sz="4"/>
+            </w:tcBorders>
+            <w:tcMar>
+              <w:top w:type="dxa" w:w="60"/>
+              <w:left w:type="dxa" w:w="90"/>
+              <w:bottom w:type="dxa" w:w="60"/>
+              <w:right w:type="dxa" w:w="90"/>
+            </w:tcMar>
+          </w:tcPr>
+          <w:p>
+            <w:pPr>
+              <w:spacing w:after="0" w:before="0"/>
+            </w:pPr>
+            <w:r>
+              <w:rPr>
+                <w:rFonts w:ascii="Arial" w:cs="Arial" w:eastAsia="Arial" w:hAnsi="Arial"/>
+                <w:color w:val="15202B"/>
+                <w:sz w:val="18"/>
+                <w:szCs w:val="18"/>
+              </w:rPr>
+              <w:t xml:space="preserve">☐ Pass</w:t>
+            </w:r>
+          </w:p>
+          <w:p>
+            <w:pPr>
+              <w:spacing w:after="0" w:before="0"/>
+            </w:pPr>
+            <w:r>
+              <w:rPr>
+                <w:rFonts w:ascii="Arial" w:cs="Arial" w:eastAsia="Arial" w:hAnsi="Arial"/>
+                <w:color w:val="15202B"/>
+                <w:sz w:val="18"/>
+                <w:szCs w:val="18"/>
+              </w:rPr>
+              <w:t xml:space="preserve">☐ Fail</w:t>
+            </w:r>
+          </w:p>
+        </w:tc>
+        <w:tc>
+          <w:tcPr>
+            <w:tcW w:type="dxa" w:w="1206"/>
+            <w:tcBorders>
+              <w:top w:val="single" w:color="B9D7F2" w:sz="4"/>
+              <w:left w:val="single" w:color="B9D7F2" w:sz="4"/>
+              <w:bottom w:val="single" w:color="B9D7F2" w:sz="4"/>
+              <w:right w:val="single" w:color="B9D7F2" w:sz="4"/>
+            </w:tcBorders>
+            <w:tcMar>
+              <w:top w:type="dxa" w:w="60"/>
+              <w:left w:type="dxa" w:w="90"/>
+              <w:bottom w:type="dxa" w:w="60"/>
+              <w:right w:type="dxa" w:w="90"/>
+            </w:tcMar>
+          </w:tcPr>
+          <w:p>
+            <w:pPr>
+              <w:spacing w:after="0" w:before="0"/>
+            </w:pPr>
+            <w:r>
+              <w:rPr>
+                <w:rFonts w:ascii="Arial" w:cs="Arial" w:eastAsia="Arial" w:hAnsi="Arial"/>
+                <w:color w:val="15202B"/>
+                <w:sz w:val="18"/>
+                <w:szCs w:val="18"/>
+              </w:rPr>
+              <w:t xml:space="preserve"/>
+            </w:r>
+          </w:p>
+        </w:tc>
+      </w:tr>
+      <w:tr>
+        <w:trPr>
+          <w:cantSplit/>
+        </w:trPr>
+        <w:tc>
+          <w:tcPr>
+            <w:tcW w:type="dxa" w:w="640"/>
+            <w:tcBorders>
+              <w:top w:val="single" w:color="B9D7F2" w:sz="4"/>
+              <w:left w:val="single" w:color="B9D7F2" w:sz="4"/>
+              <w:bottom w:val="single" w:color="B9D7F2" w:sz="4"/>
+              <w:right w:val="single" w:color="B9D7F2" w:sz="4"/>
+            </w:tcBorders>
+            <w:shd w:fill="EAF4FD" w:color="auto" w:val="clear"/>
+            <w:tcMar>
+              <w:top w:type="dxa" w:w="60"/>
+              <w:left w:type="dxa" w:w="90"/>
+              <w:bottom w:type="dxa" w:w="60"/>
+              <w:right w:type="dxa" w:w="90"/>
+            </w:tcMar>
+          </w:tcPr>
+          <w:p>
+            <w:pPr>
+              <w:spacing w:after="0" w:before="0"/>
+            </w:pPr>
+            <w:r>
+              <w:rPr>
+                <w:rFonts w:ascii="Arial" w:cs="Arial" w:eastAsia="Arial" w:hAnsi="Arial"/>
+                <w:color w:val="15202B"/>
+                <w:sz w:val="18"/>
+                <w:szCs w:val="18"/>
+              </w:rPr>
+              <w:t xml:space="preserve">29.6</w:t>
+            </w:r>
+          </w:p>
+        </w:tc>
+        <w:tc>
+          <w:tcPr>
+            <w:tcW w:type="dxa" w:w="3820"/>
+            <w:tcBorders>
+              <w:top w:val="single" w:color="B9D7F2" w:sz="4"/>
+              <w:left w:val="single" w:color="B9D7F2" w:sz="4"/>
+              <w:bottom w:val="single" w:color="B9D7F2" w:sz="4"/>
+              <w:right w:val="single" w:color="B9D7F2" w:sz="4"/>
+            </w:tcBorders>
+            <w:shd w:fill="EAF4FD" w:color="auto" w:val="clear"/>
+            <w:tcMar>
+              <w:top w:type="dxa" w:w="60"/>
+              <w:left w:type="dxa" w:w="90"/>
+              <w:bottom w:type="dxa" w:w="60"/>
+              <w:right w:type="dxa" w:w="90"/>
+            </w:tcMar>
+          </w:tcPr>
+          <w:p>
+            <w:pPr>
+              <w:spacing w:after="0" w:before="0"/>
+            </w:pPr>
+            <w:r>
+              <w:rPr>
+                <w:rFonts w:ascii="Arial" w:cs="Arial" w:eastAsia="Arial" w:hAnsi="Arial"/>
+                <w:color w:val="15202B"/>
+                <w:sz w:val="18"/>
+                <w:szCs w:val="18"/>
+              </w:rPr>
+              <w:t xml:space="preserve">Tap Weekly, Unpaid or Export.</w:t>
+            </w:r>
+          </w:p>
+        </w:tc>
+        <w:tc>
+          <w:tcPr>
+            <w:tcW w:type="dxa" w:w="3900"/>
+            <w:tcBorders>
+              <w:top w:val="single" w:color="B9D7F2" w:sz="4"/>
+              <w:left w:val="single" w:color="B9D7F2" w:sz="4"/>
+              <w:bottom w:val="single" w:color="B9D7F2" w:sz="4"/>
+              <w:right w:val="single" w:color="B9D7F2" w:sz="4"/>
+            </w:tcBorders>
+            <w:shd w:fill="EAF4FD" w:color="auto" w:val="clear"/>
+            <w:tcMar>
+              <w:top w:type="dxa" w:w="60"/>
+              <w:left w:type="dxa" w:w="90"/>
+              <w:bottom w:type="dxa" w:w="60"/>
+              <w:right w:type="dxa" w:w="90"/>
+            </w:tcMar>
+          </w:tcPr>
+          <w:p>
+            <w:pPr>
+              <w:spacing w:after="0" w:before="0"/>
+            </w:pPr>
+            <w:r>
+              <w:rPr>
+                <w:rFonts w:ascii="Arial" w:cs="Arial" w:eastAsia="Arial" w:hAnsi="Arial"/>
+                <w:color w:val="15202B"/>
+                <w:sz w:val="18"/>
+                <w:szCs w:val="18"/>
+              </w:rPr>
+              <w:t xml:space="preserve">Message that it comes in step 37, 38 or 39 (Sprint 3).</w:t>
+            </w:r>
+          </w:p>
+        </w:tc>
+        <w:tc>
+          <w:tcPr>
+            <w:tcW w:type="dxa" w:w="900"/>
+            <w:tcBorders>
+              <w:top w:val="single" w:color="B9D7F2" w:sz="4"/>
+              <w:left w:val="single" w:color="B9D7F2" w:sz="4"/>
+              <w:bottom w:val="single" w:color="B9D7F2" w:sz="4"/>
+              <w:right w:val="single" w:color="B9D7F2" w:sz="4"/>
+            </w:tcBorders>
+            <w:shd w:fill="EAF4FD" w:color="auto" w:val="clear"/>
+            <w:tcMar>
+              <w:top w:type="dxa" w:w="60"/>
+              <w:left w:type="dxa" w:w="90"/>
+              <w:bottom w:type="dxa" w:w="60"/>
+              <w:right w:type="dxa" w:w="90"/>
+            </w:tcMar>
+          </w:tcPr>
+          <w:p>
+            <w:pPr>
+              <w:spacing w:after="0" w:before="0"/>
+            </w:pPr>
+            <w:r>
+              <w:rPr>
+                <w:rFonts w:ascii="Arial" w:cs="Arial" w:eastAsia="Arial" w:hAnsi="Arial"/>
+                <w:color w:val="15202B"/>
+                <w:sz w:val="18"/>
+                <w:szCs w:val="18"/>
+              </w:rPr>
+              <w:t xml:space="preserve">☐ Pass</w:t>
+            </w:r>
+          </w:p>
+          <w:p>
+            <w:pPr>
+              <w:spacing w:after="0" w:before="0"/>
+            </w:pPr>
+            <w:r>
+              <w:rPr>
+                <w:rFonts w:ascii="Arial" w:cs="Arial" w:eastAsia="Arial" w:hAnsi="Arial"/>
+                <w:color w:val="15202B"/>
+                <w:sz w:val="18"/>
+                <w:szCs w:val="18"/>
+              </w:rPr>
+              <w:t xml:space="preserve">☐ Fail</w:t>
+            </w:r>
+          </w:p>
+        </w:tc>
+        <w:tc>
+          <w:tcPr>
+            <w:tcW w:type="dxa" w:w="1206"/>
+            <w:tcBorders>
+              <w:top w:val="single" w:color="B9D7F2" w:sz="4"/>
+              <w:left w:val="single" w:color="B9D7F2" w:sz="4"/>
+              <w:bottom w:val="single" w:color="B9D7F2" w:sz="4"/>
+              <w:right w:val="single" w:color="B9D7F2" w:sz="4"/>
+            </w:tcBorders>
+            <w:shd w:fill="EAF4FD" w:color="auto" w:val="clear"/>
             <w:tcMar>
               <w:top w:type="dxa" w:w="60"/>
               <w:left w:type="dxa" w:w="90"/>

</xml_diff>

<commit_message>
T30 staff and rider Done Today, T31 notifications list and live bell, T32 customer My Orders with reorder; testing checklist steps 10-32
Co-Authored-By: Claude Opus 5.5 <noreply@anthropic.com>
Claude-Session: https://claude.ai/code/session_01DasQCNUJBbLyCWkvv4Qmw3
</commit_message>
<xml_diff>
--- a/docs/testing/Mangao-Testing-Checklist.docx
+++ b/docs/testing/Mangao-Testing-Checklist.docx
@@ -30,7 +30,7 @@
           <w:sz w:val="19"/>
           <w:szCs w:val="19"/>
         </w:rPr>
-        <w:t xml:space="preserve">Steps built but not yet checked in Chrome: 20 steps, 158 checks. Updated Oct 14, 2026, 1:03 AM.</w:t>
+        <w:t xml:space="preserve">Steps built but not yet checked in Chrome: 23 steps, 179 checks. Updated Oct 14, 2026, 1:05 AM.</w:t>
       </w:r>
     </w:p>
     <w:p>
@@ -4546,6 +4546,491 @@
           </w:p>
         </w:tc>
       </w:tr>
+      <w:tr>
+        <w:trPr>
+          <w:cantSplit/>
+        </w:trPr>
+        <w:tc>
+          <w:tcPr>
+            <w:tcW w:type="dxa" w:w="900"/>
+            <w:tcBorders>
+              <w:top w:val="single" w:color="B9D7F2" w:sz="4"/>
+              <w:left w:val="single" w:color="B9D7F2" w:sz="4"/>
+              <w:bottom w:val="single" w:color="B9D7F2" w:sz="4"/>
+              <w:right w:val="single" w:color="B9D7F2" w:sz="4"/>
+            </w:tcBorders>
+            <w:tcMar>
+              <w:top w:type="dxa" w:w="60"/>
+              <w:left w:type="dxa" w:w="90"/>
+              <w:bottom w:type="dxa" w:w="60"/>
+              <w:right w:type="dxa" w:w="90"/>
+            </w:tcMar>
+          </w:tcPr>
+          <w:p>
+            <w:pPr>
+              <w:spacing w:after="0" w:before="0"/>
+            </w:pPr>
+            <w:r>
+              <w:rPr>
+                <w:rFonts w:ascii="Arial" w:cs="Arial" w:eastAsia="Arial" w:hAnsi="Arial"/>
+                <w:color w:val="15202B"/>
+                <w:sz w:val="18"/>
+                <w:szCs w:val="18"/>
+              </w:rPr>
+              <w:t xml:space="preserve">30</w:t>
+            </w:r>
+          </w:p>
+        </w:tc>
+        <w:tc>
+          <w:tcPr>
+            <w:tcW w:type="dxa" w:w="4400"/>
+            <w:tcBorders>
+              <w:top w:val="single" w:color="B9D7F2" w:sz="4"/>
+              <w:left w:val="single" w:color="B9D7F2" w:sz="4"/>
+              <w:bottom w:val="single" w:color="B9D7F2" w:sz="4"/>
+              <w:right w:val="single" w:color="B9D7F2" w:sz="4"/>
+            </w:tcBorders>
+            <w:tcMar>
+              <w:top w:type="dxa" w:w="60"/>
+              <w:left w:type="dxa" w:w="90"/>
+              <w:bottom w:type="dxa" w:w="60"/>
+              <w:right w:type="dxa" w:w="90"/>
+            </w:tcMar>
+          </w:tcPr>
+          <w:p>
+            <w:pPr>
+              <w:spacing w:after="0" w:before="0"/>
+            </w:pPr>
+            <w:r>
+              <w:rPr>
+                <w:rFonts w:ascii="Arial" w:cs="Arial" w:eastAsia="Arial" w:hAnsi="Arial"/>
+                <w:color w:val="15202B"/>
+                <w:sz w:val="18"/>
+                <w:szCs w:val="18"/>
+              </w:rPr>
+              <w:t xml:space="preserve">Staff and rider work lists</w:t>
+            </w:r>
+          </w:p>
+        </w:tc>
+        <w:tc>
+          <w:tcPr>
+            <w:tcW w:type="dxa" w:w="2600"/>
+            <w:tcBorders>
+              <w:top w:val="single" w:color="B9D7F2" w:sz="4"/>
+              <w:left w:val="single" w:color="B9D7F2" w:sz="4"/>
+              <w:bottom w:val="single" w:color="B9D7F2" w:sz="4"/>
+              <w:right w:val="single" w:color="B9D7F2" w:sz="4"/>
+            </w:tcBorders>
+            <w:tcMar>
+              <w:top w:type="dxa" w:w="60"/>
+              <w:left w:type="dxa" w:w="90"/>
+              <w:bottom w:type="dxa" w:w="60"/>
+              <w:right w:type="dxa" w:w="90"/>
+            </w:tcMar>
+          </w:tcPr>
+          <w:p>
+            <w:pPr>
+              <w:spacing w:after="0" w:before="0"/>
+            </w:pPr>
+            <w:r>
+              <w:rPr>
+                <w:rFonts w:ascii="Arial" w:cs="Arial" w:eastAsia="Arial" w:hAnsi="Arial"/>
+                <w:color w:val="15202B"/>
+                <w:sz w:val="18"/>
+                <w:szCs w:val="18"/>
+              </w:rPr>
+              <w:t xml:space="preserve">Staff 1, 2, 5, 6, Rider 6</w:t>
+            </w:r>
+          </w:p>
+        </w:tc>
+        <w:tc>
+          <w:tcPr>
+            <w:tcW w:type="dxa" w:w="1300"/>
+            <w:tcBorders>
+              <w:top w:val="single" w:color="B9D7F2" w:sz="4"/>
+              <w:left w:val="single" w:color="B9D7F2" w:sz="4"/>
+              <w:bottom w:val="single" w:color="B9D7F2" w:sz="4"/>
+              <w:right w:val="single" w:color="B9D7F2" w:sz="4"/>
+            </w:tcBorders>
+            <w:tcMar>
+              <w:top w:type="dxa" w:w="60"/>
+              <w:left w:type="dxa" w:w="90"/>
+              <w:bottom w:type="dxa" w:w="60"/>
+              <w:right w:type="dxa" w:w="90"/>
+            </w:tcMar>
+          </w:tcPr>
+          <w:p>
+            <w:pPr>
+              <w:spacing w:after="0" w:before="0"/>
+            </w:pPr>
+            <w:r>
+              <w:rPr>
+                <w:rFonts w:ascii="Arial" w:cs="Arial" w:eastAsia="Arial" w:hAnsi="Arial"/>
+                <w:color w:val="15202B"/>
+                <w:sz w:val="18"/>
+                <w:szCs w:val="18"/>
+              </w:rPr>
+              <w:t xml:space="preserve">7</w:t>
+            </w:r>
+          </w:p>
+        </w:tc>
+        <w:tc>
+          <w:tcPr>
+            <w:tcW w:type="dxa" w:w="1266"/>
+            <w:tcBorders>
+              <w:top w:val="single" w:color="B9D7F2" w:sz="4"/>
+              <w:left w:val="single" w:color="B9D7F2" w:sz="4"/>
+              <w:bottom w:val="single" w:color="B9D7F2" w:sz="4"/>
+              <w:right w:val="single" w:color="B9D7F2" w:sz="4"/>
+            </w:tcBorders>
+            <w:tcMar>
+              <w:top w:type="dxa" w:w="60"/>
+              <w:left w:type="dxa" w:w="90"/>
+              <w:bottom w:type="dxa" w:w="60"/>
+              <w:right w:type="dxa" w:w="90"/>
+            </w:tcMar>
+          </w:tcPr>
+          <w:p>
+            <w:pPr>
+              <w:spacing w:after="0" w:before="0"/>
+            </w:pPr>
+            <w:r>
+              <w:rPr>
+                <w:rFonts w:ascii="Arial" w:cs="Arial" w:eastAsia="Arial" w:hAnsi="Arial"/>
+                <w:color w:val="15202B"/>
+                <w:sz w:val="18"/>
+                <w:szCs w:val="18"/>
+              </w:rPr>
+              <w:t xml:space="preserve">☐ Yes  ☐ No</w:t>
+            </w:r>
+          </w:p>
+        </w:tc>
+      </w:tr>
+      <w:tr>
+        <w:trPr>
+          <w:cantSplit/>
+        </w:trPr>
+        <w:tc>
+          <w:tcPr>
+            <w:tcW w:type="dxa" w:w="900"/>
+            <w:tcBorders>
+              <w:top w:val="single" w:color="B9D7F2" w:sz="4"/>
+              <w:left w:val="single" w:color="B9D7F2" w:sz="4"/>
+              <w:bottom w:val="single" w:color="B9D7F2" w:sz="4"/>
+              <w:right w:val="single" w:color="B9D7F2" w:sz="4"/>
+            </w:tcBorders>
+            <w:shd w:fill="EAF4FD" w:color="auto" w:val="clear"/>
+            <w:tcMar>
+              <w:top w:type="dxa" w:w="60"/>
+              <w:left w:type="dxa" w:w="90"/>
+              <w:bottom w:type="dxa" w:w="60"/>
+              <w:right w:type="dxa" w:w="90"/>
+            </w:tcMar>
+          </w:tcPr>
+          <w:p>
+            <w:pPr>
+              <w:spacing w:after="0" w:before="0"/>
+            </w:pPr>
+            <w:r>
+              <w:rPr>
+                <w:rFonts w:ascii="Arial" w:cs="Arial" w:eastAsia="Arial" w:hAnsi="Arial"/>
+                <w:color w:val="15202B"/>
+                <w:sz w:val="18"/>
+                <w:szCs w:val="18"/>
+              </w:rPr>
+              <w:t xml:space="preserve">31</w:t>
+            </w:r>
+          </w:p>
+        </w:tc>
+        <w:tc>
+          <w:tcPr>
+            <w:tcW w:type="dxa" w:w="4400"/>
+            <w:tcBorders>
+              <w:top w:val="single" w:color="B9D7F2" w:sz="4"/>
+              <w:left w:val="single" w:color="B9D7F2" w:sz="4"/>
+              <w:bottom w:val="single" w:color="B9D7F2" w:sz="4"/>
+              <w:right w:val="single" w:color="B9D7F2" w:sz="4"/>
+            </w:tcBorders>
+            <w:shd w:fill="EAF4FD" w:color="auto" w:val="clear"/>
+            <w:tcMar>
+              <w:top w:type="dxa" w:w="60"/>
+              <w:left w:type="dxa" w:w="90"/>
+              <w:bottom w:type="dxa" w:w="60"/>
+              <w:right w:type="dxa" w:w="90"/>
+            </w:tcMar>
+          </w:tcPr>
+          <w:p>
+            <w:pPr>
+              <w:spacing w:after="0" w:before="0"/>
+            </w:pPr>
+            <w:r>
+              <w:rPr>
+                <w:rFonts w:ascii="Arial" w:cs="Arial" w:eastAsia="Arial" w:hAnsi="Arial"/>
+                <w:color w:val="15202B"/>
+                <w:sz w:val="18"/>
+                <w:szCs w:val="18"/>
+              </w:rPr>
+              <w:t xml:space="preserve">Owner in-app alerts</w:t>
+            </w:r>
+          </w:p>
+        </w:tc>
+        <w:tc>
+          <w:tcPr>
+            <w:tcW w:type="dxa" w:w="2600"/>
+            <w:tcBorders>
+              <w:top w:val="single" w:color="B9D7F2" w:sz="4"/>
+              <w:left w:val="single" w:color="B9D7F2" w:sz="4"/>
+              <w:bottom w:val="single" w:color="B9D7F2" w:sz="4"/>
+              <w:right w:val="single" w:color="B9D7F2" w:sz="4"/>
+            </w:tcBorders>
+            <w:shd w:fill="EAF4FD" w:color="auto" w:val="clear"/>
+            <w:tcMar>
+              <w:top w:type="dxa" w:w="60"/>
+              <w:left w:type="dxa" w:w="90"/>
+              <w:bottom w:type="dxa" w:w="60"/>
+              <w:right w:type="dxa" w:w="90"/>
+            </w:tcMar>
+          </w:tcPr>
+          <w:p>
+            <w:pPr>
+              <w:spacing w:after="0" w:before="0"/>
+            </w:pPr>
+            <w:r>
+              <w:rPr>
+                <w:rFonts w:ascii="Arial" w:cs="Arial" w:eastAsia="Arial" w:hAnsi="Arial"/>
+                <w:color w:val="15202B"/>
+                <w:sz w:val="18"/>
+                <w:szCs w:val="18"/>
+              </w:rPr>
+              <w:t xml:space="preserve">Admin More 4</w:t>
+            </w:r>
+          </w:p>
+        </w:tc>
+        <w:tc>
+          <w:tcPr>
+            <w:tcW w:type="dxa" w:w="1300"/>
+            <w:tcBorders>
+              <w:top w:val="single" w:color="B9D7F2" w:sz="4"/>
+              <w:left w:val="single" w:color="B9D7F2" w:sz="4"/>
+              <w:bottom w:val="single" w:color="B9D7F2" w:sz="4"/>
+              <w:right w:val="single" w:color="B9D7F2" w:sz="4"/>
+            </w:tcBorders>
+            <w:shd w:fill="EAF4FD" w:color="auto" w:val="clear"/>
+            <w:tcMar>
+              <w:top w:type="dxa" w:w="60"/>
+              <w:left w:type="dxa" w:w="90"/>
+              <w:bottom w:type="dxa" w:w="60"/>
+              <w:right w:type="dxa" w:w="90"/>
+            </w:tcMar>
+          </w:tcPr>
+          <w:p>
+            <w:pPr>
+              <w:spacing w:after="0" w:before="0"/>
+            </w:pPr>
+            <w:r>
+              <w:rPr>
+                <w:rFonts w:ascii="Arial" w:cs="Arial" w:eastAsia="Arial" w:hAnsi="Arial"/>
+                <w:color w:val="15202B"/>
+                <w:sz w:val="18"/>
+                <w:szCs w:val="18"/>
+              </w:rPr>
+              <w:t xml:space="preserve">8</w:t>
+            </w:r>
+          </w:p>
+        </w:tc>
+        <w:tc>
+          <w:tcPr>
+            <w:tcW w:type="dxa" w:w="1266"/>
+            <w:tcBorders>
+              <w:top w:val="single" w:color="B9D7F2" w:sz="4"/>
+              <w:left w:val="single" w:color="B9D7F2" w:sz="4"/>
+              <w:bottom w:val="single" w:color="B9D7F2" w:sz="4"/>
+              <w:right w:val="single" w:color="B9D7F2" w:sz="4"/>
+            </w:tcBorders>
+            <w:shd w:fill="EAF4FD" w:color="auto" w:val="clear"/>
+            <w:tcMar>
+              <w:top w:type="dxa" w:w="60"/>
+              <w:left w:type="dxa" w:w="90"/>
+              <w:bottom w:type="dxa" w:w="60"/>
+              <w:right w:type="dxa" w:w="90"/>
+            </w:tcMar>
+          </w:tcPr>
+          <w:p>
+            <w:pPr>
+              <w:spacing w:after="0" w:before="0"/>
+            </w:pPr>
+            <w:r>
+              <w:rPr>
+                <w:rFonts w:ascii="Arial" w:cs="Arial" w:eastAsia="Arial" w:hAnsi="Arial"/>
+                <w:color w:val="15202B"/>
+                <w:sz w:val="18"/>
+                <w:szCs w:val="18"/>
+              </w:rPr>
+              <w:t xml:space="preserve">☐ Yes  ☐ No</w:t>
+            </w:r>
+          </w:p>
+        </w:tc>
+      </w:tr>
+      <w:tr>
+        <w:trPr>
+          <w:cantSplit/>
+        </w:trPr>
+        <w:tc>
+          <w:tcPr>
+            <w:tcW w:type="dxa" w:w="900"/>
+            <w:tcBorders>
+              <w:top w:val="single" w:color="B9D7F2" w:sz="4"/>
+              <w:left w:val="single" w:color="B9D7F2" w:sz="4"/>
+              <w:bottom w:val="single" w:color="B9D7F2" w:sz="4"/>
+              <w:right w:val="single" w:color="B9D7F2" w:sz="4"/>
+            </w:tcBorders>
+            <w:tcMar>
+              <w:top w:type="dxa" w:w="60"/>
+              <w:left w:type="dxa" w:w="90"/>
+              <w:bottom w:type="dxa" w:w="60"/>
+              <w:right w:type="dxa" w:w="90"/>
+            </w:tcMar>
+          </w:tcPr>
+          <w:p>
+            <w:pPr>
+              <w:spacing w:after="0" w:before="0"/>
+            </w:pPr>
+            <w:r>
+              <w:rPr>
+                <w:rFonts w:ascii="Arial" w:cs="Arial" w:eastAsia="Arial" w:hAnsi="Arial"/>
+                <w:color w:val="15202B"/>
+                <w:sz w:val="18"/>
+                <w:szCs w:val="18"/>
+              </w:rPr>
+              <w:t xml:space="preserve">32</w:t>
+            </w:r>
+          </w:p>
+        </w:tc>
+        <w:tc>
+          <w:tcPr>
+            <w:tcW w:type="dxa" w:w="4400"/>
+            <w:tcBorders>
+              <w:top w:val="single" w:color="B9D7F2" w:sz="4"/>
+              <w:left w:val="single" w:color="B9D7F2" w:sz="4"/>
+              <w:bottom w:val="single" w:color="B9D7F2" w:sz="4"/>
+              <w:right w:val="single" w:color="B9D7F2" w:sz="4"/>
+            </w:tcBorders>
+            <w:tcMar>
+              <w:top w:type="dxa" w:w="60"/>
+              <w:left w:type="dxa" w:w="90"/>
+              <w:bottom w:type="dxa" w:w="60"/>
+              <w:right w:type="dxa" w:w="90"/>
+            </w:tcMar>
+          </w:tcPr>
+          <w:p>
+            <w:pPr>
+              <w:spacing w:after="0" w:before="0"/>
+            </w:pPr>
+            <w:r>
+              <w:rPr>
+                <w:rFonts w:ascii="Arial" w:cs="Arial" w:eastAsia="Arial" w:hAnsi="Arial"/>
+                <w:color w:val="15202B"/>
+                <w:sz w:val="18"/>
+                <w:szCs w:val="18"/>
+              </w:rPr>
+              <w:t xml:space="preserve">Customer My Orders and reorder</w:t>
+            </w:r>
+          </w:p>
+        </w:tc>
+        <w:tc>
+          <w:tcPr>
+            <w:tcW w:type="dxa" w:w="2600"/>
+            <w:tcBorders>
+              <w:top w:val="single" w:color="B9D7F2" w:sz="4"/>
+              <w:left w:val="single" w:color="B9D7F2" w:sz="4"/>
+              <w:bottom w:val="single" w:color="B9D7F2" w:sz="4"/>
+              <w:right w:val="single" w:color="B9D7F2" w:sz="4"/>
+            </w:tcBorders>
+            <w:tcMar>
+              <w:top w:type="dxa" w:w="60"/>
+              <w:left w:type="dxa" w:w="90"/>
+              <w:bottom w:type="dxa" w:w="60"/>
+              <w:right w:type="dxa" w:w="90"/>
+            </w:tcMar>
+          </w:tcPr>
+          <w:p>
+            <w:pPr>
+              <w:spacing w:after="0" w:before="0"/>
+            </w:pPr>
+            <w:r>
+              <w:rPr>
+                <w:rFonts w:ascii="Arial" w:cs="Arial" w:eastAsia="Arial" w:hAnsi="Arial"/>
+                <w:color w:val="15202B"/>
+                <w:sz w:val="18"/>
+                <w:szCs w:val="18"/>
+              </w:rPr>
+              <w:t xml:space="preserve">Customer 6</w:t>
+            </w:r>
+          </w:p>
+        </w:tc>
+        <w:tc>
+          <w:tcPr>
+            <w:tcW w:type="dxa" w:w="1300"/>
+            <w:tcBorders>
+              <w:top w:val="single" w:color="B9D7F2" w:sz="4"/>
+              <w:left w:val="single" w:color="B9D7F2" w:sz="4"/>
+              <w:bottom w:val="single" w:color="B9D7F2" w:sz="4"/>
+              <w:right w:val="single" w:color="B9D7F2" w:sz="4"/>
+            </w:tcBorders>
+            <w:tcMar>
+              <w:top w:type="dxa" w:w="60"/>
+              <w:left w:type="dxa" w:w="90"/>
+              <w:bottom w:type="dxa" w:w="60"/>
+              <w:right w:type="dxa" w:w="90"/>
+            </w:tcMar>
+          </w:tcPr>
+          <w:p>
+            <w:pPr>
+              <w:spacing w:after="0" w:before="0"/>
+            </w:pPr>
+            <w:r>
+              <w:rPr>
+                <w:rFonts w:ascii="Arial" w:cs="Arial" w:eastAsia="Arial" w:hAnsi="Arial"/>
+                <w:color w:val="15202B"/>
+                <w:sz w:val="18"/>
+                <w:szCs w:val="18"/>
+              </w:rPr>
+              <w:t xml:space="preserve">6</w:t>
+            </w:r>
+          </w:p>
+        </w:tc>
+        <w:tc>
+          <w:tcPr>
+            <w:tcW w:type="dxa" w:w="1266"/>
+            <w:tcBorders>
+              <w:top w:val="single" w:color="B9D7F2" w:sz="4"/>
+              <w:left w:val="single" w:color="B9D7F2" w:sz="4"/>
+              <w:bottom w:val="single" w:color="B9D7F2" w:sz="4"/>
+              <w:right w:val="single" w:color="B9D7F2" w:sz="4"/>
+            </w:tcBorders>
+            <w:tcMar>
+              <w:top w:type="dxa" w:w="60"/>
+              <w:left w:type="dxa" w:w="90"/>
+              <w:bottom w:type="dxa" w:w="60"/>
+              <w:right w:type="dxa" w:w="90"/>
+            </w:tcMar>
+          </w:tcPr>
+          <w:p>
+            <w:pPr>
+              <w:spacing w:after="0" w:before="0"/>
+            </w:pPr>
+            <w:r>
+              <w:rPr>
+                <w:rFonts w:ascii="Arial" w:cs="Arial" w:eastAsia="Arial" w:hAnsi="Arial"/>
+                <w:color w:val="15202B"/>
+                <w:sz w:val="18"/>
+                <w:szCs w:val="18"/>
+              </w:rPr>
+              <w:t xml:space="preserve">☐ Yes  ☐ No</w:t>
+            </w:r>
+          </w:p>
+        </w:tc>
+      </w:tr>
     </w:tbl>
     <w:p>
       <w:pPr>
@@ -37646,6 +38131,4487 @@
                 <w:szCs w:val="18"/>
               </w:rPr>
               <w:t xml:space="preserve">Message that it comes in step 37, 38 or 39 (Sprint 3).</w:t>
+            </w:r>
+          </w:p>
+        </w:tc>
+        <w:tc>
+          <w:tcPr>
+            <w:tcW w:type="dxa" w:w="900"/>
+            <w:tcBorders>
+              <w:top w:val="single" w:color="B9D7F2" w:sz="4"/>
+              <w:left w:val="single" w:color="B9D7F2" w:sz="4"/>
+              <w:bottom w:val="single" w:color="B9D7F2" w:sz="4"/>
+              <w:right w:val="single" w:color="B9D7F2" w:sz="4"/>
+            </w:tcBorders>
+            <w:shd w:fill="EAF4FD" w:color="auto" w:val="clear"/>
+            <w:tcMar>
+              <w:top w:type="dxa" w:w="60"/>
+              <w:left w:type="dxa" w:w="90"/>
+              <w:bottom w:type="dxa" w:w="60"/>
+              <w:right w:type="dxa" w:w="90"/>
+            </w:tcMar>
+          </w:tcPr>
+          <w:p>
+            <w:pPr>
+              <w:spacing w:after="0" w:before="0"/>
+            </w:pPr>
+            <w:r>
+              <w:rPr>
+                <w:rFonts w:ascii="Arial" w:cs="Arial" w:eastAsia="Arial" w:hAnsi="Arial"/>
+                <w:color w:val="15202B"/>
+                <w:sz w:val="18"/>
+                <w:szCs w:val="18"/>
+              </w:rPr>
+              <w:t xml:space="preserve">☐ Pass</w:t>
+            </w:r>
+          </w:p>
+          <w:p>
+            <w:pPr>
+              <w:spacing w:after="0" w:before="0"/>
+            </w:pPr>
+            <w:r>
+              <w:rPr>
+                <w:rFonts w:ascii="Arial" w:cs="Arial" w:eastAsia="Arial" w:hAnsi="Arial"/>
+                <w:color w:val="15202B"/>
+                <w:sz w:val="18"/>
+                <w:szCs w:val="18"/>
+              </w:rPr>
+              <w:t xml:space="preserve">☐ Fail</w:t>
+            </w:r>
+          </w:p>
+        </w:tc>
+        <w:tc>
+          <w:tcPr>
+            <w:tcW w:type="dxa" w:w="1206"/>
+            <w:tcBorders>
+              <w:top w:val="single" w:color="B9D7F2" w:sz="4"/>
+              <w:left w:val="single" w:color="B9D7F2" w:sz="4"/>
+              <w:bottom w:val="single" w:color="B9D7F2" w:sz="4"/>
+              <w:right w:val="single" w:color="B9D7F2" w:sz="4"/>
+            </w:tcBorders>
+            <w:shd w:fill="EAF4FD" w:color="auto" w:val="clear"/>
+            <w:tcMar>
+              <w:top w:type="dxa" w:w="60"/>
+              <w:left w:type="dxa" w:w="90"/>
+              <w:bottom w:type="dxa" w:w="60"/>
+              <w:right w:type="dxa" w:w="90"/>
+            </w:tcMar>
+          </w:tcPr>
+          <w:p>
+            <w:pPr>
+              <w:spacing w:after="0" w:before="0"/>
+            </w:pPr>
+            <w:r>
+              <w:rPr>
+                <w:rFonts w:ascii="Arial" w:cs="Arial" w:eastAsia="Arial" w:hAnsi="Arial"/>
+                <w:color w:val="15202B"/>
+                <w:sz w:val="18"/>
+                <w:szCs w:val="18"/>
+              </w:rPr>
+              <w:t xml:space="preserve"/>
+            </w:r>
+          </w:p>
+        </w:tc>
+      </w:tr>
+    </w:tbl>
+    <w:p>
+      <w:pPr>
+        <w:pStyle w:val="Heading1"/>
+        <w:pageBreakBefore/>
+        <w:spacing w:after="60"/>
+      </w:pPr>
+      <w:r>
+        <w:rPr>
+          <w:rFonts w:ascii="Arial" w:cs="Arial" w:eastAsia="Arial" w:hAnsi="Arial"/>
+          <w:b/>
+          <w:bCs/>
+          <w:color w:val="0A84E0"/>
+          <w:sz w:val="28"/>
+          <w:szCs w:val="28"/>
+        </w:rPr>
+        <w:t xml:space="preserve">Step 30 · Staff and rider work lists</w:t>
+      </w:r>
+    </w:p>
+    <w:p>
+      <w:pPr>
+        <w:spacing w:after="60" w:before="0"/>
+      </w:pPr>
+      <w:r>
+        <w:rPr>
+          <w:rFonts w:ascii="Arial" w:cs="Arial" w:eastAsia="Arial" w:hAnsi="Arial"/>
+          <w:b/>
+          <w:bCs/>
+          <w:color w:val="15202B"/>
+          <w:sz w:val="19"/>
+          <w:szCs w:val="19"/>
+        </w:rPr>
+        <w:t xml:space="preserve">Screens: </w:t>
+      </w:r>
+      <w:r>
+        <w:rPr>
+          <w:rFonts w:ascii="Arial" w:cs="Arial" w:eastAsia="Arial" w:hAnsi="Arial"/>
+          <w:color w:val="15202B"/>
+          <w:sz w:val="19"/>
+          <w:szCs w:val="19"/>
+        </w:rPr>
+        <w:t xml:space="preserve">Staff 1, 2, 5, 6, Rider 6</w:t>
+      </w:r>
+      <w:r>
+        <w:rPr>
+          <w:rFonts w:ascii="Arial" w:cs="Arial" w:eastAsia="Arial" w:hAnsi="Arial"/>
+          <w:b/>
+          <w:bCs/>
+          <w:color w:val="15202B"/>
+          <w:sz w:val="19"/>
+          <w:szCs w:val="19"/>
+        </w:rPr>
+        <w:t xml:space="preserve">    Log in as: </w:t>
+      </w:r>
+      <w:r>
+        <w:rPr>
+          <w:rFonts w:ascii="Arial" w:cs="Arial" w:eastAsia="Arial" w:hAnsi="Arial"/>
+          <w:color w:val="15202B"/>
+          <w:sz w:val="19"/>
+          <w:szCs w:val="19"/>
+        </w:rPr>
+        <w:t xml:space="preserve">Staff, then Rider</w:t>
+      </w:r>
+    </w:p>
+    <w:tbl>
+      <w:tblPr>
+        <w:tblW w:type="dxa" w:w="10466"/>
+        <w:tblBorders>
+          <w:top w:val="single" w:color="auto" w:sz="4"/>
+          <w:left w:val="single" w:color="auto" w:sz="4"/>
+          <w:bottom w:val="single" w:color="auto" w:sz="4"/>
+          <w:right w:val="single" w:color="auto" w:sz="4"/>
+          <w:insideH w:val="single" w:color="auto" w:sz="4"/>
+          <w:insideV w:val="single" w:color="auto" w:sz="4"/>
+        </w:tblBorders>
+        <w:tblLayout w:type="fixed"/>
+      </w:tblPr>
+      <w:tblGrid>
+        <w:gridCol w:w="640"/>
+        <w:gridCol w:w="3820"/>
+        <w:gridCol w:w="3900"/>
+        <w:gridCol w:w="900"/>
+        <w:gridCol w:w="1206"/>
+      </w:tblGrid>
+      <w:tr>
+        <w:trPr>
+          <w:tblHeader/>
+        </w:trPr>
+        <w:tc>
+          <w:tcPr>
+            <w:tcW w:type="dxa" w:w="640"/>
+            <w:tcBorders>
+              <w:top w:val="single" w:color="B9D7F2" w:sz="4"/>
+              <w:left w:val="single" w:color="B9D7F2" w:sz="4"/>
+              <w:bottom w:val="single" w:color="B9D7F2" w:sz="4"/>
+              <w:right w:val="single" w:color="B9D7F2" w:sz="4"/>
+            </w:tcBorders>
+            <w:shd w:fill="0A84E0" w:color="auto" w:val="clear"/>
+            <w:tcMar>
+              <w:top w:type="dxa" w:w="60"/>
+              <w:left w:type="dxa" w:w="90"/>
+              <w:bottom w:type="dxa" w:w="60"/>
+              <w:right w:type="dxa" w:w="90"/>
+            </w:tcMar>
+          </w:tcPr>
+          <w:p>
+            <w:pPr>
+              <w:spacing w:after="0" w:before="0"/>
+            </w:pPr>
+            <w:r>
+              <w:rPr>
+                <w:rFonts w:ascii="Arial" w:cs="Arial" w:eastAsia="Arial" w:hAnsi="Arial"/>
+                <w:b/>
+                <w:bCs/>
+                <w:color w:val="FFFFFF"/>
+                <w:sz w:val="18"/>
+                <w:szCs w:val="18"/>
+              </w:rPr>
+              <w:t xml:space="preserve">#</w:t>
+            </w:r>
+          </w:p>
+        </w:tc>
+        <w:tc>
+          <w:tcPr>
+            <w:tcW w:type="dxa" w:w="3820"/>
+            <w:tcBorders>
+              <w:top w:val="single" w:color="B9D7F2" w:sz="4"/>
+              <w:left w:val="single" w:color="B9D7F2" w:sz="4"/>
+              <w:bottom w:val="single" w:color="B9D7F2" w:sz="4"/>
+              <w:right w:val="single" w:color="B9D7F2" w:sz="4"/>
+            </w:tcBorders>
+            <w:shd w:fill="0A84E0" w:color="auto" w:val="clear"/>
+            <w:tcMar>
+              <w:top w:type="dxa" w:w="60"/>
+              <w:left w:type="dxa" w:w="90"/>
+              <w:bottom w:type="dxa" w:w="60"/>
+              <w:right w:type="dxa" w:w="90"/>
+            </w:tcMar>
+          </w:tcPr>
+          <w:p>
+            <w:pPr>
+              <w:spacing w:after="0" w:before="0"/>
+            </w:pPr>
+            <w:r>
+              <w:rPr>
+                <w:rFonts w:ascii="Arial" w:cs="Arial" w:eastAsia="Arial" w:hAnsi="Arial"/>
+                <w:b/>
+                <w:bCs/>
+                <w:color w:val="FFFFFF"/>
+                <w:sz w:val="18"/>
+                <w:szCs w:val="18"/>
+              </w:rPr>
+              <w:t xml:space="preserve">What to do</w:t>
+            </w:r>
+          </w:p>
+        </w:tc>
+        <w:tc>
+          <w:tcPr>
+            <w:tcW w:type="dxa" w:w="3900"/>
+            <w:tcBorders>
+              <w:top w:val="single" w:color="B9D7F2" w:sz="4"/>
+              <w:left w:val="single" w:color="B9D7F2" w:sz="4"/>
+              <w:bottom w:val="single" w:color="B9D7F2" w:sz="4"/>
+              <w:right w:val="single" w:color="B9D7F2" w:sz="4"/>
+            </w:tcBorders>
+            <w:shd w:fill="0A84E0" w:color="auto" w:val="clear"/>
+            <w:tcMar>
+              <w:top w:type="dxa" w:w="60"/>
+              <w:left w:type="dxa" w:w="90"/>
+              <w:bottom w:type="dxa" w:w="60"/>
+              <w:right w:type="dxa" w:w="90"/>
+            </w:tcMar>
+          </w:tcPr>
+          <w:p>
+            <w:pPr>
+              <w:spacing w:after="0" w:before="0"/>
+            </w:pPr>
+            <w:r>
+              <w:rPr>
+                <w:rFonts w:ascii="Arial" w:cs="Arial" w:eastAsia="Arial" w:hAnsi="Arial"/>
+                <w:b/>
+                <w:bCs/>
+                <w:color w:val="FFFFFF"/>
+                <w:sz w:val="18"/>
+                <w:szCs w:val="18"/>
+              </w:rPr>
+              <w:t xml:space="preserve">What you should see</w:t>
+            </w:r>
+          </w:p>
+        </w:tc>
+        <w:tc>
+          <w:tcPr>
+            <w:tcW w:type="dxa" w:w="900"/>
+            <w:tcBorders>
+              <w:top w:val="single" w:color="B9D7F2" w:sz="4"/>
+              <w:left w:val="single" w:color="B9D7F2" w:sz="4"/>
+              <w:bottom w:val="single" w:color="B9D7F2" w:sz="4"/>
+              <w:right w:val="single" w:color="B9D7F2" w:sz="4"/>
+            </w:tcBorders>
+            <w:shd w:fill="0A84E0" w:color="auto" w:val="clear"/>
+            <w:tcMar>
+              <w:top w:type="dxa" w:w="60"/>
+              <w:left w:type="dxa" w:w="90"/>
+              <w:bottom w:type="dxa" w:w="60"/>
+              <w:right w:type="dxa" w:w="90"/>
+            </w:tcMar>
+          </w:tcPr>
+          <w:p>
+            <w:pPr>
+              <w:spacing w:after="0" w:before="0"/>
+            </w:pPr>
+            <w:r>
+              <w:rPr>
+                <w:rFonts w:ascii="Arial" w:cs="Arial" w:eastAsia="Arial" w:hAnsi="Arial"/>
+                <w:b/>
+                <w:bCs/>
+                <w:color w:val="FFFFFF"/>
+                <w:sz w:val="18"/>
+                <w:szCs w:val="18"/>
+              </w:rPr>
+              <w:t xml:space="preserve">Result</w:t>
+            </w:r>
+          </w:p>
+        </w:tc>
+        <w:tc>
+          <w:tcPr>
+            <w:tcW w:type="dxa" w:w="1206"/>
+            <w:tcBorders>
+              <w:top w:val="single" w:color="B9D7F2" w:sz="4"/>
+              <w:left w:val="single" w:color="B9D7F2" w:sz="4"/>
+              <w:bottom w:val="single" w:color="B9D7F2" w:sz="4"/>
+              <w:right w:val="single" w:color="B9D7F2" w:sz="4"/>
+            </w:tcBorders>
+            <w:shd w:fill="0A84E0" w:color="auto" w:val="clear"/>
+            <w:tcMar>
+              <w:top w:type="dxa" w:w="60"/>
+              <w:left w:type="dxa" w:w="90"/>
+              <w:bottom w:type="dxa" w:w="60"/>
+              <w:right w:type="dxa" w:w="90"/>
+            </w:tcMar>
+          </w:tcPr>
+          <w:p>
+            <w:pPr>
+              <w:spacing w:after="0" w:before="0"/>
+            </w:pPr>
+            <w:r>
+              <w:rPr>
+                <w:rFonts w:ascii="Arial" w:cs="Arial" w:eastAsia="Arial" w:hAnsi="Arial"/>
+                <w:b/>
+                <w:bCs/>
+                <w:color w:val="FFFFFF"/>
+                <w:sz w:val="18"/>
+                <w:szCs w:val="18"/>
+              </w:rPr>
+              <w:t xml:space="preserve">Notes</w:t>
+            </w:r>
+          </w:p>
+        </w:tc>
+      </w:tr>
+      <w:tr>
+        <w:trPr>
+          <w:cantSplit/>
+        </w:trPr>
+        <w:tc>
+          <w:tcPr>
+            <w:tcW w:type="dxa" w:w="640"/>
+            <w:tcBorders>
+              <w:top w:val="single" w:color="B9D7F2" w:sz="4"/>
+              <w:left w:val="single" w:color="B9D7F2" w:sz="4"/>
+              <w:bottom w:val="single" w:color="B9D7F2" w:sz="4"/>
+              <w:right w:val="single" w:color="B9D7F2" w:sz="4"/>
+            </w:tcBorders>
+            <w:tcMar>
+              <w:top w:type="dxa" w:w="60"/>
+              <w:left w:type="dxa" w:w="90"/>
+              <w:bottom w:type="dxa" w:w="60"/>
+              <w:right w:type="dxa" w:w="90"/>
+            </w:tcMar>
+          </w:tcPr>
+          <w:p>
+            <w:pPr>
+              <w:spacing w:after="0" w:before="0"/>
+            </w:pPr>
+            <w:r>
+              <w:rPr>
+                <w:rFonts w:ascii="Arial" w:cs="Arial" w:eastAsia="Arial" w:hAnsi="Arial"/>
+                <w:color w:val="15202B"/>
+                <w:sz w:val="18"/>
+                <w:szCs w:val="18"/>
+              </w:rPr>
+              <w:t xml:space="preserve">30.1</w:t>
+            </w:r>
+          </w:p>
+        </w:tc>
+        <w:tc>
+          <w:tcPr>
+            <w:tcW w:type="dxa" w:w="3820"/>
+            <w:tcBorders>
+              <w:top w:val="single" w:color="B9D7F2" w:sz="4"/>
+              <w:left w:val="single" w:color="B9D7F2" w:sz="4"/>
+              <w:bottom w:val="single" w:color="B9D7F2" w:sz="4"/>
+              <w:right w:val="single" w:color="B9D7F2" w:sz="4"/>
+            </w:tcBorders>
+            <w:tcMar>
+              <w:top w:type="dxa" w:w="60"/>
+              <w:left w:type="dxa" w:w="90"/>
+              <w:bottom w:type="dxa" w:w="60"/>
+              <w:right w:type="dxa" w:w="90"/>
+            </w:tcMar>
+          </w:tcPr>
+          <w:p>
+            <w:pPr>
+              <w:spacing w:after="0" w:before="0"/>
+            </w:pPr>
+            <w:r>
+              <w:rPr>
+                <w:rFonts w:ascii="Arial" w:cs="Arial" w:eastAsia="Arial" w:hAnsi="Arial"/>
+                <w:color w:val="15202B"/>
+                <w:sz w:val="18"/>
+                <w:szCs w:val="18"/>
+              </w:rPr>
+              <w:t xml:space="preserve">Staff: To Do with orders in Processing.</w:t>
+            </w:r>
+          </w:p>
+        </w:tc>
+        <w:tc>
+          <w:tcPr>
+            <w:tcW w:type="dxa" w:w="3900"/>
+            <w:tcBorders>
+              <w:top w:val="single" w:color="B9D7F2" w:sz="4"/>
+              <w:left w:val="single" w:color="B9D7F2" w:sz="4"/>
+              <w:bottom w:val="single" w:color="B9D7F2" w:sz="4"/>
+              <w:right w:val="single" w:color="B9D7F2" w:sz="4"/>
+            </w:tcBorders>
+            <w:tcMar>
+              <w:top w:type="dxa" w:w="60"/>
+              <w:left w:type="dxa" w:w="90"/>
+              <w:bottom w:type="dxa" w:w="60"/>
+              <w:right w:type="dxa" w:w="90"/>
+            </w:tcMar>
+          </w:tcPr>
+          <w:p>
+            <w:pPr>
+              <w:spacing w:after="0" w:before="0"/>
+            </w:pPr>
+            <w:r>
+              <w:rPr>
+                <w:rFonts w:ascii="Arial" w:cs="Arial" w:eastAsia="Arial" w:hAnsi="Arial"/>
+                <w:color w:val="15202B"/>
+                <w:sz w:val="18"/>
+                <w:szCs w:val="18"/>
+              </w:rPr>
+              <w:t xml:space="preserve">Processing cards show customer, gallons, refill or package, source, rider and delivery time; "Refill and seal; no status to tap".</w:t>
+            </w:r>
+          </w:p>
+        </w:tc>
+        <w:tc>
+          <w:tcPr>
+            <w:tcW w:type="dxa" w:w="900"/>
+            <w:tcBorders>
+              <w:top w:val="single" w:color="B9D7F2" w:sz="4"/>
+              <w:left w:val="single" w:color="B9D7F2" w:sz="4"/>
+              <w:bottom w:val="single" w:color="B9D7F2" w:sz="4"/>
+              <w:right w:val="single" w:color="B9D7F2" w:sz="4"/>
+            </w:tcBorders>
+            <w:tcMar>
+              <w:top w:type="dxa" w:w="60"/>
+              <w:left w:type="dxa" w:w="90"/>
+              <w:bottom w:type="dxa" w:w="60"/>
+              <w:right w:type="dxa" w:w="90"/>
+            </w:tcMar>
+          </w:tcPr>
+          <w:p>
+            <w:pPr>
+              <w:spacing w:after="0" w:before="0"/>
+            </w:pPr>
+            <w:r>
+              <w:rPr>
+                <w:rFonts w:ascii="Arial" w:cs="Arial" w:eastAsia="Arial" w:hAnsi="Arial"/>
+                <w:color w:val="15202B"/>
+                <w:sz w:val="18"/>
+                <w:szCs w:val="18"/>
+              </w:rPr>
+              <w:t xml:space="preserve">☐ Pass</w:t>
+            </w:r>
+          </w:p>
+          <w:p>
+            <w:pPr>
+              <w:spacing w:after="0" w:before="0"/>
+            </w:pPr>
+            <w:r>
+              <w:rPr>
+                <w:rFonts w:ascii="Arial" w:cs="Arial" w:eastAsia="Arial" w:hAnsi="Arial"/>
+                <w:color w:val="15202B"/>
+                <w:sz w:val="18"/>
+                <w:szCs w:val="18"/>
+              </w:rPr>
+              <w:t xml:space="preserve">☐ Fail</w:t>
+            </w:r>
+          </w:p>
+        </w:tc>
+        <w:tc>
+          <w:tcPr>
+            <w:tcW w:type="dxa" w:w="1206"/>
+            <w:tcBorders>
+              <w:top w:val="single" w:color="B9D7F2" w:sz="4"/>
+              <w:left w:val="single" w:color="B9D7F2" w:sz="4"/>
+              <w:bottom w:val="single" w:color="B9D7F2" w:sz="4"/>
+              <w:right w:val="single" w:color="B9D7F2" w:sz="4"/>
+            </w:tcBorders>
+            <w:tcMar>
+              <w:top w:type="dxa" w:w="60"/>
+              <w:left w:type="dxa" w:w="90"/>
+              <w:bottom w:type="dxa" w:w="60"/>
+              <w:right w:type="dxa" w:w="90"/>
+            </w:tcMar>
+          </w:tcPr>
+          <w:p>
+            <w:pPr>
+              <w:spacing w:after="0" w:before="0"/>
+            </w:pPr>
+            <w:r>
+              <w:rPr>
+                <w:rFonts w:ascii="Arial" w:cs="Arial" w:eastAsia="Arial" w:hAnsi="Arial"/>
+                <w:color w:val="15202B"/>
+                <w:sz w:val="18"/>
+                <w:szCs w:val="18"/>
+              </w:rPr>
+              <w:t xml:space="preserve"/>
+            </w:r>
+          </w:p>
+        </w:tc>
+      </w:tr>
+      <w:tr>
+        <w:trPr>
+          <w:cantSplit/>
+        </w:trPr>
+        <w:tc>
+          <w:tcPr>
+            <w:tcW w:type="dxa" w:w="640"/>
+            <w:tcBorders>
+              <w:top w:val="single" w:color="B9D7F2" w:sz="4"/>
+              <w:left w:val="single" w:color="B9D7F2" w:sz="4"/>
+              <w:bottom w:val="single" w:color="B9D7F2" w:sz="4"/>
+              <w:right w:val="single" w:color="B9D7F2" w:sz="4"/>
+            </w:tcBorders>
+            <w:shd w:fill="EAF4FD" w:color="auto" w:val="clear"/>
+            <w:tcMar>
+              <w:top w:type="dxa" w:w="60"/>
+              <w:left w:type="dxa" w:w="90"/>
+              <w:bottom w:type="dxa" w:w="60"/>
+              <w:right w:type="dxa" w:w="90"/>
+            </w:tcMar>
+          </w:tcPr>
+          <w:p>
+            <w:pPr>
+              <w:spacing w:after="0" w:before="0"/>
+            </w:pPr>
+            <w:r>
+              <w:rPr>
+                <w:rFonts w:ascii="Arial" w:cs="Arial" w:eastAsia="Arial" w:hAnsi="Arial"/>
+                <w:color w:val="15202B"/>
+                <w:sz w:val="18"/>
+                <w:szCs w:val="18"/>
+              </w:rPr>
+              <w:t xml:space="preserve">30.2</w:t>
+            </w:r>
+          </w:p>
+        </w:tc>
+        <w:tc>
+          <w:tcPr>
+            <w:tcW w:type="dxa" w:w="3820"/>
+            <w:tcBorders>
+              <w:top w:val="single" w:color="B9D7F2" w:sz="4"/>
+              <w:left w:val="single" w:color="B9D7F2" w:sz="4"/>
+              <w:bottom w:val="single" w:color="B9D7F2" w:sz="4"/>
+              <w:right w:val="single" w:color="B9D7F2" w:sz="4"/>
+            </w:tcBorders>
+            <w:shd w:fill="EAF4FD" w:color="auto" w:val="clear"/>
+            <w:tcMar>
+              <w:top w:type="dxa" w:w="60"/>
+              <w:left w:type="dxa" w:w="90"/>
+              <w:bottom w:type="dxa" w:w="60"/>
+              <w:right w:type="dxa" w:w="90"/>
+            </w:tcMar>
+          </w:tcPr>
+          <w:p>
+            <w:pPr>
+              <w:spacing w:after="0" w:before="0"/>
+            </w:pPr>
+            <w:r>
+              <w:rPr>
+                <w:rFonts w:ascii="Arial" w:cs="Arial" w:eastAsia="Arial" w:hAnsi="Arial"/>
+                <w:color w:val="15202B"/>
+                <w:sz w:val="18"/>
+                <w:szCs w:val="18"/>
+              </w:rPr>
+              <w:t xml:space="preserve">Tap a card.</w:t>
+            </w:r>
+          </w:p>
+        </w:tc>
+        <w:tc>
+          <w:tcPr>
+            <w:tcW w:type="dxa" w:w="3900"/>
+            <w:tcBorders>
+              <w:top w:val="single" w:color="B9D7F2" w:sz="4"/>
+              <w:left w:val="single" w:color="B9D7F2" w:sz="4"/>
+              <w:bottom w:val="single" w:color="B9D7F2" w:sz="4"/>
+              <w:right w:val="single" w:color="B9D7F2" w:sz="4"/>
+            </w:tcBorders>
+            <w:shd w:fill="EAF4FD" w:color="auto" w:val="clear"/>
+            <w:tcMar>
+              <w:top w:type="dxa" w:w="60"/>
+              <w:left w:type="dxa" w:w="90"/>
+              <w:bottom w:type="dxa" w:w="60"/>
+              <w:right w:type="dxa" w:w="90"/>
+            </w:tcMar>
+          </w:tcPr>
+          <w:p>
+            <w:pPr>
+              <w:spacing w:after="0" w:before="0"/>
+            </w:pPr>
+            <w:r>
+              <w:rPr>
+                <w:rFonts w:ascii="Arial" w:cs="Arial" w:eastAsia="Arial" w:hAnsi="Arial"/>
+                <w:color w:val="15202B"/>
+                <w:sz w:val="18"/>
+                <w:szCs w:val="18"/>
+              </w:rPr>
+              <w:t xml:space="preserve">Order Details (view only) with Mark Out for Delivery and Report damaged gallon.</w:t>
+            </w:r>
+          </w:p>
+        </w:tc>
+        <w:tc>
+          <w:tcPr>
+            <w:tcW w:type="dxa" w:w="900"/>
+            <w:tcBorders>
+              <w:top w:val="single" w:color="B9D7F2" w:sz="4"/>
+              <w:left w:val="single" w:color="B9D7F2" w:sz="4"/>
+              <w:bottom w:val="single" w:color="B9D7F2" w:sz="4"/>
+              <w:right w:val="single" w:color="B9D7F2" w:sz="4"/>
+            </w:tcBorders>
+            <w:shd w:fill="EAF4FD" w:color="auto" w:val="clear"/>
+            <w:tcMar>
+              <w:top w:type="dxa" w:w="60"/>
+              <w:left w:type="dxa" w:w="90"/>
+              <w:bottom w:type="dxa" w:w="60"/>
+              <w:right w:type="dxa" w:w="90"/>
+            </w:tcMar>
+          </w:tcPr>
+          <w:p>
+            <w:pPr>
+              <w:spacing w:after="0" w:before="0"/>
+            </w:pPr>
+            <w:r>
+              <w:rPr>
+                <w:rFonts w:ascii="Arial" w:cs="Arial" w:eastAsia="Arial" w:hAnsi="Arial"/>
+                <w:color w:val="15202B"/>
+                <w:sz w:val="18"/>
+                <w:szCs w:val="18"/>
+              </w:rPr>
+              <w:t xml:space="preserve">☐ Pass</w:t>
+            </w:r>
+          </w:p>
+          <w:p>
+            <w:pPr>
+              <w:spacing w:after="0" w:before="0"/>
+            </w:pPr>
+            <w:r>
+              <w:rPr>
+                <w:rFonts w:ascii="Arial" w:cs="Arial" w:eastAsia="Arial" w:hAnsi="Arial"/>
+                <w:color w:val="15202B"/>
+                <w:sz w:val="18"/>
+                <w:szCs w:val="18"/>
+              </w:rPr>
+              <w:t xml:space="preserve">☐ Fail</w:t>
+            </w:r>
+          </w:p>
+        </w:tc>
+        <w:tc>
+          <w:tcPr>
+            <w:tcW w:type="dxa" w:w="1206"/>
+            <w:tcBorders>
+              <w:top w:val="single" w:color="B9D7F2" w:sz="4"/>
+              <w:left w:val="single" w:color="B9D7F2" w:sz="4"/>
+              <w:bottom w:val="single" w:color="B9D7F2" w:sz="4"/>
+              <w:right w:val="single" w:color="B9D7F2" w:sz="4"/>
+            </w:tcBorders>
+            <w:shd w:fill="EAF4FD" w:color="auto" w:val="clear"/>
+            <w:tcMar>
+              <w:top w:type="dxa" w:w="60"/>
+              <w:left w:type="dxa" w:w="90"/>
+              <w:bottom w:type="dxa" w:w="60"/>
+              <w:right w:type="dxa" w:w="90"/>
+            </w:tcMar>
+          </w:tcPr>
+          <w:p>
+            <w:pPr>
+              <w:spacing w:after="0" w:before="0"/>
+            </w:pPr>
+            <w:r>
+              <w:rPr>
+                <w:rFonts w:ascii="Arial" w:cs="Arial" w:eastAsia="Arial" w:hAnsi="Arial"/>
+                <w:color w:val="15202B"/>
+                <w:sz w:val="18"/>
+                <w:szCs w:val="18"/>
+              </w:rPr>
+              <w:t xml:space="preserve"/>
+            </w:r>
+          </w:p>
+        </w:tc>
+      </w:tr>
+      <w:tr>
+        <w:trPr>
+          <w:cantSplit/>
+        </w:trPr>
+        <w:tc>
+          <w:tcPr>
+            <w:tcW w:type="dxa" w:w="640"/>
+            <w:tcBorders>
+              <w:top w:val="single" w:color="B9D7F2" w:sz="4"/>
+              <w:left w:val="single" w:color="B9D7F2" w:sz="4"/>
+              <w:bottom w:val="single" w:color="B9D7F2" w:sz="4"/>
+              <w:right w:val="single" w:color="B9D7F2" w:sz="4"/>
+            </w:tcBorders>
+            <w:tcMar>
+              <w:top w:type="dxa" w:w="60"/>
+              <w:left w:type="dxa" w:w="90"/>
+              <w:bottom w:type="dxa" w:w="60"/>
+              <w:right w:type="dxa" w:w="90"/>
+            </w:tcMar>
+          </w:tcPr>
+          <w:p>
+            <w:pPr>
+              <w:spacing w:after="0" w:before="0"/>
+            </w:pPr>
+            <w:r>
+              <w:rPr>
+                <w:rFonts w:ascii="Arial" w:cs="Arial" w:eastAsia="Arial" w:hAnsi="Arial"/>
+                <w:color w:val="15202B"/>
+                <w:sz w:val="18"/>
+                <w:szCs w:val="18"/>
+              </w:rPr>
+              <w:t xml:space="preserve">30.3</w:t>
+            </w:r>
+          </w:p>
+        </w:tc>
+        <w:tc>
+          <w:tcPr>
+            <w:tcW w:type="dxa" w:w="3820"/>
+            <w:tcBorders>
+              <w:top w:val="single" w:color="B9D7F2" w:sz="4"/>
+              <w:left w:val="single" w:color="B9D7F2" w:sz="4"/>
+              <w:bottom w:val="single" w:color="B9D7F2" w:sz="4"/>
+              <w:right w:val="single" w:color="B9D7F2" w:sz="4"/>
+            </w:tcBorders>
+            <w:tcMar>
+              <w:top w:type="dxa" w:w="60"/>
+              <w:left w:type="dxa" w:w="90"/>
+              <w:bottom w:type="dxa" w:w="60"/>
+              <w:right w:type="dxa" w:w="90"/>
+            </w:tcMar>
+          </w:tcPr>
+          <w:p>
+            <w:pPr>
+              <w:spacing w:after="0" w:before="0"/>
+            </w:pPr>
+            <w:r>
+              <w:rPr>
+                <w:rFonts w:ascii="Arial" w:cs="Arial" w:eastAsia="Arial" w:hAnsi="Arial"/>
+                <w:color w:val="15202B"/>
+                <w:sz w:val="18"/>
+                <w:szCs w:val="18"/>
+              </w:rPr>
+              <w:t xml:space="preserve">Staff: Done Today.</w:t>
+            </w:r>
+          </w:p>
+        </w:tc>
+        <w:tc>
+          <w:tcPr>
+            <w:tcW w:type="dxa" w:w="3900"/>
+            <w:tcBorders>
+              <w:top w:val="single" w:color="B9D7F2" w:sz="4"/>
+              <w:left w:val="single" w:color="B9D7F2" w:sz="4"/>
+              <w:bottom w:val="single" w:color="B9D7F2" w:sz="4"/>
+              <w:right w:val="single" w:color="B9D7F2" w:sz="4"/>
+            </w:tcBorders>
+            <w:tcMar>
+              <w:top w:type="dxa" w:w="60"/>
+              <w:left w:type="dxa" w:w="90"/>
+              <w:bottom w:type="dxa" w:w="60"/>
+              <w:right w:type="dxa" w:w="90"/>
+            </w:tcMar>
+          </w:tcPr>
+          <w:p>
+            <w:pPr>
+              <w:spacing w:after="0" w:before="0"/>
+            </w:pPr>
+            <w:r>
+              <w:rPr>
+                <w:rFonts w:ascii="Arial" w:cs="Arial" w:eastAsia="Arial" w:hAnsi="Arial"/>
+                <w:color w:val="15202B"/>
+                <w:sz w:val="18"/>
+                <w:szCs w:val="18"/>
+              </w:rPr>
+              <w:t xml:space="preserve">Gallons processed today (the same number as the tank counter added today); Orders list "Logged and sent out today, newest first" with time and "Walk-in saved", "Delivery logged" or "Sent out".</w:t>
+            </w:r>
+          </w:p>
+        </w:tc>
+        <w:tc>
+          <w:tcPr>
+            <w:tcW w:type="dxa" w:w="900"/>
+            <w:tcBorders>
+              <w:top w:val="single" w:color="B9D7F2" w:sz="4"/>
+              <w:left w:val="single" w:color="B9D7F2" w:sz="4"/>
+              <w:bottom w:val="single" w:color="B9D7F2" w:sz="4"/>
+              <w:right w:val="single" w:color="B9D7F2" w:sz="4"/>
+            </w:tcBorders>
+            <w:tcMar>
+              <w:top w:type="dxa" w:w="60"/>
+              <w:left w:type="dxa" w:w="90"/>
+              <w:bottom w:type="dxa" w:w="60"/>
+              <w:right w:type="dxa" w:w="90"/>
+            </w:tcMar>
+          </w:tcPr>
+          <w:p>
+            <w:pPr>
+              <w:spacing w:after="0" w:before="0"/>
+            </w:pPr>
+            <w:r>
+              <w:rPr>
+                <w:rFonts w:ascii="Arial" w:cs="Arial" w:eastAsia="Arial" w:hAnsi="Arial"/>
+                <w:color w:val="15202B"/>
+                <w:sz w:val="18"/>
+                <w:szCs w:val="18"/>
+              </w:rPr>
+              <w:t xml:space="preserve">☐ Pass</w:t>
+            </w:r>
+          </w:p>
+          <w:p>
+            <w:pPr>
+              <w:spacing w:after="0" w:before="0"/>
+            </w:pPr>
+            <w:r>
+              <w:rPr>
+                <w:rFonts w:ascii="Arial" w:cs="Arial" w:eastAsia="Arial" w:hAnsi="Arial"/>
+                <w:color w:val="15202B"/>
+                <w:sz w:val="18"/>
+                <w:szCs w:val="18"/>
+              </w:rPr>
+              <w:t xml:space="preserve">☐ Fail</w:t>
+            </w:r>
+          </w:p>
+        </w:tc>
+        <w:tc>
+          <w:tcPr>
+            <w:tcW w:type="dxa" w:w="1206"/>
+            <w:tcBorders>
+              <w:top w:val="single" w:color="B9D7F2" w:sz="4"/>
+              <w:left w:val="single" w:color="B9D7F2" w:sz="4"/>
+              <w:bottom w:val="single" w:color="B9D7F2" w:sz="4"/>
+              <w:right w:val="single" w:color="B9D7F2" w:sz="4"/>
+            </w:tcBorders>
+            <w:tcMar>
+              <w:top w:type="dxa" w:w="60"/>
+              <w:left w:type="dxa" w:w="90"/>
+              <w:bottom w:type="dxa" w:w="60"/>
+              <w:right w:type="dxa" w:w="90"/>
+            </w:tcMar>
+          </w:tcPr>
+          <w:p>
+            <w:pPr>
+              <w:spacing w:after="0" w:before="0"/>
+            </w:pPr>
+            <w:r>
+              <w:rPr>
+                <w:rFonts w:ascii="Arial" w:cs="Arial" w:eastAsia="Arial" w:hAnsi="Arial"/>
+                <w:color w:val="15202B"/>
+                <w:sz w:val="18"/>
+                <w:szCs w:val="18"/>
+              </w:rPr>
+              <w:t xml:space="preserve"/>
+            </w:r>
+          </w:p>
+        </w:tc>
+      </w:tr>
+      <w:tr>
+        <w:trPr>
+          <w:cantSplit/>
+        </w:trPr>
+        <w:tc>
+          <w:tcPr>
+            <w:tcW w:type="dxa" w:w="640"/>
+            <w:tcBorders>
+              <w:top w:val="single" w:color="B9D7F2" w:sz="4"/>
+              <w:left w:val="single" w:color="B9D7F2" w:sz="4"/>
+              <w:bottom w:val="single" w:color="B9D7F2" w:sz="4"/>
+              <w:right w:val="single" w:color="B9D7F2" w:sz="4"/>
+            </w:tcBorders>
+            <w:shd w:fill="EAF4FD" w:color="auto" w:val="clear"/>
+            <w:tcMar>
+              <w:top w:type="dxa" w:w="60"/>
+              <w:left w:type="dxa" w:w="90"/>
+              <w:bottom w:type="dxa" w:w="60"/>
+              <w:right w:type="dxa" w:w="90"/>
+            </w:tcMar>
+          </w:tcPr>
+          <w:p>
+            <w:pPr>
+              <w:spacing w:after="0" w:before="0"/>
+            </w:pPr>
+            <w:r>
+              <w:rPr>
+                <w:rFonts w:ascii="Arial" w:cs="Arial" w:eastAsia="Arial" w:hAnsi="Arial"/>
+                <w:color w:val="15202B"/>
+                <w:sz w:val="18"/>
+                <w:szCs w:val="18"/>
+              </w:rPr>
+              <w:t xml:space="preserve">30.4</w:t>
+            </w:r>
+          </w:p>
+        </w:tc>
+        <w:tc>
+          <w:tcPr>
+            <w:tcW w:type="dxa" w:w="3820"/>
+            <w:tcBorders>
+              <w:top w:val="single" w:color="B9D7F2" w:sz="4"/>
+              <w:left w:val="single" w:color="B9D7F2" w:sz="4"/>
+              <w:bottom w:val="single" w:color="B9D7F2" w:sz="4"/>
+              <w:right w:val="single" w:color="B9D7F2" w:sz="4"/>
+            </w:tcBorders>
+            <w:shd w:fill="EAF4FD" w:color="auto" w:val="clear"/>
+            <w:tcMar>
+              <w:top w:type="dxa" w:w="60"/>
+              <w:left w:type="dxa" w:w="90"/>
+              <w:bottom w:type="dxa" w:w="60"/>
+              <w:right w:type="dxa" w:w="90"/>
+            </w:tcMar>
+          </w:tcPr>
+          <w:p>
+            <w:pPr>
+              <w:spacing w:after="0" w:before="0"/>
+            </w:pPr>
+            <w:r>
+              <w:rPr>
+                <w:rFonts w:ascii="Arial" w:cs="Arial" w:eastAsia="Arial" w:hAnsi="Arial"/>
+                <w:color w:val="15202B"/>
+                <w:sz w:val="18"/>
+                <w:szCs w:val="18"/>
+              </w:rPr>
+              <w:t xml:space="preserve">Tap an entry.</w:t>
+            </w:r>
+          </w:p>
+        </w:tc>
+        <w:tc>
+          <w:tcPr>
+            <w:tcW w:type="dxa" w:w="3900"/>
+            <w:tcBorders>
+              <w:top w:val="single" w:color="B9D7F2" w:sz="4"/>
+              <w:left w:val="single" w:color="B9D7F2" w:sz="4"/>
+              <w:bottom w:val="single" w:color="B9D7F2" w:sz="4"/>
+              <w:right w:val="single" w:color="B9D7F2" w:sz="4"/>
+            </w:tcBorders>
+            <w:shd w:fill="EAF4FD" w:color="auto" w:val="clear"/>
+            <w:tcMar>
+              <w:top w:type="dxa" w:w="60"/>
+              <w:left w:type="dxa" w:w="90"/>
+              <w:bottom w:type="dxa" w:w="60"/>
+              <w:right w:type="dxa" w:w="90"/>
+            </w:tcMar>
+          </w:tcPr>
+          <w:p>
+            <w:pPr>
+              <w:spacing w:after="0" w:before="0"/>
+            </w:pPr>
+            <w:r>
+              <w:rPr>
+                <w:rFonts w:ascii="Arial" w:cs="Arial" w:eastAsia="Arial" w:hAnsi="Arial"/>
+                <w:color w:val="15202B"/>
+                <w:sz w:val="18"/>
+                <w:szCs w:val="18"/>
+              </w:rPr>
+              <w:t xml:space="preserve">Its Order Details (view only).</w:t>
+            </w:r>
+          </w:p>
+        </w:tc>
+        <w:tc>
+          <w:tcPr>
+            <w:tcW w:type="dxa" w:w="900"/>
+            <w:tcBorders>
+              <w:top w:val="single" w:color="B9D7F2" w:sz="4"/>
+              <w:left w:val="single" w:color="B9D7F2" w:sz="4"/>
+              <w:bottom w:val="single" w:color="B9D7F2" w:sz="4"/>
+              <w:right w:val="single" w:color="B9D7F2" w:sz="4"/>
+            </w:tcBorders>
+            <w:shd w:fill="EAF4FD" w:color="auto" w:val="clear"/>
+            <w:tcMar>
+              <w:top w:type="dxa" w:w="60"/>
+              <w:left w:type="dxa" w:w="90"/>
+              <w:bottom w:type="dxa" w:w="60"/>
+              <w:right w:type="dxa" w:w="90"/>
+            </w:tcMar>
+          </w:tcPr>
+          <w:p>
+            <w:pPr>
+              <w:spacing w:after="0" w:before="0"/>
+            </w:pPr>
+            <w:r>
+              <w:rPr>
+                <w:rFonts w:ascii="Arial" w:cs="Arial" w:eastAsia="Arial" w:hAnsi="Arial"/>
+                <w:color w:val="15202B"/>
+                <w:sz w:val="18"/>
+                <w:szCs w:val="18"/>
+              </w:rPr>
+              <w:t xml:space="preserve">☐ Pass</w:t>
+            </w:r>
+          </w:p>
+          <w:p>
+            <w:pPr>
+              <w:spacing w:after="0" w:before="0"/>
+            </w:pPr>
+            <w:r>
+              <w:rPr>
+                <w:rFonts w:ascii="Arial" w:cs="Arial" w:eastAsia="Arial" w:hAnsi="Arial"/>
+                <w:color w:val="15202B"/>
+                <w:sz w:val="18"/>
+                <w:szCs w:val="18"/>
+              </w:rPr>
+              <w:t xml:space="preserve">☐ Fail</w:t>
+            </w:r>
+          </w:p>
+        </w:tc>
+        <w:tc>
+          <w:tcPr>
+            <w:tcW w:type="dxa" w:w="1206"/>
+            <w:tcBorders>
+              <w:top w:val="single" w:color="B9D7F2" w:sz="4"/>
+              <w:left w:val="single" w:color="B9D7F2" w:sz="4"/>
+              <w:bottom w:val="single" w:color="B9D7F2" w:sz="4"/>
+              <w:right w:val="single" w:color="B9D7F2" w:sz="4"/>
+            </w:tcBorders>
+            <w:shd w:fill="EAF4FD" w:color="auto" w:val="clear"/>
+            <w:tcMar>
+              <w:top w:type="dxa" w:w="60"/>
+              <w:left w:type="dxa" w:w="90"/>
+              <w:bottom w:type="dxa" w:w="60"/>
+              <w:right w:type="dxa" w:w="90"/>
+            </w:tcMar>
+          </w:tcPr>
+          <w:p>
+            <w:pPr>
+              <w:spacing w:after="0" w:before="0"/>
+            </w:pPr>
+            <w:r>
+              <w:rPr>
+                <w:rFonts w:ascii="Arial" w:cs="Arial" w:eastAsia="Arial" w:hAnsi="Arial"/>
+                <w:color w:val="15202B"/>
+                <w:sz w:val="18"/>
+                <w:szCs w:val="18"/>
+              </w:rPr>
+              <w:t xml:space="preserve"/>
+            </w:r>
+          </w:p>
+        </w:tc>
+      </w:tr>
+      <w:tr>
+        <w:trPr>
+          <w:cantSplit/>
+        </w:trPr>
+        <w:tc>
+          <w:tcPr>
+            <w:tcW w:type="dxa" w:w="640"/>
+            <w:tcBorders>
+              <w:top w:val="single" w:color="B9D7F2" w:sz="4"/>
+              <w:left w:val="single" w:color="B9D7F2" w:sz="4"/>
+              <w:bottom w:val="single" w:color="B9D7F2" w:sz="4"/>
+              <w:right w:val="single" w:color="B9D7F2" w:sz="4"/>
+            </w:tcBorders>
+            <w:tcMar>
+              <w:top w:type="dxa" w:w="60"/>
+              <w:left w:type="dxa" w:w="90"/>
+              <w:bottom w:type="dxa" w:w="60"/>
+              <w:right w:type="dxa" w:w="90"/>
+            </w:tcMar>
+          </w:tcPr>
+          <w:p>
+            <w:pPr>
+              <w:spacing w:after="0" w:before="0"/>
+            </w:pPr>
+            <w:r>
+              <w:rPr>
+                <w:rFonts w:ascii="Arial" w:cs="Arial" w:eastAsia="Arial" w:hAnsi="Arial"/>
+                <w:color w:val="15202B"/>
+                <w:sz w:val="18"/>
+                <w:szCs w:val="18"/>
+              </w:rPr>
+              <w:t xml:space="preserve">30.5</w:t>
+            </w:r>
+          </w:p>
+        </w:tc>
+        <w:tc>
+          <w:tcPr>
+            <w:tcW w:type="dxa" w:w="3820"/>
+            <w:tcBorders>
+              <w:top w:val="single" w:color="B9D7F2" w:sz="4"/>
+              <w:left w:val="single" w:color="B9D7F2" w:sz="4"/>
+              <w:bottom w:val="single" w:color="B9D7F2" w:sz="4"/>
+              <w:right w:val="single" w:color="B9D7F2" w:sz="4"/>
+            </w:tcBorders>
+            <w:tcMar>
+              <w:top w:type="dxa" w:w="60"/>
+              <w:left w:type="dxa" w:w="90"/>
+              <w:bottom w:type="dxa" w:w="60"/>
+              <w:right w:type="dxa" w:w="90"/>
+            </w:tcMar>
+          </w:tcPr>
+          <w:p>
+            <w:pPr>
+              <w:spacing w:after="0" w:before="0"/>
+            </w:pPr>
+            <w:r>
+              <w:rPr>
+                <w:rFonts w:ascii="Arial" w:cs="Arial" w:eastAsia="Arial" w:hAnsi="Arial"/>
+                <w:color w:val="15202B"/>
+                <w:sz w:val="18"/>
+                <w:szCs w:val="18"/>
+              </w:rPr>
+              <w:t xml:space="preserve">Rider: Done Today after delivering a few orders.</w:t>
+            </w:r>
+          </w:p>
+        </w:tc>
+        <w:tc>
+          <w:tcPr>
+            <w:tcW w:type="dxa" w:w="3900"/>
+            <w:tcBorders>
+              <w:top w:val="single" w:color="B9D7F2" w:sz="4"/>
+              <w:left w:val="single" w:color="B9D7F2" w:sz="4"/>
+              <w:bottom w:val="single" w:color="B9D7F2" w:sz="4"/>
+              <w:right w:val="single" w:color="B9D7F2" w:sz="4"/>
+            </w:tcBorders>
+            <w:tcMar>
+              <w:top w:type="dxa" w:w="60"/>
+              <w:left w:type="dxa" w:w="90"/>
+              <w:bottom w:type="dxa" w:w="60"/>
+              <w:right w:type="dxa" w:w="90"/>
+            </w:tcMar>
+          </w:tcPr>
+          <w:p>
+            <w:pPr>
+              <w:spacing w:after="0" w:before="0"/>
+            </w:pPr>
+            <w:r>
+              <w:rPr>
+                <w:rFonts w:ascii="Arial" w:cs="Arial" w:eastAsia="Arial" w:hAnsi="Arial"/>
+                <w:color w:val="15202B"/>
+                <w:sz w:val="18"/>
+                <w:szCs w:val="18"/>
+              </w:rPr>
+              <w:t xml:space="preserve">Delivered today count; Paid total (cash collected); Unpaid "n orders"; Orders list newest first with Paid or Unpaid tags.</w:t>
+            </w:r>
+          </w:p>
+        </w:tc>
+        <w:tc>
+          <w:tcPr>
+            <w:tcW w:type="dxa" w:w="900"/>
+            <w:tcBorders>
+              <w:top w:val="single" w:color="B9D7F2" w:sz="4"/>
+              <w:left w:val="single" w:color="B9D7F2" w:sz="4"/>
+              <w:bottom w:val="single" w:color="B9D7F2" w:sz="4"/>
+              <w:right w:val="single" w:color="B9D7F2" w:sz="4"/>
+            </w:tcBorders>
+            <w:tcMar>
+              <w:top w:type="dxa" w:w="60"/>
+              <w:left w:type="dxa" w:w="90"/>
+              <w:bottom w:type="dxa" w:w="60"/>
+              <w:right w:type="dxa" w:w="90"/>
+            </w:tcMar>
+          </w:tcPr>
+          <w:p>
+            <w:pPr>
+              <w:spacing w:after="0" w:before="0"/>
+            </w:pPr>
+            <w:r>
+              <w:rPr>
+                <w:rFonts w:ascii="Arial" w:cs="Arial" w:eastAsia="Arial" w:hAnsi="Arial"/>
+                <w:color w:val="15202B"/>
+                <w:sz w:val="18"/>
+                <w:szCs w:val="18"/>
+              </w:rPr>
+              <w:t xml:space="preserve">☐ Pass</w:t>
+            </w:r>
+          </w:p>
+          <w:p>
+            <w:pPr>
+              <w:spacing w:after="0" w:before="0"/>
+            </w:pPr>
+            <w:r>
+              <w:rPr>
+                <w:rFonts w:ascii="Arial" w:cs="Arial" w:eastAsia="Arial" w:hAnsi="Arial"/>
+                <w:color w:val="15202B"/>
+                <w:sz w:val="18"/>
+                <w:szCs w:val="18"/>
+              </w:rPr>
+              <w:t xml:space="preserve">☐ Fail</w:t>
+            </w:r>
+          </w:p>
+        </w:tc>
+        <w:tc>
+          <w:tcPr>
+            <w:tcW w:type="dxa" w:w="1206"/>
+            <w:tcBorders>
+              <w:top w:val="single" w:color="B9D7F2" w:sz="4"/>
+              <w:left w:val="single" w:color="B9D7F2" w:sz="4"/>
+              <w:bottom w:val="single" w:color="B9D7F2" w:sz="4"/>
+              <w:right w:val="single" w:color="B9D7F2" w:sz="4"/>
+            </w:tcBorders>
+            <w:tcMar>
+              <w:top w:type="dxa" w:w="60"/>
+              <w:left w:type="dxa" w:w="90"/>
+              <w:bottom w:type="dxa" w:w="60"/>
+              <w:right w:type="dxa" w:w="90"/>
+            </w:tcMar>
+          </w:tcPr>
+          <w:p>
+            <w:pPr>
+              <w:spacing w:after="0" w:before="0"/>
+            </w:pPr>
+            <w:r>
+              <w:rPr>
+                <w:rFonts w:ascii="Arial" w:cs="Arial" w:eastAsia="Arial" w:hAnsi="Arial"/>
+                <w:color w:val="15202B"/>
+                <w:sz w:val="18"/>
+                <w:szCs w:val="18"/>
+              </w:rPr>
+              <w:t xml:space="preserve"/>
+            </w:r>
+          </w:p>
+        </w:tc>
+      </w:tr>
+      <w:tr>
+        <w:trPr>
+          <w:cantSplit/>
+        </w:trPr>
+        <w:tc>
+          <w:tcPr>
+            <w:tcW w:type="dxa" w:w="640"/>
+            <w:tcBorders>
+              <w:top w:val="single" w:color="B9D7F2" w:sz="4"/>
+              <w:left w:val="single" w:color="B9D7F2" w:sz="4"/>
+              <w:bottom w:val="single" w:color="B9D7F2" w:sz="4"/>
+              <w:right w:val="single" w:color="B9D7F2" w:sz="4"/>
+            </w:tcBorders>
+            <w:shd w:fill="EAF4FD" w:color="auto" w:val="clear"/>
+            <w:tcMar>
+              <w:top w:type="dxa" w:w="60"/>
+              <w:left w:type="dxa" w:w="90"/>
+              <w:bottom w:type="dxa" w:w="60"/>
+              <w:right w:type="dxa" w:w="90"/>
+            </w:tcMar>
+          </w:tcPr>
+          <w:p>
+            <w:pPr>
+              <w:spacing w:after="0" w:before="0"/>
+            </w:pPr>
+            <w:r>
+              <w:rPr>
+                <w:rFonts w:ascii="Arial" w:cs="Arial" w:eastAsia="Arial" w:hAnsi="Arial"/>
+                <w:color w:val="15202B"/>
+                <w:sz w:val="18"/>
+                <w:szCs w:val="18"/>
+              </w:rPr>
+              <w:t xml:space="preserve">30.6</w:t>
+            </w:r>
+          </w:p>
+        </w:tc>
+        <w:tc>
+          <w:tcPr>
+            <w:tcW w:type="dxa" w:w="3820"/>
+            <w:tcBorders>
+              <w:top w:val="single" w:color="B9D7F2" w:sz="4"/>
+              <w:left w:val="single" w:color="B9D7F2" w:sz="4"/>
+              <w:bottom w:val="single" w:color="B9D7F2" w:sz="4"/>
+              <w:right w:val="single" w:color="B9D7F2" w:sz="4"/>
+            </w:tcBorders>
+            <w:shd w:fill="EAF4FD" w:color="auto" w:val="clear"/>
+            <w:tcMar>
+              <w:top w:type="dxa" w:w="60"/>
+              <w:left w:type="dxa" w:w="90"/>
+              <w:bottom w:type="dxa" w:w="60"/>
+              <w:right w:type="dxa" w:w="90"/>
+            </w:tcMar>
+          </w:tcPr>
+          <w:p>
+            <w:pPr>
+              <w:spacing w:after="0" w:before="0"/>
+            </w:pPr>
+            <w:r>
+              <w:rPr>
+                <w:rFonts w:ascii="Arial" w:cs="Arial" w:eastAsia="Arial" w:hAnsi="Arial"/>
+                <w:color w:val="15202B"/>
+                <w:sz w:val="18"/>
+                <w:szCs w:val="18"/>
+              </w:rPr>
+              <w:t xml:space="preserve">Tap a delivered order.</w:t>
+            </w:r>
+          </w:p>
+        </w:tc>
+        <w:tc>
+          <w:tcPr>
+            <w:tcW w:type="dxa" w:w="3900"/>
+            <w:tcBorders>
+              <w:top w:val="single" w:color="B9D7F2" w:sz="4"/>
+              <w:left w:val="single" w:color="B9D7F2" w:sz="4"/>
+              <w:bottom w:val="single" w:color="B9D7F2" w:sz="4"/>
+              <w:right w:val="single" w:color="B9D7F2" w:sz="4"/>
+            </w:tcBorders>
+            <w:shd w:fill="EAF4FD" w:color="auto" w:val="clear"/>
+            <w:tcMar>
+              <w:top w:type="dxa" w:w="60"/>
+              <w:left w:type="dxa" w:w="90"/>
+              <w:bottom w:type="dxa" w:w="60"/>
+              <w:right w:type="dxa" w:w="90"/>
+            </w:tcMar>
+          </w:tcPr>
+          <w:p>
+            <w:pPr>
+              <w:spacing w:after="0" w:before="0"/>
+            </w:pPr>
+            <w:r>
+              <w:rPr>
+                <w:rFonts w:ascii="Arial" w:cs="Arial" w:eastAsia="Arial" w:hAnsi="Arial"/>
+                <w:color w:val="15202B"/>
+                <w:sz w:val="18"/>
+                <w:szCs w:val="18"/>
+              </w:rPr>
+              <w:t xml:space="preserve">Order Details (view only): name, address, gallons, amount, payment, time delivered.</w:t>
+            </w:r>
+          </w:p>
+        </w:tc>
+        <w:tc>
+          <w:tcPr>
+            <w:tcW w:type="dxa" w:w="900"/>
+            <w:tcBorders>
+              <w:top w:val="single" w:color="B9D7F2" w:sz="4"/>
+              <w:left w:val="single" w:color="B9D7F2" w:sz="4"/>
+              <w:bottom w:val="single" w:color="B9D7F2" w:sz="4"/>
+              <w:right w:val="single" w:color="B9D7F2" w:sz="4"/>
+            </w:tcBorders>
+            <w:shd w:fill="EAF4FD" w:color="auto" w:val="clear"/>
+            <w:tcMar>
+              <w:top w:type="dxa" w:w="60"/>
+              <w:left w:type="dxa" w:w="90"/>
+              <w:bottom w:type="dxa" w:w="60"/>
+              <w:right w:type="dxa" w:w="90"/>
+            </w:tcMar>
+          </w:tcPr>
+          <w:p>
+            <w:pPr>
+              <w:spacing w:after="0" w:before="0"/>
+            </w:pPr>
+            <w:r>
+              <w:rPr>
+                <w:rFonts w:ascii="Arial" w:cs="Arial" w:eastAsia="Arial" w:hAnsi="Arial"/>
+                <w:color w:val="15202B"/>
+                <w:sz w:val="18"/>
+                <w:szCs w:val="18"/>
+              </w:rPr>
+              <w:t xml:space="preserve">☐ Pass</w:t>
+            </w:r>
+          </w:p>
+          <w:p>
+            <w:pPr>
+              <w:spacing w:after="0" w:before="0"/>
+            </w:pPr>
+            <w:r>
+              <w:rPr>
+                <w:rFonts w:ascii="Arial" w:cs="Arial" w:eastAsia="Arial" w:hAnsi="Arial"/>
+                <w:color w:val="15202B"/>
+                <w:sz w:val="18"/>
+                <w:szCs w:val="18"/>
+              </w:rPr>
+              <w:t xml:space="preserve">☐ Fail</w:t>
+            </w:r>
+          </w:p>
+        </w:tc>
+        <w:tc>
+          <w:tcPr>
+            <w:tcW w:type="dxa" w:w="1206"/>
+            <w:tcBorders>
+              <w:top w:val="single" w:color="B9D7F2" w:sz="4"/>
+              <w:left w:val="single" w:color="B9D7F2" w:sz="4"/>
+              <w:bottom w:val="single" w:color="B9D7F2" w:sz="4"/>
+              <w:right w:val="single" w:color="B9D7F2" w:sz="4"/>
+            </w:tcBorders>
+            <w:shd w:fill="EAF4FD" w:color="auto" w:val="clear"/>
+            <w:tcMar>
+              <w:top w:type="dxa" w:w="60"/>
+              <w:left w:type="dxa" w:w="90"/>
+              <w:bottom w:type="dxa" w:w="60"/>
+              <w:right w:type="dxa" w:w="90"/>
+            </w:tcMar>
+          </w:tcPr>
+          <w:p>
+            <w:pPr>
+              <w:spacing w:after="0" w:before="0"/>
+            </w:pPr>
+            <w:r>
+              <w:rPr>
+                <w:rFonts w:ascii="Arial" w:cs="Arial" w:eastAsia="Arial" w:hAnsi="Arial"/>
+                <w:color w:val="15202B"/>
+                <w:sz w:val="18"/>
+                <w:szCs w:val="18"/>
+              </w:rPr>
+              <w:t xml:space="preserve"/>
+            </w:r>
+          </w:p>
+        </w:tc>
+      </w:tr>
+      <w:tr>
+        <w:trPr>
+          <w:cantSplit/>
+        </w:trPr>
+        <w:tc>
+          <w:tcPr>
+            <w:tcW w:type="dxa" w:w="640"/>
+            <w:tcBorders>
+              <w:top w:val="single" w:color="B9D7F2" w:sz="4"/>
+              <w:left w:val="single" w:color="B9D7F2" w:sz="4"/>
+              <w:bottom w:val="single" w:color="B9D7F2" w:sz="4"/>
+              <w:right w:val="single" w:color="B9D7F2" w:sz="4"/>
+            </w:tcBorders>
+            <w:tcMar>
+              <w:top w:type="dxa" w:w="60"/>
+              <w:left w:type="dxa" w:w="90"/>
+              <w:bottom w:type="dxa" w:w="60"/>
+              <w:right w:type="dxa" w:w="90"/>
+            </w:tcMar>
+          </w:tcPr>
+          <w:p>
+            <w:pPr>
+              <w:spacing w:after="0" w:before="0"/>
+            </w:pPr>
+            <w:r>
+              <w:rPr>
+                <w:rFonts w:ascii="Arial" w:cs="Arial" w:eastAsia="Arial" w:hAnsi="Arial"/>
+                <w:color w:val="15202B"/>
+                <w:sz w:val="18"/>
+                <w:szCs w:val="18"/>
+              </w:rPr>
+              <w:t xml:space="preserve">30.7</w:t>
+            </w:r>
+          </w:p>
+        </w:tc>
+        <w:tc>
+          <w:tcPr>
+            <w:tcW w:type="dxa" w:w="3820"/>
+            <w:tcBorders>
+              <w:top w:val="single" w:color="B9D7F2" w:sz="4"/>
+              <w:left w:val="single" w:color="B9D7F2" w:sz="4"/>
+              <w:bottom w:val="single" w:color="B9D7F2" w:sz="4"/>
+              <w:right w:val="single" w:color="B9D7F2" w:sz="4"/>
+            </w:tcBorders>
+            <w:tcMar>
+              <w:top w:type="dxa" w:w="60"/>
+              <w:left w:type="dxa" w:w="90"/>
+              <w:bottom w:type="dxa" w:w="60"/>
+              <w:right w:type="dxa" w:w="90"/>
+            </w:tcMar>
+          </w:tcPr>
+          <w:p>
+            <w:pPr>
+              <w:spacing w:after="0" w:before="0"/>
+            </w:pPr>
+            <w:r>
+              <w:rPr>
+                <w:rFonts w:ascii="Arial" w:cs="Arial" w:eastAsia="Arial" w:hAnsi="Arial"/>
+                <w:color w:val="15202B"/>
+                <w:sz w:val="18"/>
+                <w:szCs w:val="18"/>
+              </w:rPr>
+              <w:t xml:space="preserve">Owner: switch to Staff view, then Delivery view.</w:t>
+            </w:r>
+          </w:p>
+        </w:tc>
+        <w:tc>
+          <w:tcPr>
+            <w:tcW w:type="dxa" w:w="3900"/>
+            <w:tcBorders>
+              <w:top w:val="single" w:color="B9D7F2" w:sz="4"/>
+              <w:left w:val="single" w:color="B9D7F2" w:sz="4"/>
+              <w:bottom w:val="single" w:color="B9D7F2" w:sz="4"/>
+              <w:right w:val="single" w:color="B9D7F2" w:sz="4"/>
+            </w:tcBorders>
+            <w:tcMar>
+              <w:top w:type="dxa" w:w="60"/>
+              <w:left w:type="dxa" w:w="90"/>
+              <w:bottom w:type="dxa" w:w="60"/>
+              <w:right w:type="dxa" w:w="90"/>
+            </w:tcMar>
+          </w:tcPr>
+          <w:p>
+            <w:pPr>
+              <w:spacing w:after="0" w:before="0"/>
+            </w:pPr>
+            <w:r>
+              <w:rPr>
+                <w:rFonts w:ascii="Arial" w:cs="Arial" w:eastAsia="Arial" w:hAnsi="Arial"/>
+                <w:color w:val="15202B"/>
+                <w:sz w:val="18"/>
+                <w:szCs w:val="18"/>
+              </w:rPr>
+              <w:t xml:space="preserve">The owner sees the same To Do / Done Today and Deliveries / Done Today screens.</w:t>
+            </w:r>
+          </w:p>
+        </w:tc>
+        <w:tc>
+          <w:tcPr>
+            <w:tcW w:type="dxa" w:w="900"/>
+            <w:tcBorders>
+              <w:top w:val="single" w:color="B9D7F2" w:sz="4"/>
+              <w:left w:val="single" w:color="B9D7F2" w:sz="4"/>
+              <w:bottom w:val="single" w:color="B9D7F2" w:sz="4"/>
+              <w:right w:val="single" w:color="B9D7F2" w:sz="4"/>
+            </w:tcBorders>
+            <w:tcMar>
+              <w:top w:type="dxa" w:w="60"/>
+              <w:left w:type="dxa" w:w="90"/>
+              <w:bottom w:type="dxa" w:w="60"/>
+              <w:right w:type="dxa" w:w="90"/>
+            </w:tcMar>
+          </w:tcPr>
+          <w:p>
+            <w:pPr>
+              <w:spacing w:after="0" w:before="0"/>
+            </w:pPr>
+            <w:r>
+              <w:rPr>
+                <w:rFonts w:ascii="Arial" w:cs="Arial" w:eastAsia="Arial" w:hAnsi="Arial"/>
+                <w:color w:val="15202B"/>
+                <w:sz w:val="18"/>
+                <w:szCs w:val="18"/>
+              </w:rPr>
+              <w:t xml:space="preserve">☐ Pass</w:t>
+            </w:r>
+          </w:p>
+          <w:p>
+            <w:pPr>
+              <w:spacing w:after="0" w:before="0"/>
+            </w:pPr>
+            <w:r>
+              <w:rPr>
+                <w:rFonts w:ascii="Arial" w:cs="Arial" w:eastAsia="Arial" w:hAnsi="Arial"/>
+                <w:color w:val="15202B"/>
+                <w:sz w:val="18"/>
+                <w:szCs w:val="18"/>
+              </w:rPr>
+              <w:t xml:space="preserve">☐ Fail</w:t>
+            </w:r>
+          </w:p>
+        </w:tc>
+        <w:tc>
+          <w:tcPr>
+            <w:tcW w:type="dxa" w:w="1206"/>
+            <w:tcBorders>
+              <w:top w:val="single" w:color="B9D7F2" w:sz="4"/>
+              <w:left w:val="single" w:color="B9D7F2" w:sz="4"/>
+              <w:bottom w:val="single" w:color="B9D7F2" w:sz="4"/>
+              <w:right w:val="single" w:color="B9D7F2" w:sz="4"/>
+            </w:tcBorders>
+            <w:tcMar>
+              <w:top w:type="dxa" w:w="60"/>
+              <w:left w:type="dxa" w:w="90"/>
+              <w:bottom w:type="dxa" w:w="60"/>
+              <w:right w:type="dxa" w:w="90"/>
+            </w:tcMar>
+          </w:tcPr>
+          <w:p>
+            <w:pPr>
+              <w:spacing w:after="0" w:before="0"/>
+            </w:pPr>
+            <w:r>
+              <w:rPr>
+                <w:rFonts w:ascii="Arial" w:cs="Arial" w:eastAsia="Arial" w:hAnsi="Arial"/>
+                <w:color w:val="15202B"/>
+                <w:sz w:val="18"/>
+                <w:szCs w:val="18"/>
+              </w:rPr>
+              <w:t xml:space="preserve"/>
+            </w:r>
+          </w:p>
+        </w:tc>
+      </w:tr>
+    </w:tbl>
+    <w:p>
+      <w:pPr>
+        <w:pStyle w:val="Heading1"/>
+        <w:pageBreakBefore/>
+        <w:spacing w:after="60"/>
+      </w:pPr>
+      <w:r>
+        <w:rPr>
+          <w:rFonts w:ascii="Arial" w:cs="Arial" w:eastAsia="Arial" w:hAnsi="Arial"/>
+          <w:b/>
+          <w:bCs/>
+          <w:color w:val="0A84E0"/>
+          <w:sz w:val="28"/>
+          <w:szCs w:val="28"/>
+        </w:rPr>
+        <w:t xml:space="preserve">Step 31 · Owner in-app alerts</w:t>
+      </w:r>
+    </w:p>
+    <w:p>
+      <w:pPr>
+        <w:spacing w:after="60" w:before="0"/>
+      </w:pPr>
+      <w:r>
+        <w:rPr>
+          <w:rFonts w:ascii="Arial" w:cs="Arial" w:eastAsia="Arial" w:hAnsi="Arial"/>
+          <w:b/>
+          <w:bCs/>
+          <w:color w:val="15202B"/>
+          <w:sz w:val="19"/>
+          <w:szCs w:val="19"/>
+        </w:rPr>
+        <w:t xml:space="preserve">Screens: </w:t>
+      </w:r>
+      <w:r>
+        <w:rPr>
+          <w:rFonts w:ascii="Arial" w:cs="Arial" w:eastAsia="Arial" w:hAnsi="Arial"/>
+          <w:color w:val="15202B"/>
+          <w:sz w:val="19"/>
+          <w:szCs w:val="19"/>
+        </w:rPr>
+        <w:t xml:space="preserve">Admin More 4</w:t>
+      </w:r>
+      <w:r>
+        <w:rPr>
+          <w:rFonts w:ascii="Arial" w:cs="Arial" w:eastAsia="Arial" w:hAnsi="Arial"/>
+          <w:b/>
+          <w:bCs/>
+          <w:color w:val="15202B"/>
+          <w:sz w:val="19"/>
+          <w:szCs w:val="19"/>
+        </w:rPr>
+        <w:t xml:space="preserve">    Log in as: </w:t>
+      </w:r>
+      <w:r>
+        <w:rPr>
+          <w:rFonts w:ascii="Arial" w:cs="Arial" w:eastAsia="Arial" w:hAnsi="Arial"/>
+          <w:color w:val="15202B"/>
+          <w:sz w:val="19"/>
+          <w:szCs w:val="19"/>
+        </w:rPr>
+        <w:t xml:space="preserve">Owner (with a staff, rider and customer doing things in another window)</w:t>
+      </w:r>
+    </w:p>
+    <w:tbl>
+      <w:tblPr>
+        <w:tblW w:type="dxa" w:w="10466"/>
+        <w:tblBorders>
+          <w:top w:val="single" w:color="auto" w:sz="4"/>
+          <w:left w:val="single" w:color="auto" w:sz="4"/>
+          <w:bottom w:val="single" w:color="auto" w:sz="4"/>
+          <w:right w:val="single" w:color="auto" w:sz="4"/>
+          <w:insideH w:val="single" w:color="auto" w:sz="4"/>
+          <w:insideV w:val="single" w:color="auto" w:sz="4"/>
+        </w:tblBorders>
+        <w:tblLayout w:type="fixed"/>
+      </w:tblPr>
+      <w:tblGrid>
+        <w:gridCol w:w="640"/>
+        <w:gridCol w:w="3820"/>
+        <w:gridCol w:w="3900"/>
+        <w:gridCol w:w="900"/>
+        <w:gridCol w:w="1206"/>
+      </w:tblGrid>
+      <w:tr>
+        <w:trPr>
+          <w:tblHeader/>
+        </w:trPr>
+        <w:tc>
+          <w:tcPr>
+            <w:tcW w:type="dxa" w:w="640"/>
+            <w:tcBorders>
+              <w:top w:val="single" w:color="B9D7F2" w:sz="4"/>
+              <w:left w:val="single" w:color="B9D7F2" w:sz="4"/>
+              <w:bottom w:val="single" w:color="B9D7F2" w:sz="4"/>
+              <w:right w:val="single" w:color="B9D7F2" w:sz="4"/>
+            </w:tcBorders>
+            <w:shd w:fill="0A84E0" w:color="auto" w:val="clear"/>
+            <w:tcMar>
+              <w:top w:type="dxa" w:w="60"/>
+              <w:left w:type="dxa" w:w="90"/>
+              <w:bottom w:type="dxa" w:w="60"/>
+              <w:right w:type="dxa" w:w="90"/>
+            </w:tcMar>
+          </w:tcPr>
+          <w:p>
+            <w:pPr>
+              <w:spacing w:after="0" w:before="0"/>
+            </w:pPr>
+            <w:r>
+              <w:rPr>
+                <w:rFonts w:ascii="Arial" w:cs="Arial" w:eastAsia="Arial" w:hAnsi="Arial"/>
+                <w:b/>
+                <w:bCs/>
+                <w:color w:val="FFFFFF"/>
+                <w:sz w:val="18"/>
+                <w:szCs w:val="18"/>
+              </w:rPr>
+              <w:t xml:space="preserve">#</w:t>
+            </w:r>
+          </w:p>
+        </w:tc>
+        <w:tc>
+          <w:tcPr>
+            <w:tcW w:type="dxa" w:w="3820"/>
+            <w:tcBorders>
+              <w:top w:val="single" w:color="B9D7F2" w:sz="4"/>
+              <w:left w:val="single" w:color="B9D7F2" w:sz="4"/>
+              <w:bottom w:val="single" w:color="B9D7F2" w:sz="4"/>
+              <w:right w:val="single" w:color="B9D7F2" w:sz="4"/>
+            </w:tcBorders>
+            <w:shd w:fill="0A84E0" w:color="auto" w:val="clear"/>
+            <w:tcMar>
+              <w:top w:type="dxa" w:w="60"/>
+              <w:left w:type="dxa" w:w="90"/>
+              <w:bottom w:type="dxa" w:w="60"/>
+              <w:right w:type="dxa" w:w="90"/>
+            </w:tcMar>
+          </w:tcPr>
+          <w:p>
+            <w:pPr>
+              <w:spacing w:after="0" w:before="0"/>
+            </w:pPr>
+            <w:r>
+              <w:rPr>
+                <w:rFonts w:ascii="Arial" w:cs="Arial" w:eastAsia="Arial" w:hAnsi="Arial"/>
+                <w:b/>
+                <w:bCs/>
+                <w:color w:val="FFFFFF"/>
+                <w:sz w:val="18"/>
+                <w:szCs w:val="18"/>
+              </w:rPr>
+              <w:t xml:space="preserve">What to do</w:t>
+            </w:r>
+          </w:p>
+        </w:tc>
+        <w:tc>
+          <w:tcPr>
+            <w:tcW w:type="dxa" w:w="3900"/>
+            <w:tcBorders>
+              <w:top w:val="single" w:color="B9D7F2" w:sz="4"/>
+              <w:left w:val="single" w:color="B9D7F2" w:sz="4"/>
+              <w:bottom w:val="single" w:color="B9D7F2" w:sz="4"/>
+              <w:right w:val="single" w:color="B9D7F2" w:sz="4"/>
+            </w:tcBorders>
+            <w:shd w:fill="0A84E0" w:color="auto" w:val="clear"/>
+            <w:tcMar>
+              <w:top w:type="dxa" w:w="60"/>
+              <w:left w:type="dxa" w:w="90"/>
+              <w:bottom w:type="dxa" w:w="60"/>
+              <w:right w:type="dxa" w:w="90"/>
+            </w:tcMar>
+          </w:tcPr>
+          <w:p>
+            <w:pPr>
+              <w:spacing w:after="0" w:before="0"/>
+            </w:pPr>
+            <w:r>
+              <w:rPr>
+                <w:rFonts w:ascii="Arial" w:cs="Arial" w:eastAsia="Arial" w:hAnsi="Arial"/>
+                <w:b/>
+                <w:bCs/>
+                <w:color w:val="FFFFFF"/>
+                <w:sz w:val="18"/>
+                <w:szCs w:val="18"/>
+              </w:rPr>
+              <w:t xml:space="preserve">What you should see</w:t>
+            </w:r>
+          </w:p>
+        </w:tc>
+        <w:tc>
+          <w:tcPr>
+            <w:tcW w:type="dxa" w:w="900"/>
+            <w:tcBorders>
+              <w:top w:val="single" w:color="B9D7F2" w:sz="4"/>
+              <w:left w:val="single" w:color="B9D7F2" w:sz="4"/>
+              <w:bottom w:val="single" w:color="B9D7F2" w:sz="4"/>
+              <w:right w:val="single" w:color="B9D7F2" w:sz="4"/>
+            </w:tcBorders>
+            <w:shd w:fill="0A84E0" w:color="auto" w:val="clear"/>
+            <w:tcMar>
+              <w:top w:type="dxa" w:w="60"/>
+              <w:left w:type="dxa" w:w="90"/>
+              <w:bottom w:type="dxa" w:w="60"/>
+              <w:right w:type="dxa" w:w="90"/>
+            </w:tcMar>
+          </w:tcPr>
+          <w:p>
+            <w:pPr>
+              <w:spacing w:after="0" w:before="0"/>
+            </w:pPr>
+            <w:r>
+              <w:rPr>
+                <w:rFonts w:ascii="Arial" w:cs="Arial" w:eastAsia="Arial" w:hAnsi="Arial"/>
+                <w:b/>
+                <w:bCs/>
+                <w:color w:val="FFFFFF"/>
+                <w:sz w:val="18"/>
+                <w:szCs w:val="18"/>
+              </w:rPr>
+              <w:t xml:space="preserve">Result</w:t>
+            </w:r>
+          </w:p>
+        </w:tc>
+        <w:tc>
+          <w:tcPr>
+            <w:tcW w:type="dxa" w:w="1206"/>
+            <w:tcBorders>
+              <w:top w:val="single" w:color="B9D7F2" w:sz="4"/>
+              <w:left w:val="single" w:color="B9D7F2" w:sz="4"/>
+              <w:bottom w:val="single" w:color="B9D7F2" w:sz="4"/>
+              <w:right w:val="single" w:color="B9D7F2" w:sz="4"/>
+            </w:tcBorders>
+            <w:shd w:fill="0A84E0" w:color="auto" w:val="clear"/>
+            <w:tcMar>
+              <w:top w:type="dxa" w:w="60"/>
+              <w:left w:type="dxa" w:w="90"/>
+              <w:bottom w:type="dxa" w:w="60"/>
+              <w:right w:type="dxa" w:w="90"/>
+            </w:tcMar>
+          </w:tcPr>
+          <w:p>
+            <w:pPr>
+              <w:spacing w:after="0" w:before="0"/>
+            </w:pPr>
+            <w:r>
+              <w:rPr>
+                <w:rFonts w:ascii="Arial" w:cs="Arial" w:eastAsia="Arial" w:hAnsi="Arial"/>
+                <w:b/>
+                <w:bCs/>
+                <w:color w:val="FFFFFF"/>
+                <w:sz w:val="18"/>
+                <w:szCs w:val="18"/>
+              </w:rPr>
+              <w:t xml:space="preserve">Notes</w:t>
+            </w:r>
+          </w:p>
+        </w:tc>
+      </w:tr>
+      <w:tr>
+        <w:trPr>
+          <w:cantSplit/>
+        </w:trPr>
+        <w:tc>
+          <w:tcPr>
+            <w:tcW w:type="dxa" w:w="640"/>
+            <w:tcBorders>
+              <w:top w:val="single" w:color="B9D7F2" w:sz="4"/>
+              <w:left w:val="single" w:color="B9D7F2" w:sz="4"/>
+              <w:bottom w:val="single" w:color="B9D7F2" w:sz="4"/>
+              <w:right w:val="single" w:color="B9D7F2" w:sz="4"/>
+            </w:tcBorders>
+            <w:tcMar>
+              <w:top w:type="dxa" w:w="60"/>
+              <w:left w:type="dxa" w:w="90"/>
+              <w:bottom w:type="dxa" w:w="60"/>
+              <w:right w:type="dxa" w:w="90"/>
+            </w:tcMar>
+          </w:tcPr>
+          <w:p>
+            <w:pPr>
+              <w:spacing w:after="0" w:before="0"/>
+            </w:pPr>
+            <w:r>
+              <w:rPr>
+                <w:rFonts w:ascii="Arial" w:cs="Arial" w:eastAsia="Arial" w:hAnsi="Arial"/>
+                <w:color w:val="15202B"/>
+                <w:sz w:val="18"/>
+                <w:szCs w:val="18"/>
+              </w:rPr>
+              <w:t xml:space="preserve">31.1</w:t>
+            </w:r>
+          </w:p>
+        </w:tc>
+        <w:tc>
+          <w:tcPr>
+            <w:tcW w:type="dxa" w:w="3820"/>
+            <w:tcBorders>
+              <w:top w:val="single" w:color="B9D7F2" w:sz="4"/>
+              <w:left w:val="single" w:color="B9D7F2" w:sz="4"/>
+              <w:bottom w:val="single" w:color="B9D7F2" w:sz="4"/>
+              <w:right w:val="single" w:color="B9D7F2" w:sz="4"/>
+            </w:tcBorders>
+            <w:tcMar>
+              <w:top w:type="dxa" w:w="60"/>
+              <w:left w:type="dxa" w:w="90"/>
+              <w:bottom w:type="dxa" w:w="60"/>
+              <w:right w:type="dxa" w:w="90"/>
+            </w:tcMar>
+          </w:tcPr>
+          <w:p>
+            <w:pPr>
+              <w:spacing w:after="0" w:before="0"/>
+            </w:pPr>
+            <w:r>
+              <w:rPr>
+                <w:rFonts w:ascii="Arial" w:cs="Arial" w:eastAsia="Arial" w:hAnsi="Arial"/>
+                <w:color w:val="15202B"/>
+                <w:sz w:val="18"/>
+                <w:szCs w:val="18"/>
+              </w:rPr>
+              <w:t xml:space="preserve">Customer places an order.</w:t>
+            </w:r>
+          </w:p>
+        </w:tc>
+        <w:tc>
+          <w:tcPr>
+            <w:tcW w:type="dxa" w:w="3900"/>
+            <w:tcBorders>
+              <w:top w:val="single" w:color="B9D7F2" w:sz="4"/>
+              <w:left w:val="single" w:color="B9D7F2" w:sz="4"/>
+              <w:bottom w:val="single" w:color="B9D7F2" w:sz="4"/>
+              <w:right w:val="single" w:color="B9D7F2" w:sz="4"/>
+            </w:tcBorders>
+            <w:tcMar>
+              <w:top w:type="dxa" w:w="60"/>
+              <w:left w:type="dxa" w:w="90"/>
+              <w:bottom w:type="dxa" w:w="60"/>
+              <w:right w:type="dxa" w:w="90"/>
+            </w:tcMar>
+          </w:tcPr>
+          <w:p>
+            <w:pPr>
+              <w:spacing w:after="0" w:before="0"/>
+            </w:pPr>
+            <w:r>
+              <w:rPr>
+                <w:rFonts w:ascii="Arial" w:cs="Arial" w:eastAsia="Arial" w:hAnsi="Arial"/>
+                <w:color w:val="15202B"/>
+                <w:sz w:val="18"/>
+                <w:szCs w:val="18"/>
+              </w:rPr>
+              <w:t xml:space="preserve">Within 30 seconds the bell in the owner's top bar shows a number.</w:t>
+            </w:r>
+          </w:p>
+        </w:tc>
+        <w:tc>
+          <w:tcPr>
+            <w:tcW w:type="dxa" w:w="900"/>
+            <w:tcBorders>
+              <w:top w:val="single" w:color="B9D7F2" w:sz="4"/>
+              <w:left w:val="single" w:color="B9D7F2" w:sz="4"/>
+              <w:bottom w:val="single" w:color="B9D7F2" w:sz="4"/>
+              <w:right w:val="single" w:color="B9D7F2" w:sz="4"/>
+            </w:tcBorders>
+            <w:tcMar>
+              <w:top w:type="dxa" w:w="60"/>
+              <w:left w:type="dxa" w:w="90"/>
+              <w:bottom w:type="dxa" w:w="60"/>
+              <w:right w:type="dxa" w:w="90"/>
+            </w:tcMar>
+          </w:tcPr>
+          <w:p>
+            <w:pPr>
+              <w:spacing w:after="0" w:before="0"/>
+            </w:pPr>
+            <w:r>
+              <w:rPr>
+                <w:rFonts w:ascii="Arial" w:cs="Arial" w:eastAsia="Arial" w:hAnsi="Arial"/>
+                <w:color w:val="15202B"/>
+                <w:sz w:val="18"/>
+                <w:szCs w:val="18"/>
+              </w:rPr>
+              <w:t xml:space="preserve">☐ Pass</w:t>
+            </w:r>
+          </w:p>
+          <w:p>
+            <w:pPr>
+              <w:spacing w:after="0" w:before="0"/>
+            </w:pPr>
+            <w:r>
+              <w:rPr>
+                <w:rFonts w:ascii="Arial" w:cs="Arial" w:eastAsia="Arial" w:hAnsi="Arial"/>
+                <w:color w:val="15202B"/>
+                <w:sz w:val="18"/>
+                <w:szCs w:val="18"/>
+              </w:rPr>
+              <w:t xml:space="preserve">☐ Fail</w:t>
+            </w:r>
+          </w:p>
+        </w:tc>
+        <w:tc>
+          <w:tcPr>
+            <w:tcW w:type="dxa" w:w="1206"/>
+            <w:tcBorders>
+              <w:top w:val="single" w:color="B9D7F2" w:sz="4"/>
+              <w:left w:val="single" w:color="B9D7F2" w:sz="4"/>
+              <w:bottom w:val="single" w:color="B9D7F2" w:sz="4"/>
+              <w:right w:val="single" w:color="B9D7F2" w:sz="4"/>
+            </w:tcBorders>
+            <w:tcMar>
+              <w:top w:type="dxa" w:w="60"/>
+              <w:left w:type="dxa" w:w="90"/>
+              <w:bottom w:type="dxa" w:w="60"/>
+              <w:right w:type="dxa" w:w="90"/>
+            </w:tcMar>
+          </w:tcPr>
+          <w:p>
+            <w:pPr>
+              <w:spacing w:after="0" w:before="0"/>
+            </w:pPr>
+            <w:r>
+              <w:rPr>
+                <w:rFonts w:ascii="Arial" w:cs="Arial" w:eastAsia="Arial" w:hAnsi="Arial"/>
+                <w:color w:val="15202B"/>
+                <w:sz w:val="18"/>
+                <w:szCs w:val="18"/>
+              </w:rPr>
+              <w:t xml:space="preserve"/>
+            </w:r>
+          </w:p>
+        </w:tc>
+      </w:tr>
+      <w:tr>
+        <w:trPr>
+          <w:cantSplit/>
+        </w:trPr>
+        <w:tc>
+          <w:tcPr>
+            <w:tcW w:type="dxa" w:w="640"/>
+            <w:tcBorders>
+              <w:top w:val="single" w:color="B9D7F2" w:sz="4"/>
+              <w:left w:val="single" w:color="B9D7F2" w:sz="4"/>
+              <w:bottom w:val="single" w:color="B9D7F2" w:sz="4"/>
+              <w:right w:val="single" w:color="B9D7F2" w:sz="4"/>
+            </w:tcBorders>
+            <w:shd w:fill="EAF4FD" w:color="auto" w:val="clear"/>
+            <w:tcMar>
+              <w:top w:type="dxa" w:w="60"/>
+              <w:left w:type="dxa" w:w="90"/>
+              <w:bottom w:type="dxa" w:w="60"/>
+              <w:right w:type="dxa" w:w="90"/>
+            </w:tcMar>
+          </w:tcPr>
+          <w:p>
+            <w:pPr>
+              <w:spacing w:after="0" w:before="0"/>
+            </w:pPr>
+            <w:r>
+              <w:rPr>
+                <w:rFonts w:ascii="Arial" w:cs="Arial" w:eastAsia="Arial" w:hAnsi="Arial"/>
+                <w:color w:val="15202B"/>
+                <w:sz w:val="18"/>
+                <w:szCs w:val="18"/>
+              </w:rPr>
+              <w:t xml:space="preserve">31.2</w:t>
+            </w:r>
+          </w:p>
+        </w:tc>
+        <w:tc>
+          <w:tcPr>
+            <w:tcW w:type="dxa" w:w="3820"/>
+            <w:tcBorders>
+              <w:top w:val="single" w:color="B9D7F2" w:sz="4"/>
+              <w:left w:val="single" w:color="B9D7F2" w:sz="4"/>
+              <w:bottom w:val="single" w:color="B9D7F2" w:sz="4"/>
+              <w:right w:val="single" w:color="B9D7F2" w:sz="4"/>
+            </w:tcBorders>
+            <w:shd w:fill="EAF4FD" w:color="auto" w:val="clear"/>
+            <w:tcMar>
+              <w:top w:type="dxa" w:w="60"/>
+              <w:left w:type="dxa" w:w="90"/>
+              <w:bottom w:type="dxa" w:w="60"/>
+              <w:right w:type="dxa" w:w="90"/>
+            </w:tcMar>
+          </w:tcPr>
+          <w:p>
+            <w:pPr>
+              <w:spacing w:after="0" w:before="0"/>
+            </w:pPr>
+            <w:r>
+              <w:rPr>
+                <w:rFonts w:ascii="Arial" w:cs="Arial" w:eastAsia="Arial" w:hAnsi="Arial"/>
+                <w:color w:val="15202B"/>
+                <w:sz w:val="18"/>
+                <w:szCs w:val="18"/>
+              </w:rPr>
+              <w:t xml:space="preserve">Tap the bell.</w:t>
+            </w:r>
+          </w:p>
+        </w:tc>
+        <w:tc>
+          <w:tcPr>
+            <w:tcW w:type="dxa" w:w="3900"/>
+            <w:tcBorders>
+              <w:top w:val="single" w:color="B9D7F2" w:sz="4"/>
+              <w:left w:val="single" w:color="B9D7F2" w:sz="4"/>
+              <w:bottom w:val="single" w:color="B9D7F2" w:sz="4"/>
+              <w:right w:val="single" w:color="B9D7F2" w:sz="4"/>
+            </w:tcBorders>
+            <w:shd w:fill="EAF4FD" w:color="auto" w:val="clear"/>
+            <w:tcMar>
+              <w:top w:type="dxa" w:w="60"/>
+              <w:left w:type="dxa" w:w="90"/>
+              <w:bottom w:type="dxa" w:w="60"/>
+              <w:right w:type="dxa" w:w="90"/>
+            </w:tcMar>
+          </w:tcPr>
+          <w:p>
+            <w:pPr>
+              <w:spacing w:after="0" w:before="0"/>
+            </w:pPr>
+            <w:r>
+              <w:rPr>
+                <w:rFonts w:ascii="Arial" w:cs="Arial" w:eastAsia="Arial" w:hAnsi="Arial"/>
+                <w:color w:val="15202B"/>
+                <w:sz w:val="18"/>
+                <w:szCs w:val="18"/>
+              </w:rPr>
+              <w:t xml:space="preserve">Notifications: Alerts (newest first) "New order · Ana Lim: 3 gallons · Refill" with a dot (unread) and the time.</w:t>
+            </w:r>
+          </w:p>
+        </w:tc>
+        <w:tc>
+          <w:tcPr>
+            <w:tcW w:type="dxa" w:w="900"/>
+            <w:tcBorders>
+              <w:top w:val="single" w:color="B9D7F2" w:sz="4"/>
+              <w:left w:val="single" w:color="B9D7F2" w:sz="4"/>
+              <w:bottom w:val="single" w:color="B9D7F2" w:sz="4"/>
+              <w:right w:val="single" w:color="B9D7F2" w:sz="4"/>
+            </w:tcBorders>
+            <w:shd w:fill="EAF4FD" w:color="auto" w:val="clear"/>
+            <w:tcMar>
+              <w:top w:type="dxa" w:w="60"/>
+              <w:left w:type="dxa" w:w="90"/>
+              <w:bottom w:type="dxa" w:w="60"/>
+              <w:right w:type="dxa" w:w="90"/>
+            </w:tcMar>
+          </w:tcPr>
+          <w:p>
+            <w:pPr>
+              <w:spacing w:after="0" w:before="0"/>
+            </w:pPr>
+            <w:r>
+              <w:rPr>
+                <w:rFonts w:ascii="Arial" w:cs="Arial" w:eastAsia="Arial" w:hAnsi="Arial"/>
+                <w:color w:val="15202B"/>
+                <w:sz w:val="18"/>
+                <w:szCs w:val="18"/>
+              </w:rPr>
+              <w:t xml:space="preserve">☐ Pass</w:t>
+            </w:r>
+          </w:p>
+          <w:p>
+            <w:pPr>
+              <w:spacing w:after="0" w:before="0"/>
+            </w:pPr>
+            <w:r>
+              <w:rPr>
+                <w:rFonts w:ascii="Arial" w:cs="Arial" w:eastAsia="Arial" w:hAnsi="Arial"/>
+                <w:color w:val="15202B"/>
+                <w:sz w:val="18"/>
+                <w:szCs w:val="18"/>
+              </w:rPr>
+              <w:t xml:space="preserve">☐ Fail</w:t>
+            </w:r>
+          </w:p>
+        </w:tc>
+        <w:tc>
+          <w:tcPr>
+            <w:tcW w:type="dxa" w:w="1206"/>
+            <w:tcBorders>
+              <w:top w:val="single" w:color="B9D7F2" w:sz="4"/>
+              <w:left w:val="single" w:color="B9D7F2" w:sz="4"/>
+              <w:bottom w:val="single" w:color="B9D7F2" w:sz="4"/>
+              <w:right w:val="single" w:color="B9D7F2" w:sz="4"/>
+            </w:tcBorders>
+            <w:shd w:fill="EAF4FD" w:color="auto" w:val="clear"/>
+            <w:tcMar>
+              <w:top w:type="dxa" w:w="60"/>
+              <w:left w:type="dxa" w:w="90"/>
+              <w:bottom w:type="dxa" w:w="60"/>
+              <w:right w:type="dxa" w:w="90"/>
+            </w:tcMar>
+          </w:tcPr>
+          <w:p>
+            <w:pPr>
+              <w:spacing w:after="0" w:before="0"/>
+            </w:pPr>
+            <w:r>
+              <w:rPr>
+                <w:rFonts w:ascii="Arial" w:cs="Arial" w:eastAsia="Arial" w:hAnsi="Arial"/>
+                <w:color w:val="15202B"/>
+                <w:sz w:val="18"/>
+                <w:szCs w:val="18"/>
+              </w:rPr>
+              <w:t xml:space="preserve"/>
+            </w:r>
+          </w:p>
+        </w:tc>
+      </w:tr>
+      <w:tr>
+        <w:trPr>
+          <w:cantSplit/>
+        </w:trPr>
+        <w:tc>
+          <w:tcPr>
+            <w:tcW w:type="dxa" w:w="640"/>
+            <w:tcBorders>
+              <w:top w:val="single" w:color="B9D7F2" w:sz="4"/>
+              <w:left w:val="single" w:color="B9D7F2" w:sz="4"/>
+              <w:bottom w:val="single" w:color="B9D7F2" w:sz="4"/>
+              <w:right w:val="single" w:color="B9D7F2" w:sz="4"/>
+            </w:tcBorders>
+            <w:tcMar>
+              <w:top w:type="dxa" w:w="60"/>
+              <w:left w:type="dxa" w:w="90"/>
+              <w:bottom w:type="dxa" w:w="60"/>
+              <w:right w:type="dxa" w:w="90"/>
+            </w:tcMar>
+          </w:tcPr>
+          <w:p>
+            <w:pPr>
+              <w:spacing w:after="0" w:before="0"/>
+            </w:pPr>
+            <w:r>
+              <w:rPr>
+                <w:rFonts w:ascii="Arial" w:cs="Arial" w:eastAsia="Arial" w:hAnsi="Arial"/>
+                <w:color w:val="15202B"/>
+                <w:sz w:val="18"/>
+                <w:szCs w:val="18"/>
+              </w:rPr>
+              <w:t xml:space="preserve">31.3</w:t>
+            </w:r>
+          </w:p>
+        </w:tc>
+        <w:tc>
+          <w:tcPr>
+            <w:tcW w:type="dxa" w:w="3820"/>
+            <w:tcBorders>
+              <w:top w:val="single" w:color="B9D7F2" w:sz="4"/>
+              <w:left w:val="single" w:color="B9D7F2" w:sz="4"/>
+              <w:bottom w:val="single" w:color="B9D7F2" w:sz="4"/>
+              <w:right w:val="single" w:color="B9D7F2" w:sz="4"/>
+            </w:tcBorders>
+            <w:tcMar>
+              <w:top w:type="dxa" w:w="60"/>
+              <w:left w:type="dxa" w:w="90"/>
+              <w:bottom w:type="dxa" w:w="60"/>
+              <w:right w:type="dxa" w:w="90"/>
+            </w:tcMar>
+          </w:tcPr>
+          <w:p>
+            <w:pPr>
+              <w:spacing w:after="0" w:before="0"/>
+            </w:pPr>
+            <w:r>
+              <w:rPr>
+                <w:rFonts w:ascii="Arial" w:cs="Arial" w:eastAsia="Arial" w:hAnsi="Arial"/>
+                <w:color w:val="15202B"/>
+                <w:sz w:val="18"/>
+                <w:szCs w:val="18"/>
+              </w:rPr>
+              <w:t xml:space="preserve">Tap the alert.</w:t>
+            </w:r>
+          </w:p>
+        </w:tc>
+        <w:tc>
+          <w:tcPr>
+            <w:tcW w:type="dxa" w:w="3900"/>
+            <w:tcBorders>
+              <w:top w:val="single" w:color="B9D7F2" w:sz="4"/>
+              <w:left w:val="single" w:color="B9D7F2" w:sz="4"/>
+              <w:bottom w:val="single" w:color="B9D7F2" w:sz="4"/>
+              <w:right w:val="single" w:color="B9D7F2" w:sz="4"/>
+            </w:tcBorders>
+            <w:tcMar>
+              <w:top w:type="dxa" w:w="60"/>
+              <w:left w:type="dxa" w:w="90"/>
+              <w:bottom w:type="dxa" w:w="60"/>
+              <w:right w:type="dxa" w:w="90"/>
+            </w:tcMar>
+          </w:tcPr>
+          <w:p>
+            <w:pPr>
+              <w:spacing w:after="0" w:before="0"/>
+            </w:pPr>
+            <w:r>
+              <w:rPr>
+                <w:rFonts w:ascii="Arial" w:cs="Arial" w:eastAsia="Arial" w:hAnsi="Arial"/>
+                <w:color w:val="15202B"/>
+                <w:sz w:val="18"/>
+                <w:szCs w:val="18"/>
+              </w:rPr>
+              <w:t xml:space="preserve">Order Details of that order; back in the list the dot is gone.</w:t>
+            </w:r>
+          </w:p>
+        </w:tc>
+        <w:tc>
+          <w:tcPr>
+            <w:tcW w:type="dxa" w:w="900"/>
+            <w:tcBorders>
+              <w:top w:val="single" w:color="B9D7F2" w:sz="4"/>
+              <w:left w:val="single" w:color="B9D7F2" w:sz="4"/>
+              <w:bottom w:val="single" w:color="B9D7F2" w:sz="4"/>
+              <w:right w:val="single" w:color="B9D7F2" w:sz="4"/>
+            </w:tcBorders>
+            <w:tcMar>
+              <w:top w:type="dxa" w:w="60"/>
+              <w:left w:type="dxa" w:w="90"/>
+              <w:bottom w:type="dxa" w:w="60"/>
+              <w:right w:type="dxa" w:w="90"/>
+            </w:tcMar>
+          </w:tcPr>
+          <w:p>
+            <w:pPr>
+              <w:spacing w:after="0" w:before="0"/>
+            </w:pPr>
+            <w:r>
+              <w:rPr>
+                <w:rFonts w:ascii="Arial" w:cs="Arial" w:eastAsia="Arial" w:hAnsi="Arial"/>
+                <w:color w:val="15202B"/>
+                <w:sz w:val="18"/>
+                <w:szCs w:val="18"/>
+              </w:rPr>
+              <w:t xml:space="preserve">☐ Pass</w:t>
+            </w:r>
+          </w:p>
+          <w:p>
+            <w:pPr>
+              <w:spacing w:after="0" w:before="0"/>
+            </w:pPr>
+            <w:r>
+              <w:rPr>
+                <w:rFonts w:ascii="Arial" w:cs="Arial" w:eastAsia="Arial" w:hAnsi="Arial"/>
+                <w:color w:val="15202B"/>
+                <w:sz w:val="18"/>
+                <w:szCs w:val="18"/>
+              </w:rPr>
+              <w:t xml:space="preserve">☐ Fail</w:t>
+            </w:r>
+          </w:p>
+        </w:tc>
+        <w:tc>
+          <w:tcPr>
+            <w:tcW w:type="dxa" w:w="1206"/>
+            <w:tcBorders>
+              <w:top w:val="single" w:color="B9D7F2" w:sz="4"/>
+              <w:left w:val="single" w:color="B9D7F2" w:sz="4"/>
+              <w:bottom w:val="single" w:color="B9D7F2" w:sz="4"/>
+              <w:right w:val="single" w:color="B9D7F2" w:sz="4"/>
+            </w:tcBorders>
+            <w:tcMar>
+              <w:top w:type="dxa" w:w="60"/>
+              <w:left w:type="dxa" w:w="90"/>
+              <w:bottom w:type="dxa" w:w="60"/>
+              <w:right w:type="dxa" w:w="90"/>
+            </w:tcMar>
+          </w:tcPr>
+          <w:p>
+            <w:pPr>
+              <w:spacing w:after="0" w:before="0"/>
+            </w:pPr>
+            <w:r>
+              <w:rPr>
+                <w:rFonts w:ascii="Arial" w:cs="Arial" w:eastAsia="Arial" w:hAnsi="Arial"/>
+                <w:color w:val="15202B"/>
+                <w:sz w:val="18"/>
+                <w:szCs w:val="18"/>
+              </w:rPr>
+              <w:t xml:space="preserve"/>
+            </w:r>
+          </w:p>
+        </w:tc>
+      </w:tr>
+      <w:tr>
+        <w:trPr>
+          <w:cantSplit/>
+        </w:trPr>
+        <w:tc>
+          <w:tcPr>
+            <w:tcW w:type="dxa" w:w="640"/>
+            <w:tcBorders>
+              <w:top w:val="single" w:color="B9D7F2" w:sz="4"/>
+              <w:left w:val="single" w:color="B9D7F2" w:sz="4"/>
+              <w:bottom w:val="single" w:color="B9D7F2" w:sz="4"/>
+              <w:right w:val="single" w:color="B9D7F2" w:sz="4"/>
+            </w:tcBorders>
+            <w:shd w:fill="EAF4FD" w:color="auto" w:val="clear"/>
+            <w:tcMar>
+              <w:top w:type="dxa" w:w="60"/>
+              <w:left w:type="dxa" w:w="90"/>
+              <w:bottom w:type="dxa" w:w="60"/>
+              <w:right w:type="dxa" w:w="90"/>
+            </w:tcMar>
+          </w:tcPr>
+          <w:p>
+            <w:pPr>
+              <w:spacing w:after="0" w:before="0"/>
+            </w:pPr>
+            <w:r>
+              <w:rPr>
+                <w:rFonts w:ascii="Arial" w:cs="Arial" w:eastAsia="Arial" w:hAnsi="Arial"/>
+                <w:color w:val="15202B"/>
+                <w:sz w:val="18"/>
+                <w:szCs w:val="18"/>
+              </w:rPr>
+              <w:t xml:space="preserve">31.4</w:t>
+            </w:r>
+          </w:p>
+        </w:tc>
+        <w:tc>
+          <w:tcPr>
+            <w:tcW w:type="dxa" w:w="3820"/>
+            <w:tcBorders>
+              <w:top w:val="single" w:color="B9D7F2" w:sz="4"/>
+              <w:left w:val="single" w:color="B9D7F2" w:sz="4"/>
+              <w:bottom w:val="single" w:color="B9D7F2" w:sz="4"/>
+              <w:right w:val="single" w:color="B9D7F2" w:sz="4"/>
+            </w:tcBorders>
+            <w:shd w:fill="EAF4FD" w:color="auto" w:val="clear"/>
+            <w:tcMar>
+              <w:top w:type="dxa" w:w="60"/>
+              <w:left w:type="dxa" w:w="90"/>
+              <w:bottom w:type="dxa" w:w="60"/>
+              <w:right w:type="dxa" w:w="90"/>
+            </w:tcMar>
+          </w:tcPr>
+          <w:p>
+            <w:pPr>
+              <w:spacing w:after="0" w:before="0"/>
+            </w:pPr>
+            <w:r>
+              <w:rPr>
+                <w:rFonts w:ascii="Arial" w:cs="Arial" w:eastAsia="Arial" w:hAnsi="Arial"/>
+                <w:color w:val="15202B"/>
+                <w:sz w:val="18"/>
+                <w:szCs w:val="18"/>
+              </w:rPr>
+              <w:t xml:space="preserve">Staff logs a delivery order; a rider marks one Not delivered; a customer cancels.</w:t>
+            </w:r>
+          </w:p>
+        </w:tc>
+        <w:tc>
+          <w:tcPr>
+            <w:tcW w:type="dxa" w:w="3900"/>
+            <w:tcBorders>
+              <w:top w:val="single" w:color="B9D7F2" w:sz="4"/>
+              <w:left w:val="single" w:color="B9D7F2" w:sz="4"/>
+              <w:bottom w:val="single" w:color="B9D7F2" w:sz="4"/>
+              <w:right w:val="single" w:color="B9D7F2" w:sz="4"/>
+            </w:tcBorders>
+            <w:shd w:fill="EAF4FD" w:color="auto" w:val="clear"/>
+            <w:tcMar>
+              <w:top w:type="dxa" w:w="60"/>
+              <w:left w:type="dxa" w:w="90"/>
+              <w:bottom w:type="dxa" w:w="60"/>
+              <w:right w:type="dxa" w:w="90"/>
+            </w:tcMar>
+          </w:tcPr>
+          <w:p>
+            <w:pPr>
+              <w:spacing w:after="0" w:before="0"/>
+            </w:pPr>
+            <w:r>
+              <w:rPr>
+                <w:rFonts w:ascii="Arial" w:cs="Arial" w:eastAsia="Arial" w:hAnsi="Arial"/>
+                <w:color w:val="15202B"/>
+                <w:sz w:val="18"/>
+                <w:szCs w:val="18"/>
+              </w:rPr>
+              <w:t xml:space="preserve">Alerts "Order logged by staff", "Not delivered", "Order cancelled".</w:t>
+            </w:r>
+          </w:p>
+        </w:tc>
+        <w:tc>
+          <w:tcPr>
+            <w:tcW w:type="dxa" w:w="900"/>
+            <w:tcBorders>
+              <w:top w:val="single" w:color="B9D7F2" w:sz="4"/>
+              <w:left w:val="single" w:color="B9D7F2" w:sz="4"/>
+              <w:bottom w:val="single" w:color="B9D7F2" w:sz="4"/>
+              <w:right w:val="single" w:color="B9D7F2" w:sz="4"/>
+            </w:tcBorders>
+            <w:shd w:fill="EAF4FD" w:color="auto" w:val="clear"/>
+            <w:tcMar>
+              <w:top w:type="dxa" w:w="60"/>
+              <w:left w:type="dxa" w:w="90"/>
+              <w:bottom w:type="dxa" w:w="60"/>
+              <w:right w:type="dxa" w:w="90"/>
+            </w:tcMar>
+          </w:tcPr>
+          <w:p>
+            <w:pPr>
+              <w:spacing w:after="0" w:before="0"/>
+            </w:pPr>
+            <w:r>
+              <w:rPr>
+                <w:rFonts w:ascii="Arial" w:cs="Arial" w:eastAsia="Arial" w:hAnsi="Arial"/>
+                <w:color w:val="15202B"/>
+                <w:sz w:val="18"/>
+                <w:szCs w:val="18"/>
+              </w:rPr>
+              <w:t xml:space="preserve">☐ Pass</w:t>
+            </w:r>
+          </w:p>
+          <w:p>
+            <w:pPr>
+              <w:spacing w:after="0" w:before="0"/>
+            </w:pPr>
+            <w:r>
+              <w:rPr>
+                <w:rFonts w:ascii="Arial" w:cs="Arial" w:eastAsia="Arial" w:hAnsi="Arial"/>
+                <w:color w:val="15202B"/>
+                <w:sz w:val="18"/>
+                <w:szCs w:val="18"/>
+              </w:rPr>
+              <w:t xml:space="preserve">☐ Fail</w:t>
+            </w:r>
+          </w:p>
+        </w:tc>
+        <w:tc>
+          <w:tcPr>
+            <w:tcW w:type="dxa" w:w="1206"/>
+            <w:tcBorders>
+              <w:top w:val="single" w:color="B9D7F2" w:sz="4"/>
+              <w:left w:val="single" w:color="B9D7F2" w:sz="4"/>
+              <w:bottom w:val="single" w:color="B9D7F2" w:sz="4"/>
+              <w:right w:val="single" w:color="B9D7F2" w:sz="4"/>
+            </w:tcBorders>
+            <w:shd w:fill="EAF4FD" w:color="auto" w:val="clear"/>
+            <w:tcMar>
+              <w:top w:type="dxa" w:w="60"/>
+              <w:left w:type="dxa" w:w="90"/>
+              <w:bottom w:type="dxa" w:w="60"/>
+              <w:right w:type="dxa" w:w="90"/>
+            </w:tcMar>
+          </w:tcPr>
+          <w:p>
+            <w:pPr>
+              <w:spacing w:after="0" w:before="0"/>
+            </w:pPr>
+            <w:r>
+              <w:rPr>
+                <w:rFonts w:ascii="Arial" w:cs="Arial" w:eastAsia="Arial" w:hAnsi="Arial"/>
+                <w:color w:val="15202B"/>
+                <w:sz w:val="18"/>
+                <w:szCs w:val="18"/>
+              </w:rPr>
+              <w:t xml:space="preserve"/>
+            </w:r>
+          </w:p>
+        </w:tc>
+      </w:tr>
+      <w:tr>
+        <w:trPr>
+          <w:cantSplit/>
+        </w:trPr>
+        <w:tc>
+          <w:tcPr>
+            <w:tcW w:type="dxa" w:w="640"/>
+            <w:tcBorders>
+              <w:top w:val="single" w:color="B9D7F2" w:sz="4"/>
+              <w:left w:val="single" w:color="B9D7F2" w:sz="4"/>
+              <w:bottom w:val="single" w:color="B9D7F2" w:sz="4"/>
+              <w:right w:val="single" w:color="B9D7F2" w:sz="4"/>
+            </w:tcBorders>
+            <w:tcMar>
+              <w:top w:type="dxa" w:w="60"/>
+              <w:left w:type="dxa" w:w="90"/>
+              <w:bottom w:type="dxa" w:w="60"/>
+              <w:right w:type="dxa" w:w="90"/>
+            </w:tcMar>
+          </w:tcPr>
+          <w:p>
+            <w:pPr>
+              <w:spacing w:after="0" w:before="0"/>
+            </w:pPr>
+            <w:r>
+              <w:rPr>
+                <w:rFonts w:ascii="Arial" w:cs="Arial" w:eastAsia="Arial" w:hAnsi="Arial"/>
+                <w:color w:val="15202B"/>
+                <w:sz w:val="18"/>
+                <w:szCs w:val="18"/>
+              </w:rPr>
+              <w:t xml:space="preserve">31.5</w:t>
+            </w:r>
+          </w:p>
+        </w:tc>
+        <w:tc>
+          <w:tcPr>
+            <w:tcW w:type="dxa" w:w="3820"/>
+            <w:tcBorders>
+              <w:top w:val="single" w:color="B9D7F2" w:sz="4"/>
+              <w:left w:val="single" w:color="B9D7F2" w:sz="4"/>
+              <w:bottom w:val="single" w:color="B9D7F2" w:sz="4"/>
+              <w:right w:val="single" w:color="B9D7F2" w:sz="4"/>
+            </w:tcBorders>
+            <w:tcMar>
+              <w:top w:type="dxa" w:w="60"/>
+              <w:left w:type="dxa" w:w="90"/>
+              <w:bottom w:type="dxa" w:w="60"/>
+              <w:right w:type="dxa" w:w="90"/>
+            </w:tcMar>
+          </w:tcPr>
+          <w:p>
+            <w:pPr>
+              <w:spacing w:after="0" w:before="0"/>
+            </w:pPr>
+            <w:r>
+              <w:rPr>
+                <w:rFonts w:ascii="Arial" w:cs="Arial" w:eastAsia="Arial" w:hAnsi="Arial"/>
+                <w:color w:val="15202B"/>
+                <w:sz w:val="18"/>
+                <w:szCs w:val="18"/>
+              </w:rPr>
+              <w:t xml:space="preserve">Tank counter reaches 60.</w:t>
+            </w:r>
+          </w:p>
+        </w:tc>
+        <w:tc>
+          <w:tcPr>
+            <w:tcW w:type="dxa" w:w="3900"/>
+            <w:tcBorders>
+              <w:top w:val="single" w:color="B9D7F2" w:sz="4"/>
+              <w:left w:val="single" w:color="B9D7F2" w:sz="4"/>
+              <w:bottom w:val="single" w:color="B9D7F2" w:sz="4"/>
+              <w:right w:val="single" w:color="B9D7F2" w:sz="4"/>
+            </w:tcBorders>
+            <w:tcMar>
+              <w:top w:type="dxa" w:w="60"/>
+              <w:left w:type="dxa" w:w="90"/>
+              <w:bottom w:type="dxa" w:w="60"/>
+              <w:right w:type="dxa" w:w="90"/>
+            </w:tcMar>
+          </w:tcPr>
+          <w:p>
+            <w:pPr>
+              <w:spacing w:after="0" w:before="0"/>
+            </w:pPr>
+            <w:r>
+              <w:rPr>
+                <w:rFonts w:ascii="Arial" w:cs="Arial" w:eastAsia="Arial" w:hAnsi="Arial"/>
+                <w:color w:val="15202B"/>
+                <w:sz w:val="18"/>
+                <w:szCs w:val="18"/>
+              </w:rPr>
+              <w:t xml:space="preserve">Alert "Tank at 60 · Refill the water tank"; tapping it opens Home.</w:t>
+            </w:r>
+          </w:p>
+        </w:tc>
+        <w:tc>
+          <w:tcPr>
+            <w:tcW w:type="dxa" w:w="900"/>
+            <w:tcBorders>
+              <w:top w:val="single" w:color="B9D7F2" w:sz="4"/>
+              <w:left w:val="single" w:color="B9D7F2" w:sz="4"/>
+              <w:bottom w:val="single" w:color="B9D7F2" w:sz="4"/>
+              <w:right w:val="single" w:color="B9D7F2" w:sz="4"/>
+            </w:tcBorders>
+            <w:tcMar>
+              <w:top w:type="dxa" w:w="60"/>
+              <w:left w:type="dxa" w:w="90"/>
+              <w:bottom w:type="dxa" w:w="60"/>
+              <w:right w:type="dxa" w:w="90"/>
+            </w:tcMar>
+          </w:tcPr>
+          <w:p>
+            <w:pPr>
+              <w:spacing w:after="0" w:before="0"/>
+            </w:pPr>
+            <w:r>
+              <w:rPr>
+                <w:rFonts w:ascii="Arial" w:cs="Arial" w:eastAsia="Arial" w:hAnsi="Arial"/>
+                <w:color w:val="15202B"/>
+                <w:sz w:val="18"/>
+                <w:szCs w:val="18"/>
+              </w:rPr>
+              <w:t xml:space="preserve">☐ Pass</w:t>
+            </w:r>
+          </w:p>
+          <w:p>
+            <w:pPr>
+              <w:spacing w:after="0" w:before="0"/>
+            </w:pPr>
+            <w:r>
+              <w:rPr>
+                <w:rFonts w:ascii="Arial" w:cs="Arial" w:eastAsia="Arial" w:hAnsi="Arial"/>
+                <w:color w:val="15202B"/>
+                <w:sz w:val="18"/>
+                <w:szCs w:val="18"/>
+              </w:rPr>
+              <w:t xml:space="preserve">☐ Fail</w:t>
+            </w:r>
+          </w:p>
+        </w:tc>
+        <w:tc>
+          <w:tcPr>
+            <w:tcW w:type="dxa" w:w="1206"/>
+            <w:tcBorders>
+              <w:top w:val="single" w:color="B9D7F2" w:sz="4"/>
+              <w:left w:val="single" w:color="B9D7F2" w:sz="4"/>
+              <w:bottom w:val="single" w:color="B9D7F2" w:sz="4"/>
+              <w:right w:val="single" w:color="B9D7F2" w:sz="4"/>
+            </w:tcBorders>
+            <w:tcMar>
+              <w:top w:type="dxa" w:w="60"/>
+              <w:left w:type="dxa" w:w="90"/>
+              <w:bottom w:type="dxa" w:w="60"/>
+              <w:right w:type="dxa" w:w="90"/>
+            </w:tcMar>
+          </w:tcPr>
+          <w:p>
+            <w:pPr>
+              <w:spacing w:after="0" w:before="0"/>
+            </w:pPr>
+            <w:r>
+              <w:rPr>
+                <w:rFonts w:ascii="Arial" w:cs="Arial" w:eastAsia="Arial" w:hAnsi="Arial"/>
+                <w:color w:val="15202B"/>
+                <w:sz w:val="18"/>
+                <w:szCs w:val="18"/>
+              </w:rPr>
+              <w:t xml:space="preserve"/>
+            </w:r>
+          </w:p>
+        </w:tc>
+      </w:tr>
+      <w:tr>
+        <w:trPr>
+          <w:cantSplit/>
+        </w:trPr>
+        <w:tc>
+          <w:tcPr>
+            <w:tcW w:type="dxa" w:w="640"/>
+            <w:tcBorders>
+              <w:top w:val="single" w:color="B9D7F2" w:sz="4"/>
+              <w:left w:val="single" w:color="B9D7F2" w:sz="4"/>
+              <w:bottom w:val="single" w:color="B9D7F2" w:sz="4"/>
+              <w:right w:val="single" w:color="B9D7F2" w:sz="4"/>
+            </w:tcBorders>
+            <w:shd w:fill="EAF4FD" w:color="auto" w:val="clear"/>
+            <w:tcMar>
+              <w:top w:type="dxa" w:w="60"/>
+              <w:left w:type="dxa" w:w="90"/>
+              <w:bottom w:type="dxa" w:w="60"/>
+              <w:right w:type="dxa" w:w="90"/>
+            </w:tcMar>
+          </w:tcPr>
+          <w:p>
+            <w:pPr>
+              <w:spacing w:after="0" w:before="0"/>
+            </w:pPr>
+            <w:r>
+              <w:rPr>
+                <w:rFonts w:ascii="Arial" w:cs="Arial" w:eastAsia="Arial" w:hAnsi="Arial"/>
+                <w:color w:val="15202B"/>
+                <w:sz w:val="18"/>
+                <w:szCs w:val="18"/>
+              </w:rPr>
+              <w:t xml:space="preserve">31.6</w:t>
+            </w:r>
+          </w:p>
+        </w:tc>
+        <w:tc>
+          <w:tcPr>
+            <w:tcW w:type="dxa" w:w="3820"/>
+            <w:tcBorders>
+              <w:top w:val="single" w:color="B9D7F2" w:sz="4"/>
+              <w:left w:val="single" w:color="B9D7F2" w:sz="4"/>
+              <w:bottom w:val="single" w:color="B9D7F2" w:sz="4"/>
+              <w:right w:val="single" w:color="B9D7F2" w:sz="4"/>
+            </w:tcBorders>
+            <w:shd w:fill="EAF4FD" w:color="auto" w:val="clear"/>
+            <w:tcMar>
+              <w:top w:type="dxa" w:w="60"/>
+              <w:left w:type="dxa" w:w="90"/>
+              <w:bottom w:type="dxa" w:w="60"/>
+              <w:right w:type="dxa" w:w="90"/>
+            </w:tcMar>
+          </w:tcPr>
+          <w:p>
+            <w:pPr>
+              <w:spacing w:after="0" w:before="0"/>
+            </w:pPr>
+            <w:r>
+              <w:rPr>
+                <w:rFonts w:ascii="Arial" w:cs="Arial" w:eastAsia="Arial" w:hAnsi="Arial"/>
+                <w:color w:val="15202B"/>
+                <w:sz w:val="18"/>
+                <w:szCs w:val="18"/>
+              </w:rPr>
+              <w:t xml:space="preserve">Stock drops to the low-stock level.</w:t>
+            </w:r>
+          </w:p>
+        </w:tc>
+        <w:tc>
+          <w:tcPr>
+            <w:tcW w:type="dxa" w:w="3900"/>
+            <w:tcBorders>
+              <w:top w:val="single" w:color="B9D7F2" w:sz="4"/>
+              <w:left w:val="single" w:color="B9D7F2" w:sz="4"/>
+              <w:bottom w:val="single" w:color="B9D7F2" w:sz="4"/>
+              <w:right w:val="single" w:color="B9D7F2" w:sz="4"/>
+            </w:tcBorders>
+            <w:shd w:fill="EAF4FD" w:color="auto" w:val="clear"/>
+            <w:tcMar>
+              <w:top w:type="dxa" w:w="60"/>
+              <w:left w:type="dxa" w:w="90"/>
+              <w:bottom w:type="dxa" w:w="60"/>
+              <w:right w:type="dxa" w:w="90"/>
+            </w:tcMar>
+          </w:tcPr>
+          <w:p>
+            <w:pPr>
+              <w:spacing w:after="0" w:before="0"/>
+            </w:pPr>
+            <w:r>
+              <w:rPr>
+                <w:rFonts w:ascii="Arial" w:cs="Arial" w:eastAsia="Arial" w:hAnsi="Arial"/>
+                <w:color w:val="15202B"/>
+                <w:sz w:val="18"/>
+                <w:szCs w:val="18"/>
+              </w:rPr>
+              <w:t xml:space="preserve">Alert "Low stock · Gallons: n left"; tapping it opens Inventory.</w:t>
+            </w:r>
+          </w:p>
+        </w:tc>
+        <w:tc>
+          <w:tcPr>
+            <w:tcW w:type="dxa" w:w="900"/>
+            <w:tcBorders>
+              <w:top w:val="single" w:color="B9D7F2" w:sz="4"/>
+              <w:left w:val="single" w:color="B9D7F2" w:sz="4"/>
+              <w:bottom w:val="single" w:color="B9D7F2" w:sz="4"/>
+              <w:right w:val="single" w:color="B9D7F2" w:sz="4"/>
+            </w:tcBorders>
+            <w:shd w:fill="EAF4FD" w:color="auto" w:val="clear"/>
+            <w:tcMar>
+              <w:top w:type="dxa" w:w="60"/>
+              <w:left w:type="dxa" w:w="90"/>
+              <w:bottom w:type="dxa" w:w="60"/>
+              <w:right w:type="dxa" w:w="90"/>
+            </w:tcMar>
+          </w:tcPr>
+          <w:p>
+            <w:pPr>
+              <w:spacing w:after="0" w:before="0"/>
+            </w:pPr>
+            <w:r>
+              <w:rPr>
+                <w:rFonts w:ascii="Arial" w:cs="Arial" w:eastAsia="Arial" w:hAnsi="Arial"/>
+                <w:color w:val="15202B"/>
+                <w:sz w:val="18"/>
+                <w:szCs w:val="18"/>
+              </w:rPr>
+              <w:t xml:space="preserve">☐ Pass</w:t>
+            </w:r>
+          </w:p>
+          <w:p>
+            <w:pPr>
+              <w:spacing w:after="0" w:before="0"/>
+            </w:pPr>
+            <w:r>
+              <w:rPr>
+                <w:rFonts w:ascii="Arial" w:cs="Arial" w:eastAsia="Arial" w:hAnsi="Arial"/>
+                <w:color w:val="15202B"/>
+                <w:sz w:val="18"/>
+                <w:szCs w:val="18"/>
+              </w:rPr>
+              <w:t xml:space="preserve">☐ Fail</w:t>
+            </w:r>
+          </w:p>
+        </w:tc>
+        <w:tc>
+          <w:tcPr>
+            <w:tcW w:type="dxa" w:w="1206"/>
+            <w:tcBorders>
+              <w:top w:val="single" w:color="B9D7F2" w:sz="4"/>
+              <w:left w:val="single" w:color="B9D7F2" w:sz="4"/>
+              <w:bottom w:val="single" w:color="B9D7F2" w:sz="4"/>
+              <w:right w:val="single" w:color="B9D7F2" w:sz="4"/>
+            </w:tcBorders>
+            <w:shd w:fill="EAF4FD" w:color="auto" w:val="clear"/>
+            <w:tcMar>
+              <w:top w:type="dxa" w:w="60"/>
+              <w:left w:type="dxa" w:w="90"/>
+              <w:bottom w:type="dxa" w:w="60"/>
+              <w:right w:type="dxa" w:w="90"/>
+            </w:tcMar>
+          </w:tcPr>
+          <w:p>
+            <w:pPr>
+              <w:spacing w:after="0" w:before="0"/>
+            </w:pPr>
+            <w:r>
+              <w:rPr>
+                <w:rFonts w:ascii="Arial" w:cs="Arial" w:eastAsia="Arial" w:hAnsi="Arial"/>
+                <w:color w:val="15202B"/>
+                <w:sz w:val="18"/>
+                <w:szCs w:val="18"/>
+              </w:rPr>
+              <w:t xml:space="preserve"/>
+            </w:r>
+          </w:p>
+        </w:tc>
+      </w:tr>
+      <w:tr>
+        <w:trPr>
+          <w:cantSplit/>
+        </w:trPr>
+        <w:tc>
+          <w:tcPr>
+            <w:tcW w:type="dxa" w:w="640"/>
+            <w:tcBorders>
+              <w:top w:val="single" w:color="B9D7F2" w:sz="4"/>
+              <w:left w:val="single" w:color="B9D7F2" w:sz="4"/>
+              <w:bottom w:val="single" w:color="B9D7F2" w:sz="4"/>
+              <w:right w:val="single" w:color="B9D7F2" w:sz="4"/>
+            </w:tcBorders>
+            <w:tcMar>
+              <w:top w:type="dxa" w:w="60"/>
+              <w:left w:type="dxa" w:w="90"/>
+              <w:bottom w:type="dxa" w:w="60"/>
+              <w:right w:type="dxa" w:w="90"/>
+            </w:tcMar>
+          </w:tcPr>
+          <w:p>
+            <w:pPr>
+              <w:spacing w:after="0" w:before="0"/>
+            </w:pPr>
+            <w:r>
+              <w:rPr>
+                <w:rFonts w:ascii="Arial" w:cs="Arial" w:eastAsia="Arial" w:hAnsi="Arial"/>
+                <w:color w:val="15202B"/>
+                <w:sz w:val="18"/>
+                <w:szCs w:val="18"/>
+              </w:rPr>
+              <w:t xml:space="preserve">31.7</w:t>
+            </w:r>
+          </w:p>
+        </w:tc>
+        <w:tc>
+          <w:tcPr>
+            <w:tcW w:type="dxa" w:w="3820"/>
+            <w:tcBorders>
+              <w:top w:val="single" w:color="B9D7F2" w:sz="4"/>
+              <w:left w:val="single" w:color="B9D7F2" w:sz="4"/>
+              <w:bottom w:val="single" w:color="B9D7F2" w:sz="4"/>
+              <w:right w:val="single" w:color="B9D7F2" w:sz="4"/>
+            </w:tcBorders>
+            <w:tcMar>
+              <w:top w:type="dxa" w:w="60"/>
+              <w:left w:type="dxa" w:w="90"/>
+              <w:bottom w:type="dxa" w:w="60"/>
+              <w:right w:type="dxa" w:w="90"/>
+            </w:tcMar>
+          </w:tcPr>
+          <w:p>
+            <w:pPr>
+              <w:spacing w:after="0" w:before="0"/>
+            </w:pPr>
+            <w:r>
+              <w:rPr>
+                <w:rFonts w:ascii="Arial" w:cs="Arial" w:eastAsia="Arial" w:hAnsi="Arial"/>
+                <w:color w:val="15202B"/>
+                <w:sz w:val="18"/>
+                <w:szCs w:val="18"/>
+              </w:rPr>
+              <w:t xml:space="preserve">Mark all read.</w:t>
+            </w:r>
+          </w:p>
+        </w:tc>
+        <w:tc>
+          <w:tcPr>
+            <w:tcW w:type="dxa" w:w="3900"/>
+            <w:tcBorders>
+              <w:top w:val="single" w:color="B9D7F2" w:sz="4"/>
+              <w:left w:val="single" w:color="B9D7F2" w:sz="4"/>
+              <w:bottom w:val="single" w:color="B9D7F2" w:sz="4"/>
+              <w:right w:val="single" w:color="B9D7F2" w:sz="4"/>
+            </w:tcBorders>
+            <w:tcMar>
+              <w:top w:type="dxa" w:w="60"/>
+              <w:left w:type="dxa" w:w="90"/>
+              <w:bottom w:type="dxa" w:w="60"/>
+              <w:right w:type="dxa" w:w="90"/>
+            </w:tcMar>
+          </w:tcPr>
+          <w:p>
+            <w:pPr>
+              <w:spacing w:after="0" w:before="0"/>
+            </w:pPr>
+            <w:r>
+              <w:rPr>
+                <w:rFonts w:ascii="Arial" w:cs="Arial" w:eastAsia="Arial" w:hAnsi="Arial"/>
+                <w:color w:val="15202B"/>
+                <w:sz w:val="18"/>
+                <w:szCs w:val="18"/>
+              </w:rPr>
+              <w:t xml:space="preserve">All dots gone; the bell number disappears.</w:t>
+            </w:r>
+          </w:p>
+        </w:tc>
+        <w:tc>
+          <w:tcPr>
+            <w:tcW w:type="dxa" w:w="900"/>
+            <w:tcBorders>
+              <w:top w:val="single" w:color="B9D7F2" w:sz="4"/>
+              <w:left w:val="single" w:color="B9D7F2" w:sz="4"/>
+              <w:bottom w:val="single" w:color="B9D7F2" w:sz="4"/>
+              <w:right w:val="single" w:color="B9D7F2" w:sz="4"/>
+            </w:tcBorders>
+            <w:tcMar>
+              <w:top w:type="dxa" w:w="60"/>
+              <w:left w:type="dxa" w:w="90"/>
+              <w:bottom w:type="dxa" w:w="60"/>
+              <w:right w:type="dxa" w:w="90"/>
+            </w:tcMar>
+          </w:tcPr>
+          <w:p>
+            <w:pPr>
+              <w:spacing w:after="0" w:before="0"/>
+            </w:pPr>
+            <w:r>
+              <w:rPr>
+                <w:rFonts w:ascii="Arial" w:cs="Arial" w:eastAsia="Arial" w:hAnsi="Arial"/>
+                <w:color w:val="15202B"/>
+                <w:sz w:val="18"/>
+                <w:szCs w:val="18"/>
+              </w:rPr>
+              <w:t xml:space="preserve">☐ Pass</w:t>
+            </w:r>
+          </w:p>
+          <w:p>
+            <w:pPr>
+              <w:spacing w:after="0" w:before="0"/>
+            </w:pPr>
+            <w:r>
+              <w:rPr>
+                <w:rFonts w:ascii="Arial" w:cs="Arial" w:eastAsia="Arial" w:hAnsi="Arial"/>
+                <w:color w:val="15202B"/>
+                <w:sz w:val="18"/>
+                <w:szCs w:val="18"/>
+              </w:rPr>
+              <w:t xml:space="preserve">☐ Fail</w:t>
+            </w:r>
+          </w:p>
+        </w:tc>
+        <w:tc>
+          <w:tcPr>
+            <w:tcW w:type="dxa" w:w="1206"/>
+            <w:tcBorders>
+              <w:top w:val="single" w:color="B9D7F2" w:sz="4"/>
+              <w:left w:val="single" w:color="B9D7F2" w:sz="4"/>
+              <w:bottom w:val="single" w:color="B9D7F2" w:sz="4"/>
+              <w:right w:val="single" w:color="B9D7F2" w:sz="4"/>
+            </w:tcBorders>
+            <w:tcMar>
+              <w:top w:type="dxa" w:w="60"/>
+              <w:left w:type="dxa" w:w="90"/>
+              <w:bottom w:type="dxa" w:w="60"/>
+              <w:right w:type="dxa" w:w="90"/>
+            </w:tcMar>
+          </w:tcPr>
+          <w:p>
+            <w:pPr>
+              <w:spacing w:after="0" w:before="0"/>
+            </w:pPr>
+            <w:r>
+              <w:rPr>
+                <w:rFonts w:ascii="Arial" w:cs="Arial" w:eastAsia="Arial" w:hAnsi="Arial"/>
+                <w:color w:val="15202B"/>
+                <w:sz w:val="18"/>
+                <w:szCs w:val="18"/>
+              </w:rPr>
+              <w:t xml:space="preserve"/>
+            </w:r>
+          </w:p>
+        </w:tc>
+      </w:tr>
+      <w:tr>
+        <w:trPr>
+          <w:cantSplit/>
+        </w:trPr>
+        <w:tc>
+          <w:tcPr>
+            <w:tcW w:type="dxa" w:w="640"/>
+            <w:tcBorders>
+              <w:top w:val="single" w:color="B9D7F2" w:sz="4"/>
+              <w:left w:val="single" w:color="B9D7F2" w:sz="4"/>
+              <w:bottom w:val="single" w:color="B9D7F2" w:sz="4"/>
+              <w:right w:val="single" w:color="B9D7F2" w:sz="4"/>
+            </w:tcBorders>
+            <w:shd w:fill="EAF4FD" w:color="auto" w:val="clear"/>
+            <w:tcMar>
+              <w:top w:type="dxa" w:w="60"/>
+              <w:left w:type="dxa" w:w="90"/>
+              <w:bottom w:type="dxa" w:w="60"/>
+              <w:right w:type="dxa" w:w="90"/>
+            </w:tcMar>
+          </w:tcPr>
+          <w:p>
+            <w:pPr>
+              <w:spacing w:after="0" w:before="0"/>
+            </w:pPr>
+            <w:r>
+              <w:rPr>
+                <w:rFonts w:ascii="Arial" w:cs="Arial" w:eastAsia="Arial" w:hAnsi="Arial"/>
+                <w:color w:val="15202B"/>
+                <w:sz w:val="18"/>
+                <w:szCs w:val="18"/>
+              </w:rPr>
+              <w:t xml:space="preserve">31.8</w:t>
+            </w:r>
+          </w:p>
+        </w:tc>
+        <w:tc>
+          <w:tcPr>
+            <w:tcW w:type="dxa" w:w="3820"/>
+            <w:tcBorders>
+              <w:top w:val="single" w:color="B9D7F2" w:sz="4"/>
+              <w:left w:val="single" w:color="B9D7F2" w:sz="4"/>
+              <w:bottom w:val="single" w:color="B9D7F2" w:sz="4"/>
+              <w:right w:val="single" w:color="B9D7F2" w:sz="4"/>
+            </w:tcBorders>
+            <w:shd w:fill="EAF4FD" w:color="auto" w:val="clear"/>
+            <w:tcMar>
+              <w:top w:type="dxa" w:w="60"/>
+              <w:left w:type="dxa" w:w="90"/>
+              <w:bottom w:type="dxa" w:w="60"/>
+              <w:right w:type="dxa" w:w="90"/>
+            </w:tcMar>
+          </w:tcPr>
+          <w:p>
+            <w:pPr>
+              <w:spacing w:after="0" w:before="0"/>
+            </w:pPr>
+            <w:r>
+              <w:rPr>
+                <w:rFonts w:ascii="Arial" w:cs="Arial" w:eastAsia="Arial" w:hAnsi="Arial"/>
+                <w:color w:val="15202B"/>
+                <w:sz w:val="18"/>
+                <w:szCs w:val="18"/>
+              </w:rPr>
+              <w:t xml:space="preserve">More &gt; Notifications.</w:t>
+            </w:r>
+          </w:p>
+        </w:tc>
+        <w:tc>
+          <w:tcPr>
+            <w:tcW w:type="dxa" w:w="3900"/>
+            <w:tcBorders>
+              <w:top w:val="single" w:color="B9D7F2" w:sz="4"/>
+              <w:left w:val="single" w:color="B9D7F2" w:sz="4"/>
+              <w:bottom w:val="single" w:color="B9D7F2" w:sz="4"/>
+              <w:right w:val="single" w:color="B9D7F2" w:sz="4"/>
+            </w:tcBorders>
+            <w:shd w:fill="EAF4FD" w:color="auto" w:val="clear"/>
+            <w:tcMar>
+              <w:top w:type="dxa" w:w="60"/>
+              <w:left w:type="dxa" w:w="90"/>
+              <w:bottom w:type="dxa" w:w="60"/>
+              <w:right w:type="dxa" w:w="90"/>
+            </w:tcMar>
+          </w:tcPr>
+          <w:p>
+            <w:pPr>
+              <w:spacing w:after="0" w:before="0"/>
+            </w:pPr>
+            <w:r>
+              <w:rPr>
+                <w:rFonts w:ascii="Arial" w:cs="Arial" w:eastAsia="Arial" w:hAnsi="Arial"/>
+                <w:color w:val="15202B"/>
+                <w:sz w:val="18"/>
+                <w:szCs w:val="18"/>
+              </w:rPr>
+              <w:t xml:space="preserve">Opens the same list. Preferences shows a message that it comes in step 36.</w:t>
+            </w:r>
+          </w:p>
+        </w:tc>
+        <w:tc>
+          <w:tcPr>
+            <w:tcW w:type="dxa" w:w="900"/>
+            <w:tcBorders>
+              <w:top w:val="single" w:color="B9D7F2" w:sz="4"/>
+              <w:left w:val="single" w:color="B9D7F2" w:sz="4"/>
+              <w:bottom w:val="single" w:color="B9D7F2" w:sz="4"/>
+              <w:right w:val="single" w:color="B9D7F2" w:sz="4"/>
+            </w:tcBorders>
+            <w:shd w:fill="EAF4FD" w:color="auto" w:val="clear"/>
+            <w:tcMar>
+              <w:top w:type="dxa" w:w="60"/>
+              <w:left w:type="dxa" w:w="90"/>
+              <w:bottom w:type="dxa" w:w="60"/>
+              <w:right w:type="dxa" w:w="90"/>
+            </w:tcMar>
+          </w:tcPr>
+          <w:p>
+            <w:pPr>
+              <w:spacing w:after="0" w:before="0"/>
+            </w:pPr>
+            <w:r>
+              <w:rPr>
+                <w:rFonts w:ascii="Arial" w:cs="Arial" w:eastAsia="Arial" w:hAnsi="Arial"/>
+                <w:color w:val="15202B"/>
+                <w:sz w:val="18"/>
+                <w:szCs w:val="18"/>
+              </w:rPr>
+              <w:t xml:space="preserve">☐ Pass</w:t>
+            </w:r>
+          </w:p>
+          <w:p>
+            <w:pPr>
+              <w:spacing w:after="0" w:before="0"/>
+            </w:pPr>
+            <w:r>
+              <w:rPr>
+                <w:rFonts w:ascii="Arial" w:cs="Arial" w:eastAsia="Arial" w:hAnsi="Arial"/>
+                <w:color w:val="15202B"/>
+                <w:sz w:val="18"/>
+                <w:szCs w:val="18"/>
+              </w:rPr>
+              <w:t xml:space="preserve">☐ Fail</w:t>
+            </w:r>
+          </w:p>
+        </w:tc>
+        <w:tc>
+          <w:tcPr>
+            <w:tcW w:type="dxa" w:w="1206"/>
+            <w:tcBorders>
+              <w:top w:val="single" w:color="B9D7F2" w:sz="4"/>
+              <w:left w:val="single" w:color="B9D7F2" w:sz="4"/>
+              <w:bottom w:val="single" w:color="B9D7F2" w:sz="4"/>
+              <w:right w:val="single" w:color="B9D7F2" w:sz="4"/>
+            </w:tcBorders>
+            <w:shd w:fill="EAF4FD" w:color="auto" w:val="clear"/>
+            <w:tcMar>
+              <w:top w:type="dxa" w:w="60"/>
+              <w:left w:type="dxa" w:w="90"/>
+              <w:bottom w:type="dxa" w:w="60"/>
+              <w:right w:type="dxa" w:w="90"/>
+            </w:tcMar>
+          </w:tcPr>
+          <w:p>
+            <w:pPr>
+              <w:spacing w:after="0" w:before="0"/>
+            </w:pPr>
+            <w:r>
+              <w:rPr>
+                <w:rFonts w:ascii="Arial" w:cs="Arial" w:eastAsia="Arial" w:hAnsi="Arial"/>
+                <w:color w:val="15202B"/>
+                <w:sz w:val="18"/>
+                <w:szCs w:val="18"/>
+              </w:rPr>
+              <w:t xml:space="preserve"/>
+            </w:r>
+          </w:p>
+        </w:tc>
+      </w:tr>
+    </w:tbl>
+    <w:p>
+      <w:pPr>
+        <w:pStyle w:val="Heading1"/>
+        <w:pageBreakBefore/>
+        <w:spacing w:after="60"/>
+      </w:pPr>
+      <w:r>
+        <w:rPr>
+          <w:rFonts w:ascii="Arial" w:cs="Arial" w:eastAsia="Arial" w:hAnsi="Arial"/>
+          <w:b/>
+          <w:bCs/>
+          <w:color w:val="0A84E0"/>
+          <w:sz w:val="28"/>
+          <w:szCs w:val="28"/>
+        </w:rPr>
+        <w:t xml:space="preserve">Step 32 · Customer My Orders and reorder</w:t>
+      </w:r>
+    </w:p>
+    <w:p>
+      <w:pPr>
+        <w:spacing w:after="60" w:before="0"/>
+      </w:pPr>
+      <w:r>
+        <w:rPr>
+          <w:rFonts w:ascii="Arial" w:cs="Arial" w:eastAsia="Arial" w:hAnsi="Arial"/>
+          <w:b/>
+          <w:bCs/>
+          <w:color w:val="15202B"/>
+          <w:sz w:val="19"/>
+          <w:szCs w:val="19"/>
+        </w:rPr>
+        <w:t xml:space="preserve">Screens: </w:t>
+      </w:r>
+      <w:r>
+        <w:rPr>
+          <w:rFonts w:ascii="Arial" w:cs="Arial" w:eastAsia="Arial" w:hAnsi="Arial"/>
+          <w:color w:val="15202B"/>
+          <w:sz w:val="19"/>
+          <w:szCs w:val="19"/>
+        </w:rPr>
+        <w:t xml:space="preserve">Customer 6</w:t>
+      </w:r>
+      <w:r>
+        <w:rPr>
+          <w:rFonts w:ascii="Arial" w:cs="Arial" w:eastAsia="Arial" w:hAnsi="Arial"/>
+          <w:b/>
+          <w:bCs/>
+          <w:color w:val="15202B"/>
+          <w:sz w:val="19"/>
+          <w:szCs w:val="19"/>
+        </w:rPr>
+        <w:t xml:space="preserve">    Log in as: </w:t>
+      </w:r>
+      <w:r>
+        <w:rPr>
+          <w:rFonts w:ascii="Arial" w:cs="Arial" w:eastAsia="Arial" w:hAnsi="Arial"/>
+          <w:color w:val="15202B"/>
+          <w:sz w:val="19"/>
+          <w:szCs w:val="19"/>
+        </w:rPr>
+        <w:t xml:space="preserve">Customer Ana</w:t>
+      </w:r>
+    </w:p>
+    <w:tbl>
+      <w:tblPr>
+        <w:tblW w:type="dxa" w:w="10466"/>
+        <w:tblBorders>
+          <w:top w:val="single" w:color="auto" w:sz="4"/>
+          <w:left w:val="single" w:color="auto" w:sz="4"/>
+          <w:bottom w:val="single" w:color="auto" w:sz="4"/>
+          <w:right w:val="single" w:color="auto" w:sz="4"/>
+          <w:insideH w:val="single" w:color="auto" w:sz="4"/>
+          <w:insideV w:val="single" w:color="auto" w:sz="4"/>
+        </w:tblBorders>
+        <w:tblLayout w:type="fixed"/>
+      </w:tblPr>
+      <w:tblGrid>
+        <w:gridCol w:w="640"/>
+        <w:gridCol w:w="3820"/>
+        <w:gridCol w:w="3900"/>
+        <w:gridCol w:w="900"/>
+        <w:gridCol w:w="1206"/>
+      </w:tblGrid>
+      <w:tr>
+        <w:trPr>
+          <w:tblHeader/>
+        </w:trPr>
+        <w:tc>
+          <w:tcPr>
+            <w:tcW w:type="dxa" w:w="640"/>
+            <w:tcBorders>
+              <w:top w:val="single" w:color="B9D7F2" w:sz="4"/>
+              <w:left w:val="single" w:color="B9D7F2" w:sz="4"/>
+              <w:bottom w:val="single" w:color="B9D7F2" w:sz="4"/>
+              <w:right w:val="single" w:color="B9D7F2" w:sz="4"/>
+            </w:tcBorders>
+            <w:shd w:fill="0A84E0" w:color="auto" w:val="clear"/>
+            <w:tcMar>
+              <w:top w:type="dxa" w:w="60"/>
+              <w:left w:type="dxa" w:w="90"/>
+              <w:bottom w:type="dxa" w:w="60"/>
+              <w:right w:type="dxa" w:w="90"/>
+            </w:tcMar>
+          </w:tcPr>
+          <w:p>
+            <w:pPr>
+              <w:spacing w:after="0" w:before="0"/>
+            </w:pPr>
+            <w:r>
+              <w:rPr>
+                <w:rFonts w:ascii="Arial" w:cs="Arial" w:eastAsia="Arial" w:hAnsi="Arial"/>
+                <w:b/>
+                <w:bCs/>
+                <w:color w:val="FFFFFF"/>
+                <w:sz w:val="18"/>
+                <w:szCs w:val="18"/>
+              </w:rPr>
+              <w:t xml:space="preserve">#</w:t>
+            </w:r>
+          </w:p>
+        </w:tc>
+        <w:tc>
+          <w:tcPr>
+            <w:tcW w:type="dxa" w:w="3820"/>
+            <w:tcBorders>
+              <w:top w:val="single" w:color="B9D7F2" w:sz="4"/>
+              <w:left w:val="single" w:color="B9D7F2" w:sz="4"/>
+              <w:bottom w:val="single" w:color="B9D7F2" w:sz="4"/>
+              <w:right w:val="single" w:color="B9D7F2" w:sz="4"/>
+            </w:tcBorders>
+            <w:shd w:fill="0A84E0" w:color="auto" w:val="clear"/>
+            <w:tcMar>
+              <w:top w:type="dxa" w:w="60"/>
+              <w:left w:type="dxa" w:w="90"/>
+              <w:bottom w:type="dxa" w:w="60"/>
+              <w:right w:type="dxa" w:w="90"/>
+            </w:tcMar>
+          </w:tcPr>
+          <w:p>
+            <w:pPr>
+              <w:spacing w:after="0" w:before="0"/>
+            </w:pPr>
+            <w:r>
+              <w:rPr>
+                <w:rFonts w:ascii="Arial" w:cs="Arial" w:eastAsia="Arial" w:hAnsi="Arial"/>
+                <w:b/>
+                <w:bCs/>
+                <w:color w:val="FFFFFF"/>
+                <w:sz w:val="18"/>
+                <w:szCs w:val="18"/>
+              </w:rPr>
+              <w:t xml:space="preserve">What to do</w:t>
+            </w:r>
+          </w:p>
+        </w:tc>
+        <w:tc>
+          <w:tcPr>
+            <w:tcW w:type="dxa" w:w="3900"/>
+            <w:tcBorders>
+              <w:top w:val="single" w:color="B9D7F2" w:sz="4"/>
+              <w:left w:val="single" w:color="B9D7F2" w:sz="4"/>
+              <w:bottom w:val="single" w:color="B9D7F2" w:sz="4"/>
+              <w:right w:val="single" w:color="B9D7F2" w:sz="4"/>
+            </w:tcBorders>
+            <w:shd w:fill="0A84E0" w:color="auto" w:val="clear"/>
+            <w:tcMar>
+              <w:top w:type="dxa" w:w="60"/>
+              <w:left w:type="dxa" w:w="90"/>
+              <w:bottom w:type="dxa" w:w="60"/>
+              <w:right w:type="dxa" w:w="90"/>
+            </w:tcMar>
+          </w:tcPr>
+          <w:p>
+            <w:pPr>
+              <w:spacing w:after="0" w:before="0"/>
+            </w:pPr>
+            <w:r>
+              <w:rPr>
+                <w:rFonts w:ascii="Arial" w:cs="Arial" w:eastAsia="Arial" w:hAnsi="Arial"/>
+                <w:b/>
+                <w:bCs/>
+                <w:color w:val="FFFFFF"/>
+                <w:sz w:val="18"/>
+                <w:szCs w:val="18"/>
+              </w:rPr>
+              <w:t xml:space="preserve">What you should see</w:t>
+            </w:r>
+          </w:p>
+        </w:tc>
+        <w:tc>
+          <w:tcPr>
+            <w:tcW w:type="dxa" w:w="900"/>
+            <w:tcBorders>
+              <w:top w:val="single" w:color="B9D7F2" w:sz="4"/>
+              <w:left w:val="single" w:color="B9D7F2" w:sz="4"/>
+              <w:bottom w:val="single" w:color="B9D7F2" w:sz="4"/>
+              <w:right w:val="single" w:color="B9D7F2" w:sz="4"/>
+            </w:tcBorders>
+            <w:shd w:fill="0A84E0" w:color="auto" w:val="clear"/>
+            <w:tcMar>
+              <w:top w:type="dxa" w:w="60"/>
+              <w:left w:type="dxa" w:w="90"/>
+              <w:bottom w:type="dxa" w:w="60"/>
+              <w:right w:type="dxa" w:w="90"/>
+            </w:tcMar>
+          </w:tcPr>
+          <w:p>
+            <w:pPr>
+              <w:spacing w:after="0" w:before="0"/>
+            </w:pPr>
+            <w:r>
+              <w:rPr>
+                <w:rFonts w:ascii="Arial" w:cs="Arial" w:eastAsia="Arial" w:hAnsi="Arial"/>
+                <w:b/>
+                <w:bCs/>
+                <w:color w:val="FFFFFF"/>
+                <w:sz w:val="18"/>
+                <w:szCs w:val="18"/>
+              </w:rPr>
+              <w:t xml:space="preserve">Result</w:t>
+            </w:r>
+          </w:p>
+        </w:tc>
+        <w:tc>
+          <w:tcPr>
+            <w:tcW w:type="dxa" w:w="1206"/>
+            <w:tcBorders>
+              <w:top w:val="single" w:color="B9D7F2" w:sz="4"/>
+              <w:left w:val="single" w:color="B9D7F2" w:sz="4"/>
+              <w:bottom w:val="single" w:color="B9D7F2" w:sz="4"/>
+              <w:right w:val="single" w:color="B9D7F2" w:sz="4"/>
+            </w:tcBorders>
+            <w:shd w:fill="0A84E0" w:color="auto" w:val="clear"/>
+            <w:tcMar>
+              <w:top w:type="dxa" w:w="60"/>
+              <w:left w:type="dxa" w:w="90"/>
+              <w:bottom w:type="dxa" w:w="60"/>
+              <w:right w:type="dxa" w:w="90"/>
+            </w:tcMar>
+          </w:tcPr>
+          <w:p>
+            <w:pPr>
+              <w:spacing w:after="0" w:before="0"/>
+            </w:pPr>
+            <w:r>
+              <w:rPr>
+                <w:rFonts w:ascii="Arial" w:cs="Arial" w:eastAsia="Arial" w:hAnsi="Arial"/>
+                <w:b/>
+                <w:bCs/>
+                <w:color w:val="FFFFFF"/>
+                <w:sz w:val="18"/>
+                <w:szCs w:val="18"/>
+              </w:rPr>
+              <w:t xml:space="preserve">Notes</w:t>
+            </w:r>
+          </w:p>
+        </w:tc>
+      </w:tr>
+      <w:tr>
+        <w:trPr>
+          <w:cantSplit/>
+        </w:trPr>
+        <w:tc>
+          <w:tcPr>
+            <w:tcW w:type="dxa" w:w="640"/>
+            <w:tcBorders>
+              <w:top w:val="single" w:color="B9D7F2" w:sz="4"/>
+              <w:left w:val="single" w:color="B9D7F2" w:sz="4"/>
+              <w:bottom w:val="single" w:color="B9D7F2" w:sz="4"/>
+              <w:right w:val="single" w:color="B9D7F2" w:sz="4"/>
+            </w:tcBorders>
+            <w:tcMar>
+              <w:top w:type="dxa" w:w="60"/>
+              <w:left w:type="dxa" w:w="90"/>
+              <w:bottom w:type="dxa" w:w="60"/>
+              <w:right w:type="dxa" w:w="90"/>
+            </w:tcMar>
+          </w:tcPr>
+          <w:p>
+            <w:pPr>
+              <w:spacing w:after="0" w:before="0"/>
+            </w:pPr>
+            <w:r>
+              <w:rPr>
+                <w:rFonts w:ascii="Arial" w:cs="Arial" w:eastAsia="Arial" w:hAnsi="Arial"/>
+                <w:color w:val="15202B"/>
+                <w:sz w:val="18"/>
+                <w:szCs w:val="18"/>
+              </w:rPr>
+              <w:t xml:space="preserve">32.1</w:t>
+            </w:r>
+          </w:p>
+        </w:tc>
+        <w:tc>
+          <w:tcPr>
+            <w:tcW w:type="dxa" w:w="3820"/>
+            <w:tcBorders>
+              <w:top w:val="single" w:color="B9D7F2" w:sz="4"/>
+              <w:left w:val="single" w:color="B9D7F2" w:sz="4"/>
+              <w:bottom w:val="single" w:color="B9D7F2" w:sz="4"/>
+              <w:right w:val="single" w:color="B9D7F2" w:sz="4"/>
+            </w:tcBorders>
+            <w:tcMar>
+              <w:top w:type="dxa" w:w="60"/>
+              <w:left w:type="dxa" w:w="90"/>
+              <w:bottom w:type="dxa" w:w="60"/>
+              <w:right w:type="dxa" w:w="90"/>
+            </w:tcMar>
+          </w:tcPr>
+          <w:p>
+            <w:pPr>
+              <w:spacing w:after="0" w:before="0"/>
+            </w:pPr>
+            <w:r>
+              <w:rPr>
+                <w:rFonts w:ascii="Arial" w:cs="Arial" w:eastAsia="Arial" w:hAnsi="Arial"/>
+                <w:color w:val="15202B"/>
+                <w:sz w:val="18"/>
+                <w:szCs w:val="18"/>
+              </w:rPr>
+              <w:t xml:space="preserve">My Orders tab with nothing owed.</w:t>
+            </w:r>
+          </w:p>
+        </w:tc>
+        <w:tc>
+          <w:tcPr>
+            <w:tcW w:type="dxa" w:w="3900"/>
+            <w:tcBorders>
+              <w:top w:val="single" w:color="B9D7F2" w:sz="4"/>
+              <w:left w:val="single" w:color="B9D7F2" w:sz="4"/>
+              <w:bottom w:val="single" w:color="B9D7F2" w:sz="4"/>
+              <w:right w:val="single" w:color="B9D7F2" w:sz="4"/>
+            </w:tcBorders>
+            <w:tcMar>
+              <w:top w:type="dxa" w:w="60"/>
+              <w:left w:type="dxa" w:w="90"/>
+              <w:bottom w:type="dxa" w:w="60"/>
+              <w:right w:type="dxa" w:w="90"/>
+            </w:tcMar>
+          </w:tcPr>
+          <w:p>
+            <w:pPr>
+              <w:spacing w:after="0" w:before="0"/>
+            </w:pPr>
+            <w:r>
+              <w:rPr>
+                <w:rFonts w:ascii="Arial" w:cs="Arial" w:eastAsia="Arial" w:hAnsi="Arial"/>
+                <w:color w:val="15202B"/>
+                <w:sz w:val="18"/>
+                <w:szCs w:val="18"/>
+              </w:rPr>
+              <w:t xml:space="preserve">No Unpaid Balance card; Active (n) and History.</w:t>
+            </w:r>
+          </w:p>
+        </w:tc>
+        <w:tc>
+          <w:tcPr>
+            <w:tcW w:type="dxa" w:w="900"/>
+            <w:tcBorders>
+              <w:top w:val="single" w:color="B9D7F2" w:sz="4"/>
+              <w:left w:val="single" w:color="B9D7F2" w:sz="4"/>
+              <w:bottom w:val="single" w:color="B9D7F2" w:sz="4"/>
+              <w:right w:val="single" w:color="B9D7F2" w:sz="4"/>
+            </w:tcBorders>
+            <w:tcMar>
+              <w:top w:type="dxa" w:w="60"/>
+              <w:left w:type="dxa" w:w="90"/>
+              <w:bottom w:type="dxa" w:w="60"/>
+              <w:right w:type="dxa" w:w="90"/>
+            </w:tcMar>
+          </w:tcPr>
+          <w:p>
+            <w:pPr>
+              <w:spacing w:after="0" w:before="0"/>
+            </w:pPr>
+            <w:r>
+              <w:rPr>
+                <w:rFonts w:ascii="Arial" w:cs="Arial" w:eastAsia="Arial" w:hAnsi="Arial"/>
+                <w:color w:val="15202B"/>
+                <w:sz w:val="18"/>
+                <w:szCs w:val="18"/>
+              </w:rPr>
+              <w:t xml:space="preserve">☐ Pass</w:t>
+            </w:r>
+          </w:p>
+          <w:p>
+            <w:pPr>
+              <w:spacing w:after="0" w:before="0"/>
+            </w:pPr>
+            <w:r>
+              <w:rPr>
+                <w:rFonts w:ascii="Arial" w:cs="Arial" w:eastAsia="Arial" w:hAnsi="Arial"/>
+                <w:color w:val="15202B"/>
+                <w:sz w:val="18"/>
+                <w:szCs w:val="18"/>
+              </w:rPr>
+              <w:t xml:space="preserve">☐ Fail</w:t>
+            </w:r>
+          </w:p>
+        </w:tc>
+        <w:tc>
+          <w:tcPr>
+            <w:tcW w:type="dxa" w:w="1206"/>
+            <w:tcBorders>
+              <w:top w:val="single" w:color="B9D7F2" w:sz="4"/>
+              <w:left w:val="single" w:color="B9D7F2" w:sz="4"/>
+              <w:bottom w:val="single" w:color="B9D7F2" w:sz="4"/>
+              <w:right w:val="single" w:color="B9D7F2" w:sz="4"/>
+            </w:tcBorders>
+            <w:tcMar>
+              <w:top w:type="dxa" w:w="60"/>
+              <w:left w:type="dxa" w:w="90"/>
+              <w:bottom w:type="dxa" w:w="60"/>
+              <w:right w:type="dxa" w:w="90"/>
+            </w:tcMar>
+          </w:tcPr>
+          <w:p>
+            <w:pPr>
+              <w:spacing w:after="0" w:before="0"/>
+            </w:pPr>
+            <w:r>
+              <w:rPr>
+                <w:rFonts w:ascii="Arial" w:cs="Arial" w:eastAsia="Arial" w:hAnsi="Arial"/>
+                <w:color w:val="15202B"/>
+                <w:sz w:val="18"/>
+                <w:szCs w:val="18"/>
+              </w:rPr>
+              <w:t xml:space="preserve"/>
+            </w:r>
+          </w:p>
+        </w:tc>
+      </w:tr>
+      <w:tr>
+        <w:trPr>
+          <w:cantSplit/>
+        </w:trPr>
+        <w:tc>
+          <w:tcPr>
+            <w:tcW w:type="dxa" w:w="640"/>
+            <w:tcBorders>
+              <w:top w:val="single" w:color="B9D7F2" w:sz="4"/>
+              <w:left w:val="single" w:color="B9D7F2" w:sz="4"/>
+              <w:bottom w:val="single" w:color="B9D7F2" w:sz="4"/>
+              <w:right w:val="single" w:color="B9D7F2" w:sz="4"/>
+            </w:tcBorders>
+            <w:shd w:fill="EAF4FD" w:color="auto" w:val="clear"/>
+            <w:tcMar>
+              <w:top w:type="dxa" w:w="60"/>
+              <w:left w:type="dxa" w:w="90"/>
+              <w:bottom w:type="dxa" w:w="60"/>
+              <w:right w:type="dxa" w:w="90"/>
+            </w:tcMar>
+          </w:tcPr>
+          <w:p>
+            <w:pPr>
+              <w:spacing w:after="0" w:before="0"/>
+            </w:pPr>
+            <w:r>
+              <w:rPr>
+                <w:rFonts w:ascii="Arial" w:cs="Arial" w:eastAsia="Arial" w:hAnsi="Arial"/>
+                <w:color w:val="15202B"/>
+                <w:sz w:val="18"/>
+                <w:szCs w:val="18"/>
+              </w:rPr>
+              <w:t xml:space="preserve">32.2</w:t>
+            </w:r>
+          </w:p>
+        </w:tc>
+        <w:tc>
+          <w:tcPr>
+            <w:tcW w:type="dxa" w:w="3820"/>
+            <w:tcBorders>
+              <w:top w:val="single" w:color="B9D7F2" w:sz="4"/>
+              <w:left w:val="single" w:color="B9D7F2" w:sz="4"/>
+              <w:bottom w:val="single" w:color="B9D7F2" w:sz="4"/>
+              <w:right w:val="single" w:color="B9D7F2" w:sz="4"/>
+            </w:tcBorders>
+            <w:shd w:fill="EAF4FD" w:color="auto" w:val="clear"/>
+            <w:tcMar>
+              <w:top w:type="dxa" w:w="60"/>
+              <w:left w:type="dxa" w:w="90"/>
+              <w:bottom w:type="dxa" w:w="60"/>
+              <w:right w:type="dxa" w:w="90"/>
+            </w:tcMar>
+          </w:tcPr>
+          <w:p>
+            <w:pPr>
+              <w:spacing w:after="0" w:before="0"/>
+            </w:pPr>
+            <w:r>
+              <w:rPr>
+                <w:rFonts w:ascii="Arial" w:cs="Arial" w:eastAsia="Arial" w:hAnsi="Arial"/>
+                <w:color w:val="15202B"/>
+                <w:sz w:val="18"/>
+                <w:szCs w:val="18"/>
+              </w:rPr>
+              <w:t xml:space="preserve">Active.</w:t>
+            </w:r>
+          </w:p>
+        </w:tc>
+        <w:tc>
+          <w:tcPr>
+            <w:tcW w:type="dxa" w:w="3900"/>
+            <w:tcBorders>
+              <w:top w:val="single" w:color="B9D7F2" w:sz="4"/>
+              <w:left w:val="single" w:color="B9D7F2" w:sz="4"/>
+              <w:bottom w:val="single" w:color="B9D7F2" w:sz="4"/>
+              <w:right w:val="single" w:color="B9D7F2" w:sz="4"/>
+            </w:tcBorders>
+            <w:shd w:fill="EAF4FD" w:color="auto" w:val="clear"/>
+            <w:tcMar>
+              <w:top w:type="dxa" w:w="60"/>
+              <w:left w:type="dxa" w:w="90"/>
+              <w:bottom w:type="dxa" w:w="60"/>
+              <w:right w:type="dxa" w:w="90"/>
+            </w:tcMar>
+          </w:tcPr>
+          <w:p>
+            <w:pPr>
+              <w:spacing w:after="0" w:before="0"/>
+            </w:pPr>
+            <w:r>
+              <w:rPr>
+                <w:rFonts w:ascii="Arial" w:cs="Arial" w:eastAsia="Arial" w:hAnsi="Arial"/>
+                <w:color w:val="15202B"/>
+                <w:sz w:val="18"/>
+                <w:szCs w:val="18"/>
+              </w:rPr>
+              <w:t xml:space="preserve">Each order in progress: "2 gallons · Refill", "Today 9:20 AM · By 10:05 AM", tag (Waiting to be accepted, Processing, Out for delivery).</w:t>
+            </w:r>
+          </w:p>
+        </w:tc>
+        <w:tc>
+          <w:tcPr>
+            <w:tcW w:type="dxa" w:w="900"/>
+            <w:tcBorders>
+              <w:top w:val="single" w:color="B9D7F2" w:sz="4"/>
+              <w:left w:val="single" w:color="B9D7F2" w:sz="4"/>
+              <w:bottom w:val="single" w:color="B9D7F2" w:sz="4"/>
+              <w:right w:val="single" w:color="B9D7F2" w:sz="4"/>
+            </w:tcBorders>
+            <w:shd w:fill="EAF4FD" w:color="auto" w:val="clear"/>
+            <w:tcMar>
+              <w:top w:type="dxa" w:w="60"/>
+              <w:left w:type="dxa" w:w="90"/>
+              <w:bottom w:type="dxa" w:w="60"/>
+              <w:right w:type="dxa" w:w="90"/>
+            </w:tcMar>
+          </w:tcPr>
+          <w:p>
+            <w:pPr>
+              <w:spacing w:after="0" w:before="0"/>
+            </w:pPr>
+            <w:r>
+              <w:rPr>
+                <w:rFonts w:ascii="Arial" w:cs="Arial" w:eastAsia="Arial" w:hAnsi="Arial"/>
+                <w:color w:val="15202B"/>
+                <w:sz w:val="18"/>
+                <w:szCs w:val="18"/>
+              </w:rPr>
+              <w:t xml:space="preserve">☐ Pass</w:t>
+            </w:r>
+          </w:p>
+          <w:p>
+            <w:pPr>
+              <w:spacing w:after="0" w:before="0"/>
+            </w:pPr>
+            <w:r>
+              <w:rPr>
+                <w:rFonts w:ascii="Arial" w:cs="Arial" w:eastAsia="Arial" w:hAnsi="Arial"/>
+                <w:color w:val="15202B"/>
+                <w:sz w:val="18"/>
+                <w:szCs w:val="18"/>
+              </w:rPr>
+              <w:t xml:space="preserve">☐ Fail</w:t>
+            </w:r>
+          </w:p>
+        </w:tc>
+        <w:tc>
+          <w:tcPr>
+            <w:tcW w:type="dxa" w:w="1206"/>
+            <w:tcBorders>
+              <w:top w:val="single" w:color="B9D7F2" w:sz="4"/>
+              <w:left w:val="single" w:color="B9D7F2" w:sz="4"/>
+              <w:bottom w:val="single" w:color="B9D7F2" w:sz="4"/>
+              <w:right w:val="single" w:color="B9D7F2" w:sz="4"/>
+            </w:tcBorders>
+            <w:shd w:fill="EAF4FD" w:color="auto" w:val="clear"/>
+            <w:tcMar>
+              <w:top w:type="dxa" w:w="60"/>
+              <w:left w:type="dxa" w:w="90"/>
+              <w:bottom w:type="dxa" w:w="60"/>
+              <w:right w:type="dxa" w:w="90"/>
+            </w:tcMar>
+          </w:tcPr>
+          <w:p>
+            <w:pPr>
+              <w:spacing w:after="0" w:before="0"/>
+            </w:pPr>
+            <w:r>
+              <w:rPr>
+                <w:rFonts w:ascii="Arial" w:cs="Arial" w:eastAsia="Arial" w:hAnsi="Arial"/>
+                <w:color w:val="15202B"/>
+                <w:sz w:val="18"/>
+                <w:szCs w:val="18"/>
+              </w:rPr>
+              <w:t xml:space="preserve"/>
+            </w:r>
+          </w:p>
+        </w:tc>
+      </w:tr>
+      <w:tr>
+        <w:trPr>
+          <w:cantSplit/>
+        </w:trPr>
+        <w:tc>
+          <w:tcPr>
+            <w:tcW w:type="dxa" w:w="640"/>
+            <w:tcBorders>
+              <w:top w:val="single" w:color="B9D7F2" w:sz="4"/>
+              <w:left w:val="single" w:color="B9D7F2" w:sz="4"/>
+              <w:bottom w:val="single" w:color="B9D7F2" w:sz="4"/>
+              <w:right w:val="single" w:color="B9D7F2" w:sz="4"/>
+            </w:tcBorders>
+            <w:tcMar>
+              <w:top w:type="dxa" w:w="60"/>
+              <w:left w:type="dxa" w:w="90"/>
+              <w:bottom w:type="dxa" w:w="60"/>
+              <w:right w:type="dxa" w:w="90"/>
+            </w:tcMar>
+          </w:tcPr>
+          <w:p>
+            <w:pPr>
+              <w:spacing w:after="0" w:before="0"/>
+            </w:pPr>
+            <w:r>
+              <w:rPr>
+                <w:rFonts w:ascii="Arial" w:cs="Arial" w:eastAsia="Arial" w:hAnsi="Arial"/>
+                <w:color w:val="15202B"/>
+                <w:sz w:val="18"/>
+                <w:szCs w:val="18"/>
+              </w:rPr>
+              <w:t xml:space="preserve">32.3</w:t>
+            </w:r>
+          </w:p>
+        </w:tc>
+        <w:tc>
+          <w:tcPr>
+            <w:tcW w:type="dxa" w:w="3820"/>
+            <w:tcBorders>
+              <w:top w:val="single" w:color="B9D7F2" w:sz="4"/>
+              <w:left w:val="single" w:color="B9D7F2" w:sz="4"/>
+              <w:bottom w:val="single" w:color="B9D7F2" w:sz="4"/>
+              <w:right w:val="single" w:color="B9D7F2" w:sz="4"/>
+            </w:tcBorders>
+            <w:tcMar>
+              <w:top w:type="dxa" w:w="60"/>
+              <w:left w:type="dxa" w:w="90"/>
+              <w:bottom w:type="dxa" w:w="60"/>
+              <w:right w:type="dxa" w:w="90"/>
+            </w:tcMar>
+          </w:tcPr>
+          <w:p>
+            <w:pPr>
+              <w:spacing w:after="0" w:before="0"/>
+            </w:pPr>
+            <w:r>
+              <w:rPr>
+                <w:rFonts w:ascii="Arial" w:cs="Arial" w:eastAsia="Arial" w:hAnsi="Arial"/>
+                <w:color w:val="15202B"/>
+                <w:sz w:val="18"/>
+                <w:szCs w:val="18"/>
+              </w:rPr>
+              <w:t xml:space="preserve">Tap one.</w:t>
+            </w:r>
+          </w:p>
+        </w:tc>
+        <w:tc>
+          <w:tcPr>
+            <w:tcW w:type="dxa" w:w="3900"/>
+            <w:tcBorders>
+              <w:top w:val="single" w:color="B9D7F2" w:sz="4"/>
+              <w:left w:val="single" w:color="B9D7F2" w:sz="4"/>
+              <w:bottom w:val="single" w:color="B9D7F2" w:sz="4"/>
+              <w:right w:val="single" w:color="B9D7F2" w:sz="4"/>
+            </w:tcBorders>
+            <w:tcMar>
+              <w:top w:type="dxa" w:w="60"/>
+              <w:left w:type="dxa" w:w="90"/>
+              <w:bottom w:type="dxa" w:w="60"/>
+              <w:right w:type="dxa" w:w="90"/>
+            </w:tcMar>
+          </w:tcPr>
+          <w:p>
+            <w:pPr>
+              <w:spacing w:after="0" w:before="0"/>
+            </w:pPr>
+            <w:r>
+              <w:rPr>
+                <w:rFonts w:ascii="Arial" w:cs="Arial" w:eastAsia="Arial" w:hAnsi="Arial"/>
+                <w:color w:val="15202B"/>
+                <w:sz w:val="18"/>
+                <w:szCs w:val="18"/>
+              </w:rPr>
+              <w:t xml:space="preserve">Order Details with the 5 steps (step 18).</w:t>
+            </w:r>
+          </w:p>
+        </w:tc>
+        <w:tc>
+          <w:tcPr>
+            <w:tcW w:type="dxa" w:w="900"/>
+            <w:tcBorders>
+              <w:top w:val="single" w:color="B9D7F2" w:sz="4"/>
+              <w:left w:val="single" w:color="B9D7F2" w:sz="4"/>
+              <w:bottom w:val="single" w:color="B9D7F2" w:sz="4"/>
+              <w:right w:val="single" w:color="B9D7F2" w:sz="4"/>
+            </w:tcBorders>
+            <w:tcMar>
+              <w:top w:type="dxa" w:w="60"/>
+              <w:left w:type="dxa" w:w="90"/>
+              <w:bottom w:type="dxa" w:w="60"/>
+              <w:right w:type="dxa" w:w="90"/>
+            </w:tcMar>
+          </w:tcPr>
+          <w:p>
+            <w:pPr>
+              <w:spacing w:after="0" w:before="0"/>
+            </w:pPr>
+            <w:r>
+              <w:rPr>
+                <w:rFonts w:ascii="Arial" w:cs="Arial" w:eastAsia="Arial" w:hAnsi="Arial"/>
+                <w:color w:val="15202B"/>
+                <w:sz w:val="18"/>
+                <w:szCs w:val="18"/>
+              </w:rPr>
+              <w:t xml:space="preserve">☐ Pass</w:t>
+            </w:r>
+          </w:p>
+          <w:p>
+            <w:pPr>
+              <w:spacing w:after="0" w:before="0"/>
+            </w:pPr>
+            <w:r>
+              <w:rPr>
+                <w:rFonts w:ascii="Arial" w:cs="Arial" w:eastAsia="Arial" w:hAnsi="Arial"/>
+                <w:color w:val="15202B"/>
+                <w:sz w:val="18"/>
+                <w:szCs w:val="18"/>
+              </w:rPr>
+              <w:t xml:space="preserve">☐ Fail</w:t>
+            </w:r>
+          </w:p>
+        </w:tc>
+        <w:tc>
+          <w:tcPr>
+            <w:tcW w:type="dxa" w:w="1206"/>
+            <w:tcBorders>
+              <w:top w:val="single" w:color="B9D7F2" w:sz="4"/>
+              <w:left w:val="single" w:color="B9D7F2" w:sz="4"/>
+              <w:bottom w:val="single" w:color="B9D7F2" w:sz="4"/>
+              <w:right w:val="single" w:color="B9D7F2" w:sz="4"/>
+            </w:tcBorders>
+            <w:tcMar>
+              <w:top w:type="dxa" w:w="60"/>
+              <w:left w:type="dxa" w:w="90"/>
+              <w:bottom w:type="dxa" w:w="60"/>
+              <w:right w:type="dxa" w:w="90"/>
+            </w:tcMar>
+          </w:tcPr>
+          <w:p>
+            <w:pPr>
+              <w:spacing w:after="0" w:before="0"/>
+            </w:pPr>
+            <w:r>
+              <w:rPr>
+                <w:rFonts w:ascii="Arial" w:cs="Arial" w:eastAsia="Arial" w:hAnsi="Arial"/>
+                <w:color w:val="15202B"/>
+                <w:sz w:val="18"/>
+                <w:szCs w:val="18"/>
+              </w:rPr>
+              <w:t xml:space="preserve"/>
+            </w:r>
+          </w:p>
+        </w:tc>
+      </w:tr>
+      <w:tr>
+        <w:trPr>
+          <w:cantSplit/>
+        </w:trPr>
+        <w:tc>
+          <w:tcPr>
+            <w:tcW w:type="dxa" w:w="640"/>
+            <w:tcBorders>
+              <w:top w:val="single" w:color="B9D7F2" w:sz="4"/>
+              <w:left w:val="single" w:color="B9D7F2" w:sz="4"/>
+              <w:bottom w:val="single" w:color="B9D7F2" w:sz="4"/>
+              <w:right w:val="single" w:color="B9D7F2" w:sz="4"/>
+            </w:tcBorders>
+            <w:shd w:fill="EAF4FD" w:color="auto" w:val="clear"/>
+            <w:tcMar>
+              <w:top w:type="dxa" w:w="60"/>
+              <w:left w:type="dxa" w:w="90"/>
+              <w:bottom w:type="dxa" w:w="60"/>
+              <w:right w:type="dxa" w:w="90"/>
+            </w:tcMar>
+          </w:tcPr>
+          <w:p>
+            <w:pPr>
+              <w:spacing w:after="0" w:before="0"/>
+            </w:pPr>
+            <w:r>
+              <w:rPr>
+                <w:rFonts w:ascii="Arial" w:cs="Arial" w:eastAsia="Arial" w:hAnsi="Arial"/>
+                <w:color w:val="15202B"/>
+                <w:sz w:val="18"/>
+                <w:szCs w:val="18"/>
+              </w:rPr>
+              <w:t xml:space="preserve">32.4</w:t>
+            </w:r>
+          </w:p>
+        </w:tc>
+        <w:tc>
+          <w:tcPr>
+            <w:tcW w:type="dxa" w:w="3820"/>
+            <w:tcBorders>
+              <w:top w:val="single" w:color="B9D7F2" w:sz="4"/>
+              <w:left w:val="single" w:color="B9D7F2" w:sz="4"/>
+              <w:bottom w:val="single" w:color="B9D7F2" w:sz="4"/>
+              <w:right w:val="single" w:color="B9D7F2" w:sz="4"/>
+            </w:tcBorders>
+            <w:shd w:fill="EAF4FD" w:color="auto" w:val="clear"/>
+            <w:tcMar>
+              <w:top w:type="dxa" w:w="60"/>
+              <w:left w:type="dxa" w:w="90"/>
+              <w:bottom w:type="dxa" w:w="60"/>
+              <w:right w:type="dxa" w:w="90"/>
+            </w:tcMar>
+          </w:tcPr>
+          <w:p>
+            <w:pPr>
+              <w:spacing w:after="0" w:before="0"/>
+            </w:pPr>
+            <w:r>
+              <w:rPr>
+                <w:rFonts w:ascii="Arial" w:cs="Arial" w:eastAsia="Arial" w:hAnsi="Arial"/>
+                <w:color w:val="15202B"/>
+                <w:sz w:val="18"/>
+                <w:szCs w:val="18"/>
+              </w:rPr>
+              <w:t xml:space="preserve">History.</w:t>
+            </w:r>
+          </w:p>
+        </w:tc>
+        <w:tc>
+          <w:tcPr>
+            <w:tcW w:type="dxa" w:w="3900"/>
+            <w:tcBorders>
+              <w:top w:val="single" w:color="B9D7F2" w:sz="4"/>
+              <w:left w:val="single" w:color="B9D7F2" w:sz="4"/>
+              <w:bottom w:val="single" w:color="B9D7F2" w:sz="4"/>
+              <w:right w:val="single" w:color="B9D7F2" w:sz="4"/>
+            </w:tcBorders>
+            <w:shd w:fill="EAF4FD" w:color="auto" w:val="clear"/>
+            <w:tcMar>
+              <w:top w:type="dxa" w:w="60"/>
+              <w:left w:type="dxa" w:w="90"/>
+              <w:bottom w:type="dxa" w:w="60"/>
+              <w:right w:type="dxa" w:w="90"/>
+            </w:tcMar>
+          </w:tcPr>
+          <w:p>
+            <w:pPr>
+              <w:spacing w:after="0" w:before="0"/>
+            </w:pPr>
+            <w:r>
+              <w:rPr>
+                <w:rFonts w:ascii="Arial" w:cs="Arial" w:eastAsia="Arial" w:hAnsi="Arial"/>
+                <w:color w:val="15202B"/>
+                <w:sz w:val="18"/>
+                <w:szCs w:val="18"/>
+              </w:rPr>
+              <w:t xml:space="preserve">Delivered (Paid), Delivered (Unpaid), Declined, Cancelled and Not delivered orders with the date and a Reorder button.</w:t>
+            </w:r>
+          </w:p>
+        </w:tc>
+        <w:tc>
+          <w:tcPr>
+            <w:tcW w:type="dxa" w:w="900"/>
+            <w:tcBorders>
+              <w:top w:val="single" w:color="B9D7F2" w:sz="4"/>
+              <w:left w:val="single" w:color="B9D7F2" w:sz="4"/>
+              <w:bottom w:val="single" w:color="B9D7F2" w:sz="4"/>
+              <w:right w:val="single" w:color="B9D7F2" w:sz="4"/>
+            </w:tcBorders>
+            <w:shd w:fill="EAF4FD" w:color="auto" w:val="clear"/>
+            <w:tcMar>
+              <w:top w:type="dxa" w:w="60"/>
+              <w:left w:type="dxa" w:w="90"/>
+              <w:bottom w:type="dxa" w:w="60"/>
+              <w:right w:type="dxa" w:w="90"/>
+            </w:tcMar>
+          </w:tcPr>
+          <w:p>
+            <w:pPr>
+              <w:spacing w:after="0" w:before="0"/>
+            </w:pPr>
+            <w:r>
+              <w:rPr>
+                <w:rFonts w:ascii="Arial" w:cs="Arial" w:eastAsia="Arial" w:hAnsi="Arial"/>
+                <w:color w:val="15202B"/>
+                <w:sz w:val="18"/>
+                <w:szCs w:val="18"/>
+              </w:rPr>
+              <w:t xml:space="preserve">☐ Pass</w:t>
+            </w:r>
+          </w:p>
+          <w:p>
+            <w:pPr>
+              <w:spacing w:after="0" w:before="0"/>
+            </w:pPr>
+            <w:r>
+              <w:rPr>
+                <w:rFonts w:ascii="Arial" w:cs="Arial" w:eastAsia="Arial" w:hAnsi="Arial"/>
+                <w:color w:val="15202B"/>
+                <w:sz w:val="18"/>
+                <w:szCs w:val="18"/>
+              </w:rPr>
+              <w:t xml:space="preserve">☐ Fail</w:t>
+            </w:r>
+          </w:p>
+        </w:tc>
+        <w:tc>
+          <w:tcPr>
+            <w:tcW w:type="dxa" w:w="1206"/>
+            <w:tcBorders>
+              <w:top w:val="single" w:color="B9D7F2" w:sz="4"/>
+              <w:left w:val="single" w:color="B9D7F2" w:sz="4"/>
+              <w:bottom w:val="single" w:color="B9D7F2" w:sz="4"/>
+              <w:right w:val="single" w:color="B9D7F2" w:sz="4"/>
+            </w:tcBorders>
+            <w:shd w:fill="EAF4FD" w:color="auto" w:val="clear"/>
+            <w:tcMar>
+              <w:top w:type="dxa" w:w="60"/>
+              <w:left w:type="dxa" w:w="90"/>
+              <w:bottom w:type="dxa" w:w="60"/>
+              <w:right w:type="dxa" w:w="90"/>
+            </w:tcMar>
+          </w:tcPr>
+          <w:p>
+            <w:pPr>
+              <w:spacing w:after="0" w:before="0"/>
+            </w:pPr>
+            <w:r>
+              <w:rPr>
+                <w:rFonts w:ascii="Arial" w:cs="Arial" w:eastAsia="Arial" w:hAnsi="Arial"/>
+                <w:color w:val="15202B"/>
+                <w:sz w:val="18"/>
+                <w:szCs w:val="18"/>
+              </w:rPr>
+              <w:t xml:space="preserve"/>
+            </w:r>
+          </w:p>
+        </w:tc>
+      </w:tr>
+      <w:tr>
+        <w:trPr>
+          <w:cantSplit/>
+        </w:trPr>
+        <w:tc>
+          <w:tcPr>
+            <w:tcW w:type="dxa" w:w="640"/>
+            <w:tcBorders>
+              <w:top w:val="single" w:color="B9D7F2" w:sz="4"/>
+              <w:left w:val="single" w:color="B9D7F2" w:sz="4"/>
+              <w:bottom w:val="single" w:color="B9D7F2" w:sz="4"/>
+              <w:right w:val="single" w:color="B9D7F2" w:sz="4"/>
+            </w:tcBorders>
+            <w:tcMar>
+              <w:top w:type="dxa" w:w="60"/>
+              <w:left w:type="dxa" w:w="90"/>
+              <w:bottom w:type="dxa" w:w="60"/>
+              <w:right w:type="dxa" w:w="90"/>
+            </w:tcMar>
+          </w:tcPr>
+          <w:p>
+            <w:pPr>
+              <w:spacing w:after="0" w:before="0"/>
+            </w:pPr>
+            <w:r>
+              <w:rPr>
+                <w:rFonts w:ascii="Arial" w:cs="Arial" w:eastAsia="Arial" w:hAnsi="Arial"/>
+                <w:color w:val="15202B"/>
+                <w:sz w:val="18"/>
+                <w:szCs w:val="18"/>
+              </w:rPr>
+              <w:t xml:space="preserve">32.5</w:t>
+            </w:r>
+          </w:p>
+        </w:tc>
+        <w:tc>
+          <w:tcPr>
+            <w:tcW w:type="dxa" w:w="3820"/>
+            <w:tcBorders>
+              <w:top w:val="single" w:color="B9D7F2" w:sz="4"/>
+              <w:left w:val="single" w:color="B9D7F2" w:sz="4"/>
+              <w:bottom w:val="single" w:color="B9D7F2" w:sz="4"/>
+              <w:right w:val="single" w:color="B9D7F2" w:sz="4"/>
+            </w:tcBorders>
+            <w:tcMar>
+              <w:top w:type="dxa" w:w="60"/>
+              <w:left w:type="dxa" w:w="90"/>
+              <w:bottom w:type="dxa" w:w="60"/>
+              <w:right w:type="dxa" w:w="90"/>
+            </w:tcMar>
+          </w:tcPr>
+          <w:p>
+            <w:pPr>
+              <w:spacing w:after="0" w:before="0"/>
+            </w:pPr>
+            <w:r>
+              <w:rPr>
+                <w:rFonts w:ascii="Arial" w:cs="Arial" w:eastAsia="Arial" w:hAnsi="Arial"/>
+                <w:color w:val="15202B"/>
+                <w:sz w:val="18"/>
+                <w:szCs w:val="18"/>
+              </w:rPr>
+              <w:t xml:space="preserve">Tap Reorder.</w:t>
+            </w:r>
+          </w:p>
+        </w:tc>
+        <w:tc>
+          <w:tcPr>
+            <w:tcW w:type="dxa" w:w="3900"/>
+            <w:tcBorders>
+              <w:top w:val="single" w:color="B9D7F2" w:sz="4"/>
+              <w:left w:val="single" w:color="B9D7F2" w:sz="4"/>
+              <w:bottom w:val="single" w:color="B9D7F2" w:sz="4"/>
+              <w:right w:val="single" w:color="B9D7F2" w:sz="4"/>
+            </w:tcBorders>
+            <w:tcMar>
+              <w:top w:type="dxa" w:w="60"/>
+              <w:left w:type="dxa" w:w="90"/>
+              <w:bottom w:type="dxa" w:w="60"/>
+              <w:right w:type="dxa" w:w="90"/>
+            </w:tcMar>
+          </w:tcPr>
+          <w:p>
+            <w:pPr>
+              <w:spacing w:after="0" w:before="0"/>
+            </w:pPr>
+            <w:r>
+              <w:rPr>
+                <w:rFonts w:ascii="Arial" w:cs="Arial" w:eastAsia="Arial" w:hAnsi="Arial"/>
+                <w:color w:val="15202B"/>
+                <w:sz w:val="18"/>
+                <w:szCs w:val="18"/>
+              </w:rPr>
+              <w:t xml:space="preserve">Order Form filled in from the old order (type, gallons, address, phone). Place order works.</w:t>
+            </w:r>
+          </w:p>
+        </w:tc>
+        <w:tc>
+          <w:tcPr>
+            <w:tcW w:type="dxa" w:w="900"/>
+            <w:tcBorders>
+              <w:top w:val="single" w:color="B9D7F2" w:sz="4"/>
+              <w:left w:val="single" w:color="B9D7F2" w:sz="4"/>
+              <w:bottom w:val="single" w:color="B9D7F2" w:sz="4"/>
+              <w:right w:val="single" w:color="B9D7F2" w:sz="4"/>
+            </w:tcBorders>
+            <w:tcMar>
+              <w:top w:type="dxa" w:w="60"/>
+              <w:left w:type="dxa" w:w="90"/>
+              <w:bottom w:type="dxa" w:w="60"/>
+              <w:right w:type="dxa" w:w="90"/>
+            </w:tcMar>
+          </w:tcPr>
+          <w:p>
+            <w:pPr>
+              <w:spacing w:after="0" w:before="0"/>
+            </w:pPr>
+            <w:r>
+              <w:rPr>
+                <w:rFonts w:ascii="Arial" w:cs="Arial" w:eastAsia="Arial" w:hAnsi="Arial"/>
+                <w:color w:val="15202B"/>
+                <w:sz w:val="18"/>
+                <w:szCs w:val="18"/>
+              </w:rPr>
+              <w:t xml:space="preserve">☐ Pass</w:t>
+            </w:r>
+          </w:p>
+          <w:p>
+            <w:pPr>
+              <w:spacing w:after="0" w:before="0"/>
+            </w:pPr>
+            <w:r>
+              <w:rPr>
+                <w:rFonts w:ascii="Arial" w:cs="Arial" w:eastAsia="Arial" w:hAnsi="Arial"/>
+                <w:color w:val="15202B"/>
+                <w:sz w:val="18"/>
+                <w:szCs w:val="18"/>
+              </w:rPr>
+              <w:t xml:space="preserve">☐ Fail</w:t>
+            </w:r>
+          </w:p>
+        </w:tc>
+        <w:tc>
+          <w:tcPr>
+            <w:tcW w:type="dxa" w:w="1206"/>
+            <w:tcBorders>
+              <w:top w:val="single" w:color="B9D7F2" w:sz="4"/>
+              <w:left w:val="single" w:color="B9D7F2" w:sz="4"/>
+              <w:bottom w:val="single" w:color="B9D7F2" w:sz="4"/>
+              <w:right w:val="single" w:color="B9D7F2" w:sz="4"/>
+            </w:tcBorders>
+            <w:tcMar>
+              <w:top w:type="dxa" w:w="60"/>
+              <w:left w:type="dxa" w:w="90"/>
+              <w:bottom w:type="dxa" w:w="60"/>
+              <w:right w:type="dxa" w:w="90"/>
+            </w:tcMar>
+          </w:tcPr>
+          <w:p>
+            <w:pPr>
+              <w:spacing w:after="0" w:before="0"/>
+            </w:pPr>
+            <w:r>
+              <w:rPr>
+                <w:rFonts w:ascii="Arial" w:cs="Arial" w:eastAsia="Arial" w:hAnsi="Arial"/>
+                <w:color w:val="15202B"/>
+                <w:sz w:val="18"/>
+                <w:szCs w:val="18"/>
+              </w:rPr>
+              <w:t xml:space="preserve"/>
+            </w:r>
+          </w:p>
+        </w:tc>
+      </w:tr>
+      <w:tr>
+        <w:trPr>
+          <w:cantSplit/>
+        </w:trPr>
+        <w:tc>
+          <w:tcPr>
+            <w:tcW w:type="dxa" w:w="640"/>
+            <w:tcBorders>
+              <w:top w:val="single" w:color="B9D7F2" w:sz="4"/>
+              <w:left w:val="single" w:color="B9D7F2" w:sz="4"/>
+              <w:bottom w:val="single" w:color="B9D7F2" w:sz="4"/>
+              <w:right w:val="single" w:color="B9D7F2" w:sz="4"/>
+            </w:tcBorders>
+            <w:shd w:fill="EAF4FD" w:color="auto" w:val="clear"/>
+            <w:tcMar>
+              <w:top w:type="dxa" w:w="60"/>
+              <w:left w:type="dxa" w:w="90"/>
+              <w:bottom w:type="dxa" w:w="60"/>
+              <w:right w:type="dxa" w:w="90"/>
+            </w:tcMar>
+          </w:tcPr>
+          <w:p>
+            <w:pPr>
+              <w:spacing w:after="0" w:before="0"/>
+            </w:pPr>
+            <w:r>
+              <w:rPr>
+                <w:rFonts w:ascii="Arial" w:cs="Arial" w:eastAsia="Arial" w:hAnsi="Arial"/>
+                <w:color w:val="15202B"/>
+                <w:sz w:val="18"/>
+                <w:szCs w:val="18"/>
+              </w:rPr>
+              <w:t xml:space="preserve">32.6</w:t>
+            </w:r>
+          </w:p>
+        </w:tc>
+        <w:tc>
+          <w:tcPr>
+            <w:tcW w:type="dxa" w:w="3820"/>
+            <w:tcBorders>
+              <w:top w:val="single" w:color="B9D7F2" w:sz="4"/>
+              <w:left w:val="single" w:color="B9D7F2" w:sz="4"/>
+              <w:bottom w:val="single" w:color="B9D7F2" w:sz="4"/>
+              <w:right w:val="single" w:color="B9D7F2" w:sz="4"/>
+            </w:tcBorders>
+            <w:shd w:fill="EAF4FD" w:color="auto" w:val="clear"/>
+            <w:tcMar>
+              <w:top w:type="dxa" w:w="60"/>
+              <w:left w:type="dxa" w:w="90"/>
+              <w:bottom w:type="dxa" w:w="60"/>
+              <w:right w:type="dxa" w:w="90"/>
+            </w:tcMar>
+          </w:tcPr>
+          <w:p>
+            <w:pPr>
+              <w:spacing w:after="0" w:before="0"/>
+            </w:pPr>
+            <w:r>
+              <w:rPr>
+                <w:rFonts w:ascii="Arial" w:cs="Arial" w:eastAsia="Arial" w:hAnsi="Arial"/>
+                <w:color w:val="15202B"/>
+                <w:sz w:val="18"/>
+                <w:szCs w:val="18"/>
+              </w:rPr>
+              <w:t xml:space="preserve">An order delivered Unpaid.</w:t>
+            </w:r>
+          </w:p>
+        </w:tc>
+        <w:tc>
+          <w:tcPr>
+            <w:tcW w:type="dxa" w:w="3900"/>
+            <w:tcBorders>
+              <w:top w:val="single" w:color="B9D7F2" w:sz="4"/>
+              <w:left w:val="single" w:color="B9D7F2" w:sz="4"/>
+              <w:bottom w:val="single" w:color="B9D7F2" w:sz="4"/>
+              <w:right w:val="single" w:color="B9D7F2" w:sz="4"/>
+            </w:tcBorders>
+            <w:shd w:fill="EAF4FD" w:color="auto" w:val="clear"/>
+            <w:tcMar>
+              <w:top w:type="dxa" w:w="60"/>
+              <w:left w:type="dxa" w:w="90"/>
+              <w:bottom w:type="dxa" w:w="60"/>
+              <w:right w:type="dxa" w:w="90"/>
+            </w:tcMar>
+          </w:tcPr>
+          <w:p>
+            <w:pPr>
+              <w:spacing w:after="0" w:before="0"/>
+            </w:pPr>
+            <w:r>
+              <w:rPr>
+                <w:rFonts w:ascii="Arial" w:cs="Arial" w:eastAsia="Arial" w:hAnsi="Arial"/>
+                <w:color w:val="15202B"/>
+                <w:sz w:val="18"/>
+                <w:szCs w:val="18"/>
+              </w:rPr>
+              <w:t xml:space="preserve">Unpaid Balance card "Amount owed P..." at the top. It goes away after the owner marks it paid.</w:t>
             </w:r>
           </w:p>
         </w:tc>

</xml_diff>

<commit_message>
T33 guest mode (name on order form, guest My Orders and My Account, sign up moves guest orders); START.bat installs new server libraries; socket.io, pdfkit, exceljs
Co-Authored-By: Claude Opus 5.5 <noreply@anthropic.com>
Claude-Session: https://claude.ai/code/session_01DasQCNUJBbLyCWkvv4Qmw3
</commit_message>
<xml_diff>
--- a/docs/testing/Mangao-Testing-Checklist.docx
+++ b/docs/testing/Mangao-Testing-Checklist.docx
@@ -30,7 +30,7 @@
           <w:sz w:val="19"/>
           <w:szCs w:val="19"/>
         </w:rPr>
-        <w:t xml:space="preserve">Steps built but not yet checked in Chrome: 23 steps, 179 checks. Updated Oct 14, 2026, 1:05 AM.</w:t>
+        <w:t xml:space="preserve">Steps built but not yet checked in Chrome: 24 steps, 189 checks. Updated Oct 14, 2026, 1:13 AM.</w:t>
       </w:r>
     </w:p>
     <w:p>
@@ -5031,6 +5031,171 @@
           </w:p>
         </w:tc>
       </w:tr>
+      <w:tr>
+        <w:trPr>
+          <w:cantSplit/>
+        </w:trPr>
+        <w:tc>
+          <w:tcPr>
+            <w:tcW w:type="dxa" w:w="900"/>
+            <w:tcBorders>
+              <w:top w:val="single" w:color="B9D7F2" w:sz="4"/>
+              <w:left w:val="single" w:color="B9D7F2" w:sz="4"/>
+              <w:bottom w:val="single" w:color="B9D7F2" w:sz="4"/>
+              <w:right w:val="single" w:color="B9D7F2" w:sz="4"/>
+            </w:tcBorders>
+            <w:shd w:fill="EAF4FD" w:color="auto" w:val="clear"/>
+            <w:tcMar>
+              <w:top w:type="dxa" w:w="60"/>
+              <w:left w:type="dxa" w:w="90"/>
+              <w:bottom w:type="dxa" w:w="60"/>
+              <w:right w:type="dxa" w:w="90"/>
+            </w:tcMar>
+          </w:tcPr>
+          <w:p>
+            <w:pPr>
+              <w:spacing w:after="0" w:before="0"/>
+            </w:pPr>
+            <w:r>
+              <w:rPr>
+                <w:rFonts w:ascii="Arial" w:cs="Arial" w:eastAsia="Arial" w:hAnsi="Arial"/>
+                <w:color w:val="15202B"/>
+                <w:sz w:val="18"/>
+                <w:szCs w:val="18"/>
+              </w:rPr>
+              <w:t xml:space="preserve">33</w:t>
+            </w:r>
+          </w:p>
+        </w:tc>
+        <w:tc>
+          <w:tcPr>
+            <w:tcW w:type="dxa" w:w="4400"/>
+            <w:tcBorders>
+              <w:top w:val="single" w:color="B9D7F2" w:sz="4"/>
+              <w:left w:val="single" w:color="B9D7F2" w:sz="4"/>
+              <w:bottom w:val="single" w:color="B9D7F2" w:sz="4"/>
+              <w:right w:val="single" w:color="B9D7F2" w:sz="4"/>
+            </w:tcBorders>
+            <w:shd w:fill="EAF4FD" w:color="auto" w:val="clear"/>
+            <w:tcMar>
+              <w:top w:type="dxa" w:w="60"/>
+              <w:left w:type="dxa" w:w="90"/>
+              <w:bottom w:type="dxa" w:w="60"/>
+              <w:right w:type="dxa" w:w="90"/>
+            </w:tcMar>
+          </w:tcPr>
+          <w:p>
+            <w:pPr>
+              <w:spacing w:after="0" w:before="0"/>
+            </w:pPr>
+            <w:r>
+              <w:rPr>
+                <w:rFonts w:ascii="Arial" w:cs="Arial" w:eastAsia="Arial" w:hAnsi="Arial"/>
+                <w:color w:val="15202B"/>
+                <w:sz w:val="18"/>
+                <w:szCs w:val="18"/>
+              </w:rPr>
+              <w:t xml:space="preserve">Guest mode</w:t>
+            </w:r>
+          </w:p>
+        </w:tc>
+        <w:tc>
+          <w:tcPr>
+            <w:tcW w:type="dxa" w:w="2600"/>
+            <w:tcBorders>
+              <w:top w:val="single" w:color="B9D7F2" w:sz="4"/>
+              <w:left w:val="single" w:color="B9D7F2" w:sz="4"/>
+              <w:bottom w:val="single" w:color="B9D7F2" w:sz="4"/>
+              <w:right w:val="single" w:color="B9D7F2" w:sz="4"/>
+            </w:tcBorders>
+            <w:shd w:fill="EAF4FD" w:color="auto" w:val="clear"/>
+            <w:tcMar>
+              <w:top w:type="dxa" w:w="60"/>
+              <w:left w:type="dxa" w:w="90"/>
+              <w:bottom w:type="dxa" w:w="60"/>
+              <w:right w:type="dxa" w:w="90"/>
+            </w:tcMar>
+          </w:tcPr>
+          <w:p>
+            <w:pPr>
+              <w:spacing w:after="0" w:before="0"/>
+            </w:pPr>
+            <w:r>
+              <w:rPr>
+                <w:rFonts w:ascii="Arial" w:cs="Arial" w:eastAsia="Arial" w:hAnsi="Arial"/>
+                <w:color w:val="15202B"/>
+                <w:sz w:val="18"/>
+                <w:szCs w:val="18"/>
+              </w:rPr>
+              <w:t xml:space="preserve">Customer 9, 10</w:t>
+            </w:r>
+          </w:p>
+        </w:tc>
+        <w:tc>
+          <w:tcPr>
+            <w:tcW w:type="dxa" w:w="1300"/>
+            <w:tcBorders>
+              <w:top w:val="single" w:color="B9D7F2" w:sz="4"/>
+              <w:left w:val="single" w:color="B9D7F2" w:sz="4"/>
+              <w:bottom w:val="single" w:color="B9D7F2" w:sz="4"/>
+              <w:right w:val="single" w:color="B9D7F2" w:sz="4"/>
+            </w:tcBorders>
+            <w:shd w:fill="EAF4FD" w:color="auto" w:val="clear"/>
+            <w:tcMar>
+              <w:top w:type="dxa" w:w="60"/>
+              <w:left w:type="dxa" w:w="90"/>
+              <w:bottom w:type="dxa" w:w="60"/>
+              <w:right w:type="dxa" w:w="90"/>
+            </w:tcMar>
+          </w:tcPr>
+          <w:p>
+            <w:pPr>
+              <w:spacing w:after="0" w:before="0"/>
+            </w:pPr>
+            <w:r>
+              <w:rPr>
+                <w:rFonts w:ascii="Arial" w:cs="Arial" w:eastAsia="Arial" w:hAnsi="Arial"/>
+                <w:color w:val="15202B"/>
+                <w:sz w:val="18"/>
+                <w:szCs w:val="18"/>
+              </w:rPr>
+              <w:t xml:space="preserve">10</w:t>
+            </w:r>
+          </w:p>
+        </w:tc>
+        <w:tc>
+          <w:tcPr>
+            <w:tcW w:type="dxa" w:w="1266"/>
+            <w:tcBorders>
+              <w:top w:val="single" w:color="B9D7F2" w:sz="4"/>
+              <w:left w:val="single" w:color="B9D7F2" w:sz="4"/>
+              <w:bottom w:val="single" w:color="B9D7F2" w:sz="4"/>
+              <w:right w:val="single" w:color="B9D7F2" w:sz="4"/>
+            </w:tcBorders>
+            <w:shd w:fill="EAF4FD" w:color="auto" w:val="clear"/>
+            <w:tcMar>
+              <w:top w:type="dxa" w:w="60"/>
+              <w:left w:type="dxa" w:w="90"/>
+              <w:bottom w:type="dxa" w:w="60"/>
+              <w:right w:type="dxa" w:w="90"/>
+            </w:tcMar>
+          </w:tcPr>
+          <w:p>
+            <w:pPr>
+              <w:spacing w:after="0" w:before="0"/>
+            </w:pPr>
+            <w:r>
+              <w:rPr>
+                <w:rFonts w:ascii="Arial" w:cs="Arial" w:eastAsia="Arial" w:hAnsi="Arial"/>
+                <w:color w:val="15202B"/>
+                <w:sz w:val="18"/>
+                <w:szCs w:val="18"/>
+              </w:rPr>
+              <w:t xml:space="preserve">☐ Yes  ☐ No</w:t>
+            </w:r>
+          </w:p>
+        </w:tc>
+      </w:tr>
     </w:tbl>
     <w:p>
       <w:pPr>
@@ -42612,6 +42777,2030 @@
                 <w:szCs w:val="18"/>
               </w:rPr>
               <w:t xml:space="preserve">Unpaid Balance card "Amount owed P..." at the top. It goes away after the owner marks it paid.</w:t>
+            </w:r>
+          </w:p>
+        </w:tc>
+        <w:tc>
+          <w:tcPr>
+            <w:tcW w:type="dxa" w:w="900"/>
+            <w:tcBorders>
+              <w:top w:val="single" w:color="B9D7F2" w:sz="4"/>
+              <w:left w:val="single" w:color="B9D7F2" w:sz="4"/>
+              <w:bottom w:val="single" w:color="B9D7F2" w:sz="4"/>
+              <w:right w:val="single" w:color="B9D7F2" w:sz="4"/>
+            </w:tcBorders>
+            <w:shd w:fill="EAF4FD" w:color="auto" w:val="clear"/>
+            <w:tcMar>
+              <w:top w:type="dxa" w:w="60"/>
+              <w:left w:type="dxa" w:w="90"/>
+              <w:bottom w:type="dxa" w:w="60"/>
+              <w:right w:type="dxa" w:w="90"/>
+            </w:tcMar>
+          </w:tcPr>
+          <w:p>
+            <w:pPr>
+              <w:spacing w:after="0" w:before="0"/>
+            </w:pPr>
+            <w:r>
+              <w:rPr>
+                <w:rFonts w:ascii="Arial" w:cs="Arial" w:eastAsia="Arial" w:hAnsi="Arial"/>
+                <w:color w:val="15202B"/>
+                <w:sz w:val="18"/>
+                <w:szCs w:val="18"/>
+              </w:rPr>
+              <w:t xml:space="preserve">☐ Pass</w:t>
+            </w:r>
+          </w:p>
+          <w:p>
+            <w:pPr>
+              <w:spacing w:after="0" w:before="0"/>
+            </w:pPr>
+            <w:r>
+              <w:rPr>
+                <w:rFonts w:ascii="Arial" w:cs="Arial" w:eastAsia="Arial" w:hAnsi="Arial"/>
+                <w:color w:val="15202B"/>
+                <w:sz w:val="18"/>
+                <w:szCs w:val="18"/>
+              </w:rPr>
+              <w:t xml:space="preserve">☐ Fail</w:t>
+            </w:r>
+          </w:p>
+        </w:tc>
+        <w:tc>
+          <w:tcPr>
+            <w:tcW w:type="dxa" w:w="1206"/>
+            <w:tcBorders>
+              <w:top w:val="single" w:color="B9D7F2" w:sz="4"/>
+              <w:left w:val="single" w:color="B9D7F2" w:sz="4"/>
+              <w:bottom w:val="single" w:color="B9D7F2" w:sz="4"/>
+              <w:right w:val="single" w:color="B9D7F2" w:sz="4"/>
+            </w:tcBorders>
+            <w:shd w:fill="EAF4FD" w:color="auto" w:val="clear"/>
+            <w:tcMar>
+              <w:top w:type="dxa" w:w="60"/>
+              <w:left w:type="dxa" w:w="90"/>
+              <w:bottom w:type="dxa" w:w="60"/>
+              <w:right w:type="dxa" w:w="90"/>
+            </w:tcMar>
+          </w:tcPr>
+          <w:p>
+            <w:pPr>
+              <w:spacing w:after="0" w:before="0"/>
+            </w:pPr>
+            <w:r>
+              <w:rPr>
+                <w:rFonts w:ascii="Arial" w:cs="Arial" w:eastAsia="Arial" w:hAnsi="Arial"/>
+                <w:color w:val="15202B"/>
+                <w:sz w:val="18"/>
+                <w:szCs w:val="18"/>
+              </w:rPr>
+              <w:t xml:space="preserve"/>
+            </w:r>
+          </w:p>
+        </w:tc>
+      </w:tr>
+    </w:tbl>
+    <w:p>
+      <w:pPr>
+        <w:pStyle w:val="Heading1"/>
+        <w:pageBreakBefore/>
+        <w:spacing w:after="60"/>
+      </w:pPr>
+      <w:r>
+        <w:rPr>
+          <w:rFonts w:ascii="Arial" w:cs="Arial" w:eastAsia="Arial" w:hAnsi="Arial"/>
+          <w:b/>
+          <w:bCs/>
+          <w:color w:val="0A84E0"/>
+          <w:sz w:val="28"/>
+          <w:szCs w:val="28"/>
+        </w:rPr>
+        <w:t xml:space="preserve">Step 33 · Guest mode</w:t>
+      </w:r>
+    </w:p>
+    <w:p>
+      <w:pPr>
+        <w:spacing w:after="60" w:before="0"/>
+      </w:pPr>
+      <w:r>
+        <w:rPr>
+          <w:rFonts w:ascii="Arial" w:cs="Arial" w:eastAsia="Arial" w:hAnsi="Arial"/>
+          <w:b/>
+          <w:bCs/>
+          <w:color w:val="15202B"/>
+          <w:sz w:val="19"/>
+          <w:szCs w:val="19"/>
+        </w:rPr>
+        <w:t xml:space="preserve">Screens: </w:t>
+      </w:r>
+      <w:r>
+        <w:rPr>
+          <w:rFonts w:ascii="Arial" w:cs="Arial" w:eastAsia="Arial" w:hAnsi="Arial"/>
+          <w:color w:val="15202B"/>
+          <w:sz w:val="19"/>
+          <w:szCs w:val="19"/>
+        </w:rPr>
+        <w:t xml:space="preserve">Customer 9, 10</w:t>
+      </w:r>
+      <w:r>
+        <w:rPr>
+          <w:rFonts w:ascii="Arial" w:cs="Arial" w:eastAsia="Arial" w:hAnsi="Arial"/>
+          <w:b/>
+          <w:bCs/>
+          <w:color w:val="15202B"/>
+          <w:sz w:val="19"/>
+          <w:szCs w:val="19"/>
+        </w:rPr>
+        <w:t xml:space="preserve">    Log in as: </w:t>
+      </w:r>
+      <w:r>
+        <w:rPr>
+          <w:rFonts w:ascii="Arial" w:cs="Arial" w:eastAsia="Arial" w:hAnsi="Arial"/>
+          <w:color w:val="15202B"/>
+          <w:sz w:val="19"/>
+          <w:szCs w:val="19"/>
+        </w:rPr>
+        <w:t xml:space="preserve">Nobody logged in (Welcome screen)</w:t>
+      </w:r>
+    </w:p>
+    <w:tbl>
+      <w:tblPr>
+        <w:tblW w:type="dxa" w:w="10466"/>
+        <w:tblBorders>
+          <w:top w:val="single" w:color="auto" w:sz="4"/>
+          <w:left w:val="single" w:color="auto" w:sz="4"/>
+          <w:bottom w:val="single" w:color="auto" w:sz="4"/>
+          <w:right w:val="single" w:color="auto" w:sz="4"/>
+          <w:insideH w:val="single" w:color="auto" w:sz="4"/>
+          <w:insideV w:val="single" w:color="auto" w:sz="4"/>
+        </w:tblBorders>
+        <w:tblLayout w:type="fixed"/>
+      </w:tblPr>
+      <w:tblGrid>
+        <w:gridCol w:w="640"/>
+        <w:gridCol w:w="3820"/>
+        <w:gridCol w:w="3900"/>
+        <w:gridCol w:w="900"/>
+        <w:gridCol w:w="1206"/>
+      </w:tblGrid>
+      <w:tr>
+        <w:trPr>
+          <w:tblHeader/>
+        </w:trPr>
+        <w:tc>
+          <w:tcPr>
+            <w:tcW w:type="dxa" w:w="640"/>
+            <w:tcBorders>
+              <w:top w:val="single" w:color="B9D7F2" w:sz="4"/>
+              <w:left w:val="single" w:color="B9D7F2" w:sz="4"/>
+              <w:bottom w:val="single" w:color="B9D7F2" w:sz="4"/>
+              <w:right w:val="single" w:color="B9D7F2" w:sz="4"/>
+            </w:tcBorders>
+            <w:shd w:fill="0A84E0" w:color="auto" w:val="clear"/>
+            <w:tcMar>
+              <w:top w:type="dxa" w:w="60"/>
+              <w:left w:type="dxa" w:w="90"/>
+              <w:bottom w:type="dxa" w:w="60"/>
+              <w:right w:type="dxa" w:w="90"/>
+            </w:tcMar>
+          </w:tcPr>
+          <w:p>
+            <w:pPr>
+              <w:spacing w:after="0" w:before="0"/>
+            </w:pPr>
+            <w:r>
+              <w:rPr>
+                <w:rFonts w:ascii="Arial" w:cs="Arial" w:eastAsia="Arial" w:hAnsi="Arial"/>
+                <w:b/>
+                <w:bCs/>
+                <w:color w:val="FFFFFF"/>
+                <w:sz w:val="18"/>
+                <w:szCs w:val="18"/>
+              </w:rPr>
+              <w:t xml:space="preserve">#</w:t>
+            </w:r>
+          </w:p>
+        </w:tc>
+        <w:tc>
+          <w:tcPr>
+            <w:tcW w:type="dxa" w:w="3820"/>
+            <w:tcBorders>
+              <w:top w:val="single" w:color="B9D7F2" w:sz="4"/>
+              <w:left w:val="single" w:color="B9D7F2" w:sz="4"/>
+              <w:bottom w:val="single" w:color="B9D7F2" w:sz="4"/>
+              <w:right w:val="single" w:color="B9D7F2" w:sz="4"/>
+            </w:tcBorders>
+            <w:shd w:fill="0A84E0" w:color="auto" w:val="clear"/>
+            <w:tcMar>
+              <w:top w:type="dxa" w:w="60"/>
+              <w:left w:type="dxa" w:w="90"/>
+              <w:bottom w:type="dxa" w:w="60"/>
+              <w:right w:type="dxa" w:w="90"/>
+            </w:tcMar>
+          </w:tcPr>
+          <w:p>
+            <w:pPr>
+              <w:spacing w:after="0" w:before="0"/>
+            </w:pPr>
+            <w:r>
+              <w:rPr>
+                <w:rFonts w:ascii="Arial" w:cs="Arial" w:eastAsia="Arial" w:hAnsi="Arial"/>
+                <w:b/>
+                <w:bCs/>
+                <w:color w:val="FFFFFF"/>
+                <w:sz w:val="18"/>
+                <w:szCs w:val="18"/>
+              </w:rPr>
+              <w:t xml:space="preserve">What to do</w:t>
+            </w:r>
+          </w:p>
+        </w:tc>
+        <w:tc>
+          <w:tcPr>
+            <w:tcW w:type="dxa" w:w="3900"/>
+            <w:tcBorders>
+              <w:top w:val="single" w:color="B9D7F2" w:sz="4"/>
+              <w:left w:val="single" w:color="B9D7F2" w:sz="4"/>
+              <w:bottom w:val="single" w:color="B9D7F2" w:sz="4"/>
+              <w:right w:val="single" w:color="B9D7F2" w:sz="4"/>
+            </w:tcBorders>
+            <w:shd w:fill="0A84E0" w:color="auto" w:val="clear"/>
+            <w:tcMar>
+              <w:top w:type="dxa" w:w="60"/>
+              <w:left w:type="dxa" w:w="90"/>
+              <w:bottom w:type="dxa" w:w="60"/>
+              <w:right w:type="dxa" w:w="90"/>
+            </w:tcMar>
+          </w:tcPr>
+          <w:p>
+            <w:pPr>
+              <w:spacing w:after="0" w:before="0"/>
+            </w:pPr>
+            <w:r>
+              <w:rPr>
+                <w:rFonts w:ascii="Arial" w:cs="Arial" w:eastAsia="Arial" w:hAnsi="Arial"/>
+                <w:b/>
+                <w:bCs/>
+                <w:color w:val="FFFFFF"/>
+                <w:sz w:val="18"/>
+                <w:szCs w:val="18"/>
+              </w:rPr>
+              <w:t xml:space="preserve">What you should see</w:t>
+            </w:r>
+          </w:p>
+        </w:tc>
+        <w:tc>
+          <w:tcPr>
+            <w:tcW w:type="dxa" w:w="900"/>
+            <w:tcBorders>
+              <w:top w:val="single" w:color="B9D7F2" w:sz="4"/>
+              <w:left w:val="single" w:color="B9D7F2" w:sz="4"/>
+              <w:bottom w:val="single" w:color="B9D7F2" w:sz="4"/>
+              <w:right w:val="single" w:color="B9D7F2" w:sz="4"/>
+            </w:tcBorders>
+            <w:shd w:fill="0A84E0" w:color="auto" w:val="clear"/>
+            <w:tcMar>
+              <w:top w:type="dxa" w:w="60"/>
+              <w:left w:type="dxa" w:w="90"/>
+              <w:bottom w:type="dxa" w:w="60"/>
+              <w:right w:type="dxa" w:w="90"/>
+            </w:tcMar>
+          </w:tcPr>
+          <w:p>
+            <w:pPr>
+              <w:spacing w:after="0" w:before="0"/>
+            </w:pPr>
+            <w:r>
+              <w:rPr>
+                <w:rFonts w:ascii="Arial" w:cs="Arial" w:eastAsia="Arial" w:hAnsi="Arial"/>
+                <w:b/>
+                <w:bCs/>
+                <w:color w:val="FFFFFF"/>
+                <w:sz w:val="18"/>
+                <w:szCs w:val="18"/>
+              </w:rPr>
+              <w:t xml:space="preserve">Result</w:t>
+            </w:r>
+          </w:p>
+        </w:tc>
+        <w:tc>
+          <w:tcPr>
+            <w:tcW w:type="dxa" w:w="1206"/>
+            <w:tcBorders>
+              <w:top w:val="single" w:color="B9D7F2" w:sz="4"/>
+              <w:left w:val="single" w:color="B9D7F2" w:sz="4"/>
+              <w:bottom w:val="single" w:color="B9D7F2" w:sz="4"/>
+              <w:right w:val="single" w:color="B9D7F2" w:sz="4"/>
+            </w:tcBorders>
+            <w:shd w:fill="0A84E0" w:color="auto" w:val="clear"/>
+            <w:tcMar>
+              <w:top w:type="dxa" w:w="60"/>
+              <w:left w:type="dxa" w:w="90"/>
+              <w:bottom w:type="dxa" w:w="60"/>
+              <w:right w:type="dxa" w:w="90"/>
+            </w:tcMar>
+          </w:tcPr>
+          <w:p>
+            <w:pPr>
+              <w:spacing w:after="0" w:before="0"/>
+            </w:pPr>
+            <w:r>
+              <w:rPr>
+                <w:rFonts w:ascii="Arial" w:cs="Arial" w:eastAsia="Arial" w:hAnsi="Arial"/>
+                <w:b/>
+                <w:bCs/>
+                <w:color w:val="FFFFFF"/>
+                <w:sz w:val="18"/>
+                <w:szCs w:val="18"/>
+              </w:rPr>
+              <w:t xml:space="preserve">Notes</w:t>
+            </w:r>
+          </w:p>
+        </w:tc>
+      </w:tr>
+      <w:tr>
+        <w:trPr>
+          <w:cantSplit/>
+        </w:trPr>
+        <w:tc>
+          <w:tcPr>
+            <w:tcW w:type="dxa" w:w="640"/>
+            <w:tcBorders>
+              <w:top w:val="single" w:color="B9D7F2" w:sz="4"/>
+              <w:left w:val="single" w:color="B9D7F2" w:sz="4"/>
+              <w:bottom w:val="single" w:color="B9D7F2" w:sz="4"/>
+              <w:right w:val="single" w:color="B9D7F2" w:sz="4"/>
+            </w:tcBorders>
+            <w:tcMar>
+              <w:top w:type="dxa" w:w="60"/>
+              <w:left w:type="dxa" w:w="90"/>
+              <w:bottom w:type="dxa" w:w="60"/>
+              <w:right w:type="dxa" w:w="90"/>
+            </w:tcMar>
+          </w:tcPr>
+          <w:p>
+            <w:pPr>
+              <w:spacing w:after="0" w:before="0"/>
+            </w:pPr>
+            <w:r>
+              <w:rPr>
+                <w:rFonts w:ascii="Arial" w:cs="Arial" w:eastAsia="Arial" w:hAnsi="Arial"/>
+                <w:color w:val="15202B"/>
+                <w:sz w:val="18"/>
+                <w:szCs w:val="18"/>
+              </w:rPr>
+              <w:t xml:space="preserve">33.1</w:t>
+            </w:r>
+          </w:p>
+        </w:tc>
+        <w:tc>
+          <w:tcPr>
+            <w:tcW w:type="dxa" w:w="3820"/>
+            <w:tcBorders>
+              <w:top w:val="single" w:color="B9D7F2" w:sz="4"/>
+              <w:left w:val="single" w:color="B9D7F2" w:sz="4"/>
+              <w:bottom w:val="single" w:color="B9D7F2" w:sz="4"/>
+              <w:right w:val="single" w:color="B9D7F2" w:sz="4"/>
+            </w:tcBorders>
+            <w:tcMar>
+              <w:top w:type="dxa" w:w="60"/>
+              <w:left w:type="dxa" w:w="90"/>
+              <w:bottom w:type="dxa" w:w="60"/>
+              <w:right w:type="dxa" w:w="90"/>
+            </w:tcMar>
+          </w:tcPr>
+          <w:p>
+            <w:pPr>
+              <w:spacing w:after="0" w:before="0"/>
+            </w:pPr>
+            <w:r>
+              <w:rPr>
+                <w:rFonts w:ascii="Arial" w:cs="Arial" w:eastAsia="Arial" w:hAnsi="Arial"/>
+                <w:color w:val="15202B"/>
+                <w:sz w:val="18"/>
+                <w:szCs w:val="18"/>
+              </w:rPr>
+              <w:t xml:space="preserve">Welcome &gt; Continue as guest.</w:t>
+            </w:r>
+          </w:p>
+        </w:tc>
+        <w:tc>
+          <w:tcPr>
+            <w:tcW w:type="dxa" w:w="3900"/>
+            <w:tcBorders>
+              <w:top w:val="single" w:color="B9D7F2" w:sz="4"/>
+              <w:left w:val="single" w:color="B9D7F2" w:sz="4"/>
+              <w:bottom w:val="single" w:color="B9D7F2" w:sz="4"/>
+              <w:right w:val="single" w:color="B9D7F2" w:sz="4"/>
+            </w:tcBorders>
+            <w:tcMar>
+              <w:top w:type="dxa" w:w="60"/>
+              <w:left w:type="dxa" w:w="90"/>
+              <w:bottom w:type="dxa" w:w="60"/>
+              <w:right w:type="dxa" w:w="90"/>
+            </w:tcMar>
+          </w:tcPr>
+          <w:p>
+            <w:pPr>
+              <w:spacing w:after="0" w:before="0"/>
+            </w:pPr>
+            <w:r>
+              <w:rPr>
+                <w:rFonts w:ascii="Arial" w:cs="Arial" w:eastAsia="Arial" w:hAnsi="Arial"/>
+                <w:color w:val="15202B"/>
+                <w:sz w:val="18"/>
+                <w:szCs w:val="18"/>
+              </w:rPr>
+              <w:t xml:space="preserve">Customer Home with the note "Orders kept on this phone only", Order Now and the Price List.</w:t>
+            </w:r>
+          </w:p>
+        </w:tc>
+        <w:tc>
+          <w:tcPr>
+            <w:tcW w:type="dxa" w:w="900"/>
+            <w:tcBorders>
+              <w:top w:val="single" w:color="B9D7F2" w:sz="4"/>
+              <w:left w:val="single" w:color="B9D7F2" w:sz="4"/>
+              <w:bottom w:val="single" w:color="B9D7F2" w:sz="4"/>
+              <w:right w:val="single" w:color="B9D7F2" w:sz="4"/>
+            </w:tcBorders>
+            <w:tcMar>
+              <w:top w:type="dxa" w:w="60"/>
+              <w:left w:type="dxa" w:w="90"/>
+              <w:bottom w:type="dxa" w:w="60"/>
+              <w:right w:type="dxa" w:w="90"/>
+            </w:tcMar>
+          </w:tcPr>
+          <w:p>
+            <w:pPr>
+              <w:spacing w:after="0" w:before="0"/>
+            </w:pPr>
+            <w:r>
+              <w:rPr>
+                <w:rFonts w:ascii="Arial" w:cs="Arial" w:eastAsia="Arial" w:hAnsi="Arial"/>
+                <w:color w:val="15202B"/>
+                <w:sz w:val="18"/>
+                <w:szCs w:val="18"/>
+              </w:rPr>
+              <w:t xml:space="preserve">☐ Pass</w:t>
+            </w:r>
+          </w:p>
+          <w:p>
+            <w:pPr>
+              <w:spacing w:after="0" w:before="0"/>
+            </w:pPr>
+            <w:r>
+              <w:rPr>
+                <w:rFonts w:ascii="Arial" w:cs="Arial" w:eastAsia="Arial" w:hAnsi="Arial"/>
+                <w:color w:val="15202B"/>
+                <w:sz w:val="18"/>
+                <w:szCs w:val="18"/>
+              </w:rPr>
+              <w:t xml:space="preserve">☐ Fail</w:t>
+            </w:r>
+          </w:p>
+        </w:tc>
+        <w:tc>
+          <w:tcPr>
+            <w:tcW w:type="dxa" w:w="1206"/>
+            <w:tcBorders>
+              <w:top w:val="single" w:color="B9D7F2" w:sz="4"/>
+              <w:left w:val="single" w:color="B9D7F2" w:sz="4"/>
+              <w:bottom w:val="single" w:color="B9D7F2" w:sz="4"/>
+              <w:right w:val="single" w:color="B9D7F2" w:sz="4"/>
+            </w:tcBorders>
+            <w:tcMar>
+              <w:top w:type="dxa" w:w="60"/>
+              <w:left w:type="dxa" w:w="90"/>
+              <w:bottom w:type="dxa" w:w="60"/>
+              <w:right w:type="dxa" w:w="90"/>
+            </w:tcMar>
+          </w:tcPr>
+          <w:p>
+            <w:pPr>
+              <w:spacing w:after="0" w:before="0"/>
+            </w:pPr>
+            <w:r>
+              <w:rPr>
+                <w:rFonts w:ascii="Arial" w:cs="Arial" w:eastAsia="Arial" w:hAnsi="Arial"/>
+                <w:color w:val="15202B"/>
+                <w:sz w:val="18"/>
+                <w:szCs w:val="18"/>
+              </w:rPr>
+              <w:t xml:space="preserve"/>
+            </w:r>
+          </w:p>
+        </w:tc>
+      </w:tr>
+      <w:tr>
+        <w:trPr>
+          <w:cantSplit/>
+        </w:trPr>
+        <w:tc>
+          <w:tcPr>
+            <w:tcW w:type="dxa" w:w="640"/>
+            <w:tcBorders>
+              <w:top w:val="single" w:color="B9D7F2" w:sz="4"/>
+              <w:left w:val="single" w:color="B9D7F2" w:sz="4"/>
+              <w:bottom w:val="single" w:color="B9D7F2" w:sz="4"/>
+              <w:right w:val="single" w:color="B9D7F2" w:sz="4"/>
+            </w:tcBorders>
+            <w:shd w:fill="EAF4FD" w:color="auto" w:val="clear"/>
+            <w:tcMar>
+              <w:top w:type="dxa" w:w="60"/>
+              <w:left w:type="dxa" w:w="90"/>
+              <w:bottom w:type="dxa" w:w="60"/>
+              <w:right w:type="dxa" w:w="90"/>
+            </w:tcMar>
+          </w:tcPr>
+          <w:p>
+            <w:pPr>
+              <w:spacing w:after="0" w:before="0"/>
+            </w:pPr>
+            <w:r>
+              <w:rPr>
+                <w:rFonts w:ascii="Arial" w:cs="Arial" w:eastAsia="Arial" w:hAnsi="Arial"/>
+                <w:color w:val="15202B"/>
+                <w:sz w:val="18"/>
+                <w:szCs w:val="18"/>
+              </w:rPr>
+              <w:t xml:space="preserve">33.2</w:t>
+            </w:r>
+          </w:p>
+        </w:tc>
+        <w:tc>
+          <w:tcPr>
+            <w:tcW w:type="dxa" w:w="3820"/>
+            <w:tcBorders>
+              <w:top w:val="single" w:color="B9D7F2" w:sz="4"/>
+              <w:left w:val="single" w:color="B9D7F2" w:sz="4"/>
+              <w:bottom w:val="single" w:color="B9D7F2" w:sz="4"/>
+              <w:right w:val="single" w:color="B9D7F2" w:sz="4"/>
+            </w:tcBorders>
+            <w:shd w:fill="EAF4FD" w:color="auto" w:val="clear"/>
+            <w:tcMar>
+              <w:top w:type="dxa" w:w="60"/>
+              <w:left w:type="dxa" w:w="90"/>
+              <w:bottom w:type="dxa" w:w="60"/>
+              <w:right w:type="dxa" w:w="90"/>
+            </w:tcMar>
+          </w:tcPr>
+          <w:p>
+            <w:pPr>
+              <w:spacing w:after="0" w:before="0"/>
+            </w:pPr>
+            <w:r>
+              <w:rPr>
+                <w:rFonts w:ascii="Arial" w:cs="Arial" w:eastAsia="Arial" w:hAnsi="Arial"/>
+                <w:color w:val="15202B"/>
+                <w:sz w:val="18"/>
+                <w:szCs w:val="18"/>
+              </w:rPr>
+              <w:t xml:space="preserve">Order Now.</w:t>
+            </w:r>
+          </w:p>
+        </w:tc>
+        <w:tc>
+          <w:tcPr>
+            <w:tcW w:type="dxa" w:w="3900"/>
+            <w:tcBorders>
+              <w:top w:val="single" w:color="B9D7F2" w:sz="4"/>
+              <w:left w:val="single" w:color="B9D7F2" w:sz="4"/>
+              <w:bottom w:val="single" w:color="B9D7F2" w:sz="4"/>
+              <w:right w:val="single" w:color="B9D7F2" w:sz="4"/>
+            </w:tcBorders>
+            <w:shd w:fill="EAF4FD" w:color="auto" w:val="clear"/>
+            <w:tcMar>
+              <w:top w:type="dxa" w:w="60"/>
+              <w:left w:type="dxa" w:w="90"/>
+              <w:bottom w:type="dxa" w:w="60"/>
+              <w:right w:type="dxa" w:w="90"/>
+            </w:tcMar>
+          </w:tcPr>
+          <w:p>
+            <w:pPr>
+              <w:spacing w:after="0" w:before="0"/>
+            </w:pPr>
+            <w:r>
+              <w:rPr>
+                <w:rFonts w:ascii="Arial" w:cs="Arial" w:eastAsia="Arial" w:hAnsi="Arial"/>
+                <w:color w:val="15202B"/>
+                <w:sz w:val="18"/>
+                <w:szCs w:val="18"/>
+              </w:rPr>
+              <w:t xml:space="preserve">Order Form has a Name field at the top; phone is empty; no saved addresses.</w:t>
+            </w:r>
+          </w:p>
+        </w:tc>
+        <w:tc>
+          <w:tcPr>
+            <w:tcW w:type="dxa" w:w="900"/>
+            <w:tcBorders>
+              <w:top w:val="single" w:color="B9D7F2" w:sz="4"/>
+              <w:left w:val="single" w:color="B9D7F2" w:sz="4"/>
+              <w:bottom w:val="single" w:color="B9D7F2" w:sz="4"/>
+              <w:right w:val="single" w:color="B9D7F2" w:sz="4"/>
+            </w:tcBorders>
+            <w:shd w:fill="EAF4FD" w:color="auto" w:val="clear"/>
+            <w:tcMar>
+              <w:top w:type="dxa" w:w="60"/>
+              <w:left w:type="dxa" w:w="90"/>
+              <w:bottom w:type="dxa" w:w="60"/>
+              <w:right w:type="dxa" w:w="90"/>
+            </w:tcMar>
+          </w:tcPr>
+          <w:p>
+            <w:pPr>
+              <w:spacing w:after="0" w:before="0"/>
+            </w:pPr>
+            <w:r>
+              <w:rPr>
+                <w:rFonts w:ascii="Arial" w:cs="Arial" w:eastAsia="Arial" w:hAnsi="Arial"/>
+                <w:color w:val="15202B"/>
+                <w:sz w:val="18"/>
+                <w:szCs w:val="18"/>
+              </w:rPr>
+              <w:t xml:space="preserve">☐ Pass</w:t>
+            </w:r>
+          </w:p>
+          <w:p>
+            <w:pPr>
+              <w:spacing w:after="0" w:before="0"/>
+            </w:pPr>
+            <w:r>
+              <w:rPr>
+                <w:rFonts w:ascii="Arial" w:cs="Arial" w:eastAsia="Arial" w:hAnsi="Arial"/>
+                <w:color w:val="15202B"/>
+                <w:sz w:val="18"/>
+                <w:szCs w:val="18"/>
+              </w:rPr>
+              <w:t xml:space="preserve">☐ Fail</w:t>
+            </w:r>
+          </w:p>
+        </w:tc>
+        <w:tc>
+          <w:tcPr>
+            <w:tcW w:type="dxa" w:w="1206"/>
+            <w:tcBorders>
+              <w:top w:val="single" w:color="B9D7F2" w:sz="4"/>
+              <w:left w:val="single" w:color="B9D7F2" w:sz="4"/>
+              <w:bottom w:val="single" w:color="B9D7F2" w:sz="4"/>
+              <w:right w:val="single" w:color="B9D7F2" w:sz="4"/>
+            </w:tcBorders>
+            <w:shd w:fill="EAF4FD" w:color="auto" w:val="clear"/>
+            <w:tcMar>
+              <w:top w:type="dxa" w:w="60"/>
+              <w:left w:type="dxa" w:w="90"/>
+              <w:bottom w:type="dxa" w:w="60"/>
+              <w:right w:type="dxa" w:w="90"/>
+            </w:tcMar>
+          </w:tcPr>
+          <w:p>
+            <w:pPr>
+              <w:spacing w:after="0" w:before="0"/>
+            </w:pPr>
+            <w:r>
+              <w:rPr>
+                <w:rFonts w:ascii="Arial" w:cs="Arial" w:eastAsia="Arial" w:hAnsi="Arial"/>
+                <w:color w:val="15202B"/>
+                <w:sz w:val="18"/>
+                <w:szCs w:val="18"/>
+              </w:rPr>
+              <w:t xml:space="preserve"/>
+            </w:r>
+          </w:p>
+        </w:tc>
+      </w:tr>
+      <w:tr>
+        <w:trPr>
+          <w:cantSplit/>
+        </w:trPr>
+        <w:tc>
+          <w:tcPr>
+            <w:tcW w:type="dxa" w:w="640"/>
+            <w:tcBorders>
+              <w:top w:val="single" w:color="B9D7F2" w:sz="4"/>
+              <w:left w:val="single" w:color="B9D7F2" w:sz="4"/>
+              <w:bottom w:val="single" w:color="B9D7F2" w:sz="4"/>
+              <w:right w:val="single" w:color="B9D7F2" w:sz="4"/>
+            </w:tcBorders>
+            <w:tcMar>
+              <w:top w:type="dxa" w:w="60"/>
+              <w:left w:type="dxa" w:w="90"/>
+              <w:bottom w:type="dxa" w:w="60"/>
+              <w:right w:type="dxa" w:w="90"/>
+            </w:tcMar>
+          </w:tcPr>
+          <w:p>
+            <w:pPr>
+              <w:spacing w:after="0" w:before="0"/>
+            </w:pPr>
+            <w:r>
+              <w:rPr>
+                <w:rFonts w:ascii="Arial" w:cs="Arial" w:eastAsia="Arial" w:hAnsi="Arial"/>
+                <w:color w:val="15202B"/>
+                <w:sz w:val="18"/>
+                <w:szCs w:val="18"/>
+              </w:rPr>
+              <w:t xml:space="preserve">33.3</w:t>
+            </w:r>
+          </w:p>
+        </w:tc>
+        <w:tc>
+          <w:tcPr>
+            <w:tcW w:type="dxa" w:w="3820"/>
+            <w:tcBorders>
+              <w:top w:val="single" w:color="B9D7F2" w:sz="4"/>
+              <w:left w:val="single" w:color="B9D7F2" w:sz="4"/>
+              <w:bottom w:val="single" w:color="B9D7F2" w:sz="4"/>
+              <w:right w:val="single" w:color="B9D7F2" w:sz="4"/>
+            </w:tcBorders>
+            <w:tcMar>
+              <w:top w:type="dxa" w:w="60"/>
+              <w:left w:type="dxa" w:w="90"/>
+              <w:bottom w:type="dxa" w:w="60"/>
+              <w:right w:type="dxa" w:w="90"/>
+            </w:tcMar>
+          </w:tcPr>
+          <w:p>
+            <w:pPr>
+              <w:spacing w:after="0" w:before="0"/>
+            </w:pPr>
+            <w:r>
+              <w:rPr>
+                <w:rFonts w:ascii="Arial" w:cs="Arial" w:eastAsia="Arial" w:hAnsi="Arial"/>
+                <w:color w:val="15202B"/>
+                <w:sz w:val="18"/>
+                <w:szCs w:val="18"/>
+              </w:rPr>
+              <w:t xml:space="preserve">Place order without a name.</w:t>
+            </w:r>
+          </w:p>
+        </w:tc>
+        <w:tc>
+          <w:tcPr>
+            <w:tcW w:type="dxa" w:w="3900"/>
+            <w:tcBorders>
+              <w:top w:val="single" w:color="B9D7F2" w:sz="4"/>
+              <w:left w:val="single" w:color="B9D7F2" w:sz="4"/>
+              <w:bottom w:val="single" w:color="B9D7F2" w:sz="4"/>
+              <w:right w:val="single" w:color="B9D7F2" w:sz="4"/>
+            </w:tcBorders>
+            <w:tcMar>
+              <w:top w:type="dxa" w:w="60"/>
+              <w:left w:type="dxa" w:w="90"/>
+              <w:bottom w:type="dxa" w:w="60"/>
+              <w:right w:type="dxa" w:w="90"/>
+            </w:tcMar>
+          </w:tcPr>
+          <w:p>
+            <w:pPr>
+              <w:spacing w:after="0" w:before="0"/>
+            </w:pPr>
+            <w:r>
+              <w:rPr>
+                <w:rFonts w:ascii="Arial" w:cs="Arial" w:eastAsia="Arial" w:hAnsi="Arial"/>
+                <w:color w:val="15202B"/>
+                <w:sz w:val="18"/>
+                <w:szCs w:val="18"/>
+              </w:rPr>
+              <w:t xml:space="preserve">Message box "Name missing".</w:t>
+            </w:r>
+          </w:p>
+        </w:tc>
+        <w:tc>
+          <w:tcPr>
+            <w:tcW w:type="dxa" w:w="900"/>
+            <w:tcBorders>
+              <w:top w:val="single" w:color="B9D7F2" w:sz="4"/>
+              <w:left w:val="single" w:color="B9D7F2" w:sz="4"/>
+              <w:bottom w:val="single" w:color="B9D7F2" w:sz="4"/>
+              <w:right w:val="single" w:color="B9D7F2" w:sz="4"/>
+            </w:tcBorders>
+            <w:tcMar>
+              <w:top w:type="dxa" w:w="60"/>
+              <w:left w:type="dxa" w:w="90"/>
+              <w:bottom w:type="dxa" w:w="60"/>
+              <w:right w:type="dxa" w:w="90"/>
+            </w:tcMar>
+          </w:tcPr>
+          <w:p>
+            <w:pPr>
+              <w:spacing w:after="0" w:before="0"/>
+            </w:pPr>
+            <w:r>
+              <w:rPr>
+                <w:rFonts w:ascii="Arial" w:cs="Arial" w:eastAsia="Arial" w:hAnsi="Arial"/>
+                <w:color w:val="15202B"/>
+                <w:sz w:val="18"/>
+                <w:szCs w:val="18"/>
+              </w:rPr>
+              <w:t xml:space="preserve">☐ Pass</w:t>
+            </w:r>
+          </w:p>
+          <w:p>
+            <w:pPr>
+              <w:spacing w:after="0" w:before="0"/>
+            </w:pPr>
+            <w:r>
+              <w:rPr>
+                <w:rFonts w:ascii="Arial" w:cs="Arial" w:eastAsia="Arial" w:hAnsi="Arial"/>
+                <w:color w:val="15202B"/>
+                <w:sz w:val="18"/>
+                <w:szCs w:val="18"/>
+              </w:rPr>
+              <w:t xml:space="preserve">☐ Fail</w:t>
+            </w:r>
+          </w:p>
+        </w:tc>
+        <w:tc>
+          <w:tcPr>
+            <w:tcW w:type="dxa" w:w="1206"/>
+            <w:tcBorders>
+              <w:top w:val="single" w:color="B9D7F2" w:sz="4"/>
+              <w:left w:val="single" w:color="B9D7F2" w:sz="4"/>
+              <w:bottom w:val="single" w:color="B9D7F2" w:sz="4"/>
+              <w:right w:val="single" w:color="B9D7F2" w:sz="4"/>
+            </w:tcBorders>
+            <w:tcMar>
+              <w:top w:type="dxa" w:w="60"/>
+              <w:left w:type="dxa" w:w="90"/>
+              <w:bottom w:type="dxa" w:w="60"/>
+              <w:right w:type="dxa" w:w="90"/>
+            </w:tcMar>
+          </w:tcPr>
+          <w:p>
+            <w:pPr>
+              <w:spacing w:after="0" w:before="0"/>
+            </w:pPr>
+            <w:r>
+              <w:rPr>
+                <w:rFonts w:ascii="Arial" w:cs="Arial" w:eastAsia="Arial" w:hAnsi="Arial"/>
+                <w:color w:val="15202B"/>
+                <w:sz w:val="18"/>
+                <w:szCs w:val="18"/>
+              </w:rPr>
+              <w:t xml:space="preserve"/>
+            </w:r>
+          </w:p>
+        </w:tc>
+      </w:tr>
+      <w:tr>
+        <w:trPr>
+          <w:cantSplit/>
+        </w:trPr>
+        <w:tc>
+          <w:tcPr>
+            <w:tcW w:type="dxa" w:w="640"/>
+            <w:tcBorders>
+              <w:top w:val="single" w:color="B9D7F2" w:sz="4"/>
+              <w:left w:val="single" w:color="B9D7F2" w:sz="4"/>
+              <w:bottom w:val="single" w:color="B9D7F2" w:sz="4"/>
+              <w:right w:val="single" w:color="B9D7F2" w:sz="4"/>
+            </w:tcBorders>
+            <w:shd w:fill="EAF4FD" w:color="auto" w:val="clear"/>
+            <w:tcMar>
+              <w:top w:type="dxa" w:w="60"/>
+              <w:left w:type="dxa" w:w="90"/>
+              <w:bottom w:type="dxa" w:w="60"/>
+              <w:right w:type="dxa" w:w="90"/>
+            </w:tcMar>
+          </w:tcPr>
+          <w:p>
+            <w:pPr>
+              <w:spacing w:after="0" w:before="0"/>
+            </w:pPr>
+            <w:r>
+              <w:rPr>
+                <w:rFonts w:ascii="Arial" w:cs="Arial" w:eastAsia="Arial" w:hAnsi="Arial"/>
+                <w:color w:val="15202B"/>
+                <w:sz w:val="18"/>
+                <w:szCs w:val="18"/>
+              </w:rPr>
+              <w:t xml:space="preserve">33.4</w:t>
+            </w:r>
+          </w:p>
+        </w:tc>
+        <w:tc>
+          <w:tcPr>
+            <w:tcW w:type="dxa" w:w="3820"/>
+            <w:tcBorders>
+              <w:top w:val="single" w:color="B9D7F2" w:sz="4"/>
+              <w:left w:val="single" w:color="B9D7F2" w:sz="4"/>
+              <w:bottom w:val="single" w:color="B9D7F2" w:sz="4"/>
+              <w:right w:val="single" w:color="B9D7F2" w:sz="4"/>
+            </w:tcBorders>
+            <w:shd w:fill="EAF4FD" w:color="auto" w:val="clear"/>
+            <w:tcMar>
+              <w:top w:type="dxa" w:w="60"/>
+              <w:left w:type="dxa" w:w="90"/>
+              <w:bottom w:type="dxa" w:w="60"/>
+              <w:right w:type="dxa" w:w="90"/>
+            </w:tcMar>
+          </w:tcPr>
+          <w:p>
+            <w:pPr>
+              <w:spacing w:after="0" w:before="0"/>
+            </w:pPr>
+            <w:r>
+              <w:rPr>
+                <w:rFonts w:ascii="Arial" w:cs="Arial" w:eastAsia="Arial" w:hAnsi="Arial"/>
+                <w:color w:val="15202B"/>
+                <w:sz w:val="18"/>
+                <w:szCs w:val="18"/>
+              </w:rPr>
+              <w:t xml:space="preserve">Fill Name Lito, phone 0918 555 1212, type an address, place the order.</w:t>
+            </w:r>
+          </w:p>
+        </w:tc>
+        <w:tc>
+          <w:tcPr>
+            <w:tcW w:type="dxa" w:w="3900"/>
+            <w:tcBorders>
+              <w:top w:val="single" w:color="B9D7F2" w:sz="4"/>
+              <w:left w:val="single" w:color="B9D7F2" w:sz="4"/>
+              <w:bottom w:val="single" w:color="B9D7F2" w:sz="4"/>
+              <w:right w:val="single" w:color="B9D7F2" w:sz="4"/>
+            </w:tcBorders>
+            <w:shd w:fill="EAF4FD" w:color="auto" w:val="clear"/>
+            <w:tcMar>
+              <w:top w:type="dxa" w:w="60"/>
+              <w:left w:type="dxa" w:w="90"/>
+              <w:bottom w:type="dxa" w:w="60"/>
+              <w:right w:type="dxa" w:w="90"/>
+            </w:tcMar>
+          </w:tcPr>
+          <w:p>
+            <w:pPr>
+              <w:spacing w:after="0" w:before="0"/>
+            </w:pPr>
+            <w:r>
+              <w:rPr>
+                <w:rFonts w:ascii="Arial" w:cs="Arial" w:eastAsia="Arial" w:hAnsi="Arial"/>
+                <w:color w:val="15202B"/>
+                <w:sz w:val="18"/>
+                <w:szCs w:val="18"/>
+              </w:rPr>
+              <w:t xml:space="preserve">Thank-you message; the order shows on Home and in My Orders with the note "This phone only; lost if the app is deleted".</w:t>
+            </w:r>
+          </w:p>
+        </w:tc>
+        <w:tc>
+          <w:tcPr>
+            <w:tcW w:type="dxa" w:w="900"/>
+            <w:tcBorders>
+              <w:top w:val="single" w:color="B9D7F2" w:sz="4"/>
+              <w:left w:val="single" w:color="B9D7F2" w:sz="4"/>
+              <w:bottom w:val="single" w:color="B9D7F2" w:sz="4"/>
+              <w:right w:val="single" w:color="B9D7F2" w:sz="4"/>
+            </w:tcBorders>
+            <w:shd w:fill="EAF4FD" w:color="auto" w:val="clear"/>
+            <w:tcMar>
+              <w:top w:type="dxa" w:w="60"/>
+              <w:left w:type="dxa" w:w="90"/>
+              <w:bottom w:type="dxa" w:w="60"/>
+              <w:right w:type="dxa" w:w="90"/>
+            </w:tcMar>
+          </w:tcPr>
+          <w:p>
+            <w:pPr>
+              <w:spacing w:after="0" w:before="0"/>
+            </w:pPr>
+            <w:r>
+              <w:rPr>
+                <w:rFonts w:ascii="Arial" w:cs="Arial" w:eastAsia="Arial" w:hAnsi="Arial"/>
+                <w:color w:val="15202B"/>
+                <w:sz w:val="18"/>
+                <w:szCs w:val="18"/>
+              </w:rPr>
+              <w:t xml:space="preserve">☐ Pass</w:t>
+            </w:r>
+          </w:p>
+          <w:p>
+            <w:pPr>
+              <w:spacing w:after="0" w:before="0"/>
+            </w:pPr>
+            <w:r>
+              <w:rPr>
+                <w:rFonts w:ascii="Arial" w:cs="Arial" w:eastAsia="Arial" w:hAnsi="Arial"/>
+                <w:color w:val="15202B"/>
+                <w:sz w:val="18"/>
+                <w:szCs w:val="18"/>
+              </w:rPr>
+              <w:t xml:space="preserve">☐ Fail</w:t>
+            </w:r>
+          </w:p>
+        </w:tc>
+        <w:tc>
+          <w:tcPr>
+            <w:tcW w:type="dxa" w:w="1206"/>
+            <w:tcBorders>
+              <w:top w:val="single" w:color="B9D7F2" w:sz="4"/>
+              <w:left w:val="single" w:color="B9D7F2" w:sz="4"/>
+              <w:bottom w:val="single" w:color="B9D7F2" w:sz="4"/>
+              <w:right w:val="single" w:color="B9D7F2" w:sz="4"/>
+            </w:tcBorders>
+            <w:shd w:fill="EAF4FD" w:color="auto" w:val="clear"/>
+            <w:tcMar>
+              <w:top w:type="dxa" w:w="60"/>
+              <w:left w:type="dxa" w:w="90"/>
+              <w:bottom w:type="dxa" w:w="60"/>
+              <w:right w:type="dxa" w:w="90"/>
+            </w:tcMar>
+          </w:tcPr>
+          <w:p>
+            <w:pPr>
+              <w:spacing w:after="0" w:before="0"/>
+            </w:pPr>
+            <w:r>
+              <w:rPr>
+                <w:rFonts w:ascii="Arial" w:cs="Arial" w:eastAsia="Arial" w:hAnsi="Arial"/>
+                <w:color w:val="15202B"/>
+                <w:sz w:val="18"/>
+                <w:szCs w:val="18"/>
+              </w:rPr>
+              <w:t xml:space="preserve"/>
+            </w:r>
+          </w:p>
+        </w:tc>
+      </w:tr>
+      <w:tr>
+        <w:trPr>
+          <w:cantSplit/>
+        </w:trPr>
+        <w:tc>
+          <w:tcPr>
+            <w:tcW w:type="dxa" w:w="640"/>
+            <w:tcBorders>
+              <w:top w:val="single" w:color="B9D7F2" w:sz="4"/>
+              <w:left w:val="single" w:color="B9D7F2" w:sz="4"/>
+              <w:bottom w:val="single" w:color="B9D7F2" w:sz="4"/>
+              <w:right w:val="single" w:color="B9D7F2" w:sz="4"/>
+            </w:tcBorders>
+            <w:tcMar>
+              <w:top w:type="dxa" w:w="60"/>
+              <w:left w:type="dxa" w:w="90"/>
+              <w:bottom w:type="dxa" w:w="60"/>
+              <w:right w:type="dxa" w:w="90"/>
+            </w:tcMar>
+          </w:tcPr>
+          <w:p>
+            <w:pPr>
+              <w:spacing w:after="0" w:before="0"/>
+            </w:pPr>
+            <w:r>
+              <w:rPr>
+                <w:rFonts w:ascii="Arial" w:cs="Arial" w:eastAsia="Arial" w:hAnsi="Arial"/>
+                <w:color w:val="15202B"/>
+                <w:sz w:val="18"/>
+                <w:szCs w:val="18"/>
+              </w:rPr>
+              <w:t xml:space="preserve">33.5</w:t>
+            </w:r>
+          </w:p>
+        </w:tc>
+        <w:tc>
+          <w:tcPr>
+            <w:tcW w:type="dxa" w:w="3820"/>
+            <w:tcBorders>
+              <w:top w:val="single" w:color="B9D7F2" w:sz="4"/>
+              <w:left w:val="single" w:color="B9D7F2" w:sz="4"/>
+              <w:bottom w:val="single" w:color="B9D7F2" w:sz="4"/>
+              <w:right w:val="single" w:color="B9D7F2" w:sz="4"/>
+            </w:tcBorders>
+            <w:tcMar>
+              <w:top w:type="dxa" w:w="60"/>
+              <w:left w:type="dxa" w:w="90"/>
+              <w:bottom w:type="dxa" w:w="60"/>
+              <w:right w:type="dxa" w:w="90"/>
+            </w:tcMar>
+          </w:tcPr>
+          <w:p>
+            <w:pPr>
+              <w:spacing w:after="0" w:before="0"/>
+            </w:pPr>
+            <w:r>
+              <w:rPr>
+                <w:rFonts w:ascii="Arial" w:cs="Arial" w:eastAsia="Arial" w:hAnsi="Arial"/>
+                <w:color w:val="15202B"/>
+                <w:sz w:val="18"/>
+                <w:szCs w:val="18"/>
+              </w:rPr>
+              <w:t xml:space="preserve">Owner accepts it.</w:t>
+            </w:r>
+          </w:p>
+        </w:tc>
+        <w:tc>
+          <w:tcPr>
+            <w:tcW w:type="dxa" w:w="3900"/>
+            <w:tcBorders>
+              <w:top w:val="single" w:color="B9D7F2" w:sz="4"/>
+              <w:left w:val="single" w:color="B9D7F2" w:sz="4"/>
+              <w:bottom w:val="single" w:color="B9D7F2" w:sz="4"/>
+              <w:right w:val="single" w:color="B9D7F2" w:sz="4"/>
+            </w:tcBorders>
+            <w:tcMar>
+              <w:top w:type="dxa" w:w="60"/>
+              <w:left w:type="dxa" w:w="90"/>
+              <w:bottom w:type="dxa" w:w="60"/>
+              <w:right w:type="dxa" w:w="90"/>
+            </w:tcMar>
+          </w:tcPr>
+          <w:p>
+            <w:pPr>
+              <w:spacing w:after="0" w:before="0"/>
+            </w:pPr>
+            <w:r>
+              <w:rPr>
+                <w:rFonts w:ascii="Arial" w:cs="Arial" w:eastAsia="Arial" w:hAnsi="Arial"/>
+                <w:color w:val="15202B"/>
+                <w:sz w:val="18"/>
+                <w:szCs w:val="18"/>
+              </w:rPr>
+              <w:t xml:space="preserve">The guest sees Processing like a normal customer.</w:t>
+            </w:r>
+          </w:p>
+        </w:tc>
+        <w:tc>
+          <w:tcPr>
+            <w:tcW w:type="dxa" w:w="900"/>
+            <w:tcBorders>
+              <w:top w:val="single" w:color="B9D7F2" w:sz="4"/>
+              <w:left w:val="single" w:color="B9D7F2" w:sz="4"/>
+              <w:bottom w:val="single" w:color="B9D7F2" w:sz="4"/>
+              <w:right w:val="single" w:color="B9D7F2" w:sz="4"/>
+            </w:tcBorders>
+            <w:tcMar>
+              <w:top w:type="dxa" w:w="60"/>
+              <w:left w:type="dxa" w:w="90"/>
+              <w:bottom w:type="dxa" w:w="60"/>
+              <w:right w:type="dxa" w:w="90"/>
+            </w:tcMar>
+          </w:tcPr>
+          <w:p>
+            <w:pPr>
+              <w:spacing w:after="0" w:before="0"/>
+            </w:pPr>
+            <w:r>
+              <w:rPr>
+                <w:rFonts w:ascii="Arial" w:cs="Arial" w:eastAsia="Arial" w:hAnsi="Arial"/>
+                <w:color w:val="15202B"/>
+                <w:sz w:val="18"/>
+                <w:szCs w:val="18"/>
+              </w:rPr>
+              <w:t xml:space="preserve">☐ Pass</w:t>
+            </w:r>
+          </w:p>
+          <w:p>
+            <w:pPr>
+              <w:spacing w:after="0" w:before="0"/>
+            </w:pPr>
+            <w:r>
+              <w:rPr>
+                <w:rFonts w:ascii="Arial" w:cs="Arial" w:eastAsia="Arial" w:hAnsi="Arial"/>
+                <w:color w:val="15202B"/>
+                <w:sz w:val="18"/>
+                <w:szCs w:val="18"/>
+              </w:rPr>
+              <w:t xml:space="preserve">☐ Fail</w:t>
+            </w:r>
+          </w:p>
+        </w:tc>
+        <w:tc>
+          <w:tcPr>
+            <w:tcW w:type="dxa" w:w="1206"/>
+            <w:tcBorders>
+              <w:top w:val="single" w:color="B9D7F2" w:sz="4"/>
+              <w:left w:val="single" w:color="B9D7F2" w:sz="4"/>
+              <w:bottom w:val="single" w:color="B9D7F2" w:sz="4"/>
+              <w:right w:val="single" w:color="B9D7F2" w:sz="4"/>
+            </w:tcBorders>
+            <w:tcMar>
+              <w:top w:type="dxa" w:w="60"/>
+              <w:left w:type="dxa" w:w="90"/>
+              <w:bottom w:type="dxa" w:w="60"/>
+              <w:right w:type="dxa" w:w="90"/>
+            </w:tcMar>
+          </w:tcPr>
+          <w:p>
+            <w:pPr>
+              <w:spacing w:after="0" w:before="0"/>
+            </w:pPr>
+            <w:r>
+              <w:rPr>
+                <w:rFonts w:ascii="Arial" w:cs="Arial" w:eastAsia="Arial" w:hAnsi="Arial"/>
+                <w:color w:val="15202B"/>
+                <w:sz w:val="18"/>
+                <w:szCs w:val="18"/>
+              </w:rPr>
+              <w:t xml:space="preserve"/>
+            </w:r>
+          </w:p>
+        </w:tc>
+      </w:tr>
+      <w:tr>
+        <w:trPr>
+          <w:cantSplit/>
+        </w:trPr>
+        <w:tc>
+          <w:tcPr>
+            <w:tcW w:type="dxa" w:w="640"/>
+            <w:tcBorders>
+              <w:top w:val="single" w:color="B9D7F2" w:sz="4"/>
+              <w:left w:val="single" w:color="B9D7F2" w:sz="4"/>
+              <w:bottom w:val="single" w:color="B9D7F2" w:sz="4"/>
+              <w:right w:val="single" w:color="B9D7F2" w:sz="4"/>
+            </w:tcBorders>
+            <w:shd w:fill="EAF4FD" w:color="auto" w:val="clear"/>
+            <w:tcMar>
+              <w:top w:type="dxa" w:w="60"/>
+              <w:left w:type="dxa" w:w="90"/>
+              <w:bottom w:type="dxa" w:w="60"/>
+              <w:right w:type="dxa" w:w="90"/>
+            </w:tcMar>
+          </w:tcPr>
+          <w:p>
+            <w:pPr>
+              <w:spacing w:after="0" w:before="0"/>
+            </w:pPr>
+            <w:r>
+              <w:rPr>
+                <w:rFonts w:ascii="Arial" w:cs="Arial" w:eastAsia="Arial" w:hAnsi="Arial"/>
+                <w:color w:val="15202B"/>
+                <w:sz w:val="18"/>
+                <w:szCs w:val="18"/>
+              </w:rPr>
+              <w:t xml:space="preserve">33.6</w:t>
+            </w:r>
+          </w:p>
+        </w:tc>
+        <w:tc>
+          <w:tcPr>
+            <w:tcW w:type="dxa" w:w="3820"/>
+            <w:tcBorders>
+              <w:top w:val="single" w:color="B9D7F2" w:sz="4"/>
+              <w:left w:val="single" w:color="B9D7F2" w:sz="4"/>
+              <w:bottom w:val="single" w:color="B9D7F2" w:sz="4"/>
+              <w:right w:val="single" w:color="B9D7F2" w:sz="4"/>
+            </w:tcBorders>
+            <w:shd w:fill="EAF4FD" w:color="auto" w:val="clear"/>
+            <w:tcMar>
+              <w:top w:type="dxa" w:w="60"/>
+              <w:left w:type="dxa" w:w="90"/>
+              <w:bottom w:type="dxa" w:w="60"/>
+              <w:right w:type="dxa" w:w="90"/>
+            </w:tcMar>
+          </w:tcPr>
+          <w:p>
+            <w:pPr>
+              <w:spacing w:after="0" w:before="0"/>
+            </w:pPr>
+            <w:r>
+              <w:rPr>
+                <w:rFonts w:ascii="Arial" w:cs="Arial" w:eastAsia="Arial" w:hAnsi="Arial"/>
+                <w:color w:val="15202B"/>
+                <w:sz w:val="18"/>
+                <w:szCs w:val="18"/>
+              </w:rPr>
+              <w:t xml:space="preserve">My Account (guest).</w:t>
+            </w:r>
+          </w:p>
+        </w:tc>
+        <w:tc>
+          <w:tcPr>
+            <w:tcW w:type="dxa" w:w="3900"/>
+            <w:tcBorders>
+              <w:top w:val="single" w:color="B9D7F2" w:sz="4"/>
+              <w:left w:val="single" w:color="B9D7F2" w:sz="4"/>
+              <w:bottom w:val="single" w:color="B9D7F2" w:sz="4"/>
+              <w:right w:val="single" w:color="B9D7F2" w:sz="4"/>
+            </w:tcBorders>
+            <w:shd w:fill="EAF4FD" w:color="auto" w:val="clear"/>
+            <w:tcMar>
+              <w:top w:type="dxa" w:w="60"/>
+              <w:left w:type="dxa" w:w="90"/>
+              <w:bottom w:type="dxa" w:w="60"/>
+              <w:right w:type="dxa" w:w="90"/>
+            </w:tcMar>
+          </w:tcPr>
+          <w:p>
+            <w:pPr>
+              <w:spacing w:after="0" w:before="0"/>
+            </w:pPr>
+            <w:r>
+              <w:rPr>
+                <w:rFonts w:ascii="Arial" w:cs="Arial" w:eastAsia="Arial" w:hAnsi="Arial"/>
+                <w:color w:val="15202B"/>
+                <w:sz w:val="18"/>
+                <w:szCs w:val="18"/>
+              </w:rPr>
+              <w:t xml:space="preserve">Only Create account and Exit guest mode.</w:t>
+            </w:r>
+          </w:p>
+        </w:tc>
+        <w:tc>
+          <w:tcPr>
+            <w:tcW w:type="dxa" w:w="900"/>
+            <w:tcBorders>
+              <w:top w:val="single" w:color="B9D7F2" w:sz="4"/>
+              <w:left w:val="single" w:color="B9D7F2" w:sz="4"/>
+              <w:bottom w:val="single" w:color="B9D7F2" w:sz="4"/>
+              <w:right w:val="single" w:color="B9D7F2" w:sz="4"/>
+            </w:tcBorders>
+            <w:shd w:fill="EAF4FD" w:color="auto" w:val="clear"/>
+            <w:tcMar>
+              <w:top w:type="dxa" w:w="60"/>
+              <w:left w:type="dxa" w:w="90"/>
+              <w:bottom w:type="dxa" w:w="60"/>
+              <w:right w:type="dxa" w:w="90"/>
+            </w:tcMar>
+          </w:tcPr>
+          <w:p>
+            <w:pPr>
+              <w:spacing w:after="0" w:before="0"/>
+            </w:pPr>
+            <w:r>
+              <w:rPr>
+                <w:rFonts w:ascii="Arial" w:cs="Arial" w:eastAsia="Arial" w:hAnsi="Arial"/>
+                <w:color w:val="15202B"/>
+                <w:sz w:val="18"/>
+                <w:szCs w:val="18"/>
+              </w:rPr>
+              <w:t xml:space="preserve">☐ Pass</w:t>
+            </w:r>
+          </w:p>
+          <w:p>
+            <w:pPr>
+              <w:spacing w:after="0" w:before="0"/>
+            </w:pPr>
+            <w:r>
+              <w:rPr>
+                <w:rFonts w:ascii="Arial" w:cs="Arial" w:eastAsia="Arial" w:hAnsi="Arial"/>
+                <w:color w:val="15202B"/>
+                <w:sz w:val="18"/>
+                <w:szCs w:val="18"/>
+              </w:rPr>
+              <w:t xml:space="preserve">☐ Fail</w:t>
+            </w:r>
+          </w:p>
+        </w:tc>
+        <w:tc>
+          <w:tcPr>
+            <w:tcW w:type="dxa" w:w="1206"/>
+            <w:tcBorders>
+              <w:top w:val="single" w:color="B9D7F2" w:sz="4"/>
+              <w:left w:val="single" w:color="B9D7F2" w:sz="4"/>
+              <w:bottom w:val="single" w:color="B9D7F2" w:sz="4"/>
+              <w:right w:val="single" w:color="B9D7F2" w:sz="4"/>
+            </w:tcBorders>
+            <w:shd w:fill="EAF4FD" w:color="auto" w:val="clear"/>
+            <w:tcMar>
+              <w:top w:type="dxa" w:w="60"/>
+              <w:left w:type="dxa" w:w="90"/>
+              <w:bottom w:type="dxa" w:w="60"/>
+              <w:right w:type="dxa" w:w="90"/>
+            </w:tcMar>
+          </w:tcPr>
+          <w:p>
+            <w:pPr>
+              <w:spacing w:after="0" w:before="0"/>
+            </w:pPr>
+            <w:r>
+              <w:rPr>
+                <w:rFonts w:ascii="Arial" w:cs="Arial" w:eastAsia="Arial" w:hAnsi="Arial"/>
+                <w:color w:val="15202B"/>
+                <w:sz w:val="18"/>
+                <w:szCs w:val="18"/>
+              </w:rPr>
+              <w:t xml:space="preserve"/>
+            </w:r>
+          </w:p>
+        </w:tc>
+      </w:tr>
+      <w:tr>
+        <w:trPr>
+          <w:cantSplit/>
+        </w:trPr>
+        <w:tc>
+          <w:tcPr>
+            <w:tcW w:type="dxa" w:w="640"/>
+            <w:tcBorders>
+              <w:top w:val="single" w:color="B9D7F2" w:sz="4"/>
+              <w:left w:val="single" w:color="B9D7F2" w:sz="4"/>
+              <w:bottom w:val="single" w:color="B9D7F2" w:sz="4"/>
+              <w:right w:val="single" w:color="B9D7F2" w:sz="4"/>
+            </w:tcBorders>
+            <w:tcMar>
+              <w:top w:type="dxa" w:w="60"/>
+              <w:left w:type="dxa" w:w="90"/>
+              <w:bottom w:type="dxa" w:w="60"/>
+              <w:right w:type="dxa" w:w="90"/>
+            </w:tcMar>
+          </w:tcPr>
+          <w:p>
+            <w:pPr>
+              <w:spacing w:after="0" w:before="0"/>
+            </w:pPr>
+            <w:r>
+              <w:rPr>
+                <w:rFonts w:ascii="Arial" w:cs="Arial" w:eastAsia="Arial" w:hAnsi="Arial"/>
+                <w:color w:val="15202B"/>
+                <w:sz w:val="18"/>
+                <w:szCs w:val="18"/>
+              </w:rPr>
+              <w:t xml:space="preserve">33.7</w:t>
+            </w:r>
+          </w:p>
+        </w:tc>
+        <w:tc>
+          <w:tcPr>
+            <w:tcW w:type="dxa" w:w="3820"/>
+            <w:tcBorders>
+              <w:top w:val="single" w:color="B9D7F2" w:sz="4"/>
+              <w:left w:val="single" w:color="B9D7F2" w:sz="4"/>
+              <w:bottom w:val="single" w:color="B9D7F2" w:sz="4"/>
+              <w:right w:val="single" w:color="B9D7F2" w:sz="4"/>
+            </w:tcBorders>
+            <w:tcMar>
+              <w:top w:type="dxa" w:w="60"/>
+              <w:left w:type="dxa" w:w="90"/>
+              <w:bottom w:type="dxa" w:w="60"/>
+              <w:right w:type="dxa" w:w="90"/>
+            </w:tcMar>
+          </w:tcPr>
+          <w:p>
+            <w:pPr>
+              <w:spacing w:after="0" w:before="0"/>
+            </w:pPr>
+            <w:r>
+              <w:rPr>
+                <w:rFonts w:ascii="Arial" w:cs="Arial" w:eastAsia="Arial" w:hAnsi="Arial"/>
+                <w:color w:val="15202B"/>
+                <w:sz w:val="18"/>
+                <w:szCs w:val="18"/>
+              </w:rPr>
+              <w:t xml:space="preserve">Create account.</w:t>
+            </w:r>
+          </w:p>
+        </w:tc>
+        <w:tc>
+          <w:tcPr>
+            <w:tcW w:type="dxa" w:w="3900"/>
+            <w:tcBorders>
+              <w:top w:val="single" w:color="B9D7F2" w:sz="4"/>
+              <w:left w:val="single" w:color="B9D7F2" w:sz="4"/>
+              <w:bottom w:val="single" w:color="B9D7F2" w:sz="4"/>
+              <w:right w:val="single" w:color="B9D7F2" w:sz="4"/>
+            </w:tcBorders>
+            <w:tcMar>
+              <w:top w:type="dxa" w:w="60"/>
+              <w:left w:type="dxa" w:w="90"/>
+              <w:bottom w:type="dxa" w:w="60"/>
+              <w:right w:type="dxa" w:w="90"/>
+            </w:tcMar>
+          </w:tcPr>
+          <w:p>
+            <w:pPr>
+              <w:spacing w:after="0" w:before="0"/>
+            </w:pPr>
+            <w:r>
+              <w:rPr>
+                <w:rFonts w:ascii="Arial" w:cs="Arial" w:eastAsia="Arial" w:hAnsi="Arial"/>
+                <w:color w:val="15202B"/>
+                <w:sz w:val="18"/>
+                <w:szCs w:val="18"/>
+              </w:rPr>
+              <w:t xml:space="preserve">Sign up form with Name and Phone already filled from the guest order; add email, password, tick the box, Create account.</w:t>
+            </w:r>
+          </w:p>
+        </w:tc>
+        <w:tc>
+          <w:tcPr>
+            <w:tcW w:type="dxa" w:w="900"/>
+            <w:tcBorders>
+              <w:top w:val="single" w:color="B9D7F2" w:sz="4"/>
+              <w:left w:val="single" w:color="B9D7F2" w:sz="4"/>
+              <w:bottom w:val="single" w:color="B9D7F2" w:sz="4"/>
+              <w:right w:val="single" w:color="B9D7F2" w:sz="4"/>
+            </w:tcBorders>
+            <w:tcMar>
+              <w:top w:type="dxa" w:w="60"/>
+              <w:left w:type="dxa" w:w="90"/>
+              <w:bottom w:type="dxa" w:w="60"/>
+              <w:right w:type="dxa" w:w="90"/>
+            </w:tcMar>
+          </w:tcPr>
+          <w:p>
+            <w:pPr>
+              <w:spacing w:after="0" w:before="0"/>
+            </w:pPr>
+            <w:r>
+              <w:rPr>
+                <w:rFonts w:ascii="Arial" w:cs="Arial" w:eastAsia="Arial" w:hAnsi="Arial"/>
+                <w:color w:val="15202B"/>
+                <w:sz w:val="18"/>
+                <w:szCs w:val="18"/>
+              </w:rPr>
+              <w:t xml:space="preserve">☐ Pass</w:t>
+            </w:r>
+          </w:p>
+          <w:p>
+            <w:pPr>
+              <w:spacing w:after="0" w:before="0"/>
+            </w:pPr>
+            <w:r>
+              <w:rPr>
+                <w:rFonts w:ascii="Arial" w:cs="Arial" w:eastAsia="Arial" w:hAnsi="Arial"/>
+                <w:color w:val="15202B"/>
+                <w:sz w:val="18"/>
+                <w:szCs w:val="18"/>
+              </w:rPr>
+              <w:t xml:space="preserve">☐ Fail</w:t>
+            </w:r>
+          </w:p>
+        </w:tc>
+        <w:tc>
+          <w:tcPr>
+            <w:tcW w:type="dxa" w:w="1206"/>
+            <w:tcBorders>
+              <w:top w:val="single" w:color="B9D7F2" w:sz="4"/>
+              <w:left w:val="single" w:color="B9D7F2" w:sz="4"/>
+              <w:bottom w:val="single" w:color="B9D7F2" w:sz="4"/>
+              <w:right w:val="single" w:color="B9D7F2" w:sz="4"/>
+            </w:tcBorders>
+            <w:tcMar>
+              <w:top w:type="dxa" w:w="60"/>
+              <w:left w:type="dxa" w:w="90"/>
+              <w:bottom w:type="dxa" w:w="60"/>
+              <w:right w:type="dxa" w:w="90"/>
+            </w:tcMar>
+          </w:tcPr>
+          <w:p>
+            <w:pPr>
+              <w:spacing w:after="0" w:before="0"/>
+            </w:pPr>
+            <w:r>
+              <w:rPr>
+                <w:rFonts w:ascii="Arial" w:cs="Arial" w:eastAsia="Arial" w:hAnsi="Arial"/>
+                <w:color w:val="15202B"/>
+                <w:sz w:val="18"/>
+                <w:szCs w:val="18"/>
+              </w:rPr>
+              <w:t xml:space="preserve"/>
+            </w:r>
+          </w:p>
+        </w:tc>
+      </w:tr>
+      <w:tr>
+        <w:trPr>
+          <w:cantSplit/>
+        </w:trPr>
+        <w:tc>
+          <w:tcPr>
+            <w:tcW w:type="dxa" w:w="640"/>
+            <w:tcBorders>
+              <w:top w:val="single" w:color="B9D7F2" w:sz="4"/>
+              <w:left w:val="single" w:color="B9D7F2" w:sz="4"/>
+              <w:bottom w:val="single" w:color="B9D7F2" w:sz="4"/>
+              <w:right w:val="single" w:color="B9D7F2" w:sz="4"/>
+            </w:tcBorders>
+            <w:shd w:fill="EAF4FD" w:color="auto" w:val="clear"/>
+            <w:tcMar>
+              <w:top w:type="dxa" w:w="60"/>
+              <w:left w:type="dxa" w:w="90"/>
+              <w:bottom w:type="dxa" w:w="60"/>
+              <w:right w:type="dxa" w:w="90"/>
+            </w:tcMar>
+          </w:tcPr>
+          <w:p>
+            <w:pPr>
+              <w:spacing w:after="0" w:before="0"/>
+            </w:pPr>
+            <w:r>
+              <w:rPr>
+                <w:rFonts w:ascii="Arial" w:cs="Arial" w:eastAsia="Arial" w:hAnsi="Arial"/>
+                <w:color w:val="15202B"/>
+                <w:sz w:val="18"/>
+                <w:szCs w:val="18"/>
+              </w:rPr>
+              <w:t xml:space="preserve">33.8</w:t>
+            </w:r>
+          </w:p>
+        </w:tc>
+        <w:tc>
+          <w:tcPr>
+            <w:tcW w:type="dxa" w:w="3820"/>
+            <w:tcBorders>
+              <w:top w:val="single" w:color="B9D7F2" w:sz="4"/>
+              <w:left w:val="single" w:color="B9D7F2" w:sz="4"/>
+              <w:bottom w:val="single" w:color="B9D7F2" w:sz="4"/>
+              <w:right w:val="single" w:color="B9D7F2" w:sz="4"/>
+            </w:tcBorders>
+            <w:shd w:fill="EAF4FD" w:color="auto" w:val="clear"/>
+            <w:tcMar>
+              <w:top w:type="dxa" w:w="60"/>
+              <w:left w:type="dxa" w:w="90"/>
+              <w:bottom w:type="dxa" w:w="60"/>
+              <w:right w:type="dxa" w:w="90"/>
+            </w:tcMar>
+          </w:tcPr>
+          <w:p>
+            <w:pPr>
+              <w:spacing w:after="0" w:before="0"/>
+            </w:pPr>
+            <w:r>
+              <w:rPr>
+                <w:rFonts w:ascii="Arial" w:cs="Arial" w:eastAsia="Arial" w:hAnsi="Arial"/>
+                <w:color w:val="15202B"/>
+                <w:sz w:val="18"/>
+                <w:szCs w:val="18"/>
+              </w:rPr>
+              <w:t xml:space="preserve">Continue.</w:t>
+            </w:r>
+          </w:p>
+        </w:tc>
+        <w:tc>
+          <w:tcPr>
+            <w:tcW w:type="dxa" w:w="3900"/>
+            <w:tcBorders>
+              <w:top w:val="single" w:color="B9D7F2" w:sz="4"/>
+              <w:left w:val="single" w:color="B9D7F2" w:sz="4"/>
+              <w:bottom w:val="single" w:color="B9D7F2" w:sz="4"/>
+              <w:right w:val="single" w:color="B9D7F2" w:sz="4"/>
+            </w:tcBorders>
+            <w:shd w:fill="EAF4FD" w:color="auto" w:val="clear"/>
+            <w:tcMar>
+              <w:top w:type="dxa" w:w="60"/>
+              <w:left w:type="dxa" w:w="90"/>
+              <w:bottom w:type="dxa" w:w="60"/>
+              <w:right w:type="dxa" w:w="90"/>
+            </w:tcMar>
+          </w:tcPr>
+          <w:p>
+            <w:pPr>
+              <w:spacing w:after="0" w:before="0"/>
+            </w:pPr>
+            <w:r>
+              <w:rPr>
+                <w:rFonts w:ascii="Arial" w:cs="Arial" w:eastAsia="Arial" w:hAnsi="Arial"/>
+                <w:color w:val="15202B"/>
+                <w:sz w:val="18"/>
+                <w:szCs w:val="18"/>
+              </w:rPr>
+              <w:t xml:space="preserve">"Account created" says "The orders on this phone are now in your account."; My Orders shows the guest order under the new account.</w:t>
+            </w:r>
+          </w:p>
+        </w:tc>
+        <w:tc>
+          <w:tcPr>
+            <w:tcW w:type="dxa" w:w="900"/>
+            <w:tcBorders>
+              <w:top w:val="single" w:color="B9D7F2" w:sz="4"/>
+              <w:left w:val="single" w:color="B9D7F2" w:sz="4"/>
+              <w:bottom w:val="single" w:color="B9D7F2" w:sz="4"/>
+              <w:right w:val="single" w:color="B9D7F2" w:sz="4"/>
+            </w:tcBorders>
+            <w:shd w:fill="EAF4FD" w:color="auto" w:val="clear"/>
+            <w:tcMar>
+              <w:top w:type="dxa" w:w="60"/>
+              <w:left w:type="dxa" w:w="90"/>
+              <w:bottom w:type="dxa" w:w="60"/>
+              <w:right w:type="dxa" w:w="90"/>
+            </w:tcMar>
+          </w:tcPr>
+          <w:p>
+            <w:pPr>
+              <w:spacing w:after="0" w:before="0"/>
+            </w:pPr>
+            <w:r>
+              <w:rPr>
+                <w:rFonts w:ascii="Arial" w:cs="Arial" w:eastAsia="Arial" w:hAnsi="Arial"/>
+                <w:color w:val="15202B"/>
+                <w:sz w:val="18"/>
+                <w:szCs w:val="18"/>
+              </w:rPr>
+              <w:t xml:space="preserve">☐ Pass</w:t>
+            </w:r>
+          </w:p>
+          <w:p>
+            <w:pPr>
+              <w:spacing w:after="0" w:before="0"/>
+            </w:pPr>
+            <w:r>
+              <w:rPr>
+                <w:rFonts w:ascii="Arial" w:cs="Arial" w:eastAsia="Arial" w:hAnsi="Arial"/>
+                <w:color w:val="15202B"/>
+                <w:sz w:val="18"/>
+                <w:szCs w:val="18"/>
+              </w:rPr>
+              <w:t xml:space="preserve">☐ Fail</w:t>
+            </w:r>
+          </w:p>
+        </w:tc>
+        <w:tc>
+          <w:tcPr>
+            <w:tcW w:type="dxa" w:w="1206"/>
+            <w:tcBorders>
+              <w:top w:val="single" w:color="B9D7F2" w:sz="4"/>
+              <w:left w:val="single" w:color="B9D7F2" w:sz="4"/>
+              <w:bottom w:val="single" w:color="B9D7F2" w:sz="4"/>
+              <w:right w:val="single" w:color="B9D7F2" w:sz="4"/>
+            </w:tcBorders>
+            <w:shd w:fill="EAF4FD" w:color="auto" w:val="clear"/>
+            <w:tcMar>
+              <w:top w:type="dxa" w:w="60"/>
+              <w:left w:type="dxa" w:w="90"/>
+              <w:bottom w:type="dxa" w:w="60"/>
+              <w:right w:type="dxa" w:w="90"/>
+            </w:tcMar>
+          </w:tcPr>
+          <w:p>
+            <w:pPr>
+              <w:spacing w:after="0" w:before="0"/>
+            </w:pPr>
+            <w:r>
+              <w:rPr>
+                <w:rFonts w:ascii="Arial" w:cs="Arial" w:eastAsia="Arial" w:hAnsi="Arial"/>
+                <w:color w:val="15202B"/>
+                <w:sz w:val="18"/>
+                <w:szCs w:val="18"/>
+              </w:rPr>
+              <w:t xml:space="preserve"/>
+            </w:r>
+          </w:p>
+        </w:tc>
+      </w:tr>
+      <w:tr>
+        <w:trPr>
+          <w:cantSplit/>
+        </w:trPr>
+        <w:tc>
+          <w:tcPr>
+            <w:tcW w:type="dxa" w:w="640"/>
+            <w:tcBorders>
+              <w:top w:val="single" w:color="B9D7F2" w:sz="4"/>
+              <w:left w:val="single" w:color="B9D7F2" w:sz="4"/>
+              <w:bottom w:val="single" w:color="B9D7F2" w:sz="4"/>
+              <w:right w:val="single" w:color="B9D7F2" w:sz="4"/>
+            </w:tcBorders>
+            <w:tcMar>
+              <w:top w:type="dxa" w:w="60"/>
+              <w:left w:type="dxa" w:w="90"/>
+              <w:bottom w:type="dxa" w:w="60"/>
+              <w:right w:type="dxa" w:w="90"/>
+            </w:tcMar>
+          </w:tcPr>
+          <w:p>
+            <w:pPr>
+              <w:spacing w:after="0" w:before="0"/>
+            </w:pPr>
+            <w:r>
+              <w:rPr>
+                <w:rFonts w:ascii="Arial" w:cs="Arial" w:eastAsia="Arial" w:hAnsi="Arial"/>
+                <w:color w:val="15202B"/>
+                <w:sz w:val="18"/>
+                <w:szCs w:val="18"/>
+              </w:rPr>
+              <w:t xml:space="preserve">33.9</w:t>
+            </w:r>
+          </w:p>
+        </w:tc>
+        <w:tc>
+          <w:tcPr>
+            <w:tcW w:type="dxa" w:w="3820"/>
+            <w:tcBorders>
+              <w:top w:val="single" w:color="B9D7F2" w:sz="4"/>
+              <w:left w:val="single" w:color="B9D7F2" w:sz="4"/>
+              <w:bottom w:val="single" w:color="B9D7F2" w:sz="4"/>
+              <w:right w:val="single" w:color="B9D7F2" w:sz="4"/>
+            </w:tcBorders>
+            <w:tcMar>
+              <w:top w:type="dxa" w:w="60"/>
+              <w:left w:type="dxa" w:w="90"/>
+              <w:bottom w:type="dxa" w:w="60"/>
+              <w:right w:type="dxa" w:w="90"/>
+            </w:tcMar>
+          </w:tcPr>
+          <w:p>
+            <w:pPr>
+              <w:spacing w:after="0" w:before="0"/>
+            </w:pPr>
+            <w:r>
+              <w:rPr>
+                <w:rFonts w:ascii="Arial" w:cs="Arial" w:eastAsia="Arial" w:hAnsi="Arial"/>
+                <w:color w:val="15202B"/>
+                <w:sz w:val="18"/>
+                <w:szCs w:val="18"/>
+              </w:rPr>
+              <w:t xml:space="preserve">Log out, Continue as guest again, place an order, then My Account &gt; Exit guest mode &gt; Cancel.</w:t>
+            </w:r>
+          </w:p>
+        </w:tc>
+        <w:tc>
+          <w:tcPr>
+            <w:tcW w:type="dxa" w:w="3900"/>
+            <w:tcBorders>
+              <w:top w:val="single" w:color="B9D7F2" w:sz="4"/>
+              <w:left w:val="single" w:color="B9D7F2" w:sz="4"/>
+              <w:bottom w:val="single" w:color="B9D7F2" w:sz="4"/>
+              <w:right w:val="single" w:color="B9D7F2" w:sz="4"/>
+            </w:tcBorders>
+            <w:tcMar>
+              <w:top w:type="dxa" w:w="60"/>
+              <w:left w:type="dxa" w:w="90"/>
+              <w:bottom w:type="dxa" w:w="60"/>
+              <w:right w:type="dxa" w:w="90"/>
+            </w:tcMar>
+          </w:tcPr>
+          <w:p>
+            <w:pPr>
+              <w:spacing w:after="0" w:before="0"/>
+            </w:pPr>
+            <w:r>
+              <w:rPr>
+                <w:rFonts w:ascii="Arial" w:cs="Arial" w:eastAsia="Arial" w:hAnsi="Arial"/>
+                <w:color w:val="15202B"/>
+                <w:sz w:val="18"/>
+                <w:szCs w:val="18"/>
+              </w:rPr>
+              <w:t xml:space="preserve">Stays in guest mode.</w:t>
+            </w:r>
+          </w:p>
+        </w:tc>
+        <w:tc>
+          <w:tcPr>
+            <w:tcW w:type="dxa" w:w="900"/>
+            <w:tcBorders>
+              <w:top w:val="single" w:color="B9D7F2" w:sz="4"/>
+              <w:left w:val="single" w:color="B9D7F2" w:sz="4"/>
+              <w:bottom w:val="single" w:color="B9D7F2" w:sz="4"/>
+              <w:right w:val="single" w:color="B9D7F2" w:sz="4"/>
+            </w:tcBorders>
+            <w:tcMar>
+              <w:top w:type="dxa" w:w="60"/>
+              <w:left w:type="dxa" w:w="90"/>
+              <w:bottom w:type="dxa" w:w="60"/>
+              <w:right w:type="dxa" w:w="90"/>
+            </w:tcMar>
+          </w:tcPr>
+          <w:p>
+            <w:pPr>
+              <w:spacing w:after="0" w:before="0"/>
+            </w:pPr>
+            <w:r>
+              <w:rPr>
+                <w:rFonts w:ascii="Arial" w:cs="Arial" w:eastAsia="Arial" w:hAnsi="Arial"/>
+                <w:color w:val="15202B"/>
+                <w:sz w:val="18"/>
+                <w:szCs w:val="18"/>
+              </w:rPr>
+              <w:t xml:space="preserve">☐ Pass</w:t>
+            </w:r>
+          </w:p>
+          <w:p>
+            <w:pPr>
+              <w:spacing w:after="0" w:before="0"/>
+            </w:pPr>
+            <w:r>
+              <w:rPr>
+                <w:rFonts w:ascii="Arial" w:cs="Arial" w:eastAsia="Arial" w:hAnsi="Arial"/>
+                <w:color w:val="15202B"/>
+                <w:sz w:val="18"/>
+                <w:szCs w:val="18"/>
+              </w:rPr>
+              <w:t xml:space="preserve">☐ Fail</w:t>
+            </w:r>
+          </w:p>
+        </w:tc>
+        <w:tc>
+          <w:tcPr>
+            <w:tcW w:type="dxa" w:w="1206"/>
+            <w:tcBorders>
+              <w:top w:val="single" w:color="B9D7F2" w:sz="4"/>
+              <w:left w:val="single" w:color="B9D7F2" w:sz="4"/>
+              <w:bottom w:val="single" w:color="B9D7F2" w:sz="4"/>
+              <w:right w:val="single" w:color="B9D7F2" w:sz="4"/>
+            </w:tcBorders>
+            <w:tcMar>
+              <w:top w:type="dxa" w:w="60"/>
+              <w:left w:type="dxa" w:w="90"/>
+              <w:bottom w:type="dxa" w:w="60"/>
+              <w:right w:type="dxa" w:w="90"/>
+            </w:tcMar>
+          </w:tcPr>
+          <w:p>
+            <w:pPr>
+              <w:spacing w:after="0" w:before="0"/>
+            </w:pPr>
+            <w:r>
+              <w:rPr>
+                <w:rFonts w:ascii="Arial" w:cs="Arial" w:eastAsia="Arial" w:hAnsi="Arial"/>
+                <w:color w:val="15202B"/>
+                <w:sz w:val="18"/>
+                <w:szCs w:val="18"/>
+              </w:rPr>
+              <w:t xml:space="preserve"/>
+            </w:r>
+          </w:p>
+        </w:tc>
+      </w:tr>
+      <w:tr>
+        <w:trPr>
+          <w:cantSplit/>
+        </w:trPr>
+        <w:tc>
+          <w:tcPr>
+            <w:tcW w:type="dxa" w:w="640"/>
+            <w:tcBorders>
+              <w:top w:val="single" w:color="B9D7F2" w:sz="4"/>
+              <w:left w:val="single" w:color="B9D7F2" w:sz="4"/>
+              <w:bottom w:val="single" w:color="B9D7F2" w:sz="4"/>
+              <w:right w:val="single" w:color="B9D7F2" w:sz="4"/>
+            </w:tcBorders>
+            <w:shd w:fill="EAF4FD" w:color="auto" w:val="clear"/>
+            <w:tcMar>
+              <w:top w:type="dxa" w:w="60"/>
+              <w:left w:type="dxa" w:w="90"/>
+              <w:bottom w:type="dxa" w:w="60"/>
+              <w:right w:type="dxa" w:w="90"/>
+            </w:tcMar>
+          </w:tcPr>
+          <w:p>
+            <w:pPr>
+              <w:spacing w:after="0" w:before="0"/>
+            </w:pPr>
+            <w:r>
+              <w:rPr>
+                <w:rFonts w:ascii="Arial" w:cs="Arial" w:eastAsia="Arial" w:hAnsi="Arial"/>
+                <w:color w:val="15202B"/>
+                <w:sz w:val="18"/>
+                <w:szCs w:val="18"/>
+              </w:rPr>
+              <w:t xml:space="preserve">33.10</w:t>
+            </w:r>
+          </w:p>
+        </w:tc>
+        <w:tc>
+          <w:tcPr>
+            <w:tcW w:type="dxa" w:w="3820"/>
+            <w:tcBorders>
+              <w:top w:val="single" w:color="B9D7F2" w:sz="4"/>
+              <w:left w:val="single" w:color="B9D7F2" w:sz="4"/>
+              <w:bottom w:val="single" w:color="B9D7F2" w:sz="4"/>
+              <w:right w:val="single" w:color="B9D7F2" w:sz="4"/>
+            </w:tcBorders>
+            <w:shd w:fill="EAF4FD" w:color="auto" w:val="clear"/>
+            <w:tcMar>
+              <w:top w:type="dxa" w:w="60"/>
+              <w:left w:type="dxa" w:w="90"/>
+              <w:bottom w:type="dxa" w:w="60"/>
+              <w:right w:type="dxa" w:w="90"/>
+            </w:tcMar>
+          </w:tcPr>
+          <w:p>
+            <w:pPr>
+              <w:spacing w:after="0" w:before="0"/>
+            </w:pPr>
+            <w:r>
+              <w:rPr>
+                <w:rFonts w:ascii="Arial" w:cs="Arial" w:eastAsia="Arial" w:hAnsi="Arial"/>
+                <w:color w:val="15202B"/>
+                <w:sz w:val="18"/>
+                <w:szCs w:val="18"/>
+              </w:rPr>
+              <w:t xml:space="preserve">Exit guest mode &gt; Confirm ("Orders on this phone will be lost").</w:t>
+            </w:r>
+          </w:p>
+        </w:tc>
+        <w:tc>
+          <w:tcPr>
+            <w:tcW w:type="dxa" w:w="3900"/>
+            <w:tcBorders>
+              <w:top w:val="single" w:color="B9D7F2" w:sz="4"/>
+              <w:left w:val="single" w:color="B9D7F2" w:sz="4"/>
+              <w:bottom w:val="single" w:color="B9D7F2" w:sz="4"/>
+              <w:right w:val="single" w:color="B9D7F2" w:sz="4"/>
+            </w:tcBorders>
+            <w:shd w:fill="EAF4FD" w:color="auto" w:val="clear"/>
+            <w:tcMar>
+              <w:top w:type="dxa" w:w="60"/>
+              <w:left w:type="dxa" w:w="90"/>
+              <w:bottom w:type="dxa" w:w="60"/>
+              <w:right w:type="dxa" w:w="90"/>
+            </w:tcMar>
+          </w:tcPr>
+          <w:p>
+            <w:pPr>
+              <w:spacing w:after="0" w:before="0"/>
+            </w:pPr>
+            <w:r>
+              <w:rPr>
+                <w:rFonts w:ascii="Arial" w:cs="Arial" w:eastAsia="Arial" w:hAnsi="Arial"/>
+                <w:color w:val="15202B"/>
+                <w:sz w:val="18"/>
+                <w:szCs w:val="18"/>
+              </w:rPr>
+              <w:t xml:space="preserve">Back to Welcome; continuing as guest again shows no old orders.</w:t>
             </w:r>
           </w:p>
         </w:tc>

</xml_diff>

<commit_message>
T34 live location (rider sends location while orders are out, Live Map for owner/staff, rider on the customer's order) and T35 real-time updates with Socket.IO (screens reload by themselves, alert banners); push sender ready for Firebase
Co-Authored-By: Claude Opus 5.5 <noreply@anthropic.com>
Claude-Session: https://claude.ai/code/session_01DasQCNUJBbLyCWkvv4Qmw3
</commit_message>
<xml_diff>
--- a/docs/testing/Mangao-Testing-Checklist.docx
+++ b/docs/testing/Mangao-Testing-Checklist.docx
@@ -30,7 +30,7 @@
           <w:sz w:val="19"/>
           <w:szCs w:val="19"/>
         </w:rPr>
-        <w:t xml:space="preserve">Steps built but not yet checked in Chrome: 24 steps, 189 checks. Updated Oct 14, 2026, 1:13 AM.</w:t>
+        <w:t xml:space="preserve">Steps built but not yet checked in Chrome: 26 steps, 207 checks. Updated Oct 14, 2026, 1:18 AM.</w:t>
       </w:r>
     </w:p>
     <w:p>
@@ -5196,6 +5196,331 @@
           </w:p>
         </w:tc>
       </w:tr>
+      <w:tr>
+        <w:trPr>
+          <w:cantSplit/>
+        </w:trPr>
+        <w:tc>
+          <w:tcPr>
+            <w:tcW w:type="dxa" w:w="900"/>
+            <w:tcBorders>
+              <w:top w:val="single" w:color="B9D7F2" w:sz="4"/>
+              <w:left w:val="single" w:color="B9D7F2" w:sz="4"/>
+              <w:bottom w:val="single" w:color="B9D7F2" w:sz="4"/>
+              <w:right w:val="single" w:color="B9D7F2" w:sz="4"/>
+            </w:tcBorders>
+            <w:tcMar>
+              <w:top w:type="dxa" w:w="60"/>
+              <w:left w:type="dxa" w:w="90"/>
+              <w:bottom w:type="dxa" w:w="60"/>
+              <w:right w:type="dxa" w:w="90"/>
+            </w:tcMar>
+          </w:tcPr>
+          <w:p>
+            <w:pPr>
+              <w:spacing w:after="0" w:before="0"/>
+            </w:pPr>
+            <w:r>
+              <w:rPr>
+                <w:rFonts w:ascii="Arial" w:cs="Arial" w:eastAsia="Arial" w:hAnsi="Arial"/>
+                <w:color w:val="15202B"/>
+                <w:sz w:val="18"/>
+                <w:szCs w:val="18"/>
+              </w:rPr>
+              <w:t xml:space="preserve">34</w:t>
+            </w:r>
+          </w:p>
+        </w:tc>
+        <w:tc>
+          <w:tcPr>
+            <w:tcW w:type="dxa" w:w="4400"/>
+            <w:tcBorders>
+              <w:top w:val="single" w:color="B9D7F2" w:sz="4"/>
+              <w:left w:val="single" w:color="B9D7F2" w:sz="4"/>
+              <w:bottom w:val="single" w:color="B9D7F2" w:sz="4"/>
+              <w:right w:val="single" w:color="B9D7F2" w:sz="4"/>
+            </w:tcBorders>
+            <w:tcMar>
+              <w:top w:type="dxa" w:w="60"/>
+              <w:left w:type="dxa" w:w="90"/>
+              <w:bottom w:type="dxa" w:w="60"/>
+              <w:right w:type="dxa" w:w="90"/>
+            </w:tcMar>
+          </w:tcPr>
+          <w:p>
+            <w:pPr>
+              <w:spacing w:after="0" w:before="0"/>
+            </w:pPr>
+            <w:r>
+              <w:rPr>
+                <w:rFonts w:ascii="Arial" w:cs="Arial" w:eastAsia="Arial" w:hAnsi="Arial"/>
+                <w:color w:val="15202B"/>
+                <w:sz w:val="18"/>
+                <w:szCs w:val="18"/>
+              </w:rPr>
+              <w:t xml:space="preserve">Live location and live map</w:t>
+            </w:r>
+          </w:p>
+        </w:tc>
+        <w:tc>
+          <w:tcPr>
+            <w:tcW w:type="dxa" w:w="2600"/>
+            <w:tcBorders>
+              <w:top w:val="single" w:color="B9D7F2" w:sz="4"/>
+              <w:left w:val="single" w:color="B9D7F2" w:sz="4"/>
+              <w:bottom w:val="single" w:color="B9D7F2" w:sz="4"/>
+              <w:right w:val="single" w:color="B9D7F2" w:sz="4"/>
+            </w:tcBorders>
+            <w:tcMar>
+              <w:top w:type="dxa" w:w="60"/>
+              <w:left w:type="dxa" w:w="90"/>
+              <w:bottom w:type="dxa" w:w="60"/>
+              <w:right w:type="dxa" w:w="90"/>
+            </w:tcMar>
+          </w:tcPr>
+          <w:p>
+            <w:pPr>
+              <w:spacing w:after="0" w:before="0"/>
+            </w:pPr>
+            <w:r>
+              <w:rPr>
+                <w:rFonts w:ascii="Arial" w:cs="Arial" w:eastAsia="Arial" w:hAnsi="Arial"/>
+                <w:color w:val="15202B"/>
+                <w:sz w:val="18"/>
+                <w:szCs w:val="18"/>
+              </w:rPr>
+              <w:t xml:space="preserve">Admin Orders 7, Staff 9, Rider 5, Customer 5</w:t>
+            </w:r>
+          </w:p>
+        </w:tc>
+        <w:tc>
+          <w:tcPr>
+            <w:tcW w:type="dxa" w:w="1300"/>
+            <w:tcBorders>
+              <w:top w:val="single" w:color="B9D7F2" w:sz="4"/>
+              <w:left w:val="single" w:color="B9D7F2" w:sz="4"/>
+              <w:bottom w:val="single" w:color="B9D7F2" w:sz="4"/>
+              <w:right w:val="single" w:color="B9D7F2" w:sz="4"/>
+            </w:tcBorders>
+            <w:tcMar>
+              <w:top w:type="dxa" w:w="60"/>
+              <w:left w:type="dxa" w:w="90"/>
+              <w:bottom w:type="dxa" w:w="60"/>
+              <w:right w:type="dxa" w:w="90"/>
+            </w:tcMar>
+          </w:tcPr>
+          <w:p>
+            <w:pPr>
+              <w:spacing w:after="0" w:before="0"/>
+            </w:pPr>
+            <w:r>
+              <w:rPr>
+                <w:rFonts w:ascii="Arial" w:cs="Arial" w:eastAsia="Arial" w:hAnsi="Arial"/>
+                <w:color w:val="15202B"/>
+                <w:sz w:val="18"/>
+                <w:szCs w:val="18"/>
+              </w:rPr>
+              <w:t xml:space="preserve">10</w:t>
+            </w:r>
+          </w:p>
+        </w:tc>
+        <w:tc>
+          <w:tcPr>
+            <w:tcW w:type="dxa" w:w="1266"/>
+            <w:tcBorders>
+              <w:top w:val="single" w:color="B9D7F2" w:sz="4"/>
+              <w:left w:val="single" w:color="B9D7F2" w:sz="4"/>
+              <w:bottom w:val="single" w:color="B9D7F2" w:sz="4"/>
+              <w:right w:val="single" w:color="B9D7F2" w:sz="4"/>
+            </w:tcBorders>
+            <w:tcMar>
+              <w:top w:type="dxa" w:w="60"/>
+              <w:left w:type="dxa" w:w="90"/>
+              <w:bottom w:type="dxa" w:w="60"/>
+              <w:right w:type="dxa" w:w="90"/>
+            </w:tcMar>
+          </w:tcPr>
+          <w:p>
+            <w:pPr>
+              <w:spacing w:after="0" w:before="0"/>
+            </w:pPr>
+            <w:r>
+              <w:rPr>
+                <w:rFonts w:ascii="Arial" w:cs="Arial" w:eastAsia="Arial" w:hAnsi="Arial"/>
+                <w:color w:val="15202B"/>
+                <w:sz w:val="18"/>
+                <w:szCs w:val="18"/>
+              </w:rPr>
+              <w:t xml:space="preserve">☐ Yes  ☐ No</w:t>
+            </w:r>
+          </w:p>
+        </w:tc>
+      </w:tr>
+      <w:tr>
+        <w:trPr>
+          <w:cantSplit/>
+        </w:trPr>
+        <w:tc>
+          <w:tcPr>
+            <w:tcW w:type="dxa" w:w="900"/>
+            <w:tcBorders>
+              <w:top w:val="single" w:color="B9D7F2" w:sz="4"/>
+              <w:left w:val="single" w:color="B9D7F2" w:sz="4"/>
+              <w:bottom w:val="single" w:color="B9D7F2" w:sz="4"/>
+              <w:right w:val="single" w:color="B9D7F2" w:sz="4"/>
+            </w:tcBorders>
+            <w:shd w:fill="EAF4FD" w:color="auto" w:val="clear"/>
+            <w:tcMar>
+              <w:top w:type="dxa" w:w="60"/>
+              <w:left w:type="dxa" w:w="90"/>
+              <w:bottom w:type="dxa" w:w="60"/>
+              <w:right w:type="dxa" w:w="90"/>
+            </w:tcMar>
+          </w:tcPr>
+          <w:p>
+            <w:pPr>
+              <w:spacing w:after="0" w:before="0"/>
+            </w:pPr>
+            <w:r>
+              <w:rPr>
+                <w:rFonts w:ascii="Arial" w:cs="Arial" w:eastAsia="Arial" w:hAnsi="Arial"/>
+                <w:color w:val="15202B"/>
+                <w:sz w:val="18"/>
+                <w:szCs w:val="18"/>
+              </w:rPr>
+              <w:t xml:space="preserve">35</w:t>
+            </w:r>
+          </w:p>
+        </w:tc>
+        <w:tc>
+          <w:tcPr>
+            <w:tcW w:type="dxa" w:w="4400"/>
+            <w:tcBorders>
+              <w:top w:val="single" w:color="B9D7F2" w:sz="4"/>
+              <w:left w:val="single" w:color="B9D7F2" w:sz="4"/>
+              <w:bottom w:val="single" w:color="B9D7F2" w:sz="4"/>
+              <w:right w:val="single" w:color="B9D7F2" w:sz="4"/>
+            </w:tcBorders>
+            <w:shd w:fill="EAF4FD" w:color="auto" w:val="clear"/>
+            <w:tcMar>
+              <w:top w:type="dxa" w:w="60"/>
+              <w:left w:type="dxa" w:w="90"/>
+              <w:bottom w:type="dxa" w:w="60"/>
+              <w:right w:type="dxa" w:w="90"/>
+            </w:tcMar>
+          </w:tcPr>
+          <w:p>
+            <w:pPr>
+              <w:spacing w:after="0" w:before="0"/>
+            </w:pPr>
+            <w:r>
+              <w:rPr>
+                <w:rFonts w:ascii="Arial" w:cs="Arial" w:eastAsia="Arial" w:hAnsi="Arial"/>
+                <w:color w:val="15202B"/>
+                <w:sz w:val="18"/>
+                <w:szCs w:val="18"/>
+              </w:rPr>
+              <w:t xml:space="preserve">Real-time updates</w:t>
+            </w:r>
+          </w:p>
+        </w:tc>
+        <w:tc>
+          <w:tcPr>
+            <w:tcW w:type="dxa" w:w="2600"/>
+            <w:tcBorders>
+              <w:top w:val="single" w:color="B9D7F2" w:sz="4"/>
+              <w:left w:val="single" w:color="B9D7F2" w:sz="4"/>
+              <w:bottom w:val="single" w:color="B9D7F2" w:sz="4"/>
+              <w:right w:val="single" w:color="B9D7F2" w:sz="4"/>
+            </w:tcBorders>
+            <w:shd w:fill="EAF4FD" w:color="auto" w:val="clear"/>
+            <w:tcMar>
+              <w:top w:type="dxa" w:w="60"/>
+              <w:left w:type="dxa" w:w="90"/>
+              <w:bottom w:type="dxa" w:w="60"/>
+              <w:right w:type="dxa" w:w="90"/>
+            </w:tcMar>
+          </w:tcPr>
+          <w:p>
+            <w:pPr>
+              <w:spacing w:after="0" w:before="0"/>
+            </w:pPr>
+            <w:r>
+              <w:rPr>
+                <w:rFonts w:ascii="Arial" w:cs="Arial" w:eastAsia="Arial" w:hAnsi="Arial"/>
+                <w:color w:val="15202B"/>
+                <w:sz w:val="18"/>
+                <w:szCs w:val="18"/>
+              </w:rPr>
+              <w:t xml:space="preserve">All lists and details</w:t>
+            </w:r>
+          </w:p>
+        </w:tc>
+        <w:tc>
+          <w:tcPr>
+            <w:tcW w:type="dxa" w:w="1300"/>
+            <w:tcBorders>
+              <w:top w:val="single" w:color="B9D7F2" w:sz="4"/>
+              <w:left w:val="single" w:color="B9D7F2" w:sz="4"/>
+              <w:bottom w:val="single" w:color="B9D7F2" w:sz="4"/>
+              <w:right w:val="single" w:color="B9D7F2" w:sz="4"/>
+            </w:tcBorders>
+            <w:shd w:fill="EAF4FD" w:color="auto" w:val="clear"/>
+            <w:tcMar>
+              <w:top w:type="dxa" w:w="60"/>
+              <w:left w:type="dxa" w:w="90"/>
+              <w:bottom w:type="dxa" w:w="60"/>
+              <w:right w:type="dxa" w:w="90"/>
+            </w:tcMar>
+          </w:tcPr>
+          <w:p>
+            <w:pPr>
+              <w:spacing w:after="0" w:before="0"/>
+            </w:pPr>
+            <w:r>
+              <w:rPr>
+                <w:rFonts w:ascii="Arial" w:cs="Arial" w:eastAsia="Arial" w:hAnsi="Arial"/>
+                <w:color w:val="15202B"/>
+                <w:sz w:val="18"/>
+                <w:szCs w:val="18"/>
+              </w:rPr>
+              <w:t xml:space="preserve">8</w:t>
+            </w:r>
+          </w:p>
+        </w:tc>
+        <w:tc>
+          <w:tcPr>
+            <w:tcW w:type="dxa" w:w="1266"/>
+            <w:tcBorders>
+              <w:top w:val="single" w:color="B9D7F2" w:sz="4"/>
+              <w:left w:val="single" w:color="B9D7F2" w:sz="4"/>
+              <w:bottom w:val="single" w:color="B9D7F2" w:sz="4"/>
+              <w:right w:val="single" w:color="B9D7F2" w:sz="4"/>
+            </w:tcBorders>
+            <w:shd w:fill="EAF4FD" w:color="auto" w:val="clear"/>
+            <w:tcMar>
+              <w:top w:type="dxa" w:w="60"/>
+              <w:left w:type="dxa" w:w="90"/>
+              <w:bottom w:type="dxa" w:w="60"/>
+              <w:right w:type="dxa" w:w="90"/>
+            </w:tcMar>
+          </w:tcPr>
+          <w:p>
+            <w:pPr>
+              <w:spacing w:after="0" w:before="0"/>
+            </w:pPr>
+            <w:r>
+              <w:rPr>
+                <w:rFonts w:ascii="Arial" w:cs="Arial" w:eastAsia="Arial" w:hAnsi="Arial"/>
+                <w:color w:val="15202B"/>
+                <w:sz w:val="18"/>
+                <w:szCs w:val="18"/>
+              </w:rPr>
+              <w:t xml:space="preserve">☐ Yes  ☐ No</w:t>
+            </w:r>
+          </w:p>
+        </w:tc>
+      </w:tr>
     </w:tbl>
     <w:p>
       <w:pPr>
@@ -44801,6 +45126,3751 @@
                 <w:szCs w:val="18"/>
               </w:rPr>
               <w:t xml:space="preserve">Back to Welcome; continuing as guest again shows no old orders.</w:t>
+            </w:r>
+          </w:p>
+        </w:tc>
+        <w:tc>
+          <w:tcPr>
+            <w:tcW w:type="dxa" w:w="900"/>
+            <w:tcBorders>
+              <w:top w:val="single" w:color="B9D7F2" w:sz="4"/>
+              <w:left w:val="single" w:color="B9D7F2" w:sz="4"/>
+              <w:bottom w:val="single" w:color="B9D7F2" w:sz="4"/>
+              <w:right w:val="single" w:color="B9D7F2" w:sz="4"/>
+            </w:tcBorders>
+            <w:shd w:fill="EAF4FD" w:color="auto" w:val="clear"/>
+            <w:tcMar>
+              <w:top w:type="dxa" w:w="60"/>
+              <w:left w:type="dxa" w:w="90"/>
+              <w:bottom w:type="dxa" w:w="60"/>
+              <w:right w:type="dxa" w:w="90"/>
+            </w:tcMar>
+          </w:tcPr>
+          <w:p>
+            <w:pPr>
+              <w:spacing w:after="0" w:before="0"/>
+            </w:pPr>
+            <w:r>
+              <w:rPr>
+                <w:rFonts w:ascii="Arial" w:cs="Arial" w:eastAsia="Arial" w:hAnsi="Arial"/>
+                <w:color w:val="15202B"/>
+                <w:sz w:val="18"/>
+                <w:szCs w:val="18"/>
+              </w:rPr>
+              <w:t xml:space="preserve">☐ Pass</w:t>
+            </w:r>
+          </w:p>
+          <w:p>
+            <w:pPr>
+              <w:spacing w:after="0" w:before="0"/>
+            </w:pPr>
+            <w:r>
+              <w:rPr>
+                <w:rFonts w:ascii="Arial" w:cs="Arial" w:eastAsia="Arial" w:hAnsi="Arial"/>
+                <w:color w:val="15202B"/>
+                <w:sz w:val="18"/>
+                <w:szCs w:val="18"/>
+              </w:rPr>
+              <w:t xml:space="preserve">☐ Fail</w:t>
+            </w:r>
+          </w:p>
+        </w:tc>
+        <w:tc>
+          <w:tcPr>
+            <w:tcW w:type="dxa" w:w="1206"/>
+            <w:tcBorders>
+              <w:top w:val="single" w:color="B9D7F2" w:sz="4"/>
+              <w:left w:val="single" w:color="B9D7F2" w:sz="4"/>
+              <w:bottom w:val="single" w:color="B9D7F2" w:sz="4"/>
+              <w:right w:val="single" w:color="B9D7F2" w:sz="4"/>
+            </w:tcBorders>
+            <w:shd w:fill="EAF4FD" w:color="auto" w:val="clear"/>
+            <w:tcMar>
+              <w:top w:type="dxa" w:w="60"/>
+              <w:left w:type="dxa" w:w="90"/>
+              <w:bottom w:type="dxa" w:w="60"/>
+              <w:right w:type="dxa" w:w="90"/>
+            </w:tcMar>
+          </w:tcPr>
+          <w:p>
+            <w:pPr>
+              <w:spacing w:after="0" w:before="0"/>
+            </w:pPr>
+            <w:r>
+              <w:rPr>
+                <w:rFonts w:ascii="Arial" w:cs="Arial" w:eastAsia="Arial" w:hAnsi="Arial"/>
+                <w:color w:val="15202B"/>
+                <w:sz w:val="18"/>
+                <w:szCs w:val="18"/>
+              </w:rPr>
+              <w:t xml:space="preserve"/>
+            </w:r>
+          </w:p>
+        </w:tc>
+      </w:tr>
+    </w:tbl>
+    <w:p>
+      <w:pPr>
+        <w:pStyle w:val="Heading1"/>
+        <w:pageBreakBefore/>
+        <w:spacing w:after="60"/>
+      </w:pPr>
+      <w:r>
+        <w:rPr>
+          <w:rFonts w:ascii="Arial" w:cs="Arial" w:eastAsia="Arial" w:hAnsi="Arial"/>
+          <w:b/>
+          <w:bCs/>
+          <w:color w:val="0A84E0"/>
+          <w:sz w:val="28"/>
+          <w:szCs w:val="28"/>
+        </w:rPr>
+        <w:t xml:space="preserve">Step 34 · Live location and live map</w:t>
+      </w:r>
+    </w:p>
+    <w:p>
+      <w:pPr>
+        <w:spacing w:after="60" w:before="0"/>
+      </w:pPr>
+      <w:r>
+        <w:rPr>
+          <w:rFonts w:ascii="Arial" w:cs="Arial" w:eastAsia="Arial" w:hAnsi="Arial"/>
+          <w:b/>
+          <w:bCs/>
+          <w:color w:val="15202B"/>
+          <w:sz w:val="19"/>
+          <w:szCs w:val="19"/>
+        </w:rPr>
+        <w:t xml:space="preserve">Screens: </w:t>
+      </w:r>
+      <w:r>
+        <w:rPr>
+          <w:rFonts w:ascii="Arial" w:cs="Arial" w:eastAsia="Arial" w:hAnsi="Arial"/>
+          <w:color w:val="15202B"/>
+          <w:sz w:val="19"/>
+          <w:szCs w:val="19"/>
+        </w:rPr>
+        <w:t xml:space="preserve">Admin Orders 7, Staff 9, Rider 5, Customer 5</w:t>
+      </w:r>
+      <w:r>
+        <w:rPr>
+          <w:rFonts w:ascii="Arial" w:cs="Arial" w:eastAsia="Arial" w:hAnsi="Arial"/>
+          <w:b/>
+          <w:bCs/>
+          <w:color w:val="15202B"/>
+          <w:sz w:val="19"/>
+          <w:szCs w:val="19"/>
+        </w:rPr>
+        <w:t xml:space="preserve">    Log in as: </w:t>
+      </w:r>
+      <w:r>
+        <w:rPr>
+          <w:rFonts w:ascii="Arial" w:cs="Arial" w:eastAsia="Arial" w:hAnsi="Arial"/>
+          <w:color w:val="15202B"/>
+          <w:sz w:val="19"/>
+          <w:szCs w:val="19"/>
+        </w:rPr>
+        <w:t xml:space="preserve">Rider, Owner, Staff and the customer (use separate Chrome windows; allow location when Chrome asks)</w:t>
+      </w:r>
+    </w:p>
+    <w:p>
+      <w:pPr>
+        <w:spacing w:after="60" w:before="0"/>
+      </w:pPr>
+      <w:r>
+        <w:rPr>
+          <w:rFonts w:ascii="Arial" w:cs="Arial" w:eastAsia="Arial" w:hAnsi="Arial"/>
+          <w:b/>
+          <w:bCs/>
+          <w:color w:val="0A84E0"/>
+          <w:sz w:val="19"/>
+          <w:szCs w:val="19"/>
+        </w:rPr>
+        <w:t xml:space="preserve">Before: </w:t>
+      </w:r>
+      <w:r>
+        <w:rPr>
+          <w:rFonts w:ascii="Arial" w:cs="Arial" w:eastAsia="Arial" w:hAnsi="Arial"/>
+          <w:color w:val="15202B"/>
+          <w:sz w:val="19"/>
+          <w:szCs w:val="19"/>
+        </w:rPr>
+        <w:t xml:space="preserve">On one laptop every window uses the laptop's location, so the rider shows where the laptop is.</w:t>
+      </w:r>
+    </w:p>
+    <w:tbl>
+      <w:tblPr>
+        <w:tblW w:type="dxa" w:w="10466"/>
+        <w:tblBorders>
+          <w:top w:val="single" w:color="auto" w:sz="4"/>
+          <w:left w:val="single" w:color="auto" w:sz="4"/>
+          <w:bottom w:val="single" w:color="auto" w:sz="4"/>
+          <w:right w:val="single" w:color="auto" w:sz="4"/>
+          <w:insideH w:val="single" w:color="auto" w:sz="4"/>
+          <w:insideV w:val="single" w:color="auto" w:sz="4"/>
+        </w:tblBorders>
+        <w:tblLayout w:type="fixed"/>
+      </w:tblPr>
+      <w:tblGrid>
+        <w:gridCol w:w="640"/>
+        <w:gridCol w:w="3820"/>
+        <w:gridCol w:w="3900"/>
+        <w:gridCol w:w="900"/>
+        <w:gridCol w:w="1206"/>
+      </w:tblGrid>
+      <w:tr>
+        <w:trPr>
+          <w:tblHeader/>
+        </w:trPr>
+        <w:tc>
+          <w:tcPr>
+            <w:tcW w:type="dxa" w:w="640"/>
+            <w:tcBorders>
+              <w:top w:val="single" w:color="B9D7F2" w:sz="4"/>
+              <w:left w:val="single" w:color="B9D7F2" w:sz="4"/>
+              <w:bottom w:val="single" w:color="B9D7F2" w:sz="4"/>
+              <w:right w:val="single" w:color="B9D7F2" w:sz="4"/>
+            </w:tcBorders>
+            <w:shd w:fill="0A84E0" w:color="auto" w:val="clear"/>
+            <w:tcMar>
+              <w:top w:type="dxa" w:w="60"/>
+              <w:left w:type="dxa" w:w="90"/>
+              <w:bottom w:type="dxa" w:w="60"/>
+              <w:right w:type="dxa" w:w="90"/>
+            </w:tcMar>
+          </w:tcPr>
+          <w:p>
+            <w:pPr>
+              <w:spacing w:after="0" w:before="0"/>
+            </w:pPr>
+            <w:r>
+              <w:rPr>
+                <w:rFonts w:ascii="Arial" w:cs="Arial" w:eastAsia="Arial" w:hAnsi="Arial"/>
+                <w:b/>
+                <w:bCs/>
+                <w:color w:val="FFFFFF"/>
+                <w:sz w:val="18"/>
+                <w:szCs w:val="18"/>
+              </w:rPr>
+              <w:t xml:space="preserve">#</w:t>
+            </w:r>
+          </w:p>
+        </w:tc>
+        <w:tc>
+          <w:tcPr>
+            <w:tcW w:type="dxa" w:w="3820"/>
+            <w:tcBorders>
+              <w:top w:val="single" w:color="B9D7F2" w:sz="4"/>
+              <w:left w:val="single" w:color="B9D7F2" w:sz="4"/>
+              <w:bottom w:val="single" w:color="B9D7F2" w:sz="4"/>
+              <w:right w:val="single" w:color="B9D7F2" w:sz="4"/>
+            </w:tcBorders>
+            <w:shd w:fill="0A84E0" w:color="auto" w:val="clear"/>
+            <w:tcMar>
+              <w:top w:type="dxa" w:w="60"/>
+              <w:left w:type="dxa" w:w="90"/>
+              <w:bottom w:type="dxa" w:w="60"/>
+              <w:right w:type="dxa" w:w="90"/>
+            </w:tcMar>
+          </w:tcPr>
+          <w:p>
+            <w:pPr>
+              <w:spacing w:after="0" w:before="0"/>
+            </w:pPr>
+            <w:r>
+              <w:rPr>
+                <w:rFonts w:ascii="Arial" w:cs="Arial" w:eastAsia="Arial" w:hAnsi="Arial"/>
+                <w:b/>
+                <w:bCs/>
+                <w:color w:val="FFFFFF"/>
+                <w:sz w:val="18"/>
+                <w:szCs w:val="18"/>
+              </w:rPr>
+              <w:t xml:space="preserve">What to do</w:t>
+            </w:r>
+          </w:p>
+        </w:tc>
+        <w:tc>
+          <w:tcPr>
+            <w:tcW w:type="dxa" w:w="3900"/>
+            <w:tcBorders>
+              <w:top w:val="single" w:color="B9D7F2" w:sz="4"/>
+              <w:left w:val="single" w:color="B9D7F2" w:sz="4"/>
+              <w:bottom w:val="single" w:color="B9D7F2" w:sz="4"/>
+              <w:right w:val="single" w:color="B9D7F2" w:sz="4"/>
+            </w:tcBorders>
+            <w:shd w:fill="0A84E0" w:color="auto" w:val="clear"/>
+            <w:tcMar>
+              <w:top w:type="dxa" w:w="60"/>
+              <w:left w:type="dxa" w:w="90"/>
+              <w:bottom w:type="dxa" w:w="60"/>
+              <w:right w:type="dxa" w:w="90"/>
+            </w:tcMar>
+          </w:tcPr>
+          <w:p>
+            <w:pPr>
+              <w:spacing w:after="0" w:before="0"/>
+            </w:pPr>
+            <w:r>
+              <w:rPr>
+                <w:rFonts w:ascii="Arial" w:cs="Arial" w:eastAsia="Arial" w:hAnsi="Arial"/>
+                <w:b/>
+                <w:bCs/>
+                <w:color w:val="FFFFFF"/>
+                <w:sz w:val="18"/>
+                <w:szCs w:val="18"/>
+              </w:rPr>
+              <w:t xml:space="preserve">What you should see</w:t>
+            </w:r>
+          </w:p>
+        </w:tc>
+        <w:tc>
+          <w:tcPr>
+            <w:tcW w:type="dxa" w:w="900"/>
+            <w:tcBorders>
+              <w:top w:val="single" w:color="B9D7F2" w:sz="4"/>
+              <w:left w:val="single" w:color="B9D7F2" w:sz="4"/>
+              <w:bottom w:val="single" w:color="B9D7F2" w:sz="4"/>
+              <w:right w:val="single" w:color="B9D7F2" w:sz="4"/>
+            </w:tcBorders>
+            <w:shd w:fill="0A84E0" w:color="auto" w:val="clear"/>
+            <w:tcMar>
+              <w:top w:type="dxa" w:w="60"/>
+              <w:left w:type="dxa" w:w="90"/>
+              <w:bottom w:type="dxa" w:w="60"/>
+              <w:right w:type="dxa" w:w="90"/>
+            </w:tcMar>
+          </w:tcPr>
+          <w:p>
+            <w:pPr>
+              <w:spacing w:after="0" w:before="0"/>
+            </w:pPr>
+            <w:r>
+              <w:rPr>
+                <w:rFonts w:ascii="Arial" w:cs="Arial" w:eastAsia="Arial" w:hAnsi="Arial"/>
+                <w:b/>
+                <w:bCs/>
+                <w:color w:val="FFFFFF"/>
+                <w:sz w:val="18"/>
+                <w:szCs w:val="18"/>
+              </w:rPr>
+              <w:t xml:space="preserve">Result</w:t>
+            </w:r>
+          </w:p>
+        </w:tc>
+        <w:tc>
+          <w:tcPr>
+            <w:tcW w:type="dxa" w:w="1206"/>
+            <w:tcBorders>
+              <w:top w:val="single" w:color="B9D7F2" w:sz="4"/>
+              <w:left w:val="single" w:color="B9D7F2" w:sz="4"/>
+              <w:bottom w:val="single" w:color="B9D7F2" w:sz="4"/>
+              <w:right w:val="single" w:color="B9D7F2" w:sz="4"/>
+            </w:tcBorders>
+            <w:shd w:fill="0A84E0" w:color="auto" w:val="clear"/>
+            <w:tcMar>
+              <w:top w:type="dxa" w:w="60"/>
+              <w:left w:type="dxa" w:w="90"/>
+              <w:bottom w:type="dxa" w:w="60"/>
+              <w:right w:type="dxa" w:w="90"/>
+            </w:tcMar>
+          </w:tcPr>
+          <w:p>
+            <w:pPr>
+              <w:spacing w:after="0" w:before="0"/>
+            </w:pPr>
+            <w:r>
+              <w:rPr>
+                <w:rFonts w:ascii="Arial" w:cs="Arial" w:eastAsia="Arial" w:hAnsi="Arial"/>
+                <w:b/>
+                <w:bCs/>
+                <w:color w:val="FFFFFF"/>
+                <w:sz w:val="18"/>
+                <w:szCs w:val="18"/>
+              </w:rPr>
+              <w:t xml:space="preserve">Notes</w:t>
+            </w:r>
+          </w:p>
+        </w:tc>
+      </w:tr>
+      <w:tr>
+        <w:trPr>
+          <w:cantSplit/>
+        </w:trPr>
+        <w:tc>
+          <w:tcPr>
+            <w:tcW w:type="dxa" w:w="640"/>
+            <w:tcBorders>
+              <w:top w:val="single" w:color="B9D7F2" w:sz="4"/>
+              <w:left w:val="single" w:color="B9D7F2" w:sz="4"/>
+              <w:bottom w:val="single" w:color="B9D7F2" w:sz="4"/>
+              <w:right w:val="single" w:color="B9D7F2" w:sz="4"/>
+            </w:tcBorders>
+            <w:tcMar>
+              <w:top w:type="dxa" w:w="60"/>
+              <w:left w:type="dxa" w:w="90"/>
+              <w:bottom w:type="dxa" w:w="60"/>
+              <w:right w:type="dxa" w:w="90"/>
+            </w:tcMar>
+          </w:tcPr>
+          <w:p>
+            <w:pPr>
+              <w:spacing w:after="0" w:before="0"/>
+            </w:pPr>
+            <w:r>
+              <w:rPr>
+                <w:rFonts w:ascii="Arial" w:cs="Arial" w:eastAsia="Arial" w:hAnsi="Arial"/>
+                <w:color w:val="15202B"/>
+                <w:sz w:val="18"/>
+                <w:szCs w:val="18"/>
+              </w:rPr>
+              <w:t xml:space="preserve">34.1</w:t>
+            </w:r>
+          </w:p>
+        </w:tc>
+        <w:tc>
+          <w:tcPr>
+            <w:tcW w:type="dxa" w:w="3820"/>
+            <w:tcBorders>
+              <w:top w:val="single" w:color="B9D7F2" w:sz="4"/>
+              <w:left w:val="single" w:color="B9D7F2" w:sz="4"/>
+              <w:bottom w:val="single" w:color="B9D7F2" w:sz="4"/>
+              <w:right w:val="single" w:color="B9D7F2" w:sz="4"/>
+            </w:tcBorders>
+            <w:tcMar>
+              <w:top w:type="dxa" w:w="60"/>
+              <w:left w:type="dxa" w:w="90"/>
+              <w:bottom w:type="dxa" w:w="60"/>
+              <w:right w:type="dxa" w:w="90"/>
+            </w:tcMar>
+          </w:tcPr>
+          <w:p>
+            <w:pPr>
+              <w:spacing w:after="0" w:before="0"/>
+            </w:pPr>
+            <w:r>
+              <w:rPr>
+                <w:rFonts w:ascii="Arial" w:cs="Arial" w:eastAsia="Arial" w:hAnsi="Arial"/>
+                <w:color w:val="15202B"/>
+                <w:sz w:val="18"/>
+                <w:szCs w:val="18"/>
+              </w:rPr>
+              <w:t xml:space="preserve">Rider with nothing out: Deliveries.</w:t>
+            </w:r>
+          </w:p>
+        </w:tc>
+        <w:tc>
+          <w:tcPr>
+            <w:tcW w:type="dxa" w:w="3900"/>
+            <w:tcBorders>
+              <w:top w:val="single" w:color="B9D7F2" w:sz="4"/>
+              <w:left w:val="single" w:color="B9D7F2" w:sz="4"/>
+              <w:bottom w:val="single" w:color="B9D7F2" w:sz="4"/>
+              <w:right w:val="single" w:color="B9D7F2" w:sz="4"/>
+            </w:tcBorders>
+            <w:tcMar>
+              <w:top w:type="dxa" w:w="60"/>
+              <w:left w:type="dxa" w:w="90"/>
+              <w:bottom w:type="dxa" w:w="60"/>
+              <w:right w:type="dxa" w:w="90"/>
+            </w:tcMar>
+          </w:tcPr>
+          <w:p>
+            <w:pPr>
+              <w:spacing w:after="0" w:before="0"/>
+            </w:pPr>
+            <w:r>
+              <w:rPr>
+                <w:rFonts w:ascii="Arial" w:cs="Arial" w:eastAsia="Arial" w:hAnsi="Arial"/>
+                <w:color w:val="15202B"/>
+                <w:sz w:val="18"/>
+                <w:szCs w:val="18"/>
+              </w:rPr>
+              <w:t xml:space="preserve">No Location Sharing banner; "No orders on the road".</w:t>
+            </w:r>
+          </w:p>
+        </w:tc>
+        <w:tc>
+          <w:tcPr>
+            <w:tcW w:type="dxa" w:w="900"/>
+            <w:tcBorders>
+              <w:top w:val="single" w:color="B9D7F2" w:sz="4"/>
+              <w:left w:val="single" w:color="B9D7F2" w:sz="4"/>
+              <w:bottom w:val="single" w:color="B9D7F2" w:sz="4"/>
+              <w:right w:val="single" w:color="B9D7F2" w:sz="4"/>
+            </w:tcBorders>
+            <w:tcMar>
+              <w:top w:type="dxa" w:w="60"/>
+              <w:left w:type="dxa" w:w="90"/>
+              <w:bottom w:type="dxa" w:w="60"/>
+              <w:right w:type="dxa" w:w="90"/>
+            </w:tcMar>
+          </w:tcPr>
+          <w:p>
+            <w:pPr>
+              <w:spacing w:after="0" w:before="0"/>
+            </w:pPr>
+            <w:r>
+              <w:rPr>
+                <w:rFonts w:ascii="Arial" w:cs="Arial" w:eastAsia="Arial" w:hAnsi="Arial"/>
+                <w:color w:val="15202B"/>
+                <w:sz w:val="18"/>
+                <w:szCs w:val="18"/>
+              </w:rPr>
+              <w:t xml:space="preserve">☐ Pass</w:t>
+            </w:r>
+          </w:p>
+          <w:p>
+            <w:pPr>
+              <w:spacing w:after="0" w:before="0"/>
+            </w:pPr>
+            <w:r>
+              <w:rPr>
+                <w:rFonts w:ascii="Arial" w:cs="Arial" w:eastAsia="Arial" w:hAnsi="Arial"/>
+                <w:color w:val="15202B"/>
+                <w:sz w:val="18"/>
+                <w:szCs w:val="18"/>
+              </w:rPr>
+              <w:t xml:space="preserve">☐ Fail</w:t>
+            </w:r>
+          </w:p>
+        </w:tc>
+        <w:tc>
+          <w:tcPr>
+            <w:tcW w:type="dxa" w:w="1206"/>
+            <w:tcBorders>
+              <w:top w:val="single" w:color="B9D7F2" w:sz="4"/>
+              <w:left w:val="single" w:color="B9D7F2" w:sz="4"/>
+              <w:bottom w:val="single" w:color="B9D7F2" w:sz="4"/>
+              <w:right w:val="single" w:color="B9D7F2" w:sz="4"/>
+            </w:tcBorders>
+            <w:tcMar>
+              <w:top w:type="dxa" w:w="60"/>
+              <w:left w:type="dxa" w:w="90"/>
+              <w:bottom w:type="dxa" w:w="60"/>
+              <w:right w:type="dxa" w:w="90"/>
+            </w:tcMar>
+          </w:tcPr>
+          <w:p>
+            <w:pPr>
+              <w:spacing w:after="0" w:before="0"/>
+            </w:pPr>
+            <w:r>
+              <w:rPr>
+                <w:rFonts w:ascii="Arial" w:cs="Arial" w:eastAsia="Arial" w:hAnsi="Arial"/>
+                <w:color w:val="15202B"/>
+                <w:sz w:val="18"/>
+                <w:szCs w:val="18"/>
+              </w:rPr>
+              <w:t xml:space="preserve"/>
+            </w:r>
+          </w:p>
+        </w:tc>
+      </w:tr>
+      <w:tr>
+        <w:trPr>
+          <w:cantSplit/>
+        </w:trPr>
+        <w:tc>
+          <w:tcPr>
+            <w:tcW w:type="dxa" w:w="640"/>
+            <w:tcBorders>
+              <w:top w:val="single" w:color="B9D7F2" w:sz="4"/>
+              <w:left w:val="single" w:color="B9D7F2" w:sz="4"/>
+              <w:bottom w:val="single" w:color="B9D7F2" w:sz="4"/>
+              <w:right w:val="single" w:color="B9D7F2" w:sz="4"/>
+            </w:tcBorders>
+            <w:shd w:fill="EAF4FD" w:color="auto" w:val="clear"/>
+            <w:tcMar>
+              <w:top w:type="dxa" w:w="60"/>
+              <w:left w:type="dxa" w:w="90"/>
+              <w:bottom w:type="dxa" w:w="60"/>
+              <w:right w:type="dxa" w:w="90"/>
+            </w:tcMar>
+          </w:tcPr>
+          <w:p>
+            <w:pPr>
+              <w:spacing w:after="0" w:before="0"/>
+            </w:pPr>
+            <w:r>
+              <w:rPr>
+                <w:rFonts w:ascii="Arial" w:cs="Arial" w:eastAsia="Arial" w:hAnsi="Arial"/>
+                <w:color w:val="15202B"/>
+                <w:sz w:val="18"/>
+                <w:szCs w:val="18"/>
+              </w:rPr>
+              <w:t xml:space="preserve">34.2</w:t>
+            </w:r>
+          </w:p>
+        </w:tc>
+        <w:tc>
+          <w:tcPr>
+            <w:tcW w:type="dxa" w:w="3820"/>
+            <w:tcBorders>
+              <w:top w:val="single" w:color="B9D7F2" w:sz="4"/>
+              <w:left w:val="single" w:color="B9D7F2" w:sz="4"/>
+              <w:bottom w:val="single" w:color="B9D7F2" w:sz="4"/>
+              <w:right w:val="single" w:color="B9D7F2" w:sz="4"/>
+            </w:tcBorders>
+            <w:shd w:fill="EAF4FD" w:color="auto" w:val="clear"/>
+            <w:tcMar>
+              <w:top w:type="dxa" w:w="60"/>
+              <w:left w:type="dxa" w:w="90"/>
+              <w:bottom w:type="dxa" w:w="60"/>
+              <w:right w:type="dxa" w:w="90"/>
+            </w:tcMar>
+          </w:tcPr>
+          <w:p>
+            <w:pPr>
+              <w:spacing w:after="0" w:before="0"/>
+            </w:pPr>
+            <w:r>
+              <w:rPr>
+                <w:rFonts w:ascii="Arial" w:cs="Arial" w:eastAsia="Arial" w:hAnsi="Arial"/>
+                <w:color w:val="15202B"/>
+                <w:sz w:val="18"/>
+                <w:szCs w:val="18"/>
+              </w:rPr>
+              <w:t xml:space="preserve">Send one of Juan's orders out (step 22). Rider: Deliveries (allow location).</w:t>
+            </w:r>
+          </w:p>
+        </w:tc>
+        <w:tc>
+          <w:tcPr>
+            <w:tcW w:type="dxa" w:w="3900"/>
+            <w:tcBorders>
+              <w:top w:val="single" w:color="B9D7F2" w:sz="4"/>
+              <w:left w:val="single" w:color="B9D7F2" w:sz="4"/>
+              <w:bottom w:val="single" w:color="B9D7F2" w:sz="4"/>
+              <w:right w:val="single" w:color="B9D7F2" w:sz="4"/>
+            </w:tcBorders>
+            <w:shd w:fill="EAF4FD" w:color="auto" w:val="clear"/>
+            <w:tcMar>
+              <w:top w:type="dxa" w:w="60"/>
+              <w:left w:type="dxa" w:w="90"/>
+              <w:bottom w:type="dxa" w:w="60"/>
+              <w:right w:type="dxa" w:w="90"/>
+            </w:tcMar>
+          </w:tcPr>
+          <w:p>
+            <w:pPr>
+              <w:spacing w:after="0" w:before="0"/>
+            </w:pPr>
+            <w:r>
+              <w:rPr>
+                <w:rFonts w:ascii="Arial" w:cs="Arial" w:eastAsia="Arial" w:hAnsi="Arial"/>
+                <w:color w:val="15202B"/>
+                <w:sz w:val="18"/>
+                <w:szCs w:val="18"/>
+              </w:rPr>
+              <w:t xml:space="preserve">Banner "Location Sharing · On while orders are out · sent &lt;time&gt;"; it sends again every 15 seconds.</w:t>
+            </w:r>
+          </w:p>
+        </w:tc>
+        <w:tc>
+          <w:tcPr>
+            <w:tcW w:type="dxa" w:w="900"/>
+            <w:tcBorders>
+              <w:top w:val="single" w:color="B9D7F2" w:sz="4"/>
+              <w:left w:val="single" w:color="B9D7F2" w:sz="4"/>
+              <w:bottom w:val="single" w:color="B9D7F2" w:sz="4"/>
+              <w:right w:val="single" w:color="B9D7F2" w:sz="4"/>
+            </w:tcBorders>
+            <w:shd w:fill="EAF4FD" w:color="auto" w:val="clear"/>
+            <w:tcMar>
+              <w:top w:type="dxa" w:w="60"/>
+              <w:left w:type="dxa" w:w="90"/>
+              <w:bottom w:type="dxa" w:w="60"/>
+              <w:right w:type="dxa" w:w="90"/>
+            </w:tcMar>
+          </w:tcPr>
+          <w:p>
+            <w:pPr>
+              <w:spacing w:after="0" w:before="0"/>
+            </w:pPr>
+            <w:r>
+              <w:rPr>
+                <w:rFonts w:ascii="Arial" w:cs="Arial" w:eastAsia="Arial" w:hAnsi="Arial"/>
+                <w:color w:val="15202B"/>
+                <w:sz w:val="18"/>
+                <w:szCs w:val="18"/>
+              </w:rPr>
+              <w:t xml:space="preserve">☐ Pass</w:t>
+            </w:r>
+          </w:p>
+          <w:p>
+            <w:pPr>
+              <w:spacing w:after="0" w:before="0"/>
+            </w:pPr>
+            <w:r>
+              <w:rPr>
+                <w:rFonts w:ascii="Arial" w:cs="Arial" w:eastAsia="Arial" w:hAnsi="Arial"/>
+                <w:color w:val="15202B"/>
+                <w:sz w:val="18"/>
+                <w:szCs w:val="18"/>
+              </w:rPr>
+              <w:t xml:space="preserve">☐ Fail</w:t>
+            </w:r>
+          </w:p>
+        </w:tc>
+        <w:tc>
+          <w:tcPr>
+            <w:tcW w:type="dxa" w:w="1206"/>
+            <w:tcBorders>
+              <w:top w:val="single" w:color="B9D7F2" w:sz="4"/>
+              <w:left w:val="single" w:color="B9D7F2" w:sz="4"/>
+              <w:bottom w:val="single" w:color="B9D7F2" w:sz="4"/>
+              <w:right w:val="single" w:color="B9D7F2" w:sz="4"/>
+            </w:tcBorders>
+            <w:shd w:fill="EAF4FD" w:color="auto" w:val="clear"/>
+            <w:tcMar>
+              <w:top w:type="dxa" w:w="60"/>
+              <w:left w:type="dxa" w:w="90"/>
+              <w:bottom w:type="dxa" w:w="60"/>
+              <w:right w:type="dxa" w:w="90"/>
+            </w:tcMar>
+          </w:tcPr>
+          <w:p>
+            <w:pPr>
+              <w:spacing w:after="0" w:before="0"/>
+            </w:pPr>
+            <w:r>
+              <w:rPr>
+                <w:rFonts w:ascii="Arial" w:cs="Arial" w:eastAsia="Arial" w:hAnsi="Arial"/>
+                <w:color w:val="15202B"/>
+                <w:sz w:val="18"/>
+                <w:szCs w:val="18"/>
+              </w:rPr>
+              <w:t xml:space="preserve"/>
+            </w:r>
+          </w:p>
+        </w:tc>
+      </w:tr>
+      <w:tr>
+        <w:trPr>
+          <w:cantSplit/>
+        </w:trPr>
+        <w:tc>
+          <w:tcPr>
+            <w:tcW w:type="dxa" w:w="640"/>
+            <w:tcBorders>
+              <w:top w:val="single" w:color="B9D7F2" w:sz="4"/>
+              <w:left w:val="single" w:color="B9D7F2" w:sz="4"/>
+              <w:bottom w:val="single" w:color="B9D7F2" w:sz="4"/>
+              <w:right w:val="single" w:color="B9D7F2" w:sz="4"/>
+            </w:tcBorders>
+            <w:tcMar>
+              <w:top w:type="dxa" w:w="60"/>
+              <w:left w:type="dxa" w:w="90"/>
+              <w:bottom w:type="dxa" w:w="60"/>
+              <w:right w:type="dxa" w:w="90"/>
+            </w:tcMar>
+          </w:tcPr>
+          <w:p>
+            <w:pPr>
+              <w:spacing w:after="0" w:before="0"/>
+            </w:pPr>
+            <w:r>
+              <w:rPr>
+                <w:rFonts w:ascii="Arial" w:cs="Arial" w:eastAsia="Arial" w:hAnsi="Arial"/>
+                <w:color w:val="15202B"/>
+                <w:sz w:val="18"/>
+                <w:szCs w:val="18"/>
+              </w:rPr>
+              <w:t xml:space="preserve">34.3</w:t>
+            </w:r>
+          </w:p>
+        </w:tc>
+        <w:tc>
+          <w:tcPr>
+            <w:tcW w:type="dxa" w:w="3820"/>
+            <w:tcBorders>
+              <w:top w:val="single" w:color="B9D7F2" w:sz="4"/>
+              <w:left w:val="single" w:color="B9D7F2" w:sz="4"/>
+              <w:bottom w:val="single" w:color="B9D7F2" w:sz="4"/>
+              <w:right w:val="single" w:color="B9D7F2" w:sz="4"/>
+            </w:tcBorders>
+            <w:tcMar>
+              <w:top w:type="dxa" w:w="60"/>
+              <w:left w:type="dxa" w:w="90"/>
+              <w:bottom w:type="dxa" w:w="60"/>
+              <w:right w:type="dxa" w:w="90"/>
+            </w:tcMar>
+          </w:tcPr>
+          <w:p>
+            <w:pPr>
+              <w:spacing w:after="0" w:before="0"/>
+            </w:pPr>
+            <w:r>
+              <w:rPr>
+                <w:rFonts w:ascii="Arial" w:cs="Arial" w:eastAsia="Arial" w:hAnsi="Arial"/>
+                <w:color w:val="15202B"/>
+                <w:sz w:val="18"/>
+                <w:szCs w:val="18"/>
+              </w:rPr>
+              <w:t xml:space="preserve">Block location in Chrome for the rider window and reload.</w:t>
+            </w:r>
+          </w:p>
+        </w:tc>
+        <w:tc>
+          <w:tcPr>
+            <w:tcW w:type="dxa" w:w="3900"/>
+            <w:tcBorders>
+              <w:top w:val="single" w:color="B9D7F2" w:sz="4"/>
+              <w:left w:val="single" w:color="B9D7F2" w:sz="4"/>
+              <w:bottom w:val="single" w:color="B9D7F2" w:sz="4"/>
+              <w:right w:val="single" w:color="B9D7F2" w:sz="4"/>
+            </w:tcBorders>
+            <w:tcMar>
+              <w:top w:type="dxa" w:w="60"/>
+              <w:left w:type="dxa" w:w="90"/>
+              <w:bottom w:type="dxa" w:w="60"/>
+              <w:right w:type="dxa" w:w="90"/>
+            </w:tcMar>
+          </w:tcPr>
+          <w:p>
+            <w:pPr>
+              <w:spacing w:after="0" w:before="0"/>
+            </w:pPr>
+            <w:r>
+              <w:rPr>
+                <w:rFonts w:ascii="Arial" w:cs="Arial" w:eastAsia="Arial" w:hAnsi="Arial"/>
+                <w:color w:val="15202B"/>
+                <w:sz w:val="18"/>
+                <w:szCs w:val="18"/>
+              </w:rPr>
+              <w:t xml:space="preserve">Banner turns red: "Location Sharing: turn on location".</w:t>
+            </w:r>
+          </w:p>
+        </w:tc>
+        <w:tc>
+          <w:tcPr>
+            <w:tcW w:type="dxa" w:w="900"/>
+            <w:tcBorders>
+              <w:top w:val="single" w:color="B9D7F2" w:sz="4"/>
+              <w:left w:val="single" w:color="B9D7F2" w:sz="4"/>
+              <w:bottom w:val="single" w:color="B9D7F2" w:sz="4"/>
+              <w:right w:val="single" w:color="B9D7F2" w:sz="4"/>
+            </w:tcBorders>
+            <w:tcMar>
+              <w:top w:type="dxa" w:w="60"/>
+              <w:left w:type="dxa" w:w="90"/>
+              <w:bottom w:type="dxa" w:w="60"/>
+              <w:right w:type="dxa" w:w="90"/>
+            </w:tcMar>
+          </w:tcPr>
+          <w:p>
+            <w:pPr>
+              <w:spacing w:after="0" w:before="0"/>
+            </w:pPr>
+            <w:r>
+              <w:rPr>
+                <w:rFonts w:ascii="Arial" w:cs="Arial" w:eastAsia="Arial" w:hAnsi="Arial"/>
+                <w:color w:val="15202B"/>
+                <w:sz w:val="18"/>
+                <w:szCs w:val="18"/>
+              </w:rPr>
+              <w:t xml:space="preserve">☐ Pass</w:t>
+            </w:r>
+          </w:p>
+          <w:p>
+            <w:pPr>
+              <w:spacing w:after="0" w:before="0"/>
+            </w:pPr>
+            <w:r>
+              <w:rPr>
+                <w:rFonts w:ascii="Arial" w:cs="Arial" w:eastAsia="Arial" w:hAnsi="Arial"/>
+                <w:color w:val="15202B"/>
+                <w:sz w:val="18"/>
+                <w:szCs w:val="18"/>
+              </w:rPr>
+              <w:t xml:space="preserve">☐ Fail</w:t>
+            </w:r>
+          </w:p>
+        </w:tc>
+        <w:tc>
+          <w:tcPr>
+            <w:tcW w:type="dxa" w:w="1206"/>
+            <w:tcBorders>
+              <w:top w:val="single" w:color="B9D7F2" w:sz="4"/>
+              <w:left w:val="single" w:color="B9D7F2" w:sz="4"/>
+              <w:bottom w:val="single" w:color="B9D7F2" w:sz="4"/>
+              <w:right w:val="single" w:color="B9D7F2" w:sz="4"/>
+            </w:tcBorders>
+            <w:tcMar>
+              <w:top w:type="dxa" w:w="60"/>
+              <w:left w:type="dxa" w:w="90"/>
+              <w:bottom w:type="dxa" w:w="60"/>
+              <w:right w:type="dxa" w:w="90"/>
+            </w:tcMar>
+          </w:tcPr>
+          <w:p>
+            <w:pPr>
+              <w:spacing w:after="0" w:before="0"/>
+            </w:pPr>
+            <w:r>
+              <w:rPr>
+                <w:rFonts w:ascii="Arial" w:cs="Arial" w:eastAsia="Arial" w:hAnsi="Arial"/>
+                <w:color w:val="15202B"/>
+                <w:sz w:val="18"/>
+                <w:szCs w:val="18"/>
+              </w:rPr>
+              <w:t xml:space="preserve"/>
+            </w:r>
+          </w:p>
+        </w:tc>
+      </w:tr>
+      <w:tr>
+        <w:trPr>
+          <w:cantSplit/>
+        </w:trPr>
+        <w:tc>
+          <w:tcPr>
+            <w:tcW w:type="dxa" w:w="640"/>
+            <w:tcBorders>
+              <w:top w:val="single" w:color="B9D7F2" w:sz="4"/>
+              <w:left w:val="single" w:color="B9D7F2" w:sz="4"/>
+              <w:bottom w:val="single" w:color="B9D7F2" w:sz="4"/>
+              <w:right w:val="single" w:color="B9D7F2" w:sz="4"/>
+            </w:tcBorders>
+            <w:shd w:fill="EAF4FD" w:color="auto" w:val="clear"/>
+            <w:tcMar>
+              <w:top w:type="dxa" w:w="60"/>
+              <w:left w:type="dxa" w:w="90"/>
+              <w:bottom w:type="dxa" w:w="60"/>
+              <w:right w:type="dxa" w:w="90"/>
+            </w:tcMar>
+          </w:tcPr>
+          <w:p>
+            <w:pPr>
+              <w:spacing w:after="0" w:before="0"/>
+            </w:pPr>
+            <w:r>
+              <w:rPr>
+                <w:rFonts w:ascii="Arial" w:cs="Arial" w:eastAsia="Arial" w:hAnsi="Arial"/>
+                <w:color w:val="15202B"/>
+                <w:sz w:val="18"/>
+                <w:szCs w:val="18"/>
+              </w:rPr>
+              <w:t xml:space="preserve">34.4</w:t>
+            </w:r>
+          </w:p>
+        </w:tc>
+        <w:tc>
+          <w:tcPr>
+            <w:tcW w:type="dxa" w:w="3820"/>
+            <w:tcBorders>
+              <w:top w:val="single" w:color="B9D7F2" w:sz="4"/>
+              <w:left w:val="single" w:color="B9D7F2" w:sz="4"/>
+              <w:bottom w:val="single" w:color="B9D7F2" w:sz="4"/>
+              <w:right w:val="single" w:color="B9D7F2" w:sz="4"/>
+            </w:tcBorders>
+            <w:shd w:fill="EAF4FD" w:color="auto" w:val="clear"/>
+            <w:tcMar>
+              <w:top w:type="dxa" w:w="60"/>
+              <w:left w:type="dxa" w:w="90"/>
+              <w:bottom w:type="dxa" w:w="60"/>
+              <w:right w:type="dxa" w:w="90"/>
+            </w:tcMar>
+          </w:tcPr>
+          <w:p>
+            <w:pPr>
+              <w:spacing w:after="0" w:before="0"/>
+            </w:pPr>
+            <w:r>
+              <w:rPr>
+                <w:rFonts w:ascii="Arial" w:cs="Arial" w:eastAsia="Arial" w:hAnsi="Arial"/>
+                <w:color w:val="15202B"/>
+                <w:sz w:val="18"/>
+                <w:szCs w:val="18"/>
+              </w:rPr>
+              <w:t xml:space="preserve">Owner: Orders &gt; Live Map.</w:t>
+            </w:r>
+          </w:p>
+        </w:tc>
+        <w:tc>
+          <w:tcPr>
+            <w:tcW w:type="dxa" w:w="3900"/>
+            <w:tcBorders>
+              <w:top w:val="single" w:color="B9D7F2" w:sz="4"/>
+              <w:left w:val="single" w:color="B9D7F2" w:sz="4"/>
+              <w:bottom w:val="single" w:color="B9D7F2" w:sz="4"/>
+              <w:right w:val="single" w:color="B9D7F2" w:sz="4"/>
+            </w:tcBorders>
+            <w:shd w:fill="EAF4FD" w:color="auto" w:val="clear"/>
+            <w:tcMar>
+              <w:top w:type="dxa" w:w="60"/>
+              <w:left w:type="dxa" w:w="90"/>
+              <w:bottom w:type="dxa" w:w="60"/>
+              <w:right w:type="dxa" w:w="90"/>
+            </w:tcMar>
+          </w:tcPr>
+          <w:p>
+            <w:pPr>
+              <w:spacing w:after="0" w:before="0"/>
+            </w:pPr>
+            <w:r>
+              <w:rPr>
+                <w:rFonts w:ascii="Arial" w:cs="Arial" w:eastAsia="Arial" w:hAnsi="Arial"/>
+                <w:color w:val="15202B"/>
+                <w:sz w:val="18"/>
+                <w:szCs w:val="18"/>
+              </w:rPr>
+              <w:t xml:space="preserve">Map with the station, a blue rider marker (first letter of the name) and numbered pins for the orders on the road.</w:t>
+            </w:r>
+          </w:p>
+        </w:tc>
+        <w:tc>
+          <w:tcPr>
+            <w:tcW w:type="dxa" w:w="900"/>
+            <w:tcBorders>
+              <w:top w:val="single" w:color="B9D7F2" w:sz="4"/>
+              <w:left w:val="single" w:color="B9D7F2" w:sz="4"/>
+              <w:bottom w:val="single" w:color="B9D7F2" w:sz="4"/>
+              <w:right w:val="single" w:color="B9D7F2" w:sz="4"/>
+            </w:tcBorders>
+            <w:shd w:fill="EAF4FD" w:color="auto" w:val="clear"/>
+            <w:tcMar>
+              <w:top w:type="dxa" w:w="60"/>
+              <w:left w:type="dxa" w:w="90"/>
+              <w:bottom w:type="dxa" w:w="60"/>
+              <w:right w:type="dxa" w:w="90"/>
+            </w:tcMar>
+          </w:tcPr>
+          <w:p>
+            <w:pPr>
+              <w:spacing w:after="0" w:before="0"/>
+            </w:pPr>
+            <w:r>
+              <w:rPr>
+                <w:rFonts w:ascii="Arial" w:cs="Arial" w:eastAsia="Arial" w:hAnsi="Arial"/>
+                <w:color w:val="15202B"/>
+                <w:sz w:val="18"/>
+                <w:szCs w:val="18"/>
+              </w:rPr>
+              <w:t xml:space="preserve">☐ Pass</w:t>
+            </w:r>
+          </w:p>
+          <w:p>
+            <w:pPr>
+              <w:spacing w:after="0" w:before="0"/>
+            </w:pPr>
+            <w:r>
+              <w:rPr>
+                <w:rFonts w:ascii="Arial" w:cs="Arial" w:eastAsia="Arial" w:hAnsi="Arial"/>
+                <w:color w:val="15202B"/>
+                <w:sz w:val="18"/>
+                <w:szCs w:val="18"/>
+              </w:rPr>
+              <w:t xml:space="preserve">☐ Fail</w:t>
+            </w:r>
+          </w:p>
+        </w:tc>
+        <w:tc>
+          <w:tcPr>
+            <w:tcW w:type="dxa" w:w="1206"/>
+            <w:tcBorders>
+              <w:top w:val="single" w:color="B9D7F2" w:sz="4"/>
+              <w:left w:val="single" w:color="B9D7F2" w:sz="4"/>
+              <w:bottom w:val="single" w:color="B9D7F2" w:sz="4"/>
+              <w:right w:val="single" w:color="B9D7F2" w:sz="4"/>
+            </w:tcBorders>
+            <w:shd w:fill="EAF4FD" w:color="auto" w:val="clear"/>
+            <w:tcMar>
+              <w:top w:type="dxa" w:w="60"/>
+              <w:left w:type="dxa" w:w="90"/>
+              <w:bottom w:type="dxa" w:w="60"/>
+              <w:right w:type="dxa" w:w="90"/>
+            </w:tcMar>
+          </w:tcPr>
+          <w:p>
+            <w:pPr>
+              <w:spacing w:after="0" w:before="0"/>
+            </w:pPr>
+            <w:r>
+              <w:rPr>
+                <w:rFonts w:ascii="Arial" w:cs="Arial" w:eastAsia="Arial" w:hAnsi="Arial"/>
+                <w:color w:val="15202B"/>
+                <w:sz w:val="18"/>
+                <w:szCs w:val="18"/>
+              </w:rPr>
+              <w:t xml:space="preserve"/>
+            </w:r>
+          </w:p>
+        </w:tc>
+      </w:tr>
+      <w:tr>
+        <w:trPr>
+          <w:cantSplit/>
+        </w:trPr>
+        <w:tc>
+          <w:tcPr>
+            <w:tcW w:type="dxa" w:w="640"/>
+            <w:tcBorders>
+              <w:top w:val="single" w:color="B9D7F2" w:sz="4"/>
+              <w:left w:val="single" w:color="B9D7F2" w:sz="4"/>
+              <w:bottom w:val="single" w:color="B9D7F2" w:sz="4"/>
+              <w:right w:val="single" w:color="B9D7F2" w:sz="4"/>
+            </w:tcBorders>
+            <w:tcMar>
+              <w:top w:type="dxa" w:w="60"/>
+              <w:left w:type="dxa" w:w="90"/>
+              <w:bottom w:type="dxa" w:w="60"/>
+              <w:right w:type="dxa" w:w="90"/>
+            </w:tcMar>
+          </w:tcPr>
+          <w:p>
+            <w:pPr>
+              <w:spacing w:after="0" w:before="0"/>
+            </w:pPr>
+            <w:r>
+              <w:rPr>
+                <w:rFonts w:ascii="Arial" w:cs="Arial" w:eastAsia="Arial" w:hAnsi="Arial"/>
+                <w:color w:val="15202B"/>
+                <w:sz w:val="18"/>
+                <w:szCs w:val="18"/>
+              </w:rPr>
+              <w:t xml:space="preserve">34.5</w:t>
+            </w:r>
+          </w:p>
+        </w:tc>
+        <w:tc>
+          <w:tcPr>
+            <w:tcW w:type="dxa" w:w="3820"/>
+            <w:tcBorders>
+              <w:top w:val="single" w:color="B9D7F2" w:sz="4"/>
+              <w:left w:val="single" w:color="B9D7F2" w:sz="4"/>
+              <w:bottom w:val="single" w:color="B9D7F2" w:sz="4"/>
+              <w:right w:val="single" w:color="B9D7F2" w:sz="4"/>
+            </w:tcBorders>
+            <w:tcMar>
+              <w:top w:type="dxa" w:w="60"/>
+              <w:left w:type="dxa" w:w="90"/>
+              <w:bottom w:type="dxa" w:w="60"/>
+              <w:right w:type="dxa" w:w="90"/>
+            </w:tcMar>
+          </w:tcPr>
+          <w:p>
+            <w:pPr>
+              <w:spacing w:after="0" w:before="0"/>
+            </w:pPr>
+            <w:r>
+              <w:rPr>
+                <w:rFonts w:ascii="Arial" w:cs="Arial" w:eastAsia="Arial" w:hAnsi="Arial"/>
+                <w:color w:val="15202B"/>
+                <w:sz w:val="18"/>
+                <w:szCs w:val="18"/>
+              </w:rPr>
+              <w:t xml:space="preserve">Tap the rider marker.</w:t>
+            </w:r>
+          </w:p>
+        </w:tc>
+        <w:tc>
+          <w:tcPr>
+            <w:tcW w:type="dxa" w:w="3900"/>
+            <w:tcBorders>
+              <w:top w:val="single" w:color="B9D7F2" w:sz="4"/>
+              <w:left w:val="single" w:color="B9D7F2" w:sz="4"/>
+              <w:bottom w:val="single" w:color="B9D7F2" w:sz="4"/>
+              <w:right w:val="single" w:color="B9D7F2" w:sz="4"/>
+            </w:tcBorders>
+            <w:tcMar>
+              <w:top w:type="dxa" w:w="60"/>
+              <w:left w:type="dxa" w:w="90"/>
+              <w:bottom w:type="dxa" w:w="60"/>
+              <w:right w:type="dxa" w:w="90"/>
+            </w:tcMar>
+          </w:tcPr>
+          <w:p>
+            <w:pPr>
+              <w:spacing w:after="0" w:before="0"/>
+            </w:pPr>
+            <w:r>
+              <w:rPr>
+                <w:rFonts w:ascii="Arial" w:cs="Arial" w:eastAsia="Arial" w:hAnsi="Arial"/>
+                <w:color w:val="15202B"/>
+                <w:sz w:val="18"/>
+                <w:szCs w:val="18"/>
+              </w:rPr>
+              <w:t xml:space="preserve">Rider card: name, "n orders on board · Updated just now", Call, and the orders; tapping an order opens its Order Details.</w:t>
+            </w:r>
+          </w:p>
+        </w:tc>
+        <w:tc>
+          <w:tcPr>
+            <w:tcW w:type="dxa" w:w="900"/>
+            <w:tcBorders>
+              <w:top w:val="single" w:color="B9D7F2" w:sz="4"/>
+              <w:left w:val="single" w:color="B9D7F2" w:sz="4"/>
+              <w:bottom w:val="single" w:color="B9D7F2" w:sz="4"/>
+              <w:right w:val="single" w:color="B9D7F2" w:sz="4"/>
+            </w:tcBorders>
+            <w:tcMar>
+              <w:top w:type="dxa" w:w="60"/>
+              <w:left w:type="dxa" w:w="90"/>
+              <w:bottom w:type="dxa" w:w="60"/>
+              <w:right w:type="dxa" w:w="90"/>
+            </w:tcMar>
+          </w:tcPr>
+          <w:p>
+            <w:pPr>
+              <w:spacing w:after="0" w:before="0"/>
+            </w:pPr>
+            <w:r>
+              <w:rPr>
+                <w:rFonts w:ascii="Arial" w:cs="Arial" w:eastAsia="Arial" w:hAnsi="Arial"/>
+                <w:color w:val="15202B"/>
+                <w:sz w:val="18"/>
+                <w:szCs w:val="18"/>
+              </w:rPr>
+              <w:t xml:space="preserve">☐ Pass</w:t>
+            </w:r>
+          </w:p>
+          <w:p>
+            <w:pPr>
+              <w:spacing w:after="0" w:before="0"/>
+            </w:pPr>
+            <w:r>
+              <w:rPr>
+                <w:rFonts w:ascii="Arial" w:cs="Arial" w:eastAsia="Arial" w:hAnsi="Arial"/>
+                <w:color w:val="15202B"/>
+                <w:sz w:val="18"/>
+                <w:szCs w:val="18"/>
+              </w:rPr>
+              <w:t xml:space="preserve">☐ Fail</w:t>
+            </w:r>
+          </w:p>
+        </w:tc>
+        <w:tc>
+          <w:tcPr>
+            <w:tcW w:type="dxa" w:w="1206"/>
+            <w:tcBorders>
+              <w:top w:val="single" w:color="B9D7F2" w:sz="4"/>
+              <w:left w:val="single" w:color="B9D7F2" w:sz="4"/>
+              <w:bottom w:val="single" w:color="B9D7F2" w:sz="4"/>
+              <w:right w:val="single" w:color="B9D7F2" w:sz="4"/>
+            </w:tcBorders>
+            <w:tcMar>
+              <w:top w:type="dxa" w:w="60"/>
+              <w:left w:type="dxa" w:w="90"/>
+              <w:bottom w:type="dxa" w:w="60"/>
+              <w:right w:type="dxa" w:w="90"/>
+            </w:tcMar>
+          </w:tcPr>
+          <w:p>
+            <w:pPr>
+              <w:spacing w:after="0" w:before="0"/>
+            </w:pPr>
+            <w:r>
+              <w:rPr>
+                <w:rFonts w:ascii="Arial" w:cs="Arial" w:eastAsia="Arial" w:hAnsi="Arial"/>
+                <w:color w:val="15202B"/>
+                <w:sz w:val="18"/>
+                <w:szCs w:val="18"/>
+              </w:rPr>
+              <w:t xml:space="preserve"/>
+            </w:r>
+          </w:p>
+        </w:tc>
+      </w:tr>
+      <w:tr>
+        <w:trPr>
+          <w:cantSplit/>
+        </w:trPr>
+        <w:tc>
+          <w:tcPr>
+            <w:tcW w:type="dxa" w:w="640"/>
+            <w:tcBorders>
+              <w:top w:val="single" w:color="B9D7F2" w:sz="4"/>
+              <w:left w:val="single" w:color="B9D7F2" w:sz="4"/>
+              <w:bottom w:val="single" w:color="B9D7F2" w:sz="4"/>
+              <w:right w:val="single" w:color="B9D7F2" w:sz="4"/>
+            </w:tcBorders>
+            <w:shd w:fill="EAF4FD" w:color="auto" w:val="clear"/>
+            <w:tcMar>
+              <w:top w:type="dxa" w:w="60"/>
+              <w:left w:type="dxa" w:w="90"/>
+              <w:bottom w:type="dxa" w:w="60"/>
+              <w:right w:type="dxa" w:w="90"/>
+            </w:tcMar>
+          </w:tcPr>
+          <w:p>
+            <w:pPr>
+              <w:spacing w:after="0" w:before="0"/>
+            </w:pPr>
+            <w:r>
+              <w:rPr>
+                <w:rFonts w:ascii="Arial" w:cs="Arial" w:eastAsia="Arial" w:hAnsi="Arial"/>
+                <w:color w:val="15202B"/>
+                <w:sz w:val="18"/>
+                <w:szCs w:val="18"/>
+              </w:rPr>
+              <w:t xml:space="preserve">34.6</w:t>
+            </w:r>
+          </w:p>
+        </w:tc>
+        <w:tc>
+          <w:tcPr>
+            <w:tcW w:type="dxa" w:w="3820"/>
+            <w:tcBorders>
+              <w:top w:val="single" w:color="B9D7F2" w:sz="4"/>
+              <w:left w:val="single" w:color="B9D7F2" w:sz="4"/>
+              <w:bottom w:val="single" w:color="B9D7F2" w:sz="4"/>
+              <w:right w:val="single" w:color="B9D7F2" w:sz="4"/>
+            </w:tcBorders>
+            <w:shd w:fill="EAF4FD" w:color="auto" w:val="clear"/>
+            <w:tcMar>
+              <w:top w:type="dxa" w:w="60"/>
+              <w:left w:type="dxa" w:w="90"/>
+              <w:bottom w:type="dxa" w:w="60"/>
+              <w:right w:type="dxa" w:w="90"/>
+            </w:tcMar>
+          </w:tcPr>
+          <w:p>
+            <w:pPr>
+              <w:spacing w:after="0" w:before="0"/>
+            </w:pPr>
+            <w:r>
+              <w:rPr>
+                <w:rFonts w:ascii="Arial" w:cs="Arial" w:eastAsia="Arial" w:hAnsi="Arial"/>
+                <w:color w:val="15202B"/>
+                <w:sz w:val="18"/>
+                <w:szCs w:val="18"/>
+              </w:rPr>
+              <w:t xml:space="preserve">Tap an order pin.</w:t>
+            </w:r>
+          </w:p>
+        </w:tc>
+        <w:tc>
+          <w:tcPr>
+            <w:tcW w:type="dxa" w:w="3900"/>
+            <w:tcBorders>
+              <w:top w:val="single" w:color="B9D7F2" w:sz="4"/>
+              <w:left w:val="single" w:color="B9D7F2" w:sz="4"/>
+              <w:bottom w:val="single" w:color="B9D7F2" w:sz="4"/>
+              <w:right w:val="single" w:color="B9D7F2" w:sz="4"/>
+            </w:tcBorders>
+            <w:shd w:fill="EAF4FD" w:color="auto" w:val="clear"/>
+            <w:tcMar>
+              <w:top w:type="dxa" w:w="60"/>
+              <w:left w:type="dxa" w:w="90"/>
+              <w:bottom w:type="dxa" w:w="60"/>
+              <w:right w:type="dxa" w:w="90"/>
+            </w:tcMar>
+          </w:tcPr>
+          <w:p>
+            <w:pPr>
+              <w:spacing w:after="0" w:before="0"/>
+            </w:pPr>
+            <w:r>
+              <w:rPr>
+                <w:rFonts w:ascii="Arial" w:cs="Arial" w:eastAsia="Arial" w:hAnsi="Arial"/>
+                <w:color w:val="15202B"/>
+                <w:sz w:val="18"/>
+                <w:szCs w:val="18"/>
+              </w:rPr>
+              <w:t xml:space="preserve">Card at the bottom: customer, "3 gallons · Out for delivery", address; tap it for Order Details.</w:t>
+            </w:r>
+          </w:p>
+        </w:tc>
+        <w:tc>
+          <w:tcPr>
+            <w:tcW w:type="dxa" w:w="900"/>
+            <w:tcBorders>
+              <w:top w:val="single" w:color="B9D7F2" w:sz="4"/>
+              <w:left w:val="single" w:color="B9D7F2" w:sz="4"/>
+              <w:bottom w:val="single" w:color="B9D7F2" w:sz="4"/>
+              <w:right w:val="single" w:color="B9D7F2" w:sz="4"/>
+            </w:tcBorders>
+            <w:shd w:fill="EAF4FD" w:color="auto" w:val="clear"/>
+            <w:tcMar>
+              <w:top w:type="dxa" w:w="60"/>
+              <w:left w:type="dxa" w:w="90"/>
+              <w:bottom w:type="dxa" w:w="60"/>
+              <w:right w:type="dxa" w:w="90"/>
+            </w:tcMar>
+          </w:tcPr>
+          <w:p>
+            <w:pPr>
+              <w:spacing w:after="0" w:before="0"/>
+            </w:pPr>
+            <w:r>
+              <w:rPr>
+                <w:rFonts w:ascii="Arial" w:cs="Arial" w:eastAsia="Arial" w:hAnsi="Arial"/>
+                <w:color w:val="15202B"/>
+                <w:sz w:val="18"/>
+                <w:szCs w:val="18"/>
+              </w:rPr>
+              <w:t xml:space="preserve">☐ Pass</w:t>
+            </w:r>
+          </w:p>
+          <w:p>
+            <w:pPr>
+              <w:spacing w:after="0" w:before="0"/>
+            </w:pPr>
+            <w:r>
+              <w:rPr>
+                <w:rFonts w:ascii="Arial" w:cs="Arial" w:eastAsia="Arial" w:hAnsi="Arial"/>
+                <w:color w:val="15202B"/>
+                <w:sz w:val="18"/>
+                <w:szCs w:val="18"/>
+              </w:rPr>
+              <w:t xml:space="preserve">☐ Fail</w:t>
+            </w:r>
+          </w:p>
+        </w:tc>
+        <w:tc>
+          <w:tcPr>
+            <w:tcW w:type="dxa" w:w="1206"/>
+            <w:tcBorders>
+              <w:top w:val="single" w:color="B9D7F2" w:sz="4"/>
+              <w:left w:val="single" w:color="B9D7F2" w:sz="4"/>
+              <w:bottom w:val="single" w:color="B9D7F2" w:sz="4"/>
+              <w:right w:val="single" w:color="B9D7F2" w:sz="4"/>
+            </w:tcBorders>
+            <w:shd w:fill="EAF4FD" w:color="auto" w:val="clear"/>
+            <w:tcMar>
+              <w:top w:type="dxa" w:w="60"/>
+              <w:left w:type="dxa" w:w="90"/>
+              <w:bottom w:type="dxa" w:w="60"/>
+              <w:right w:type="dxa" w:w="90"/>
+            </w:tcMar>
+          </w:tcPr>
+          <w:p>
+            <w:pPr>
+              <w:spacing w:after="0" w:before="0"/>
+            </w:pPr>
+            <w:r>
+              <w:rPr>
+                <w:rFonts w:ascii="Arial" w:cs="Arial" w:eastAsia="Arial" w:hAnsi="Arial"/>
+                <w:color w:val="15202B"/>
+                <w:sz w:val="18"/>
+                <w:szCs w:val="18"/>
+              </w:rPr>
+              <w:t xml:space="preserve"/>
+            </w:r>
+          </w:p>
+        </w:tc>
+      </w:tr>
+      <w:tr>
+        <w:trPr>
+          <w:cantSplit/>
+        </w:trPr>
+        <w:tc>
+          <w:tcPr>
+            <w:tcW w:type="dxa" w:w="640"/>
+            <w:tcBorders>
+              <w:top w:val="single" w:color="B9D7F2" w:sz="4"/>
+              <w:left w:val="single" w:color="B9D7F2" w:sz="4"/>
+              <w:bottom w:val="single" w:color="B9D7F2" w:sz="4"/>
+              <w:right w:val="single" w:color="B9D7F2" w:sz="4"/>
+            </w:tcBorders>
+            <w:tcMar>
+              <w:top w:type="dxa" w:w="60"/>
+              <w:left w:type="dxa" w:w="90"/>
+              <w:bottom w:type="dxa" w:w="60"/>
+              <w:right w:type="dxa" w:w="90"/>
+            </w:tcMar>
+          </w:tcPr>
+          <w:p>
+            <w:pPr>
+              <w:spacing w:after="0" w:before="0"/>
+            </w:pPr>
+            <w:r>
+              <w:rPr>
+                <w:rFonts w:ascii="Arial" w:cs="Arial" w:eastAsia="Arial" w:hAnsi="Arial"/>
+                <w:color w:val="15202B"/>
+                <w:sz w:val="18"/>
+                <w:szCs w:val="18"/>
+              </w:rPr>
+              <w:t xml:space="preserve">34.7</w:t>
+            </w:r>
+          </w:p>
+        </w:tc>
+        <w:tc>
+          <w:tcPr>
+            <w:tcW w:type="dxa" w:w="3820"/>
+            <w:tcBorders>
+              <w:top w:val="single" w:color="B9D7F2" w:sz="4"/>
+              <w:left w:val="single" w:color="B9D7F2" w:sz="4"/>
+              <w:bottom w:val="single" w:color="B9D7F2" w:sz="4"/>
+              <w:right w:val="single" w:color="B9D7F2" w:sz="4"/>
+            </w:tcBorders>
+            <w:tcMar>
+              <w:top w:type="dxa" w:w="60"/>
+              <w:left w:type="dxa" w:w="90"/>
+              <w:bottom w:type="dxa" w:w="60"/>
+              <w:right w:type="dxa" w:w="90"/>
+            </w:tcMar>
+          </w:tcPr>
+          <w:p>
+            <w:pPr>
+              <w:spacing w:after="0" w:before="0"/>
+            </w:pPr>
+            <w:r>
+              <w:rPr>
+                <w:rFonts w:ascii="Arial" w:cs="Arial" w:eastAsia="Arial" w:hAnsi="Arial"/>
+                <w:color w:val="15202B"/>
+                <w:sz w:val="18"/>
+                <w:szCs w:val="18"/>
+              </w:rPr>
+              <w:t xml:space="preserve">Staff: Live Map tab.</w:t>
+            </w:r>
+          </w:p>
+        </w:tc>
+        <w:tc>
+          <w:tcPr>
+            <w:tcW w:type="dxa" w:w="3900"/>
+            <w:tcBorders>
+              <w:top w:val="single" w:color="B9D7F2" w:sz="4"/>
+              <w:left w:val="single" w:color="B9D7F2" w:sz="4"/>
+              <w:bottom w:val="single" w:color="B9D7F2" w:sz="4"/>
+              <w:right w:val="single" w:color="B9D7F2" w:sz="4"/>
+            </w:tcBorders>
+            <w:tcMar>
+              <w:top w:type="dxa" w:w="60"/>
+              <w:left w:type="dxa" w:w="90"/>
+              <w:bottom w:type="dxa" w:w="60"/>
+              <w:right w:type="dxa" w:w="90"/>
+            </w:tcMar>
+          </w:tcPr>
+          <w:p>
+            <w:pPr>
+              <w:spacing w:after="0" w:before="0"/>
+            </w:pPr>
+            <w:r>
+              <w:rPr>
+                <w:rFonts w:ascii="Arial" w:cs="Arial" w:eastAsia="Arial" w:hAnsi="Arial"/>
+                <w:color w:val="15202B"/>
+                <w:sz w:val="18"/>
+                <w:szCs w:val="18"/>
+              </w:rPr>
+              <w:t xml:space="preserve">Same map; Order Details from here are view only.</w:t>
+            </w:r>
+          </w:p>
+        </w:tc>
+        <w:tc>
+          <w:tcPr>
+            <w:tcW w:type="dxa" w:w="900"/>
+            <w:tcBorders>
+              <w:top w:val="single" w:color="B9D7F2" w:sz="4"/>
+              <w:left w:val="single" w:color="B9D7F2" w:sz="4"/>
+              <w:bottom w:val="single" w:color="B9D7F2" w:sz="4"/>
+              <w:right w:val="single" w:color="B9D7F2" w:sz="4"/>
+            </w:tcBorders>
+            <w:tcMar>
+              <w:top w:type="dxa" w:w="60"/>
+              <w:left w:type="dxa" w:w="90"/>
+              <w:bottom w:type="dxa" w:w="60"/>
+              <w:right w:type="dxa" w:w="90"/>
+            </w:tcMar>
+          </w:tcPr>
+          <w:p>
+            <w:pPr>
+              <w:spacing w:after="0" w:before="0"/>
+            </w:pPr>
+            <w:r>
+              <w:rPr>
+                <w:rFonts w:ascii="Arial" w:cs="Arial" w:eastAsia="Arial" w:hAnsi="Arial"/>
+                <w:color w:val="15202B"/>
+                <w:sz w:val="18"/>
+                <w:szCs w:val="18"/>
+              </w:rPr>
+              <w:t xml:space="preserve">☐ Pass</w:t>
+            </w:r>
+          </w:p>
+          <w:p>
+            <w:pPr>
+              <w:spacing w:after="0" w:before="0"/>
+            </w:pPr>
+            <w:r>
+              <w:rPr>
+                <w:rFonts w:ascii="Arial" w:cs="Arial" w:eastAsia="Arial" w:hAnsi="Arial"/>
+                <w:color w:val="15202B"/>
+                <w:sz w:val="18"/>
+                <w:szCs w:val="18"/>
+              </w:rPr>
+              <w:t xml:space="preserve">☐ Fail</w:t>
+            </w:r>
+          </w:p>
+        </w:tc>
+        <w:tc>
+          <w:tcPr>
+            <w:tcW w:type="dxa" w:w="1206"/>
+            <w:tcBorders>
+              <w:top w:val="single" w:color="B9D7F2" w:sz="4"/>
+              <w:left w:val="single" w:color="B9D7F2" w:sz="4"/>
+              <w:bottom w:val="single" w:color="B9D7F2" w:sz="4"/>
+              <w:right w:val="single" w:color="B9D7F2" w:sz="4"/>
+            </w:tcBorders>
+            <w:tcMar>
+              <w:top w:type="dxa" w:w="60"/>
+              <w:left w:type="dxa" w:w="90"/>
+              <w:bottom w:type="dxa" w:w="60"/>
+              <w:right w:type="dxa" w:w="90"/>
+            </w:tcMar>
+          </w:tcPr>
+          <w:p>
+            <w:pPr>
+              <w:spacing w:after="0" w:before="0"/>
+            </w:pPr>
+            <w:r>
+              <w:rPr>
+                <w:rFonts w:ascii="Arial" w:cs="Arial" w:eastAsia="Arial" w:hAnsi="Arial"/>
+                <w:color w:val="15202B"/>
+                <w:sz w:val="18"/>
+                <w:szCs w:val="18"/>
+              </w:rPr>
+              <w:t xml:space="preserve"/>
+            </w:r>
+          </w:p>
+        </w:tc>
+      </w:tr>
+      <w:tr>
+        <w:trPr>
+          <w:cantSplit/>
+        </w:trPr>
+        <w:tc>
+          <w:tcPr>
+            <w:tcW w:type="dxa" w:w="640"/>
+            <w:tcBorders>
+              <w:top w:val="single" w:color="B9D7F2" w:sz="4"/>
+              <w:left w:val="single" w:color="B9D7F2" w:sz="4"/>
+              <w:bottom w:val="single" w:color="B9D7F2" w:sz="4"/>
+              <w:right w:val="single" w:color="B9D7F2" w:sz="4"/>
+            </w:tcBorders>
+            <w:shd w:fill="EAF4FD" w:color="auto" w:val="clear"/>
+            <w:tcMar>
+              <w:top w:type="dxa" w:w="60"/>
+              <w:left w:type="dxa" w:w="90"/>
+              <w:bottom w:type="dxa" w:w="60"/>
+              <w:right w:type="dxa" w:w="90"/>
+            </w:tcMar>
+          </w:tcPr>
+          <w:p>
+            <w:pPr>
+              <w:spacing w:after="0" w:before="0"/>
+            </w:pPr>
+            <w:r>
+              <w:rPr>
+                <w:rFonts w:ascii="Arial" w:cs="Arial" w:eastAsia="Arial" w:hAnsi="Arial"/>
+                <w:color w:val="15202B"/>
+                <w:sz w:val="18"/>
+                <w:szCs w:val="18"/>
+              </w:rPr>
+              <w:t xml:space="preserve">34.8</w:t>
+            </w:r>
+          </w:p>
+        </w:tc>
+        <w:tc>
+          <w:tcPr>
+            <w:tcW w:type="dxa" w:w="3820"/>
+            <w:tcBorders>
+              <w:top w:val="single" w:color="B9D7F2" w:sz="4"/>
+              <w:left w:val="single" w:color="B9D7F2" w:sz="4"/>
+              <w:bottom w:val="single" w:color="B9D7F2" w:sz="4"/>
+              <w:right w:val="single" w:color="B9D7F2" w:sz="4"/>
+            </w:tcBorders>
+            <w:shd w:fill="EAF4FD" w:color="auto" w:val="clear"/>
+            <w:tcMar>
+              <w:top w:type="dxa" w:w="60"/>
+              <w:left w:type="dxa" w:w="90"/>
+              <w:bottom w:type="dxa" w:w="60"/>
+              <w:right w:type="dxa" w:w="90"/>
+            </w:tcMar>
+          </w:tcPr>
+          <w:p>
+            <w:pPr>
+              <w:spacing w:after="0" w:before="0"/>
+            </w:pPr>
+            <w:r>
+              <w:rPr>
+                <w:rFonts w:ascii="Arial" w:cs="Arial" w:eastAsia="Arial" w:hAnsi="Arial"/>
+                <w:color w:val="15202B"/>
+                <w:sz w:val="18"/>
+                <w:szCs w:val="18"/>
+              </w:rPr>
+              <w:t xml:space="preserve">Customer: open the order that is out.</w:t>
+            </w:r>
+          </w:p>
+        </w:tc>
+        <w:tc>
+          <w:tcPr>
+            <w:tcW w:type="dxa" w:w="3900"/>
+            <w:tcBorders>
+              <w:top w:val="single" w:color="B9D7F2" w:sz="4"/>
+              <w:left w:val="single" w:color="B9D7F2" w:sz="4"/>
+              <w:bottom w:val="single" w:color="B9D7F2" w:sz="4"/>
+              <w:right w:val="single" w:color="B9D7F2" w:sz="4"/>
+            </w:tcBorders>
+            <w:shd w:fill="EAF4FD" w:color="auto" w:val="clear"/>
+            <w:tcMar>
+              <w:top w:type="dxa" w:w="60"/>
+              <w:left w:type="dxa" w:w="90"/>
+              <w:bottom w:type="dxa" w:w="60"/>
+              <w:right w:type="dxa" w:w="90"/>
+            </w:tcMar>
+          </w:tcPr>
+          <w:p>
+            <w:pPr>
+              <w:spacing w:after="0" w:before="0"/>
+            </w:pPr>
+            <w:r>
+              <w:rPr>
+                <w:rFonts w:ascii="Arial" w:cs="Arial" w:eastAsia="Arial" w:hAnsi="Arial"/>
+                <w:color w:val="15202B"/>
+                <w:sz w:val="18"/>
+                <w:szCs w:val="18"/>
+              </w:rPr>
+              <w:t xml:space="preserve">Map with the delivery pin and the rider's blue dot ("Waiting for the rider's location..." until the rider sends one).</w:t>
+            </w:r>
+          </w:p>
+        </w:tc>
+        <w:tc>
+          <w:tcPr>
+            <w:tcW w:type="dxa" w:w="900"/>
+            <w:tcBorders>
+              <w:top w:val="single" w:color="B9D7F2" w:sz="4"/>
+              <w:left w:val="single" w:color="B9D7F2" w:sz="4"/>
+              <w:bottom w:val="single" w:color="B9D7F2" w:sz="4"/>
+              <w:right w:val="single" w:color="B9D7F2" w:sz="4"/>
+            </w:tcBorders>
+            <w:shd w:fill="EAF4FD" w:color="auto" w:val="clear"/>
+            <w:tcMar>
+              <w:top w:type="dxa" w:w="60"/>
+              <w:left w:type="dxa" w:w="90"/>
+              <w:bottom w:type="dxa" w:w="60"/>
+              <w:right w:type="dxa" w:w="90"/>
+            </w:tcMar>
+          </w:tcPr>
+          <w:p>
+            <w:pPr>
+              <w:spacing w:after="0" w:before="0"/>
+            </w:pPr>
+            <w:r>
+              <w:rPr>
+                <w:rFonts w:ascii="Arial" w:cs="Arial" w:eastAsia="Arial" w:hAnsi="Arial"/>
+                <w:color w:val="15202B"/>
+                <w:sz w:val="18"/>
+                <w:szCs w:val="18"/>
+              </w:rPr>
+              <w:t xml:space="preserve">☐ Pass</w:t>
+            </w:r>
+          </w:p>
+          <w:p>
+            <w:pPr>
+              <w:spacing w:after="0" w:before="0"/>
+            </w:pPr>
+            <w:r>
+              <w:rPr>
+                <w:rFonts w:ascii="Arial" w:cs="Arial" w:eastAsia="Arial" w:hAnsi="Arial"/>
+                <w:color w:val="15202B"/>
+                <w:sz w:val="18"/>
+                <w:szCs w:val="18"/>
+              </w:rPr>
+              <w:t xml:space="preserve">☐ Fail</w:t>
+            </w:r>
+          </w:p>
+        </w:tc>
+        <w:tc>
+          <w:tcPr>
+            <w:tcW w:type="dxa" w:w="1206"/>
+            <w:tcBorders>
+              <w:top w:val="single" w:color="B9D7F2" w:sz="4"/>
+              <w:left w:val="single" w:color="B9D7F2" w:sz="4"/>
+              <w:bottom w:val="single" w:color="B9D7F2" w:sz="4"/>
+              <w:right w:val="single" w:color="B9D7F2" w:sz="4"/>
+            </w:tcBorders>
+            <w:shd w:fill="EAF4FD" w:color="auto" w:val="clear"/>
+            <w:tcMar>
+              <w:top w:type="dxa" w:w="60"/>
+              <w:left w:type="dxa" w:w="90"/>
+              <w:bottom w:type="dxa" w:w="60"/>
+              <w:right w:type="dxa" w:w="90"/>
+            </w:tcMar>
+          </w:tcPr>
+          <w:p>
+            <w:pPr>
+              <w:spacing w:after="0" w:before="0"/>
+            </w:pPr>
+            <w:r>
+              <w:rPr>
+                <w:rFonts w:ascii="Arial" w:cs="Arial" w:eastAsia="Arial" w:hAnsi="Arial"/>
+                <w:color w:val="15202B"/>
+                <w:sz w:val="18"/>
+                <w:szCs w:val="18"/>
+              </w:rPr>
+              <w:t xml:space="preserve"/>
+            </w:r>
+          </w:p>
+        </w:tc>
+      </w:tr>
+      <w:tr>
+        <w:trPr>
+          <w:cantSplit/>
+        </w:trPr>
+        <w:tc>
+          <w:tcPr>
+            <w:tcW w:type="dxa" w:w="640"/>
+            <w:tcBorders>
+              <w:top w:val="single" w:color="B9D7F2" w:sz="4"/>
+              <w:left w:val="single" w:color="B9D7F2" w:sz="4"/>
+              <w:bottom w:val="single" w:color="B9D7F2" w:sz="4"/>
+              <w:right w:val="single" w:color="B9D7F2" w:sz="4"/>
+            </w:tcBorders>
+            <w:tcMar>
+              <w:top w:type="dxa" w:w="60"/>
+              <w:left w:type="dxa" w:w="90"/>
+              <w:bottom w:type="dxa" w:w="60"/>
+              <w:right w:type="dxa" w:w="90"/>
+            </w:tcMar>
+          </w:tcPr>
+          <w:p>
+            <w:pPr>
+              <w:spacing w:after="0" w:before="0"/>
+            </w:pPr>
+            <w:r>
+              <w:rPr>
+                <w:rFonts w:ascii="Arial" w:cs="Arial" w:eastAsia="Arial" w:hAnsi="Arial"/>
+                <w:color w:val="15202B"/>
+                <w:sz w:val="18"/>
+                <w:szCs w:val="18"/>
+              </w:rPr>
+              <w:t xml:space="preserve">34.9</w:t>
+            </w:r>
+          </w:p>
+        </w:tc>
+        <w:tc>
+          <w:tcPr>
+            <w:tcW w:type="dxa" w:w="3820"/>
+            <w:tcBorders>
+              <w:top w:val="single" w:color="B9D7F2" w:sz="4"/>
+              <w:left w:val="single" w:color="B9D7F2" w:sz="4"/>
+              <w:bottom w:val="single" w:color="B9D7F2" w:sz="4"/>
+              <w:right w:val="single" w:color="B9D7F2" w:sz="4"/>
+            </w:tcBorders>
+            <w:tcMar>
+              <w:top w:type="dxa" w:w="60"/>
+              <w:left w:type="dxa" w:w="90"/>
+              <w:bottom w:type="dxa" w:w="60"/>
+              <w:right w:type="dxa" w:w="90"/>
+            </w:tcMar>
+          </w:tcPr>
+          <w:p>
+            <w:pPr>
+              <w:spacing w:after="0" w:before="0"/>
+            </w:pPr>
+            <w:r>
+              <w:rPr>
+                <w:rFonts w:ascii="Arial" w:cs="Arial" w:eastAsia="Arial" w:hAnsi="Arial"/>
+                <w:color w:val="15202B"/>
+                <w:sz w:val="18"/>
+                <w:szCs w:val="18"/>
+              </w:rPr>
+              <w:t xml:space="preserve">Rider stops sending for more than 5 minutes (close the rider window).</w:t>
+            </w:r>
+          </w:p>
+        </w:tc>
+        <w:tc>
+          <w:tcPr>
+            <w:tcW w:type="dxa" w:w="3900"/>
+            <w:tcBorders>
+              <w:top w:val="single" w:color="B9D7F2" w:sz="4"/>
+              <w:left w:val="single" w:color="B9D7F2" w:sz="4"/>
+              <w:bottom w:val="single" w:color="B9D7F2" w:sz="4"/>
+              <w:right w:val="single" w:color="B9D7F2" w:sz="4"/>
+            </w:tcBorders>
+            <w:tcMar>
+              <w:top w:type="dxa" w:w="60"/>
+              <w:left w:type="dxa" w:w="90"/>
+              <w:bottom w:type="dxa" w:w="60"/>
+              <w:right w:type="dxa" w:w="90"/>
+            </w:tcMar>
+          </w:tcPr>
+          <w:p>
+            <w:pPr>
+              <w:spacing w:after="0" w:before="0"/>
+            </w:pPr>
+            <w:r>
+              <w:rPr>
+                <w:rFonts w:ascii="Arial" w:cs="Arial" w:eastAsia="Arial" w:hAnsi="Arial"/>
+                <w:color w:val="15202B"/>
+                <w:sz w:val="18"/>
+                <w:szCs w:val="18"/>
+              </w:rPr>
+              <w:t xml:space="preserve">Owner map: grey marker with "Last seen n min ago".</w:t>
+            </w:r>
+          </w:p>
+        </w:tc>
+        <w:tc>
+          <w:tcPr>
+            <w:tcW w:type="dxa" w:w="900"/>
+            <w:tcBorders>
+              <w:top w:val="single" w:color="B9D7F2" w:sz="4"/>
+              <w:left w:val="single" w:color="B9D7F2" w:sz="4"/>
+              <w:bottom w:val="single" w:color="B9D7F2" w:sz="4"/>
+              <w:right w:val="single" w:color="B9D7F2" w:sz="4"/>
+            </w:tcBorders>
+            <w:tcMar>
+              <w:top w:type="dxa" w:w="60"/>
+              <w:left w:type="dxa" w:w="90"/>
+              <w:bottom w:type="dxa" w:w="60"/>
+              <w:right w:type="dxa" w:w="90"/>
+            </w:tcMar>
+          </w:tcPr>
+          <w:p>
+            <w:pPr>
+              <w:spacing w:after="0" w:before="0"/>
+            </w:pPr>
+            <w:r>
+              <w:rPr>
+                <w:rFonts w:ascii="Arial" w:cs="Arial" w:eastAsia="Arial" w:hAnsi="Arial"/>
+                <w:color w:val="15202B"/>
+                <w:sz w:val="18"/>
+                <w:szCs w:val="18"/>
+              </w:rPr>
+              <w:t xml:space="preserve">☐ Pass</w:t>
+            </w:r>
+          </w:p>
+          <w:p>
+            <w:pPr>
+              <w:spacing w:after="0" w:before="0"/>
+            </w:pPr>
+            <w:r>
+              <w:rPr>
+                <w:rFonts w:ascii="Arial" w:cs="Arial" w:eastAsia="Arial" w:hAnsi="Arial"/>
+                <w:color w:val="15202B"/>
+                <w:sz w:val="18"/>
+                <w:szCs w:val="18"/>
+              </w:rPr>
+              <w:t xml:space="preserve">☐ Fail</w:t>
+            </w:r>
+          </w:p>
+        </w:tc>
+        <w:tc>
+          <w:tcPr>
+            <w:tcW w:type="dxa" w:w="1206"/>
+            <w:tcBorders>
+              <w:top w:val="single" w:color="B9D7F2" w:sz="4"/>
+              <w:left w:val="single" w:color="B9D7F2" w:sz="4"/>
+              <w:bottom w:val="single" w:color="B9D7F2" w:sz="4"/>
+              <w:right w:val="single" w:color="B9D7F2" w:sz="4"/>
+            </w:tcBorders>
+            <w:tcMar>
+              <w:top w:type="dxa" w:w="60"/>
+              <w:left w:type="dxa" w:w="90"/>
+              <w:bottom w:type="dxa" w:w="60"/>
+              <w:right w:type="dxa" w:w="90"/>
+            </w:tcMar>
+          </w:tcPr>
+          <w:p>
+            <w:pPr>
+              <w:spacing w:after="0" w:before="0"/>
+            </w:pPr>
+            <w:r>
+              <w:rPr>
+                <w:rFonts w:ascii="Arial" w:cs="Arial" w:eastAsia="Arial" w:hAnsi="Arial"/>
+                <w:color w:val="15202B"/>
+                <w:sz w:val="18"/>
+                <w:szCs w:val="18"/>
+              </w:rPr>
+              <w:t xml:space="preserve"/>
+            </w:r>
+          </w:p>
+        </w:tc>
+      </w:tr>
+      <w:tr>
+        <w:trPr>
+          <w:cantSplit/>
+        </w:trPr>
+        <w:tc>
+          <w:tcPr>
+            <w:tcW w:type="dxa" w:w="640"/>
+            <w:tcBorders>
+              <w:top w:val="single" w:color="B9D7F2" w:sz="4"/>
+              <w:left w:val="single" w:color="B9D7F2" w:sz="4"/>
+              <w:bottom w:val="single" w:color="B9D7F2" w:sz="4"/>
+              <w:right w:val="single" w:color="B9D7F2" w:sz="4"/>
+            </w:tcBorders>
+            <w:shd w:fill="EAF4FD" w:color="auto" w:val="clear"/>
+            <w:tcMar>
+              <w:top w:type="dxa" w:w="60"/>
+              <w:left w:type="dxa" w:w="90"/>
+              <w:bottom w:type="dxa" w:w="60"/>
+              <w:right w:type="dxa" w:w="90"/>
+            </w:tcMar>
+          </w:tcPr>
+          <w:p>
+            <w:pPr>
+              <w:spacing w:after="0" w:before="0"/>
+            </w:pPr>
+            <w:r>
+              <w:rPr>
+                <w:rFonts w:ascii="Arial" w:cs="Arial" w:eastAsia="Arial" w:hAnsi="Arial"/>
+                <w:color w:val="15202B"/>
+                <w:sz w:val="18"/>
+                <w:szCs w:val="18"/>
+              </w:rPr>
+              <w:t xml:space="preserve">34.10</w:t>
+            </w:r>
+          </w:p>
+        </w:tc>
+        <w:tc>
+          <w:tcPr>
+            <w:tcW w:type="dxa" w:w="3820"/>
+            <w:tcBorders>
+              <w:top w:val="single" w:color="B9D7F2" w:sz="4"/>
+              <w:left w:val="single" w:color="B9D7F2" w:sz="4"/>
+              <w:bottom w:val="single" w:color="B9D7F2" w:sz="4"/>
+              <w:right w:val="single" w:color="B9D7F2" w:sz="4"/>
+            </w:tcBorders>
+            <w:shd w:fill="EAF4FD" w:color="auto" w:val="clear"/>
+            <w:tcMar>
+              <w:top w:type="dxa" w:w="60"/>
+              <w:left w:type="dxa" w:w="90"/>
+              <w:bottom w:type="dxa" w:w="60"/>
+              <w:right w:type="dxa" w:w="90"/>
+            </w:tcMar>
+          </w:tcPr>
+          <w:p>
+            <w:pPr>
+              <w:spacing w:after="0" w:before="0"/>
+            </w:pPr>
+            <w:r>
+              <w:rPr>
+                <w:rFonts w:ascii="Arial" w:cs="Arial" w:eastAsia="Arial" w:hAnsi="Arial"/>
+                <w:color w:val="15202B"/>
+                <w:sz w:val="18"/>
+                <w:szCs w:val="18"/>
+              </w:rPr>
+              <w:t xml:space="preserve">Rider records the last order Delivered.</w:t>
+            </w:r>
+          </w:p>
+        </w:tc>
+        <w:tc>
+          <w:tcPr>
+            <w:tcW w:type="dxa" w:w="3900"/>
+            <w:tcBorders>
+              <w:top w:val="single" w:color="B9D7F2" w:sz="4"/>
+              <w:left w:val="single" w:color="B9D7F2" w:sz="4"/>
+              <w:bottom w:val="single" w:color="B9D7F2" w:sz="4"/>
+              <w:right w:val="single" w:color="B9D7F2" w:sz="4"/>
+            </w:tcBorders>
+            <w:shd w:fill="EAF4FD" w:color="auto" w:val="clear"/>
+            <w:tcMar>
+              <w:top w:type="dxa" w:w="60"/>
+              <w:left w:type="dxa" w:w="90"/>
+              <w:bottom w:type="dxa" w:w="60"/>
+              <w:right w:type="dxa" w:w="90"/>
+            </w:tcMar>
+          </w:tcPr>
+          <w:p>
+            <w:pPr>
+              <w:spacing w:after="0" w:before="0"/>
+            </w:pPr>
+            <w:r>
+              <w:rPr>
+                <w:rFonts w:ascii="Arial" w:cs="Arial" w:eastAsia="Arial" w:hAnsi="Arial"/>
+                <w:color w:val="15202B"/>
+                <w:sz w:val="18"/>
+                <w:szCs w:val="18"/>
+              </w:rPr>
+              <w:t xml:space="preserve">"Location sharing off."; the Live Map shows "No deliveries running".</w:t>
+            </w:r>
+          </w:p>
+        </w:tc>
+        <w:tc>
+          <w:tcPr>
+            <w:tcW w:type="dxa" w:w="900"/>
+            <w:tcBorders>
+              <w:top w:val="single" w:color="B9D7F2" w:sz="4"/>
+              <w:left w:val="single" w:color="B9D7F2" w:sz="4"/>
+              <w:bottom w:val="single" w:color="B9D7F2" w:sz="4"/>
+              <w:right w:val="single" w:color="B9D7F2" w:sz="4"/>
+            </w:tcBorders>
+            <w:shd w:fill="EAF4FD" w:color="auto" w:val="clear"/>
+            <w:tcMar>
+              <w:top w:type="dxa" w:w="60"/>
+              <w:left w:type="dxa" w:w="90"/>
+              <w:bottom w:type="dxa" w:w="60"/>
+              <w:right w:type="dxa" w:w="90"/>
+            </w:tcMar>
+          </w:tcPr>
+          <w:p>
+            <w:pPr>
+              <w:spacing w:after="0" w:before="0"/>
+            </w:pPr>
+            <w:r>
+              <w:rPr>
+                <w:rFonts w:ascii="Arial" w:cs="Arial" w:eastAsia="Arial" w:hAnsi="Arial"/>
+                <w:color w:val="15202B"/>
+                <w:sz w:val="18"/>
+                <w:szCs w:val="18"/>
+              </w:rPr>
+              <w:t xml:space="preserve">☐ Pass</w:t>
+            </w:r>
+          </w:p>
+          <w:p>
+            <w:pPr>
+              <w:spacing w:after="0" w:before="0"/>
+            </w:pPr>
+            <w:r>
+              <w:rPr>
+                <w:rFonts w:ascii="Arial" w:cs="Arial" w:eastAsia="Arial" w:hAnsi="Arial"/>
+                <w:color w:val="15202B"/>
+                <w:sz w:val="18"/>
+                <w:szCs w:val="18"/>
+              </w:rPr>
+              <w:t xml:space="preserve">☐ Fail</w:t>
+            </w:r>
+          </w:p>
+        </w:tc>
+        <w:tc>
+          <w:tcPr>
+            <w:tcW w:type="dxa" w:w="1206"/>
+            <w:tcBorders>
+              <w:top w:val="single" w:color="B9D7F2" w:sz="4"/>
+              <w:left w:val="single" w:color="B9D7F2" w:sz="4"/>
+              <w:bottom w:val="single" w:color="B9D7F2" w:sz="4"/>
+              <w:right w:val="single" w:color="B9D7F2" w:sz="4"/>
+            </w:tcBorders>
+            <w:shd w:fill="EAF4FD" w:color="auto" w:val="clear"/>
+            <w:tcMar>
+              <w:top w:type="dxa" w:w="60"/>
+              <w:left w:type="dxa" w:w="90"/>
+              <w:bottom w:type="dxa" w:w="60"/>
+              <w:right w:type="dxa" w:w="90"/>
+            </w:tcMar>
+          </w:tcPr>
+          <w:p>
+            <w:pPr>
+              <w:spacing w:after="0" w:before="0"/>
+            </w:pPr>
+            <w:r>
+              <w:rPr>
+                <w:rFonts w:ascii="Arial" w:cs="Arial" w:eastAsia="Arial" w:hAnsi="Arial"/>
+                <w:color w:val="15202B"/>
+                <w:sz w:val="18"/>
+                <w:szCs w:val="18"/>
+              </w:rPr>
+              <w:t xml:space="preserve"/>
+            </w:r>
+          </w:p>
+        </w:tc>
+      </w:tr>
+    </w:tbl>
+    <w:p>
+      <w:pPr>
+        <w:pStyle w:val="Heading1"/>
+        <w:pageBreakBefore/>
+        <w:spacing w:after="60"/>
+      </w:pPr>
+      <w:r>
+        <w:rPr>
+          <w:rFonts w:ascii="Arial" w:cs="Arial" w:eastAsia="Arial" w:hAnsi="Arial"/>
+          <w:b/>
+          <w:bCs/>
+          <w:color w:val="0A84E0"/>
+          <w:sz w:val="28"/>
+          <w:szCs w:val="28"/>
+        </w:rPr>
+        <w:t xml:space="preserve">Step 35 · Real-time updates</w:t>
+      </w:r>
+    </w:p>
+    <w:p>
+      <w:pPr>
+        <w:spacing w:after="60" w:before="0"/>
+      </w:pPr>
+      <w:r>
+        <w:rPr>
+          <w:rFonts w:ascii="Arial" w:cs="Arial" w:eastAsia="Arial" w:hAnsi="Arial"/>
+          <w:b/>
+          <w:bCs/>
+          <w:color w:val="15202B"/>
+          <w:sz w:val="19"/>
+          <w:szCs w:val="19"/>
+        </w:rPr>
+        <w:t xml:space="preserve">Screens: </w:t>
+      </w:r>
+      <w:r>
+        <w:rPr>
+          <w:rFonts w:ascii="Arial" w:cs="Arial" w:eastAsia="Arial" w:hAnsi="Arial"/>
+          <w:color w:val="15202B"/>
+          <w:sz w:val="19"/>
+          <w:szCs w:val="19"/>
+        </w:rPr>
+        <w:t xml:space="preserve">All lists and details</w:t>
+      </w:r>
+      <w:r>
+        <w:rPr>
+          <w:rFonts w:ascii="Arial" w:cs="Arial" w:eastAsia="Arial" w:hAnsi="Arial"/>
+          <w:b/>
+          <w:bCs/>
+          <w:color w:val="15202B"/>
+          <w:sz w:val="19"/>
+          <w:szCs w:val="19"/>
+        </w:rPr>
+        <w:t xml:space="preserve">    Log in as: </w:t>
+      </w:r>
+      <w:r>
+        <w:rPr>
+          <w:rFonts w:ascii="Arial" w:cs="Arial" w:eastAsia="Arial" w:hAnsi="Arial"/>
+          <w:color w:val="15202B"/>
+          <w:sz w:val="19"/>
+          <w:szCs w:val="19"/>
+        </w:rPr>
+        <w:t xml:space="preserve">Owner, Staff, Rider and Customer in separate Chrome windows</w:t>
+      </w:r>
+    </w:p>
+    <w:p>
+      <w:pPr>
+        <w:spacing w:after="60" w:before="0"/>
+      </w:pPr>
+      <w:r>
+        <w:rPr>
+          <w:rFonts w:ascii="Arial" w:cs="Arial" w:eastAsia="Arial" w:hAnsi="Arial"/>
+          <w:b/>
+          <w:bCs/>
+          <w:color w:val="0A84E0"/>
+          <w:sz w:val="19"/>
+          <w:szCs w:val="19"/>
+        </w:rPr>
+        <w:t xml:space="preserve">Before: </w:t>
+      </w:r>
+      <w:r>
+        <w:rPr>
+          <w:rFonts w:ascii="Arial" w:cs="Arial" w:eastAsia="Arial" w:hAnsi="Arial"/>
+          <w:color w:val="15202B"/>
+          <w:sz w:val="19"/>
+          <w:szCs w:val="19"/>
+        </w:rPr>
+        <w:t xml:space="preserve">Do NOT pull down to refresh in these checks: the screens should change by themselves within about a second.</w:t>
+      </w:r>
+    </w:p>
+    <w:tbl>
+      <w:tblPr>
+        <w:tblW w:type="dxa" w:w="10466"/>
+        <w:tblBorders>
+          <w:top w:val="single" w:color="auto" w:sz="4"/>
+          <w:left w:val="single" w:color="auto" w:sz="4"/>
+          <w:bottom w:val="single" w:color="auto" w:sz="4"/>
+          <w:right w:val="single" w:color="auto" w:sz="4"/>
+          <w:insideH w:val="single" w:color="auto" w:sz="4"/>
+          <w:insideV w:val="single" w:color="auto" w:sz="4"/>
+        </w:tblBorders>
+        <w:tblLayout w:type="fixed"/>
+      </w:tblPr>
+      <w:tblGrid>
+        <w:gridCol w:w="640"/>
+        <w:gridCol w:w="3820"/>
+        <w:gridCol w:w="3900"/>
+        <w:gridCol w:w="900"/>
+        <w:gridCol w:w="1206"/>
+      </w:tblGrid>
+      <w:tr>
+        <w:trPr>
+          <w:tblHeader/>
+        </w:trPr>
+        <w:tc>
+          <w:tcPr>
+            <w:tcW w:type="dxa" w:w="640"/>
+            <w:tcBorders>
+              <w:top w:val="single" w:color="B9D7F2" w:sz="4"/>
+              <w:left w:val="single" w:color="B9D7F2" w:sz="4"/>
+              <w:bottom w:val="single" w:color="B9D7F2" w:sz="4"/>
+              <w:right w:val="single" w:color="B9D7F2" w:sz="4"/>
+            </w:tcBorders>
+            <w:shd w:fill="0A84E0" w:color="auto" w:val="clear"/>
+            <w:tcMar>
+              <w:top w:type="dxa" w:w="60"/>
+              <w:left w:type="dxa" w:w="90"/>
+              <w:bottom w:type="dxa" w:w="60"/>
+              <w:right w:type="dxa" w:w="90"/>
+            </w:tcMar>
+          </w:tcPr>
+          <w:p>
+            <w:pPr>
+              <w:spacing w:after="0" w:before="0"/>
+            </w:pPr>
+            <w:r>
+              <w:rPr>
+                <w:rFonts w:ascii="Arial" w:cs="Arial" w:eastAsia="Arial" w:hAnsi="Arial"/>
+                <w:b/>
+                <w:bCs/>
+                <w:color w:val="FFFFFF"/>
+                <w:sz w:val="18"/>
+                <w:szCs w:val="18"/>
+              </w:rPr>
+              <w:t xml:space="preserve">#</w:t>
+            </w:r>
+          </w:p>
+        </w:tc>
+        <w:tc>
+          <w:tcPr>
+            <w:tcW w:type="dxa" w:w="3820"/>
+            <w:tcBorders>
+              <w:top w:val="single" w:color="B9D7F2" w:sz="4"/>
+              <w:left w:val="single" w:color="B9D7F2" w:sz="4"/>
+              <w:bottom w:val="single" w:color="B9D7F2" w:sz="4"/>
+              <w:right w:val="single" w:color="B9D7F2" w:sz="4"/>
+            </w:tcBorders>
+            <w:shd w:fill="0A84E0" w:color="auto" w:val="clear"/>
+            <w:tcMar>
+              <w:top w:type="dxa" w:w="60"/>
+              <w:left w:type="dxa" w:w="90"/>
+              <w:bottom w:type="dxa" w:w="60"/>
+              <w:right w:type="dxa" w:w="90"/>
+            </w:tcMar>
+          </w:tcPr>
+          <w:p>
+            <w:pPr>
+              <w:spacing w:after="0" w:before="0"/>
+            </w:pPr>
+            <w:r>
+              <w:rPr>
+                <w:rFonts w:ascii="Arial" w:cs="Arial" w:eastAsia="Arial" w:hAnsi="Arial"/>
+                <w:b/>
+                <w:bCs/>
+                <w:color w:val="FFFFFF"/>
+                <w:sz w:val="18"/>
+                <w:szCs w:val="18"/>
+              </w:rPr>
+              <w:t xml:space="preserve">What to do</w:t>
+            </w:r>
+          </w:p>
+        </w:tc>
+        <w:tc>
+          <w:tcPr>
+            <w:tcW w:type="dxa" w:w="3900"/>
+            <w:tcBorders>
+              <w:top w:val="single" w:color="B9D7F2" w:sz="4"/>
+              <w:left w:val="single" w:color="B9D7F2" w:sz="4"/>
+              <w:bottom w:val="single" w:color="B9D7F2" w:sz="4"/>
+              <w:right w:val="single" w:color="B9D7F2" w:sz="4"/>
+            </w:tcBorders>
+            <w:shd w:fill="0A84E0" w:color="auto" w:val="clear"/>
+            <w:tcMar>
+              <w:top w:type="dxa" w:w="60"/>
+              <w:left w:type="dxa" w:w="90"/>
+              <w:bottom w:type="dxa" w:w="60"/>
+              <w:right w:type="dxa" w:w="90"/>
+            </w:tcMar>
+          </w:tcPr>
+          <w:p>
+            <w:pPr>
+              <w:spacing w:after="0" w:before="0"/>
+            </w:pPr>
+            <w:r>
+              <w:rPr>
+                <w:rFonts w:ascii="Arial" w:cs="Arial" w:eastAsia="Arial" w:hAnsi="Arial"/>
+                <w:b/>
+                <w:bCs/>
+                <w:color w:val="FFFFFF"/>
+                <w:sz w:val="18"/>
+                <w:szCs w:val="18"/>
+              </w:rPr>
+              <w:t xml:space="preserve">What you should see</w:t>
+            </w:r>
+          </w:p>
+        </w:tc>
+        <w:tc>
+          <w:tcPr>
+            <w:tcW w:type="dxa" w:w="900"/>
+            <w:tcBorders>
+              <w:top w:val="single" w:color="B9D7F2" w:sz="4"/>
+              <w:left w:val="single" w:color="B9D7F2" w:sz="4"/>
+              <w:bottom w:val="single" w:color="B9D7F2" w:sz="4"/>
+              <w:right w:val="single" w:color="B9D7F2" w:sz="4"/>
+            </w:tcBorders>
+            <w:shd w:fill="0A84E0" w:color="auto" w:val="clear"/>
+            <w:tcMar>
+              <w:top w:type="dxa" w:w="60"/>
+              <w:left w:type="dxa" w:w="90"/>
+              <w:bottom w:type="dxa" w:w="60"/>
+              <w:right w:type="dxa" w:w="90"/>
+            </w:tcMar>
+          </w:tcPr>
+          <w:p>
+            <w:pPr>
+              <w:spacing w:after="0" w:before="0"/>
+            </w:pPr>
+            <w:r>
+              <w:rPr>
+                <w:rFonts w:ascii="Arial" w:cs="Arial" w:eastAsia="Arial" w:hAnsi="Arial"/>
+                <w:b/>
+                <w:bCs/>
+                <w:color w:val="FFFFFF"/>
+                <w:sz w:val="18"/>
+                <w:szCs w:val="18"/>
+              </w:rPr>
+              <w:t xml:space="preserve">Result</w:t>
+            </w:r>
+          </w:p>
+        </w:tc>
+        <w:tc>
+          <w:tcPr>
+            <w:tcW w:type="dxa" w:w="1206"/>
+            <w:tcBorders>
+              <w:top w:val="single" w:color="B9D7F2" w:sz="4"/>
+              <w:left w:val="single" w:color="B9D7F2" w:sz="4"/>
+              <w:bottom w:val="single" w:color="B9D7F2" w:sz="4"/>
+              <w:right w:val="single" w:color="B9D7F2" w:sz="4"/>
+            </w:tcBorders>
+            <w:shd w:fill="0A84E0" w:color="auto" w:val="clear"/>
+            <w:tcMar>
+              <w:top w:type="dxa" w:w="60"/>
+              <w:left w:type="dxa" w:w="90"/>
+              <w:bottom w:type="dxa" w:w="60"/>
+              <w:right w:type="dxa" w:w="90"/>
+            </w:tcMar>
+          </w:tcPr>
+          <w:p>
+            <w:pPr>
+              <w:spacing w:after="0" w:before="0"/>
+            </w:pPr>
+            <w:r>
+              <w:rPr>
+                <w:rFonts w:ascii="Arial" w:cs="Arial" w:eastAsia="Arial" w:hAnsi="Arial"/>
+                <w:b/>
+                <w:bCs/>
+                <w:color w:val="FFFFFF"/>
+                <w:sz w:val="18"/>
+                <w:szCs w:val="18"/>
+              </w:rPr>
+              <w:t xml:space="preserve">Notes</w:t>
+            </w:r>
+          </w:p>
+        </w:tc>
+      </w:tr>
+      <w:tr>
+        <w:trPr>
+          <w:cantSplit/>
+        </w:trPr>
+        <w:tc>
+          <w:tcPr>
+            <w:tcW w:type="dxa" w:w="640"/>
+            <w:tcBorders>
+              <w:top w:val="single" w:color="B9D7F2" w:sz="4"/>
+              <w:left w:val="single" w:color="B9D7F2" w:sz="4"/>
+              <w:bottom w:val="single" w:color="B9D7F2" w:sz="4"/>
+              <w:right w:val="single" w:color="B9D7F2" w:sz="4"/>
+            </w:tcBorders>
+            <w:tcMar>
+              <w:top w:type="dxa" w:w="60"/>
+              <w:left w:type="dxa" w:w="90"/>
+              <w:bottom w:type="dxa" w:w="60"/>
+              <w:right w:type="dxa" w:w="90"/>
+            </w:tcMar>
+          </w:tcPr>
+          <w:p>
+            <w:pPr>
+              <w:spacing w:after="0" w:before="0"/>
+            </w:pPr>
+            <w:r>
+              <w:rPr>
+                <w:rFonts w:ascii="Arial" w:cs="Arial" w:eastAsia="Arial" w:hAnsi="Arial"/>
+                <w:color w:val="15202B"/>
+                <w:sz w:val="18"/>
+                <w:szCs w:val="18"/>
+              </w:rPr>
+              <w:t xml:space="preserve">35.1</w:t>
+            </w:r>
+          </w:p>
+        </w:tc>
+        <w:tc>
+          <w:tcPr>
+            <w:tcW w:type="dxa" w:w="3820"/>
+            <w:tcBorders>
+              <w:top w:val="single" w:color="B9D7F2" w:sz="4"/>
+              <w:left w:val="single" w:color="B9D7F2" w:sz="4"/>
+              <w:bottom w:val="single" w:color="B9D7F2" w:sz="4"/>
+              <w:right w:val="single" w:color="B9D7F2" w:sz="4"/>
+            </w:tcBorders>
+            <w:tcMar>
+              <w:top w:type="dxa" w:w="60"/>
+              <w:left w:type="dxa" w:w="90"/>
+              <w:bottom w:type="dxa" w:w="60"/>
+              <w:right w:type="dxa" w:w="90"/>
+            </w:tcMar>
+          </w:tcPr>
+          <w:p>
+            <w:pPr>
+              <w:spacing w:after="0" w:before="0"/>
+            </w:pPr>
+            <w:r>
+              <w:rPr>
+                <w:rFonts w:ascii="Arial" w:cs="Arial" w:eastAsia="Arial" w:hAnsi="Arial"/>
+                <w:color w:val="15202B"/>
+                <w:sz w:val="18"/>
+                <w:szCs w:val="18"/>
+              </w:rPr>
+              <w:t xml:space="preserve">Owner on the Order Board (New tab). Customer places an order.</w:t>
+            </w:r>
+          </w:p>
+        </w:tc>
+        <w:tc>
+          <w:tcPr>
+            <w:tcW w:type="dxa" w:w="3900"/>
+            <w:tcBorders>
+              <w:top w:val="single" w:color="B9D7F2" w:sz="4"/>
+              <w:left w:val="single" w:color="B9D7F2" w:sz="4"/>
+              <w:bottom w:val="single" w:color="B9D7F2" w:sz="4"/>
+              <w:right w:val="single" w:color="B9D7F2" w:sz="4"/>
+            </w:tcBorders>
+            <w:tcMar>
+              <w:top w:type="dxa" w:w="60"/>
+              <w:left w:type="dxa" w:w="90"/>
+              <w:bottom w:type="dxa" w:w="60"/>
+              <w:right w:type="dxa" w:w="90"/>
+            </w:tcMar>
+          </w:tcPr>
+          <w:p>
+            <w:pPr>
+              <w:spacing w:after="0" w:before="0"/>
+            </w:pPr>
+            <w:r>
+              <w:rPr>
+                <w:rFonts w:ascii="Arial" w:cs="Arial" w:eastAsia="Arial" w:hAnsi="Arial"/>
+                <w:color w:val="15202B"/>
+                <w:sz w:val="18"/>
+                <w:szCs w:val="18"/>
+              </w:rPr>
+              <w:t xml:space="preserve">The new order appears right away; the New count goes up; a banner "New order · Ana Lim: ..." shows at the bottom with View.</w:t>
+            </w:r>
+          </w:p>
+        </w:tc>
+        <w:tc>
+          <w:tcPr>
+            <w:tcW w:type="dxa" w:w="900"/>
+            <w:tcBorders>
+              <w:top w:val="single" w:color="B9D7F2" w:sz="4"/>
+              <w:left w:val="single" w:color="B9D7F2" w:sz="4"/>
+              <w:bottom w:val="single" w:color="B9D7F2" w:sz="4"/>
+              <w:right w:val="single" w:color="B9D7F2" w:sz="4"/>
+            </w:tcBorders>
+            <w:tcMar>
+              <w:top w:type="dxa" w:w="60"/>
+              <w:left w:type="dxa" w:w="90"/>
+              <w:bottom w:type="dxa" w:w="60"/>
+              <w:right w:type="dxa" w:w="90"/>
+            </w:tcMar>
+          </w:tcPr>
+          <w:p>
+            <w:pPr>
+              <w:spacing w:after="0" w:before="0"/>
+            </w:pPr>
+            <w:r>
+              <w:rPr>
+                <w:rFonts w:ascii="Arial" w:cs="Arial" w:eastAsia="Arial" w:hAnsi="Arial"/>
+                <w:color w:val="15202B"/>
+                <w:sz w:val="18"/>
+                <w:szCs w:val="18"/>
+              </w:rPr>
+              <w:t xml:space="preserve">☐ Pass</w:t>
+            </w:r>
+          </w:p>
+          <w:p>
+            <w:pPr>
+              <w:spacing w:after="0" w:before="0"/>
+            </w:pPr>
+            <w:r>
+              <w:rPr>
+                <w:rFonts w:ascii="Arial" w:cs="Arial" w:eastAsia="Arial" w:hAnsi="Arial"/>
+                <w:color w:val="15202B"/>
+                <w:sz w:val="18"/>
+                <w:szCs w:val="18"/>
+              </w:rPr>
+              <w:t xml:space="preserve">☐ Fail</w:t>
+            </w:r>
+          </w:p>
+        </w:tc>
+        <w:tc>
+          <w:tcPr>
+            <w:tcW w:type="dxa" w:w="1206"/>
+            <w:tcBorders>
+              <w:top w:val="single" w:color="B9D7F2" w:sz="4"/>
+              <w:left w:val="single" w:color="B9D7F2" w:sz="4"/>
+              <w:bottom w:val="single" w:color="B9D7F2" w:sz="4"/>
+              <w:right w:val="single" w:color="B9D7F2" w:sz="4"/>
+            </w:tcBorders>
+            <w:tcMar>
+              <w:top w:type="dxa" w:w="60"/>
+              <w:left w:type="dxa" w:w="90"/>
+              <w:bottom w:type="dxa" w:w="60"/>
+              <w:right w:type="dxa" w:w="90"/>
+            </w:tcMar>
+          </w:tcPr>
+          <w:p>
+            <w:pPr>
+              <w:spacing w:after="0" w:before="0"/>
+            </w:pPr>
+            <w:r>
+              <w:rPr>
+                <w:rFonts w:ascii="Arial" w:cs="Arial" w:eastAsia="Arial" w:hAnsi="Arial"/>
+                <w:color w:val="15202B"/>
+                <w:sz w:val="18"/>
+                <w:szCs w:val="18"/>
+              </w:rPr>
+              <w:t xml:space="preserve"/>
+            </w:r>
+          </w:p>
+        </w:tc>
+      </w:tr>
+      <w:tr>
+        <w:trPr>
+          <w:cantSplit/>
+        </w:trPr>
+        <w:tc>
+          <w:tcPr>
+            <w:tcW w:type="dxa" w:w="640"/>
+            <w:tcBorders>
+              <w:top w:val="single" w:color="B9D7F2" w:sz="4"/>
+              <w:left w:val="single" w:color="B9D7F2" w:sz="4"/>
+              <w:bottom w:val="single" w:color="B9D7F2" w:sz="4"/>
+              <w:right w:val="single" w:color="B9D7F2" w:sz="4"/>
+            </w:tcBorders>
+            <w:shd w:fill="EAF4FD" w:color="auto" w:val="clear"/>
+            <w:tcMar>
+              <w:top w:type="dxa" w:w="60"/>
+              <w:left w:type="dxa" w:w="90"/>
+              <w:bottom w:type="dxa" w:w="60"/>
+              <w:right w:type="dxa" w:w="90"/>
+            </w:tcMar>
+          </w:tcPr>
+          <w:p>
+            <w:pPr>
+              <w:spacing w:after="0" w:before="0"/>
+            </w:pPr>
+            <w:r>
+              <w:rPr>
+                <w:rFonts w:ascii="Arial" w:cs="Arial" w:eastAsia="Arial" w:hAnsi="Arial"/>
+                <w:color w:val="15202B"/>
+                <w:sz w:val="18"/>
+                <w:szCs w:val="18"/>
+              </w:rPr>
+              <w:t xml:space="preserve">35.2</w:t>
+            </w:r>
+          </w:p>
+        </w:tc>
+        <w:tc>
+          <w:tcPr>
+            <w:tcW w:type="dxa" w:w="3820"/>
+            <w:tcBorders>
+              <w:top w:val="single" w:color="B9D7F2" w:sz="4"/>
+              <w:left w:val="single" w:color="B9D7F2" w:sz="4"/>
+              <w:bottom w:val="single" w:color="B9D7F2" w:sz="4"/>
+              <w:right w:val="single" w:color="B9D7F2" w:sz="4"/>
+            </w:tcBorders>
+            <w:shd w:fill="EAF4FD" w:color="auto" w:val="clear"/>
+            <w:tcMar>
+              <w:top w:type="dxa" w:w="60"/>
+              <w:left w:type="dxa" w:w="90"/>
+              <w:bottom w:type="dxa" w:w="60"/>
+              <w:right w:type="dxa" w:w="90"/>
+            </w:tcMar>
+          </w:tcPr>
+          <w:p>
+            <w:pPr>
+              <w:spacing w:after="0" w:before="0"/>
+            </w:pPr>
+            <w:r>
+              <w:rPr>
+                <w:rFonts w:ascii="Arial" w:cs="Arial" w:eastAsia="Arial" w:hAnsi="Arial"/>
+                <w:color w:val="15202B"/>
+                <w:sz w:val="18"/>
+                <w:szCs w:val="18"/>
+              </w:rPr>
+              <w:t xml:space="preserve">Customer on Order Details. Owner accepts it.</w:t>
+            </w:r>
+          </w:p>
+        </w:tc>
+        <w:tc>
+          <w:tcPr>
+            <w:tcW w:type="dxa" w:w="3900"/>
+            <w:tcBorders>
+              <w:top w:val="single" w:color="B9D7F2" w:sz="4"/>
+              <w:left w:val="single" w:color="B9D7F2" w:sz="4"/>
+              <w:bottom w:val="single" w:color="B9D7F2" w:sz="4"/>
+              <w:right w:val="single" w:color="B9D7F2" w:sz="4"/>
+            </w:tcBorders>
+            <w:shd w:fill="EAF4FD" w:color="auto" w:val="clear"/>
+            <w:tcMar>
+              <w:top w:type="dxa" w:w="60"/>
+              <w:left w:type="dxa" w:w="90"/>
+              <w:bottom w:type="dxa" w:w="60"/>
+              <w:right w:type="dxa" w:w="90"/>
+            </w:tcMar>
+          </w:tcPr>
+          <w:p>
+            <w:pPr>
+              <w:spacing w:after="0" w:before="0"/>
+            </w:pPr>
+            <w:r>
+              <w:rPr>
+                <w:rFonts w:ascii="Arial" w:cs="Arial" w:eastAsia="Arial" w:hAnsi="Arial"/>
+                <w:color w:val="15202B"/>
+                <w:sz w:val="18"/>
+                <w:szCs w:val="18"/>
+              </w:rPr>
+              <w:t xml:space="preserve">The customer screen jumps to Processing with the delivery time; banner "Order accepted".</w:t>
+            </w:r>
+          </w:p>
+        </w:tc>
+        <w:tc>
+          <w:tcPr>
+            <w:tcW w:type="dxa" w:w="900"/>
+            <w:tcBorders>
+              <w:top w:val="single" w:color="B9D7F2" w:sz="4"/>
+              <w:left w:val="single" w:color="B9D7F2" w:sz="4"/>
+              <w:bottom w:val="single" w:color="B9D7F2" w:sz="4"/>
+              <w:right w:val="single" w:color="B9D7F2" w:sz="4"/>
+            </w:tcBorders>
+            <w:shd w:fill="EAF4FD" w:color="auto" w:val="clear"/>
+            <w:tcMar>
+              <w:top w:type="dxa" w:w="60"/>
+              <w:left w:type="dxa" w:w="90"/>
+              <w:bottom w:type="dxa" w:w="60"/>
+              <w:right w:type="dxa" w:w="90"/>
+            </w:tcMar>
+          </w:tcPr>
+          <w:p>
+            <w:pPr>
+              <w:spacing w:after="0" w:before="0"/>
+            </w:pPr>
+            <w:r>
+              <w:rPr>
+                <w:rFonts w:ascii="Arial" w:cs="Arial" w:eastAsia="Arial" w:hAnsi="Arial"/>
+                <w:color w:val="15202B"/>
+                <w:sz w:val="18"/>
+                <w:szCs w:val="18"/>
+              </w:rPr>
+              <w:t xml:space="preserve">☐ Pass</w:t>
+            </w:r>
+          </w:p>
+          <w:p>
+            <w:pPr>
+              <w:spacing w:after="0" w:before="0"/>
+            </w:pPr>
+            <w:r>
+              <w:rPr>
+                <w:rFonts w:ascii="Arial" w:cs="Arial" w:eastAsia="Arial" w:hAnsi="Arial"/>
+                <w:color w:val="15202B"/>
+                <w:sz w:val="18"/>
+                <w:szCs w:val="18"/>
+              </w:rPr>
+              <w:t xml:space="preserve">☐ Fail</w:t>
+            </w:r>
+          </w:p>
+        </w:tc>
+        <w:tc>
+          <w:tcPr>
+            <w:tcW w:type="dxa" w:w="1206"/>
+            <w:tcBorders>
+              <w:top w:val="single" w:color="B9D7F2" w:sz="4"/>
+              <w:left w:val="single" w:color="B9D7F2" w:sz="4"/>
+              <w:bottom w:val="single" w:color="B9D7F2" w:sz="4"/>
+              <w:right w:val="single" w:color="B9D7F2" w:sz="4"/>
+            </w:tcBorders>
+            <w:shd w:fill="EAF4FD" w:color="auto" w:val="clear"/>
+            <w:tcMar>
+              <w:top w:type="dxa" w:w="60"/>
+              <w:left w:type="dxa" w:w="90"/>
+              <w:bottom w:type="dxa" w:w="60"/>
+              <w:right w:type="dxa" w:w="90"/>
+            </w:tcMar>
+          </w:tcPr>
+          <w:p>
+            <w:pPr>
+              <w:spacing w:after="0" w:before="0"/>
+            </w:pPr>
+            <w:r>
+              <w:rPr>
+                <w:rFonts w:ascii="Arial" w:cs="Arial" w:eastAsia="Arial" w:hAnsi="Arial"/>
+                <w:color w:val="15202B"/>
+                <w:sz w:val="18"/>
+                <w:szCs w:val="18"/>
+              </w:rPr>
+              <w:t xml:space="preserve"/>
+            </w:r>
+          </w:p>
+        </w:tc>
+      </w:tr>
+      <w:tr>
+        <w:trPr>
+          <w:cantSplit/>
+        </w:trPr>
+        <w:tc>
+          <w:tcPr>
+            <w:tcW w:type="dxa" w:w="640"/>
+            <w:tcBorders>
+              <w:top w:val="single" w:color="B9D7F2" w:sz="4"/>
+              <w:left w:val="single" w:color="B9D7F2" w:sz="4"/>
+              <w:bottom w:val="single" w:color="B9D7F2" w:sz="4"/>
+              <w:right w:val="single" w:color="B9D7F2" w:sz="4"/>
+            </w:tcBorders>
+            <w:tcMar>
+              <w:top w:type="dxa" w:w="60"/>
+              <w:left w:type="dxa" w:w="90"/>
+              <w:bottom w:type="dxa" w:w="60"/>
+              <w:right w:type="dxa" w:w="90"/>
+            </w:tcMar>
+          </w:tcPr>
+          <w:p>
+            <w:pPr>
+              <w:spacing w:after="0" w:before="0"/>
+            </w:pPr>
+            <w:r>
+              <w:rPr>
+                <w:rFonts w:ascii="Arial" w:cs="Arial" w:eastAsia="Arial" w:hAnsi="Arial"/>
+                <w:color w:val="15202B"/>
+                <w:sz w:val="18"/>
+                <w:szCs w:val="18"/>
+              </w:rPr>
+              <w:t xml:space="preserve">35.3</w:t>
+            </w:r>
+          </w:p>
+        </w:tc>
+        <w:tc>
+          <w:tcPr>
+            <w:tcW w:type="dxa" w:w="3820"/>
+            <w:tcBorders>
+              <w:top w:val="single" w:color="B9D7F2" w:sz="4"/>
+              <w:left w:val="single" w:color="B9D7F2" w:sz="4"/>
+              <w:bottom w:val="single" w:color="B9D7F2" w:sz="4"/>
+              <w:right w:val="single" w:color="B9D7F2" w:sz="4"/>
+            </w:tcBorders>
+            <w:tcMar>
+              <w:top w:type="dxa" w:w="60"/>
+              <w:left w:type="dxa" w:w="90"/>
+              <w:bottom w:type="dxa" w:w="60"/>
+              <w:right w:type="dxa" w:w="90"/>
+            </w:tcMar>
+          </w:tcPr>
+          <w:p>
+            <w:pPr>
+              <w:spacing w:after="0" w:before="0"/>
+            </w:pPr>
+            <w:r>
+              <w:rPr>
+                <w:rFonts w:ascii="Arial" w:cs="Arial" w:eastAsia="Arial" w:hAnsi="Arial"/>
+                <w:color w:val="15202B"/>
+                <w:sz w:val="18"/>
+                <w:szCs w:val="18"/>
+              </w:rPr>
+              <w:t xml:space="preserve">Staff on To Do. Owner accepts or logs an order.</w:t>
+            </w:r>
+          </w:p>
+        </w:tc>
+        <w:tc>
+          <w:tcPr>
+            <w:tcW w:type="dxa" w:w="3900"/>
+            <w:tcBorders>
+              <w:top w:val="single" w:color="B9D7F2" w:sz="4"/>
+              <w:left w:val="single" w:color="B9D7F2" w:sz="4"/>
+              <w:bottom w:val="single" w:color="B9D7F2" w:sz="4"/>
+              <w:right w:val="single" w:color="B9D7F2" w:sz="4"/>
+            </w:tcBorders>
+            <w:tcMar>
+              <w:top w:type="dxa" w:w="60"/>
+              <w:left w:type="dxa" w:w="90"/>
+              <w:bottom w:type="dxa" w:w="60"/>
+              <w:right w:type="dxa" w:w="90"/>
+            </w:tcMar>
+          </w:tcPr>
+          <w:p>
+            <w:pPr>
+              <w:spacing w:after="0" w:before="0"/>
+            </w:pPr>
+            <w:r>
+              <w:rPr>
+                <w:rFonts w:ascii="Arial" w:cs="Arial" w:eastAsia="Arial" w:hAnsi="Arial"/>
+                <w:color w:val="15202B"/>
+                <w:sz w:val="18"/>
+                <w:szCs w:val="18"/>
+              </w:rPr>
+              <w:t xml:space="preserve">It appears in Processing on the staff screen right away.</w:t>
+            </w:r>
+          </w:p>
+        </w:tc>
+        <w:tc>
+          <w:tcPr>
+            <w:tcW w:type="dxa" w:w="900"/>
+            <w:tcBorders>
+              <w:top w:val="single" w:color="B9D7F2" w:sz="4"/>
+              <w:left w:val="single" w:color="B9D7F2" w:sz="4"/>
+              <w:bottom w:val="single" w:color="B9D7F2" w:sz="4"/>
+              <w:right w:val="single" w:color="B9D7F2" w:sz="4"/>
+            </w:tcBorders>
+            <w:tcMar>
+              <w:top w:type="dxa" w:w="60"/>
+              <w:left w:type="dxa" w:w="90"/>
+              <w:bottom w:type="dxa" w:w="60"/>
+              <w:right w:type="dxa" w:w="90"/>
+            </w:tcMar>
+          </w:tcPr>
+          <w:p>
+            <w:pPr>
+              <w:spacing w:after="0" w:before="0"/>
+            </w:pPr>
+            <w:r>
+              <w:rPr>
+                <w:rFonts w:ascii="Arial" w:cs="Arial" w:eastAsia="Arial" w:hAnsi="Arial"/>
+                <w:color w:val="15202B"/>
+                <w:sz w:val="18"/>
+                <w:szCs w:val="18"/>
+              </w:rPr>
+              <w:t xml:space="preserve">☐ Pass</w:t>
+            </w:r>
+          </w:p>
+          <w:p>
+            <w:pPr>
+              <w:spacing w:after="0" w:before="0"/>
+            </w:pPr>
+            <w:r>
+              <w:rPr>
+                <w:rFonts w:ascii="Arial" w:cs="Arial" w:eastAsia="Arial" w:hAnsi="Arial"/>
+                <w:color w:val="15202B"/>
+                <w:sz w:val="18"/>
+                <w:szCs w:val="18"/>
+              </w:rPr>
+              <w:t xml:space="preserve">☐ Fail</w:t>
+            </w:r>
+          </w:p>
+        </w:tc>
+        <w:tc>
+          <w:tcPr>
+            <w:tcW w:type="dxa" w:w="1206"/>
+            <w:tcBorders>
+              <w:top w:val="single" w:color="B9D7F2" w:sz="4"/>
+              <w:left w:val="single" w:color="B9D7F2" w:sz="4"/>
+              <w:bottom w:val="single" w:color="B9D7F2" w:sz="4"/>
+              <w:right w:val="single" w:color="B9D7F2" w:sz="4"/>
+            </w:tcBorders>
+            <w:tcMar>
+              <w:top w:type="dxa" w:w="60"/>
+              <w:left w:type="dxa" w:w="90"/>
+              <w:bottom w:type="dxa" w:w="60"/>
+              <w:right w:type="dxa" w:w="90"/>
+            </w:tcMar>
+          </w:tcPr>
+          <w:p>
+            <w:pPr>
+              <w:spacing w:after="0" w:before="0"/>
+            </w:pPr>
+            <w:r>
+              <w:rPr>
+                <w:rFonts w:ascii="Arial" w:cs="Arial" w:eastAsia="Arial" w:hAnsi="Arial"/>
+                <w:color w:val="15202B"/>
+                <w:sz w:val="18"/>
+                <w:szCs w:val="18"/>
+              </w:rPr>
+              <w:t xml:space="preserve"/>
+            </w:r>
+          </w:p>
+        </w:tc>
+      </w:tr>
+      <w:tr>
+        <w:trPr>
+          <w:cantSplit/>
+        </w:trPr>
+        <w:tc>
+          <w:tcPr>
+            <w:tcW w:type="dxa" w:w="640"/>
+            <w:tcBorders>
+              <w:top w:val="single" w:color="B9D7F2" w:sz="4"/>
+              <w:left w:val="single" w:color="B9D7F2" w:sz="4"/>
+              <w:bottom w:val="single" w:color="B9D7F2" w:sz="4"/>
+              <w:right w:val="single" w:color="B9D7F2" w:sz="4"/>
+            </w:tcBorders>
+            <w:shd w:fill="EAF4FD" w:color="auto" w:val="clear"/>
+            <w:tcMar>
+              <w:top w:type="dxa" w:w="60"/>
+              <w:left w:type="dxa" w:w="90"/>
+              <w:bottom w:type="dxa" w:w="60"/>
+              <w:right w:type="dxa" w:w="90"/>
+            </w:tcMar>
+          </w:tcPr>
+          <w:p>
+            <w:pPr>
+              <w:spacing w:after="0" w:before="0"/>
+            </w:pPr>
+            <w:r>
+              <w:rPr>
+                <w:rFonts w:ascii="Arial" w:cs="Arial" w:eastAsia="Arial" w:hAnsi="Arial"/>
+                <w:color w:val="15202B"/>
+                <w:sz w:val="18"/>
+                <w:szCs w:val="18"/>
+              </w:rPr>
+              <w:t xml:space="preserve">35.4</w:t>
+            </w:r>
+          </w:p>
+        </w:tc>
+        <w:tc>
+          <w:tcPr>
+            <w:tcW w:type="dxa" w:w="3820"/>
+            <w:tcBorders>
+              <w:top w:val="single" w:color="B9D7F2" w:sz="4"/>
+              <w:left w:val="single" w:color="B9D7F2" w:sz="4"/>
+              <w:bottom w:val="single" w:color="B9D7F2" w:sz="4"/>
+              <w:right w:val="single" w:color="B9D7F2" w:sz="4"/>
+            </w:tcBorders>
+            <w:shd w:fill="EAF4FD" w:color="auto" w:val="clear"/>
+            <w:tcMar>
+              <w:top w:type="dxa" w:w="60"/>
+              <w:left w:type="dxa" w:w="90"/>
+              <w:bottom w:type="dxa" w:w="60"/>
+              <w:right w:type="dxa" w:w="90"/>
+            </w:tcMar>
+          </w:tcPr>
+          <w:p>
+            <w:pPr>
+              <w:spacing w:after="0" w:before="0"/>
+            </w:pPr>
+            <w:r>
+              <w:rPr>
+                <w:rFonts w:ascii="Arial" w:cs="Arial" w:eastAsia="Arial" w:hAnsi="Arial"/>
+                <w:color w:val="15202B"/>
+                <w:sz w:val="18"/>
+                <w:szCs w:val="18"/>
+              </w:rPr>
+              <w:t xml:space="preserve">Rider on Deliveries. Staff marks orders Out for Delivery.</w:t>
+            </w:r>
+          </w:p>
+        </w:tc>
+        <w:tc>
+          <w:tcPr>
+            <w:tcW w:type="dxa" w:w="3900"/>
+            <w:tcBorders>
+              <w:top w:val="single" w:color="B9D7F2" w:sz="4"/>
+              <w:left w:val="single" w:color="B9D7F2" w:sz="4"/>
+              <w:bottom w:val="single" w:color="B9D7F2" w:sz="4"/>
+              <w:right w:val="single" w:color="B9D7F2" w:sz="4"/>
+            </w:tcBorders>
+            <w:shd w:fill="EAF4FD" w:color="auto" w:val="clear"/>
+            <w:tcMar>
+              <w:top w:type="dxa" w:w="60"/>
+              <w:left w:type="dxa" w:w="90"/>
+              <w:bottom w:type="dxa" w:w="60"/>
+              <w:right w:type="dxa" w:w="90"/>
+            </w:tcMar>
+          </w:tcPr>
+          <w:p>
+            <w:pPr>
+              <w:spacing w:after="0" w:before="0"/>
+            </w:pPr>
+            <w:r>
+              <w:rPr>
+                <w:rFonts w:ascii="Arial" w:cs="Arial" w:eastAsia="Arial" w:hAnsi="Arial"/>
+                <w:color w:val="15202B"/>
+                <w:sz w:val="18"/>
+                <w:szCs w:val="18"/>
+              </w:rPr>
+              <w:t xml:space="preserve">The rider's list fills right away.</w:t>
+            </w:r>
+          </w:p>
+        </w:tc>
+        <w:tc>
+          <w:tcPr>
+            <w:tcW w:type="dxa" w:w="900"/>
+            <w:tcBorders>
+              <w:top w:val="single" w:color="B9D7F2" w:sz="4"/>
+              <w:left w:val="single" w:color="B9D7F2" w:sz="4"/>
+              <w:bottom w:val="single" w:color="B9D7F2" w:sz="4"/>
+              <w:right w:val="single" w:color="B9D7F2" w:sz="4"/>
+            </w:tcBorders>
+            <w:shd w:fill="EAF4FD" w:color="auto" w:val="clear"/>
+            <w:tcMar>
+              <w:top w:type="dxa" w:w="60"/>
+              <w:left w:type="dxa" w:w="90"/>
+              <w:bottom w:type="dxa" w:w="60"/>
+              <w:right w:type="dxa" w:w="90"/>
+            </w:tcMar>
+          </w:tcPr>
+          <w:p>
+            <w:pPr>
+              <w:spacing w:after="0" w:before="0"/>
+            </w:pPr>
+            <w:r>
+              <w:rPr>
+                <w:rFonts w:ascii="Arial" w:cs="Arial" w:eastAsia="Arial" w:hAnsi="Arial"/>
+                <w:color w:val="15202B"/>
+                <w:sz w:val="18"/>
+                <w:szCs w:val="18"/>
+              </w:rPr>
+              <w:t xml:space="preserve">☐ Pass</w:t>
+            </w:r>
+          </w:p>
+          <w:p>
+            <w:pPr>
+              <w:spacing w:after="0" w:before="0"/>
+            </w:pPr>
+            <w:r>
+              <w:rPr>
+                <w:rFonts w:ascii="Arial" w:cs="Arial" w:eastAsia="Arial" w:hAnsi="Arial"/>
+                <w:color w:val="15202B"/>
+                <w:sz w:val="18"/>
+                <w:szCs w:val="18"/>
+              </w:rPr>
+              <w:t xml:space="preserve">☐ Fail</w:t>
+            </w:r>
+          </w:p>
+        </w:tc>
+        <w:tc>
+          <w:tcPr>
+            <w:tcW w:type="dxa" w:w="1206"/>
+            <w:tcBorders>
+              <w:top w:val="single" w:color="B9D7F2" w:sz="4"/>
+              <w:left w:val="single" w:color="B9D7F2" w:sz="4"/>
+              <w:bottom w:val="single" w:color="B9D7F2" w:sz="4"/>
+              <w:right w:val="single" w:color="B9D7F2" w:sz="4"/>
+            </w:tcBorders>
+            <w:shd w:fill="EAF4FD" w:color="auto" w:val="clear"/>
+            <w:tcMar>
+              <w:top w:type="dxa" w:w="60"/>
+              <w:left w:type="dxa" w:w="90"/>
+              <w:bottom w:type="dxa" w:w="60"/>
+              <w:right w:type="dxa" w:w="90"/>
+            </w:tcMar>
+          </w:tcPr>
+          <w:p>
+            <w:pPr>
+              <w:spacing w:after="0" w:before="0"/>
+            </w:pPr>
+            <w:r>
+              <w:rPr>
+                <w:rFonts w:ascii="Arial" w:cs="Arial" w:eastAsia="Arial" w:hAnsi="Arial"/>
+                <w:color w:val="15202B"/>
+                <w:sz w:val="18"/>
+                <w:szCs w:val="18"/>
+              </w:rPr>
+              <w:t xml:space="preserve"/>
+            </w:r>
+          </w:p>
+        </w:tc>
+      </w:tr>
+      <w:tr>
+        <w:trPr>
+          <w:cantSplit/>
+        </w:trPr>
+        <w:tc>
+          <w:tcPr>
+            <w:tcW w:type="dxa" w:w="640"/>
+            <w:tcBorders>
+              <w:top w:val="single" w:color="B9D7F2" w:sz="4"/>
+              <w:left w:val="single" w:color="B9D7F2" w:sz="4"/>
+              <w:bottom w:val="single" w:color="B9D7F2" w:sz="4"/>
+              <w:right w:val="single" w:color="B9D7F2" w:sz="4"/>
+            </w:tcBorders>
+            <w:tcMar>
+              <w:top w:type="dxa" w:w="60"/>
+              <w:left w:type="dxa" w:w="90"/>
+              <w:bottom w:type="dxa" w:w="60"/>
+              <w:right w:type="dxa" w:w="90"/>
+            </w:tcMar>
+          </w:tcPr>
+          <w:p>
+            <w:pPr>
+              <w:spacing w:after="0" w:before="0"/>
+            </w:pPr>
+            <w:r>
+              <w:rPr>
+                <w:rFonts w:ascii="Arial" w:cs="Arial" w:eastAsia="Arial" w:hAnsi="Arial"/>
+                <w:color w:val="15202B"/>
+                <w:sz w:val="18"/>
+                <w:szCs w:val="18"/>
+              </w:rPr>
+              <w:t xml:space="preserve">35.5</w:t>
+            </w:r>
+          </w:p>
+        </w:tc>
+        <w:tc>
+          <w:tcPr>
+            <w:tcW w:type="dxa" w:w="3820"/>
+            <w:tcBorders>
+              <w:top w:val="single" w:color="B9D7F2" w:sz="4"/>
+              <w:left w:val="single" w:color="B9D7F2" w:sz="4"/>
+              <w:bottom w:val="single" w:color="B9D7F2" w:sz="4"/>
+              <w:right w:val="single" w:color="B9D7F2" w:sz="4"/>
+            </w:tcBorders>
+            <w:tcMar>
+              <w:top w:type="dxa" w:w="60"/>
+              <w:left w:type="dxa" w:w="90"/>
+              <w:bottom w:type="dxa" w:w="60"/>
+              <w:right w:type="dxa" w:w="90"/>
+            </w:tcMar>
+          </w:tcPr>
+          <w:p>
+            <w:pPr>
+              <w:spacing w:after="0" w:before="0"/>
+            </w:pPr>
+            <w:r>
+              <w:rPr>
+                <w:rFonts w:ascii="Arial" w:cs="Arial" w:eastAsia="Arial" w:hAnsi="Arial"/>
+                <w:color w:val="15202B"/>
+                <w:sz w:val="18"/>
+                <w:szCs w:val="18"/>
+              </w:rPr>
+              <w:t xml:space="preserve">Owner on Home. Rider marks Delivered.</w:t>
+            </w:r>
+          </w:p>
+        </w:tc>
+        <w:tc>
+          <w:tcPr>
+            <w:tcW w:type="dxa" w:w="3900"/>
+            <w:tcBorders>
+              <w:top w:val="single" w:color="B9D7F2" w:sz="4"/>
+              <w:left w:val="single" w:color="B9D7F2" w:sz="4"/>
+              <w:bottom w:val="single" w:color="B9D7F2" w:sz="4"/>
+              <w:right w:val="single" w:color="B9D7F2" w:sz="4"/>
+            </w:tcBorders>
+            <w:tcMar>
+              <w:top w:type="dxa" w:w="60"/>
+              <w:left w:type="dxa" w:w="90"/>
+              <w:bottom w:type="dxa" w:w="60"/>
+              <w:right w:type="dxa" w:w="90"/>
+            </w:tcMar>
+          </w:tcPr>
+          <w:p>
+            <w:pPr>
+              <w:spacing w:after="0" w:before="0"/>
+            </w:pPr>
+            <w:r>
+              <w:rPr>
+                <w:rFonts w:ascii="Arial" w:cs="Arial" w:eastAsia="Arial" w:hAnsi="Arial"/>
+                <w:color w:val="15202B"/>
+                <w:sz w:val="18"/>
+                <w:szCs w:val="18"/>
+              </w:rPr>
+              <w:t xml:space="preserve">Delivered tile and Sales update right away.</w:t>
+            </w:r>
+          </w:p>
+        </w:tc>
+        <w:tc>
+          <w:tcPr>
+            <w:tcW w:type="dxa" w:w="900"/>
+            <w:tcBorders>
+              <w:top w:val="single" w:color="B9D7F2" w:sz="4"/>
+              <w:left w:val="single" w:color="B9D7F2" w:sz="4"/>
+              <w:bottom w:val="single" w:color="B9D7F2" w:sz="4"/>
+              <w:right w:val="single" w:color="B9D7F2" w:sz="4"/>
+            </w:tcBorders>
+            <w:tcMar>
+              <w:top w:type="dxa" w:w="60"/>
+              <w:left w:type="dxa" w:w="90"/>
+              <w:bottom w:type="dxa" w:w="60"/>
+              <w:right w:type="dxa" w:w="90"/>
+            </w:tcMar>
+          </w:tcPr>
+          <w:p>
+            <w:pPr>
+              <w:spacing w:after="0" w:before="0"/>
+            </w:pPr>
+            <w:r>
+              <w:rPr>
+                <w:rFonts w:ascii="Arial" w:cs="Arial" w:eastAsia="Arial" w:hAnsi="Arial"/>
+                <w:color w:val="15202B"/>
+                <w:sz w:val="18"/>
+                <w:szCs w:val="18"/>
+              </w:rPr>
+              <w:t xml:space="preserve">☐ Pass</w:t>
+            </w:r>
+          </w:p>
+          <w:p>
+            <w:pPr>
+              <w:spacing w:after="0" w:before="0"/>
+            </w:pPr>
+            <w:r>
+              <w:rPr>
+                <w:rFonts w:ascii="Arial" w:cs="Arial" w:eastAsia="Arial" w:hAnsi="Arial"/>
+                <w:color w:val="15202B"/>
+                <w:sz w:val="18"/>
+                <w:szCs w:val="18"/>
+              </w:rPr>
+              <w:t xml:space="preserve">☐ Fail</w:t>
+            </w:r>
+          </w:p>
+        </w:tc>
+        <w:tc>
+          <w:tcPr>
+            <w:tcW w:type="dxa" w:w="1206"/>
+            <w:tcBorders>
+              <w:top w:val="single" w:color="B9D7F2" w:sz="4"/>
+              <w:left w:val="single" w:color="B9D7F2" w:sz="4"/>
+              <w:bottom w:val="single" w:color="B9D7F2" w:sz="4"/>
+              <w:right w:val="single" w:color="B9D7F2" w:sz="4"/>
+            </w:tcBorders>
+            <w:tcMar>
+              <w:top w:type="dxa" w:w="60"/>
+              <w:left w:type="dxa" w:w="90"/>
+              <w:bottom w:type="dxa" w:w="60"/>
+              <w:right w:type="dxa" w:w="90"/>
+            </w:tcMar>
+          </w:tcPr>
+          <w:p>
+            <w:pPr>
+              <w:spacing w:after="0" w:before="0"/>
+            </w:pPr>
+            <w:r>
+              <w:rPr>
+                <w:rFonts w:ascii="Arial" w:cs="Arial" w:eastAsia="Arial" w:hAnsi="Arial"/>
+                <w:color w:val="15202B"/>
+                <w:sz w:val="18"/>
+                <w:szCs w:val="18"/>
+              </w:rPr>
+              <w:t xml:space="preserve"/>
+            </w:r>
+          </w:p>
+        </w:tc>
+      </w:tr>
+      <w:tr>
+        <w:trPr>
+          <w:cantSplit/>
+        </w:trPr>
+        <w:tc>
+          <w:tcPr>
+            <w:tcW w:type="dxa" w:w="640"/>
+            <w:tcBorders>
+              <w:top w:val="single" w:color="B9D7F2" w:sz="4"/>
+              <w:left w:val="single" w:color="B9D7F2" w:sz="4"/>
+              <w:bottom w:val="single" w:color="B9D7F2" w:sz="4"/>
+              <w:right w:val="single" w:color="B9D7F2" w:sz="4"/>
+            </w:tcBorders>
+            <w:shd w:fill="EAF4FD" w:color="auto" w:val="clear"/>
+            <w:tcMar>
+              <w:top w:type="dxa" w:w="60"/>
+              <w:left w:type="dxa" w:w="90"/>
+              <w:bottom w:type="dxa" w:w="60"/>
+              <w:right w:type="dxa" w:w="90"/>
+            </w:tcMar>
+          </w:tcPr>
+          <w:p>
+            <w:pPr>
+              <w:spacing w:after="0" w:before="0"/>
+            </w:pPr>
+            <w:r>
+              <w:rPr>
+                <w:rFonts w:ascii="Arial" w:cs="Arial" w:eastAsia="Arial" w:hAnsi="Arial"/>
+                <w:color w:val="15202B"/>
+                <w:sz w:val="18"/>
+                <w:szCs w:val="18"/>
+              </w:rPr>
+              <w:t xml:space="preserve">35.6</w:t>
+            </w:r>
+          </w:p>
+        </w:tc>
+        <w:tc>
+          <w:tcPr>
+            <w:tcW w:type="dxa" w:w="3820"/>
+            <w:tcBorders>
+              <w:top w:val="single" w:color="B9D7F2" w:sz="4"/>
+              <w:left w:val="single" w:color="B9D7F2" w:sz="4"/>
+              <w:bottom w:val="single" w:color="B9D7F2" w:sz="4"/>
+              <w:right w:val="single" w:color="B9D7F2" w:sz="4"/>
+            </w:tcBorders>
+            <w:shd w:fill="EAF4FD" w:color="auto" w:val="clear"/>
+            <w:tcMar>
+              <w:top w:type="dxa" w:w="60"/>
+              <w:left w:type="dxa" w:w="90"/>
+              <w:bottom w:type="dxa" w:w="60"/>
+              <w:right w:type="dxa" w:w="90"/>
+            </w:tcMar>
+          </w:tcPr>
+          <w:p>
+            <w:pPr>
+              <w:spacing w:after="0" w:before="0"/>
+            </w:pPr>
+            <w:r>
+              <w:rPr>
+                <w:rFonts w:ascii="Arial" w:cs="Arial" w:eastAsia="Arial" w:hAnsi="Arial"/>
+                <w:color w:val="15202B"/>
+                <w:sz w:val="18"/>
+                <w:szCs w:val="18"/>
+              </w:rPr>
+              <w:t xml:space="preserve">Customer on My Orders. Rider marks Not delivered.</w:t>
+            </w:r>
+          </w:p>
+        </w:tc>
+        <w:tc>
+          <w:tcPr>
+            <w:tcW w:type="dxa" w:w="3900"/>
+            <w:tcBorders>
+              <w:top w:val="single" w:color="B9D7F2" w:sz="4"/>
+              <w:left w:val="single" w:color="B9D7F2" w:sz="4"/>
+              <w:bottom w:val="single" w:color="B9D7F2" w:sz="4"/>
+              <w:right w:val="single" w:color="B9D7F2" w:sz="4"/>
+            </w:tcBorders>
+            <w:shd w:fill="EAF4FD" w:color="auto" w:val="clear"/>
+            <w:tcMar>
+              <w:top w:type="dxa" w:w="60"/>
+              <w:left w:type="dxa" w:w="90"/>
+              <w:bottom w:type="dxa" w:w="60"/>
+              <w:right w:type="dxa" w:w="90"/>
+            </w:tcMar>
+          </w:tcPr>
+          <w:p>
+            <w:pPr>
+              <w:spacing w:after="0" w:before="0"/>
+            </w:pPr>
+            <w:r>
+              <w:rPr>
+                <w:rFonts w:ascii="Arial" w:cs="Arial" w:eastAsia="Arial" w:hAnsi="Arial"/>
+                <w:color w:val="15202B"/>
+                <w:sz w:val="18"/>
+                <w:szCs w:val="18"/>
+              </w:rPr>
+              <w:t xml:space="preserve">Status changes and the banner "Not delivered" shows.</w:t>
+            </w:r>
+          </w:p>
+        </w:tc>
+        <w:tc>
+          <w:tcPr>
+            <w:tcW w:type="dxa" w:w="900"/>
+            <w:tcBorders>
+              <w:top w:val="single" w:color="B9D7F2" w:sz="4"/>
+              <w:left w:val="single" w:color="B9D7F2" w:sz="4"/>
+              <w:bottom w:val="single" w:color="B9D7F2" w:sz="4"/>
+              <w:right w:val="single" w:color="B9D7F2" w:sz="4"/>
+            </w:tcBorders>
+            <w:shd w:fill="EAF4FD" w:color="auto" w:val="clear"/>
+            <w:tcMar>
+              <w:top w:type="dxa" w:w="60"/>
+              <w:left w:type="dxa" w:w="90"/>
+              <w:bottom w:type="dxa" w:w="60"/>
+              <w:right w:type="dxa" w:w="90"/>
+            </w:tcMar>
+          </w:tcPr>
+          <w:p>
+            <w:pPr>
+              <w:spacing w:after="0" w:before="0"/>
+            </w:pPr>
+            <w:r>
+              <w:rPr>
+                <w:rFonts w:ascii="Arial" w:cs="Arial" w:eastAsia="Arial" w:hAnsi="Arial"/>
+                <w:color w:val="15202B"/>
+                <w:sz w:val="18"/>
+                <w:szCs w:val="18"/>
+              </w:rPr>
+              <w:t xml:space="preserve">☐ Pass</w:t>
+            </w:r>
+          </w:p>
+          <w:p>
+            <w:pPr>
+              <w:spacing w:after="0" w:before="0"/>
+            </w:pPr>
+            <w:r>
+              <w:rPr>
+                <w:rFonts w:ascii="Arial" w:cs="Arial" w:eastAsia="Arial" w:hAnsi="Arial"/>
+                <w:color w:val="15202B"/>
+                <w:sz w:val="18"/>
+                <w:szCs w:val="18"/>
+              </w:rPr>
+              <w:t xml:space="preserve">☐ Fail</w:t>
+            </w:r>
+          </w:p>
+        </w:tc>
+        <w:tc>
+          <w:tcPr>
+            <w:tcW w:type="dxa" w:w="1206"/>
+            <w:tcBorders>
+              <w:top w:val="single" w:color="B9D7F2" w:sz="4"/>
+              <w:left w:val="single" w:color="B9D7F2" w:sz="4"/>
+              <w:bottom w:val="single" w:color="B9D7F2" w:sz="4"/>
+              <w:right w:val="single" w:color="B9D7F2" w:sz="4"/>
+            </w:tcBorders>
+            <w:shd w:fill="EAF4FD" w:color="auto" w:val="clear"/>
+            <w:tcMar>
+              <w:top w:type="dxa" w:w="60"/>
+              <w:left w:type="dxa" w:w="90"/>
+              <w:bottom w:type="dxa" w:w="60"/>
+              <w:right w:type="dxa" w:w="90"/>
+            </w:tcMar>
+          </w:tcPr>
+          <w:p>
+            <w:pPr>
+              <w:spacing w:after="0" w:before="0"/>
+            </w:pPr>
+            <w:r>
+              <w:rPr>
+                <w:rFonts w:ascii="Arial" w:cs="Arial" w:eastAsia="Arial" w:hAnsi="Arial"/>
+                <w:color w:val="15202B"/>
+                <w:sz w:val="18"/>
+                <w:szCs w:val="18"/>
+              </w:rPr>
+              <w:t xml:space="preserve"/>
+            </w:r>
+          </w:p>
+        </w:tc>
+      </w:tr>
+      <w:tr>
+        <w:trPr>
+          <w:cantSplit/>
+        </w:trPr>
+        <w:tc>
+          <w:tcPr>
+            <w:tcW w:type="dxa" w:w="640"/>
+            <w:tcBorders>
+              <w:top w:val="single" w:color="B9D7F2" w:sz="4"/>
+              <w:left w:val="single" w:color="B9D7F2" w:sz="4"/>
+              <w:bottom w:val="single" w:color="B9D7F2" w:sz="4"/>
+              <w:right w:val="single" w:color="B9D7F2" w:sz="4"/>
+            </w:tcBorders>
+            <w:tcMar>
+              <w:top w:type="dxa" w:w="60"/>
+              <w:left w:type="dxa" w:w="90"/>
+              <w:bottom w:type="dxa" w:w="60"/>
+              <w:right w:type="dxa" w:w="90"/>
+            </w:tcMar>
+          </w:tcPr>
+          <w:p>
+            <w:pPr>
+              <w:spacing w:after="0" w:before="0"/>
+            </w:pPr>
+            <w:r>
+              <w:rPr>
+                <w:rFonts w:ascii="Arial" w:cs="Arial" w:eastAsia="Arial" w:hAnsi="Arial"/>
+                <w:color w:val="15202B"/>
+                <w:sz w:val="18"/>
+                <w:szCs w:val="18"/>
+              </w:rPr>
+              <w:t xml:space="preserve">35.7</w:t>
+            </w:r>
+          </w:p>
+        </w:tc>
+        <w:tc>
+          <w:tcPr>
+            <w:tcW w:type="dxa" w:w="3820"/>
+            <w:tcBorders>
+              <w:top w:val="single" w:color="B9D7F2" w:sz="4"/>
+              <w:left w:val="single" w:color="B9D7F2" w:sz="4"/>
+              <w:bottom w:val="single" w:color="B9D7F2" w:sz="4"/>
+              <w:right w:val="single" w:color="B9D7F2" w:sz="4"/>
+            </w:tcBorders>
+            <w:tcMar>
+              <w:top w:type="dxa" w:w="60"/>
+              <w:left w:type="dxa" w:w="90"/>
+              <w:bottom w:type="dxa" w:w="60"/>
+              <w:right w:type="dxa" w:w="90"/>
+            </w:tcMar>
+          </w:tcPr>
+          <w:p>
+            <w:pPr>
+              <w:spacing w:after="0" w:before="0"/>
+            </w:pPr>
+            <w:r>
+              <w:rPr>
+                <w:rFonts w:ascii="Arial" w:cs="Arial" w:eastAsia="Arial" w:hAnsi="Arial"/>
+                <w:color w:val="15202B"/>
+                <w:sz w:val="18"/>
+                <w:szCs w:val="18"/>
+              </w:rPr>
+              <w:t xml:space="preserve">Owner: the bell number.</w:t>
+            </w:r>
+          </w:p>
+        </w:tc>
+        <w:tc>
+          <w:tcPr>
+            <w:tcW w:type="dxa" w:w="3900"/>
+            <w:tcBorders>
+              <w:top w:val="single" w:color="B9D7F2" w:sz="4"/>
+              <w:left w:val="single" w:color="B9D7F2" w:sz="4"/>
+              <w:bottom w:val="single" w:color="B9D7F2" w:sz="4"/>
+              <w:right w:val="single" w:color="B9D7F2" w:sz="4"/>
+            </w:tcBorders>
+            <w:tcMar>
+              <w:top w:type="dxa" w:w="60"/>
+              <w:left w:type="dxa" w:w="90"/>
+              <w:bottom w:type="dxa" w:w="60"/>
+              <w:right w:type="dxa" w:w="90"/>
+            </w:tcMar>
+          </w:tcPr>
+          <w:p>
+            <w:pPr>
+              <w:spacing w:after="0" w:before="0"/>
+            </w:pPr>
+            <w:r>
+              <w:rPr>
+                <w:rFonts w:ascii="Arial" w:cs="Arial" w:eastAsia="Arial" w:hAnsi="Arial"/>
+                <w:color w:val="15202B"/>
+                <w:sz w:val="18"/>
+                <w:szCs w:val="18"/>
+              </w:rPr>
+              <w:t xml:space="preserve">Goes up as soon as an alert is made, without waiting.</w:t>
+            </w:r>
+          </w:p>
+        </w:tc>
+        <w:tc>
+          <w:tcPr>
+            <w:tcW w:type="dxa" w:w="900"/>
+            <w:tcBorders>
+              <w:top w:val="single" w:color="B9D7F2" w:sz="4"/>
+              <w:left w:val="single" w:color="B9D7F2" w:sz="4"/>
+              <w:bottom w:val="single" w:color="B9D7F2" w:sz="4"/>
+              <w:right w:val="single" w:color="B9D7F2" w:sz="4"/>
+            </w:tcBorders>
+            <w:tcMar>
+              <w:top w:type="dxa" w:w="60"/>
+              <w:left w:type="dxa" w:w="90"/>
+              <w:bottom w:type="dxa" w:w="60"/>
+              <w:right w:type="dxa" w:w="90"/>
+            </w:tcMar>
+          </w:tcPr>
+          <w:p>
+            <w:pPr>
+              <w:spacing w:after="0" w:before="0"/>
+            </w:pPr>
+            <w:r>
+              <w:rPr>
+                <w:rFonts w:ascii="Arial" w:cs="Arial" w:eastAsia="Arial" w:hAnsi="Arial"/>
+                <w:color w:val="15202B"/>
+                <w:sz w:val="18"/>
+                <w:szCs w:val="18"/>
+              </w:rPr>
+              <w:t xml:space="preserve">☐ Pass</w:t>
+            </w:r>
+          </w:p>
+          <w:p>
+            <w:pPr>
+              <w:spacing w:after="0" w:before="0"/>
+            </w:pPr>
+            <w:r>
+              <w:rPr>
+                <w:rFonts w:ascii="Arial" w:cs="Arial" w:eastAsia="Arial" w:hAnsi="Arial"/>
+                <w:color w:val="15202B"/>
+                <w:sz w:val="18"/>
+                <w:szCs w:val="18"/>
+              </w:rPr>
+              <w:t xml:space="preserve">☐ Fail</w:t>
+            </w:r>
+          </w:p>
+        </w:tc>
+        <w:tc>
+          <w:tcPr>
+            <w:tcW w:type="dxa" w:w="1206"/>
+            <w:tcBorders>
+              <w:top w:val="single" w:color="B9D7F2" w:sz="4"/>
+              <w:left w:val="single" w:color="B9D7F2" w:sz="4"/>
+              <w:bottom w:val="single" w:color="B9D7F2" w:sz="4"/>
+              <w:right w:val="single" w:color="B9D7F2" w:sz="4"/>
+            </w:tcBorders>
+            <w:tcMar>
+              <w:top w:type="dxa" w:w="60"/>
+              <w:left w:type="dxa" w:w="90"/>
+              <w:bottom w:type="dxa" w:w="60"/>
+              <w:right w:type="dxa" w:w="90"/>
+            </w:tcMar>
+          </w:tcPr>
+          <w:p>
+            <w:pPr>
+              <w:spacing w:after="0" w:before="0"/>
+            </w:pPr>
+            <w:r>
+              <w:rPr>
+                <w:rFonts w:ascii="Arial" w:cs="Arial" w:eastAsia="Arial" w:hAnsi="Arial"/>
+                <w:color w:val="15202B"/>
+                <w:sz w:val="18"/>
+                <w:szCs w:val="18"/>
+              </w:rPr>
+              <w:t xml:space="preserve"/>
+            </w:r>
+          </w:p>
+        </w:tc>
+      </w:tr>
+      <w:tr>
+        <w:trPr>
+          <w:cantSplit/>
+        </w:trPr>
+        <w:tc>
+          <w:tcPr>
+            <w:tcW w:type="dxa" w:w="640"/>
+            <w:tcBorders>
+              <w:top w:val="single" w:color="B9D7F2" w:sz="4"/>
+              <w:left w:val="single" w:color="B9D7F2" w:sz="4"/>
+              <w:bottom w:val="single" w:color="B9D7F2" w:sz="4"/>
+              <w:right w:val="single" w:color="B9D7F2" w:sz="4"/>
+            </w:tcBorders>
+            <w:shd w:fill="EAF4FD" w:color="auto" w:val="clear"/>
+            <w:tcMar>
+              <w:top w:type="dxa" w:w="60"/>
+              <w:left w:type="dxa" w:w="90"/>
+              <w:bottom w:type="dxa" w:w="60"/>
+              <w:right w:type="dxa" w:w="90"/>
+            </w:tcMar>
+          </w:tcPr>
+          <w:p>
+            <w:pPr>
+              <w:spacing w:after="0" w:before="0"/>
+            </w:pPr>
+            <w:r>
+              <w:rPr>
+                <w:rFonts w:ascii="Arial" w:cs="Arial" w:eastAsia="Arial" w:hAnsi="Arial"/>
+                <w:color w:val="15202B"/>
+                <w:sz w:val="18"/>
+                <w:szCs w:val="18"/>
+              </w:rPr>
+              <w:t xml:space="preserve">35.8</w:t>
+            </w:r>
+          </w:p>
+        </w:tc>
+        <w:tc>
+          <w:tcPr>
+            <w:tcW w:type="dxa" w:w="3820"/>
+            <w:tcBorders>
+              <w:top w:val="single" w:color="B9D7F2" w:sz="4"/>
+              <w:left w:val="single" w:color="B9D7F2" w:sz="4"/>
+              <w:bottom w:val="single" w:color="B9D7F2" w:sz="4"/>
+              <w:right w:val="single" w:color="B9D7F2" w:sz="4"/>
+            </w:tcBorders>
+            <w:shd w:fill="EAF4FD" w:color="auto" w:val="clear"/>
+            <w:tcMar>
+              <w:top w:type="dxa" w:w="60"/>
+              <w:left w:type="dxa" w:w="90"/>
+              <w:bottom w:type="dxa" w:w="60"/>
+              <w:right w:type="dxa" w:w="90"/>
+            </w:tcMar>
+          </w:tcPr>
+          <w:p>
+            <w:pPr>
+              <w:spacing w:after="0" w:before="0"/>
+            </w:pPr>
+            <w:r>
+              <w:rPr>
+                <w:rFonts w:ascii="Arial" w:cs="Arial" w:eastAsia="Arial" w:hAnsi="Arial"/>
+                <w:color w:val="15202B"/>
+                <w:sz w:val="18"/>
+                <w:szCs w:val="18"/>
+              </w:rPr>
+              <w:t xml:space="preserve">Stop the server window for a few seconds and start it again.</w:t>
+            </w:r>
+          </w:p>
+        </w:tc>
+        <w:tc>
+          <w:tcPr>
+            <w:tcW w:type="dxa" w:w="3900"/>
+            <w:tcBorders>
+              <w:top w:val="single" w:color="B9D7F2" w:sz="4"/>
+              <w:left w:val="single" w:color="B9D7F2" w:sz="4"/>
+              <w:bottom w:val="single" w:color="B9D7F2" w:sz="4"/>
+              <w:right w:val="single" w:color="B9D7F2" w:sz="4"/>
+            </w:tcBorders>
+            <w:shd w:fill="EAF4FD" w:color="auto" w:val="clear"/>
+            <w:tcMar>
+              <w:top w:type="dxa" w:w="60"/>
+              <w:left w:type="dxa" w:w="90"/>
+              <w:bottom w:type="dxa" w:w="60"/>
+              <w:right w:type="dxa" w:w="90"/>
+            </w:tcMar>
+          </w:tcPr>
+          <w:p>
+            <w:pPr>
+              <w:spacing w:after="0" w:before="0"/>
+            </w:pPr>
+            <w:r>
+              <w:rPr>
+                <w:rFonts w:ascii="Arial" w:cs="Arial" w:eastAsia="Arial" w:hAnsi="Arial"/>
+                <w:color w:val="15202B"/>
+                <w:sz w:val="18"/>
+                <w:szCs w:val="18"/>
+              </w:rPr>
+              <w:t xml:space="preserve">The app reconnects by itself; updates work again (screens also check every minute).</w:t>
             </w:r>
           </w:p>
         </w:tc>

</xml_diff>

<commit_message>
T36 alert preferences, push token registration and Firebase push sender, customer alert wording
Co-Authored-By: Claude Opus 5.5 <noreply@anthropic.com>
Claude-Session: https://claude.ai/code/session_01DasQCNUJBbLyCWkvv4Qmw3
</commit_message>
<xml_diff>
--- a/docs/testing/Mangao-Testing-Checklist.docx
+++ b/docs/testing/Mangao-Testing-Checklist.docx
@@ -30,7 +30,7 @@
           <w:sz w:val="19"/>
           <w:szCs w:val="19"/>
         </w:rPr>
-        <w:t xml:space="preserve">Steps built but not yet checked in Chrome: 26 steps, 207 checks. Updated Oct 14, 2026, 1:18 AM.</w:t>
+        <w:t xml:space="preserve">Steps built but not yet checked in Chrome: 27 steps, 217 checks. Updated Oct 14, 2026, 1:20 AM.</w:t>
       </w:r>
     </w:p>
     <w:p>
@@ -5521,6 +5521,166 @@
           </w:p>
         </w:tc>
       </w:tr>
+      <w:tr>
+        <w:trPr>
+          <w:cantSplit/>
+        </w:trPr>
+        <w:tc>
+          <w:tcPr>
+            <w:tcW w:type="dxa" w:w="900"/>
+            <w:tcBorders>
+              <w:top w:val="single" w:color="B9D7F2" w:sz="4"/>
+              <w:left w:val="single" w:color="B9D7F2" w:sz="4"/>
+              <w:bottom w:val="single" w:color="B9D7F2" w:sz="4"/>
+              <w:right w:val="single" w:color="B9D7F2" w:sz="4"/>
+            </w:tcBorders>
+            <w:tcMar>
+              <w:top w:type="dxa" w:w="60"/>
+              <w:left w:type="dxa" w:w="90"/>
+              <w:bottom w:type="dxa" w:w="60"/>
+              <w:right w:type="dxa" w:w="90"/>
+            </w:tcMar>
+          </w:tcPr>
+          <w:p>
+            <w:pPr>
+              <w:spacing w:after="0" w:before="0"/>
+            </w:pPr>
+            <w:r>
+              <w:rPr>
+                <w:rFonts w:ascii="Arial" w:cs="Arial" w:eastAsia="Arial" w:hAnsi="Arial"/>
+                <w:color w:val="15202B"/>
+                <w:sz w:val="18"/>
+                <w:szCs w:val="18"/>
+              </w:rPr>
+              <w:t xml:space="preserve">36</w:t>
+            </w:r>
+          </w:p>
+        </w:tc>
+        <w:tc>
+          <w:tcPr>
+            <w:tcW w:type="dxa" w:w="4400"/>
+            <w:tcBorders>
+              <w:top w:val="single" w:color="B9D7F2" w:sz="4"/>
+              <w:left w:val="single" w:color="B9D7F2" w:sz="4"/>
+              <w:bottom w:val="single" w:color="B9D7F2" w:sz="4"/>
+              <w:right w:val="single" w:color="B9D7F2" w:sz="4"/>
+            </w:tcBorders>
+            <w:tcMar>
+              <w:top w:type="dxa" w:w="60"/>
+              <w:left w:type="dxa" w:w="90"/>
+              <w:bottom w:type="dxa" w:w="60"/>
+              <w:right w:type="dxa" w:w="90"/>
+            </w:tcMar>
+          </w:tcPr>
+          <w:p>
+            <w:pPr>
+              <w:spacing w:after="0" w:before="0"/>
+            </w:pPr>
+            <w:r>
+              <w:rPr>
+                <w:rFonts w:ascii="Arial" w:cs="Arial" w:eastAsia="Arial" w:hAnsi="Arial"/>
+                <w:color w:val="15202B"/>
+                <w:sz w:val="18"/>
+                <w:szCs w:val="18"/>
+              </w:rPr>
+              <w:t xml:space="preserve">Push notifications and alert preferences</w:t>
+            </w:r>
+          </w:p>
+        </w:tc>
+        <w:tc>
+          <w:tcPr>
+            <w:tcW w:type="dxa" w:w="2600"/>
+            <w:tcBorders>
+              <w:top w:val="single" w:color="B9D7F2" w:sz="4"/>
+              <w:left w:val="single" w:color="B9D7F2" w:sz="4"/>
+              <w:bottom w:val="single" w:color="B9D7F2" w:sz="4"/>
+              <w:right w:val="single" w:color="B9D7F2" w:sz="4"/>
+            </w:tcBorders>
+            <w:tcMar>
+              <w:top w:type="dxa" w:w="60"/>
+              <w:left w:type="dxa" w:w="90"/>
+              <w:bottom w:type="dxa" w:w="60"/>
+              <w:right w:type="dxa" w:w="90"/>
+            </w:tcMar>
+          </w:tcPr>
+          <w:p>
+            <w:pPr>
+              <w:spacing w:after="0" w:before="0"/>
+            </w:pPr>
+            <w:r>
+              <w:rPr>
+                <w:rFonts w:ascii="Arial" w:cs="Arial" w:eastAsia="Arial" w:hAnsi="Arial"/>
+                <w:color w:val="15202B"/>
+                <w:sz w:val="18"/>
+                <w:szCs w:val="18"/>
+              </w:rPr>
+              <w:t xml:space="preserve">Customer 11, Admin More 4</w:t>
+            </w:r>
+          </w:p>
+        </w:tc>
+        <w:tc>
+          <w:tcPr>
+            <w:tcW w:type="dxa" w:w="1300"/>
+            <w:tcBorders>
+              <w:top w:val="single" w:color="B9D7F2" w:sz="4"/>
+              <w:left w:val="single" w:color="B9D7F2" w:sz="4"/>
+              <w:bottom w:val="single" w:color="B9D7F2" w:sz="4"/>
+              <w:right w:val="single" w:color="B9D7F2" w:sz="4"/>
+            </w:tcBorders>
+            <w:tcMar>
+              <w:top w:type="dxa" w:w="60"/>
+              <w:left w:type="dxa" w:w="90"/>
+              <w:bottom w:type="dxa" w:w="60"/>
+              <w:right w:type="dxa" w:w="90"/>
+            </w:tcMar>
+          </w:tcPr>
+          <w:p>
+            <w:pPr>
+              <w:spacing w:after="0" w:before="0"/>
+            </w:pPr>
+            <w:r>
+              <w:rPr>
+                <w:rFonts w:ascii="Arial" w:cs="Arial" w:eastAsia="Arial" w:hAnsi="Arial"/>
+                <w:color w:val="15202B"/>
+                <w:sz w:val="18"/>
+                <w:szCs w:val="18"/>
+              </w:rPr>
+              <w:t xml:space="preserve">10</w:t>
+            </w:r>
+          </w:p>
+        </w:tc>
+        <w:tc>
+          <w:tcPr>
+            <w:tcW w:type="dxa" w:w="1266"/>
+            <w:tcBorders>
+              <w:top w:val="single" w:color="B9D7F2" w:sz="4"/>
+              <w:left w:val="single" w:color="B9D7F2" w:sz="4"/>
+              <w:bottom w:val="single" w:color="B9D7F2" w:sz="4"/>
+              <w:right w:val="single" w:color="B9D7F2" w:sz="4"/>
+            </w:tcBorders>
+            <w:tcMar>
+              <w:top w:type="dxa" w:w="60"/>
+              <w:left w:type="dxa" w:w="90"/>
+              <w:bottom w:type="dxa" w:w="60"/>
+              <w:right w:type="dxa" w:w="90"/>
+            </w:tcMar>
+          </w:tcPr>
+          <w:p>
+            <w:pPr>
+              <w:spacing w:after="0" w:before="0"/>
+            </w:pPr>
+            <w:r>
+              <w:rPr>
+                <w:rFonts w:ascii="Arial" w:cs="Arial" w:eastAsia="Arial" w:hAnsi="Arial"/>
+                <w:color w:val="15202B"/>
+                <w:sz w:val="18"/>
+                <w:szCs w:val="18"/>
+              </w:rPr>
+              <w:t xml:space="preserve">☐ Yes  ☐ No</w:t>
+            </w:r>
+          </w:p>
+        </w:tc>
+      </w:tr>
     </w:tbl>
     <w:p>
       <w:pPr>
@@ -48871,6 +49031,2055 @@
                 <w:szCs w:val="18"/>
               </w:rPr>
               <w:t xml:space="preserve">The app reconnects by itself; updates work again (screens also check every minute).</w:t>
+            </w:r>
+          </w:p>
+        </w:tc>
+        <w:tc>
+          <w:tcPr>
+            <w:tcW w:type="dxa" w:w="900"/>
+            <w:tcBorders>
+              <w:top w:val="single" w:color="B9D7F2" w:sz="4"/>
+              <w:left w:val="single" w:color="B9D7F2" w:sz="4"/>
+              <w:bottom w:val="single" w:color="B9D7F2" w:sz="4"/>
+              <w:right w:val="single" w:color="B9D7F2" w:sz="4"/>
+            </w:tcBorders>
+            <w:shd w:fill="EAF4FD" w:color="auto" w:val="clear"/>
+            <w:tcMar>
+              <w:top w:type="dxa" w:w="60"/>
+              <w:left w:type="dxa" w:w="90"/>
+              <w:bottom w:type="dxa" w:w="60"/>
+              <w:right w:type="dxa" w:w="90"/>
+            </w:tcMar>
+          </w:tcPr>
+          <w:p>
+            <w:pPr>
+              <w:spacing w:after="0" w:before="0"/>
+            </w:pPr>
+            <w:r>
+              <w:rPr>
+                <w:rFonts w:ascii="Arial" w:cs="Arial" w:eastAsia="Arial" w:hAnsi="Arial"/>
+                <w:color w:val="15202B"/>
+                <w:sz w:val="18"/>
+                <w:szCs w:val="18"/>
+              </w:rPr>
+              <w:t xml:space="preserve">☐ Pass</w:t>
+            </w:r>
+          </w:p>
+          <w:p>
+            <w:pPr>
+              <w:spacing w:after="0" w:before="0"/>
+            </w:pPr>
+            <w:r>
+              <w:rPr>
+                <w:rFonts w:ascii="Arial" w:cs="Arial" w:eastAsia="Arial" w:hAnsi="Arial"/>
+                <w:color w:val="15202B"/>
+                <w:sz w:val="18"/>
+                <w:szCs w:val="18"/>
+              </w:rPr>
+              <w:t xml:space="preserve">☐ Fail</w:t>
+            </w:r>
+          </w:p>
+        </w:tc>
+        <w:tc>
+          <w:tcPr>
+            <w:tcW w:type="dxa" w:w="1206"/>
+            <w:tcBorders>
+              <w:top w:val="single" w:color="B9D7F2" w:sz="4"/>
+              <w:left w:val="single" w:color="B9D7F2" w:sz="4"/>
+              <w:bottom w:val="single" w:color="B9D7F2" w:sz="4"/>
+              <w:right w:val="single" w:color="B9D7F2" w:sz="4"/>
+            </w:tcBorders>
+            <w:shd w:fill="EAF4FD" w:color="auto" w:val="clear"/>
+            <w:tcMar>
+              <w:top w:type="dxa" w:w="60"/>
+              <w:left w:type="dxa" w:w="90"/>
+              <w:bottom w:type="dxa" w:w="60"/>
+              <w:right w:type="dxa" w:w="90"/>
+            </w:tcMar>
+          </w:tcPr>
+          <w:p>
+            <w:pPr>
+              <w:spacing w:after="0" w:before="0"/>
+            </w:pPr>
+            <w:r>
+              <w:rPr>
+                <w:rFonts w:ascii="Arial" w:cs="Arial" w:eastAsia="Arial" w:hAnsi="Arial"/>
+                <w:color w:val="15202B"/>
+                <w:sz w:val="18"/>
+                <w:szCs w:val="18"/>
+              </w:rPr>
+              <w:t xml:space="preserve"/>
+            </w:r>
+          </w:p>
+        </w:tc>
+      </w:tr>
+    </w:tbl>
+    <w:p>
+      <w:pPr>
+        <w:pStyle w:val="Heading1"/>
+        <w:pageBreakBefore/>
+        <w:spacing w:after="60"/>
+      </w:pPr>
+      <w:r>
+        <w:rPr>
+          <w:rFonts w:ascii="Arial" w:cs="Arial" w:eastAsia="Arial" w:hAnsi="Arial"/>
+          <w:b/>
+          <w:bCs/>
+          <w:color w:val="0A84E0"/>
+          <w:sz w:val="28"/>
+          <w:szCs w:val="28"/>
+        </w:rPr>
+        <w:t xml:space="preserve">Step 36 · Push notifications and alert preferences</w:t>
+      </w:r>
+    </w:p>
+    <w:p>
+      <w:pPr>
+        <w:spacing w:after="60" w:before="0"/>
+      </w:pPr>
+      <w:r>
+        <w:rPr>
+          <w:rFonts w:ascii="Arial" w:cs="Arial" w:eastAsia="Arial" w:hAnsi="Arial"/>
+          <w:b/>
+          <w:bCs/>
+          <w:color w:val="15202B"/>
+          <w:sz w:val="19"/>
+          <w:szCs w:val="19"/>
+        </w:rPr>
+        <w:t xml:space="preserve">Screens: </w:t>
+      </w:r>
+      <w:r>
+        <w:rPr>
+          <w:rFonts w:ascii="Arial" w:cs="Arial" w:eastAsia="Arial" w:hAnsi="Arial"/>
+          <w:color w:val="15202B"/>
+          <w:sz w:val="19"/>
+          <w:szCs w:val="19"/>
+        </w:rPr>
+        <w:t xml:space="preserve">Customer 11, Admin More 4</w:t>
+      </w:r>
+      <w:r>
+        <w:rPr>
+          <w:rFonts w:ascii="Arial" w:cs="Arial" w:eastAsia="Arial" w:hAnsi="Arial"/>
+          <w:b/>
+          <w:bCs/>
+          <w:color w:val="15202B"/>
+          <w:sz w:val="19"/>
+          <w:szCs w:val="19"/>
+        </w:rPr>
+        <w:t xml:space="preserve">    Log in as: </w:t>
+      </w:r>
+      <w:r>
+        <w:rPr>
+          <w:rFonts w:ascii="Arial" w:cs="Arial" w:eastAsia="Arial" w:hAnsi="Arial"/>
+          <w:color w:val="15202B"/>
+          <w:sz w:val="19"/>
+          <w:szCs w:val="19"/>
+        </w:rPr>
+        <w:t xml:space="preserve">Customer and Owner</w:t>
+      </w:r>
+    </w:p>
+    <w:p>
+      <w:pPr>
+        <w:spacing w:after="60" w:before="0"/>
+      </w:pPr>
+      <w:r>
+        <w:rPr>
+          <w:rFonts w:ascii="Arial" w:cs="Arial" w:eastAsia="Arial" w:hAnsi="Arial"/>
+          <w:b/>
+          <w:bCs/>
+          <w:color w:val="0A84E0"/>
+          <w:sz w:val="19"/>
+          <w:szCs w:val="19"/>
+        </w:rPr>
+        <w:t xml:space="preserve">Before: </w:t>
+      </w:r>
+      <w:r>
+        <w:rPr>
+          <w:rFonts w:ascii="Arial" w:cs="Arial" w:eastAsia="Arial" w:hAnsi="Arial"/>
+          <w:color w:val="15202B"/>
+          <w:sz w:val="19"/>
+          <w:szCs w:val="19"/>
+        </w:rPr>
+        <w:t xml:space="preserve">In Chrome these come as banners at the bottom of the app. Phone push (app closed) needs the Firebase project on the server; see the backend notes.</w:t>
+      </w:r>
+    </w:p>
+    <w:tbl>
+      <w:tblPr>
+        <w:tblW w:type="dxa" w:w="10466"/>
+        <w:tblBorders>
+          <w:top w:val="single" w:color="auto" w:sz="4"/>
+          <w:left w:val="single" w:color="auto" w:sz="4"/>
+          <w:bottom w:val="single" w:color="auto" w:sz="4"/>
+          <w:right w:val="single" w:color="auto" w:sz="4"/>
+          <w:insideH w:val="single" w:color="auto" w:sz="4"/>
+          <w:insideV w:val="single" w:color="auto" w:sz="4"/>
+        </w:tblBorders>
+        <w:tblLayout w:type="fixed"/>
+      </w:tblPr>
+      <w:tblGrid>
+        <w:gridCol w:w="640"/>
+        <w:gridCol w:w="3820"/>
+        <w:gridCol w:w="3900"/>
+        <w:gridCol w:w="900"/>
+        <w:gridCol w:w="1206"/>
+      </w:tblGrid>
+      <w:tr>
+        <w:trPr>
+          <w:tblHeader/>
+        </w:trPr>
+        <w:tc>
+          <w:tcPr>
+            <w:tcW w:type="dxa" w:w="640"/>
+            <w:tcBorders>
+              <w:top w:val="single" w:color="B9D7F2" w:sz="4"/>
+              <w:left w:val="single" w:color="B9D7F2" w:sz="4"/>
+              <w:bottom w:val="single" w:color="B9D7F2" w:sz="4"/>
+              <w:right w:val="single" w:color="B9D7F2" w:sz="4"/>
+            </w:tcBorders>
+            <w:shd w:fill="0A84E0" w:color="auto" w:val="clear"/>
+            <w:tcMar>
+              <w:top w:type="dxa" w:w="60"/>
+              <w:left w:type="dxa" w:w="90"/>
+              <w:bottom w:type="dxa" w:w="60"/>
+              <w:right w:type="dxa" w:w="90"/>
+            </w:tcMar>
+          </w:tcPr>
+          <w:p>
+            <w:pPr>
+              <w:spacing w:after="0" w:before="0"/>
+            </w:pPr>
+            <w:r>
+              <w:rPr>
+                <w:rFonts w:ascii="Arial" w:cs="Arial" w:eastAsia="Arial" w:hAnsi="Arial"/>
+                <w:b/>
+                <w:bCs/>
+                <w:color w:val="FFFFFF"/>
+                <w:sz w:val="18"/>
+                <w:szCs w:val="18"/>
+              </w:rPr>
+              <w:t xml:space="preserve">#</w:t>
+            </w:r>
+          </w:p>
+        </w:tc>
+        <w:tc>
+          <w:tcPr>
+            <w:tcW w:type="dxa" w:w="3820"/>
+            <w:tcBorders>
+              <w:top w:val="single" w:color="B9D7F2" w:sz="4"/>
+              <w:left w:val="single" w:color="B9D7F2" w:sz="4"/>
+              <w:bottom w:val="single" w:color="B9D7F2" w:sz="4"/>
+              <w:right w:val="single" w:color="B9D7F2" w:sz="4"/>
+            </w:tcBorders>
+            <w:shd w:fill="0A84E0" w:color="auto" w:val="clear"/>
+            <w:tcMar>
+              <w:top w:type="dxa" w:w="60"/>
+              <w:left w:type="dxa" w:w="90"/>
+              <w:bottom w:type="dxa" w:w="60"/>
+              <w:right w:type="dxa" w:w="90"/>
+            </w:tcMar>
+          </w:tcPr>
+          <w:p>
+            <w:pPr>
+              <w:spacing w:after="0" w:before="0"/>
+            </w:pPr>
+            <w:r>
+              <w:rPr>
+                <w:rFonts w:ascii="Arial" w:cs="Arial" w:eastAsia="Arial" w:hAnsi="Arial"/>
+                <w:b/>
+                <w:bCs/>
+                <w:color w:val="FFFFFF"/>
+                <w:sz w:val="18"/>
+                <w:szCs w:val="18"/>
+              </w:rPr>
+              <w:t xml:space="preserve">What to do</w:t>
+            </w:r>
+          </w:p>
+        </w:tc>
+        <w:tc>
+          <w:tcPr>
+            <w:tcW w:type="dxa" w:w="3900"/>
+            <w:tcBorders>
+              <w:top w:val="single" w:color="B9D7F2" w:sz="4"/>
+              <w:left w:val="single" w:color="B9D7F2" w:sz="4"/>
+              <w:bottom w:val="single" w:color="B9D7F2" w:sz="4"/>
+              <w:right w:val="single" w:color="B9D7F2" w:sz="4"/>
+            </w:tcBorders>
+            <w:shd w:fill="0A84E0" w:color="auto" w:val="clear"/>
+            <w:tcMar>
+              <w:top w:type="dxa" w:w="60"/>
+              <w:left w:type="dxa" w:w="90"/>
+              <w:bottom w:type="dxa" w:w="60"/>
+              <w:right w:type="dxa" w:w="90"/>
+            </w:tcMar>
+          </w:tcPr>
+          <w:p>
+            <w:pPr>
+              <w:spacing w:after="0" w:before="0"/>
+            </w:pPr>
+            <w:r>
+              <w:rPr>
+                <w:rFonts w:ascii="Arial" w:cs="Arial" w:eastAsia="Arial" w:hAnsi="Arial"/>
+                <w:b/>
+                <w:bCs/>
+                <w:color w:val="FFFFFF"/>
+                <w:sz w:val="18"/>
+                <w:szCs w:val="18"/>
+              </w:rPr>
+              <w:t xml:space="preserve">What you should see</w:t>
+            </w:r>
+          </w:p>
+        </w:tc>
+        <w:tc>
+          <w:tcPr>
+            <w:tcW w:type="dxa" w:w="900"/>
+            <w:tcBorders>
+              <w:top w:val="single" w:color="B9D7F2" w:sz="4"/>
+              <w:left w:val="single" w:color="B9D7F2" w:sz="4"/>
+              <w:bottom w:val="single" w:color="B9D7F2" w:sz="4"/>
+              <w:right w:val="single" w:color="B9D7F2" w:sz="4"/>
+            </w:tcBorders>
+            <w:shd w:fill="0A84E0" w:color="auto" w:val="clear"/>
+            <w:tcMar>
+              <w:top w:type="dxa" w:w="60"/>
+              <w:left w:type="dxa" w:w="90"/>
+              <w:bottom w:type="dxa" w:w="60"/>
+              <w:right w:type="dxa" w:w="90"/>
+            </w:tcMar>
+          </w:tcPr>
+          <w:p>
+            <w:pPr>
+              <w:spacing w:after="0" w:before="0"/>
+            </w:pPr>
+            <w:r>
+              <w:rPr>
+                <w:rFonts w:ascii="Arial" w:cs="Arial" w:eastAsia="Arial" w:hAnsi="Arial"/>
+                <w:b/>
+                <w:bCs/>
+                <w:color w:val="FFFFFF"/>
+                <w:sz w:val="18"/>
+                <w:szCs w:val="18"/>
+              </w:rPr>
+              <w:t xml:space="preserve">Result</w:t>
+            </w:r>
+          </w:p>
+        </w:tc>
+        <w:tc>
+          <w:tcPr>
+            <w:tcW w:type="dxa" w:w="1206"/>
+            <w:tcBorders>
+              <w:top w:val="single" w:color="B9D7F2" w:sz="4"/>
+              <w:left w:val="single" w:color="B9D7F2" w:sz="4"/>
+              <w:bottom w:val="single" w:color="B9D7F2" w:sz="4"/>
+              <w:right w:val="single" w:color="B9D7F2" w:sz="4"/>
+            </w:tcBorders>
+            <w:shd w:fill="0A84E0" w:color="auto" w:val="clear"/>
+            <w:tcMar>
+              <w:top w:type="dxa" w:w="60"/>
+              <w:left w:type="dxa" w:w="90"/>
+              <w:bottom w:type="dxa" w:w="60"/>
+              <w:right w:type="dxa" w:w="90"/>
+            </w:tcMar>
+          </w:tcPr>
+          <w:p>
+            <w:pPr>
+              <w:spacing w:after="0" w:before="0"/>
+            </w:pPr>
+            <w:r>
+              <w:rPr>
+                <w:rFonts w:ascii="Arial" w:cs="Arial" w:eastAsia="Arial" w:hAnsi="Arial"/>
+                <w:b/>
+                <w:bCs/>
+                <w:color w:val="FFFFFF"/>
+                <w:sz w:val="18"/>
+                <w:szCs w:val="18"/>
+              </w:rPr>
+              <w:t xml:space="preserve">Notes</w:t>
+            </w:r>
+          </w:p>
+        </w:tc>
+      </w:tr>
+      <w:tr>
+        <w:trPr>
+          <w:cantSplit/>
+        </w:trPr>
+        <w:tc>
+          <w:tcPr>
+            <w:tcW w:type="dxa" w:w="640"/>
+            <w:tcBorders>
+              <w:top w:val="single" w:color="B9D7F2" w:sz="4"/>
+              <w:left w:val="single" w:color="B9D7F2" w:sz="4"/>
+              <w:bottom w:val="single" w:color="B9D7F2" w:sz="4"/>
+              <w:right w:val="single" w:color="B9D7F2" w:sz="4"/>
+            </w:tcBorders>
+            <w:tcMar>
+              <w:top w:type="dxa" w:w="60"/>
+              <w:left w:type="dxa" w:w="90"/>
+              <w:bottom w:type="dxa" w:w="60"/>
+              <w:right w:type="dxa" w:w="90"/>
+            </w:tcMar>
+          </w:tcPr>
+          <w:p>
+            <w:pPr>
+              <w:spacing w:after="0" w:before="0"/>
+            </w:pPr>
+            <w:r>
+              <w:rPr>
+                <w:rFonts w:ascii="Arial" w:cs="Arial" w:eastAsia="Arial" w:hAnsi="Arial"/>
+                <w:color w:val="15202B"/>
+                <w:sz w:val="18"/>
+                <w:szCs w:val="18"/>
+              </w:rPr>
+              <w:t xml:space="preserve">36.1</w:t>
+            </w:r>
+          </w:p>
+        </w:tc>
+        <w:tc>
+          <w:tcPr>
+            <w:tcW w:type="dxa" w:w="3820"/>
+            <w:tcBorders>
+              <w:top w:val="single" w:color="B9D7F2" w:sz="4"/>
+              <w:left w:val="single" w:color="B9D7F2" w:sz="4"/>
+              <w:bottom w:val="single" w:color="B9D7F2" w:sz="4"/>
+              <w:right w:val="single" w:color="B9D7F2" w:sz="4"/>
+            </w:tcBorders>
+            <w:tcMar>
+              <w:top w:type="dxa" w:w="60"/>
+              <w:left w:type="dxa" w:w="90"/>
+              <w:bottom w:type="dxa" w:w="60"/>
+              <w:right w:type="dxa" w:w="90"/>
+            </w:tcMar>
+          </w:tcPr>
+          <w:p>
+            <w:pPr>
+              <w:spacing w:after="0" w:before="0"/>
+            </w:pPr>
+            <w:r>
+              <w:rPr>
+                <w:rFonts w:ascii="Arial" w:cs="Arial" w:eastAsia="Arial" w:hAnsi="Arial"/>
+                <w:color w:val="15202B"/>
+                <w:sz w:val="18"/>
+                <w:szCs w:val="18"/>
+              </w:rPr>
+              <w:t xml:space="preserve">Customer keeps the app open. Owner accepts the order.</w:t>
+            </w:r>
+          </w:p>
+        </w:tc>
+        <w:tc>
+          <w:tcPr>
+            <w:tcW w:type="dxa" w:w="3900"/>
+            <w:tcBorders>
+              <w:top w:val="single" w:color="B9D7F2" w:sz="4"/>
+              <w:left w:val="single" w:color="B9D7F2" w:sz="4"/>
+              <w:bottom w:val="single" w:color="B9D7F2" w:sz="4"/>
+              <w:right w:val="single" w:color="B9D7F2" w:sz="4"/>
+            </w:tcBorders>
+            <w:tcMar>
+              <w:top w:type="dxa" w:w="60"/>
+              <w:left w:type="dxa" w:w="90"/>
+              <w:bottom w:type="dxa" w:w="60"/>
+              <w:right w:type="dxa" w:w="90"/>
+            </w:tcMar>
+          </w:tcPr>
+          <w:p>
+            <w:pPr>
+              <w:spacing w:after="0" w:before="0"/>
+            </w:pPr>
+            <w:r>
+              <w:rPr>
+                <w:rFonts w:ascii="Arial" w:cs="Arial" w:eastAsia="Arial" w:hAnsi="Arial"/>
+                <w:color w:val="15202B"/>
+                <w:sz w:val="18"/>
+                <w:szCs w:val="18"/>
+              </w:rPr>
+              <w:t xml:space="preserve">Banner "Mangao Water Refilling Station · Order accepted · Your refill order is processing. Estimated delivery: by ..." with View.</w:t>
+            </w:r>
+          </w:p>
+        </w:tc>
+        <w:tc>
+          <w:tcPr>
+            <w:tcW w:type="dxa" w:w="900"/>
+            <w:tcBorders>
+              <w:top w:val="single" w:color="B9D7F2" w:sz="4"/>
+              <w:left w:val="single" w:color="B9D7F2" w:sz="4"/>
+              <w:bottom w:val="single" w:color="B9D7F2" w:sz="4"/>
+              <w:right w:val="single" w:color="B9D7F2" w:sz="4"/>
+            </w:tcBorders>
+            <w:tcMar>
+              <w:top w:type="dxa" w:w="60"/>
+              <w:left w:type="dxa" w:w="90"/>
+              <w:bottom w:type="dxa" w:w="60"/>
+              <w:right w:type="dxa" w:w="90"/>
+            </w:tcMar>
+          </w:tcPr>
+          <w:p>
+            <w:pPr>
+              <w:spacing w:after="0" w:before="0"/>
+            </w:pPr>
+            <w:r>
+              <w:rPr>
+                <w:rFonts w:ascii="Arial" w:cs="Arial" w:eastAsia="Arial" w:hAnsi="Arial"/>
+                <w:color w:val="15202B"/>
+                <w:sz w:val="18"/>
+                <w:szCs w:val="18"/>
+              </w:rPr>
+              <w:t xml:space="preserve">☐ Pass</w:t>
+            </w:r>
+          </w:p>
+          <w:p>
+            <w:pPr>
+              <w:spacing w:after="0" w:before="0"/>
+            </w:pPr>
+            <w:r>
+              <w:rPr>
+                <w:rFonts w:ascii="Arial" w:cs="Arial" w:eastAsia="Arial" w:hAnsi="Arial"/>
+                <w:color w:val="15202B"/>
+                <w:sz w:val="18"/>
+                <w:szCs w:val="18"/>
+              </w:rPr>
+              <w:t xml:space="preserve">☐ Fail</w:t>
+            </w:r>
+          </w:p>
+        </w:tc>
+        <w:tc>
+          <w:tcPr>
+            <w:tcW w:type="dxa" w:w="1206"/>
+            <w:tcBorders>
+              <w:top w:val="single" w:color="B9D7F2" w:sz="4"/>
+              <w:left w:val="single" w:color="B9D7F2" w:sz="4"/>
+              <w:bottom w:val="single" w:color="B9D7F2" w:sz="4"/>
+              <w:right w:val="single" w:color="B9D7F2" w:sz="4"/>
+            </w:tcBorders>
+            <w:tcMar>
+              <w:top w:type="dxa" w:w="60"/>
+              <w:left w:type="dxa" w:w="90"/>
+              <w:bottom w:type="dxa" w:w="60"/>
+              <w:right w:type="dxa" w:w="90"/>
+            </w:tcMar>
+          </w:tcPr>
+          <w:p>
+            <w:pPr>
+              <w:spacing w:after="0" w:before="0"/>
+            </w:pPr>
+            <w:r>
+              <w:rPr>
+                <w:rFonts w:ascii="Arial" w:cs="Arial" w:eastAsia="Arial" w:hAnsi="Arial"/>
+                <w:color w:val="15202B"/>
+                <w:sz w:val="18"/>
+                <w:szCs w:val="18"/>
+              </w:rPr>
+              <w:t xml:space="preserve"/>
+            </w:r>
+          </w:p>
+        </w:tc>
+      </w:tr>
+      <w:tr>
+        <w:trPr>
+          <w:cantSplit/>
+        </w:trPr>
+        <w:tc>
+          <w:tcPr>
+            <w:tcW w:type="dxa" w:w="640"/>
+            <w:tcBorders>
+              <w:top w:val="single" w:color="B9D7F2" w:sz="4"/>
+              <w:left w:val="single" w:color="B9D7F2" w:sz="4"/>
+              <w:bottom w:val="single" w:color="B9D7F2" w:sz="4"/>
+              <w:right w:val="single" w:color="B9D7F2" w:sz="4"/>
+            </w:tcBorders>
+            <w:shd w:fill="EAF4FD" w:color="auto" w:val="clear"/>
+            <w:tcMar>
+              <w:top w:type="dxa" w:w="60"/>
+              <w:left w:type="dxa" w:w="90"/>
+              <w:bottom w:type="dxa" w:w="60"/>
+              <w:right w:type="dxa" w:w="90"/>
+            </w:tcMar>
+          </w:tcPr>
+          <w:p>
+            <w:pPr>
+              <w:spacing w:after="0" w:before="0"/>
+            </w:pPr>
+            <w:r>
+              <w:rPr>
+                <w:rFonts w:ascii="Arial" w:cs="Arial" w:eastAsia="Arial" w:hAnsi="Arial"/>
+                <w:color w:val="15202B"/>
+                <w:sz w:val="18"/>
+                <w:szCs w:val="18"/>
+              </w:rPr>
+              <w:t xml:space="preserve">36.2</w:t>
+            </w:r>
+          </w:p>
+        </w:tc>
+        <w:tc>
+          <w:tcPr>
+            <w:tcW w:type="dxa" w:w="3820"/>
+            <w:tcBorders>
+              <w:top w:val="single" w:color="B9D7F2" w:sz="4"/>
+              <w:left w:val="single" w:color="B9D7F2" w:sz="4"/>
+              <w:bottom w:val="single" w:color="B9D7F2" w:sz="4"/>
+              <w:right w:val="single" w:color="B9D7F2" w:sz="4"/>
+            </w:tcBorders>
+            <w:shd w:fill="EAF4FD" w:color="auto" w:val="clear"/>
+            <w:tcMar>
+              <w:top w:type="dxa" w:w="60"/>
+              <w:left w:type="dxa" w:w="90"/>
+              <w:bottom w:type="dxa" w:w="60"/>
+              <w:right w:type="dxa" w:w="90"/>
+            </w:tcMar>
+          </w:tcPr>
+          <w:p>
+            <w:pPr>
+              <w:spacing w:after="0" w:before="0"/>
+            </w:pPr>
+            <w:r>
+              <w:rPr>
+                <w:rFonts w:ascii="Arial" w:cs="Arial" w:eastAsia="Arial" w:hAnsi="Arial"/>
+                <w:color w:val="15202B"/>
+                <w:sz w:val="18"/>
+                <w:szCs w:val="18"/>
+              </w:rPr>
+              <w:t xml:space="preserve">Tap View.</w:t>
+            </w:r>
+          </w:p>
+        </w:tc>
+        <w:tc>
+          <w:tcPr>
+            <w:tcW w:type="dxa" w:w="3900"/>
+            <w:tcBorders>
+              <w:top w:val="single" w:color="B9D7F2" w:sz="4"/>
+              <w:left w:val="single" w:color="B9D7F2" w:sz="4"/>
+              <w:bottom w:val="single" w:color="B9D7F2" w:sz="4"/>
+              <w:right w:val="single" w:color="B9D7F2" w:sz="4"/>
+            </w:tcBorders>
+            <w:shd w:fill="EAF4FD" w:color="auto" w:val="clear"/>
+            <w:tcMar>
+              <w:top w:type="dxa" w:w="60"/>
+              <w:left w:type="dxa" w:w="90"/>
+              <w:bottom w:type="dxa" w:w="60"/>
+              <w:right w:type="dxa" w:w="90"/>
+            </w:tcMar>
+          </w:tcPr>
+          <w:p>
+            <w:pPr>
+              <w:spacing w:after="0" w:before="0"/>
+            </w:pPr>
+            <w:r>
+              <w:rPr>
+                <w:rFonts w:ascii="Arial" w:cs="Arial" w:eastAsia="Arial" w:hAnsi="Arial"/>
+                <w:color w:val="15202B"/>
+                <w:sz w:val="18"/>
+                <w:szCs w:val="18"/>
+              </w:rPr>
+              <w:t xml:space="preserve">Opens that order's Order Details.</w:t>
+            </w:r>
+          </w:p>
+        </w:tc>
+        <w:tc>
+          <w:tcPr>
+            <w:tcW w:type="dxa" w:w="900"/>
+            <w:tcBorders>
+              <w:top w:val="single" w:color="B9D7F2" w:sz="4"/>
+              <w:left w:val="single" w:color="B9D7F2" w:sz="4"/>
+              <w:bottom w:val="single" w:color="B9D7F2" w:sz="4"/>
+              <w:right w:val="single" w:color="B9D7F2" w:sz="4"/>
+            </w:tcBorders>
+            <w:shd w:fill="EAF4FD" w:color="auto" w:val="clear"/>
+            <w:tcMar>
+              <w:top w:type="dxa" w:w="60"/>
+              <w:left w:type="dxa" w:w="90"/>
+              <w:bottom w:type="dxa" w:w="60"/>
+              <w:right w:type="dxa" w:w="90"/>
+            </w:tcMar>
+          </w:tcPr>
+          <w:p>
+            <w:pPr>
+              <w:spacing w:after="0" w:before="0"/>
+            </w:pPr>
+            <w:r>
+              <w:rPr>
+                <w:rFonts w:ascii="Arial" w:cs="Arial" w:eastAsia="Arial" w:hAnsi="Arial"/>
+                <w:color w:val="15202B"/>
+                <w:sz w:val="18"/>
+                <w:szCs w:val="18"/>
+              </w:rPr>
+              <w:t xml:space="preserve">☐ Pass</w:t>
+            </w:r>
+          </w:p>
+          <w:p>
+            <w:pPr>
+              <w:spacing w:after="0" w:before="0"/>
+            </w:pPr>
+            <w:r>
+              <w:rPr>
+                <w:rFonts w:ascii="Arial" w:cs="Arial" w:eastAsia="Arial" w:hAnsi="Arial"/>
+                <w:color w:val="15202B"/>
+                <w:sz w:val="18"/>
+                <w:szCs w:val="18"/>
+              </w:rPr>
+              <w:t xml:space="preserve">☐ Fail</w:t>
+            </w:r>
+          </w:p>
+        </w:tc>
+        <w:tc>
+          <w:tcPr>
+            <w:tcW w:type="dxa" w:w="1206"/>
+            <w:tcBorders>
+              <w:top w:val="single" w:color="B9D7F2" w:sz="4"/>
+              <w:left w:val="single" w:color="B9D7F2" w:sz="4"/>
+              <w:bottom w:val="single" w:color="B9D7F2" w:sz="4"/>
+              <w:right w:val="single" w:color="B9D7F2" w:sz="4"/>
+            </w:tcBorders>
+            <w:shd w:fill="EAF4FD" w:color="auto" w:val="clear"/>
+            <w:tcMar>
+              <w:top w:type="dxa" w:w="60"/>
+              <w:left w:type="dxa" w:w="90"/>
+              <w:bottom w:type="dxa" w:w="60"/>
+              <w:right w:type="dxa" w:w="90"/>
+            </w:tcMar>
+          </w:tcPr>
+          <w:p>
+            <w:pPr>
+              <w:spacing w:after="0" w:before="0"/>
+            </w:pPr>
+            <w:r>
+              <w:rPr>
+                <w:rFonts w:ascii="Arial" w:cs="Arial" w:eastAsia="Arial" w:hAnsi="Arial"/>
+                <w:color w:val="15202B"/>
+                <w:sz w:val="18"/>
+                <w:szCs w:val="18"/>
+              </w:rPr>
+              <w:t xml:space="preserve"/>
+            </w:r>
+          </w:p>
+        </w:tc>
+      </w:tr>
+      <w:tr>
+        <w:trPr>
+          <w:cantSplit/>
+        </w:trPr>
+        <w:tc>
+          <w:tcPr>
+            <w:tcW w:type="dxa" w:w="640"/>
+            <w:tcBorders>
+              <w:top w:val="single" w:color="B9D7F2" w:sz="4"/>
+              <w:left w:val="single" w:color="B9D7F2" w:sz="4"/>
+              <w:bottom w:val="single" w:color="B9D7F2" w:sz="4"/>
+              <w:right w:val="single" w:color="B9D7F2" w:sz="4"/>
+            </w:tcBorders>
+            <w:tcMar>
+              <w:top w:type="dxa" w:w="60"/>
+              <w:left w:type="dxa" w:w="90"/>
+              <w:bottom w:type="dxa" w:w="60"/>
+              <w:right w:type="dxa" w:w="90"/>
+            </w:tcMar>
+          </w:tcPr>
+          <w:p>
+            <w:pPr>
+              <w:spacing w:after="0" w:before="0"/>
+            </w:pPr>
+            <w:r>
+              <w:rPr>
+                <w:rFonts w:ascii="Arial" w:cs="Arial" w:eastAsia="Arial" w:hAnsi="Arial"/>
+                <w:color w:val="15202B"/>
+                <w:sz w:val="18"/>
+                <w:szCs w:val="18"/>
+              </w:rPr>
+              <w:t xml:space="preserve">36.3</w:t>
+            </w:r>
+          </w:p>
+        </w:tc>
+        <w:tc>
+          <w:tcPr>
+            <w:tcW w:type="dxa" w:w="3820"/>
+            <w:tcBorders>
+              <w:top w:val="single" w:color="B9D7F2" w:sz="4"/>
+              <w:left w:val="single" w:color="B9D7F2" w:sz="4"/>
+              <w:bottom w:val="single" w:color="B9D7F2" w:sz="4"/>
+              <w:right w:val="single" w:color="B9D7F2" w:sz="4"/>
+            </w:tcBorders>
+            <w:tcMar>
+              <w:top w:type="dxa" w:w="60"/>
+              <w:left w:type="dxa" w:w="90"/>
+              <w:bottom w:type="dxa" w:w="60"/>
+              <w:right w:type="dxa" w:w="90"/>
+            </w:tcMar>
+          </w:tcPr>
+          <w:p>
+            <w:pPr>
+              <w:spacing w:after="0" w:before="0"/>
+            </w:pPr>
+            <w:r>
+              <w:rPr>
+                <w:rFonts w:ascii="Arial" w:cs="Arial" w:eastAsia="Arial" w:hAnsi="Arial"/>
+                <w:color w:val="15202B"/>
+                <w:sz w:val="18"/>
+                <w:szCs w:val="18"/>
+              </w:rPr>
+              <w:t xml:space="preserve">Owner declines another order with "The station is closed for today."</w:t>
+            </w:r>
+          </w:p>
+        </w:tc>
+        <w:tc>
+          <w:tcPr>
+            <w:tcW w:type="dxa" w:w="3900"/>
+            <w:tcBorders>
+              <w:top w:val="single" w:color="B9D7F2" w:sz="4"/>
+              <w:left w:val="single" w:color="B9D7F2" w:sz="4"/>
+              <w:bottom w:val="single" w:color="B9D7F2" w:sz="4"/>
+              <w:right w:val="single" w:color="B9D7F2" w:sz="4"/>
+            </w:tcBorders>
+            <w:tcMar>
+              <w:top w:type="dxa" w:w="60"/>
+              <w:left w:type="dxa" w:w="90"/>
+              <w:bottom w:type="dxa" w:w="60"/>
+              <w:right w:type="dxa" w:w="90"/>
+            </w:tcMar>
+          </w:tcPr>
+          <w:p>
+            <w:pPr>
+              <w:spacing w:after="0" w:before="0"/>
+            </w:pPr>
+            <w:r>
+              <w:rPr>
+                <w:rFonts w:ascii="Arial" w:cs="Arial" w:eastAsia="Arial" w:hAnsi="Arial"/>
+                <w:color w:val="15202B"/>
+                <w:sz w:val="18"/>
+                <w:szCs w:val="18"/>
+              </w:rPr>
+              <w:t xml:space="preserve">Customer banner "Order declined · The station is closed for today."</w:t>
+            </w:r>
+          </w:p>
+        </w:tc>
+        <w:tc>
+          <w:tcPr>
+            <w:tcW w:type="dxa" w:w="900"/>
+            <w:tcBorders>
+              <w:top w:val="single" w:color="B9D7F2" w:sz="4"/>
+              <w:left w:val="single" w:color="B9D7F2" w:sz="4"/>
+              <w:bottom w:val="single" w:color="B9D7F2" w:sz="4"/>
+              <w:right w:val="single" w:color="B9D7F2" w:sz="4"/>
+            </w:tcBorders>
+            <w:tcMar>
+              <w:top w:type="dxa" w:w="60"/>
+              <w:left w:type="dxa" w:w="90"/>
+              <w:bottom w:type="dxa" w:w="60"/>
+              <w:right w:type="dxa" w:w="90"/>
+            </w:tcMar>
+          </w:tcPr>
+          <w:p>
+            <w:pPr>
+              <w:spacing w:after="0" w:before="0"/>
+            </w:pPr>
+            <w:r>
+              <w:rPr>
+                <w:rFonts w:ascii="Arial" w:cs="Arial" w:eastAsia="Arial" w:hAnsi="Arial"/>
+                <w:color w:val="15202B"/>
+                <w:sz w:val="18"/>
+                <w:szCs w:val="18"/>
+              </w:rPr>
+              <w:t xml:space="preserve">☐ Pass</w:t>
+            </w:r>
+          </w:p>
+          <w:p>
+            <w:pPr>
+              <w:spacing w:after="0" w:before="0"/>
+            </w:pPr>
+            <w:r>
+              <w:rPr>
+                <w:rFonts w:ascii="Arial" w:cs="Arial" w:eastAsia="Arial" w:hAnsi="Arial"/>
+                <w:color w:val="15202B"/>
+                <w:sz w:val="18"/>
+                <w:szCs w:val="18"/>
+              </w:rPr>
+              <w:t xml:space="preserve">☐ Fail</w:t>
+            </w:r>
+          </w:p>
+        </w:tc>
+        <w:tc>
+          <w:tcPr>
+            <w:tcW w:type="dxa" w:w="1206"/>
+            <w:tcBorders>
+              <w:top w:val="single" w:color="B9D7F2" w:sz="4"/>
+              <w:left w:val="single" w:color="B9D7F2" w:sz="4"/>
+              <w:bottom w:val="single" w:color="B9D7F2" w:sz="4"/>
+              <w:right w:val="single" w:color="B9D7F2" w:sz="4"/>
+            </w:tcBorders>
+            <w:tcMar>
+              <w:top w:type="dxa" w:w="60"/>
+              <w:left w:type="dxa" w:w="90"/>
+              <w:bottom w:type="dxa" w:w="60"/>
+              <w:right w:type="dxa" w:w="90"/>
+            </w:tcMar>
+          </w:tcPr>
+          <w:p>
+            <w:pPr>
+              <w:spacing w:after="0" w:before="0"/>
+            </w:pPr>
+            <w:r>
+              <w:rPr>
+                <w:rFonts w:ascii="Arial" w:cs="Arial" w:eastAsia="Arial" w:hAnsi="Arial"/>
+                <w:color w:val="15202B"/>
+                <w:sz w:val="18"/>
+                <w:szCs w:val="18"/>
+              </w:rPr>
+              <w:t xml:space="preserve"/>
+            </w:r>
+          </w:p>
+        </w:tc>
+      </w:tr>
+      <w:tr>
+        <w:trPr>
+          <w:cantSplit/>
+        </w:trPr>
+        <w:tc>
+          <w:tcPr>
+            <w:tcW w:type="dxa" w:w="640"/>
+            <w:tcBorders>
+              <w:top w:val="single" w:color="B9D7F2" w:sz="4"/>
+              <w:left w:val="single" w:color="B9D7F2" w:sz="4"/>
+              <w:bottom w:val="single" w:color="B9D7F2" w:sz="4"/>
+              <w:right w:val="single" w:color="B9D7F2" w:sz="4"/>
+            </w:tcBorders>
+            <w:shd w:fill="EAF4FD" w:color="auto" w:val="clear"/>
+            <w:tcMar>
+              <w:top w:type="dxa" w:w="60"/>
+              <w:left w:type="dxa" w:w="90"/>
+              <w:bottom w:type="dxa" w:w="60"/>
+              <w:right w:type="dxa" w:w="90"/>
+            </w:tcMar>
+          </w:tcPr>
+          <w:p>
+            <w:pPr>
+              <w:spacing w:after="0" w:before="0"/>
+            </w:pPr>
+            <w:r>
+              <w:rPr>
+                <w:rFonts w:ascii="Arial" w:cs="Arial" w:eastAsia="Arial" w:hAnsi="Arial"/>
+                <w:color w:val="15202B"/>
+                <w:sz w:val="18"/>
+                <w:szCs w:val="18"/>
+              </w:rPr>
+              <w:t xml:space="preserve">36.4</w:t>
+            </w:r>
+          </w:p>
+        </w:tc>
+        <w:tc>
+          <w:tcPr>
+            <w:tcW w:type="dxa" w:w="3820"/>
+            <w:tcBorders>
+              <w:top w:val="single" w:color="B9D7F2" w:sz="4"/>
+              <w:left w:val="single" w:color="B9D7F2" w:sz="4"/>
+              <w:bottom w:val="single" w:color="B9D7F2" w:sz="4"/>
+              <w:right w:val="single" w:color="B9D7F2" w:sz="4"/>
+            </w:tcBorders>
+            <w:shd w:fill="EAF4FD" w:color="auto" w:val="clear"/>
+            <w:tcMar>
+              <w:top w:type="dxa" w:w="60"/>
+              <w:left w:type="dxa" w:w="90"/>
+              <w:bottom w:type="dxa" w:w="60"/>
+              <w:right w:type="dxa" w:w="90"/>
+            </w:tcMar>
+          </w:tcPr>
+          <w:p>
+            <w:pPr>
+              <w:spacing w:after="0" w:before="0"/>
+            </w:pPr>
+            <w:r>
+              <w:rPr>
+                <w:rFonts w:ascii="Arial" w:cs="Arial" w:eastAsia="Arial" w:hAnsi="Arial"/>
+                <w:color w:val="15202B"/>
+                <w:sz w:val="18"/>
+                <w:szCs w:val="18"/>
+              </w:rPr>
+              <w:t xml:space="preserve">Staff sends the order out.</w:t>
+            </w:r>
+          </w:p>
+        </w:tc>
+        <w:tc>
+          <w:tcPr>
+            <w:tcW w:type="dxa" w:w="3900"/>
+            <w:tcBorders>
+              <w:top w:val="single" w:color="B9D7F2" w:sz="4"/>
+              <w:left w:val="single" w:color="B9D7F2" w:sz="4"/>
+              <w:bottom w:val="single" w:color="B9D7F2" w:sz="4"/>
+              <w:right w:val="single" w:color="B9D7F2" w:sz="4"/>
+            </w:tcBorders>
+            <w:shd w:fill="EAF4FD" w:color="auto" w:val="clear"/>
+            <w:tcMar>
+              <w:top w:type="dxa" w:w="60"/>
+              <w:left w:type="dxa" w:w="90"/>
+              <w:bottom w:type="dxa" w:w="60"/>
+              <w:right w:type="dxa" w:w="90"/>
+            </w:tcMar>
+          </w:tcPr>
+          <w:p>
+            <w:pPr>
+              <w:spacing w:after="0" w:before="0"/>
+            </w:pPr>
+            <w:r>
+              <w:rPr>
+                <w:rFonts w:ascii="Arial" w:cs="Arial" w:eastAsia="Arial" w:hAnsi="Arial"/>
+                <w:color w:val="15202B"/>
+                <w:sz w:val="18"/>
+                <w:szCs w:val="18"/>
+              </w:rPr>
+              <w:t xml:space="preserve">Customer banner "Out for delivery · Your rider is on the way." (or "...handling multiple orders.").</w:t>
+            </w:r>
+          </w:p>
+        </w:tc>
+        <w:tc>
+          <w:tcPr>
+            <w:tcW w:type="dxa" w:w="900"/>
+            <w:tcBorders>
+              <w:top w:val="single" w:color="B9D7F2" w:sz="4"/>
+              <w:left w:val="single" w:color="B9D7F2" w:sz="4"/>
+              <w:bottom w:val="single" w:color="B9D7F2" w:sz="4"/>
+              <w:right w:val="single" w:color="B9D7F2" w:sz="4"/>
+            </w:tcBorders>
+            <w:shd w:fill="EAF4FD" w:color="auto" w:val="clear"/>
+            <w:tcMar>
+              <w:top w:type="dxa" w:w="60"/>
+              <w:left w:type="dxa" w:w="90"/>
+              <w:bottom w:type="dxa" w:w="60"/>
+              <w:right w:type="dxa" w:w="90"/>
+            </w:tcMar>
+          </w:tcPr>
+          <w:p>
+            <w:pPr>
+              <w:spacing w:after="0" w:before="0"/>
+            </w:pPr>
+            <w:r>
+              <w:rPr>
+                <w:rFonts w:ascii="Arial" w:cs="Arial" w:eastAsia="Arial" w:hAnsi="Arial"/>
+                <w:color w:val="15202B"/>
+                <w:sz w:val="18"/>
+                <w:szCs w:val="18"/>
+              </w:rPr>
+              <w:t xml:space="preserve">☐ Pass</w:t>
+            </w:r>
+          </w:p>
+          <w:p>
+            <w:pPr>
+              <w:spacing w:after="0" w:before="0"/>
+            </w:pPr>
+            <w:r>
+              <w:rPr>
+                <w:rFonts w:ascii="Arial" w:cs="Arial" w:eastAsia="Arial" w:hAnsi="Arial"/>
+                <w:color w:val="15202B"/>
+                <w:sz w:val="18"/>
+                <w:szCs w:val="18"/>
+              </w:rPr>
+              <w:t xml:space="preserve">☐ Fail</w:t>
+            </w:r>
+          </w:p>
+        </w:tc>
+        <w:tc>
+          <w:tcPr>
+            <w:tcW w:type="dxa" w:w="1206"/>
+            <w:tcBorders>
+              <w:top w:val="single" w:color="B9D7F2" w:sz="4"/>
+              <w:left w:val="single" w:color="B9D7F2" w:sz="4"/>
+              <w:bottom w:val="single" w:color="B9D7F2" w:sz="4"/>
+              <w:right w:val="single" w:color="B9D7F2" w:sz="4"/>
+            </w:tcBorders>
+            <w:shd w:fill="EAF4FD" w:color="auto" w:val="clear"/>
+            <w:tcMar>
+              <w:top w:type="dxa" w:w="60"/>
+              <w:left w:type="dxa" w:w="90"/>
+              <w:bottom w:type="dxa" w:w="60"/>
+              <w:right w:type="dxa" w:w="90"/>
+            </w:tcMar>
+          </w:tcPr>
+          <w:p>
+            <w:pPr>
+              <w:spacing w:after="0" w:before="0"/>
+            </w:pPr>
+            <w:r>
+              <w:rPr>
+                <w:rFonts w:ascii="Arial" w:cs="Arial" w:eastAsia="Arial" w:hAnsi="Arial"/>
+                <w:color w:val="15202B"/>
+                <w:sz w:val="18"/>
+                <w:szCs w:val="18"/>
+              </w:rPr>
+              <w:t xml:space="preserve"/>
+            </w:r>
+          </w:p>
+        </w:tc>
+      </w:tr>
+      <w:tr>
+        <w:trPr>
+          <w:cantSplit/>
+        </w:trPr>
+        <w:tc>
+          <w:tcPr>
+            <w:tcW w:type="dxa" w:w="640"/>
+            <w:tcBorders>
+              <w:top w:val="single" w:color="B9D7F2" w:sz="4"/>
+              <w:left w:val="single" w:color="B9D7F2" w:sz="4"/>
+              <w:bottom w:val="single" w:color="B9D7F2" w:sz="4"/>
+              <w:right w:val="single" w:color="B9D7F2" w:sz="4"/>
+            </w:tcBorders>
+            <w:tcMar>
+              <w:top w:type="dxa" w:w="60"/>
+              <w:left w:type="dxa" w:w="90"/>
+              <w:bottom w:type="dxa" w:w="60"/>
+              <w:right w:type="dxa" w:w="90"/>
+            </w:tcMar>
+          </w:tcPr>
+          <w:p>
+            <w:pPr>
+              <w:spacing w:after="0" w:before="0"/>
+            </w:pPr>
+            <w:r>
+              <w:rPr>
+                <w:rFonts w:ascii="Arial" w:cs="Arial" w:eastAsia="Arial" w:hAnsi="Arial"/>
+                <w:color w:val="15202B"/>
+                <w:sz w:val="18"/>
+                <w:szCs w:val="18"/>
+              </w:rPr>
+              <w:t xml:space="preserve">36.5</w:t>
+            </w:r>
+          </w:p>
+        </w:tc>
+        <w:tc>
+          <w:tcPr>
+            <w:tcW w:type="dxa" w:w="3820"/>
+            <w:tcBorders>
+              <w:top w:val="single" w:color="B9D7F2" w:sz="4"/>
+              <w:left w:val="single" w:color="B9D7F2" w:sz="4"/>
+              <w:bottom w:val="single" w:color="B9D7F2" w:sz="4"/>
+              <w:right w:val="single" w:color="B9D7F2" w:sz="4"/>
+            </w:tcBorders>
+            <w:tcMar>
+              <w:top w:type="dxa" w:w="60"/>
+              <w:left w:type="dxa" w:w="90"/>
+              <w:bottom w:type="dxa" w:w="60"/>
+              <w:right w:type="dxa" w:w="90"/>
+            </w:tcMar>
+          </w:tcPr>
+          <w:p>
+            <w:pPr>
+              <w:spacing w:after="0" w:before="0"/>
+            </w:pPr>
+            <w:r>
+              <w:rPr>
+                <w:rFonts w:ascii="Arial" w:cs="Arial" w:eastAsia="Arial" w:hAnsi="Arial"/>
+                <w:color w:val="15202B"/>
+                <w:sz w:val="18"/>
+                <w:szCs w:val="18"/>
+              </w:rPr>
+              <w:t xml:space="preserve">Rider records Delivered (Paid).</w:t>
+            </w:r>
+          </w:p>
+        </w:tc>
+        <w:tc>
+          <w:tcPr>
+            <w:tcW w:type="dxa" w:w="3900"/>
+            <w:tcBorders>
+              <w:top w:val="single" w:color="B9D7F2" w:sz="4"/>
+              <w:left w:val="single" w:color="B9D7F2" w:sz="4"/>
+              <w:bottom w:val="single" w:color="B9D7F2" w:sz="4"/>
+              <w:right w:val="single" w:color="B9D7F2" w:sz="4"/>
+            </w:tcBorders>
+            <w:tcMar>
+              <w:top w:type="dxa" w:w="60"/>
+              <w:left w:type="dxa" w:w="90"/>
+              <w:bottom w:type="dxa" w:w="60"/>
+              <w:right w:type="dxa" w:w="90"/>
+            </w:tcMar>
+          </w:tcPr>
+          <w:p>
+            <w:pPr>
+              <w:spacing w:after="0" w:before="0"/>
+            </w:pPr>
+            <w:r>
+              <w:rPr>
+                <w:rFonts w:ascii="Arial" w:cs="Arial" w:eastAsia="Arial" w:hAnsi="Arial"/>
+                <w:color w:val="15202B"/>
+                <w:sz w:val="18"/>
+                <w:szCs w:val="18"/>
+              </w:rPr>
+              <w:t xml:space="preserve">Customer banner "Delivered · Thank you! Enjoy your fresh water."</w:t>
+            </w:r>
+          </w:p>
+        </w:tc>
+        <w:tc>
+          <w:tcPr>
+            <w:tcW w:type="dxa" w:w="900"/>
+            <w:tcBorders>
+              <w:top w:val="single" w:color="B9D7F2" w:sz="4"/>
+              <w:left w:val="single" w:color="B9D7F2" w:sz="4"/>
+              <w:bottom w:val="single" w:color="B9D7F2" w:sz="4"/>
+              <w:right w:val="single" w:color="B9D7F2" w:sz="4"/>
+            </w:tcBorders>
+            <w:tcMar>
+              <w:top w:type="dxa" w:w="60"/>
+              <w:left w:type="dxa" w:w="90"/>
+              <w:bottom w:type="dxa" w:w="60"/>
+              <w:right w:type="dxa" w:w="90"/>
+            </w:tcMar>
+          </w:tcPr>
+          <w:p>
+            <w:pPr>
+              <w:spacing w:after="0" w:before="0"/>
+            </w:pPr>
+            <w:r>
+              <w:rPr>
+                <w:rFonts w:ascii="Arial" w:cs="Arial" w:eastAsia="Arial" w:hAnsi="Arial"/>
+                <w:color w:val="15202B"/>
+                <w:sz w:val="18"/>
+                <w:szCs w:val="18"/>
+              </w:rPr>
+              <w:t xml:space="preserve">☐ Pass</w:t>
+            </w:r>
+          </w:p>
+          <w:p>
+            <w:pPr>
+              <w:spacing w:after="0" w:before="0"/>
+            </w:pPr>
+            <w:r>
+              <w:rPr>
+                <w:rFonts w:ascii="Arial" w:cs="Arial" w:eastAsia="Arial" w:hAnsi="Arial"/>
+                <w:color w:val="15202B"/>
+                <w:sz w:val="18"/>
+                <w:szCs w:val="18"/>
+              </w:rPr>
+              <w:t xml:space="preserve">☐ Fail</w:t>
+            </w:r>
+          </w:p>
+        </w:tc>
+        <w:tc>
+          <w:tcPr>
+            <w:tcW w:type="dxa" w:w="1206"/>
+            <w:tcBorders>
+              <w:top w:val="single" w:color="B9D7F2" w:sz="4"/>
+              <w:left w:val="single" w:color="B9D7F2" w:sz="4"/>
+              <w:bottom w:val="single" w:color="B9D7F2" w:sz="4"/>
+              <w:right w:val="single" w:color="B9D7F2" w:sz="4"/>
+            </w:tcBorders>
+            <w:tcMar>
+              <w:top w:type="dxa" w:w="60"/>
+              <w:left w:type="dxa" w:w="90"/>
+              <w:bottom w:type="dxa" w:w="60"/>
+              <w:right w:type="dxa" w:w="90"/>
+            </w:tcMar>
+          </w:tcPr>
+          <w:p>
+            <w:pPr>
+              <w:spacing w:after="0" w:before="0"/>
+            </w:pPr>
+            <w:r>
+              <w:rPr>
+                <w:rFonts w:ascii="Arial" w:cs="Arial" w:eastAsia="Arial" w:hAnsi="Arial"/>
+                <w:color w:val="15202B"/>
+                <w:sz w:val="18"/>
+                <w:szCs w:val="18"/>
+              </w:rPr>
+              <w:t xml:space="preserve"/>
+            </w:r>
+          </w:p>
+        </w:tc>
+      </w:tr>
+      <w:tr>
+        <w:trPr>
+          <w:cantSplit/>
+        </w:trPr>
+        <w:tc>
+          <w:tcPr>
+            <w:tcW w:type="dxa" w:w="640"/>
+            <w:tcBorders>
+              <w:top w:val="single" w:color="B9D7F2" w:sz="4"/>
+              <w:left w:val="single" w:color="B9D7F2" w:sz="4"/>
+              <w:bottom w:val="single" w:color="B9D7F2" w:sz="4"/>
+              <w:right w:val="single" w:color="B9D7F2" w:sz="4"/>
+            </w:tcBorders>
+            <w:shd w:fill="EAF4FD" w:color="auto" w:val="clear"/>
+            <w:tcMar>
+              <w:top w:type="dxa" w:w="60"/>
+              <w:left w:type="dxa" w:w="90"/>
+              <w:bottom w:type="dxa" w:w="60"/>
+              <w:right w:type="dxa" w:w="90"/>
+            </w:tcMar>
+          </w:tcPr>
+          <w:p>
+            <w:pPr>
+              <w:spacing w:after="0" w:before="0"/>
+            </w:pPr>
+            <w:r>
+              <w:rPr>
+                <w:rFonts w:ascii="Arial" w:cs="Arial" w:eastAsia="Arial" w:hAnsi="Arial"/>
+                <w:color w:val="15202B"/>
+                <w:sz w:val="18"/>
+                <w:szCs w:val="18"/>
+              </w:rPr>
+              <w:t xml:space="preserve">36.6</w:t>
+            </w:r>
+          </w:p>
+        </w:tc>
+        <w:tc>
+          <w:tcPr>
+            <w:tcW w:type="dxa" w:w="3820"/>
+            <w:tcBorders>
+              <w:top w:val="single" w:color="B9D7F2" w:sz="4"/>
+              <w:left w:val="single" w:color="B9D7F2" w:sz="4"/>
+              <w:bottom w:val="single" w:color="B9D7F2" w:sz="4"/>
+              <w:right w:val="single" w:color="B9D7F2" w:sz="4"/>
+            </w:tcBorders>
+            <w:shd w:fill="EAF4FD" w:color="auto" w:val="clear"/>
+            <w:tcMar>
+              <w:top w:type="dxa" w:w="60"/>
+              <w:left w:type="dxa" w:w="90"/>
+              <w:bottom w:type="dxa" w:w="60"/>
+              <w:right w:type="dxa" w:w="90"/>
+            </w:tcMar>
+          </w:tcPr>
+          <w:p>
+            <w:pPr>
+              <w:spacing w:after="0" w:before="0"/>
+            </w:pPr>
+            <w:r>
+              <w:rPr>
+                <w:rFonts w:ascii="Arial" w:cs="Arial" w:eastAsia="Arial" w:hAnsi="Arial"/>
+                <w:color w:val="15202B"/>
+                <w:sz w:val="18"/>
+                <w:szCs w:val="18"/>
+              </w:rPr>
+              <w:t xml:space="preserve">Rider records Not delivered with note "Not home".</w:t>
+            </w:r>
+          </w:p>
+        </w:tc>
+        <w:tc>
+          <w:tcPr>
+            <w:tcW w:type="dxa" w:w="3900"/>
+            <w:tcBorders>
+              <w:top w:val="single" w:color="B9D7F2" w:sz="4"/>
+              <w:left w:val="single" w:color="B9D7F2" w:sz="4"/>
+              <w:bottom w:val="single" w:color="B9D7F2" w:sz="4"/>
+              <w:right w:val="single" w:color="B9D7F2" w:sz="4"/>
+            </w:tcBorders>
+            <w:shd w:fill="EAF4FD" w:color="auto" w:val="clear"/>
+            <w:tcMar>
+              <w:top w:type="dxa" w:w="60"/>
+              <w:left w:type="dxa" w:w="90"/>
+              <w:bottom w:type="dxa" w:w="60"/>
+              <w:right w:type="dxa" w:w="90"/>
+            </w:tcMar>
+          </w:tcPr>
+          <w:p>
+            <w:pPr>
+              <w:spacing w:after="0" w:before="0"/>
+            </w:pPr>
+            <w:r>
+              <w:rPr>
+                <w:rFonts w:ascii="Arial" w:cs="Arial" w:eastAsia="Arial" w:hAnsi="Arial"/>
+                <w:color w:val="15202B"/>
+                <w:sz w:val="18"/>
+                <w:szCs w:val="18"/>
+              </w:rPr>
+              <w:t xml:space="preserve">Customer banner "Not delivered · Not home. The station will contact you."</w:t>
+            </w:r>
+          </w:p>
+        </w:tc>
+        <w:tc>
+          <w:tcPr>
+            <w:tcW w:type="dxa" w:w="900"/>
+            <w:tcBorders>
+              <w:top w:val="single" w:color="B9D7F2" w:sz="4"/>
+              <w:left w:val="single" w:color="B9D7F2" w:sz="4"/>
+              <w:bottom w:val="single" w:color="B9D7F2" w:sz="4"/>
+              <w:right w:val="single" w:color="B9D7F2" w:sz="4"/>
+            </w:tcBorders>
+            <w:shd w:fill="EAF4FD" w:color="auto" w:val="clear"/>
+            <w:tcMar>
+              <w:top w:type="dxa" w:w="60"/>
+              <w:left w:type="dxa" w:w="90"/>
+              <w:bottom w:type="dxa" w:w="60"/>
+              <w:right w:type="dxa" w:w="90"/>
+            </w:tcMar>
+          </w:tcPr>
+          <w:p>
+            <w:pPr>
+              <w:spacing w:after="0" w:before="0"/>
+            </w:pPr>
+            <w:r>
+              <w:rPr>
+                <w:rFonts w:ascii="Arial" w:cs="Arial" w:eastAsia="Arial" w:hAnsi="Arial"/>
+                <w:color w:val="15202B"/>
+                <w:sz w:val="18"/>
+                <w:szCs w:val="18"/>
+              </w:rPr>
+              <w:t xml:space="preserve">☐ Pass</w:t>
+            </w:r>
+          </w:p>
+          <w:p>
+            <w:pPr>
+              <w:spacing w:after="0" w:before="0"/>
+            </w:pPr>
+            <w:r>
+              <w:rPr>
+                <w:rFonts w:ascii="Arial" w:cs="Arial" w:eastAsia="Arial" w:hAnsi="Arial"/>
+                <w:color w:val="15202B"/>
+                <w:sz w:val="18"/>
+                <w:szCs w:val="18"/>
+              </w:rPr>
+              <w:t xml:space="preserve">☐ Fail</w:t>
+            </w:r>
+          </w:p>
+        </w:tc>
+        <w:tc>
+          <w:tcPr>
+            <w:tcW w:type="dxa" w:w="1206"/>
+            <w:tcBorders>
+              <w:top w:val="single" w:color="B9D7F2" w:sz="4"/>
+              <w:left w:val="single" w:color="B9D7F2" w:sz="4"/>
+              <w:bottom w:val="single" w:color="B9D7F2" w:sz="4"/>
+              <w:right w:val="single" w:color="B9D7F2" w:sz="4"/>
+            </w:tcBorders>
+            <w:shd w:fill="EAF4FD" w:color="auto" w:val="clear"/>
+            <w:tcMar>
+              <w:top w:type="dxa" w:w="60"/>
+              <w:left w:type="dxa" w:w="90"/>
+              <w:bottom w:type="dxa" w:w="60"/>
+              <w:right w:type="dxa" w:w="90"/>
+            </w:tcMar>
+          </w:tcPr>
+          <w:p>
+            <w:pPr>
+              <w:spacing w:after="0" w:before="0"/>
+            </w:pPr>
+            <w:r>
+              <w:rPr>
+                <w:rFonts w:ascii="Arial" w:cs="Arial" w:eastAsia="Arial" w:hAnsi="Arial"/>
+                <w:color w:val="15202B"/>
+                <w:sz w:val="18"/>
+                <w:szCs w:val="18"/>
+              </w:rPr>
+              <w:t xml:space="preserve"/>
+            </w:r>
+          </w:p>
+        </w:tc>
+      </w:tr>
+      <w:tr>
+        <w:trPr>
+          <w:cantSplit/>
+        </w:trPr>
+        <w:tc>
+          <w:tcPr>
+            <w:tcW w:type="dxa" w:w="640"/>
+            <w:tcBorders>
+              <w:top w:val="single" w:color="B9D7F2" w:sz="4"/>
+              <w:left w:val="single" w:color="B9D7F2" w:sz="4"/>
+              <w:bottom w:val="single" w:color="B9D7F2" w:sz="4"/>
+              <w:right w:val="single" w:color="B9D7F2" w:sz="4"/>
+            </w:tcBorders>
+            <w:tcMar>
+              <w:top w:type="dxa" w:w="60"/>
+              <w:left w:type="dxa" w:w="90"/>
+              <w:bottom w:type="dxa" w:w="60"/>
+              <w:right w:type="dxa" w:w="90"/>
+            </w:tcMar>
+          </w:tcPr>
+          <w:p>
+            <w:pPr>
+              <w:spacing w:after="0" w:before="0"/>
+            </w:pPr>
+            <w:r>
+              <w:rPr>
+                <w:rFonts w:ascii="Arial" w:cs="Arial" w:eastAsia="Arial" w:hAnsi="Arial"/>
+                <w:color w:val="15202B"/>
+                <w:sz w:val="18"/>
+                <w:szCs w:val="18"/>
+              </w:rPr>
+              <w:t xml:space="preserve">36.7</w:t>
+            </w:r>
+          </w:p>
+        </w:tc>
+        <w:tc>
+          <w:tcPr>
+            <w:tcW w:type="dxa" w:w="3820"/>
+            <w:tcBorders>
+              <w:top w:val="single" w:color="B9D7F2" w:sz="4"/>
+              <w:left w:val="single" w:color="B9D7F2" w:sz="4"/>
+              <w:bottom w:val="single" w:color="B9D7F2" w:sz="4"/>
+              <w:right w:val="single" w:color="B9D7F2" w:sz="4"/>
+            </w:tcBorders>
+            <w:tcMar>
+              <w:top w:type="dxa" w:w="60"/>
+              <w:left w:type="dxa" w:w="90"/>
+              <w:bottom w:type="dxa" w:w="60"/>
+              <w:right w:type="dxa" w:w="90"/>
+            </w:tcMar>
+          </w:tcPr>
+          <w:p>
+            <w:pPr>
+              <w:spacing w:after="0" w:before="0"/>
+            </w:pPr>
+            <w:r>
+              <w:rPr>
+                <w:rFonts w:ascii="Arial" w:cs="Arial" w:eastAsia="Arial" w:hAnsi="Arial"/>
+                <w:color w:val="15202B"/>
+                <w:sz w:val="18"/>
+                <w:szCs w:val="18"/>
+              </w:rPr>
+              <w:t xml:space="preserve">Owner: bell &gt; Preferences.</w:t>
+            </w:r>
+          </w:p>
+        </w:tc>
+        <w:tc>
+          <w:tcPr>
+            <w:tcW w:type="dxa" w:w="3900"/>
+            <w:tcBorders>
+              <w:top w:val="single" w:color="B9D7F2" w:sz="4"/>
+              <w:left w:val="single" w:color="B9D7F2" w:sz="4"/>
+              <w:bottom w:val="single" w:color="B9D7F2" w:sz="4"/>
+              <w:right w:val="single" w:color="B9D7F2" w:sz="4"/>
+            </w:tcBorders>
+            <w:tcMar>
+              <w:top w:type="dxa" w:w="60"/>
+              <w:left w:type="dxa" w:w="90"/>
+              <w:bottom w:type="dxa" w:w="60"/>
+              <w:right w:type="dxa" w:w="90"/>
+            </w:tcMar>
+          </w:tcPr>
+          <w:p>
+            <w:pPr>
+              <w:spacing w:after="0" w:before="0"/>
+            </w:pPr>
+            <w:r>
+              <w:rPr>
+                <w:rFonts w:ascii="Arial" w:cs="Arial" w:eastAsia="Arial" w:hAnsi="Arial"/>
+                <w:color w:val="15202B"/>
+                <w:sz w:val="18"/>
+                <w:szCs w:val="18"/>
+              </w:rPr>
+              <w:t xml:space="preserve">List with switches: New orders, Orders logged by staff, Cancelled orders, Not delivered, Tank at 60, Low stock, Damaged gallon; note about phone push.</w:t>
+            </w:r>
+          </w:p>
+        </w:tc>
+        <w:tc>
+          <w:tcPr>
+            <w:tcW w:type="dxa" w:w="900"/>
+            <w:tcBorders>
+              <w:top w:val="single" w:color="B9D7F2" w:sz="4"/>
+              <w:left w:val="single" w:color="B9D7F2" w:sz="4"/>
+              <w:bottom w:val="single" w:color="B9D7F2" w:sz="4"/>
+              <w:right w:val="single" w:color="B9D7F2" w:sz="4"/>
+            </w:tcBorders>
+            <w:tcMar>
+              <w:top w:type="dxa" w:w="60"/>
+              <w:left w:type="dxa" w:w="90"/>
+              <w:bottom w:type="dxa" w:w="60"/>
+              <w:right w:type="dxa" w:w="90"/>
+            </w:tcMar>
+          </w:tcPr>
+          <w:p>
+            <w:pPr>
+              <w:spacing w:after="0" w:before="0"/>
+            </w:pPr>
+            <w:r>
+              <w:rPr>
+                <w:rFonts w:ascii="Arial" w:cs="Arial" w:eastAsia="Arial" w:hAnsi="Arial"/>
+                <w:color w:val="15202B"/>
+                <w:sz w:val="18"/>
+                <w:szCs w:val="18"/>
+              </w:rPr>
+              <w:t xml:space="preserve">☐ Pass</w:t>
+            </w:r>
+          </w:p>
+          <w:p>
+            <w:pPr>
+              <w:spacing w:after="0" w:before="0"/>
+            </w:pPr>
+            <w:r>
+              <w:rPr>
+                <w:rFonts w:ascii="Arial" w:cs="Arial" w:eastAsia="Arial" w:hAnsi="Arial"/>
+                <w:color w:val="15202B"/>
+                <w:sz w:val="18"/>
+                <w:szCs w:val="18"/>
+              </w:rPr>
+              <w:t xml:space="preserve">☐ Fail</w:t>
+            </w:r>
+          </w:p>
+        </w:tc>
+        <w:tc>
+          <w:tcPr>
+            <w:tcW w:type="dxa" w:w="1206"/>
+            <w:tcBorders>
+              <w:top w:val="single" w:color="B9D7F2" w:sz="4"/>
+              <w:left w:val="single" w:color="B9D7F2" w:sz="4"/>
+              <w:bottom w:val="single" w:color="B9D7F2" w:sz="4"/>
+              <w:right w:val="single" w:color="B9D7F2" w:sz="4"/>
+            </w:tcBorders>
+            <w:tcMar>
+              <w:top w:type="dxa" w:w="60"/>
+              <w:left w:type="dxa" w:w="90"/>
+              <w:bottom w:type="dxa" w:w="60"/>
+              <w:right w:type="dxa" w:w="90"/>
+            </w:tcMar>
+          </w:tcPr>
+          <w:p>
+            <w:pPr>
+              <w:spacing w:after="0" w:before="0"/>
+            </w:pPr>
+            <w:r>
+              <w:rPr>
+                <w:rFonts w:ascii="Arial" w:cs="Arial" w:eastAsia="Arial" w:hAnsi="Arial"/>
+                <w:color w:val="15202B"/>
+                <w:sz w:val="18"/>
+                <w:szCs w:val="18"/>
+              </w:rPr>
+              <w:t xml:space="preserve"/>
+            </w:r>
+          </w:p>
+        </w:tc>
+      </w:tr>
+      <w:tr>
+        <w:trPr>
+          <w:cantSplit/>
+        </w:trPr>
+        <w:tc>
+          <w:tcPr>
+            <w:tcW w:type="dxa" w:w="640"/>
+            <w:tcBorders>
+              <w:top w:val="single" w:color="B9D7F2" w:sz="4"/>
+              <w:left w:val="single" w:color="B9D7F2" w:sz="4"/>
+              <w:bottom w:val="single" w:color="B9D7F2" w:sz="4"/>
+              <w:right w:val="single" w:color="B9D7F2" w:sz="4"/>
+            </w:tcBorders>
+            <w:shd w:fill="EAF4FD" w:color="auto" w:val="clear"/>
+            <w:tcMar>
+              <w:top w:type="dxa" w:w="60"/>
+              <w:left w:type="dxa" w:w="90"/>
+              <w:bottom w:type="dxa" w:w="60"/>
+              <w:right w:type="dxa" w:w="90"/>
+            </w:tcMar>
+          </w:tcPr>
+          <w:p>
+            <w:pPr>
+              <w:spacing w:after="0" w:before="0"/>
+            </w:pPr>
+            <w:r>
+              <w:rPr>
+                <w:rFonts w:ascii="Arial" w:cs="Arial" w:eastAsia="Arial" w:hAnsi="Arial"/>
+                <w:color w:val="15202B"/>
+                <w:sz w:val="18"/>
+                <w:szCs w:val="18"/>
+              </w:rPr>
+              <w:t xml:space="preserve">36.8</w:t>
+            </w:r>
+          </w:p>
+        </w:tc>
+        <w:tc>
+          <w:tcPr>
+            <w:tcW w:type="dxa" w:w="3820"/>
+            <w:tcBorders>
+              <w:top w:val="single" w:color="B9D7F2" w:sz="4"/>
+              <w:left w:val="single" w:color="B9D7F2" w:sz="4"/>
+              <w:bottom w:val="single" w:color="B9D7F2" w:sz="4"/>
+              <w:right w:val="single" w:color="B9D7F2" w:sz="4"/>
+            </w:tcBorders>
+            <w:shd w:fill="EAF4FD" w:color="auto" w:val="clear"/>
+            <w:tcMar>
+              <w:top w:type="dxa" w:w="60"/>
+              <w:left w:type="dxa" w:w="90"/>
+              <w:bottom w:type="dxa" w:w="60"/>
+              <w:right w:type="dxa" w:w="90"/>
+            </w:tcMar>
+          </w:tcPr>
+          <w:p>
+            <w:pPr>
+              <w:spacing w:after="0" w:before="0"/>
+            </w:pPr>
+            <w:r>
+              <w:rPr>
+                <w:rFonts w:ascii="Arial" w:cs="Arial" w:eastAsia="Arial" w:hAnsi="Arial"/>
+                <w:color w:val="15202B"/>
+                <w:sz w:val="18"/>
+                <w:szCs w:val="18"/>
+              </w:rPr>
+              <w:t xml:space="preserve">Turn off New orders.</w:t>
+            </w:r>
+          </w:p>
+        </w:tc>
+        <w:tc>
+          <w:tcPr>
+            <w:tcW w:type="dxa" w:w="3900"/>
+            <w:tcBorders>
+              <w:top w:val="single" w:color="B9D7F2" w:sz="4"/>
+              <w:left w:val="single" w:color="B9D7F2" w:sz="4"/>
+              <w:bottom w:val="single" w:color="B9D7F2" w:sz="4"/>
+              <w:right w:val="single" w:color="B9D7F2" w:sz="4"/>
+            </w:tcBorders>
+            <w:shd w:fill="EAF4FD" w:color="auto" w:val="clear"/>
+            <w:tcMar>
+              <w:top w:type="dxa" w:w="60"/>
+              <w:left w:type="dxa" w:w="90"/>
+              <w:bottom w:type="dxa" w:w="60"/>
+              <w:right w:type="dxa" w:w="90"/>
+            </w:tcMar>
+          </w:tcPr>
+          <w:p>
+            <w:pPr>
+              <w:spacing w:after="0" w:before="0"/>
+            </w:pPr>
+            <w:r>
+              <w:rPr>
+                <w:rFonts w:ascii="Arial" w:cs="Arial" w:eastAsia="Arial" w:hAnsi="Arial"/>
+                <w:color w:val="15202B"/>
+                <w:sz w:val="18"/>
+                <w:szCs w:val="18"/>
+              </w:rPr>
+              <w:t xml:space="preserve">Message "Saved. Takes effect right away."</w:t>
+            </w:r>
+          </w:p>
+        </w:tc>
+        <w:tc>
+          <w:tcPr>
+            <w:tcW w:type="dxa" w:w="900"/>
+            <w:tcBorders>
+              <w:top w:val="single" w:color="B9D7F2" w:sz="4"/>
+              <w:left w:val="single" w:color="B9D7F2" w:sz="4"/>
+              <w:bottom w:val="single" w:color="B9D7F2" w:sz="4"/>
+              <w:right w:val="single" w:color="B9D7F2" w:sz="4"/>
+            </w:tcBorders>
+            <w:shd w:fill="EAF4FD" w:color="auto" w:val="clear"/>
+            <w:tcMar>
+              <w:top w:type="dxa" w:w="60"/>
+              <w:left w:type="dxa" w:w="90"/>
+              <w:bottom w:type="dxa" w:w="60"/>
+              <w:right w:type="dxa" w:w="90"/>
+            </w:tcMar>
+          </w:tcPr>
+          <w:p>
+            <w:pPr>
+              <w:spacing w:after="0" w:before="0"/>
+            </w:pPr>
+            <w:r>
+              <w:rPr>
+                <w:rFonts w:ascii="Arial" w:cs="Arial" w:eastAsia="Arial" w:hAnsi="Arial"/>
+                <w:color w:val="15202B"/>
+                <w:sz w:val="18"/>
+                <w:szCs w:val="18"/>
+              </w:rPr>
+              <w:t xml:space="preserve">☐ Pass</w:t>
+            </w:r>
+          </w:p>
+          <w:p>
+            <w:pPr>
+              <w:spacing w:after="0" w:before="0"/>
+            </w:pPr>
+            <w:r>
+              <w:rPr>
+                <w:rFonts w:ascii="Arial" w:cs="Arial" w:eastAsia="Arial" w:hAnsi="Arial"/>
+                <w:color w:val="15202B"/>
+                <w:sz w:val="18"/>
+                <w:szCs w:val="18"/>
+              </w:rPr>
+              <w:t xml:space="preserve">☐ Fail</w:t>
+            </w:r>
+          </w:p>
+        </w:tc>
+        <w:tc>
+          <w:tcPr>
+            <w:tcW w:type="dxa" w:w="1206"/>
+            <w:tcBorders>
+              <w:top w:val="single" w:color="B9D7F2" w:sz="4"/>
+              <w:left w:val="single" w:color="B9D7F2" w:sz="4"/>
+              <w:bottom w:val="single" w:color="B9D7F2" w:sz="4"/>
+              <w:right w:val="single" w:color="B9D7F2" w:sz="4"/>
+            </w:tcBorders>
+            <w:shd w:fill="EAF4FD" w:color="auto" w:val="clear"/>
+            <w:tcMar>
+              <w:top w:type="dxa" w:w="60"/>
+              <w:left w:type="dxa" w:w="90"/>
+              <w:bottom w:type="dxa" w:w="60"/>
+              <w:right w:type="dxa" w:w="90"/>
+            </w:tcMar>
+          </w:tcPr>
+          <w:p>
+            <w:pPr>
+              <w:spacing w:after="0" w:before="0"/>
+            </w:pPr>
+            <w:r>
+              <w:rPr>
+                <w:rFonts w:ascii="Arial" w:cs="Arial" w:eastAsia="Arial" w:hAnsi="Arial"/>
+                <w:color w:val="15202B"/>
+                <w:sz w:val="18"/>
+                <w:szCs w:val="18"/>
+              </w:rPr>
+              <w:t xml:space="preserve"/>
+            </w:r>
+          </w:p>
+        </w:tc>
+      </w:tr>
+      <w:tr>
+        <w:trPr>
+          <w:cantSplit/>
+        </w:trPr>
+        <w:tc>
+          <w:tcPr>
+            <w:tcW w:type="dxa" w:w="640"/>
+            <w:tcBorders>
+              <w:top w:val="single" w:color="B9D7F2" w:sz="4"/>
+              <w:left w:val="single" w:color="B9D7F2" w:sz="4"/>
+              <w:bottom w:val="single" w:color="B9D7F2" w:sz="4"/>
+              <w:right w:val="single" w:color="B9D7F2" w:sz="4"/>
+            </w:tcBorders>
+            <w:tcMar>
+              <w:top w:type="dxa" w:w="60"/>
+              <w:left w:type="dxa" w:w="90"/>
+              <w:bottom w:type="dxa" w:w="60"/>
+              <w:right w:type="dxa" w:w="90"/>
+            </w:tcMar>
+          </w:tcPr>
+          <w:p>
+            <w:pPr>
+              <w:spacing w:after="0" w:before="0"/>
+            </w:pPr>
+            <w:r>
+              <w:rPr>
+                <w:rFonts w:ascii="Arial" w:cs="Arial" w:eastAsia="Arial" w:hAnsi="Arial"/>
+                <w:color w:val="15202B"/>
+                <w:sz w:val="18"/>
+                <w:szCs w:val="18"/>
+              </w:rPr>
+              <w:t xml:space="preserve">36.9</w:t>
+            </w:r>
+          </w:p>
+        </w:tc>
+        <w:tc>
+          <w:tcPr>
+            <w:tcW w:type="dxa" w:w="3820"/>
+            <w:tcBorders>
+              <w:top w:val="single" w:color="B9D7F2" w:sz="4"/>
+              <w:left w:val="single" w:color="B9D7F2" w:sz="4"/>
+              <w:bottom w:val="single" w:color="B9D7F2" w:sz="4"/>
+              <w:right w:val="single" w:color="B9D7F2" w:sz="4"/>
+            </w:tcBorders>
+            <w:tcMar>
+              <w:top w:type="dxa" w:w="60"/>
+              <w:left w:type="dxa" w:w="90"/>
+              <w:bottom w:type="dxa" w:w="60"/>
+              <w:right w:type="dxa" w:w="90"/>
+            </w:tcMar>
+          </w:tcPr>
+          <w:p>
+            <w:pPr>
+              <w:spacing w:after="0" w:before="0"/>
+            </w:pPr>
+            <w:r>
+              <w:rPr>
+                <w:rFonts w:ascii="Arial" w:cs="Arial" w:eastAsia="Arial" w:hAnsi="Arial"/>
+                <w:color w:val="15202B"/>
+                <w:sz w:val="18"/>
+                <w:szCs w:val="18"/>
+              </w:rPr>
+              <w:t xml:space="preserve">Customer places an order.</w:t>
+            </w:r>
+          </w:p>
+        </w:tc>
+        <w:tc>
+          <w:tcPr>
+            <w:tcW w:type="dxa" w:w="3900"/>
+            <w:tcBorders>
+              <w:top w:val="single" w:color="B9D7F2" w:sz="4"/>
+              <w:left w:val="single" w:color="B9D7F2" w:sz="4"/>
+              <w:bottom w:val="single" w:color="B9D7F2" w:sz="4"/>
+              <w:right w:val="single" w:color="B9D7F2" w:sz="4"/>
+            </w:tcBorders>
+            <w:tcMar>
+              <w:top w:type="dxa" w:w="60"/>
+              <w:left w:type="dxa" w:w="90"/>
+              <w:bottom w:type="dxa" w:w="60"/>
+              <w:right w:type="dxa" w:w="90"/>
+            </w:tcMar>
+          </w:tcPr>
+          <w:p>
+            <w:pPr>
+              <w:spacing w:after="0" w:before="0"/>
+            </w:pPr>
+            <w:r>
+              <w:rPr>
+                <w:rFonts w:ascii="Arial" w:cs="Arial" w:eastAsia="Arial" w:hAnsi="Arial"/>
+                <w:color w:val="15202B"/>
+                <w:sz w:val="18"/>
+                <w:szCs w:val="18"/>
+              </w:rPr>
+              <w:t xml:space="preserve">The owner gets NO "New order" alert or banner. (The order still shows on the Order Board.)</w:t>
+            </w:r>
+          </w:p>
+        </w:tc>
+        <w:tc>
+          <w:tcPr>
+            <w:tcW w:type="dxa" w:w="900"/>
+            <w:tcBorders>
+              <w:top w:val="single" w:color="B9D7F2" w:sz="4"/>
+              <w:left w:val="single" w:color="B9D7F2" w:sz="4"/>
+              <w:bottom w:val="single" w:color="B9D7F2" w:sz="4"/>
+              <w:right w:val="single" w:color="B9D7F2" w:sz="4"/>
+            </w:tcBorders>
+            <w:tcMar>
+              <w:top w:type="dxa" w:w="60"/>
+              <w:left w:type="dxa" w:w="90"/>
+              <w:bottom w:type="dxa" w:w="60"/>
+              <w:right w:type="dxa" w:w="90"/>
+            </w:tcMar>
+          </w:tcPr>
+          <w:p>
+            <w:pPr>
+              <w:spacing w:after="0" w:before="0"/>
+            </w:pPr>
+            <w:r>
+              <w:rPr>
+                <w:rFonts w:ascii="Arial" w:cs="Arial" w:eastAsia="Arial" w:hAnsi="Arial"/>
+                <w:color w:val="15202B"/>
+                <w:sz w:val="18"/>
+                <w:szCs w:val="18"/>
+              </w:rPr>
+              <w:t xml:space="preserve">☐ Pass</w:t>
+            </w:r>
+          </w:p>
+          <w:p>
+            <w:pPr>
+              <w:spacing w:after="0" w:before="0"/>
+            </w:pPr>
+            <w:r>
+              <w:rPr>
+                <w:rFonts w:ascii="Arial" w:cs="Arial" w:eastAsia="Arial" w:hAnsi="Arial"/>
+                <w:color w:val="15202B"/>
+                <w:sz w:val="18"/>
+                <w:szCs w:val="18"/>
+              </w:rPr>
+              <w:t xml:space="preserve">☐ Fail</w:t>
+            </w:r>
+          </w:p>
+        </w:tc>
+        <w:tc>
+          <w:tcPr>
+            <w:tcW w:type="dxa" w:w="1206"/>
+            <w:tcBorders>
+              <w:top w:val="single" w:color="B9D7F2" w:sz="4"/>
+              <w:left w:val="single" w:color="B9D7F2" w:sz="4"/>
+              <w:bottom w:val="single" w:color="B9D7F2" w:sz="4"/>
+              <w:right w:val="single" w:color="B9D7F2" w:sz="4"/>
+            </w:tcBorders>
+            <w:tcMar>
+              <w:top w:type="dxa" w:w="60"/>
+              <w:left w:type="dxa" w:w="90"/>
+              <w:bottom w:type="dxa" w:w="60"/>
+              <w:right w:type="dxa" w:w="90"/>
+            </w:tcMar>
+          </w:tcPr>
+          <w:p>
+            <w:pPr>
+              <w:spacing w:after="0" w:before="0"/>
+            </w:pPr>
+            <w:r>
+              <w:rPr>
+                <w:rFonts w:ascii="Arial" w:cs="Arial" w:eastAsia="Arial" w:hAnsi="Arial"/>
+                <w:color w:val="15202B"/>
+                <w:sz w:val="18"/>
+                <w:szCs w:val="18"/>
+              </w:rPr>
+              <w:t xml:space="preserve"/>
+            </w:r>
+          </w:p>
+        </w:tc>
+      </w:tr>
+      <w:tr>
+        <w:trPr>
+          <w:cantSplit/>
+        </w:trPr>
+        <w:tc>
+          <w:tcPr>
+            <w:tcW w:type="dxa" w:w="640"/>
+            <w:tcBorders>
+              <w:top w:val="single" w:color="B9D7F2" w:sz="4"/>
+              <w:left w:val="single" w:color="B9D7F2" w:sz="4"/>
+              <w:bottom w:val="single" w:color="B9D7F2" w:sz="4"/>
+              <w:right w:val="single" w:color="B9D7F2" w:sz="4"/>
+            </w:tcBorders>
+            <w:shd w:fill="EAF4FD" w:color="auto" w:val="clear"/>
+            <w:tcMar>
+              <w:top w:type="dxa" w:w="60"/>
+              <w:left w:type="dxa" w:w="90"/>
+              <w:bottom w:type="dxa" w:w="60"/>
+              <w:right w:type="dxa" w:w="90"/>
+            </w:tcMar>
+          </w:tcPr>
+          <w:p>
+            <w:pPr>
+              <w:spacing w:after="0" w:before="0"/>
+            </w:pPr>
+            <w:r>
+              <w:rPr>
+                <w:rFonts w:ascii="Arial" w:cs="Arial" w:eastAsia="Arial" w:hAnsi="Arial"/>
+                <w:color w:val="15202B"/>
+                <w:sz w:val="18"/>
+                <w:szCs w:val="18"/>
+              </w:rPr>
+              <w:t xml:space="preserve">36.10</w:t>
+            </w:r>
+          </w:p>
+        </w:tc>
+        <w:tc>
+          <w:tcPr>
+            <w:tcW w:type="dxa" w:w="3820"/>
+            <w:tcBorders>
+              <w:top w:val="single" w:color="B9D7F2" w:sz="4"/>
+              <w:left w:val="single" w:color="B9D7F2" w:sz="4"/>
+              <w:bottom w:val="single" w:color="B9D7F2" w:sz="4"/>
+              <w:right w:val="single" w:color="B9D7F2" w:sz="4"/>
+            </w:tcBorders>
+            <w:shd w:fill="EAF4FD" w:color="auto" w:val="clear"/>
+            <w:tcMar>
+              <w:top w:type="dxa" w:w="60"/>
+              <w:left w:type="dxa" w:w="90"/>
+              <w:bottom w:type="dxa" w:w="60"/>
+              <w:right w:type="dxa" w:w="90"/>
+            </w:tcMar>
+          </w:tcPr>
+          <w:p>
+            <w:pPr>
+              <w:spacing w:after="0" w:before="0"/>
+            </w:pPr>
+            <w:r>
+              <w:rPr>
+                <w:rFonts w:ascii="Arial" w:cs="Arial" w:eastAsia="Arial" w:hAnsi="Arial"/>
+                <w:color w:val="15202B"/>
+                <w:sz w:val="18"/>
+                <w:szCs w:val="18"/>
+              </w:rPr>
+              <w:t xml:space="preserve">Turn New orders back on; customer orders again.</w:t>
+            </w:r>
+          </w:p>
+        </w:tc>
+        <w:tc>
+          <w:tcPr>
+            <w:tcW w:type="dxa" w:w="3900"/>
+            <w:tcBorders>
+              <w:top w:val="single" w:color="B9D7F2" w:sz="4"/>
+              <w:left w:val="single" w:color="B9D7F2" w:sz="4"/>
+              <w:bottom w:val="single" w:color="B9D7F2" w:sz="4"/>
+              <w:right w:val="single" w:color="B9D7F2" w:sz="4"/>
+            </w:tcBorders>
+            <w:shd w:fill="EAF4FD" w:color="auto" w:val="clear"/>
+            <w:tcMar>
+              <w:top w:type="dxa" w:w="60"/>
+              <w:left w:type="dxa" w:w="90"/>
+              <w:bottom w:type="dxa" w:w="60"/>
+              <w:right w:type="dxa" w:w="90"/>
+            </w:tcMar>
+          </w:tcPr>
+          <w:p>
+            <w:pPr>
+              <w:spacing w:after="0" w:before="0"/>
+            </w:pPr>
+            <w:r>
+              <w:rPr>
+                <w:rFonts w:ascii="Arial" w:cs="Arial" w:eastAsia="Arial" w:hAnsi="Arial"/>
+                <w:color w:val="15202B"/>
+                <w:sz w:val="18"/>
+                <w:szCs w:val="18"/>
+              </w:rPr>
+              <w:t xml:space="preserve">The owner gets the alert again.</w:t>
             </w:r>
           </w:p>
         </w:tc>

</xml_diff>

<commit_message>
T38 Unpaid Accounts (per customer with search, total owed, Call, Paid per order, link from Payment box)
Co-Authored-By: Claude Opus 5.5 <noreply@anthropic.com>
Claude-Session: https://claude.ai/code/session_01DasQCNUJBbLyCWkvv4Qmw3
</commit_message>
<xml_diff>
--- a/docs/testing/Mangao-Testing-Checklist.docx
+++ b/docs/testing/Mangao-Testing-Checklist.docx
@@ -30,7 +30,7 @@
           <w:sz w:val="19"/>
           <w:szCs w:val="19"/>
         </w:rPr>
-        <w:t xml:space="preserve">Steps built but not yet checked in Chrome: 28 steps, 226 checks. Updated Oct 14, 2026, 1:24 AM.</w:t>
+        <w:t xml:space="preserve">Steps built but not yet checked in Chrome: 29 steps, 236 checks. Updated Oct 14, 2026, 1:29 AM.</w:t>
       </w:r>
     </w:p>
     <w:p>
@@ -5846,6 +5846,166 @@
           </w:p>
         </w:tc>
       </w:tr>
+      <w:tr>
+        <w:trPr>
+          <w:cantSplit/>
+        </w:trPr>
+        <w:tc>
+          <w:tcPr>
+            <w:tcW w:type="dxa" w:w="900"/>
+            <w:tcBorders>
+              <w:top w:val="single" w:color="B9D7F2" w:sz="4"/>
+              <w:left w:val="single" w:color="B9D7F2" w:sz="4"/>
+              <w:bottom w:val="single" w:color="B9D7F2" w:sz="4"/>
+              <w:right w:val="single" w:color="B9D7F2" w:sz="4"/>
+            </w:tcBorders>
+            <w:tcMar>
+              <w:top w:type="dxa" w:w="60"/>
+              <w:left w:type="dxa" w:w="90"/>
+              <w:bottom w:type="dxa" w:w="60"/>
+              <w:right w:type="dxa" w:w="90"/>
+            </w:tcMar>
+          </w:tcPr>
+          <w:p>
+            <w:pPr>
+              <w:spacing w:after="0" w:before="0"/>
+            </w:pPr>
+            <w:r>
+              <w:rPr>
+                <w:rFonts w:ascii="Arial" w:cs="Arial" w:eastAsia="Arial" w:hAnsi="Arial"/>
+                <w:color w:val="15202B"/>
+                <w:sz w:val="18"/>
+                <w:szCs w:val="18"/>
+              </w:rPr>
+              <w:t xml:space="preserve">38</w:t>
+            </w:r>
+          </w:p>
+        </w:tc>
+        <w:tc>
+          <w:tcPr>
+            <w:tcW w:type="dxa" w:w="4400"/>
+            <w:tcBorders>
+              <w:top w:val="single" w:color="B9D7F2" w:sz="4"/>
+              <w:left w:val="single" w:color="B9D7F2" w:sz="4"/>
+              <w:bottom w:val="single" w:color="B9D7F2" w:sz="4"/>
+              <w:right w:val="single" w:color="B9D7F2" w:sz="4"/>
+            </w:tcBorders>
+            <w:tcMar>
+              <w:top w:type="dxa" w:w="60"/>
+              <w:left w:type="dxa" w:w="90"/>
+              <w:bottom w:type="dxa" w:w="60"/>
+              <w:right w:type="dxa" w:w="90"/>
+            </w:tcMar>
+          </w:tcPr>
+          <w:p>
+            <w:pPr>
+              <w:spacing w:after="0" w:before="0"/>
+            </w:pPr>
+            <w:r>
+              <w:rPr>
+                <w:rFonts w:ascii="Arial" w:cs="Arial" w:eastAsia="Arial" w:hAnsi="Arial"/>
+                <w:color w:val="15202B"/>
+                <w:sz w:val="18"/>
+                <w:szCs w:val="18"/>
+              </w:rPr>
+              <w:t xml:space="preserve">Unpaid Accounts</w:t>
+            </w:r>
+          </w:p>
+        </w:tc>
+        <w:tc>
+          <w:tcPr>
+            <w:tcW w:type="dxa" w:w="2600"/>
+            <w:tcBorders>
+              <w:top w:val="single" w:color="B9D7F2" w:sz="4"/>
+              <w:left w:val="single" w:color="B9D7F2" w:sz="4"/>
+              <w:bottom w:val="single" w:color="B9D7F2" w:sz="4"/>
+              <w:right w:val="single" w:color="B9D7F2" w:sz="4"/>
+            </w:tcBorders>
+            <w:tcMar>
+              <w:top w:type="dxa" w:w="60"/>
+              <w:left w:type="dxa" w:w="90"/>
+              <w:bottom w:type="dxa" w:w="60"/>
+              <w:right w:type="dxa" w:w="90"/>
+            </w:tcMar>
+          </w:tcPr>
+          <w:p>
+            <w:pPr>
+              <w:spacing w:after="0" w:before="0"/>
+            </w:pPr>
+            <w:r>
+              <w:rPr>
+                <w:rFonts w:ascii="Arial" w:cs="Arial" w:eastAsia="Arial" w:hAnsi="Arial"/>
+                <w:color w:val="15202B"/>
+                <w:sz w:val="18"/>
+                <w:szCs w:val="18"/>
+              </w:rPr>
+              <w:t xml:space="preserve">Admin Sales 3</w:t>
+            </w:r>
+          </w:p>
+        </w:tc>
+        <w:tc>
+          <w:tcPr>
+            <w:tcW w:type="dxa" w:w="1300"/>
+            <w:tcBorders>
+              <w:top w:val="single" w:color="B9D7F2" w:sz="4"/>
+              <w:left w:val="single" w:color="B9D7F2" w:sz="4"/>
+              <w:bottom w:val="single" w:color="B9D7F2" w:sz="4"/>
+              <w:right w:val="single" w:color="B9D7F2" w:sz="4"/>
+            </w:tcBorders>
+            <w:tcMar>
+              <w:top w:type="dxa" w:w="60"/>
+              <w:left w:type="dxa" w:w="90"/>
+              <w:bottom w:type="dxa" w:w="60"/>
+              <w:right w:type="dxa" w:w="90"/>
+            </w:tcMar>
+          </w:tcPr>
+          <w:p>
+            <w:pPr>
+              <w:spacing w:after="0" w:before="0"/>
+            </w:pPr>
+            <w:r>
+              <w:rPr>
+                <w:rFonts w:ascii="Arial" w:cs="Arial" w:eastAsia="Arial" w:hAnsi="Arial"/>
+                <w:color w:val="15202B"/>
+                <w:sz w:val="18"/>
+                <w:szCs w:val="18"/>
+              </w:rPr>
+              <w:t xml:space="preserve">10</w:t>
+            </w:r>
+          </w:p>
+        </w:tc>
+        <w:tc>
+          <w:tcPr>
+            <w:tcW w:type="dxa" w:w="1266"/>
+            <w:tcBorders>
+              <w:top w:val="single" w:color="B9D7F2" w:sz="4"/>
+              <w:left w:val="single" w:color="B9D7F2" w:sz="4"/>
+              <w:bottom w:val="single" w:color="B9D7F2" w:sz="4"/>
+              <w:right w:val="single" w:color="B9D7F2" w:sz="4"/>
+            </w:tcBorders>
+            <w:tcMar>
+              <w:top w:type="dxa" w:w="60"/>
+              <w:left w:type="dxa" w:w="90"/>
+              <w:bottom w:type="dxa" w:w="60"/>
+              <w:right w:type="dxa" w:w="90"/>
+            </w:tcMar>
+          </w:tcPr>
+          <w:p>
+            <w:pPr>
+              <w:spacing w:after="0" w:before="0"/>
+            </w:pPr>
+            <w:r>
+              <w:rPr>
+                <w:rFonts w:ascii="Arial" w:cs="Arial" w:eastAsia="Arial" w:hAnsi="Arial"/>
+                <w:color w:val="15202B"/>
+                <w:sz w:val="18"/>
+                <w:szCs w:val="18"/>
+              </w:rPr>
+              <w:t xml:space="preserve">☐ Yes  ☐ No</w:t>
+            </w:r>
+          </w:p>
+        </w:tc>
+      </w:tr>
     </w:tbl>
     <w:p>
       <w:pPr>
@@ -53174,6 +53334,2055 @@
               <w:bottom w:val="single" w:color="B9D7F2" w:sz="4"/>
               <w:right w:val="single" w:color="B9D7F2" w:sz="4"/>
             </w:tcBorders>
+            <w:tcMar>
+              <w:top w:type="dxa" w:w="60"/>
+              <w:left w:type="dxa" w:w="90"/>
+              <w:bottom w:type="dxa" w:w="60"/>
+              <w:right w:type="dxa" w:w="90"/>
+            </w:tcMar>
+          </w:tcPr>
+          <w:p>
+            <w:pPr>
+              <w:spacing w:after="0" w:before="0"/>
+            </w:pPr>
+            <w:r>
+              <w:rPr>
+                <w:rFonts w:ascii="Arial" w:cs="Arial" w:eastAsia="Arial" w:hAnsi="Arial"/>
+                <w:color w:val="15202B"/>
+                <w:sz w:val="18"/>
+                <w:szCs w:val="18"/>
+              </w:rPr>
+              <w:t xml:space="preserve"/>
+            </w:r>
+          </w:p>
+        </w:tc>
+      </w:tr>
+    </w:tbl>
+    <w:p>
+      <w:pPr>
+        <w:pStyle w:val="Heading1"/>
+        <w:pageBreakBefore/>
+        <w:spacing w:after="60"/>
+      </w:pPr>
+      <w:r>
+        <w:rPr>
+          <w:rFonts w:ascii="Arial" w:cs="Arial" w:eastAsia="Arial" w:hAnsi="Arial"/>
+          <w:b/>
+          <w:bCs/>
+          <w:color w:val="0A84E0"/>
+          <w:sz w:val="28"/>
+          <w:szCs w:val="28"/>
+        </w:rPr>
+        <w:t xml:space="preserve">Step 38 · Unpaid Accounts</w:t>
+      </w:r>
+    </w:p>
+    <w:p>
+      <w:pPr>
+        <w:spacing w:after="60" w:before="0"/>
+      </w:pPr>
+      <w:r>
+        <w:rPr>
+          <w:rFonts w:ascii="Arial" w:cs="Arial" w:eastAsia="Arial" w:hAnsi="Arial"/>
+          <w:b/>
+          <w:bCs/>
+          <w:color w:val="15202B"/>
+          <w:sz w:val="19"/>
+          <w:szCs w:val="19"/>
+        </w:rPr>
+        <w:t xml:space="preserve">Screens: </w:t>
+      </w:r>
+      <w:r>
+        <w:rPr>
+          <w:rFonts w:ascii="Arial" w:cs="Arial" w:eastAsia="Arial" w:hAnsi="Arial"/>
+          <w:color w:val="15202B"/>
+          <w:sz w:val="19"/>
+          <w:szCs w:val="19"/>
+        </w:rPr>
+        <w:t xml:space="preserve">Admin Sales 3</w:t>
+      </w:r>
+      <w:r>
+        <w:rPr>
+          <w:rFonts w:ascii="Arial" w:cs="Arial" w:eastAsia="Arial" w:hAnsi="Arial"/>
+          <w:b/>
+          <w:bCs/>
+          <w:color w:val="15202B"/>
+          <w:sz w:val="19"/>
+          <w:szCs w:val="19"/>
+        </w:rPr>
+        <w:t xml:space="preserve">    Log in as: </w:t>
+      </w:r>
+      <w:r>
+        <w:rPr>
+          <w:rFonts w:ascii="Arial" w:cs="Arial" w:eastAsia="Arial" w:hAnsi="Arial"/>
+          <w:color w:val="15202B"/>
+          <w:sz w:val="19"/>
+          <w:szCs w:val="19"/>
+        </w:rPr>
+        <w:t xml:space="preserve">Owner</w:t>
+      </w:r>
+    </w:p>
+    <w:p>
+      <w:pPr>
+        <w:spacing w:after="60" w:before="0"/>
+      </w:pPr>
+      <w:r>
+        <w:rPr>
+          <w:rFonts w:ascii="Arial" w:cs="Arial" w:eastAsia="Arial" w:hAnsi="Arial"/>
+          <w:b/>
+          <w:bCs/>
+          <w:color w:val="0A84E0"/>
+          <w:sz w:val="19"/>
+          <w:szCs w:val="19"/>
+        </w:rPr>
+        <w:t xml:space="preserve">Before: </w:t>
+      </w:r>
+      <w:r>
+        <w:rPr>
+          <w:rFonts w:ascii="Arial" w:cs="Arial" w:eastAsia="Arial" w:hAnsi="Arial"/>
+          <w:color w:val="15202B"/>
+          <w:sz w:val="19"/>
+          <w:szCs w:val="19"/>
+        </w:rPr>
+        <w:t xml:space="preserve">Have 2 or 3 orders recorded Delivered (Unpaid): one app order from Ana Lim, one order logged by phone with Ana's number (0917 200 1111), and one walk-in saved as Unpaid.</w:t>
+      </w:r>
+    </w:p>
+    <w:tbl>
+      <w:tblPr>
+        <w:tblW w:type="dxa" w:w="10466"/>
+        <w:tblBorders>
+          <w:top w:val="single" w:color="auto" w:sz="4"/>
+          <w:left w:val="single" w:color="auto" w:sz="4"/>
+          <w:bottom w:val="single" w:color="auto" w:sz="4"/>
+          <w:right w:val="single" w:color="auto" w:sz="4"/>
+          <w:insideH w:val="single" w:color="auto" w:sz="4"/>
+          <w:insideV w:val="single" w:color="auto" w:sz="4"/>
+        </w:tblBorders>
+        <w:tblLayout w:type="fixed"/>
+      </w:tblPr>
+      <w:tblGrid>
+        <w:gridCol w:w="640"/>
+        <w:gridCol w:w="3820"/>
+        <w:gridCol w:w="3900"/>
+        <w:gridCol w:w="900"/>
+        <w:gridCol w:w="1206"/>
+      </w:tblGrid>
+      <w:tr>
+        <w:trPr>
+          <w:tblHeader/>
+        </w:trPr>
+        <w:tc>
+          <w:tcPr>
+            <w:tcW w:type="dxa" w:w="640"/>
+            <w:tcBorders>
+              <w:top w:val="single" w:color="B9D7F2" w:sz="4"/>
+              <w:left w:val="single" w:color="B9D7F2" w:sz="4"/>
+              <w:bottom w:val="single" w:color="B9D7F2" w:sz="4"/>
+              <w:right w:val="single" w:color="B9D7F2" w:sz="4"/>
+            </w:tcBorders>
+            <w:shd w:fill="0A84E0" w:color="auto" w:val="clear"/>
+            <w:tcMar>
+              <w:top w:type="dxa" w:w="60"/>
+              <w:left w:type="dxa" w:w="90"/>
+              <w:bottom w:type="dxa" w:w="60"/>
+              <w:right w:type="dxa" w:w="90"/>
+            </w:tcMar>
+          </w:tcPr>
+          <w:p>
+            <w:pPr>
+              <w:spacing w:after="0" w:before="0"/>
+            </w:pPr>
+            <w:r>
+              <w:rPr>
+                <w:rFonts w:ascii="Arial" w:cs="Arial" w:eastAsia="Arial" w:hAnsi="Arial"/>
+                <w:b/>
+                <w:bCs/>
+                <w:color w:val="FFFFFF"/>
+                <w:sz w:val="18"/>
+                <w:szCs w:val="18"/>
+              </w:rPr>
+              <w:t xml:space="preserve">#</w:t>
+            </w:r>
+          </w:p>
+        </w:tc>
+        <w:tc>
+          <w:tcPr>
+            <w:tcW w:type="dxa" w:w="3820"/>
+            <w:tcBorders>
+              <w:top w:val="single" w:color="B9D7F2" w:sz="4"/>
+              <w:left w:val="single" w:color="B9D7F2" w:sz="4"/>
+              <w:bottom w:val="single" w:color="B9D7F2" w:sz="4"/>
+              <w:right w:val="single" w:color="B9D7F2" w:sz="4"/>
+            </w:tcBorders>
+            <w:shd w:fill="0A84E0" w:color="auto" w:val="clear"/>
+            <w:tcMar>
+              <w:top w:type="dxa" w:w="60"/>
+              <w:left w:type="dxa" w:w="90"/>
+              <w:bottom w:type="dxa" w:w="60"/>
+              <w:right w:type="dxa" w:w="90"/>
+            </w:tcMar>
+          </w:tcPr>
+          <w:p>
+            <w:pPr>
+              <w:spacing w:after="0" w:before="0"/>
+            </w:pPr>
+            <w:r>
+              <w:rPr>
+                <w:rFonts w:ascii="Arial" w:cs="Arial" w:eastAsia="Arial" w:hAnsi="Arial"/>
+                <w:b/>
+                <w:bCs/>
+                <w:color w:val="FFFFFF"/>
+                <w:sz w:val="18"/>
+                <w:szCs w:val="18"/>
+              </w:rPr>
+              <w:t xml:space="preserve">What to do</w:t>
+            </w:r>
+          </w:p>
+        </w:tc>
+        <w:tc>
+          <w:tcPr>
+            <w:tcW w:type="dxa" w:w="3900"/>
+            <w:tcBorders>
+              <w:top w:val="single" w:color="B9D7F2" w:sz="4"/>
+              <w:left w:val="single" w:color="B9D7F2" w:sz="4"/>
+              <w:bottom w:val="single" w:color="B9D7F2" w:sz="4"/>
+              <w:right w:val="single" w:color="B9D7F2" w:sz="4"/>
+            </w:tcBorders>
+            <w:shd w:fill="0A84E0" w:color="auto" w:val="clear"/>
+            <w:tcMar>
+              <w:top w:type="dxa" w:w="60"/>
+              <w:left w:type="dxa" w:w="90"/>
+              <w:bottom w:type="dxa" w:w="60"/>
+              <w:right w:type="dxa" w:w="90"/>
+            </w:tcMar>
+          </w:tcPr>
+          <w:p>
+            <w:pPr>
+              <w:spacing w:after="0" w:before="0"/>
+            </w:pPr>
+            <w:r>
+              <w:rPr>
+                <w:rFonts w:ascii="Arial" w:cs="Arial" w:eastAsia="Arial" w:hAnsi="Arial"/>
+                <w:b/>
+                <w:bCs/>
+                <w:color w:val="FFFFFF"/>
+                <w:sz w:val="18"/>
+                <w:szCs w:val="18"/>
+              </w:rPr>
+              <w:t xml:space="preserve">What you should see</w:t>
+            </w:r>
+          </w:p>
+        </w:tc>
+        <w:tc>
+          <w:tcPr>
+            <w:tcW w:type="dxa" w:w="900"/>
+            <w:tcBorders>
+              <w:top w:val="single" w:color="B9D7F2" w:sz="4"/>
+              <w:left w:val="single" w:color="B9D7F2" w:sz="4"/>
+              <w:bottom w:val="single" w:color="B9D7F2" w:sz="4"/>
+              <w:right w:val="single" w:color="B9D7F2" w:sz="4"/>
+            </w:tcBorders>
+            <w:shd w:fill="0A84E0" w:color="auto" w:val="clear"/>
+            <w:tcMar>
+              <w:top w:type="dxa" w:w="60"/>
+              <w:left w:type="dxa" w:w="90"/>
+              <w:bottom w:type="dxa" w:w="60"/>
+              <w:right w:type="dxa" w:w="90"/>
+            </w:tcMar>
+          </w:tcPr>
+          <w:p>
+            <w:pPr>
+              <w:spacing w:after="0" w:before="0"/>
+            </w:pPr>
+            <w:r>
+              <w:rPr>
+                <w:rFonts w:ascii="Arial" w:cs="Arial" w:eastAsia="Arial" w:hAnsi="Arial"/>
+                <w:b/>
+                <w:bCs/>
+                <w:color w:val="FFFFFF"/>
+                <w:sz w:val="18"/>
+                <w:szCs w:val="18"/>
+              </w:rPr>
+              <w:t xml:space="preserve">Result</w:t>
+            </w:r>
+          </w:p>
+        </w:tc>
+        <w:tc>
+          <w:tcPr>
+            <w:tcW w:type="dxa" w:w="1206"/>
+            <w:tcBorders>
+              <w:top w:val="single" w:color="B9D7F2" w:sz="4"/>
+              <w:left w:val="single" w:color="B9D7F2" w:sz="4"/>
+              <w:bottom w:val="single" w:color="B9D7F2" w:sz="4"/>
+              <w:right w:val="single" w:color="B9D7F2" w:sz="4"/>
+            </w:tcBorders>
+            <w:shd w:fill="0A84E0" w:color="auto" w:val="clear"/>
+            <w:tcMar>
+              <w:top w:type="dxa" w:w="60"/>
+              <w:left w:type="dxa" w:w="90"/>
+              <w:bottom w:type="dxa" w:w="60"/>
+              <w:right w:type="dxa" w:w="90"/>
+            </w:tcMar>
+          </w:tcPr>
+          <w:p>
+            <w:pPr>
+              <w:spacing w:after="0" w:before="0"/>
+            </w:pPr>
+            <w:r>
+              <w:rPr>
+                <w:rFonts w:ascii="Arial" w:cs="Arial" w:eastAsia="Arial" w:hAnsi="Arial"/>
+                <w:b/>
+                <w:bCs/>
+                <w:color w:val="FFFFFF"/>
+                <w:sz w:val="18"/>
+                <w:szCs w:val="18"/>
+              </w:rPr>
+              <w:t xml:space="preserve">Notes</w:t>
+            </w:r>
+          </w:p>
+        </w:tc>
+      </w:tr>
+      <w:tr>
+        <w:trPr>
+          <w:cantSplit/>
+        </w:trPr>
+        <w:tc>
+          <w:tcPr>
+            <w:tcW w:type="dxa" w:w="640"/>
+            <w:tcBorders>
+              <w:top w:val="single" w:color="B9D7F2" w:sz="4"/>
+              <w:left w:val="single" w:color="B9D7F2" w:sz="4"/>
+              <w:bottom w:val="single" w:color="B9D7F2" w:sz="4"/>
+              <w:right w:val="single" w:color="B9D7F2" w:sz="4"/>
+            </w:tcBorders>
+            <w:tcMar>
+              <w:top w:type="dxa" w:w="60"/>
+              <w:left w:type="dxa" w:w="90"/>
+              <w:bottom w:type="dxa" w:w="60"/>
+              <w:right w:type="dxa" w:w="90"/>
+            </w:tcMar>
+          </w:tcPr>
+          <w:p>
+            <w:pPr>
+              <w:spacing w:after="0" w:before="0"/>
+            </w:pPr>
+            <w:r>
+              <w:rPr>
+                <w:rFonts w:ascii="Arial" w:cs="Arial" w:eastAsia="Arial" w:hAnsi="Arial"/>
+                <w:color w:val="15202B"/>
+                <w:sz w:val="18"/>
+                <w:szCs w:val="18"/>
+              </w:rPr>
+              <w:t xml:space="preserve">38.1</w:t>
+            </w:r>
+          </w:p>
+        </w:tc>
+        <w:tc>
+          <w:tcPr>
+            <w:tcW w:type="dxa" w:w="3820"/>
+            <w:tcBorders>
+              <w:top w:val="single" w:color="B9D7F2" w:sz="4"/>
+              <w:left w:val="single" w:color="B9D7F2" w:sz="4"/>
+              <w:bottom w:val="single" w:color="B9D7F2" w:sz="4"/>
+              <w:right w:val="single" w:color="B9D7F2" w:sz="4"/>
+            </w:tcBorders>
+            <w:tcMar>
+              <w:top w:type="dxa" w:w="60"/>
+              <w:left w:type="dxa" w:w="90"/>
+              <w:bottom w:type="dxa" w:w="60"/>
+              <w:right w:type="dxa" w:w="90"/>
+            </w:tcMar>
+          </w:tcPr>
+          <w:p>
+            <w:pPr>
+              <w:spacing w:after="0" w:before="0"/>
+            </w:pPr>
+            <w:r>
+              <w:rPr>
+                <w:rFonts w:ascii="Arial" w:cs="Arial" w:eastAsia="Arial" w:hAnsi="Arial"/>
+                <w:color w:val="15202B"/>
+                <w:sz w:val="18"/>
+                <w:szCs w:val="18"/>
+              </w:rPr>
+              <w:t xml:space="preserve">Sales &gt; Daily, tap the Unpaid tile.</w:t>
+            </w:r>
+          </w:p>
+        </w:tc>
+        <w:tc>
+          <w:tcPr>
+            <w:tcW w:type="dxa" w:w="3900"/>
+            <w:tcBorders>
+              <w:top w:val="single" w:color="B9D7F2" w:sz="4"/>
+              <w:left w:val="single" w:color="B9D7F2" w:sz="4"/>
+              <w:bottom w:val="single" w:color="B9D7F2" w:sz="4"/>
+              <w:right w:val="single" w:color="B9D7F2" w:sz="4"/>
+            </w:tcBorders>
+            <w:tcMar>
+              <w:top w:type="dxa" w:w="60"/>
+              <w:left w:type="dxa" w:w="90"/>
+              <w:bottom w:type="dxa" w:w="60"/>
+              <w:right w:type="dxa" w:w="90"/>
+            </w:tcMar>
+          </w:tcPr>
+          <w:p>
+            <w:pPr>
+              <w:spacing w:after="0" w:before="0"/>
+            </w:pPr>
+            <w:r>
+              <w:rPr>
+                <w:rFonts w:ascii="Arial" w:cs="Arial" w:eastAsia="Arial" w:hAnsi="Arial"/>
+                <w:color w:val="15202B"/>
+                <w:sz w:val="18"/>
+                <w:szCs w:val="18"/>
+              </w:rPr>
+              <w:t xml:space="preserve">Unpaid Accounts opens: blue box "Total owed" with the amount and the number of customers.</w:t>
+            </w:r>
+          </w:p>
+        </w:tc>
+        <w:tc>
+          <w:tcPr>
+            <w:tcW w:type="dxa" w:w="900"/>
+            <w:tcBorders>
+              <w:top w:val="single" w:color="B9D7F2" w:sz="4"/>
+              <w:left w:val="single" w:color="B9D7F2" w:sz="4"/>
+              <w:bottom w:val="single" w:color="B9D7F2" w:sz="4"/>
+              <w:right w:val="single" w:color="B9D7F2" w:sz="4"/>
+            </w:tcBorders>
+            <w:tcMar>
+              <w:top w:type="dxa" w:w="60"/>
+              <w:left w:type="dxa" w:w="90"/>
+              <w:bottom w:type="dxa" w:w="60"/>
+              <w:right w:type="dxa" w:w="90"/>
+            </w:tcMar>
+          </w:tcPr>
+          <w:p>
+            <w:pPr>
+              <w:spacing w:after="0" w:before="0"/>
+            </w:pPr>
+            <w:r>
+              <w:rPr>
+                <w:rFonts w:ascii="Arial" w:cs="Arial" w:eastAsia="Arial" w:hAnsi="Arial"/>
+                <w:color w:val="15202B"/>
+                <w:sz w:val="18"/>
+                <w:szCs w:val="18"/>
+              </w:rPr>
+              <w:t xml:space="preserve">☐ Pass</w:t>
+            </w:r>
+          </w:p>
+          <w:p>
+            <w:pPr>
+              <w:spacing w:after="0" w:before="0"/>
+            </w:pPr>
+            <w:r>
+              <w:rPr>
+                <w:rFonts w:ascii="Arial" w:cs="Arial" w:eastAsia="Arial" w:hAnsi="Arial"/>
+                <w:color w:val="15202B"/>
+                <w:sz w:val="18"/>
+                <w:szCs w:val="18"/>
+              </w:rPr>
+              <w:t xml:space="preserve">☐ Fail</w:t>
+            </w:r>
+          </w:p>
+        </w:tc>
+        <w:tc>
+          <w:tcPr>
+            <w:tcW w:type="dxa" w:w="1206"/>
+            <w:tcBorders>
+              <w:top w:val="single" w:color="B9D7F2" w:sz="4"/>
+              <w:left w:val="single" w:color="B9D7F2" w:sz="4"/>
+              <w:bottom w:val="single" w:color="B9D7F2" w:sz="4"/>
+              <w:right w:val="single" w:color="B9D7F2" w:sz="4"/>
+            </w:tcBorders>
+            <w:tcMar>
+              <w:top w:type="dxa" w:w="60"/>
+              <w:left w:type="dxa" w:w="90"/>
+              <w:bottom w:type="dxa" w:w="60"/>
+              <w:right w:type="dxa" w:w="90"/>
+            </w:tcMar>
+          </w:tcPr>
+          <w:p>
+            <w:pPr>
+              <w:spacing w:after="0" w:before="0"/>
+            </w:pPr>
+            <w:r>
+              <w:rPr>
+                <w:rFonts w:ascii="Arial" w:cs="Arial" w:eastAsia="Arial" w:hAnsi="Arial"/>
+                <w:color w:val="15202B"/>
+                <w:sz w:val="18"/>
+                <w:szCs w:val="18"/>
+              </w:rPr>
+              <w:t xml:space="preserve"/>
+            </w:r>
+          </w:p>
+        </w:tc>
+      </w:tr>
+      <w:tr>
+        <w:trPr>
+          <w:cantSplit/>
+        </w:trPr>
+        <w:tc>
+          <w:tcPr>
+            <w:tcW w:type="dxa" w:w="640"/>
+            <w:tcBorders>
+              <w:top w:val="single" w:color="B9D7F2" w:sz="4"/>
+              <w:left w:val="single" w:color="B9D7F2" w:sz="4"/>
+              <w:bottom w:val="single" w:color="B9D7F2" w:sz="4"/>
+              <w:right w:val="single" w:color="B9D7F2" w:sz="4"/>
+            </w:tcBorders>
+            <w:shd w:fill="EAF4FD" w:color="auto" w:val="clear"/>
+            <w:tcMar>
+              <w:top w:type="dxa" w:w="60"/>
+              <w:left w:type="dxa" w:w="90"/>
+              <w:bottom w:type="dxa" w:w="60"/>
+              <w:right w:type="dxa" w:w="90"/>
+            </w:tcMar>
+          </w:tcPr>
+          <w:p>
+            <w:pPr>
+              <w:spacing w:after="0" w:before="0"/>
+            </w:pPr>
+            <w:r>
+              <w:rPr>
+                <w:rFonts w:ascii="Arial" w:cs="Arial" w:eastAsia="Arial" w:hAnsi="Arial"/>
+                <w:color w:val="15202B"/>
+                <w:sz w:val="18"/>
+                <w:szCs w:val="18"/>
+              </w:rPr>
+              <w:t xml:space="preserve">38.2</w:t>
+            </w:r>
+          </w:p>
+        </w:tc>
+        <w:tc>
+          <w:tcPr>
+            <w:tcW w:type="dxa" w:w="3820"/>
+            <w:tcBorders>
+              <w:top w:val="single" w:color="B9D7F2" w:sz="4"/>
+              <w:left w:val="single" w:color="B9D7F2" w:sz="4"/>
+              <w:bottom w:val="single" w:color="B9D7F2" w:sz="4"/>
+              <w:right w:val="single" w:color="B9D7F2" w:sz="4"/>
+            </w:tcBorders>
+            <w:shd w:fill="EAF4FD" w:color="auto" w:val="clear"/>
+            <w:tcMar>
+              <w:top w:type="dxa" w:w="60"/>
+              <w:left w:type="dxa" w:w="90"/>
+              <w:bottom w:type="dxa" w:w="60"/>
+              <w:right w:type="dxa" w:w="90"/>
+            </w:tcMar>
+          </w:tcPr>
+          <w:p>
+            <w:pPr>
+              <w:spacing w:after="0" w:before="0"/>
+            </w:pPr>
+            <w:r>
+              <w:rPr>
+                <w:rFonts w:ascii="Arial" w:cs="Arial" w:eastAsia="Arial" w:hAnsi="Arial"/>
+                <w:color w:val="15202B"/>
+                <w:sz w:val="18"/>
+                <w:szCs w:val="18"/>
+              </w:rPr>
+              <w:t xml:space="preserve">Look at the list.</w:t>
+            </w:r>
+          </w:p>
+        </w:tc>
+        <w:tc>
+          <w:tcPr>
+            <w:tcW w:type="dxa" w:w="3900"/>
+            <w:tcBorders>
+              <w:top w:val="single" w:color="B9D7F2" w:sz="4"/>
+              <w:left w:val="single" w:color="B9D7F2" w:sz="4"/>
+              <w:bottom w:val="single" w:color="B9D7F2" w:sz="4"/>
+              <w:right w:val="single" w:color="B9D7F2" w:sz="4"/>
+            </w:tcBorders>
+            <w:shd w:fill="EAF4FD" w:color="auto" w:val="clear"/>
+            <w:tcMar>
+              <w:top w:type="dxa" w:w="60"/>
+              <w:left w:type="dxa" w:w="90"/>
+              <w:bottom w:type="dxa" w:w="60"/>
+              <w:right w:type="dxa" w:w="90"/>
+            </w:tcMar>
+          </w:tcPr>
+          <w:p>
+            <w:pPr>
+              <w:spacing w:after="0" w:before="0"/>
+            </w:pPr>
+            <w:r>
+              <w:rPr>
+                <w:rFonts w:ascii="Arial" w:cs="Arial" w:eastAsia="Arial" w:hAnsi="Arial"/>
+                <w:color w:val="15202B"/>
+                <w:sz w:val="18"/>
+                <w:szCs w:val="18"/>
+              </w:rPr>
+              <w:t xml:space="preserve">One row per customer with name, phone, "2 unpaid orders" and the amount; most owed first. Ana's app order and the order logged with her phone are in ONE row.</w:t>
+            </w:r>
+          </w:p>
+        </w:tc>
+        <w:tc>
+          <w:tcPr>
+            <w:tcW w:type="dxa" w:w="900"/>
+            <w:tcBorders>
+              <w:top w:val="single" w:color="B9D7F2" w:sz="4"/>
+              <w:left w:val="single" w:color="B9D7F2" w:sz="4"/>
+              <w:bottom w:val="single" w:color="B9D7F2" w:sz="4"/>
+              <w:right w:val="single" w:color="B9D7F2" w:sz="4"/>
+            </w:tcBorders>
+            <w:shd w:fill="EAF4FD" w:color="auto" w:val="clear"/>
+            <w:tcMar>
+              <w:top w:type="dxa" w:w="60"/>
+              <w:left w:type="dxa" w:w="90"/>
+              <w:bottom w:type="dxa" w:w="60"/>
+              <w:right w:type="dxa" w:w="90"/>
+            </w:tcMar>
+          </w:tcPr>
+          <w:p>
+            <w:pPr>
+              <w:spacing w:after="0" w:before="0"/>
+            </w:pPr>
+            <w:r>
+              <w:rPr>
+                <w:rFonts w:ascii="Arial" w:cs="Arial" w:eastAsia="Arial" w:hAnsi="Arial"/>
+                <w:color w:val="15202B"/>
+                <w:sz w:val="18"/>
+                <w:szCs w:val="18"/>
+              </w:rPr>
+              <w:t xml:space="preserve">☐ Pass</w:t>
+            </w:r>
+          </w:p>
+          <w:p>
+            <w:pPr>
+              <w:spacing w:after="0" w:before="0"/>
+            </w:pPr>
+            <w:r>
+              <w:rPr>
+                <w:rFonts w:ascii="Arial" w:cs="Arial" w:eastAsia="Arial" w:hAnsi="Arial"/>
+                <w:color w:val="15202B"/>
+                <w:sz w:val="18"/>
+                <w:szCs w:val="18"/>
+              </w:rPr>
+              <w:t xml:space="preserve">☐ Fail</w:t>
+            </w:r>
+          </w:p>
+        </w:tc>
+        <w:tc>
+          <w:tcPr>
+            <w:tcW w:type="dxa" w:w="1206"/>
+            <w:tcBorders>
+              <w:top w:val="single" w:color="B9D7F2" w:sz="4"/>
+              <w:left w:val="single" w:color="B9D7F2" w:sz="4"/>
+              <w:bottom w:val="single" w:color="B9D7F2" w:sz="4"/>
+              <w:right w:val="single" w:color="B9D7F2" w:sz="4"/>
+            </w:tcBorders>
+            <w:shd w:fill="EAF4FD" w:color="auto" w:val="clear"/>
+            <w:tcMar>
+              <w:top w:type="dxa" w:w="60"/>
+              <w:left w:type="dxa" w:w="90"/>
+              <w:bottom w:type="dxa" w:w="60"/>
+              <w:right w:type="dxa" w:w="90"/>
+            </w:tcMar>
+          </w:tcPr>
+          <w:p>
+            <w:pPr>
+              <w:spacing w:after="0" w:before="0"/>
+            </w:pPr>
+            <w:r>
+              <w:rPr>
+                <w:rFonts w:ascii="Arial" w:cs="Arial" w:eastAsia="Arial" w:hAnsi="Arial"/>
+                <w:color w:val="15202B"/>
+                <w:sz w:val="18"/>
+                <w:szCs w:val="18"/>
+              </w:rPr>
+              <w:t xml:space="preserve"/>
+            </w:r>
+          </w:p>
+        </w:tc>
+      </w:tr>
+      <w:tr>
+        <w:trPr>
+          <w:cantSplit/>
+        </w:trPr>
+        <w:tc>
+          <w:tcPr>
+            <w:tcW w:type="dxa" w:w="640"/>
+            <w:tcBorders>
+              <w:top w:val="single" w:color="B9D7F2" w:sz="4"/>
+              <w:left w:val="single" w:color="B9D7F2" w:sz="4"/>
+              <w:bottom w:val="single" w:color="B9D7F2" w:sz="4"/>
+              <w:right w:val="single" w:color="B9D7F2" w:sz="4"/>
+            </w:tcBorders>
+            <w:tcMar>
+              <w:top w:type="dxa" w:w="60"/>
+              <w:left w:type="dxa" w:w="90"/>
+              <w:bottom w:type="dxa" w:w="60"/>
+              <w:right w:type="dxa" w:w="90"/>
+            </w:tcMar>
+          </w:tcPr>
+          <w:p>
+            <w:pPr>
+              <w:spacing w:after="0" w:before="0"/>
+            </w:pPr>
+            <w:r>
+              <w:rPr>
+                <w:rFonts w:ascii="Arial" w:cs="Arial" w:eastAsia="Arial" w:hAnsi="Arial"/>
+                <w:color w:val="15202B"/>
+                <w:sz w:val="18"/>
+                <w:szCs w:val="18"/>
+              </w:rPr>
+              <w:t xml:space="preserve">38.3</w:t>
+            </w:r>
+          </w:p>
+        </w:tc>
+        <w:tc>
+          <w:tcPr>
+            <w:tcW w:type="dxa" w:w="3820"/>
+            <w:tcBorders>
+              <w:top w:val="single" w:color="B9D7F2" w:sz="4"/>
+              <w:left w:val="single" w:color="B9D7F2" w:sz="4"/>
+              <w:bottom w:val="single" w:color="B9D7F2" w:sz="4"/>
+              <w:right w:val="single" w:color="B9D7F2" w:sz="4"/>
+            </w:tcBorders>
+            <w:tcMar>
+              <w:top w:type="dxa" w:w="60"/>
+              <w:left w:type="dxa" w:w="90"/>
+              <w:bottom w:type="dxa" w:w="60"/>
+              <w:right w:type="dxa" w:w="90"/>
+            </w:tcMar>
+          </w:tcPr>
+          <w:p>
+            <w:pPr>
+              <w:spacing w:after="0" w:before="0"/>
+            </w:pPr>
+            <w:r>
+              <w:rPr>
+                <w:rFonts w:ascii="Arial" w:cs="Arial" w:eastAsia="Arial" w:hAnsi="Arial"/>
+                <w:color w:val="15202B"/>
+                <w:sz w:val="18"/>
+                <w:szCs w:val="18"/>
+              </w:rPr>
+              <w:t xml:space="preserve">Type "ana" in the search box.</w:t>
+            </w:r>
+          </w:p>
+        </w:tc>
+        <w:tc>
+          <w:tcPr>
+            <w:tcW w:type="dxa" w:w="3900"/>
+            <w:tcBorders>
+              <w:top w:val="single" w:color="B9D7F2" w:sz="4"/>
+              <w:left w:val="single" w:color="B9D7F2" w:sz="4"/>
+              <w:bottom w:val="single" w:color="B9D7F2" w:sz="4"/>
+              <w:right w:val="single" w:color="B9D7F2" w:sz="4"/>
+            </w:tcBorders>
+            <w:tcMar>
+              <w:top w:type="dxa" w:w="60"/>
+              <w:left w:type="dxa" w:w="90"/>
+              <w:bottom w:type="dxa" w:w="60"/>
+              <w:right w:type="dxa" w:w="90"/>
+            </w:tcMar>
+          </w:tcPr>
+          <w:p>
+            <w:pPr>
+              <w:spacing w:after="0" w:before="0"/>
+            </w:pPr>
+            <w:r>
+              <w:rPr>
+                <w:rFonts w:ascii="Arial" w:cs="Arial" w:eastAsia="Arial" w:hAnsi="Arial"/>
+                <w:color w:val="15202B"/>
+                <w:sz w:val="18"/>
+                <w:szCs w:val="18"/>
+              </w:rPr>
+              <w:t xml:space="preserve">Only Ana Lim shows. Type part of a phone number (e.g. 0917 200): the matching customer shows.</w:t>
+            </w:r>
+          </w:p>
+        </w:tc>
+        <w:tc>
+          <w:tcPr>
+            <w:tcW w:type="dxa" w:w="900"/>
+            <w:tcBorders>
+              <w:top w:val="single" w:color="B9D7F2" w:sz="4"/>
+              <w:left w:val="single" w:color="B9D7F2" w:sz="4"/>
+              <w:bottom w:val="single" w:color="B9D7F2" w:sz="4"/>
+              <w:right w:val="single" w:color="B9D7F2" w:sz="4"/>
+            </w:tcBorders>
+            <w:tcMar>
+              <w:top w:type="dxa" w:w="60"/>
+              <w:left w:type="dxa" w:w="90"/>
+              <w:bottom w:type="dxa" w:w="60"/>
+              <w:right w:type="dxa" w:w="90"/>
+            </w:tcMar>
+          </w:tcPr>
+          <w:p>
+            <w:pPr>
+              <w:spacing w:after="0" w:before="0"/>
+            </w:pPr>
+            <w:r>
+              <w:rPr>
+                <w:rFonts w:ascii="Arial" w:cs="Arial" w:eastAsia="Arial" w:hAnsi="Arial"/>
+                <w:color w:val="15202B"/>
+                <w:sz w:val="18"/>
+                <w:szCs w:val="18"/>
+              </w:rPr>
+              <w:t xml:space="preserve">☐ Pass</w:t>
+            </w:r>
+          </w:p>
+          <w:p>
+            <w:pPr>
+              <w:spacing w:after="0" w:before="0"/>
+            </w:pPr>
+            <w:r>
+              <w:rPr>
+                <w:rFonts w:ascii="Arial" w:cs="Arial" w:eastAsia="Arial" w:hAnsi="Arial"/>
+                <w:color w:val="15202B"/>
+                <w:sz w:val="18"/>
+                <w:szCs w:val="18"/>
+              </w:rPr>
+              <w:t xml:space="preserve">☐ Fail</w:t>
+            </w:r>
+          </w:p>
+        </w:tc>
+        <w:tc>
+          <w:tcPr>
+            <w:tcW w:type="dxa" w:w="1206"/>
+            <w:tcBorders>
+              <w:top w:val="single" w:color="B9D7F2" w:sz="4"/>
+              <w:left w:val="single" w:color="B9D7F2" w:sz="4"/>
+              <w:bottom w:val="single" w:color="B9D7F2" w:sz="4"/>
+              <w:right w:val="single" w:color="B9D7F2" w:sz="4"/>
+            </w:tcBorders>
+            <w:tcMar>
+              <w:top w:type="dxa" w:w="60"/>
+              <w:left w:type="dxa" w:w="90"/>
+              <w:bottom w:type="dxa" w:w="60"/>
+              <w:right w:type="dxa" w:w="90"/>
+            </w:tcMar>
+          </w:tcPr>
+          <w:p>
+            <w:pPr>
+              <w:spacing w:after="0" w:before="0"/>
+            </w:pPr>
+            <w:r>
+              <w:rPr>
+                <w:rFonts w:ascii="Arial" w:cs="Arial" w:eastAsia="Arial" w:hAnsi="Arial"/>
+                <w:color w:val="15202B"/>
+                <w:sz w:val="18"/>
+                <w:szCs w:val="18"/>
+              </w:rPr>
+              <w:t xml:space="preserve"/>
+            </w:r>
+          </w:p>
+        </w:tc>
+      </w:tr>
+      <w:tr>
+        <w:trPr>
+          <w:cantSplit/>
+        </w:trPr>
+        <w:tc>
+          <w:tcPr>
+            <w:tcW w:type="dxa" w:w="640"/>
+            <w:tcBorders>
+              <w:top w:val="single" w:color="B9D7F2" w:sz="4"/>
+              <w:left w:val="single" w:color="B9D7F2" w:sz="4"/>
+              <w:bottom w:val="single" w:color="B9D7F2" w:sz="4"/>
+              <w:right w:val="single" w:color="B9D7F2" w:sz="4"/>
+            </w:tcBorders>
+            <w:shd w:fill="EAF4FD" w:color="auto" w:val="clear"/>
+            <w:tcMar>
+              <w:top w:type="dxa" w:w="60"/>
+              <w:left w:type="dxa" w:w="90"/>
+              <w:bottom w:type="dxa" w:w="60"/>
+              <w:right w:type="dxa" w:w="90"/>
+            </w:tcMar>
+          </w:tcPr>
+          <w:p>
+            <w:pPr>
+              <w:spacing w:after="0" w:before="0"/>
+            </w:pPr>
+            <w:r>
+              <w:rPr>
+                <w:rFonts w:ascii="Arial" w:cs="Arial" w:eastAsia="Arial" w:hAnsi="Arial"/>
+                <w:color w:val="15202B"/>
+                <w:sz w:val="18"/>
+                <w:szCs w:val="18"/>
+              </w:rPr>
+              <w:t xml:space="preserve">38.4</w:t>
+            </w:r>
+          </w:p>
+        </w:tc>
+        <w:tc>
+          <w:tcPr>
+            <w:tcW w:type="dxa" w:w="3820"/>
+            <w:tcBorders>
+              <w:top w:val="single" w:color="B9D7F2" w:sz="4"/>
+              <w:left w:val="single" w:color="B9D7F2" w:sz="4"/>
+              <w:bottom w:val="single" w:color="B9D7F2" w:sz="4"/>
+              <w:right w:val="single" w:color="B9D7F2" w:sz="4"/>
+            </w:tcBorders>
+            <w:shd w:fill="EAF4FD" w:color="auto" w:val="clear"/>
+            <w:tcMar>
+              <w:top w:type="dxa" w:w="60"/>
+              <w:left w:type="dxa" w:w="90"/>
+              <w:bottom w:type="dxa" w:w="60"/>
+              <w:right w:type="dxa" w:w="90"/>
+            </w:tcMar>
+          </w:tcPr>
+          <w:p>
+            <w:pPr>
+              <w:spacing w:after="0" w:before="0"/>
+            </w:pPr>
+            <w:r>
+              <w:rPr>
+                <w:rFonts w:ascii="Arial" w:cs="Arial" w:eastAsia="Arial" w:hAnsi="Arial"/>
+                <w:color w:val="15202B"/>
+                <w:sz w:val="18"/>
+                <w:szCs w:val="18"/>
+              </w:rPr>
+              <w:t xml:space="preserve">Type a name that does not exist.</w:t>
+            </w:r>
+          </w:p>
+        </w:tc>
+        <w:tc>
+          <w:tcPr>
+            <w:tcW w:type="dxa" w:w="3900"/>
+            <w:tcBorders>
+              <w:top w:val="single" w:color="B9D7F2" w:sz="4"/>
+              <w:left w:val="single" w:color="B9D7F2" w:sz="4"/>
+              <w:bottom w:val="single" w:color="B9D7F2" w:sz="4"/>
+              <w:right w:val="single" w:color="B9D7F2" w:sz="4"/>
+            </w:tcBorders>
+            <w:shd w:fill="EAF4FD" w:color="auto" w:val="clear"/>
+            <w:tcMar>
+              <w:top w:type="dxa" w:w="60"/>
+              <w:left w:type="dxa" w:w="90"/>
+              <w:bottom w:type="dxa" w:w="60"/>
+              <w:right w:type="dxa" w:w="90"/>
+            </w:tcMar>
+          </w:tcPr>
+          <w:p>
+            <w:pPr>
+              <w:spacing w:after="0" w:before="0"/>
+            </w:pPr>
+            <w:r>
+              <w:rPr>
+                <w:rFonts w:ascii="Arial" w:cs="Arial" w:eastAsia="Arial" w:hAnsi="Arial"/>
+                <w:color w:val="15202B"/>
+                <w:sz w:val="18"/>
+                <w:szCs w:val="18"/>
+              </w:rPr>
+              <w:t xml:space="preserve">"No customer found". Tap the X to clear: the full list comes back.</w:t>
+            </w:r>
+          </w:p>
+        </w:tc>
+        <w:tc>
+          <w:tcPr>
+            <w:tcW w:type="dxa" w:w="900"/>
+            <w:tcBorders>
+              <w:top w:val="single" w:color="B9D7F2" w:sz="4"/>
+              <w:left w:val="single" w:color="B9D7F2" w:sz="4"/>
+              <w:bottom w:val="single" w:color="B9D7F2" w:sz="4"/>
+              <w:right w:val="single" w:color="B9D7F2" w:sz="4"/>
+            </w:tcBorders>
+            <w:shd w:fill="EAF4FD" w:color="auto" w:val="clear"/>
+            <w:tcMar>
+              <w:top w:type="dxa" w:w="60"/>
+              <w:left w:type="dxa" w:w="90"/>
+              <w:bottom w:type="dxa" w:w="60"/>
+              <w:right w:type="dxa" w:w="90"/>
+            </w:tcMar>
+          </w:tcPr>
+          <w:p>
+            <w:pPr>
+              <w:spacing w:after="0" w:before="0"/>
+            </w:pPr>
+            <w:r>
+              <w:rPr>
+                <w:rFonts w:ascii="Arial" w:cs="Arial" w:eastAsia="Arial" w:hAnsi="Arial"/>
+                <w:color w:val="15202B"/>
+                <w:sz w:val="18"/>
+                <w:szCs w:val="18"/>
+              </w:rPr>
+              <w:t xml:space="preserve">☐ Pass</w:t>
+            </w:r>
+          </w:p>
+          <w:p>
+            <w:pPr>
+              <w:spacing w:after="0" w:before="0"/>
+            </w:pPr>
+            <w:r>
+              <w:rPr>
+                <w:rFonts w:ascii="Arial" w:cs="Arial" w:eastAsia="Arial" w:hAnsi="Arial"/>
+                <w:color w:val="15202B"/>
+                <w:sz w:val="18"/>
+                <w:szCs w:val="18"/>
+              </w:rPr>
+              <w:t xml:space="preserve">☐ Fail</w:t>
+            </w:r>
+          </w:p>
+        </w:tc>
+        <w:tc>
+          <w:tcPr>
+            <w:tcW w:type="dxa" w:w="1206"/>
+            <w:tcBorders>
+              <w:top w:val="single" w:color="B9D7F2" w:sz="4"/>
+              <w:left w:val="single" w:color="B9D7F2" w:sz="4"/>
+              <w:bottom w:val="single" w:color="B9D7F2" w:sz="4"/>
+              <w:right w:val="single" w:color="B9D7F2" w:sz="4"/>
+            </w:tcBorders>
+            <w:shd w:fill="EAF4FD" w:color="auto" w:val="clear"/>
+            <w:tcMar>
+              <w:top w:type="dxa" w:w="60"/>
+              <w:left w:type="dxa" w:w="90"/>
+              <w:bottom w:type="dxa" w:w="60"/>
+              <w:right w:type="dxa" w:w="90"/>
+            </w:tcMar>
+          </w:tcPr>
+          <w:p>
+            <w:pPr>
+              <w:spacing w:after="0" w:before="0"/>
+            </w:pPr>
+            <w:r>
+              <w:rPr>
+                <w:rFonts w:ascii="Arial" w:cs="Arial" w:eastAsia="Arial" w:hAnsi="Arial"/>
+                <w:color w:val="15202B"/>
+                <w:sz w:val="18"/>
+                <w:szCs w:val="18"/>
+              </w:rPr>
+              <w:t xml:space="preserve"/>
+            </w:r>
+          </w:p>
+        </w:tc>
+      </w:tr>
+      <w:tr>
+        <w:trPr>
+          <w:cantSplit/>
+        </w:trPr>
+        <w:tc>
+          <w:tcPr>
+            <w:tcW w:type="dxa" w:w="640"/>
+            <w:tcBorders>
+              <w:top w:val="single" w:color="B9D7F2" w:sz="4"/>
+              <w:left w:val="single" w:color="B9D7F2" w:sz="4"/>
+              <w:bottom w:val="single" w:color="B9D7F2" w:sz="4"/>
+              <w:right w:val="single" w:color="B9D7F2" w:sz="4"/>
+            </w:tcBorders>
+            <w:tcMar>
+              <w:top w:type="dxa" w:w="60"/>
+              <w:left w:type="dxa" w:w="90"/>
+              <w:bottom w:type="dxa" w:w="60"/>
+              <w:right w:type="dxa" w:w="90"/>
+            </w:tcMar>
+          </w:tcPr>
+          <w:p>
+            <w:pPr>
+              <w:spacing w:after="0" w:before="0"/>
+            </w:pPr>
+            <w:r>
+              <w:rPr>
+                <w:rFonts w:ascii="Arial" w:cs="Arial" w:eastAsia="Arial" w:hAnsi="Arial"/>
+                <w:color w:val="15202B"/>
+                <w:sz w:val="18"/>
+                <w:szCs w:val="18"/>
+              </w:rPr>
+              <w:t xml:space="preserve">38.5</w:t>
+            </w:r>
+          </w:p>
+        </w:tc>
+        <w:tc>
+          <w:tcPr>
+            <w:tcW w:type="dxa" w:w="3820"/>
+            <w:tcBorders>
+              <w:top w:val="single" w:color="B9D7F2" w:sz="4"/>
+              <w:left w:val="single" w:color="B9D7F2" w:sz="4"/>
+              <w:bottom w:val="single" w:color="B9D7F2" w:sz="4"/>
+              <w:right w:val="single" w:color="B9D7F2" w:sz="4"/>
+            </w:tcBorders>
+            <w:tcMar>
+              <w:top w:type="dxa" w:w="60"/>
+              <w:left w:type="dxa" w:w="90"/>
+              <w:bottom w:type="dxa" w:w="60"/>
+              <w:right w:type="dxa" w:w="90"/>
+            </w:tcMar>
+          </w:tcPr>
+          <w:p>
+            <w:pPr>
+              <w:spacing w:after="0" w:before="0"/>
+            </w:pPr>
+            <w:r>
+              <w:rPr>
+                <w:rFonts w:ascii="Arial" w:cs="Arial" w:eastAsia="Arial" w:hAnsi="Arial"/>
+                <w:color w:val="15202B"/>
+                <w:sz w:val="18"/>
+                <w:szCs w:val="18"/>
+              </w:rPr>
+              <w:t xml:space="preserve">Tap Ana Lim.</w:t>
+            </w:r>
+          </w:p>
+        </w:tc>
+        <w:tc>
+          <w:tcPr>
+            <w:tcW w:type="dxa" w:w="3900"/>
+            <w:tcBorders>
+              <w:top w:val="single" w:color="B9D7F2" w:sz="4"/>
+              <w:left w:val="single" w:color="B9D7F2" w:sz="4"/>
+              <w:bottom w:val="single" w:color="B9D7F2" w:sz="4"/>
+              <w:right w:val="single" w:color="B9D7F2" w:sz="4"/>
+            </w:tcBorders>
+            <w:tcMar>
+              <w:top w:type="dxa" w:w="60"/>
+              <w:left w:type="dxa" w:w="90"/>
+              <w:bottom w:type="dxa" w:w="60"/>
+              <w:right w:type="dxa" w:w="90"/>
+            </w:tcMar>
+          </w:tcPr>
+          <w:p>
+            <w:pPr>
+              <w:spacing w:after="0" w:before="0"/>
+            </w:pPr>
+            <w:r>
+              <w:rPr>
+                <w:rFonts w:ascii="Arial" w:cs="Arial" w:eastAsia="Arial" w:hAnsi="Arial"/>
+                <w:color w:val="15202B"/>
+                <w:sz w:val="18"/>
+                <w:szCs w:val="18"/>
+              </w:rPr>
+              <w:t xml:space="preserve">Unpaid Orders: name, phone, "Has an account", Total owed, Call button, and each unpaid order (#, date, gallons, amount) with a Paid button.</w:t>
+            </w:r>
+          </w:p>
+        </w:tc>
+        <w:tc>
+          <w:tcPr>
+            <w:tcW w:type="dxa" w:w="900"/>
+            <w:tcBorders>
+              <w:top w:val="single" w:color="B9D7F2" w:sz="4"/>
+              <w:left w:val="single" w:color="B9D7F2" w:sz="4"/>
+              <w:bottom w:val="single" w:color="B9D7F2" w:sz="4"/>
+              <w:right w:val="single" w:color="B9D7F2" w:sz="4"/>
+            </w:tcBorders>
+            <w:tcMar>
+              <w:top w:type="dxa" w:w="60"/>
+              <w:left w:type="dxa" w:w="90"/>
+              <w:bottom w:type="dxa" w:w="60"/>
+              <w:right w:type="dxa" w:w="90"/>
+            </w:tcMar>
+          </w:tcPr>
+          <w:p>
+            <w:pPr>
+              <w:spacing w:after="0" w:before="0"/>
+            </w:pPr>
+            <w:r>
+              <w:rPr>
+                <w:rFonts w:ascii="Arial" w:cs="Arial" w:eastAsia="Arial" w:hAnsi="Arial"/>
+                <w:color w:val="15202B"/>
+                <w:sz w:val="18"/>
+                <w:szCs w:val="18"/>
+              </w:rPr>
+              <w:t xml:space="preserve">☐ Pass</w:t>
+            </w:r>
+          </w:p>
+          <w:p>
+            <w:pPr>
+              <w:spacing w:after="0" w:before="0"/>
+            </w:pPr>
+            <w:r>
+              <w:rPr>
+                <w:rFonts w:ascii="Arial" w:cs="Arial" w:eastAsia="Arial" w:hAnsi="Arial"/>
+                <w:color w:val="15202B"/>
+                <w:sz w:val="18"/>
+                <w:szCs w:val="18"/>
+              </w:rPr>
+              <w:t xml:space="preserve">☐ Fail</w:t>
+            </w:r>
+          </w:p>
+        </w:tc>
+        <w:tc>
+          <w:tcPr>
+            <w:tcW w:type="dxa" w:w="1206"/>
+            <w:tcBorders>
+              <w:top w:val="single" w:color="B9D7F2" w:sz="4"/>
+              <w:left w:val="single" w:color="B9D7F2" w:sz="4"/>
+              <w:bottom w:val="single" w:color="B9D7F2" w:sz="4"/>
+              <w:right w:val="single" w:color="B9D7F2" w:sz="4"/>
+            </w:tcBorders>
+            <w:tcMar>
+              <w:top w:type="dxa" w:w="60"/>
+              <w:left w:type="dxa" w:w="90"/>
+              <w:bottom w:type="dxa" w:w="60"/>
+              <w:right w:type="dxa" w:w="90"/>
+            </w:tcMar>
+          </w:tcPr>
+          <w:p>
+            <w:pPr>
+              <w:spacing w:after="0" w:before="0"/>
+            </w:pPr>
+            <w:r>
+              <w:rPr>
+                <w:rFonts w:ascii="Arial" w:cs="Arial" w:eastAsia="Arial" w:hAnsi="Arial"/>
+                <w:color w:val="15202B"/>
+                <w:sz w:val="18"/>
+                <w:szCs w:val="18"/>
+              </w:rPr>
+              <w:t xml:space="preserve"/>
+            </w:r>
+          </w:p>
+        </w:tc>
+      </w:tr>
+      <w:tr>
+        <w:trPr>
+          <w:cantSplit/>
+        </w:trPr>
+        <w:tc>
+          <w:tcPr>
+            <w:tcW w:type="dxa" w:w="640"/>
+            <w:tcBorders>
+              <w:top w:val="single" w:color="B9D7F2" w:sz="4"/>
+              <w:left w:val="single" w:color="B9D7F2" w:sz="4"/>
+              <w:bottom w:val="single" w:color="B9D7F2" w:sz="4"/>
+              <w:right w:val="single" w:color="B9D7F2" w:sz="4"/>
+            </w:tcBorders>
+            <w:shd w:fill="EAF4FD" w:color="auto" w:val="clear"/>
+            <w:tcMar>
+              <w:top w:type="dxa" w:w="60"/>
+              <w:left w:type="dxa" w:w="90"/>
+              <w:bottom w:type="dxa" w:w="60"/>
+              <w:right w:type="dxa" w:w="90"/>
+            </w:tcMar>
+          </w:tcPr>
+          <w:p>
+            <w:pPr>
+              <w:spacing w:after="0" w:before="0"/>
+            </w:pPr>
+            <w:r>
+              <w:rPr>
+                <w:rFonts w:ascii="Arial" w:cs="Arial" w:eastAsia="Arial" w:hAnsi="Arial"/>
+                <w:color w:val="15202B"/>
+                <w:sz w:val="18"/>
+                <w:szCs w:val="18"/>
+              </w:rPr>
+              <w:t xml:space="preserve">38.6</w:t>
+            </w:r>
+          </w:p>
+        </w:tc>
+        <w:tc>
+          <w:tcPr>
+            <w:tcW w:type="dxa" w:w="3820"/>
+            <w:tcBorders>
+              <w:top w:val="single" w:color="B9D7F2" w:sz="4"/>
+              <w:left w:val="single" w:color="B9D7F2" w:sz="4"/>
+              <w:bottom w:val="single" w:color="B9D7F2" w:sz="4"/>
+              <w:right w:val="single" w:color="B9D7F2" w:sz="4"/>
+            </w:tcBorders>
+            <w:shd w:fill="EAF4FD" w:color="auto" w:val="clear"/>
+            <w:tcMar>
+              <w:top w:type="dxa" w:w="60"/>
+              <w:left w:type="dxa" w:w="90"/>
+              <w:bottom w:type="dxa" w:w="60"/>
+              <w:right w:type="dxa" w:w="90"/>
+            </w:tcMar>
+          </w:tcPr>
+          <w:p>
+            <w:pPr>
+              <w:spacing w:after="0" w:before="0"/>
+            </w:pPr>
+            <w:r>
+              <w:rPr>
+                <w:rFonts w:ascii="Arial" w:cs="Arial" w:eastAsia="Arial" w:hAnsi="Arial"/>
+                <w:color w:val="15202B"/>
+                <w:sz w:val="18"/>
+                <w:szCs w:val="18"/>
+              </w:rPr>
+              <w:t xml:space="preserve">Tap Call.</w:t>
+            </w:r>
+          </w:p>
+        </w:tc>
+        <w:tc>
+          <w:tcPr>
+            <w:tcW w:type="dxa" w:w="3900"/>
+            <w:tcBorders>
+              <w:top w:val="single" w:color="B9D7F2" w:sz="4"/>
+              <w:left w:val="single" w:color="B9D7F2" w:sz="4"/>
+              <w:bottom w:val="single" w:color="B9D7F2" w:sz="4"/>
+              <w:right w:val="single" w:color="B9D7F2" w:sz="4"/>
+            </w:tcBorders>
+            <w:shd w:fill="EAF4FD" w:color="auto" w:val="clear"/>
+            <w:tcMar>
+              <w:top w:type="dxa" w:w="60"/>
+              <w:left w:type="dxa" w:w="90"/>
+              <w:bottom w:type="dxa" w:w="60"/>
+              <w:right w:type="dxa" w:w="90"/>
+            </w:tcMar>
+          </w:tcPr>
+          <w:p>
+            <w:pPr>
+              <w:spacing w:after="0" w:before="0"/>
+            </w:pPr>
+            <w:r>
+              <w:rPr>
+                <w:rFonts w:ascii="Arial" w:cs="Arial" w:eastAsia="Arial" w:hAnsi="Arial"/>
+                <w:color w:val="15202B"/>
+                <w:sz w:val="18"/>
+                <w:szCs w:val="18"/>
+              </w:rPr>
+              <w:t xml:space="preserve">The phone dialer opens with Ana's number (in Chrome: a tel: link prompt).</w:t>
+            </w:r>
+          </w:p>
+        </w:tc>
+        <w:tc>
+          <w:tcPr>
+            <w:tcW w:type="dxa" w:w="900"/>
+            <w:tcBorders>
+              <w:top w:val="single" w:color="B9D7F2" w:sz="4"/>
+              <w:left w:val="single" w:color="B9D7F2" w:sz="4"/>
+              <w:bottom w:val="single" w:color="B9D7F2" w:sz="4"/>
+              <w:right w:val="single" w:color="B9D7F2" w:sz="4"/>
+            </w:tcBorders>
+            <w:shd w:fill="EAF4FD" w:color="auto" w:val="clear"/>
+            <w:tcMar>
+              <w:top w:type="dxa" w:w="60"/>
+              <w:left w:type="dxa" w:w="90"/>
+              <w:bottom w:type="dxa" w:w="60"/>
+              <w:right w:type="dxa" w:w="90"/>
+            </w:tcMar>
+          </w:tcPr>
+          <w:p>
+            <w:pPr>
+              <w:spacing w:after="0" w:before="0"/>
+            </w:pPr>
+            <w:r>
+              <w:rPr>
+                <w:rFonts w:ascii="Arial" w:cs="Arial" w:eastAsia="Arial" w:hAnsi="Arial"/>
+                <w:color w:val="15202B"/>
+                <w:sz w:val="18"/>
+                <w:szCs w:val="18"/>
+              </w:rPr>
+              <w:t xml:space="preserve">☐ Pass</w:t>
+            </w:r>
+          </w:p>
+          <w:p>
+            <w:pPr>
+              <w:spacing w:after="0" w:before="0"/>
+            </w:pPr>
+            <w:r>
+              <w:rPr>
+                <w:rFonts w:ascii="Arial" w:cs="Arial" w:eastAsia="Arial" w:hAnsi="Arial"/>
+                <w:color w:val="15202B"/>
+                <w:sz w:val="18"/>
+                <w:szCs w:val="18"/>
+              </w:rPr>
+              <w:t xml:space="preserve">☐ Fail</w:t>
+            </w:r>
+          </w:p>
+        </w:tc>
+        <w:tc>
+          <w:tcPr>
+            <w:tcW w:type="dxa" w:w="1206"/>
+            <w:tcBorders>
+              <w:top w:val="single" w:color="B9D7F2" w:sz="4"/>
+              <w:left w:val="single" w:color="B9D7F2" w:sz="4"/>
+              <w:bottom w:val="single" w:color="B9D7F2" w:sz="4"/>
+              <w:right w:val="single" w:color="B9D7F2" w:sz="4"/>
+            </w:tcBorders>
+            <w:shd w:fill="EAF4FD" w:color="auto" w:val="clear"/>
+            <w:tcMar>
+              <w:top w:type="dxa" w:w="60"/>
+              <w:left w:type="dxa" w:w="90"/>
+              <w:bottom w:type="dxa" w:w="60"/>
+              <w:right w:type="dxa" w:w="90"/>
+            </w:tcMar>
+          </w:tcPr>
+          <w:p>
+            <w:pPr>
+              <w:spacing w:after="0" w:before="0"/>
+            </w:pPr>
+            <w:r>
+              <w:rPr>
+                <w:rFonts w:ascii="Arial" w:cs="Arial" w:eastAsia="Arial" w:hAnsi="Arial"/>
+                <w:color w:val="15202B"/>
+                <w:sz w:val="18"/>
+                <w:szCs w:val="18"/>
+              </w:rPr>
+              <w:t xml:space="preserve"/>
+            </w:r>
+          </w:p>
+        </w:tc>
+      </w:tr>
+      <w:tr>
+        <w:trPr>
+          <w:cantSplit/>
+        </w:trPr>
+        <w:tc>
+          <w:tcPr>
+            <w:tcW w:type="dxa" w:w="640"/>
+            <w:tcBorders>
+              <w:top w:val="single" w:color="B9D7F2" w:sz="4"/>
+              <w:left w:val="single" w:color="B9D7F2" w:sz="4"/>
+              <w:bottom w:val="single" w:color="B9D7F2" w:sz="4"/>
+              <w:right w:val="single" w:color="B9D7F2" w:sz="4"/>
+            </w:tcBorders>
+            <w:tcMar>
+              <w:top w:type="dxa" w:w="60"/>
+              <w:left w:type="dxa" w:w="90"/>
+              <w:bottom w:type="dxa" w:w="60"/>
+              <w:right w:type="dxa" w:w="90"/>
+            </w:tcMar>
+          </w:tcPr>
+          <w:p>
+            <w:pPr>
+              <w:spacing w:after="0" w:before="0"/>
+            </w:pPr>
+            <w:r>
+              <w:rPr>
+                <w:rFonts w:ascii="Arial" w:cs="Arial" w:eastAsia="Arial" w:hAnsi="Arial"/>
+                <w:color w:val="15202B"/>
+                <w:sz w:val="18"/>
+                <w:szCs w:val="18"/>
+              </w:rPr>
+              <w:t xml:space="preserve">38.7</w:t>
+            </w:r>
+          </w:p>
+        </w:tc>
+        <w:tc>
+          <w:tcPr>
+            <w:tcW w:type="dxa" w:w="3820"/>
+            <w:tcBorders>
+              <w:top w:val="single" w:color="B9D7F2" w:sz="4"/>
+              <w:left w:val="single" w:color="B9D7F2" w:sz="4"/>
+              <w:bottom w:val="single" w:color="B9D7F2" w:sz="4"/>
+              <w:right w:val="single" w:color="B9D7F2" w:sz="4"/>
+            </w:tcBorders>
+            <w:tcMar>
+              <w:top w:type="dxa" w:w="60"/>
+              <w:left w:type="dxa" w:w="90"/>
+              <w:bottom w:type="dxa" w:w="60"/>
+              <w:right w:type="dxa" w:w="90"/>
+            </w:tcMar>
+          </w:tcPr>
+          <w:p>
+            <w:pPr>
+              <w:spacing w:after="0" w:before="0"/>
+            </w:pPr>
+            <w:r>
+              <w:rPr>
+                <w:rFonts w:ascii="Arial" w:cs="Arial" w:eastAsia="Arial" w:hAnsi="Arial"/>
+                <w:color w:val="15202B"/>
+                <w:sz w:val="18"/>
+                <w:szCs w:val="18"/>
+              </w:rPr>
+              <w:t xml:space="preserve">Tap Paid on one order, then Confirm.</w:t>
+            </w:r>
+          </w:p>
+        </w:tc>
+        <w:tc>
+          <w:tcPr>
+            <w:tcW w:type="dxa" w:w="3900"/>
+            <w:tcBorders>
+              <w:top w:val="single" w:color="B9D7F2" w:sz="4"/>
+              <w:left w:val="single" w:color="B9D7F2" w:sz="4"/>
+              <w:bottom w:val="single" w:color="B9D7F2" w:sz="4"/>
+              <w:right w:val="single" w:color="B9D7F2" w:sz="4"/>
+            </w:tcBorders>
+            <w:tcMar>
+              <w:top w:type="dxa" w:w="60"/>
+              <w:left w:type="dxa" w:w="90"/>
+              <w:bottom w:type="dxa" w:w="60"/>
+              <w:right w:type="dxa" w:w="90"/>
+            </w:tcMar>
+          </w:tcPr>
+          <w:p>
+            <w:pPr>
+              <w:spacing w:after="0" w:before="0"/>
+            </w:pPr>
+            <w:r>
+              <w:rPr>
+                <w:rFonts w:ascii="Arial" w:cs="Arial" w:eastAsia="Arial" w:hAnsi="Arial"/>
+                <w:color w:val="15202B"/>
+                <w:sz w:val="18"/>
+                <w:szCs w:val="18"/>
+              </w:rPr>
+              <w:t xml:space="preserve">Message "Marked paid. Total owed updated."; the order leaves the list and Total owed goes down.</w:t>
+            </w:r>
+          </w:p>
+        </w:tc>
+        <w:tc>
+          <w:tcPr>
+            <w:tcW w:type="dxa" w:w="900"/>
+            <w:tcBorders>
+              <w:top w:val="single" w:color="B9D7F2" w:sz="4"/>
+              <w:left w:val="single" w:color="B9D7F2" w:sz="4"/>
+              <w:bottom w:val="single" w:color="B9D7F2" w:sz="4"/>
+              <w:right w:val="single" w:color="B9D7F2" w:sz="4"/>
+            </w:tcBorders>
+            <w:tcMar>
+              <w:top w:type="dxa" w:w="60"/>
+              <w:left w:type="dxa" w:w="90"/>
+              <w:bottom w:type="dxa" w:w="60"/>
+              <w:right w:type="dxa" w:w="90"/>
+            </w:tcMar>
+          </w:tcPr>
+          <w:p>
+            <w:pPr>
+              <w:spacing w:after="0" w:before="0"/>
+            </w:pPr>
+            <w:r>
+              <w:rPr>
+                <w:rFonts w:ascii="Arial" w:cs="Arial" w:eastAsia="Arial" w:hAnsi="Arial"/>
+                <w:color w:val="15202B"/>
+                <w:sz w:val="18"/>
+                <w:szCs w:val="18"/>
+              </w:rPr>
+              <w:t xml:space="preserve">☐ Pass</w:t>
+            </w:r>
+          </w:p>
+          <w:p>
+            <w:pPr>
+              <w:spacing w:after="0" w:before="0"/>
+            </w:pPr>
+            <w:r>
+              <w:rPr>
+                <w:rFonts w:ascii="Arial" w:cs="Arial" w:eastAsia="Arial" w:hAnsi="Arial"/>
+                <w:color w:val="15202B"/>
+                <w:sz w:val="18"/>
+                <w:szCs w:val="18"/>
+              </w:rPr>
+              <w:t xml:space="preserve">☐ Fail</w:t>
+            </w:r>
+          </w:p>
+        </w:tc>
+        <w:tc>
+          <w:tcPr>
+            <w:tcW w:type="dxa" w:w="1206"/>
+            <w:tcBorders>
+              <w:top w:val="single" w:color="B9D7F2" w:sz="4"/>
+              <w:left w:val="single" w:color="B9D7F2" w:sz="4"/>
+              <w:bottom w:val="single" w:color="B9D7F2" w:sz="4"/>
+              <w:right w:val="single" w:color="B9D7F2" w:sz="4"/>
+            </w:tcBorders>
+            <w:tcMar>
+              <w:top w:type="dxa" w:w="60"/>
+              <w:left w:type="dxa" w:w="90"/>
+              <w:bottom w:type="dxa" w:w="60"/>
+              <w:right w:type="dxa" w:w="90"/>
+            </w:tcMar>
+          </w:tcPr>
+          <w:p>
+            <w:pPr>
+              <w:spacing w:after="0" w:before="0"/>
+            </w:pPr>
+            <w:r>
+              <w:rPr>
+                <w:rFonts w:ascii="Arial" w:cs="Arial" w:eastAsia="Arial" w:hAnsi="Arial"/>
+                <w:color w:val="15202B"/>
+                <w:sz w:val="18"/>
+                <w:szCs w:val="18"/>
+              </w:rPr>
+              <w:t xml:space="preserve"/>
+            </w:r>
+          </w:p>
+        </w:tc>
+      </w:tr>
+      <w:tr>
+        <w:trPr>
+          <w:cantSplit/>
+        </w:trPr>
+        <w:tc>
+          <w:tcPr>
+            <w:tcW w:type="dxa" w:w="640"/>
+            <w:tcBorders>
+              <w:top w:val="single" w:color="B9D7F2" w:sz="4"/>
+              <w:left w:val="single" w:color="B9D7F2" w:sz="4"/>
+              <w:bottom w:val="single" w:color="B9D7F2" w:sz="4"/>
+              <w:right w:val="single" w:color="B9D7F2" w:sz="4"/>
+            </w:tcBorders>
+            <w:shd w:fill="EAF4FD" w:color="auto" w:val="clear"/>
+            <w:tcMar>
+              <w:top w:type="dxa" w:w="60"/>
+              <w:left w:type="dxa" w:w="90"/>
+              <w:bottom w:type="dxa" w:w="60"/>
+              <w:right w:type="dxa" w:w="90"/>
+            </w:tcMar>
+          </w:tcPr>
+          <w:p>
+            <w:pPr>
+              <w:spacing w:after="0" w:before="0"/>
+            </w:pPr>
+            <w:r>
+              <w:rPr>
+                <w:rFonts w:ascii="Arial" w:cs="Arial" w:eastAsia="Arial" w:hAnsi="Arial"/>
+                <w:color w:val="15202B"/>
+                <w:sz w:val="18"/>
+                <w:szCs w:val="18"/>
+              </w:rPr>
+              <w:t xml:space="preserve">38.8</w:t>
+            </w:r>
+          </w:p>
+        </w:tc>
+        <w:tc>
+          <w:tcPr>
+            <w:tcW w:type="dxa" w:w="3820"/>
+            <w:tcBorders>
+              <w:top w:val="single" w:color="B9D7F2" w:sz="4"/>
+              <w:left w:val="single" w:color="B9D7F2" w:sz="4"/>
+              <w:bottom w:val="single" w:color="B9D7F2" w:sz="4"/>
+              <w:right w:val="single" w:color="B9D7F2" w:sz="4"/>
+            </w:tcBorders>
+            <w:shd w:fill="EAF4FD" w:color="auto" w:val="clear"/>
+            <w:tcMar>
+              <w:top w:type="dxa" w:w="60"/>
+              <w:left w:type="dxa" w:w="90"/>
+              <w:bottom w:type="dxa" w:w="60"/>
+              <w:right w:type="dxa" w:w="90"/>
+            </w:tcMar>
+          </w:tcPr>
+          <w:p>
+            <w:pPr>
+              <w:spacing w:after="0" w:before="0"/>
+            </w:pPr>
+            <w:r>
+              <w:rPr>
+                <w:rFonts w:ascii="Arial" w:cs="Arial" w:eastAsia="Arial" w:hAnsi="Arial"/>
+                <w:color w:val="15202B"/>
+                <w:sz w:val="18"/>
+                <w:szCs w:val="18"/>
+              </w:rPr>
+              <w:t xml:space="preserve">Tap an order row (not the Paid button).</w:t>
+            </w:r>
+          </w:p>
+        </w:tc>
+        <w:tc>
+          <w:tcPr>
+            <w:tcW w:type="dxa" w:w="3900"/>
+            <w:tcBorders>
+              <w:top w:val="single" w:color="B9D7F2" w:sz="4"/>
+              <w:left w:val="single" w:color="B9D7F2" w:sz="4"/>
+              <w:bottom w:val="single" w:color="B9D7F2" w:sz="4"/>
+              <w:right w:val="single" w:color="B9D7F2" w:sz="4"/>
+            </w:tcBorders>
+            <w:shd w:fill="EAF4FD" w:color="auto" w:val="clear"/>
+            <w:tcMar>
+              <w:top w:type="dxa" w:w="60"/>
+              <w:left w:type="dxa" w:w="90"/>
+              <w:bottom w:type="dxa" w:w="60"/>
+              <w:right w:type="dxa" w:w="90"/>
+            </w:tcMar>
+          </w:tcPr>
+          <w:p>
+            <w:pPr>
+              <w:spacing w:after="0" w:before="0"/>
+            </w:pPr>
+            <w:r>
+              <w:rPr>
+                <w:rFonts w:ascii="Arial" w:cs="Arial" w:eastAsia="Arial" w:hAnsi="Arial"/>
+                <w:color w:val="15202B"/>
+                <w:sz w:val="18"/>
+                <w:szCs w:val="18"/>
+              </w:rPr>
+              <w:t xml:space="preserve">Admin Order Details opens; the Payment box shows "Unpaid: owes P..." with Mark paid.</w:t>
+            </w:r>
+          </w:p>
+        </w:tc>
+        <w:tc>
+          <w:tcPr>
+            <w:tcW w:type="dxa" w:w="900"/>
+            <w:tcBorders>
+              <w:top w:val="single" w:color="B9D7F2" w:sz="4"/>
+              <w:left w:val="single" w:color="B9D7F2" w:sz="4"/>
+              <w:bottom w:val="single" w:color="B9D7F2" w:sz="4"/>
+              <w:right w:val="single" w:color="B9D7F2" w:sz="4"/>
+            </w:tcBorders>
+            <w:shd w:fill="EAF4FD" w:color="auto" w:val="clear"/>
+            <w:tcMar>
+              <w:top w:type="dxa" w:w="60"/>
+              <w:left w:type="dxa" w:w="90"/>
+              <w:bottom w:type="dxa" w:w="60"/>
+              <w:right w:type="dxa" w:w="90"/>
+            </w:tcMar>
+          </w:tcPr>
+          <w:p>
+            <w:pPr>
+              <w:spacing w:after="0" w:before="0"/>
+            </w:pPr>
+            <w:r>
+              <w:rPr>
+                <w:rFonts w:ascii="Arial" w:cs="Arial" w:eastAsia="Arial" w:hAnsi="Arial"/>
+                <w:color w:val="15202B"/>
+                <w:sz w:val="18"/>
+                <w:szCs w:val="18"/>
+              </w:rPr>
+              <w:t xml:space="preserve">☐ Pass</w:t>
+            </w:r>
+          </w:p>
+          <w:p>
+            <w:pPr>
+              <w:spacing w:after="0" w:before="0"/>
+            </w:pPr>
+            <w:r>
+              <w:rPr>
+                <w:rFonts w:ascii="Arial" w:cs="Arial" w:eastAsia="Arial" w:hAnsi="Arial"/>
+                <w:color w:val="15202B"/>
+                <w:sz w:val="18"/>
+                <w:szCs w:val="18"/>
+              </w:rPr>
+              <w:t xml:space="preserve">☐ Fail</w:t>
+            </w:r>
+          </w:p>
+        </w:tc>
+        <w:tc>
+          <w:tcPr>
+            <w:tcW w:type="dxa" w:w="1206"/>
+            <w:tcBorders>
+              <w:top w:val="single" w:color="B9D7F2" w:sz="4"/>
+              <w:left w:val="single" w:color="B9D7F2" w:sz="4"/>
+              <w:bottom w:val="single" w:color="B9D7F2" w:sz="4"/>
+              <w:right w:val="single" w:color="B9D7F2" w:sz="4"/>
+            </w:tcBorders>
+            <w:shd w:fill="EAF4FD" w:color="auto" w:val="clear"/>
+            <w:tcMar>
+              <w:top w:type="dxa" w:w="60"/>
+              <w:left w:type="dxa" w:w="90"/>
+              <w:bottom w:type="dxa" w:w="60"/>
+              <w:right w:type="dxa" w:w="90"/>
+            </w:tcMar>
+          </w:tcPr>
+          <w:p>
+            <w:pPr>
+              <w:spacing w:after="0" w:before="0"/>
+            </w:pPr>
+            <w:r>
+              <w:rPr>
+                <w:rFonts w:ascii="Arial" w:cs="Arial" w:eastAsia="Arial" w:hAnsi="Arial"/>
+                <w:color w:val="15202B"/>
+                <w:sz w:val="18"/>
+                <w:szCs w:val="18"/>
+              </w:rPr>
+              <w:t xml:space="preserve"/>
+            </w:r>
+          </w:p>
+        </w:tc>
+      </w:tr>
+      <w:tr>
+        <w:trPr>
+          <w:cantSplit/>
+        </w:trPr>
+        <w:tc>
+          <w:tcPr>
+            <w:tcW w:type="dxa" w:w="640"/>
+            <w:tcBorders>
+              <w:top w:val="single" w:color="B9D7F2" w:sz="4"/>
+              <w:left w:val="single" w:color="B9D7F2" w:sz="4"/>
+              <w:bottom w:val="single" w:color="B9D7F2" w:sz="4"/>
+              <w:right w:val="single" w:color="B9D7F2" w:sz="4"/>
+            </w:tcBorders>
+            <w:tcMar>
+              <w:top w:type="dxa" w:w="60"/>
+              <w:left w:type="dxa" w:w="90"/>
+              <w:bottom w:type="dxa" w:w="60"/>
+              <w:right w:type="dxa" w:w="90"/>
+            </w:tcMar>
+          </w:tcPr>
+          <w:p>
+            <w:pPr>
+              <w:spacing w:after="0" w:before="0"/>
+            </w:pPr>
+            <w:r>
+              <w:rPr>
+                <w:rFonts w:ascii="Arial" w:cs="Arial" w:eastAsia="Arial" w:hAnsi="Arial"/>
+                <w:color w:val="15202B"/>
+                <w:sz w:val="18"/>
+                <w:szCs w:val="18"/>
+              </w:rPr>
+              <w:t xml:space="preserve">38.9</w:t>
+            </w:r>
+          </w:p>
+        </w:tc>
+        <w:tc>
+          <w:tcPr>
+            <w:tcW w:type="dxa" w:w="3820"/>
+            <w:tcBorders>
+              <w:top w:val="single" w:color="B9D7F2" w:sz="4"/>
+              <w:left w:val="single" w:color="B9D7F2" w:sz="4"/>
+              <w:bottom w:val="single" w:color="B9D7F2" w:sz="4"/>
+              <w:right w:val="single" w:color="B9D7F2" w:sz="4"/>
+            </w:tcBorders>
+            <w:tcMar>
+              <w:top w:type="dxa" w:w="60"/>
+              <w:left w:type="dxa" w:w="90"/>
+              <w:bottom w:type="dxa" w:w="60"/>
+              <w:right w:type="dxa" w:w="90"/>
+            </w:tcMar>
+          </w:tcPr>
+          <w:p>
+            <w:pPr>
+              <w:spacing w:after="0" w:before="0"/>
+            </w:pPr>
+            <w:r>
+              <w:rPr>
+                <w:rFonts w:ascii="Arial" w:cs="Arial" w:eastAsia="Arial" w:hAnsi="Arial"/>
+                <w:color w:val="15202B"/>
+                <w:sz w:val="18"/>
+                <w:szCs w:val="18"/>
+              </w:rPr>
+              <w:t xml:space="preserve">In that Payment box, tap "All unpaid orders of this customer".</w:t>
+            </w:r>
+          </w:p>
+        </w:tc>
+        <w:tc>
+          <w:tcPr>
+            <w:tcW w:type="dxa" w:w="3900"/>
+            <w:tcBorders>
+              <w:top w:val="single" w:color="B9D7F2" w:sz="4"/>
+              <w:left w:val="single" w:color="B9D7F2" w:sz="4"/>
+              <w:bottom w:val="single" w:color="B9D7F2" w:sz="4"/>
+              <w:right w:val="single" w:color="B9D7F2" w:sz="4"/>
+            </w:tcBorders>
+            <w:tcMar>
+              <w:top w:type="dxa" w:w="60"/>
+              <w:left w:type="dxa" w:w="90"/>
+              <w:bottom w:type="dxa" w:w="60"/>
+              <w:right w:type="dxa" w:w="90"/>
+            </w:tcMar>
+          </w:tcPr>
+          <w:p>
+            <w:pPr>
+              <w:spacing w:after="0" w:before="0"/>
+            </w:pPr>
+            <w:r>
+              <w:rPr>
+                <w:rFonts w:ascii="Arial" w:cs="Arial" w:eastAsia="Arial" w:hAnsi="Arial"/>
+                <w:color w:val="15202B"/>
+                <w:sz w:val="18"/>
+                <w:szCs w:val="18"/>
+              </w:rPr>
+              <w:t xml:space="preserve">Goes to the same customer's Unpaid Orders page.</w:t>
+            </w:r>
+          </w:p>
+        </w:tc>
+        <w:tc>
+          <w:tcPr>
+            <w:tcW w:type="dxa" w:w="900"/>
+            <w:tcBorders>
+              <w:top w:val="single" w:color="B9D7F2" w:sz="4"/>
+              <w:left w:val="single" w:color="B9D7F2" w:sz="4"/>
+              <w:bottom w:val="single" w:color="B9D7F2" w:sz="4"/>
+              <w:right w:val="single" w:color="B9D7F2" w:sz="4"/>
+            </w:tcBorders>
+            <w:tcMar>
+              <w:top w:type="dxa" w:w="60"/>
+              <w:left w:type="dxa" w:w="90"/>
+              <w:bottom w:type="dxa" w:w="60"/>
+              <w:right w:type="dxa" w:w="90"/>
+            </w:tcMar>
+          </w:tcPr>
+          <w:p>
+            <w:pPr>
+              <w:spacing w:after="0" w:before="0"/>
+            </w:pPr>
+            <w:r>
+              <w:rPr>
+                <w:rFonts w:ascii="Arial" w:cs="Arial" w:eastAsia="Arial" w:hAnsi="Arial"/>
+                <w:color w:val="15202B"/>
+                <w:sz w:val="18"/>
+                <w:szCs w:val="18"/>
+              </w:rPr>
+              <w:t xml:space="preserve">☐ Pass</w:t>
+            </w:r>
+          </w:p>
+          <w:p>
+            <w:pPr>
+              <w:spacing w:after="0" w:before="0"/>
+            </w:pPr>
+            <w:r>
+              <w:rPr>
+                <w:rFonts w:ascii="Arial" w:cs="Arial" w:eastAsia="Arial" w:hAnsi="Arial"/>
+                <w:color w:val="15202B"/>
+                <w:sz w:val="18"/>
+                <w:szCs w:val="18"/>
+              </w:rPr>
+              <w:t xml:space="preserve">☐ Fail</w:t>
+            </w:r>
+          </w:p>
+        </w:tc>
+        <w:tc>
+          <w:tcPr>
+            <w:tcW w:type="dxa" w:w="1206"/>
+            <w:tcBorders>
+              <w:top w:val="single" w:color="B9D7F2" w:sz="4"/>
+              <w:left w:val="single" w:color="B9D7F2" w:sz="4"/>
+              <w:bottom w:val="single" w:color="B9D7F2" w:sz="4"/>
+              <w:right w:val="single" w:color="B9D7F2" w:sz="4"/>
+            </w:tcBorders>
+            <w:tcMar>
+              <w:top w:type="dxa" w:w="60"/>
+              <w:left w:type="dxa" w:w="90"/>
+              <w:bottom w:type="dxa" w:w="60"/>
+              <w:right w:type="dxa" w:w="90"/>
+            </w:tcMar>
+          </w:tcPr>
+          <w:p>
+            <w:pPr>
+              <w:spacing w:after="0" w:before="0"/>
+            </w:pPr>
+            <w:r>
+              <w:rPr>
+                <w:rFonts w:ascii="Arial" w:cs="Arial" w:eastAsia="Arial" w:hAnsi="Arial"/>
+                <w:color w:val="15202B"/>
+                <w:sz w:val="18"/>
+                <w:szCs w:val="18"/>
+              </w:rPr>
+              <w:t xml:space="preserve"/>
+            </w:r>
+          </w:p>
+        </w:tc>
+      </w:tr>
+      <w:tr>
+        <w:trPr>
+          <w:cantSplit/>
+        </w:trPr>
+        <w:tc>
+          <w:tcPr>
+            <w:tcW w:type="dxa" w:w="640"/>
+            <w:tcBorders>
+              <w:top w:val="single" w:color="B9D7F2" w:sz="4"/>
+              <w:left w:val="single" w:color="B9D7F2" w:sz="4"/>
+              <w:bottom w:val="single" w:color="B9D7F2" w:sz="4"/>
+              <w:right w:val="single" w:color="B9D7F2" w:sz="4"/>
+            </w:tcBorders>
+            <w:shd w:fill="EAF4FD" w:color="auto" w:val="clear"/>
+            <w:tcMar>
+              <w:top w:type="dxa" w:w="60"/>
+              <w:left w:type="dxa" w:w="90"/>
+              <w:bottom w:type="dxa" w:w="60"/>
+              <w:right w:type="dxa" w:w="90"/>
+            </w:tcMar>
+          </w:tcPr>
+          <w:p>
+            <w:pPr>
+              <w:spacing w:after="0" w:before="0"/>
+            </w:pPr>
+            <w:r>
+              <w:rPr>
+                <w:rFonts w:ascii="Arial" w:cs="Arial" w:eastAsia="Arial" w:hAnsi="Arial"/>
+                <w:color w:val="15202B"/>
+                <w:sz w:val="18"/>
+                <w:szCs w:val="18"/>
+              </w:rPr>
+              <w:t xml:space="preserve">38.10</w:t>
+            </w:r>
+          </w:p>
+        </w:tc>
+        <w:tc>
+          <w:tcPr>
+            <w:tcW w:type="dxa" w:w="3820"/>
+            <w:tcBorders>
+              <w:top w:val="single" w:color="B9D7F2" w:sz="4"/>
+              <w:left w:val="single" w:color="B9D7F2" w:sz="4"/>
+              <w:bottom w:val="single" w:color="B9D7F2" w:sz="4"/>
+              <w:right w:val="single" w:color="B9D7F2" w:sz="4"/>
+            </w:tcBorders>
+            <w:shd w:fill="EAF4FD" w:color="auto" w:val="clear"/>
+            <w:tcMar>
+              <w:top w:type="dxa" w:w="60"/>
+              <w:left w:type="dxa" w:w="90"/>
+              <w:bottom w:type="dxa" w:w="60"/>
+              <w:right w:type="dxa" w:w="90"/>
+            </w:tcMar>
+          </w:tcPr>
+          <w:p>
+            <w:pPr>
+              <w:spacing w:after="0" w:before="0"/>
+            </w:pPr>
+            <w:r>
+              <w:rPr>
+                <w:rFonts w:ascii="Arial" w:cs="Arial" w:eastAsia="Arial" w:hAnsi="Arial"/>
+                <w:color w:val="15202B"/>
+                <w:sz w:val="18"/>
+                <w:szCs w:val="18"/>
+              </w:rPr>
+              <w:t xml:space="preserve">Pay the last order of a customer, go back.</w:t>
+            </w:r>
+          </w:p>
+        </w:tc>
+        <w:tc>
+          <w:tcPr>
+            <w:tcW w:type="dxa" w:w="3900"/>
+            <w:tcBorders>
+              <w:top w:val="single" w:color="B9D7F2" w:sz="4"/>
+              <w:left w:val="single" w:color="B9D7F2" w:sz="4"/>
+              <w:bottom w:val="single" w:color="B9D7F2" w:sz="4"/>
+              <w:right w:val="single" w:color="B9D7F2" w:sz="4"/>
+            </w:tcBorders>
+            <w:shd w:fill="EAF4FD" w:color="auto" w:val="clear"/>
+            <w:tcMar>
+              <w:top w:type="dxa" w:w="60"/>
+              <w:left w:type="dxa" w:w="90"/>
+              <w:bottom w:type="dxa" w:w="60"/>
+              <w:right w:type="dxa" w:w="90"/>
+            </w:tcMar>
+          </w:tcPr>
+          <w:p>
+            <w:pPr>
+              <w:spacing w:after="0" w:before="0"/>
+            </w:pPr>
+            <w:r>
+              <w:rPr>
+                <w:rFonts w:ascii="Arial" w:cs="Arial" w:eastAsia="Arial" w:hAnsi="Arial"/>
+                <w:color w:val="15202B"/>
+                <w:sz w:val="18"/>
+                <w:szCs w:val="18"/>
+              </w:rPr>
+              <w:t xml:space="preserve">The customer is gone from Unpaid Accounts; the Daily report Money earned goes up by that amount today.</w:t>
+            </w:r>
+          </w:p>
+        </w:tc>
+        <w:tc>
+          <w:tcPr>
+            <w:tcW w:type="dxa" w:w="900"/>
+            <w:tcBorders>
+              <w:top w:val="single" w:color="B9D7F2" w:sz="4"/>
+              <w:left w:val="single" w:color="B9D7F2" w:sz="4"/>
+              <w:bottom w:val="single" w:color="B9D7F2" w:sz="4"/>
+              <w:right w:val="single" w:color="B9D7F2" w:sz="4"/>
+            </w:tcBorders>
+            <w:shd w:fill="EAF4FD" w:color="auto" w:val="clear"/>
+            <w:tcMar>
+              <w:top w:type="dxa" w:w="60"/>
+              <w:left w:type="dxa" w:w="90"/>
+              <w:bottom w:type="dxa" w:w="60"/>
+              <w:right w:type="dxa" w:w="90"/>
+            </w:tcMar>
+          </w:tcPr>
+          <w:p>
+            <w:pPr>
+              <w:spacing w:after="0" w:before="0"/>
+            </w:pPr>
+            <w:r>
+              <w:rPr>
+                <w:rFonts w:ascii="Arial" w:cs="Arial" w:eastAsia="Arial" w:hAnsi="Arial"/>
+                <w:color w:val="15202B"/>
+                <w:sz w:val="18"/>
+                <w:szCs w:val="18"/>
+              </w:rPr>
+              <w:t xml:space="preserve">☐ Pass</w:t>
+            </w:r>
+          </w:p>
+          <w:p>
+            <w:pPr>
+              <w:spacing w:after="0" w:before="0"/>
+            </w:pPr>
+            <w:r>
+              <w:rPr>
+                <w:rFonts w:ascii="Arial" w:cs="Arial" w:eastAsia="Arial" w:hAnsi="Arial"/>
+                <w:color w:val="15202B"/>
+                <w:sz w:val="18"/>
+                <w:szCs w:val="18"/>
+              </w:rPr>
+              <w:t xml:space="preserve">☐ Fail</w:t>
+            </w:r>
+          </w:p>
+        </w:tc>
+        <w:tc>
+          <w:tcPr>
+            <w:tcW w:type="dxa" w:w="1206"/>
+            <w:tcBorders>
+              <w:top w:val="single" w:color="B9D7F2" w:sz="4"/>
+              <w:left w:val="single" w:color="B9D7F2" w:sz="4"/>
+              <w:bottom w:val="single" w:color="B9D7F2" w:sz="4"/>
+              <w:right w:val="single" w:color="B9D7F2" w:sz="4"/>
+            </w:tcBorders>
+            <w:shd w:fill="EAF4FD" w:color="auto" w:val="clear"/>
             <w:tcMar>
               <w:top w:type="dxa" w:w="60"/>
               <w:left w:type="dxa" w:w="90"/>

</xml_diff>